<commit_message>
feat(rules): enforce Batch (n+1) zero-overlap with ALL previous batches, sync channel list to Word docx
</commit_message>
<xml_diff>
--- a/Danh_Sach_Kenh_Da_Cao.docx
+++ b/Danh_Sach_Kenh_Da_Cao.docx
@@ -29,7 +29,7 @@
           <w:color w:val="64748B"/>
           <w:sz w:val="20"/>
         </w:rPr>
-        <w:t>Hệ thống: Zero-Overlap Round-Robin (5 phút/lần) | Cập nhật: 09/10/2026 00:34:43</w:t>
+        <w:t>Hệ thống: Zero-Overlap Round-Robin (5 phút/lần) | Cập nhật: 09/10/2026 00:51:18</w:t>
       </w:r>
     </w:p>
     <w:p/>
@@ -77,7 +77,7 @@
               <w:br/>
               <w:t>4. Tải Ảnh Poster Thật: Lưu trực tiếp thumbnail gốc vào public/thumbnails/{id}.jpg.</w:t>
               <w:br/>
-              <w:t>5. Cơ Chế Xoay Vòng Zero-Overlap: Mỗi lượt quét đúng 5 kênh. 5 kênh trong Lô tiếp theo là 5 KÊNH MỚI HOÀN TOÀN, tuyệt đối không trùng với bất kỳ kênh nào trong các lô đã cào trước đó.</w:t>
+              <w:t>5. Quy Chuẩn Lô Kế Tiếp (Lô n+1): Mỗi lượt quét Lô (n+1), toàn bộ 5 kênh được quét BẮT BUỘC KHÔNG ĐƯỢC TRÙNG với bất kỳ kênh nào của tất cả các Lô trước đó (Lô 1 đến Lô n): Lô_{n+1} ∩ (∪_{i=1}^n Lô_i) = ∅. Toàn bộ các kênh được quét được lưu trữ, đồng bộ và cập nhật thường xuyên vào file Word này.</w:t>
             </w:r>
           </w:p>
         </w:tc>
@@ -100,7 +100,7 @@
           <w:color w:val="166534"/>
           <w:sz w:val="19"/>
         </w:rPr>
-        <w:t>Trạng thái: ĐÃ CÀO (Chu kỳ 1, 4)</w:t>
+        <w:t>Trạng thái: ĐÃ CÀO (Chu kỳ 1, 4, 6)</w:t>
       </w:r>
     </w:p>
     <w:tbl>
@@ -782,7 +782,7 @@
           <w:color w:val="166534"/>
           <w:sz w:val="19"/>
         </w:rPr>
-        <w:t>Trạng thái: ĐÃ CÀO (Chu kỳ 2)</w:t>
+        <w:t>Trạng thái: ĐÃ CÀO (Chu kỳ 2, 6)</w:t>
       </w:r>
     </w:p>
     <w:tbl>
@@ -1461,7 +1461,7 @@
           <w:color w:val="166534"/>
           <w:sz w:val="19"/>
         </w:rPr>
-        <w:t>Trạng thái: ĐÃ CÀO (Chu kỳ 3 - Vừa nạp 2 phim 1h11m và 2h06m)</w:t>
+        <w:t>Trạng thái: ĐÃ CÀO (Chu kỳ 3, 6 - Đã nạp 2 phim 1h11m và 2h06m)</w:t>
       </w:r>
     </w:p>
     <w:tbl>
@@ -2131,7 +2131,7 @@
           <w:color w:val="1E293B"/>
           <w:sz w:val="23"/>
         </w:rPr>
-        <w:t>📁 LÔ TIẾP THEO (LÔ 4): 5 KÊNH MỚI HOÀN TOÀN (100% KHÔNG TRÙNG LÔ 1, 2, 3)</w:t>
+        <w:t>📁 LÔ KẾ TIẾP (LÔ 4): 5 KÊNH MỚI HOÀN TOÀN (100% KHÔNG TRÙNG LÔ 1, 2, 3)</w:t>
         <w:br/>
       </w:r>
       <w:r>
@@ -2140,7 +2140,7 @@
           <w:color w:val="1D4ED8"/>
           <w:sz w:val="19"/>
         </w:rPr>
-        <w:t>Trạng thái: ⭐ ĐANG KÍCH HOẠT LÔ MỚI TIẾP THEO</w:t>
+        <w:t>Trạng thái: ⭐ ĐANG KÍCH HOẠT LÔ KẾ TIẾP (n+1)</w:t>
       </w:r>
     </w:p>
     <w:tbl>
@@ -2384,7 +2384,7 @@
                 <w:color w:val="1D4ED8"/>
                 <w:sz w:val="17"/>
               </w:rPr>
-              <w:t>Kênh Mới 100% - Quét kế tiếp</w:t>
+              <w:t>Kênh Mới Lô n+1 - Quét kế tiếp</w:t>
             </w:r>
           </w:p>
         </w:tc>
@@ -2490,7 +2490,7 @@
                 <w:color w:val="1D4ED8"/>
                 <w:sz w:val="17"/>
               </w:rPr>
-              <w:t>Kênh Mới 100% - Quét kế tiếp</w:t>
+              <w:t>Kênh Mới Lô n+1 - Quét kế tiếp</w:t>
             </w:r>
           </w:p>
         </w:tc>
@@ -2596,7 +2596,7 @@
                 <w:color w:val="1D4ED8"/>
                 <w:sz w:val="17"/>
               </w:rPr>
-              <w:t>Kênh Mới 100% - Quét kế tiếp</w:t>
+              <w:t>Kênh Mới Lô n+1 - Quét kế tiếp</w:t>
             </w:r>
           </w:p>
         </w:tc>
@@ -2702,7 +2702,7 @@
                 <w:color w:val="1D4ED8"/>
                 <w:sz w:val="17"/>
               </w:rPr>
-              <w:t>Kênh Mới 100% - Quét kế tiếp</w:t>
+              <w:t>Kênh Mới Lô n+1 - Quét kế tiếp</w:t>
             </w:r>
           </w:p>
         </w:tc>
@@ -2808,7 +2808,698 @@
                 <w:color w:val="1D4ED8"/>
                 <w:sz w:val="17"/>
               </w:rPr>
-              <w:t>Kênh Mới 100% - Quét kế tiếp</w:t>
+              <w:t>Kênh Mới Lô n+1 - Quét kế tiếp</w:t>
+            </w:r>
+          </w:p>
+        </w:tc>
+      </w:tr>
+    </w:tbl>
+    <w:p/>
+    <w:p>
+      <w:r>
+        <w:rPr>
+          <w:b/>
+          <w:color w:val="1E293B"/>
+          <w:sz w:val="23"/>
+        </w:rPr>
+        <w:t>📁 LÔ TIẾP SAU (LÔ 5): 5 KÊNH MỚI TIẾP NỐI (100% KHÔNG TRÙNG LÔ 1, 2, 3, 4)</w:t>
+        <w:br/>
+      </w:r>
+      <w:r>
+        <w:rPr>
+          <w:b/>
+          <w:color w:val="0284C7"/>
+          <w:sz w:val="19"/>
+        </w:rPr>
+        <w:t>Trạng thái: ⭐ DỰ PHÒNG LÔ (n+2) - KHÔNG TRÙNG LẶP</w:t>
+      </w:r>
+    </w:p>
+    <w:tbl>
+      <w:tblPr>
+        <w:tblW w:type="auto" w:w="0"/>
+        <w:jc w:val="center"/>
+        <w:tblLook w:firstColumn="1" w:firstRow="1" w:lastColumn="0" w:lastRow="0" w:noHBand="0" w:noVBand="1" w:val="04A0"/>
+      </w:tblPr>
+      <w:tblGrid>
+        <w:gridCol w:w="2045"/>
+        <w:gridCol w:w="2045"/>
+        <w:gridCol w:w="2045"/>
+        <w:gridCol w:w="2045"/>
+        <w:gridCol w:w="2045"/>
+      </w:tblGrid>
+      <w:tr>
+        <w:tc>
+          <w:tcPr>
+            <w:tcW w:type="dxa" w:w="720"/>
+            <w:shd w:fill="1E293B"/>
+            <w:tcMar>
+              <w:top w:w="100" w:type="dxa"/>
+              <w:bottom w:w="100" w:type="dxa"/>
+              <w:left w:w="100" w:type="dxa"/>
+              <w:right w:w="100" w:type="dxa"/>
+            </w:tcMar>
+          </w:tcPr>
+          <w:p>
+            <w:pPr>
+              <w:jc w:val="center"/>
+            </w:pPr>
+            <w:r>
+              <w:rPr>
+                <w:b/>
+                <w:color w:val="FFFFFF"/>
+                <w:sz w:val="18"/>
+              </w:rPr>
+              <w:t>STT</w:t>
+            </w:r>
+          </w:p>
+        </w:tc>
+        <w:tc>
+          <w:tcPr>
+            <w:tcW w:type="dxa" w:w="3168"/>
+            <w:shd w:fill="1E293B"/>
+            <w:tcMar>
+              <w:top w:w="100" w:type="dxa"/>
+              <w:bottom w:w="100" w:type="dxa"/>
+              <w:left w:w="100" w:type="dxa"/>
+              <w:right w:w="100" w:type="dxa"/>
+            </w:tcMar>
+          </w:tcPr>
+          <w:p>
+            <w:pPr>
+              <w:jc w:val="center"/>
+            </w:pPr>
+            <w:r>
+              <w:rPr>
+                <w:b/>
+                <w:color w:val="FFFFFF"/>
+                <w:sz w:val="18"/>
+              </w:rPr>
+              <w:t>Tên Kênh / Fanpage</w:t>
+            </w:r>
+          </w:p>
+        </w:tc>
+        <w:tc>
+          <w:tcPr>
+            <w:tcW w:type="dxa" w:w="3312"/>
+            <w:shd w:fill="1E293B"/>
+            <w:tcMar>
+              <w:top w:w="100" w:type="dxa"/>
+              <w:bottom w:w="100" w:type="dxa"/>
+              <w:left w:w="100" w:type="dxa"/>
+              <w:right w:w="100" w:type="dxa"/>
+            </w:tcMar>
+          </w:tcPr>
+          <w:p>
+            <w:pPr>
+              <w:jc w:val="center"/>
+            </w:pPr>
+            <w:r>
+              <w:rPr>
+                <w:b/>
+                <w:color w:val="FFFFFF"/>
+                <w:sz w:val="18"/>
+              </w:rPr>
+              <w:t>Đường Dẫn URL (Videos)</w:t>
+            </w:r>
+          </w:p>
+        </w:tc>
+        <w:tc>
+          <w:tcPr>
+            <w:tcW w:type="dxa" w:w="1872"/>
+            <w:shd w:fill="1E293B"/>
+            <w:tcMar>
+              <w:top w:w="100" w:type="dxa"/>
+              <w:bottom w:w="100" w:type="dxa"/>
+              <w:left w:w="100" w:type="dxa"/>
+              <w:right w:w="100" w:type="dxa"/>
+            </w:tcMar>
+          </w:tcPr>
+          <w:p>
+            <w:pPr>
+              <w:jc w:val="center"/>
+            </w:pPr>
+            <w:r>
+              <w:rPr>
+                <w:b/>
+                <w:color w:val="FFFFFF"/>
+                <w:sz w:val="18"/>
+              </w:rPr>
+              <w:t>Thể Loại</w:t>
+            </w:r>
+          </w:p>
+        </w:tc>
+        <w:tc>
+          <w:tcPr>
+            <w:tcW w:type="dxa" w:w="1728"/>
+            <w:shd w:fill="1E293B"/>
+            <w:tcMar>
+              <w:top w:w="100" w:type="dxa"/>
+              <w:bottom w:w="100" w:type="dxa"/>
+              <w:left w:w="100" w:type="dxa"/>
+              <w:right w:w="100" w:type="dxa"/>
+            </w:tcMar>
+          </w:tcPr>
+          <w:p>
+            <w:pPr>
+              <w:jc w:val="center"/>
+            </w:pPr>
+            <w:r>
+              <w:rPr>
+                <w:b/>
+                <w:color w:val="FFFFFF"/>
+                <w:sz w:val="18"/>
+              </w:rPr>
+              <w:t>Trạng Thái</w:t>
+            </w:r>
+          </w:p>
+        </w:tc>
+      </w:tr>
+      <w:tr>
+        <w:tc>
+          <w:tcPr>
+            <w:tcW w:type="dxa" w:w="720"/>
+            <w:tcMar>
+              <w:top w:w="80" w:type="dxa"/>
+              <w:bottom w:w="80" w:type="dxa"/>
+              <w:left w:w="80" w:type="dxa"/>
+              <w:right w:w="80" w:type="dxa"/>
+            </w:tcMar>
+            <w:shd w:fill="F8FAFC"/>
+          </w:tcPr>
+          <w:p>
+            <w:pPr>
+              <w:jc w:val="center"/>
+            </w:pPr>
+            <w:r>
+              <w:rPr>
+                <w:sz w:val="17"/>
+              </w:rPr>
+              <w:t>21</w:t>
+            </w:r>
+          </w:p>
+        </w:tc>
+        <w:tc>
+          <w:tcPr>
+            <w:tcW w:type="dxa" w:w="3168"/>
+            <w:tcMar>
+              <w:top w:w="80" w:type="dxa"/>
+              <w:bottom w:w="80" w:type="dxa"/>
+              <w:left w:w="80" w:type="dxa"/>
+              <w:right w:w="80" w:type="dxa"/>
+            </w:tcMar>
+          </w:tcPr>
+          <w:p>
+            <w:r>
+              <w:rPr>
+                <w:b/>
+                <w:sz w:val="17"/>
+              </w:rPr>
+              <w:t>Thế Giới Donghua 3D</w:t>
+            </w:r>
+          </w:p>
+        </w:tc>
+        <w:tc>
+          <w:tcPr>
+            <w:tcW w:type="dxa" w:w="3312"/>
+            <w:tcMar>
+              <w:top w:w="80" w:type="dxa"/>
+              <w:bottom w:w="80" w:type="dxa"/>
+              <w:left w:w="80" w:type="dxa"/>
+              <w:right w:w="80" w:type="dxa"/>
+            </w:tcMar>
+          </w:tcPr>
+          <w:p>
+            <w:r>
+              <w:rPr>
+                <w:color w:val="2563EB"/>
+                <w:sz w:val="17"/>
+              </w:rPr>
+              <w:t>https://www.facebook.com/thegioidonghua3d/videos</w:t>
+            </w:r>
+          </w:p>
+        </w:tc>
+        <w:tc>
+          <w:tcPr>
+            <w:tcW w:type="dxa" w:w="1872"/>
+            <w:tcMar>
+              <w:top w:w="80" w:type="dxa"/>
+              <w:bottom w:w="80" w:type="dxa"/>
+              <w:left w:w="80" w:type="dxa"/>
+              <w:right w:w="80" w:type="dxa"/>
+            </w:tcMar>
+          </w:tcPr>
+          <w:p>
+            <w:r>
+              <w:rPr>
+                <w:sz w:val="17"/>
+              </w:rPr>
+              <w:t>Donghua 3D Chiếu Rạp</w:t>
+            </w:r>
+          </w:p>
+        </w:tc>
+        <w:tc>
+          <w:tcPr>
+            <w:tcW w:type="dxa" w:w="1728"/>
+            <w:tcMar>
+              <w:top w:w="80" w:type="dxa"/>
+              <w:bottom w:w="80" w:type="dxa"/>
+              <w:left w:w="80" w:type="dxa"/>
+              <w:right w:w="80" w:type="dxa"/>
+            </w:tcMar>
+            <w:shd w:fill="EFF6FF"/>
+          </w:tcPr>
+          <w:p>
+            <w:r>
+              <w:rPr>
+                <w:b/>
+                <w:color w:val="1D4ED8"/>
+                <w:sz w:val="17"/>
+              </w:rPr>
+              <w:t>Kênh Mới Lô n+2</w:t>
+            </w:r>
+          </w:p>
+        </w:tc>
+      </w:tr>
+      <w:tr>
+        <w:tc>
+          <w:tcPr>
+            <w:tcW w:type="dxa" w:w="720"/>
+            <w:tcMar>
+              <w:top w:w="80" w:type="dxa"/>
+              <w:bottom w:w="80" w:type="dxa"/>
+              <w:left w:w="80" w:type="dxa"/>
+              <w:right w:w="80" w:type="dxa"/>
+            </w:tcMar>
+            <w:shd w:fill="F8FAFC"/>
+          </w:tcPr>
+          <w:p>
+            <w:pPr>
+              <w:jc w:val="center"/>
+            </w:pPr>
+            <w:r>
+              <w:rPr>
+                <w:sz w:val="17"/>
+              </w:rPr>
+              <w:t>22</w:t>
+            </w:r>
+          </w:p>
+        </w:tc>
+        <w:tc>
+          <w:tcPr>
+            <w:tcW w:type="dxa" w:w="3168"/>
+            <w:tcMar>
+              <w:top w:w="80" w:type="dxa"/>
+              <w:bottom w:w="80" w:type="dxa"/>
+              <w:left w:w="80" w:type="dxa"/>
+              <w:right w:w="80" w:type="dxa"/>
+            </w:tcMar>
+          </w:tcPr>
+          <w:p>
+            <w:r>
+              <w:rPr>
+                <w:b/>
+                <w:sz w:val="17"/>
+              </w:rPr>
+              <w:t>Tu Tiên Giới 3D</w:t>
+            </w:r>
+          </w:p>
+        </w:tc>
+        <w:tc>
+          <w:tcPr>
+            <w:tcW w:type="dxa" w:w="3312"/>
+            <w:tcMar>
+              <w:top w:w="80" w:type="dxa"/>
+              <w:bottom w:w="80" w:type="dxa"/>
+              <w:left w:w="80" w:type="dxa"/>
+              <w:right w:w="80" w:type="dxa"/>
+            </w:tcMar>
+          </w:tcPr>
+          <w:p>
+            <w:r>
+              <w:rPr>
+                <w:color w:val="2563EB"/>
+                <w:sz w:val="17"/>
+              </w:rPr>
+              <w:t>https://www.facebook.com/tutiengioi3d/videos</w:t>
+            </w:r>
+          </w:p>
+        </w:tc>
+        <w:tc>
+          <w:tcPr>
+            <w:tcW w:type="dxa" w:w="1872"/>
+            <w:tcMar>
+              <w:top w:w="80" w:type="dxa"/>
+              <w:bottom w:w="80" w:type="dxa"/>
+              <w:left w:w="80" w:type="dxa"/>
+              <w:right w:w="80" w:type="dxa"/>
+            </w:tcMar>
+          </w:tcPr>
+          <w:p>
+            <w:r>
+              <w:rPr>
+                <w:sz w:val="17"/>
+              </w:rPr>
+              <w:t>Tu Tiên Huyền Huyễn Mới</w:t>
+            </w:r>
+          </w:p>
+        </w:tc>
+        <w:tc>
+          <w:tcPr>
+            <w:tcW w:type="dxa" w:w="1728"/>
+            <w:tcMar>
+              <w:top w:w="80" w:type="dxa"/>
+              <w:bottom w:w="80" w:type="dxa"/>
+              <w:left w:w="80" w:type="dxa"/>
+              <w:right w:w="80" w:type="dxa"/>
+            </w:tcMar>
+            <w:shd w:fill="EFF6FF"/>
+          </w:tcPr>
+          <w:p>
+            <w:r>
+              <w:rPr>
+                <w:b/>
+                <w:color w:val="1D4ED8"/>
+                <w:sz w:val="17"/>
+              </w:rPr>
+              <w:t>Kênh Mới Lô n+2</w:t>
+            </w:r>
+          </w:p>
+        </w:tc>
+      </w:tr>
+      <w:tr>
+        <w:tc>
+          <w:tcPr>
+            <w:tcW w:type="dxa" w:w="720"/>
+            <w:tcMar>
+              <w:top w:w="80" w:type="dxa"/>
+              <w:bottom w:w="80" w:type="dxa"/>
+              <w:left w:w="80" w:type="dxa"/>
+              <w:right w:w="80" w:type="dxa"/>
+            </w:tcMar>
+            <w:shd w:fill="F8FAFC"/>
+          </w:tcPr>
+          <w:p>
+            <w:pPr>
+              <w:jc w:val="center"/>
+            </w:pPr>
+            <w:r>
+              <w:rPr>
+                <w:sz w:val="17"/>
+              </w:rPr>
+              <w:t>23</w:t>
+            </w:r>
+          </w:p>
+        </w:tc>
+        <w:tc>
+          <w:tcPr>
+            <w:tcW w:type="dxa" w:w="3168"/>
+            <w:tcMar>
+              <w:top w:w="80" w:type="dxa"/>
+              <w:bottom w:w="80" w:type="dxa"/>
+              <w:left w:w="80" w:type="dxa"/>
+              <w:right w:w="80" w:type="dxa"/>
+            </w:tcMar>
+          </w:tcPr>
+          <w:p>
+            <w:r>
+              <w:rPr>
+                <w:b/>
+                <w:sz w:val="17"/>
+              </w:rPr>
+              <w:t>Phim Ngắn Báo Thù Kịch Tính</w:t>
+            </w:r>
+          </w:p>
+        </w:tc>
+        <w:tc>
+          <w:tcPr>
+            <w:tcW w:type="dxa" w:w="3312"/>
+            <w:tcMar>
+              <w:top w:w="80" w:type="dxa"/>
+              <w:bottom w:w="80" w:type="dxa"/>
+              <w:left w:w="80" w:type="dxa"/>
+              <w:right w:w="80" w:type="dxa"/>
+            </w:tcMar>
+          </w:tcPr>
+          <w:p>
+            <w:r>
+              <w:rPr>
+                <w:color w:val="2563EB"/>
+                <w:sz w:val="17"/>
+              </w:rPr>
+              <w:t>https://www.facebook.com/phimnganbaothu/videos</w:t>
+            </w:r>
+          </w:p>
+        </w:tc>
+        <w:tc>
+          <w:tcPr>
+            <w:tcW w:type="dxa" w:w="1872"/>
+            <w:tcMar>
+              <w:top w:w="80" w:type="dxa"/>
+              <w:bottom w:w="80" w:type="dxa"/>
+              <w:left w:w="80" w:type="dxa"/>
+              <w:right w:w="80" w:type="dxa"/>
+            </w:tcMar>
+          </w:tcPr>
+          <w:p>
+            <w:r>
+              <w:rPr>
+                <w:sz w:val="17"/>
+              </w:rPr>
+              <w:t>Báo Thù &amp; Trọng Sinh</w:t>
+            </w:r>
+          </w:p>
+        </w:tc>
+        <w:tc>
+          <w:tcPr>
+            <w:tcW w:type="dxa" w:w="1728"/>
+            <w:tcMar>
+              <w:top w:w="80" w:type="dxa"/>
+              <w:bottom w:w="80" w:type="dxa"/>
+              <w:left w:w="80" w:type="dxa"/>
+              <w:right w:w="80" w:type="dxa"/>
+            </w:tcMar>
+            <w:shd w:fill="EFF6FF"/>
+          </w:tcPr>
+          <w:p>
+            <w:r>
+              <w:rPr>
+                <w:b/>
+                <w:color w:val="1D4ED8"/>
+                <w:sz w:val="17"/>
+              </w:rPr>
+              <w:t>Kênh Mới Lô n+2</w:t>
+            </w:r>
+          </w:p>
+        </w:tc>
+      </w:tr>
+      <w:tr>
+        <w:tc>
+          <w:tcPr>
+            <w:tcW w:type="dxa" w:w="720"/>
+            <w:tcMar>
+              <w:top w:w="80" w:type="dxa"/>
+              <w:bottom w:w="80" w:type="dxa"/>
+              <w:left w:w="80" w:type="dxa"/>
+              <w:right w:w="80" w:type="dxa"/>
+            </w:tcMar>
+            <w:shd w:fill="F8FAFC"/>
+          </w:tcPr>
+          <w:p>
+            <w:pPr>
+              <w:jc w:val="center"/>
+            </w:pPr>
+            <w:r>
+              <w:rPr>
+                <w:sz w:val="17"/>
+              </w:rPr>
+              <w:t>24</w:t>
+            </w:r>
+          </w:p>
+        </w:tc>
+        <w:tc>
+          <w:tcPr>
+            <w:tcW w:type="dxa" w:w="3168"/>
+            <w:tcMar>
+              <w:top w:w="80" w:type="dxa"/>
+              <w:bottom w:w="80" w:type="dxa"/>
+              <w:left w:w="80" w:type="dxa"/>
+              <w:right w:w="80" w:type="dxa"/>
+            </w:tcMar>
+          </w:tcPr>
+          <w:p>
+            <w:r>
+              <w:rPr>
+                <w:b/>
+                <w:sz w:val="17"/>
+              </w:rPr>
+              <w:t>Tuyển Tập Phim Ngắn Hay</w:t>
+            </w:r>
+          </w:p>
+        </w:tc>
+        <w:tc>
+          <w:tcPr>
+            <w:tcW w:type="dxa" w:w="3312"/>
+            <w:tcMar>
+              <w:top w:w="80" w:type="dxa"/>
+              <w:bottom w:w="80" w:type="dxa"/>
+              <w:left w:w="80" w:type="dxa"/>
+              <w:right w:w="80" w:type="dxa"/>
+            </w:tcMar>
+          </w:tcPr>
+          <w:p>
+            <w:r>
+              <w:rPr>
+                <w:color w:val="2563EB"/>
+                <w:sz w:val="17"/>
+              </w:rPr>
+              <w:t>https://www.facebook.com/tuyentapphimnganhay/videos</w:t>
+            </w:r>
+          </w:p>
+        </w:tc>
+        <w:tc>
+          <w:tcPr>
+            <w:tcW w:type="dxa" w:w="1872"/>
+            <w:tcMar>
+              <w:top w:w="80" w:type="dxa"/>
+              <w:bottom w:w="80" w:type="dxa"/>
+              <w:left w:w="80" w:type="dxa"/>
+              <w:right w:w="80" w:type="dxa"/>
+            </w:tcMar>
+          </w:tcPr>
+          <w:p>
+            <w:r>
+              <w:rPr>
+                <w:sz w:val="17"/>
+              </w:rPr>
+              <w:t>Phim Ngắn Đô Thị Kịch Tính</w:t>
+            </w:r>
+          </w:p>
+        </w:tc>
+        <w:tc>
+          <w:tcPr>
+            <w:tcW w:type="dxa" w:w="1728"/>
+            <w:tcMar>
+              <w:top w:w="80" w:type="dxa"/>
+              <w:bottom w:w="80" w:type="dxa"/>
+              <w:left w:w="80" w:type="dxa"/>
+              <w:right w:w="80" w:type="dxa"/>
+            </w:tcMar>
+            <w:shd w:fill="EFF6FF"/>
+          </w:tcPr>
+          <w:p>
+            <w:r>
+              <w:rPr>
+                <w:b/>
+                <w:color w:val="1D4ED8"/>
+                <w:sz w:val="17"/>
+              </w:rPr>
+              <w:t>Kênh Mới Lô n+2</w:t>
+            </w:r>
+          </w:p>
+        </w:tc>
+      </w:tr>
+      <w:tr>
+        <w:tc>
+          <w:tcPr>
+            <w:tcW w:type="dxa" w:w="720"/>
+            <w:tcMar>
+              <w:top w:w="80" w:type="dxa"/>
+              <w:bottom w:w="80" w:type="dxa"/>
+              <w:left w:w="80" w:type="dxa"/>
+              <w:right w:w="80" w:type="dxa"/>
+            </w:tcMar>
+            <w:shd w:fill="F8FAFC"/>
+          </w:tcPr>
+          <w:p>
+            <w:pPr>
+              <w:jc w:val="center"/>
+            </w:pPr>
+            <w:r>
+              <w:rPr>
+                <w:sz w:val="17"/>
+              </w:rPr>
+              <w:t>25</w:t>
+            </w:r>
+          </w:p>
+        </w:tc>
+        <w:tc>
+          <w:tcPr>
+            <w:tcW w:type="dxa" w:w="3168"/>
+            <w:tcMar>
+              <w:top w:w="80" w:type="dxa"/>
+              <w:bottom w:w="80" w:type="dxa"/>
+              <w:left w:w="80" w:type="dxa"/>
+              <w:right w:w="80" w:type="dxa"/>
+            </w:tcMar>
+          </w:tcPr>
+          <w:p>
+            <w:r>
+              <w:rPr>
+                <w:b/>
+                <w:sz w:val="17"/>
+              </w:rPr>
+              <w:t>Mê Donghua Tu Chân</w:t>
+            </w:r>
+          </w:p>
+        </w:tc>
+        <w:tc>
+          <w:tcPr>
+            <w:tcW w:type="dxa" w:w="3312"/>
+            <w:tcMar>
+              <w:top w:w="80" w:type="dxa"/>
+              <w:bottom w:w="80" w:type="dxa"/>
+              <w:left w:w="80" w:type="dxa"/>
+              <w:right w:w="80" w:type="dxa"/>
+            </w:tcMar>
+          </w:tcPr>
+          <w:p>
+            <w:r>
+              <w:rPr>
+                <w:color w:val="2563EB"/>
+                <w:sz w:val="17"/>
+              </w:rPr>
+              <w:t>https://www.facebook.com/medonghuatuchan/videos</w:t>
+            </w:r>
+          </w:p>
+        </w:tc>
+        <w:tc>
+          <w:tcPr>
+            <w:tcW w:type="dxa" w:w="1872"/>
+            <w:tcMar>
+              <w:top w:w="80" w:type="dxa"/>
+              <w:bottom w:w="80" w:type="dxa"/>
+              <w:left w:w="80" w:type="dxa"/>
+              <w:right w:w="80" w:type="dxa"/>
+            </w:tcMar>
+          </w:tcPr>
+          <w:p>
+            <w:r>
+              <w:rPr>
+                <w:sz w:val="17"/>
+              </w:rPr>
+              <w:t>Donghua Tu Chân Đỉnh Cao</w:t>
+            </w:r>
+          </w:p>
+        </w:tc>
+        <w:tc>
+          <w:tcPr>
+            <w:tcW w:type="dxa" w:w="1728"/>
+            <w:tcMar>
+              <w:top w:w="80" w:type="dxa"/>
+              <w:bottom w:w="80" w:type="dxa"/>
+              <w:left w:w="80" w:type="dxa"/>
+              <w:right w:w="80" w:type="dxa"/>
+            </w:tcMar>
+            <w:shd w:fill="EFF6FF"/>
+          </w:tcPr>
+          <w:p>
+            <w:r>
+              <w:rPr>
+                <w:b/>
+                <w:color w:val="1D4ED8"/>
+                <w:sz w:val="17"/>
+              </w:rPr>
+              <w:t>Kênh Mới Lô n+2</w:t>
             </w:r>
           </w:p>
         </w:tc>

</xml_diff>

<commit_message>
chore(sync): update Word document with Batch 7 and 8 channels registry
</commit_message>
<xml_diff>
--- a/Danh_Sach_Kenh_Da_Cao.docx
+++ b/Danh_Sach_Kenh_Da_Cao.docx
@@ -29,7 +29,7 @@
           <w:color w:val="64748B"/>
           <w:sz w:val="20"/>
         </w:rPr>
-        <w:t>Hệ thống: Mở Rộng Vô Hạn Lô (n+1) Không Trùng Lặp | Tổng: 10 Lô (50 Kênh) | 09/10/2026 01:08:00</w:t>
+        <w:t>Hệ thống: Mở Rộng Vô Hạn Lô (n+1) Không Trùng Lặp | Tổng: 10 Lô (50 Kênh) | 09/10/2026 01:09:26</w:t>
       </w:r>
     </w:p>
     <w:p/>
@@ -3529,10 +3529,10 @@
       <w:r>
         <w:rPr>
           <w:b/>
-          <w:color w:val="0E7490"/>
+          <w:color w:val="166534"/>
           <w:sz w:val="19"/>
         </w:rPr>
-        <w:t>Trạng thái: ⭐ ĐANG CÀO (Lô n+1 = 6)</w:t>
+        <w:t>Trạng thái: ĐÃ CÀO</w:t>
       </w:r>
     </w:p>
     <w:tbl>
@@ -3767,15 +3767,15 @@
               <w:left w:w="80" w:type="dxa"/>
               <w:right w:w="80" w:type="dxa"/>
             </w:tcMar>
-            <w:shd w:fill="EFF6FF"/>
+            <w:shd w:fill="F0FDF4"/>
           </w:tcPr>
           <w:p>
             <w:r>
               <w:rPr>
-                <w:color w:val="1D4ED8"/>
+                <w:color w:val="166534"/>
                 <w:sz w:val="16"/>
               </w:rPr>
-              <w:t>Chờ quét Lô n+1</w:t>
+              <w:t>Đã cào &amp; nạp</w:t>
             </w:r>
           </w:p>
         </w:tc>
@@ -3872,15 +3872,15 @@
               <w:left w:w="80" w:type="dxa"/>
               <w:right w:w="80" w:type="dxa"/>
             </w:tcMar>
-            <w:shd w:fill="EFF6FF"/>
+            <w:shd w:fill="F0FDF4"/>
           </w:tcPr>
           <w:p>
             <w:r>
               <w:rPr>
-                <w:color w:val="1D4ED8"/>
+                <w:color w:val="166534"/>
                 <w:sz w:val="16"/>
               </w:rPr>
-              <w:t>Chờ quét Lô n+1</w:t>
+              <w:t>Đã cào &amp; nạp</w:t>
             </w:r>
           </w:p>
         </w:tc>
@@ -3977,15 +3977,15 @@
               <w:left w:w="80" w:type="dxa"/>
               <w:right w:w="80" w:type="dxa"/>
             </w:tcMar>
-            <w:shd w:fill="EFF6FF"/>
+            <w:shd w:fill="F0FDF4"/>
           </w:tcPr>
           <w:p>
             <w:r>
               <w:rPr>
-                <w:color w:val="1D4ED8"/>
+                <w:color w:val="166534"/>
                 <w:sz w:val="16"/>
               </w:rPr>
-              <w:t>Chờ quét Lô n+1</w:t>
+              <w:t>Đã cào &amp; nạp</w:t>
             </w:r>
           </w:p>
         </w:tc>
@@ -4082,15 +4082,15 @@
               <w:left w:w="80" w:type="dxa"/>
               <w:right w:w="80" w:type="dxa"/>
             </w:tcMar>
-            <w:shd w:fill="EFF6FF"/>
+            <w:shd w:fill="F0FDF4"/>
           </w:tcPr>
           <w:p>
             <w:r>
               <w:rPr>
-                <w:color w:val="1D4ED8"/>
+                <w:color w:val="166534"/>
                 <w:sz w:val="16"/>
               </w:rPr>
-              <w:t>Chờ quét Lô n+1</w:t>
+              <w:t>Đã cào &amp; nạp</w:t>
             </w:r>
           </w:p>
         </w:tc>
@@ -4187,15 +4187,15 @@
               <w:left w:w="80" w:type="dxa"/>
               <w:right w:w="80" w:type="dxa"/>
             </w:tcMar>
-            <w:shd w:fill="EFF6FF"/>
+            <w:shd w:fill="F0FDF4"/>
           </w:tcPr>
           <w:p>
             <w:r>
               <w:rPr>
-                <w:color w:val="1D4ED8"/>
+                <w:color w:val="166534"/>
                 <w:sz w:val="16"/>
               </w:rPr>
-              <w:t>Chờ quét Lô n+1</w:t>
+              <w:t>Đã cào &amp; nạp</w:t>
             </w:r>
           </w:p>
         </w:tc>
@@ -4215,10 +4215,10 @@
       <w:r>
         <w:rPr>
           <w:b/>
-          <w:color w:val="1D4ED8"/>
+          <w:color w:val="0E7490"/>
           <w:sz w:val="19"/>
         </w:rPr>
-        <w:t>Trạng thái: ⭐ ĐANG CHỜ CÀO (Lô n+2 = 7)</w:t>
+        <w:t>Trạng thái: ⭐ ĐANG CÀO (Lô n+1 = 7)</w:t>
       </w:r>
     </w:p>
     <w:tbl>
@@ -4901,10 +4901,10 @@
       <w:r>
         <w:rPr>
           <w:b/>
-          <w:color w:val="0E7490"/>
+          <w:color w:val="1D4ED8"/>
           <w:sz w:val="19"/>
         </w:rPr>
-        <w:t>Trạng thái: ⭐ DỰ PHÒNG LÔ (n+3)</w:t>
+        <w:t>Trạng thái: ⭐ ĐANG CHỜ CÀO (Lô n+2 = 8)</w:t>
       </w:r>
     </w:p>
     <w:tbl>

</xml_diff>

<commit_message>
feat(rules): enforce mandatory detailed video scraping report in every 5-min periodic check
</commit_message>
<xml_diff>
--- a/Danh_Sach_Kenh_Da_Cao.docx
+++ b/Danh_Sach_Kenh_Da_Cao.docx
@@ -29,7 +29,7 @@
           <w:color w:val="64748B"/>
           <w:sz w:val="20"/>
         </w:rPr>
-        <w:t>Hệ thống: Mở Rộng Vô Hạn Lô (n+1) Không Trùng Lặp | Tổng: 10 Lô (50 Kênh) | 09/10/2026 01:09:26</w:t>
+        <w:t>Hệ thống: Mở Rộng Vô Hạn Lô (n+1) Không Trùng Lặp | Tổng: 10 Lô (50 Kênh) | 09/10/2026 01:11:34</w:t>
       </w:r>
     </w:p>
     <w:p/>
@@ -80,6 +80,8 @@
               <w:t>5. Quy Chuẩn Mở Rộng Vô Hạn Lô (n+1): Mỗi lượt kế tiếp, số Lô tự động tăng thêm 1 (n+1 = 6, 7, 8... đến vô hạn). Toàn bộ 5 kênh ở Lô (n+1) BẮT BUỘC KHÔNG ĐƯỢC TRÙNG với bất kỳ kênh nào của tất cả các Lô trước đó (Lô 1 đến Lô n). Hệ thống không lặp lại kênh cũ mà liên tục tiến tới cào các kênh mới vô hạn.</w:t>
               <w:br/>
               <w:t>6. Lưu Trữ File Word: Toàn bộ danh sách kênh được tự động ghi nhận và đồng bộ vào file Word này.</w:t>
+              <w:br/>
+              <w:t>7. Báo Cáo Định Kỳ 5 Phút Kèm Kết Quả Cào: Mỗi lần kiểm tra định kỳ 5 phút/lần, báo cáo chi tiết toàn bộ số liệu: video tìm thấy, phim nạp mới (&gt;=30p), clip ngắn bị loại bỏ, và Lô tiếp theo.</w:t>
             </w:r>
           </w:p>
         </w:tc>

</xml_diff>

<commit_message>
chore(sync): record Batch 8 completion (40 unique channels tracked), set next Batch n+1=9
</commit_message>
<xml_diff>
--- a/Danh_Sach_Kenh_Da_Cao.docx
+++ b/Danh_Sach_Kenh_Da_Cao.docx
@@ -29,7 +29,7 @@
           <w:color w:val="64748B"/>
           <w:sz w:val="20"/>
         </w:rPr>
-        <w:t>Hệ thống: Mở Rộng Vô Hạn Lô (n+1) Không Trùng Lặp | Tổng: 10 Lô (50 Kênh) | 09/10/2026 01:11:34</w:t>
+        <w:t>Hệ thống: Mở Rộng Vô Hạn Lô (n+1) Không Trùng Lặp | Tổng: 10 Lô (50 Kênh) | 09/10/2026 01:15:39</w:t>
       </w:r>
     </w:p>
     <w:p/>
@@ -4217,10 +4217,10 @@
       <w:r>
         <w:rPr>
           <w:b/>
-          <w:color w:val="0E7490"/>
+          <w:color w:val="166534"/>
           <w:sz w:val="19"/>
         </w:rPr>
-        <w:t>Trạng thái: ⭐ ĐANG CÀO (Lô n+1 = 7)</w:t>
+        <w:t>Trạng thái: ĐÃ CÀO</w:t>
       </w:r>
     </w:p>
     <w:tbl>
@@ -4455,15 +4455,15 @@
               <w:left w:w="80" w:type="dxa"/>
               <w:right w:w="80" w:type="dxa"/>
             </w:tcMar>
-            <w:shd w:fill="EFF6FF"/>
+            <w:shd w:fill="F0FDF4"/>
           </w:tcPr>
           <w:p>
             <w:r>
               <w:rPr>
-                <w:color w:val="1D4ED8"/>
+                <w:color w:val="166534"/>
                 <w:sz w:val="16"/>
               </w:rPr>
-              <w:t>Chờ quét Lô n+1</w:t>
+              <w:t>Đã cào &amp; nạp</w:t>
             </w:r>
           </w:p>
         </w:tc>
@@ -4560,15 +4560,15 @@
               <w:left w:w="80" w:type="dxa"/>
               <w:right w:w="80" w:type="dxa"/>
             </w:tcMar>
-            <w:shd w:fill="EFF6FF"/>
+            <w:shd w:fill="F0FDF4"/>
           </w:tcPr>
           <w:p>
             <w:r>
               <w:rPr>
-                <w:color w:val="1D4ED8"/>
+                <w:color w:val="166534"/>
                 <w:sz w:val="16"/>
               </w:rPr>
-              <w:t>Chờ quét Lô n+1</w:t>
+              <w:t>Đã cào &amp; nạp</w:t>
             </w:r>
           </w:p>
         </w:tc>
@@ -4665,15 +4665,15 @@
               <w:left w:w="80" w:type="dxa"/>
               <w:right w:w="80" w:type="dxa"/>
             </w:tcMar>
-            <w:shd w:fill="EFF6FF"/>
+            <w:shd w:fill="F0FDF4"/>
           </w:tcPr>
           <w:p>
             <w:r>
               <w:rPr>
-                <w:color w:val="1D4ED8"/>
+                <w:color w:val="166534"/>
                 <w:sz w:val="16"/>
               </w:rPr>
-              <w:t>Chờ quét Lô n+1</w:t>
+              <w:t>Đã cào &amp; nạp</w:t>
             </w:r>
           </w:p>
         </w:tc>
@@ -4770,15 +4770,15 @@
               <w:left w:w="80" w:type="dxa"/>
               <w:right w:w="80" w:type="dxa"/>
             </w:tcMar>
-            <w:shd w:fill="EFF6FF"/>
+            <w:shd w:fill="F0FDF4"/>
           </w:tcPr>
           <w:p>
             <w:r>
               <w:rPr>
-                <w:color w:val="1D4ED8"/>
+                <w:color w:val="166534"/>
                 <w:sz w:val="16"/>
               </w:rPr>
-              <w:t>Chờ quét Lô n+1</w:t>
+              <w:t>Đã cào &amp; nạp</w:t>
             </w:r>
           </w:p>
         </w:tc>
@@ -4875,15 +4875,15 @@
               <w:left w:w="80" w:type="dxa"/>
               <w:right w:w="80" w:type="dxa"/>
             </w:tcMar>
-            <w:shd w:fill="EFF6FF"/>
+            <w:shd w:fill="F0FDF4"/>
           </w:tcPr>
           <w:p>
             <w:r>
               <w:rPr>
-                <w:color w:val="1D4ED8"/>
+                <w:color w:val="166534"/>
                 <w:sz w:val="16"/>
               </w:rPr>
-              <w:t>Chờ quét Lô n+1</w:t>
+              <w:t>Đã cào &amp; nạp</w:t>
             </w:r>
           </w:p>
         </w:tc>
@@ -4903,10 +4903,10 @@
       <w:r>
         <w:rPr>
           <w:b/>
-          <w:color w:val="1D4ED8"/>
+          <w:color w:val="0E7490"/>
           <w:sz w:val="19"/>
         </w:rPr>
-        <w:t>Trạng thái: ⭐ ĐANG CHỜ CÀO (Lô n+2 = 8)</w:t>
+        <w:t>Trạng thái: ⭐ ĐANG CÀO (Lô n+1 = 8)</w:t>
       </w:r>
     </w:p>
     <w:tbl>
@@ -5589,10 +5589,10 @@
       <w:r>
         <w:rPr>
           <w:b/>
-          <w:color w:val="0E7490"/>
+          <w:color w:val="1D4ED8"/>
           <w:sz w:val="19"/>
         </w:rPr>
-        <w:t>Trạng thái: ⭐ DỰ PHÒNG LÔ (n+4)</w:t>
+        <w:t>Trạng thái: ⭐ ĐANG CHỜ CÀO (Lô n+2 = 9)</w:t>
       </w:r>
     </w:p>
     <w:tbl>

</xml_diff>

<commit_message>
feat(crawler): integrate Claude and GPT optimization insights, exhaustive deep crawl and top-layer incremental engine
</commit_message>
<xml_diff>
--- a/Danh_Sach_Kenh_Da_Cao.docx
+++ b/Danh_Sach_Kenh_Da_Cao.docx
@@ -29,7 +29,7 @@
           <w:color w:val="64748B"/>
           <w:sz w:val="20"/>
         </w:rPr>
-        <w:t>Hệ thống: Mở Rộng Vô Hạn Lô (n+1) Không Trùng Lặp | Tổng: 10 Lô (50 Kênh) | 09/10/2026 01:15:39</w:t>
+        <w:t>Hệ thống: Mở Rộng Vô Hạn Lô (n+1) Không Trùng Lặp | Tổng: 10 Lô (50 Kênh) | 09/10/2026 01:30:04</w:t>
       </w:r>
     </w:p>
     <w:p/>
@@ -4903,10 +4903,10 @@
       <w:r>
         <w:rPr>
           <w:b/>
-          <w:color w:val="0E7490"/>
+          <w:color w:val="166534"/>
           <w:sz w:val="19"/>
         </w:rPr>
-        <w:t>Trạng thái: ⭐ ĐANG CÀO (Lô n+1 = 8)</w:t>
+        <w:t>Trạng thái: ĐÃ CÀO</w:t>
       </w:r>
     </w:p>
     <w:tbl>
@@ -5141,15 +5141,15 @@
               <w:left w:w="80" w:type="dxa"/>
               <w:right w:w="80" w:type="dxa"/>
             </w:tcMar>
-            <w:shd w:fill="EFF6FF"/>
+            <w:shd w:fill="F0FDF4"/>
           </w:tcPr>
           <w:p>
             <w:r>
               <w:rPr>
-                <w:color w:val="1D4ED8"/>
+                <w:color w:val="166534"/>
                 <w:sz w:val="16"/>
               </w:rPr>
-              <w:t>Chờ quét Lô n+1</w:t>
+              <w:t>Đã cào &amp; nạp</w:t>
             </w:r>
           </w:p>
         </w:tc>
@@ -5246,15 +5246,15 @@
               <w:left w:w="80" w:type="dxa"/>
               <w:right w:w="80" w:type="dxa"/>
             </w:tcMar>
-            <w:shd w:fill="EFF6FF"/>
+            <w:shd w:fill="F0FDF4"/>
           </w:tcPr>
           <w:p>
             <w:r>
               <w:rPr>
-                <w:color w:val="1D4ED8"/>
+                <w:color w:val="166534"/>
                 <w:sz w:val="16"/>
               </w:rPr>
-              <w:t>Chờ quét Lô n+1</w:t>
+              <w:t>Đã cào &amp; nạp</w:t>
             </w:r>
           </w:p>
         </w:tc>
@@ -5351,15 +5351,15 @@
               <w:left w:w="80" w:type="dxa"/>
               <w:right w:w="80" w:type="dxa"/>
             </w:tcMar>
-            <w:shd w:fill="EFF6FF"/>
+            <w:shd w:fill="F0FDF4"/>
           </w:tcPr>
           <w:p>
             <w:r>
               <w:rPr>
-                <w:color w:val="1D4ED8"/>
+                <w:color w:val="166534"/>
                 <w:sz w:val="16"/>
               </w:rPr>
-              <w:t>Chờ quét Lô n+1</w:t>
+              <w:t>Đã cào &amp; nạp</w:t>
             </w:r>
           </w:p>
         </w:tc>
@@ -5456,15 +5456,15 @@
               <w:left w:w="80" w:type="dxa"/>
               <w:right w:w="80" w:type="dxa"/>
             </w:tcMar>
-            <w:shd w:fill="EFF6FF"/>
+            <w:shd w:fill="F0FDF4"/>
           </w:tcPr>
           <w:p>
             <w:r>
               <w:rPr>
-                <w:color w:val="1D4ED8"/>
+                <w:color w:val="166534"/>
                 <w:sz w:val="16"/>
               </w:rPr>
-              <w:t>Chờ quét Lô n+1</w:t>
+              <w:t>Đã cào &amp; nạp</w:t>
             </w:r>
           </w:p>
         </w:tc>
@@ -5561,15 +5561,15 @@
               <w:left w:w="80" w:type="dxa"/>
               <w:right w:w="80" w:type="dxa"/>
             </w:tcMar>
-            <w:shd w:fill="EFF6FF"/>
+            <w:shd w:fill="F0FDF4"/>
           </w:tcPr>
           <w:p>
             <w:r>
               <w:rPr>
-                <w:color w:val="1D4ED8"/>
+                <w:color w:val="166534"/>
                 <w:sz w:val="16"/>
               </w:rPr>
-              <w:t>Chờ quét Lô n+1</w:t>
+              <w:t>Đã cào &amp; nạp</w:t>
             </w:r>
           </w:p>
         </w:tc>
@@ -5589,10 +5589,10 @@
       <w:r>
         <w:rPr>
           <w:b/>
-          <w:color w:val="1D4ED8"/>
+          <w:color w:val="166534"/>
           <w:sz w:val="19"/>
         </w:rPr>
-        <w:t>Trạng thái: ⭐ ĐANG CHỜ CÀO (Lô n+2 = 9)</w:t>
+        <w:t>Trạng thái: ĐÃ CÀO</w:t>
       </w:r>
     </w:p>
     <w:tbl>
@@ -5827,15 +5827,15 @@
               <w:left w:w="80" w:type="dxa"/>
               <w:right w:w="80" w:type="dxa"/>
             </w:tcMar>
-            <w:shd w:fill="EFF6FF"/>
+            <w:shd w:fill="F0FDF4"/>
           </w:tcPr>
           <w:p>
             <w:r>
               <w:rPr>
-                <w:color w:val="1D4ED8"/>
+                <w:color w:val="166534"/>
                 <w:sz w:val="16"/>
               </w:rPr>
-              <w:t>Chờ quét Lô n+1</w:t>
+              <w:t>Đã cào &amp; nạp</w:t>
             </w:r>
           </w:p>
         </w:tc>
@@ -5932,15 +5932,15 @@
               <w:left w:w="80" w:type="dxa"/>
               <w:right w:w="80" w:type="dxa"/>
             </w:tcMar>
-            <w:shd w:fill="EFF6FF"/>
+            <w:shd w:fill="F0FDF4"/>
           </w:tcPr>
           <w:p>
             <w:r>
               <w:rPr>
-                <w:color w:val="1D4ED8"/>
+                <w:color w:val="166534"/>
                 <w:sz w:val="16"/>
               </w:rPr>
-              <w:t>Chờ quét Lô n+1</w:t>
+              <w:t>Đã cào &amp; nạp</w:t>
             </w:r>
           </w:p>
         </w:tc>
@@ -6037,15 +6037,15 @@
               <w:left w:w="80" w:type="dxa"/>
               <w:right w:w="80" w:type="dxa"/>
             </w:tcMar>
-            <w:shd w:fill="EFF6FF"/>
+            <w:shd w:fill="F0FDF4"/>
           </w:tcPr>
           <w:p>
             <w:r>
               <w:rPr>
-                <w:color w:val="1D4ED8"/>
+                <w:color w:val="166534"/>
                 <w:sz w:val="16"/>
               </w:rPr>
-              <w:t>Chờ quét Lô n+1</w:t>
+              <w:t>Đã cào &amp; nạp</w:t>
             </w:r>
           </w:p>
         </w:tc>
@@ -6142,15 +6142,15 @@
               <w:left w:w="80" w:type="dxa"/>
               <w:right w:w="80" w:type="dxa"/>
             </w:tcMar>
-            <w:shd w:fill="EFF6FF"/>
+            <w:shd w:fill="F0FDF4"/>
           </w:tcPr>
           <w:p>
             <w:r>
               <w:rPr>
-                <w:color w:val="1D4ED8"/>
+                <w:color w:val="166534"/>
                 <w:sz w:val="16"/>
               </w:rPr>
-              <w:t>Chờ quét Lô n+1</w:t>
+              <w:t>Đã cào &amp; nạp</w:t>
             </w:r>
           </w:p>
         </w:tc>
@@ -6247,15 +6247,15 @@
               <w:left w:w="80" w:type="dxa"/>
               <w:right w:w="80" w:type="dxa"/>
             </w:tcMar>
-            <w:shd w:fill="EFF6FF"/>
+            <w:shd w:fill="F0FDF4"/>
           </w:tcPr>
           <w:p>
             <w:r>
               <w:rPr>
-                <w:color w:val="1D4ED8"/>
+                <w:color w:val="166534"/>
                 <w:sz w:val="16"/>
               </w:rPr>
-              <w:t>Chờ quét Lô n+1</w:t>
+              <w:t>Đã cào &amp; nạp</w:t>
             </w:r>
           </w:p>
         </w:tc>
@@ -6278,7 +6278,7 @@
           <w:color w:val="0E7490"/>
           <w:sz w:val="19"/>
         </w:rPr>
-        <w:t>Trạng thái: ⭐ DỰ PHÒNG LÔ (n+5)</w:t>
+        <w:t>Trạng thái: ⭐ ĐANG CÀO (Lô n+1 = 10)</w:t>
       </w:r>
     </w:p>
     <w:tbl>

</xml_diff>

<commit_message>
feat(database): update 191 movies, sync batch 12 results and thumbnails
</commit_message>
<xml_diff>
--- a/Danh_Sach_Kenh_Da_Cao.docx
+++ b/Danh_Sach_Kenh_Da_Cao.docx
@@ -29,7 +29,7 @@
           <w:color w:val="64748B"/>
           <w:sz w:val="20"/>
         </w:rPr>
-        <w:t>Hệ thống: Mở Rộng Vô Hạn Lô (n+1) Không Trùng Lặp | Tổng: 10 Lô (50 Kênh) | 09/10/2026 01:30:04</w:t>
+        <w:t>Hệ thống: Mở Rộng Vô Hạn Lô (n+1) Không Trùng Lặp | Tổng: 12 Lô (60 Kênh) | 09/10/2026 01:42:22</w:t>
       </w:r>
     </w:p>
     <w:p/>
@@ -6275,10 +6275,10 @@
       <w:r>
         <w:rPr>
           <w:b/>
-          <w:color w:val="0E7490"/>
+          <w:color w:val="166534"/>
           <w:sz w:val="19"/>
         </w:rPr>
-        <w:t>Trạng thái: ⭐ ĐANG CÀO (Lô n+1 = 10)</w:t>
+        <w:t>Trạng thái: ĐÃ CÀO</w:t>
       </w:r>
     </w:p>
     <w:tbl>
@@ -6513,15 +6513,15 @@
               <w:left w:w="80" w:type="dxa"/>
               <w:right w:w="80" w:type="dxa"/>
             </w:tcMar>
-            <w:shd w:fill="EFF6FF"/>
-          </w:tcPr>
-          <w:p>
-            <w:r>
-              <w:rPr>
-                <w:color w:val="1D4ED8"/>
+            <w:shd w:fill="F0FDF4"/>
+          </w:tcPr>
+          <w:p>
+            <w:r>
+              <w:rPr>
+                <w:color w:val="166534"/>
                 <w:sz w:val="16"/>
               </w:rPr>
-              <w:t>Chờ quét Lô n+1</w:t>
+              <w:t>Đã cào &amp; nạp</w:t>
             </w:r>
           </w:p>
         </w:tc>
@@ -6618,15 +6618,15 @@
               <w:left w:w="80" w:type="dxa"/>
               <w:right w:w="80" w:type="dxa"/>
             </w:tcMar>
-            <w:shd w:fill="EFF6FF"/>
-          </w:tcPr>
-          <w:p>
-            <w:r>
-              <w:rPr>
-                <w:color w:val="1D4ED8"/>
+            <w:shd w:fill="F0FDF4"/>
+          </w:tcPr>
+          <w:p>
+            <w:r>
+              <w:rPr>
+                <w:color w:val="166534"/>
                 <w:sz w:val="16"/>
               </w:rPr>
-              <w:t>Chờ quét Lô n+1</w:t>
+              <w:t>Đã cào &amp; nạp</w:t>
             </w:r>
           </w:p>
         </w:tc>
@@ -6723,15 +6723,15 @@
               <w:left w:w="80" w:type="dxa"/>
               <w:right w:w="80" w:type="dxa"/>
             </w:tcMar>
-            <w:shd w:fill="EFF6FF"/>
-          </w:tcPr>
-          <w:p>
-            <w:r>
-              <w:rPr>
-                <w:color w:val="1D4ED8"/>
+            <w:shd w:fill="F0FDF4"/>
+          </w:tcPr>
+          <w:p>
+            <w:r>
+              <w:rPr>
+                <w:color w:val="166534"/>
                 <w:sz w:val="16"/>
               </w:rPr>
-              <w:t>Chờ quét Lô n+1</w:t>
+              <w:t>Đã cào &amp; nạp</w:t>
             </w:r>
           </w:p>
         </w:tc>
@@ -6828,15 +6828,15 @@
               <w:left w:w="80" w:type="dxa"/>
               <w:right w:w="80" w:type="dxa"/>
             </w:tcMar>
-            <w:shd w:fill="EFF6FF"/>
-          </w:tcPr>
-          <w:p>
-            <w:r>
-              <w:rPr>
-                <w:color w:val="1D4ED8"/>
+            <w:shd w:fill="F0FDF4"/>
+          </w:tcPr>
+          <w:p>
+            <w:r>
+              <w:rPr>
+                <w:color w:val="166534"/>
                 <w:sz w:val="16"/>
               </w:rPr>
-              <w:t>Chờ quét Lô n+1</w:t>
+              <w:t>Đã cào &amp; nạp</w:t>
             </w:r>
           </w:p>
         </w:tc>
@@ -6921,6 +6921,1378 @@
                 <w:sz w:val="16"/>
               </w:rPr>
               <w:t>Nữ Quyền &amp; Báo Thù</w:t>
+            </w:r>
+          </w:p>
+        </w:tc>
+        <w:tc>
+          <w:tcPr>
+            <w:tcW w:type="dxa" w:w="1728"/>
+            <w:tcMar>
+              <w:top w:w="70" w:type="dxa"/>
+              <w:bottom w:w="70" w:type="dxa"/>
+              <w:left w:w="80" w:type="dxa"/>
+              <w:right w:w="80" w:type="dxa"/>
+            </w:tcMar>
+            <w:shd w:fill="F0FDF4"/>
+          </w:tcPr>
+          <w:p>
+            <w:r>
+              <w:rPr>
+                <w:color w:val="166534"/>
+                <w:sz w:val="16"/>
+              </w:rPr>
+              <w:t>Đã cào &amp; nạp</w:t>
+            </w:r>
+          </w:p>
+        </w:tc>
+      </w:tr>
+    </w:tbl>
+    <w:p/>
+    <w:p>
+      <w:r>
+        <w:rPr>
+          <w:b/>
+          <w:color w:val="1E293B"/>
+          <w:sz w:val="22"/>
+        </w:rPr>
+        <w:t>📁 LÔ 11 (n+1 MỚI): Tuyển Tập Kênh Mới Hoàn Toàn #11</w:t>
+        <w:br/>
+      </w:r>
+      <w:r>
+        <w:rPr>
+          <w:b/>
+          <w:color w:val="166534"/>
+          <w:sz w:val="19"/>
+        </w:rPr>
+        <w:t>Trạng thái: ĐÃ CÀO</w:t>
+      </w:r>
+    </w:p>
+    <w:tbl>
+      <w:tblPr>
+        <w:tblW w:type="auto" w:w="0"/>
+        <w:jc w:val="center"/>
+        <w:tblLook w:firstColumn="1" w:firstRow="1" w:lastColumn="0" w:lastRow="0" w:noHBand="0" w:noVBand="1" w:val="04A0"/>
+      </w:tblPr>
+      <w:tblGrid>
+        <w:gridCol w:w="2045"/>
+        <w:gridCol w:w="2045"/>
+        <w:gridCol w:w="2045"/>
+        <w:gridCol w:w="2045"/>
+        <w:gridCol w:w="2045"/>
+      </w:tblGrid>
+      <w:tr>
+        <w:tc>
+          <w:tcPr>
+            <w:tcW w:type="dxa" w:w="720"/>
+            <w:shd w:fill="1E293B"/>
+            <w:tcMar>
+              <w:top w:w="90" w:type="dxa"/>
+              <w:bottom w:w="90" w:type="dxa"/>
+              <w:left w:w="90" w:type="dxa"/>
+              <w:right w:w="90" w:type="dxa"/>
+            </w:tcMar>
+          </w:tcPr>
+          <w:p>
+            <w:pPr>
+              <w:jc w:val="center"/>
+            </w:pPr>
+            <w:r>
+              <w:rPr>
+                <w:b/>
+                <w:color w:val="FFFFFF"/>
+                <w:sz w:val="17"/>
+              </w:rPr>
+              <w:t>STT</w:t>
+            </w:r>
+          </w:p>
+        </w:tc>
+        <w:tc>
+          <w:tcPr>
+            <w:tcW w:type="dxa" w:w="3168"/>
+            <w:shd w:fill="1E293B"/>
+            <w:tcMar>
+              <w:top w:w="90" w:type="dxa"/>
+              <w:bottom w:w="90" w:type="dxa"/>
+              <w:left w:w="90" w:type="dxa"/>
+              <w:right w:w="90" w:type="dxa"/>
+            </w:tcMar>
+          </w:tcPr>
+          <w:p>
+            <w:pPr>
+              <w:jc w:val="center"/>
+            </w:pPr>
+            <w:r>
+              <w:rPr>
+                <w:b/>
+                <w:color w:val="FFFFFF"/>
+                <w:sz w:val="17"/>
+              </w:rPr>
+              <w:t>Tên Kênh / Fanpage</w:t>
+            </w:r>
+          </w:p>
+        </w:tc>
+        <w:tc>
+          <w:tcPr>
+            <w:tcW w:type="dxa" w:w="3312"/>
+            <w:shd w:fill="1E293B"/>
+            <w:tcMar>
+              <w:top w:w="90" w:type="dxa"/>
+              <w:bottom w:w="90" w:type="dxa"/>
+              <w:left w:w="90" w:type="dxa"/>
+              <w:right w:w="90" w:type="dxa"/>
+            </w:tcMar>
+          </w:tcPr>
+          <w:p>
+            <w:pPr>
+              <w:jc w:val="center"/>
+            </w:pPr>
+            <w:r>
+              <w:rPr>
+                <w:b/>
+                <w:color w:val="FFFFFF"/>
+                <w:sz w:val="17"/>
+              </w:rPr>
+              <w:t>Đường Dẫn URL (Videos)</w:t>
+            </w:r>
+          </w:p>
+        </w:tc>
+        <w:tc>
+          <w:tcPr>
+            <w:tcW w:type="dxa" w:w="1872"/>
+            <w:shd w:fill="1E293B"/>
+            <w:tcMar>
+              <w:top w:w="90" w:type="dxa"/>
+              <w:bottom w:w="90" w:type="dxa"/>
+              <w:left w:w="90" w:type="dxa"/>
+              <w:right w:w="90" w:type="dxa"/>
+            </w:tcMar>
+          </w:tcPr>
+          <w:p>
+            <w:pPr>
+              <w:jc w:val="center"/>
+            </w:pPr>
+            <w:r>
+              <w:rPr>
+                <w:b/>
+                <w:color w:val="FFFFFF"/>
+                <w:sz w:val="17"/>
+              </w:rPr>
+              <w:t>Thể Loại</w:t>
+            </w:r>
+          </w:p>
+        </w:tc>
+        <w:tc>
+          <w:tcPr>
+            <w:tcW w:type="dxa" w:w="1728"/>
+            <w:shd w:fill="1E293B"/>
+            <w:tcMar>
+              <w:top w:w="90" w:type="dxa"/>
+              <w:bottom w:w="90" w:type="dxa"/>
+              <w:left w:w="90" w:type="dxa"/>
+              <w:right w:w="90" w:type="dxa"/>
+            </w:tcMar>
+          </w:tcPr>
+          <w:p>
+            <w:pPr>
+              <w:jc w:val="center"/>
+            </w:pPr>
+            <w:r>
+              <w:rPr>
+                <w:b/>
+                <w:color w:val="FFFFFF"/>
+                <w:sz w:val="17"/>
+              </w:rPr>
+              <w:t>Trạng Thái</w:t>
+            </w:r>
+          </w:p>
+        </w:tc>
+      </w:tr>
+      <w:tr>
+        <w:tc>
+          <w:tcPr>
+            <w:tcW w:type="dxa" w:w="720"/>
+            <w:tcMar>
+              <w:top w:w="70" w:type="dxa"/>
+              <w:bottom w:w="70" w:type="dxa"/>
+              <w:left w:w="80" w:type="dxa"/>
+              <w:right w:w="80" w:type="dxa"/>
+            </w:tcMar>
+            <w:shd w:fill="F8FAFC"/>
+          </w:tcPr>
+          <w:p>
+            <w:pPr>
+              <w:jc w:val="center"/>
+            </w:pPr>
+            <w:r>
+              <w:rPr>
+                <w:sz w:val="16"/>
+              </w:rPr>
+              <w:t>51</w:t>
+            </w:r>
+          </w:p>
+        </w:tc>
+        <w:tc>
+          <w:tcPr>
+            <w:tcW w:type="dxa" w:w="3168"/>
+            <w:tcMar>
+              <w:top w:w="70" w:type="dxa"/>
+              <w:bottom w:w="70" w:type="dxa"/>
+              <w:left w:w="80" w:type="dxa"/>
+              <w:right w:w="80" w:type="dxa"/>
+            </w:tcMar>
+          </w:tcPr>
+          <w:p>
+            <w:r>
+              <w:rPr>
+                <w:b/>
+                <w:sz w:val="16"/>
+              </w:rPr>
+              <w:t>Báo Thù Đại Nữ Chủ Review #55</w:t>
+            </w:r>
+          </w:p>
+        </w:tc>
+        <w:tc>
+          <w:tcPr>
+            <w:tcW w:type="dxa" w:w="3312"/>
+            <w:tcMar>
+              <w:top w:w="70" w:type="dxa"/>
+              <w:bottom w:w="70" w:type="dxa"/>
+              <w:left w:w="80" w:type="dxa"/>
+              <w:right w:w="80" w:type="dxa"/>
+            </w:tcMar>
+          </w:tcPr>
+          <w:p>
+            <w:r>
+              <w:rPr>
+                <w:color w:val="2563EB"/>
+                <w:sz w:val="16"/>
+              </w:rPr>
+              <w:t>https://www.facebook.com/phim.both.55/videos</w:t>
+            </w:r>
+          </w:p>
+        </w:tc>
+        <w:tc>
+          <w:tcPr>
+            <w:tcW w:type="dxa" w:w="1872"/>
+            <w:tcMar>
+              <w:top w:w="70" w:type="dxa"/>
+              <w:bottom w:w="70" w:type="dxa"/>
+              <w:left w:w="80" w:type="dxa"/>
+              <w:right w:w="80" w:type="dxa"/>
+            </w:tcMar>
+          </w:tcPr>
+          <w:p>
+            <w:r>
+              <w:rPr>
+                <w:sz w:val="16"/>
+              </w:rPr>
+              <w:t>Nữ Cường</w:t>
+            </w:r>
+          </w:p>
+        </w:tc>
+        <w:tc>
+          <w:tcPr>
+            <w:tcW w:type="dxa" w:w="1728"/>
+            <w:tcMar>
+              <w:top w:w="70" w:type="dxa"/>
+              <w:bottom w:w="70" w:type="dxa"/>
+              <w:left w:w="80" w:type="dxa"/>
+              <w:right w:w="80" w:type="dxa"/>
+            </w:tcMar>
+            <w:shd w:fill="F0FDF4"/>
+          </w:tcPr>
+          <w:p>
+            <w:r>
+              <w:rPr>
+                <w:color w:val="166534"/>
+                <w:sz w:val="16"/>
+              </w:rPr>
+              <w:t>Đã cào &amp; nạp</w:t>
+            </w:r>
+          </w:p>
+        </w:tc>
+      </w:tr>
+      <w:tr>
+        <w:tc>
+          <w:tcPr>
+            <w:tcW w:type="dxa" w:w="720"/>
+            <w:tcMar>
+              <w:top w:w="70" w:type="dxa"/>
+              <w:bottom w:w="70" w:type="dxa"/>
+              <w:left w:w="80" w:type="dxa"/>
+              <w:right w:w="80" w:type="dxa"/>
+            </w:tcMar>
+            <w:shd w:fill="F8FAFC"/>
+          </w:tcPr>
+          <w:p>
+            <w:pPr>
+              <w:jc w:val="center"/>
+            </w:pPr>
+            <w:r>
+              <w:rPr>
+                <w:sz w:val="16"/>
+              </w:rPr>
+              <w:t>52</w:t>
+            </w:r>
+          </w:p>
+        </w:tc>
+        <w:tc>
+          <w:tcPr>
+            <w:tcW w:type="dxa" w:w="3168"/>
+            <w:tcMar>
+              <w:top w:w="70" w:type="dxa"/>
+              <w:bottom w:w="70" w:type="dxa"/>
+              <w:left w:w="80" w:type="dxa"/>
+              <w:right w:w="80" w:type="dxa"/>
+            </w:tcMar>
+          </w:tcPr>
+          <w:p>
+            <w:r>
+              <w:rPr>
+                <w:b/>
+                <w:sz w:val="16"/>
+              </w:rPr>
+              <w:t>Thần Ma Đại Lục Review #56</w:t>
+            </w:r>
+          </w:p>
+        </w:tc>
+        <w:tc>
+          <w:tcPr>
+            <w:tcW w:type="dxa" w:w="3312"/>
+            <w:tcMar>
+              <w:top w:w="70" w:type="dxa"/>
+              <w:bottom w:w="70" w:type="dxa"/>
+              <w:left w:w="80" w:type="dxa"/>
+              <w:right w:w="80" w:type="dxa"/>
+            </w:tcMar>
+          </w:tcPr>
+          <w:p>
+            <w:r>
+              <w:rPr>
+                <w:color w:val="2563EB"/>
+                <w:sz w:val="16"/>
+              </w:rPr>
+              <w:t>https://www.facebook.com/phim.thnma.56/videos</w:t>
+            </w:r>
+          </w:p>
+        </w:tc>
+        <w:tc>
+          <w:tcPr>
+            <w:tcW w:type="dxa" w:w="1872"/>
+            <w:tcMar>
+              <w:top w:w="70" w:type="dxa"/>
+              <w:bottom w:w="70" w:type="dxa"/>
+              <w:left w:w="80" w:type="dxa"/>
+              <w:right w:w="80" w:type="dxa"/>
+            </w:tcMar>
+          </w:tcPr>
+          <w:p>
+            <w:r>
+              <w:rPr>
+                <w:sz w:val="16"/>
+              </w:rPr>
+              <w:t>Donghua 3D</w:t>
+            </w:r>
+          </w:p>
+        </w:tc>
+        <w:tc>
+          <w:tcPr>
+            <w:tcW w:type="dxa" w:w="1728"/>
+            <w:tcMar>
+              <w:top w:w="70" w:type="dxa"/>
+              <w:bottom w:w="70" w:type="dxa"/>
+              <w:left w:w="80" w:type="dxa"/>
+              <w:right w:w="80" w:type="dxa"/>
+            </w:tcMar>
+            <w:shd w:fill="F0FDF4"/>
+          </w:tcPr>
+          <w:p>
+            <w:r>
+              <w:rPr>
+                <w:color w:val="166534"/>
+                <w:sz w:val="16"/>
+              </w:rPr>
+              <w:t>Đã cào &amp; nạp</w:t>
+            </w:r>
+          </w:p>
+        </w:tc>
+      </w:tr>
+      <w:tr>
+        <w:tc>
+          <w:tcPr>
+            <w:tcW w:type="dxa" w:w="720"/>
+            <w:tcMar>
+              <w:top w:w="70" w:type="dxa"/>
+              <w:bottom w:w="70" w:type="dxa"/>
+              <w:left w:w="80" w:type="dxa"/>
+              <w:right w:w="80" w:type="dxa"/>
+            </w:tcMar>
+            <w:shd w:fill="F8FAFC"/>
+          </w:tcPr>
+          <w:p>
+            <w:pPr>
+              <w:jc w:val="center"/>
+            </w:pPr>
+            <w:r>
+              <w:rPr>
+                <w:sz w:val="16"/>
+              </w:rPr>
+              <w:t>53</w:t>
+            </w:r>
+          </w:p>
+        </w:tc>
+        <w:tc>
+          <w:tcPr>
+            <w:tcW w:type="dxa" w:w="3168"/>
+            <w:tcMar>
+              <w:top w:w="70" w:type="dxa"/>
+              <w:bottom w:w="70" w:type="dxa"/>
+              <w:left w:w="80" w:type="dxa"/>
+              <w:right w:w="80" w:type="dxa"/>
+            </w:tcMar>
+          </w:tcPr>
+          <w:p>
+            <w:r>
+              <w:rPr>
+                <w:b/>
+                <w:sz w:val="16"/>
+              </w:rPr>
+              <w:t>Xuyên Không Hệ Thống Review #57</w:t>
+            </w:r>
+          </w:p>
+        </w:tc>
+        <w:tc>
+          <w:tcPr>
+            <w:tcW w:type="dxa" w:w="3312"/>
+            <w:tcMar>
+              <w:top w:w="70" w:type="dxa"/>
+              <w:bottom w:w="70" w:type="dxa"/>
+              <w:left w:w="80" w:type="dxa"/>
+              <w:right w:w="80" w:type="dxa"/>
+            </w:tcMar>
+          </w:tcPr>
+          <w:p>
+            <w:r>
+              <w:rPr>
+                <w:color w:val="2563EB"/>
+                <w:sz w:val="16"/>
+              </w:rPr>
+              <w:t>https://www.facebook.com/phim.xuynkhng.57/videos</w:t>
+            </w:r>
+          </w:p>
+        </w:tc>
+        <w:tc>
+          <w:tcPr>
+            <w:tcW w:type="dxa" w:w="1872"/>
+            <w:tcMar>
+              <w:top w:w="70" w:type="dxa"/>
+              <w:bottom w:w="70" w:type="dxa"/>
+              <w:left w:w="80" w:type="dxa"/>
+              <w:right w:w="80" w:type="dxa"/>
+            </w:tcMar>
+          </w:tcPr>
+          <w:p>
+            <w:r>
+              <w:rPr>
+                <w:sz w:val="16"/>
+              </w:rPr>
+              <w:t>Xuyên Không</w:t>
+            </w:r>
+          </w:p>
+        </w:tc>
+        <w:tc>
+          <w:tcPr>
+            <w:tcW w:type="dxa" w:w="1728"/>
+            <w:tcMar>
+              <w:top w:w="70" w:type="dxa"/>
+              <w:bottom w:w="70" w:type="dxa"/>
+              <w:left w:w="80" w:type="dxa"/>
+              <w:right w:w="80" w:type="dxa"/>
+            </w:tcMar>
+            <w:shd w:fill="F0FDF4"/>
+          </w:tcPr>
+          <w:p>
+            <w:r>
+              <w:rPr>
+                <w:color w:val="166534"/>
+                <w:sz w:val="16"/>
+              </w:rPr>
+              <w:t>Đã cào &amp; nạp</w:t>
+            </w:r>
+          </w:p>
+        </w:tc>
+      </w:tr>
+      <w:tr>
+        <w:tc>
+          <w:tcPr>
+            <w:tcW w:type="dxa" w:w="720"/>
+            <w:tcMar>
+              <w:top w:w="70" w:type="dxa"/>
+              <w:bottom w:w="70" w:type="dxa"/>
+              <w:left w:w="80" w:type="dxa"/>
+              <w:right w:w="80" w:type="dxa"/>
+            </w:tcMar>
+            <w:shd w:fill="F8FAFC"/>
+          </w:tcPr>
+          <w:p>
+            <w:pPr>
+              <w:jc w:val="center"/>
+            </w:pPr>
+            <w:r>
+              <w:rPr>
+                <w:sz w:val="16"/>
+              </w:rPr>
+              <w:t>54</w:t>
+            </w:r>
+          </w:p>
+        </w:tc>
+        <w:tc>
+          <w:tcPr>
+            <w:tcW w:type="dxa" w:w="3168"/>
+            <w:tcMar>
+              <w:top w:w="70" w:type="dxa"/>
+              <w:bottom w:w="70" w:type="dxa"/>
+              <w:left w:w="80" w:type="dxa"/>
+              <w:right w:w="80" w:type="dxa"/>
+            </w:tcMar>
+          </w:tcPr>
+          <w:p>
+            <w:r>
+              <w:rPr>
+                <w:b/>
+                <w:sz w:val="16"/>
+              </w:rPr>
+              <w:t>Võ Thần Chúa Tể Review #58</w:t>
+            </w:r>
+          </w:p>
+        </w:tc>
+        <w:tc>
+          <w:tcPr>
+            <w:tcW w:type="dxa" w:w="3312"/>
+            <w:tcMar>
+              <w:top w:w="70" w:type="dxa"/>
+              <w:bottom w:w="70" w:type="dxa"/>
+              <w:left w:w="80" w:type="dxa"/>
+              <w:right w:w="80" w:type="dxa"/>
+            </w:tcMar>
+          </w:tcPr>
+          <w:p>
+            <w:r>
+              <w:rPr>
+                <w:color w:val="2563EB"/>
+                <w:sz w:val="16"/>
+              </w:rPr>
+              <w:t>https://www.facebook.com/phim.vthn.58/videos</w:t>
+            </w:r>
+          </w:p>
+        </w:tc>
+        <w:tc>
+          <w:tcPr>
+            <w:tcW w:type="dxa" w:w="1872"/>
+            <w:tcMar>
+              <w:top w:w="70" w:type="dxa"/>
+              <w:bottom w:w="70" w:type="dxa"/>
+              <w:left w:w="80" w:type="dxa"/>
+              <w:right w:w="80" w:type="dxa"/>
+            </w:tcMar>
+          </w:tcPr>
+          <w:p>
+            <w:r>
+              <w:rPr>
+                <w:sz w:val="16"/>
+              </w:rPr>
+              <w:t>Huyền Huyễn</w:t>
+            </w:r>
+          </w:p>
+        </w:tc>
+        <w:tc>
+          <w:tcPr>
+            <w:tcW w:type="dxa" w:w="1728"/>
+            <w:tcMar>
+              <w:top w:w="70" w:type="dxa"/>
+              <w:bottom w:w="70" w:type="dxa"/>
+              <w:left w:w="80" w:type="dxa"/>
+              <w:right w:w="80" w:type="dxa"/>
+            </w:tcMar>
+            <w:shd w:fill="F0FDF4"/>
+          </w:tcPr>
+          <w:p>
+            <w:r>
+              <w:rPr>
+                <w:color w:val="166534"/>
+                <w:sz w:val="16"/>
+              </w:rPr>
+              <w:t>Đã cào &amp; nạp</w:t>
+            </w:r>
+          </w:p>
+        </w:tc>
+      </w:tr>
+      <w:tr>
+        <w:tc>
+          <w:tcPr>
+            <w:tcW w:type="dxa" w:w="720"/>
+            <w:tcMar>
+              <w:top w:w="70" w:type="dxa"/>
+              <w:bottom w:w="70" w:type="dxa"/>
+              <w:left w:w="80" w:type="dxa"/>
+              <w:right w:w="80" w:type="dxa"/>
+            </w:tcMar>
+            <w:shd w:fill="F8FAFC"/>
+          </w:tcPr>
+          <w:p>
+            <w:pPr>
+              <w:jc w:val="center"/>
+            </w:pPr>
+            <w:r>
+              <w:rPr>
+                <w:sz w:val="16"/>
+              </w:rPr>
+              <w:t>55</w:t>
+            </w:r>
+          </w:p>
+        </w:tc>
+        <w:tc>
+          <w:tcPr>
+            <w:tcW w:type="dxa" w:w="3168"/>
+            <w:tcMar>
+              <w:top w:w="70" w:type="dxa"/>
+              <w:bottom w:w="70" w:type="dxa"/>
+              <w:left w:w="80" w:type="dxa"/>
+              <w:right w:w="80" w:type="dxa"/>
+            </w:tcMar>
+          </w:tcPr>
+          <w:p>
+            <w:r>
+              <w:rPr>
+                <w:b/>
+                <w:sz w:val="16"/>
+              </w:rPr>
+              <w:t>Tổng Tài Hào Môn Review #59</w:t>
+            </w:r>
+          </w:p>
+        </w:tc>
+        <w:tc>
+          <w:tcPr>
+            <w:tcW w:type="dxa" w:w="3312"/>
+            <w:tcMar>
+              <w:top w:w="70" w:type="dxa"/>
+              <w:bottom w:w="70" w:type="dxa"/>
+              <w:left w:w="80" w:type="dxa"/>
+              <w:right w:w="80" w:type="dxa"/>
+            </w:tcMar>
+          </w:tcPr>
+          <w:p>
+            <w:r>
+              <w:rPr>
+                <w:color w:val="2563EB"/>
+                <w:sz w:val="16"/>
+              </w:rPr>
+              <w:t>https://www.facebook.com/phim.tngti.59/videos</w:t>
+            </w:r>
+          </w:p>
+        </w:tc>
+        <w:tc>
+          <w:tcPr>
+            <w:tcW w:type="dxa" w:w="1872"/>
+            <w:tcMar>
+              <w:top w:w="70" w:type="dxa"/>
+              <w:bottom w:w="70" w:type="dxa"/>
+              <w:left w:w="80" w:type="dxa"/>
+              <w:right w:w="80" w:type="dxa"/>
+            </w:tcMar>
+          </w:tcPr>
+          <w:p>
+            <w:r>
+              <w:rPr>
+                <w:sz w:val="16"/>
+              </w:rPr>
+              <w:t>Đô Thị</w:t>
+            </w:r>
+          </w:p>
+        </w:tc>
+        <w:tc>
+          <w:tcPr>
+            <w:tcW w:type="dxa" w:w="1728"/>
+            <w:tcMar>
+              <w:top w:w="70" w:type="dxa"/>
+              <w:bottom w:w="70" w:type="dxa"/>
+              <w:left w:w="80" w:type="dxa"/>
+              <w:right w:w="80" w:type="dxa"/>
+            </w:tcMar>
+            <w:shd w:fill="F0FDF4"/>
+          </w:tcPr>
+          <w:p>
+            <w:r>
+              <w:rPr>
+                <w:color w:val="166534"/>
+                <w:sz w:val="16"/>
+              </w:rPr>
+              <w:t>Đã cào &amp; nạp</w:t>
+            </w:r>
+          </w:p>
+        </w:tc>
+      </w:tr>
+    </w:tbl>
+    <w:p/>
+    <w:p>
+      <w:r>
+        <w:rPr>
+          <w:b/>
+          <w:color w:val="1E293B"/>
+          <w:sz w:val="22"/>
+        </w:rPr>
+        <w:t>📁 LÔ 12 (n+1 MỚI): Tuyển Tập Kênh Mới Hoàn Toàn #12</w:t>
+        <w:br/>
+      </w:r>
+      <w:r>
+        <w:rPr>
+          <w:b/>
+          <w:color w:val="0E7490"/>
+          <w:sz w:val="19"/>
+        </w:rPr>
+        <w:t>Trạng thái: ⭐ ĐANG CÀO (Lô n+1 = 12)</w:t>
+      </w:r>
+    </w:p>
+    <w:tbl>
+      <w:tblPr>
+        <w:tblW w:type="auto" w:w="0"/>
+        <w:jc w:val="center"/>
+        <w:tblLook w:firstColumn="1" w:firstRow="1" w:lastColumn="0" w:lastRow="0" w:noHBand="0" w:noVBand="1" w:val="04A0"/>
+      </w:tblPr>
+      <w:tblGrid>
+        <w:gridCol w:w="2045"/>
+        <w:gridCol w:w="2045"/>
+        <w:gridCol w:w="2045"/>
+        <w:gridCol w:w="2045"/>
+        <w:gridCol w:w="2045"/>
+      </w:tblGrid>
+      <w:tr>
+        <w:tc>
+          <w:tcPr>
+            <w:tcW w:type="dxa" w:w="720"/>
+            <w:shd w:fill="1E293B"/>
+            <w:tcMar>
+              <w:top w:w="90" w:type="dxa"/>
+              <w:bottom w:w="90" w:type="dxa"/>
+              <w:left w:w="90" w:type="dxa"/>
+              <w:right w:w="90" w:type="dxa"/>
+            </w:tcMar>
+          </w:tcPr>
+          <w:p>
+            <w:pPr>
+              <w:jc w:val="center"/>
+            </w:pPr>
+            <w:r>
+              <w:rPr>
+                <w:b/>
+                <w:color w:val="FFFFFF"/>
+                <w:sz w:val="17"/>
+              </w:rPr>
+              <w:t>STT</w:t>
+            </w:r>
+          </w:p>
+        </w:tc>
+        <w:tc>
+          <w:tcPr>
+            <w:tcW w:type="dxa" w:w="3168"/>
+            <w:shd w:fill="1E293B"/>
+            <w:tcMar>
+              <w:top w:w="90" w:type="dxa"/>
+              <w:bottom w:w="90" w:type="dxa"/>
+              <w:left w:w="90" w:type="dxa"/>
+              <w:right w:w="90" w:type="dxa"/>
+            </w:tcMar>
+          </w:tcPr>
+          <w:p>
+            <w:pPr>
+              <w:jc w:val="center"/>
+            </w:pPr>
+            <w:r>
+              <w:rPr>
+                <w:b/>
+                <w:color w:val="FFFFFF"/>
+                <w:sz w:val="17"/>
+              </w:rPr>
+              <w:t>Tên Kênh / Fanpage</w:t>
+            </w:r>
+          </w:p>
+        </w:tc>
+        <w:tc>
+          <w:tcPr>
+            <w:tcW w:type="dxa" w:w="3312"/>
+            <w:shd w:fill="1E293B"/>
+            <w:tcMar>
+              <w:top w:w="90" w:type="dxa"/>
+              <w:bottom w:w="90" w:type="dxa"/>
+              <w:left w:w="90" w:type="dxa"/>
+              <w:right w:w="90" w:type="dxa"/>
+            </w:tcMar>
+          </w:tcPr>
+          <w:p>
+            <w:pPr>
+              <w:jc w:val="center"/>
+            </w:pPr>
+            <w:r>
+              <w:rPr>
+                <w:b/>
+                <w:color w:val="FFFFFF"/>
+                <w:sz w:val="17"/>
+              </w:rPr>
+              <w:t>Đường Dẫn URL (Videos)</w:t>
+            </w:r>
+          </w:p>
+        </w:tc>
+        <w:tc>
+          <w:tcPr>
+            <w:tcW w:type="dxa" w:w="1872"/>
+            <w:shd w:fill="1E293B"/>
+            <w:tcMar>
+              <w:top w:w="90" w:type="dxa"/>
+              <w:bottom w:w="90" w:type="dxa"/>
+              <w:left w:w="90" w:type="dxa"/>
+              <w:right w:w="90" w:type="dxa"/>
+            </w:tcMar>
+          </w:tcPr>
+          <w:p>
+            <w:pPr>
+              <w:jc w:val="center"/>
+            </w:pPr>
+            <w:r>
+              <w:rPr>
+                <w:b/>
+                <w:color w:val="FFFFFF"/>
+                <w:sz w:val="17"/>
+              </w:rPr>
+              <w:t>Thể Loại</w:t>
+            </w:r>
+          </w:p>
+        </w:tc>
+        <w:tc>
+          <w:tcPr>
+            <w:tcW w:type="dxa" w:w="1728"/>
+            <w:shd w:fill="1E293B"/>
+            <w:tcMar>
+              <w:top w:w="90" w:type="dxa"/>
+              <w:bottom w:w="90" w:type="dxa"/>
+              <w:left w:w="90" w:type="dxa"/>
+              <w:right w:w="90" w:type="dxa"/>
+            </w:tcMar>
+          </w:tcPr>
+          <w:p>
+            <w:pPr>
+              <w:jc w:val="center"/>
+            </w:pPr>
+            <w:r>
+              <w:rPr>
+                <w:b/>
+                <w:color w:val="FFFFFF"/>
+                <w:sz w:val="17"/>
+              </w:rPr>
+              <w:t>Trạng Thái</w:t>
+            </w:r>
+          </w:p>
+        </w:tc>
+      </w:tr>
+      <w:tr>
+        <w:tc>
+          <w:tcPr>
+            <w:tcW w:type="dxa" w:w="720"/>
+            <w:tcMar>
+              <w:top w:w="70" w:type="dxa"/>
+              <w:bottom w:w="70" w:type="dxa"/>
+              <w:left w:w="80" w:type="dxa"/>
+              <w:right w:w="80" w:type="dxa"/>
+            </w:tcMar>
+            <w:shd w:fill="F8FAFC"/>
+          </w:tcPr>
+          <w:p>
+            <w:pPr>
+              <w:jc w:val="center"/>
+            </w:pPr>
+            <w:r>
+              <w:rPr>
+                <w:sz w:val="16"/>
+              </w:rPr>
+              <w:t>56</w:t>
+            </w:r>
+          </w:p>
+        </w:tc>
+        <w:tc>
+          <w:tcPr>
+            <w:tcW w:type="dxa" w:w="3168"/>
+            <w:tcMar>
+              <w:top w:w="70" w:type="dxa"/>
+              <w:bottom w:w="70" w:type="dxa"/>
+              <w:left w:w="80" w:type="dxa"/>
+              <w:right w:w="80" w:type="dxa"/>
+            </w:tcMar>
+          </w:tcPr>
+          <w:p>
+            <w:r>
+              <w:rPr>
+                <w:b/>
+                <w:sz w:val="16"/>
+              </w:rPr>
+              <w:t>Đấu Phá Tu Chân Review #60</w:t>
+            </w:r>
+          </w:p>
+        </w:tc>
+        <w:tc>
+          <w:tcPr>
+            <w:tcW w:type="dxa" w:w="3312"/>
+            <w:tcMar>
+              <w:top w:w="70" w:type="dxa"/>
+              <w:bottom w:w="70" w:type="dxa"/>
+              <w:left w:w="80" w:type="dxa"/>
+              <w:right w:w="80" w:type="dxa"/>
+            </w:tcMar>
+          </w:tcPr>
+          <w:p>
+            <w:r>
+              <w:rPr>
+                <w:color w:val="2563EB"/>
+                <w:sz w:val="16"/>
+              </w:rPr>
+              <w:t>https://www.facebook.com/phim.uph.60/videos</w:t>
+            </w:r>
+          </w:p>
+        </w:tc>
+        <w:tc>
+          <w:tcPr>
+            <w:tcW w:type="dxa" w:w="1872"/>
+            <w:tcMar>
+              <w:top w:w="70" w:type="dxa"/>
+              <w:bottom w:w="70" w:type="dxa"/>
+              <w:left w:w="80" w:type="dxa"/>
+              <w:right w:w="80" w:type="dxa"/>
+            </w:tcMar>
+          </w:tcPr>
+          <w:p>
+            <w:r>
+              <w:rPr>
+                <w:sz w:val="16"/>
+              </w:rPr>
+              <w:t>Tu Tiên 3D</w:t>
+            </w:r>
+          </w:p>
+        </w:tc>
+        <w:tc>
+          <w:tcPr>
+            <w:tcW w:type="dxa" w:w="1728"/>
+            <w:tcMar>
+              <w:top w:w="70" w:type="dxa"/>
+              <w:bottom w:w="70" w:type="dxa"/>
+              <w:left w:w="80" w:type="dxa"/>
+              <w:right w:w="80" w:type="dxa"/>
+            </w:tcMar>
+            <w:shd w:fill="EFF6FF"/>
+          </w:tcPr>
+          <w:p>
+            <w:r>
+              <w:rPr>
+                <w:color w:val="1D4ED8"/>
+                <w:sz w:val="16"/>
+              </w:rPr>
+              <w:t>Chờ quét Lô n+1</w:t>
+            </w:r>
+          </w:p>
+        </w:tc>
+      </w:tr>
+      <w:tr>
+        <w:tc>
+          <w:tcPr>
+            <w:tcW w:type="dxa" w:w="720"/>
+            <w:tcMar>
+              <w:top w:w="70" w:type="dxa"/>
+              <w:bottom w:w="70" w:type="dxa"/>
+              <w:left w:w="80" w:type="dxa"/>
+              <w:right w:w="80" w:type="dxa"/>
+            </w:tcMar>
+            <w:shd w:fill="F8FAFC"/>
+          </w:tcPr>
+          <w:p>
+            <w:pPr>
+              <w:jc w:val="center"/>
+            </w:pPr>
+            <w:r>
+              <w:rPr>
+                <w:sz w:val="16"/>
+              </w:rPr>
+              <w:t>57</w:t>
+            </w:r>
+          </w:p>
+        </w:tc>
+        <w:tc>
+          <w:tcPr>
+            <w:tcW w:type="dxa" w:w="3168"/>
+            <w:tcMar>
+              <w:top w:w="70" w:type="dxa"/>
+              <w:bottom w:w="70" w:type="dxa"/>
+              <w:left w:w="80" w:type="dxa"/>
+              <w:right w:w="80" w:type="dxa"/>
+            </w:tcMar>
+          </w:tcPr>
+          <w:p>
+            <w:r>
+              <w:rPr>
+                <w:b/>
+                <w:sz w:val="16"/>
+              </w:rPr>
+              <w:t>Nghịch Thiên Kỳ Tích Review #61</w:t>
+            </w:r>
+          </w:p>
+        </w:tc>
+        <w:tc>
+          <w:tcPr>
+            <w:tcW w:type="dxa" w:w="3312"/>
+            <w:tcMar>
+              <w:top w:w="70" w:type="dxa"/>
+              <w:bottom w:w="70" w:type="dxa"/>
+              <w:left w:w="80" w:type="dxa"/>
+              <w:right w:w="80" w:type="dxa"/>
+            </w:tcMar>
+          </w:tcPr>
+          <w:p>
+            <w:r>
+              <w:rPr>
+                <w:color w:val="2563EB"/>
+                <w:sz w:val="16"/>
+              </w:rPr>
+              <w:t>https://www.facebook.com/phim.nghchthin.61/videos</w:t>
+            </w:r>
+          </w:p>
+        </w:tc>
+        <w:tc>
+          <w:tcPr>
+            <w:tcW w:type="dxa" w:w="1872"/>
+            <w:tcMar>
+              <w:top w:w="70" w:type="dxa"/>
+              <w:bottom w:w="70" w:type="dxa"/>
+              <w:left w:w="80" w:type="dxa"/>
+              <w:right w:w="80" w:type="dxa"/>
+            </w:tcMar>
+          </w:tcPr>
+          <w:p>
+            <w:r>
+              <w:rPr>
+                <w:sz w:val="16"/>
+              </w:rPr>
+              <w:t>Trọng Sinh</w:t>
+            </w:r>
+          </w:p>
+        </w:tc>
+        <w:tc>
+          <w:tcPr>
+            <w:tcW w:type="dxa" w:w="1728"/>
+            <w:tcMar>
+              <w:top w:w="70" w:type="dxa"/>
+              <w:bottom w:w="70" w:type="dxa"/>
+              <w:left w:w="80" w:type="dxa"/>
+              <w:right w:w="80" w:type="dxa"/>
+            </w:tcMar>
+            <w:shd w:fill="EFF6FF"/>
+          </w:tcPr>
+          <w:p>
+            <w:r>
+              <w:rPr>
+                <w:color w:val="1D4ED8"/>
+                <w:sz w:val="16"/>
+              </w:rPr>
+              <w:t>Chờ quét Lô n+1</w:t>
+            </w:r>
+          </w:p>
+        </w:tc>
+      </w:tr>
+      <w:tr>
+        <w:tc>
+          <w:tcPr>
+            <w:tcW w:type="dxa" w:w="720"/>
+            <w:tcMar>
+              <w:top w:w="70" w:type="dxa"/>
+              <w:bottom w:w="70" w:type="dxa"/>
+              <w:left w:w="80" w:type="dxa"/>
+              <w:right w:w="80" w:type="dxa"/>
+            </w:tcMar>
+            <w:shd w:fill="F8FAFC"/>
+          </w:tcPr>
+          <w:p>
+            <w:pPr>
+              <w:jc w:val="center"/>
+            </w:pPr>
+            <w:r>
+              <w:rPr>
+                <w:sz w:val="16"/>
+              </w:rPr>
+              <w:t>58</w:t>
+            </w:r>
+          </w:p>
+        </w:tc>
+        <w:tc>
+          <w:tcPr>
+            <w:tcW w:type="dxa" w:w="3168"/>
+            <w:tcMar>
+              <w:top w:w="70" w:type="dxa"/>
+              <w:bottom w:w="70" w:type="dxa"/>
+              <w:left w:w="80" w:type="dxa"/>
+              <w:right w:w="80" w:type="dxa"/>
+            </w:tcMar>
+          </w:tcPr>
+          <w:p>
+            <w:r>
+              <w:rPr>
+                <w:b/>
+                <w:sz w:val="16"/>
+              </w:rPr>
+              <w:t>Tiên Tôn Xuất Sơn Review #62</w:t>
+            </w:r>
+          </w:p>
+        </w:tc>
+        <w:tc>
+          <w:tcPr>
+            <w:tcW w:type="dxa" w:w="3312"/>
+            <w:tcMar>
+              <w:top w:w="70" w:type="dxa"/>
+              <w:bottom w:w="70" w:type="dxa"/>
+              <w:left w:w="80" w:type="dxa"/>
+              <w:right w:w="80" w:type="dxa"/>
+            </w:tcMar>
+          </w:tcPr>
+          <w:p>
+            <w:r>
+              <w:rPr>
+                <w:color w:val="2563EB"/>
+                <w:sz w:val="16"/>
+              </w:rPr>
+              <w:t>https://www.facebook.com/phim.tintn.62/videos</w:t>
+            </w:r>
+          </w:p>
+        </w:tc>
+        <w:tc>
+          <w:tcPr>
+            <w:tcW w:type="dxa" w:w="1872"/>
+            <w:tcMar>
+              <w:top w:w="70" w:type="dxa"/>
+              <w:bottom w:w="70" w:type="dxa"/>
+              <w:left w:w="80" w:type="dxa"/>
+              <w:right w:w="80" w:type="dxa"/>
+            </w:tcMar>
+          </w:tcPr>
+          <w:p>
+            <w:r>
+              <w:rPr>
+                <w:sz w:val="16"/>
+              </w:rPr>
+              <w:t>Tiên Hiệp</w:t>
+            </w:r>
+          </w:p>
+        </w:tc>
+        <w:tc>
+          <w:tcPr>
+            <w:tcW w:type="dxa" w:w="1728"/>
+            <w:tcMar>
+              <w:top w:w="70" w:type="dxa"/>
+              <w:bottom w:w="70" w:type="dxa"/>
+              <w:left w:w="80" w:type="dxa"/>
+              <w:right w:w="80" w:type="dxa"/>
+            </w:tcMar>
+            <w:shd w:fill="EFF6FF"/>
+          </w:tcPr>
+          <w:p>
+            <w:r>
+              <w:rPr>
+                <w:color w:val="1D4ED8"/>
+                <w:sz w:val="16"/>
+              </w:rPr>
+              <w:t>Chờ quét Lô n+1</w:t>
+            </w:r>
+          </w:p>
+        </w:tc>
+      </w:tr>
+      <w:tr>
+        <w:tc>
+          <w:tcPr>
+            <w:tcW w:type="dxa" w:w="720"/>
+            <w:tcMar>
+              <w:top w:w="70" w:type="dxa"/>
+              <w:bottom w:w="70" w:type="dxa"/>
+              <w:left w:w="80" w:type="dxa"/>
+              <w:right w:w="80" w:type="dxa"/>
+            </w:tcMar>
+            <w:shd w:fill="F8FAFC"/>
+          </w:tcPr>
+          <w:p>
+            <w:pPr>
+              <w:jc w:val="center"/>
+            </w:pPr>
+            <w:r>
+              <w:rPr>
+                <w:sz w:val="16"/>
+              </w:rPr>
+              <w:t>59</w:t>
+            </w:r>
+          </w:p>
+        </w:tc>
+        <w:tc>
+          <w:tcPr>
+            <w:tcW w:type="dxa" w:w="3168"/>
+            <w:tcMar>
+              <w:top w:w="70" w:type="dxa"/>
+              <w:bottom w:w="70" w:type="dxa"/>
+              <w:left w:w="80" w:type="dxa"/>
+              <w:right w:w="80" w:type="dxa"/>
+            </w:tcMar>
+          </w:tcPr>
+          <w:p>
+            <w:r>
+              <w:rPr>
+                <w:b/>
+                <w:sz w:val="16"/>
+              </w:rPr>
+              <w:t>Chiến Thần Trở Về Review #63</w:t>
+            </w:r>
+          </w:p>
+        </w:tc>
+        <w:tc>
+          <w:tcPr>
+            <w:tcW w:type="dxa" w:w="3312"/>
+            <w:tcMar>
+              <w:top w:w="70" w:type="dxa"/>
+              <w:bottom w:w="70" w:type="dxa"/>
+              <w:left w:w="80" w:type="dxa"/>
+              <w:right w:w="80" w:type="dxa"/>
+            </w:tcMar>
+          </w:tcPr>
+          <w:p>
+            <w:r>
+              <w:rPr>
+                <w:color w:val="2563EB"/>
+                <w:sz w:val="16"/>
+              </w:rPr>
+              <w:t>https://www.facebook.com/phim.chinthn.63/videos</w:t>
+            </w:r>
+          </w:p>
+        </w:tc>
+        <w:tc>
+          <w:tcPr>
+            <w:tcW w:type="dxa" w:w="1872"/>
+            <w:tcMar>
+              <w:top w:w="70" w:type="dxa"/>
+              <w:bottom w:w="70" w:type="dxa"/>
+              <w:left w:w="80" w:type="dxa"/>
+              <w:right w:w="80" w:type="dxa"/>
+            </w:tcMar>
+          </w:tcPr>
+          <w:p>
+            <w:r>
+              <w:rPr>
+                <w:sz w:val="16"/>
+              </w:rPr>
+              <w:t>Binh Vương</w:t>
+            </w:r>
+          </w:p>
+        </w:tc>
+        <w:tc>
+          <w:tcPr>
+            <w:tcW w:type="dxa" w:w="1728"/>
+            <w:tcMar>
+              <w:top w:w="70" w:type="dxa"/>
+              <w:bottom w:w="70" w:type="dxa"/>
+              <w:left w:w="80" w:type="dxa"/>
+              <w:right w:w="80" w:type="dxa"/>
+            </w:tcMar>
+            <w:shd w:fill="EFF6FF"/>
+          </w:tcPr>
+          <w:p>
+            <w:r>
+              <w:rPr>
+                <w:color w:val="1D4ED8"/>
+                <w:sz w:val="16"/>
+              </w:rPr>
+              <w:t>Chờ quét Lô n+1</w:t>
+            </w:r>
+          </w:p>
+        </w:tc>
+      </w:tr>
+      <w:tr>
+        <w:tc>
+          <w:tcPr>
+            <w:tcW w:type="dxa" w:w="720"/>
+            <w:tcMar>
+              <w:top w:w="70" w:type="dxa"/>
+              <w:bottom w:w="70" w:type="dxa"/>
+              <w:left w:w="80" w:type="dxa"/>
+              <w:right w:w="80" w:type="dxa"/>
+            </w:tcMar>
+            <w:shd w:fill="F8FAFC"/>
+          </w:tcPr>
+          <w:p>
+            <w:pPr>
+              <w:jc w:val="center"/>
+            </w:pPr>
+            <w:r>
+              <w:rPr>
+                <w:sz w:val="16"/>
+              </w:rPr>
+              <w:t>60</w:t>
+            </w:r>
+          </w:p>
+        </w:tc>
+        <w:tc>
+          <w:tcPr>
+            <w:tcW w:type="dxa" w:w="3168"/>
+            <w:tcMar>
+              <w:top w:w="70" w:type="dxa"/>
+              <w:bottom w:w="70" w:type="dxa"/>
+              <w:left w:w="80" w:type="dxa"/>
+              <w:right w:w="80" w:type="dxa"/>
+            </w:tcMar>
+          </w:tcPr>
+          <w:p>
+            <w:r>
+              <w:rPr>
+                <w:b/>
+                <w:sz w:val="16"/>
+              </w:rPr>
+              <w:t>Vạn Cổ Thần Đế Review #64</w:t>
+            </w:r>
+          </w:p>
+        </w:tc>
+        <w:tc>
+          <w:tcPr>
+            <w:tcW w:type="dxa" w:w="3312"/>
+            <w:tcMar>
+              <w:top w:w="70" w:type="dxa"/>
+              <w:bottom w:w="70" w:type="dxa"/>
+              <w:left w:w="80" w:type="dxa"/>
+              <w:right w:w="80" w:type="dxa"/>
+            </w:tcMar>
+          </w:tcPr>
+          <w:p>
+            <w:r>
+              <w:rPr>
+                <w:color w:val="2563EB"/>
+                <w:sz w:val="16"/>
+              </w:rPr>
+              <w:t>https://www.facebook.com/phim.vnc.64/videos</w:t>
+            </w:r>
+          </w:p>
+        </w:tc>
+        <w:tc>
+          <w:tcPr>
+            <w:tcW w:type="dxa" w:w="1872"/>
+            <w:tcMar>
+              <w:top w:w="70" w:type="dxa"/>
+              <w:bottom w:w="70" w:type="dxa"/>
+              <w:left w:w="80" w:type="dxa"/>
+              <w:right w:w="80" w:type="dxa"/>
+            </w:tcMar>
+          </w:tcPr>
+          <w:p>
+            <w:r>
+              <w:rPr>
+                <w:sz w:val="16"/>
+              </w:rPr>
+              <w:t>Huyền Ảo</w:t>
             </w:r>
           </w:p>
         </w:tc>

</xml_diff>

<commit_message>
feat(database): update 192 movies, sync batch 13 and thumbnails
</commit_message>
<xml_diff>
--- a/Danh_Sach_Kenh_Da_Cao.docx
+++ b/Danh_Sach_Kenh_Da_Cao.docx
@@ -29,7 +29,7 @@
           <w:color w:val="64748B"/>
           <w:sz w:val="20"/>
         </w:rPr>
-        <w:t>Hệ thống: Mở Rộng Vô Hạn Lô (n+1) Không Trùng Lặp | Tổng: 12 Lô (60 Kênh) | 09/10/2026 01:42:22</w:t>
+        <w:t>Hệ thống: Mở Rộng Vô Hạn Lô (n+1) Không Trùng Lặp | Tổng: 13 Lô (65 Kênh) | 09/10/2026 01:50:03</w:t>
       </w:r>
     </w:p>
     <w:p/>
@@ -7647,10 +7647,10 @@
       <w:r>
         <w:rPr>
           <w:b/>
-          <w:color w:val="0E7490"/>
+          <w:color w:val="166534"/>
           <w:sz w:val="19"/>
         </w:rPr>
-        <w:t>Trạng thái: ⭐ ĐANG CÀO (Lô n+1 = 12)</w:t>
+        <w:t>Trạng thái: ĐÃ CÀO</w:t>
       </w:r>
     </w:p>
     <w:tbl>
@@ -7885,15 +7885,15 @@
               <w:left w:w="80" w:type="dxa"/>
               <w:right w:w="80" w:type="dxa"/>
             </w:tcMar>
-            <w:shd w:fill="EFF6FF"/>
-          </w:tcPr>
-          <w:p>
-            <w:r>
-              <w:rPr>
-                <w:color w:val="1D4ED8"/>
+            <w:shd w:fill="F0FDF4"/>
+          </w:tcPr>
+          <w:p>
+            <w:r>
+              <w:rPr>
+                <w:color w:val="166534"/>
                 <w:sz w:val="16"/>
               </w:rPr>
-              <w:t>Chờ quét Lô n+1</w:t>
+              <w:t>Đã cào &amp; nạp</w:t>
             </w:r>
           </w:p>
         </w:tc>
@@ -7990,15 +7990,15 @@
               <w:left w:w="80" w:type="dxa"/>
               <w:right w:w="80" w:type="dxa"/>
             </w:tcMar>
-            <w:shd w:fill="EFF6FF"/>
-          </w:tcPr>
-          <w:p>
-            <w:r>
-              <w:rPr>
-                <w:color w:val="1D4ED8"/>
+            <w:shd w:fill="F0FDF4"/>
+          </w:tcPr>
+          <w:p>
+            <w:r>
+              <w:rPr>
+                <w:color w:val="166534"/>
                 <w:sz w:val="16"/>
               </w:rPr>
-              <w:t>Chờ quét Lô n+1</w:t>
+              <w:t>Đã cào &amp; nạp</w:t>
             </w:r>
           </w:p>
         </w:tc>
@@ -8095,15 +8095,15 @@
               <w:left w:w="80" w:type="dxa"/>
               <w:right w:w="80" w:type="dxa"/>
             </w:tcMar>
-            <w:shd w:fill="EFF6FF"/>
-          </w:tcPr>
-          <w:p>
-            <w:r>
-              <w:rPr>
-                <w:color w:val="1D4ED8"/>
+            <w:shd w:fill="F0FDF4"/>
+          </w:tcPr>
+          <w:p>
+            <w:r>
+              <w:rPr>
+                <w:color w:val="166534"/>
                 <w:sz w:val="16"/>
               </w:rPr>
-              <w:t>Chờ quét Lô n+1</w:t>
+              <w:t>Đã cào &amp; nạp</w:t>
             </w:r>
           </w:p>
         </w:tc>
@@ -8200,15 +8200,15 @@
               <w:left w:w="80" w:type="dxa"/>
               <w:right w:w="80" w:type="dxa"/>
             </w:tcMar>
-            <w:shd w:fill="EFF6FF"/>
-          </w:tcPr>
-          <w:p>
-            <w:r>
-              <w:rPr>
-                <w:color w:val="1D4ED8"/>
+            <w:shd w:fill="F0FDF4"/>
+          </w:tcPr>
+          <w:p>
+            <w:r>
+              <w:rPr>
+                <w:color w:val="166534"/>
                 <w:sz w:val="16"/>
               </w:rPr>
-              <w:t>Chờ quét Lô n+1</w:t>
+              <w:t>Đã cào &amp; nạp</w:t>
             </w:r>
           </w:p>
         </w:tc>
@@ -8293,6 +8293,692 @@
                 <w:sz w:val="16"/>
               </w:rPr>
               <w:t>Huyền Ảo</w:t>
+            </w:r>
+          </w:p>
+        </w:tc>
+        <w:tc>
+          <w:tcPr>
+            <w:tcW w:type="dxa" w:w="1728"/>
+            <w:tcMar>
+              <w:top w:w="70" w:type="dxa"/>
+              <w:bottom w:w="70" w:type="dxa"/>
+              <w:left w:w="80" w:type="dxa"/>
+              <w:right w:w="80" w:type="dxa"/>
+            </w:tcMar>
+            <w:shd w:fill="F0FDF4"/>
+          </w:tcPr>
+          <w:p>
+            <w:r>
+              <w:rPr>
+                <w:color w:val="166534"/>
+                <w:sz w:val="16"/>
+              </w:rPr>
+              <w:t>Đã cào &amp; nạp</w:t>
+            </w:r>
+          </w:p>
+        </w:tc>
+      </w:tr>
+    </w:tbl>
+    <w:p/>
+    <w:p>
+      <w:r>
+        <w:rPr>
+          <w:b/>
+          <w:color w:val="1E293B"/>
+          <w:sz w:val="22"/>
+        </w:rPr>
+        <w:t>📁 LÔ 13 (n+1 MỚI): Tuyển Tập Kênh Mới Hoàn Toàn #13</w:t>
+        <w:br/>
+      </w:r>
+      <w:r>
+        <w:rPr>
+          <w:b/>
+          <w:color w:val="0E7490"/>
+          <w:sz w:val="19"/>
+        </w:rPr>
+        <w:t>Trạng thái: ⭐ ĐANG CÀO (Lô n+1 = 13)</w:t>
+      </w:r>
+    </w:p>
+    <w:tbl>
+      <w:tblPr>
+        <w:tblW w:type="auto" w:w="0"/>
+        <w:jc w:val="center"/>
+        <w:tblLook w:firstColumn="1" w:firstRow="1" w:lastColumn="0" w:lastRow="0" w:noHBand="0" w:noVBand="1" w:val="04A0"/>
+      </w:tblPr>
+      <w:tblGrid>
+        <w:gridCol w:w="2045"/>
+        <w:gridCol w:w="2045"/>
+        <w:gridCol w:w="2045"/>
+        <w:gridCol w:w="2045"/>
+        <w:gridCol w:w="2045"/>
+      </w:tblGrid>
+      <w:tr>
+        <w:tc>
+          <w:tcPr>
+            <w:tcW w:type="dxa" w:w="720"/>
+            <w:shd w:fill="1E293B"/>
+            <w:tcMar>
+              <w:top w:w="90" w:type="dxa"/>
+              <w:bottom w:w="90" w:type="dxa"/>
+              <w:left w:w="90" w:type="dxa"/>
+              <w:right w:w="90" w:type="dxa"/>
+            </w:tcMar>
+          </w:tcPr>
+          <w:p>
+            <w:pPr>
+              <w:jc w:val="center"/>
+            </w:pPr>
+            <w:r>
+              <w:rPr>
+                <w:b/>
+                <w:color w:val="FFFFFF"/>
+                <w:sz w:val="17"/>
+              </w:rPr>
+              <w:t>STT</w:t>
+            </w:r>
+          </w:p>
+        </w:tc>
+        <w:tc>
+          <w:tcPr>
+            <w:tcW w:type="dxa" w:w="3168"/>
+            <w:shd w:fill="1E293B"/>
+            <w:tcMar>
+              <w:top w:w="90" w:type="dxa"/>
+              <w:bottom w:w="90" w:type="dxa"/>
+              <w:left w:w="90" w:type="dxa"/>
+              <w:right w:w="90" w:type="dxa"/>
+            </w:tcMar>
+          </w:tcPr>
+          <w:p>
+            <w:pPr>
+              <w:jc w:val="center"/>
+            </w:pPr>
+            <w:r>
+              <w:rPr>
+                <w:b/>
+                <w:color w:val="FFFFFF"/>
+                <w:sz w:val="17"/>
+              </w:rPr>
+              <w:t>Tên Kênh / Fanpage</w:t>
+            </w:r>
+          </w:p>
+        </w:tc>
+        <w:tc>
+          <w:tcPr>
+            <w:tcW w:type="dxa" w:w="3312"/>
+            <w:shd w:fill="1E293B"/>
+            <w:tcMar>
+              <w:top w:w="90" w:type="dxa"/>
+              <w:bottom w:w="90" w:type="dxa"/>
+              <w:left w:w="90" w:type="dxa"/>
+              <w:right w:w="90" w:type="dxa"/>
+            </w:tcMar>
+          </w:tcPr>
+          <w:p>
+            <w:pPr>
+              <w:jc w:val="center"/>
+            </w:pPr>
+            <w:r>
+              <w:rPr>
+                <w:b/>
+                <w:color w:val="FFFFFF"/>
+                <w:sz w:val="17"/>
+              </w:rPr>
+              <w:t>Đường Dẫn URL (Videos)</w:t>
+            </w:r>
+          </w:p>
+        </w:tc>
+        <w:tc>
+          <w:tcPr>
+            <w:tcW w:type="dxa" w:w="1872"/>
+            <w:shd w:fill="1E293B"/>
+            <w:tcMar>
+              <w:top w:w="90" w:type="dxa"/>
+              <w:bottom w:w="90" w:type="dxa"/>
+              <w:left w:w="90" w:type="dxa"/>
+              <w:right w:w="90" w:type="dxa"/>
+            </w:tcMar>
+          </w:tcPr>
+          <w:p>
+            <w:pPr>
+              <w:jc w:val="center"/>
+            </w:pPr>
+            <w:r>
+              <w:rPr>
+                <w:b/>
+                <w:color w:val="FFFFFF"/>
+                <w:sz w:val="17"/>
+              </w:rPr>
+              <w:t>Thể Loại</w:t>
+            </w:r>
+          </w:p>
+        </w:tc>
+        <w:tc>
+          <w:tcPr>
+            <w:tcW w:type="dxa" w:w="1728"/>
+            <w:shd w:fill="1E293B"/>
+            <w:tcMar>
+              <w:top w:w="90" w:type="dxa"/>
+              <w:bottom w:w="90" w:type="dxa"/>
+              <w:left w:w="90" w:type="dxa"/>
+              <w:right w:w="90" w:type="dxa"/>
+            </w:tcMar>
+          </w:tcPr>
+          <w:p>
+            <w:pPr>
+              <w:jc w:val="center"/>
+            </w:pPr>
+            <w:r>
+              <w:rPr>
+                <w:b/>
+                <w:color w:val="FFFFFF"/>
+                <w:sz w:val="17"/>
+              </w:rPr>
+              <w:t>Trạng Thái</w:t>
+            </w:r>
+          </w:p>
+        </w:tc>
+      </w:tr>
+      <w:tr>
+        <w:tc>
+          <w:tcPr>
+            <w:tcW w:type="dxa" w:w="720"/>
+            <w:tcMar>
+              <w:top w:w="70" w:type="dxa"/>
+              <w:bottom w:w="70" w:type="dxa"/>
+              <w:left w:w="80" w:type="dxa"/>
+              <w:right w:w="80" w:type="dxa"/>
+            </w:tcMar>
+            <w:shd w:fill="F8FAFC"/>
+          </w:tcPr>
+          <w:p>
+            <w:pPr>
+              <w:jc w:val="center"/>
+            </w:pPr>
+            <w:r>
+              <w:rPr>
+                <w:sz w:val="16"/>
+              </w:rPr>
+              <w:t>61</w:t>
+            </w:r>
+          </w:p>
+        </w:tc>
+        <w:tc>
+          <w:tcPr>
+            <w:tcW w:type="dxa" w:w="3168"/>
+            <w:tcMar>
+              <w:top w:w="70" w:type="dxa"/>
+              <w:bottom w:w="70" w:type="dxa"/>
+              <w:left w:w="80" w:type="dxa"/>
+              <w:right w:w="80" w:type="dxa"/>
+            </w:tcMar>
+          </w:tcPr>
+          <w:p>
+            <w:r>
+              <w:rPr>
+                <w:b/>
+                <w:sz w:val="16"/>
+              </w:rPr>
+              <w:t>Báo Thù Đại Nữ Chủ Review #65</w:t>
+            </w:r>
+          </w:p>
+        </w:tc>
+        <w:tc>
+          <w:tcPr>
+            <w:tcW w:type="dxa" w:w="3312"/>
+            <w:tcMar>
+              <w:top w:w="70" w:type="dxa"/>
+              <w:bottom w:w="70" w:type="dxa"/>
+              <w:left w:w="80" w:type="dxa"/>
+              <w:right w:w="80" w:type="dxa"/>
+            </w:tcMar>
+          </w:tcPr>
+          <w:p>
+            <w:r>
+              <w:rPr>
+                <w:color w:val="2563EB"/>
+                <w:sz w:val="16"/>
+              </w:rPr>
+              <w:t>https://www.facebook.com/phim.both.65/videos</w:t>
+            </w:r>
+          </w:p>
+        </w:tc>
+        <w:tc>
+          <w:tcPr>
+            <w:tcW w:type="dxa" w:w="1872"/>
+            <w:tcMar>
+              <w:top w:w="70" w:type="dxa"/>
+              <w:bottom w:w="70" w:type="dxa"/>
+              <w:left w:w="80" w:type="dxa"/>
+              <w:right w:w="80" w:type="dxa"/>
+            </w:tcMar>
+          </w:tcPr>
+          <w:p>
+            <w:r>
+              <w:rPr>
+                <w:sz w:val="16"/>
+              </w:rPr>
+              <w:t>Nữ Cường</w:t>
+            </w:r>
+          </w:p>
+        </w:tc>
+        <w:tc>
+          <w:tcPr>
+            <w:tcW w:type="dxa" w:w="1728"/>
+            <w:tcMar>
+              <w:top w:w="70" w:type="dxa"/>
+              <w:bottom w:w="70" w:type="dxa"/>
+              <w:left w:w="80" w:type="dxa"/>
+              <w:right w:w="80" w:type="dxa"/>
+            </w:tcMar>
+            <w:shd w:fill="EFF6FF"/>
+          </w:tcPr>
+          <w:p>
+            <w:r>
+              <w:rPr>
+                <w:color w:val="1D4ED8"/>
+                <w:sz w:val="16"/>
+              </w:rPr>
+              <w:t>Chờ quét Lô n+1</w:t>
+            </w:r>
+          </w:p>
+        </w:tc>
+      </w:tr>
+      <w:tr>
+        <w:tc>
+          <w:tcPr>
+            <w:tcW w:type="dxa" w:w="720"/>
+            <w:tcMar>
+              <w:top w:w="70" w:type="dxa"/>
+              <w:bottom w:w="70" w:type="dxa"/>
+              <w:left w:w="80" w:type="dxa"/>
+              <w:right w:w="80" w:type="dxa"/>
+            </w:tcMar>
+            <w:shd w:fill="F8FAFC"/>
+          </w:tcPr>
+          <w:p>
+            <w:pPr>
+              <w:jc w:val="center"/>
+            </w:pPr>
+            <w:r>
+              <w:rPr>
+                <w:sz w:val="16"/>
+              </w:rPr>
+              <w:t>62</w:t>
+            </w:r>
+          </w:p>
+        </w:tc>
+        <w:tc>
+          <w:tcPr>
+            <w:tcW w:type="dxa" w:w="3168"/>
+            <w:tcMar>
+              <w:top w:w="70" w:type="dxa"/>
+              <w:bottom w:w="70" w:type="dxa"/>
+              <w:left w:w="80" w:type="dxa"/>
+              <w:right w:w="80" w:type="dxa"/>
+            </w:tcMar>
+          </w:tcPr>
+          <w:p>
+            <w:r>
+              <w:rPr>
+                <w:b/>
+                <w:sz w:val="16"/>
+              </w:rPr>
+              <w:t>Thần Ma Đại Lục Review #66</w:t>
+            </w:r>
+          </w:p>
+        </w:tc>
+        <w:tc>
+          <w:tcPr>
+            <w:tcW w:type="dxa" w:w="3312"/>
+            <w:tcMar>
+              <w:top w:w="70" w:type="dxa"/>
+              <w:bottom w:w="70" w:type="dxa"/>
+              <w:left w:w="80" w:type="dxa"/>
+              <w:right w:w="80" w:type="dxa"/>
+            </w:tcMar>
+          </w:tcPr>
+          <w:p>
+            <w:r>
+              <w:rPr>
+                <w:color w:val="2563EB"/>
+                <w:sz w:val="16"/>
+              </w:rPr>
+              <w:t>https://www.facebook.com/phim.thnma.66/videos</w:t>
+            </w:r>
+          </w:p>
+        </w:tc>
+        <w:tc>
+          <w:tcPr>
+            <w:tcW w:type="dxa" w:w="1872"/>
+            <w:tcMar>
+              <w:top w:w="70" w:type="dxa"/>
+              <w:bottom w:w="70" w:type="dxa"/>
+              <w:left w:w="80" w:type="dxa"/>
+              <w:right w:w="80" w:type="dxa"/>
+            </w:tcMar>
+          </w:tcPr>
+          <w:p>
+            <w:r>
+              <w:rPr>
+                <w:sz w:val="16"/>
+              </w:rPr>
+              <w:t>Donghua 3D</w:t>
+            </w:r>
+          </w:p>
+        </w:tc>
+        <w:tc>
+          <w:tcPr>
+            <w:tcW w:type="dxa" w:w="1728"/>
+            <w:tcMar>
+              <w:top w:w="70" w:type="dxa"/>
+              <w:bottom w:w="70" w:type="dxa"/>
+              <w:left w:w="80" w:type="dxa"/>
+              <w:right w:w="80" w:type="dxa"/>
+            </w:tcMar>
+            <w:shd w:fill="EFF6FF"/>
+          </w:tcPr>
+          <w:p>
+            <w:r>
+              <w:rPr>
+                <w:color w:val="1D4ED8"/>
+                <w:sz w:val="16"/>
+              </w:rPr>
+              <w:t>Chờ quét Lô n+1</w:t>
+            </w:r>
+          </w:p>
+        </w:tc>
+      </w:tr>
+      <w:tr>
+        <w:tc>
+          <w:tcPr>
+            <w:tcW w:type="dxa" w:w="720"/>
+            <w:tcMar>
+              <w:top w:w="70" w:type="dxa"/>
+              <w:bottom w:w="70" w:type="dxa"/>
+              <w:left w:w="80" w:type="dxa"/>
+              <w:right w:w="80" w:type="dxa"/>
+            </w:tcMar>
+            <w:shd w:fill="F8FAFC"/>
+          </w:tcPr>
+          <w:p>
+            <w:pPr>
+              <w:jc w:val="center"/>
+            </w:pPr>
+            <w:r>
+              <w:rPr>
+                <w:sz w:val="16"/>
+              </w:rPr>
+              <w:t>63</w:t>
+            </w:r>
+          </w:p>
+        </w:tc>
+        <w:tc>
+          <w:tcPr>
+            <w:tcW w:type="dxa" w:w="3168"/>
+            <w:tcMar>
+              <w:top w:w="70" w:type="dxa"/>
+              <w:bottom w:w="70" w:type="dxa"/>
+              <w:left w:w="80" w:type="dxa"/>
+              <w:right w:w="80" w:type="dxa"/>
+            </w:tcMar>
+          </w:tcPr>
+          <w:p>
+            <w:r>
+              <w:rPr>
+                <w:b/>
+                <w:sz w:val="16"/>
+              </w:rPr>
+              <w:t>Xuyên Không Hệ Thống Review #67</w:t>
+            </w:r>
+          </w:p>
+        </w:tc>
+        <w:tc>
+          <w:tcPr>
+            <w:tcW w:type="dxa" w:w="3312"/>
+            <w:tcMar>
+              <w:top w:w="70" w:type="dxa"/>
+              <w:bottom w:w="70" w:type="dxa"/>
+              <w:left w:w="80" w:type="dxa"/>
+              <w:right w:w="80" w:type="dxa"/>
+            </w:tcMar>
+          </w:tcPr>
+          <w:p>
+            <w:r>
+              <w:rPr>
+                <w:color w:val="2563EB"/>
+                <w:sz w:val="16"/>
+              </w:rPr>
+              <w:t>https://www.facebook.com/phim.xuynkhng.67/videos</w:t>
+            </w:r>
+          </w:p>
+        </w:tc>
+        <w:tc>
+          <w:tcPr>
+            <w:tcW w:type="dxa" w:w="1872"/>
+            <w:tcMar>
+              <w:top w:w="70" w:type="dxa"/>
+              <w:bottom w:w="70" w:type="dxa"/>
+              <w:left w:w="80" w:type="dxa"/>
+              <w:right w:w="80" w:type="dxa"/>
+            </w:tcMar>
+          </w:tcPr>
+          <w:p>
+            <w:r>
+              <w:rPr>
+                <w:sz w:val="16"/>
+              </w:rPr>
+              <w:t>Xuyên Không</w:t>
+            </w:r>
+          </w:p>
+        </w:tc>
+        <w:tc>
+          <w:tcPr>
+            <w:tcW w:type="dxa" w:w="1728"/>
+            <w:tcMar>
+              <w:top w:w="70" w:type="dxa"/>
+              <w:bottom w:w="70" w:type="dxa"/>
+              <w:left w:w="80" w:type="dxa"/>
+              <w:right w:w="80" w:type="dxa"/>
+            </w:tcMar>
+            <w:shd w:fill="EFF6FF"/>
+          </w:tcPr>
+          <w:p>
+            <w:r>
+              <w:rPr>
+                <w:color w:val="1D4ED8"/>
+                <w:sz w:val="16"/>
+              </w:rPr>
+              <w:t>Chờ quét Lô n+1</w:t>
+            </w:r>
+          </w:p>
+        </w:tc>
+      </w:tr>
+      <w:tr>
+        <w:tc>
+          <w:tcPr>
+            <w:tcW w:type="dxa" w:w="720"/>
+            <w:tcMar>
+              <w:top w:w="70" w:type="dxa"/>
+              <w:bottom w:w="70" w:type="dxa"/>
+              <w:left w:w="80" w:type="dxa"/>
+              <w:right w:w="80" w:type="dxa"/>
+            </w:tcMar>
+            <w:shd w:fill="F8FAFC"/>
+          </w:tcPr>
+          <w:p>
+            <w:pPr>
+              <w:jc w:val="center"/>
+            </w:pPr>
+            <w:r>
+              <w:rPr>
+                <w:sz w:val="16"/>
+              </w:rPr>
+              <w:t>64</w:t>
+            </w:r>
+          </w:p>
+        </w:tc>
+        <w:tc>
+          <w:tcPr>
+            <w:tcW w:type="dxa" w:w="3168"/>
+            <w:tcMar>
+              <w:top w:w="70" w:type="dxa"/>
+              <w:bottom w:w="70" w:type="dxa"/>
+              <w:left w:w="80" w:type="dxa"/>
+              <w:right w:w="80" w:type="dxa"/>
+            </w:tcMar>
+          </w:tcPr>
+          <w:p>
+            <w:r>
+              <w:rPr>
+                <w:b/>
+                <w:sz w:val="16"/>
+              </w:rPr>
+              <w:t>Võ Thần Chúa Tể Review #68</w:t>
+            </w:r>
+          </w:p>
+        </w:tc>
+        <w:tc>
+          <w:tcPr>
+            <w:tcW w:type="dxa" w:w="3312"/>
+            <w:tcMar>
+              <w:top w:w="70" w:type="dxa"/>
+              <w:bottom w:w="70" w:type="dxa"/>
+              <w:left w:w="80" w:type="dxa"/>
+              <w:right w:w="80" w:type="dxa"/>
+            </w:tcMar>
+          </w:tcPr>
+          <w:p>
+            <w:r>
+              <w:rPr>
+                <w:color w:val="2563EB"/>
+                <w:sz w:val="16"/>
+              </w:rPr>
+              <w:t>https://www.facebook.com/phim.vthn.68/videos</w:t>
+            </w:r>
+          </w:p>
+        </w:tc>
+        <w:tc>
+          <w:tcPr>
+            <w:tcW w:type="dxa" w:w="1872"/>
+            <w:tcMar>
+              <w:top w:w="70" w:type="dxa"/>
+              <w:bottom w:w="70" w:type="dxa"/>
+              <w:left w:w="80" w:type="dxa"/>
+              <w:right w:w="80" w:type="dxa"/>
+            </w:tcMar>
+          </w:tcPr>
+          <w:p>
+            <w:r>
+              <w:rPr>
+                <w:sz w:val="16"/>
+              </w:rPr>
+              <w:t>Huyền Huyễn</w:t>
+            </w:r>
+          </w:p>
+        </w:tc>
+        <w:tc>
+          <w:tcPr>
+            <w:tcW w:type="dxa" w:w="1728"/>
+            <w:tcMar>
+              <w:top w:w="70" w:type="dxa"/>
+              <w:bottom w:w="70" w:type="dxa"/>
+              <w:left w:w="80" w:type="dxa"/>
+              <w:right w:w="80" w:type="dxa"/>
+            </w:tcMar>
+            <w:shd w:fill="EFF6FF"/>
+          </w:tcPr>
+          <w:p>
+            <w:r>
+              <w:rPr>
+                <w:color w:val="1D4ED8"/>
+                <w:sz w:val="16"/>
+              </w:rPr>
+              <w:t>Chờ quét Lô n+1</w:t>
+            </w:r>
+          </w:p>
+        </w:tc>
+      </w:tr>
+      <w:tr>
+        <w:tc>
+          <w:tcPr>
+            <w:tcW w:type="dxa" w:w="720"/>
+            <w:tcMar>
+              <w:top w:w="70" w:type="dxa"/>
+              <w:bottom w:w="70" w:type="dxa"/>
+              <w:left w:w="80" w:type="dxa"/>
+              <w:right w:w="80" w:type="dxa"/>
+            </w:tcMar>
+            <w:shd w:fill="F8FAFC"/>
+          </w:tcPr>
+          <w:p>
+            <w:pPr>
+              <w:jc w:val="center"/>
+            </w:pPr>
+            <w:r>
+              <w:rPr>
+                <w:sz w:val="16"/>
+              </w:rPr>
+              <w:t>65</w:t>
+            </w:r>
+          </w:p>
+        </w:tc>
+        <w:tc>
+          <w:tcPr>
+            <w:tcW w:type="dxa" w:w="3168"/>
+            <w:tcMar>
+              <w:top w:w="70" w:type="dxa"/>
+              <w:bottom w:w="70" w:type="dxa"/>
+              <w:left w:w="80" w:type="dxa"/>
+              <w:right w:w="80" w:type="dxa"/>
+            </w:tcMar>
+          </w:tcPr>
+          <w:p>
+            <w:r>
+              <w:rPr>
+                <w:b/>
+                <w:sz w:val="16"/>
+              </w:rPr>
+              <w:t>Tổng Tài Hào Môn Review #69</w:t>
+            </w:r>
+          </w:p>
+        </w:tc>
+        <w:tc>
+          <w:tcPr>
+            <w:tcW w:type="dxa" w:w="3312"/>
+            <w:tcMar>
+              <w:top w:w="70" w:type="dxa"/>
+              <w:bottom w:w="70" w:type="dxa"/>
+              <w:left w:w="80" w:type="dxa"/>
+              <w:right w:w="80" w:type="dxa"/>
+            </w:tcMar>
+          </w:tcPr>
+          <w:p>
+            <w:r>
+              <w:rPr>
+                <w:color w:val="2563EB"/>
+                <w:sz w:val="16"/>
+              </w:rPr>
+              <w:t>https://www.facebook.com/phim.tngti.69/videos</w:t>
+            </w:r>
+          </w:p>
+        </w:tc>
+        <w:tc>
+          <w:tcPr>
+            <w:tcW w:type="dxa" w:w="1872"/>
+            <w:tcMar>
+              <w:top w:w="70" w:type="dxa"/>
+              <w:bottom w:w="70" w:type="dxa"/>
+              <w:left w:w="80" w:type="dxa"/>
+              <w:right w:w="80" w:type="dxa"/>
+            </w:tcMar>
+          </w:tcPr>
+          <w:p>
+            <w:r>
+              <w:rPr>
+                <w:sz w:val="16"/>
+              </w:rPr>
+              <w:t>Đô Thị</w:t>
             </w:r>
           </w:p>
         </w:tc>

</xml_diff>

<commit_message>
feat(database): update 193 movies, sync batch 14 results and thumbnails
</commit_message>
<xml_diff>
--- a/Danh_Sach_Kenh_Da_Cao.docx
+++ b/Danh_Sach_Kenh_Da_Cao.docx
@@ -29,7 +29,7 @@
           <w:color w:val="64748B"/>
           <w:sz w:val="20"/>
         </w:rPr>
-        <w:t>Hệ thống: Mở Rộng Vô Hạn Lô (n+1) Không Trùng Lặp | Tổng: 13 Lô (65 Kênh) | 09/10/2026 01:50:03</w:t>
+        <w:t>Hệ thống: Mở Rộng Vô Hạn Lô (n+1) Không Trùng Lặp | Tổng: 14 Lô (70 Kênh) | 09/10/2026 01:57:53</w:t>
       </w:r>
     </w:p>
     <w:p/>
@@ -8333,10 +8333,10 @@
       <w:r>
         <w:rPr>
           <w:b/>
-          <w:color w:val="0E7490"/>
+          <w:color w:val="166534"/>
           <w:sz w:val="19"/>
         </w:rPr>
-        <w:t>Trạng thái: ⭐ ĐANG CÀO (Lô n+1 = 13)</w:t>
+        <w:t>Trạng thái: ĐÃ CÀO</w:t>
       </w:r>
     </w:p>
     <w:tbl>
@@ -8571,15 +8571,15 @@
               <w:left w:w="80" w:type="dxa"/>
               <w:right w:w="80" w:type="dxa"/>
             </w:tcMar>
-            <w:shd w:fill="EFF6FF"/>
-          </w:tcPr>
-          <w:p>
-            <w:r>
-              <w:rPr>
-                <w:color w:val="1D4ED8"/>
-                <w:sz w:val="16"/>
-              </w:rPr>
-              <w:t>Chờ quét Lô n+1</w:t>
+            <w:shd w:fill="F0FDF4"/>
+          </w:tcPr>
+          <w:p>
+            <w:r>
+              <w:rPr>
+                <w:color w:val="166534"/>
+                <w:sz w:val="16"/>
+              </w:rPr>
+              <w:t>Đã cào &amp; nạp</w:t>
             </w:r>
           </w:p>
         </w:tc>
@@ -8676,15 +8676,15 @@
               <w:left w:w="80" w:type="dxa"/>
               <w:right w:w="80" w:type="dxa"/>
             </w:tcMar>
-            <w:shd w:fill="EFF6FF"/>
-          </w:tcPr>
-          <w:p>
-            <w:r>
-              <w:rPr>
-                <w:color w:val="1D4ED8"/>
-                <w:sz w:val="16"/>
-              </w:rPr>
-              <w:t>Chờ quét Lô n+1</w:t>
+            <w:shd w:fill="F0FDF4"/>
+          </w:tcPr>
+          <w:p>
+            <w:r>
+              <w:rPr>
+                <w:color w:val="166534"/>
+                <w:sz w:val="16"/>
+              </w:rPr>
+              <w:t>Đã cào &amp; nạp</w:t>
             </w:r>
           </w:p>
         </w:tc>
@@ -8781,15 +8781,15 @@
               <w:left w:w="80" w:type="dxa"/>
               <w:right w:w="80" w:type="dxa"/>
             </w:tcMar>
-            <w:shd w:fill="EFF6FF"/>
-          </w:tcPr>
-          <w:p>
-            <w:r>
-              <w:rPr>
-                <w:color w:val="1D4ED8"/>
-                <w:sz w:val="16"/>
-              </w:rPr>
-              <w:t>Chờ quét Lô n+1</w:t>
+            <w:shd w:fill="F0FDF4"/>
+          </w:tcPr>
+          <w:p>
+            <w:r>
+              <w:rPr>
+                <w:color w:val="166534"/>
+                <w:sz w:val="16"/>
+              </w:rPr>
+              <w:t>Đã cào &amp; nạp</w:t>
             </w:r>
           </w:p>
         </w:tc>
@@ -8886,15 +8886,15 @@
               <w:left w:w="80" w:type="dxa"/>
               <w:right w:w="80" w:type="dxa"/>
             </w:tcMar>
-            <w:shd w:fill="EFF6FF"/>
-          </w:tcPr>
-          <w:p>
-            <w:r>
-              <w:rPr>
-                <w:color w:val="1D4ED8"/>
-                <w:sz w:val="16"/>
-              </w:rPr>
-              <w:t>Chờ quét Lô n+1</w:t>
+            <w:shd w:fill="F0FDF4"/>
+          </w:tcPr>
+          <w:p>
+            <w:r>
+              <w:rPr>
+                <w:color w:val="166534"/>
+                <w:sz w:val="16"/>
+              </w:rPr>
+              <w:t>Đã cào &amp; nạp</w:t>
             </w:r>
           </w:p>
         </w:tc>
@@ -8979,6 +8979,692 @@
                 <w:sz w:val="16"/>
               </w:rPr>
               <w:t>Đô Thị</w:t>
+            </w:r>
+          </w:p>
+        </w:tc>
+        <w:tc>
+          <w:tcPr>
+            <w:tcW w:type="dxa" w:w="1728"/>
+            <w:tcMar>
+              <w:top w:w="70" w:type="dxa"/>
+              <w:bottom w:w="70" w:type="dxa"/>
+              <w:left w:w="80" w:type="dxa"/>
+              <w:right w:w="80" w:type="dxa"/>
+            </w:tcMar>
+            <w:shd w:fill="F0FDF4"/>
+          </w:tcPr>
+          <w:p>
+            <w:r>
+              <w:rPr>
+                <w:color w:val="166534"/>
+                <w:sz w:val="16"/>
+              </w:rPr>
+              <w:t>Đã cào &amp; nạp</w:t>
+            </w:r>
+          </w:p>
+        </w:tc>
+      </w:tr>
+    </w:tbl>
+    <w:p/>
+    <w:p>
+      <w:r>
+        <w:rPr>
+          <w:b/>
+          <w:color w:val="1E293B"/>
+          <w:sz w:val="22"/>
+        </w:rPr>
+        <w:t>📁 LÔ 14 (n+1 MỚI): Tuyển Tập Kênh Mới Hoàn Toàn #14</w:t>
+        <w:br/>
+      </w:r>
+      <w:r>
+        <w:rPr>
+          <w:b/>
+          <w:color w:val="0E7490"/>
+          <w:sz w:val="19"/>
+        </w:rPr>
+        <w:t>Trạng thái: ⭐ ĐANG CÀO (Lô n+1 = 14)</w:t>
+      </w:r>
+    </w:p>
+    <w:tbl>
+      <w:tblPr>
+        <w:tblW w:type="auto" w:w="0"/>
+        <w:jc w:val="center"/>
+        <w:tblLook w:firstColumn="1" w:firstRow="1" w:lastColumn="0" w:lastRow="0" w:noHBand="0" w:noVBand="1" w:val="04A0"/>
+      </w:tblPr>
+      <w:tblGrid>
+        <w:gridCol w:w="2045"/>
+        <w:gridCol w:w="2045"/>
+        <w:gridCol w:w="2045"/>
+        <w:gridCol w:w="2045"/>
+        <w:gridCol w:w="2045"/>
+      </w:tblGrid>
+      <w:tr>
+        <w:tc>
+          <w:tcPr>
+            <w:tcW w:type="dxa" w:w="720"/>
+            <w:shd w:fill="1E293B"/>
+            <w:tcMar>
+              <w:top w:w="90" w:type="dxa"/>
+              <w:bottom w:w="90" w:type="dxa"/>
+              <w:left w:w="90" w:type="dxa"/>
+              <w:right w:w="90" w:type="dxa"/>
+            </w:tcMar>
+          </w:tcPr>
+          <w:p>
+            <w:pPr>
+              <w:jc w:val="center"/>
+            </w:pPr>
+            <w:r>
+              <w:rPr>
+                <w:b/>
+                <w:color w:val="FFFFFF"/>
+                <w:sz w:val="17"/>
+              </w:rPr>
+              <w:t>STT</w:t>
+            </w:r>
+          </w:p>
+        </w:tc>
+        <w:tc>
+          <w:tcPr>
+            <w:tcW w:type="dxa" w:w="3168"/>
+            <w:shd w:fill="1E293B"/>
+            <w:tcMar>
+              <w:top w:w="90" w:type="dxa"/>
+              <w:bottom w:w="90" w:type="dxa"/>
+              <w:left w:w="90" w:type="dxa"/>
+              <w:right w:w="90" w:type="dxa"/>
+            </w:tcMar>
+          </w:tcPr>
+          <w:p>
+            <w:pPr>
+              <w:jc w:val="center"/>
+            </w:pPr>
+            <w:r>
+              <w:rPr>
+                <w:b/>
+                <w:color w:val="FFFFFF"/>
+                <w:sz w:val="17"/>
+              </w:rPr>
+              <w:t>Tên Kênh / Fanpage</w:t>
+            </w:r>
+          </w:p>
+        </w:tc>
+        <w:tc>
+          <w:tcPr>
+            <w:tcW w:type="dxa" w:w="3312"/>
+            <w:shd w:fill="1E293B"/>
+            <w:tcMar>
+              <w:top w:w="90" w:type="dxa"/>
+              <w:bottom w:w="90" w:type="dxa"/>
+              <w:left w:w="90" w:type="dxa"/>
+              <w:right w:w="90" w:type="dxa"/>
+            </w:tcMar>
+          </w:tcPr>
+          <w:p>
+            <w:pPr>
+              <w:jc w:val="center"/>
+            </w:pPr>
+            <w:r>
+              <w:rPr>
+                <w:b/>
+                <w:color w:val="FFFFFF"/>
+                <w:sz w:val="17"/>
+              </w:rPr>
+              <w:t>Đường Dẫn URL (Videos)</w:t>
+            </w:r>
+          </w:p>
+        </w:tc>
+        <w:tc>
+          <w:tcPr>
+            <w:tcW w:type="dxa" w:w="1872"/>
+            <w:shd w:fill="1E293B"/>
+            <w:tcMar>
+              <w:top w:w="90" w:type="dxa"/>
+              <w:bottom w:w="90" w:type="dxa"/>
+              <w:left w:w="90" w:type="dxa"/>
+              <w:right w:w="90" w:type="dxa"/>
+            </w:tcMar>
+          </w:tcPr>
+          <w:p>
+            <w:pPr>
+              <w:jc w:val="center"/>
+            </w:pPr>
+            <w:r>
+              <w:rPr>
+                <w:b/>
+                <w:color w:val="FFFFFF"/>
+                <w:sz w:val="17"/>
+              </w:rPr>
+              <w:t>Thể Loại</w:t>
+            </w:r>
+          </w:p>
+        </w:tc>
+        <w:tc>
+          <w:tcPr>
+            <w:tcW w:type="dxa" w:w="1728"/>
+            <w:shd w:fill="1E293B"/>
+            <w:tcMar>
+              <w:top w:w="90" w:type="dxa"/>
+              <w:bottom w:w="90" w:type="dxa"/>
+              <w:left w:w="90" w:type="dxa"/>
+              <w:right w:w="90" w:type="dxa"/>
+            </w:tcMar>
+          </w:tcPr>
+          <w:p>
+            <w:pPr>
+              <w:jc w:val="center"/>
+            </w:pPr>
+            <w:r>
+              <w:rPr>
+                <w:b/>
+                <w:color w:val="FFFFFF"/>
+                <w:sz w:val="17"/>
+              </w:rPr>
+              <w:t>Trạng Thái</w:t>
+            </w:r>
+          </w:p>
+        </w:tc>
+      </w:tr>
+      <w:tr>
+        <w:tc>
+          <w:tcPr>
+            <w:tcW w:type="dxa" w:w="720"/>
+            <w:tcMar>
+              <w:top w:w="70" w:type="dxa"/>
+              <w:bottom w:w="70" w:type="dxa"/>
+              <w:left w:w="80" w:type="dxa"/>
+              <w:right w:w="80" w:type="dxa"/>
+            </w:tcMar>
+            <w:shd w:fill="F8FAFC"/>
+          </w:tcPr>
+          <w:p>
+            <w:pPr>
+              <w:jc w:val="center"/>
+            </w:pPr>
+            <w:r>
+              <w:rPr>
+                <w:sz w:val="16"/>
+              </w:rPr>
+              <w:t>66</w:t>
+            </w:r>
+          </w:p>
+        </w:tc>
+        <w:tc>
+          <w:tcPr>
+            <w:tcW w:type="dxa" w:w="3168"/>
+            <w:tcMar>
+              <w:top w:w="70" w:type="dxa"/>
+              <w:bottom w:w="70" w:type="dxa"/>
+              <w:left w:w="80" w:type="dxa"/>
+              <w:right w:w="80" w:type="dxa"/>
+            </w:tcMar>
+          </w:tcPr>
+          <w:p>
+            <w:r>
+              <w:rPr>
+                <w:b/>
+                <w:sz w:val="16"/>
+              </w:rPr>
+              <w:t>Đấu Phá Tu Chân Review #70</w:t>
+            </w:r>
+          </w:p>
+        </w:tc>
+        <w:tc>
+          <w:tcPr>
+            <w:tcW w:type="dxa" w:w="3312"/>
+            <w:tcMar>
+              <w:top w:w="70" w:type="dxa"/>
+              <w:bottom w:w="70" w:type="dxa"/>
+              <w:left w:w="80" w:type="dxa"/>
+              <w:right w:w="80" w:type="dxa"/>
+            </w:tcMar>
+          </w:tcPr>
+          <w:p>
+            <w:r>
+              <w:rPr>
+                <w:color w:val="2563EB"/>
+                <w:sz w:val="16"/>
+              </w:rPr>
+              <w:t>https://www.facebook.com/phim.uph.70/videos</w:t>
+            </w:r>
+          </w:p>
+        </w:tc>
+        <w:tc>
+          <w:tcPr>
+            <w:tcW w:type="dxa" w:w="1872"/>
+            <w:tcMar>
+              <w:top w:w="70" w:type="dxa"/>
+              <w:bottom w:w="70" w:type="dxa"/>
+              <w:left w:w="80" w:type="dxa"/>
+              <w:right w:w="80" w:type="dxa"/>
+            </w:tcMar>
+          </w:tcPr>
+          <w:p>
+            <w:r>
+              <w:rPr>
+                <w:sz w:val="16"/>
+              </w:rPr>
+              <w:t>Tu Tiên 3D</w:t>
+            </w:r>
+          </w:p>
+        </w:tc>
+        <w:tc>
+          <w:tcPr>
+            <w:tcW w:type="dxa" w:w="1728"/>
+            <w:tcMar>
+              <w:top w:w="70" w:type="dxa"/>
+              <w:bottom w:w="70" w:type="dxa"/>
+              <w:left w:w="80" w:type="dxa"/>
+              <w:right w:w="80" w:type="dxa"/>
+            </w:tcMar>
+            <w:shd w:fill="EFF6FF"/>
+          </w:tcPr>
+          <w:p>
+            <w:r>
+              <w:rPr>
+                <w:color w:val="1D4ED8"/>
+                <w:sz w:val="16"/>
+              </w:rPr>
+              <w:t>Chờ quét Lô n+1</w:t>
+            </w:r>
+          </w:p>
+        </w:tc>
+      </w:tr>
+      <w:tr>
+        <w:tc>
+          <w:tcPr>
+            <w:tcW w:type="dxa" w:w="720"/>
+            <w:tcMar>
+              <w:top w:w="70" w:type="dxa"/>
+              <w:bottom w:w="70" w:type="dxa"/>
+              <w:left w:w="80" w:type="dxa"/>
+              <w:right w:w="80" w:type="dxa"/>
+            </w:tcMar>
+            <w:shd w:fill="F8FAFC"/>
+          </w:tcPr>
+          <w:p>
+            <w:pPr>
+              <w:jc w:val="center"/>
+            </w:pPr>
+            <w:r>
+              <w:rPr>
+                <w:sz w:val="16"/>
+              </w:rPr>
+              <w:t>67</w:t>
+            </w:r>
+          </w:p>
+        </w:tc>
+        <w:tc>
+          <w:tcPr>
+            <w:tcW w:type="dxa" w:w="3168"/>
+            <w:tcMar>
+              <w:top w:w="70" w:type="dxa"/>
+              <w:bottom w:w="70" w:type="dxa"/>
+              <w:left w:w="80" w:type="dxa"/>
+              <w:right w:w="80" w:type="dxa"/>
+            </w:tcMar>
+          </w:tcPr>
+          <w:p>
+            <w:r>
+              <w:rPr>
+                <w:b/>
+                <w:sz w:val="16"/>
+              </w:rPr>
+              <w:t>Nghịch Thiên Kỳ Tích Review #71</w:t>
+            </w:r>
+          </w:p>
+        </w:tc>
+        <w:tc>
+          <w:tcPr>
+            <w:tcW w:type="dxa" w:w="3312"/>
+            <w:tcMar>
+              <w:top w:w="70" w:type="dxa"/>
+              <w:bottom w:w="70" w:type="dxa"/>
+              <w:left w:w="80" w:type="dxa"/>
+              <w:right w:w="80" w:type="dxa"/>
+            </w:tcMar>
+          </w:tcPr>
+          <w:p>
+            <w:r>
+              <w:rPr>
+                <w:color w:val="2563EB"/>
+                <w:sz w:val="16"/>
+              </w:rPr>
+              <w:t>https://www.facebook.com/phim.nghchthin.71/videos</w:t>
+            </w:r>
+          </w:p>
+        </w:tc>
+        <w:tc>
+          <w:tcPr>
+            <w:tcW w:type="dxa" w:w="1872"/>
+            <w:tcMar>
+              <w:top w:w="70" w:type="dxa"/>
+              <w:bottom w:w="70" w:type="dxa"/>
+              <w:left w:w="80" w:type="dxa"/>
+              <w:right w:w="80" w:type="dxa"/>
+            </w:tcMar>
+          </w:tcPr>
+          <w:p>
+            <w:r>
+              <w:rPr>
+                <w:sz w:val="16"/>
+              </w:rPr>
+              <w:t>Trọng Sinh</w:t>
+            </w:r>
+          </w:p>
+        </w:tc>
+        <w:tc>
+          <w:tcPr>
+            <w:tcW w:type="dxa" w:w="1728"/>
+            <w:tcMar>
+              <w:top w:w="70" w:type="dxa"/>
+              <w:bottom w:w="70" w:type="dxa"/>
+              <w:left w:w="80" w:type="dxa"/>
+              <w:right w:w="80" w:type="dxa"/>
+            </w:tcMar>
+            <w:shd w:fill="EFF6FF"/>
+          </w:tcPr>
+          <w:p>
+            <w:r>
+              <w:rPr>
+                <w:color w:val="1D4ED8"/>
+                <w:sz w:val="16"/>
+              </w:rPr>
+              <w:t>Chờ quét Lô n+1</w:t>
+            </w:r>
+          </w:p>
+        </w:tc>
+      </w:tr>
+      <w:tr>
+        <w:tc>
+          <w:tcPr>
+            <w:tcW w:type="dxa" w:w="720"/>
+            <w:tcMar>
+              <w:top w:w="70" w:type="dxa"/>
+              <w:bottom w:w="70" w:type="dxa"/>
+              <w:left w:w="80" w:type="dxa"/>
+              <w:right w:w="80" w:type="dxa"/>
+            </w:tcMar>
+            <w:shd w:fill="F8FAFC"/>
+          </w:tcPr>
+          <w:p>
+            <w:pPr>
+              <w:jc w:val="center"/>
+            </w:pPr>
+            <w:r>
+              <w:rPr>
+                <w:sz w:val="16"/>
+              </w:rPr>
+              <w:t>68</w:t>
+            </w:r>
+          </w:p>
+        </w:tc>
+        <w:tc>
+          <w:tcPr>
+            <w:tcW w:type="dxa" w:w="3168"/>
+            <w:tcMar>
+              <w:top w:w="70" w:type="dxa"/>
+              <w:bottom w:w="70" w:type="dxa"/>
+              <w:left w:w="80" w:type="dxa"/>
+              <w:right w:w="80" w:type="dxa"/>
+            </w:tcMar>
+          </w:tcPr>
+          <w:p>
+            <w:r>
+              <w:rPr>
+                <w:b/>
+                <w:sz w:val="16"/>
+              </w:rPr>
+              <w:t>Tiên Tôn Xuất Sơn Review #72</w:t>
+            </w:r>
+          </w:p>
+        </w:tc>
+        <w:tc>
+          <w:tcPr>
+            <w:tcW w:type="dxa" w:w="3312"/>
+            <w:tcMar>
+              <w:top w:w="70" w:type="dxa"/>
+              <w:bottom w:w="70" w:type="dxa"/>
+              <w:left w:w="80" w:type="dxa"/>
+              <w:right w:w="80" w:type="dxa"/>
+            </w:tcMar>
+          </w:tcPr>
+          <w:p>
+            <w:r>
+              <w:rPr>
+                <w:color w:val="2563EB"/>
+                <w:sz w:val="16"/>
+              </w:rPr>
+              <w:t>https://www.facebook.com/phim.tintn.72/videos</w:t>
+            </w:r>
+          </w:p>
+        </w:tc>
+        <w:tc>
+          <w:tcPr>
+            <w:tcW w:type="dxa" w:w="1872"/>
+            <w:tcMar>
+              <w:top w:w="70" w:type="dxa"/>
+              <w:bottom w:w="70" w:type="dxa"/>
+              <w:left w:w="80" w:type="dxa"/>
+              <w:right w:w="80" w:type="dxa"/>
+            </w:tcMar>
+          </w:tcPr>
+          <w:p>
+            <w:r>
+              <w:rPr>
+                <w:sz w:val="16"/>
+              </w:rPr>
+              <w:t>Tiên Hiệp</w:t>
+            </w:r>
+          </w:p>
+        </w:tc>
+        <w:tc>
+          <w:tcPr>
+            <w:tcW w:type="dxa" w:w="1728"/>
+            <w:tcMar>
+              <w:top w:w="70" w:type="dxa"/>
+              <w:bottom w:w="70" w:type="dxa"/>
+              <w:left w:w="80" w:type="dxa"/>
+              <w:right w:w="80" w:type="dxa"/>
+            </w:tcMar>
+            <w:shd w:fill="EFF6FF"/>
+          </w:tcPr>
+          <w:p>
+            <w:r>
+              <w:rPr>
+                <w:color w:val="1D4ED8"/>
+                <w:sz w:val="16"/>
+              </w:rPr>
+              <w:t>Chờ quét Lô n+1</w:t>
+            </w:r>
+          </w:p>
+        </w:tc>
+      </w:tr>
+      <w:tr>
+        <w:tc>
+          <w:tcPr>
+            <w:tcW w:type="dxa" w:w="720"/>
+            <w:tcMar>
+              <w:top w:w="70" w:type="dxa"/>
+              <w:bottom w:w="70" w:type="dxa"/>
+              <w:left w:w="80" w:type="dxa"/>
+              <w:right w:w="80" w:type="dxa"/>
+            </w:tcMar>
+            <w:shd w:fill="F8FAFC"/>
+          </w:tcPr>
+          <w:p>
+            <w:pPr>
+              <w:jc w:val="center"/>
+            </w:pPr>
+            <w:r>
+              <w:rPr>
+                <w:sz w:val="16"/>
+              </w:rPr>
+              <w:t>69</w:t>
+            </w:r>
+          </w:p>
+        </w:tc>
+        <w:tc>
+          <w:tcPr>
+            <w:tcW w:type="dxa" w:w="3168"/>
+            <w:tcMar>
+              <w:top w:w="70" w:type="dxa"/>
+              <w:bottom w:w="70" w:type="dxa"/>
+              <w:left w:w="80" w:type="dxa"/>
+              <w:right w:w="80" w:type="dxa"/>
+            </w:tcMar>
+          </w:tcPr>
+          <w:p>
+            <w:r>
+              <w:rPr>
+                <w:b/>
+                <w:sz w:val="16"/>
+              </w:rPr>
+              <w:t>Chiến Thần Trở Về Review #73</w:t>
+            </w:r>
+          </w:p>
+        </w:tc>
+        <w:tc>
+          <w:tcPr>
+            <w:tcW w:type="dxa" w:w="3312"/>
+            <w:tcMar>
+              <w:top w:w="70" w:type="dxa"/>
+              <w:bottom w:w="70" w:type="dxa"/>
+              <w:left w:w="80" w:type="dxa"/>
+              <w:right w:w="80" w:type="dxa"/>
+            </w:tcMar>
+          </w:tcPr>
+          <w:p>
+            <w:r>
+              <w:rPr>
+                <w:color w:val="2563EB"/>
+                <w:sz w:val="16"/>
+              </w:rPr>
+              <w:t>https://www.facebook.com/phim.chinthn.73/videos</w:t>
+            </w:r>
+          </w:p>
+        </w:tc>
+        <w:tc>
+          <w:tcPr>
+            <w:tcW w:type="dxa" w:w="1872"/>
+            <w:tcMar>
+              <w:top w:w="70" w:type="dxa"/>
+              <w:bottom w:w="70" w:type="dxa"/>
+              <w:left w:w="80" w:type="dxa"/>
+              <w:right w:w="80" w:type="dxa"/>
+            </w:tcMar>
+          </w:tcPr>
+          <w:p>
+            <w:r>
+              <w:rPr>
+                <w:sz w:val="16"/>
+              </w:rPr>
+              <w:t>Binh Vương</w:t>
+            </w:r>
+          </w:p>
+        </w:tc>
+        <w:tc>
+          <w:tcPr>
+            <w:tcW w:type="dxa" w:w="1728"/>
+            <w:tcMar>
+              <w:top w:w="70" w:type="dxa"/>
+              <w:bottom w:w="70" w:type="dxa"/>
+              <w:left w:w="80" w:type="dxa"/>
+              <w:right w:w="80" w:type="dxa"/>
+            </w:tcMar>
+            <w:shd w:fill="EFF6FF"/>
+          </w:tcPr>
+          <w:p>
+            <w:r>
+              <w:rPr>
+                <w:color w:val="1D4ED8"/>
+                <w:sz w:val="16"/>
+              </w:rPr>
+              <w:t>Chờ quét Lô n+1</w:t>
+            </w:r>
+          </w:p>
+        </w:tc>
+      </w:tr>
+      <w:tr>
+        <w:tc>
+          <w:tcPr>
+            <w:tcW w:type="dxa" w:w="720"/>
+            <w:tcMar>
+              <w:top w:w="70" w:type="dxa"/>
+              <w:bottom w:w="70" w:type="dxa"/>
+              <w:left w:w="80" w:type="dxa"/>
+              <w:right w:w="80" w:type="dxa"/>
+            </w:tcMar>
+            <w:shd w:fill="F8FAFC"/>
+          </w:tcPr>
+          <w:p>
+            <w:pPr>
+              <w:jc w:val="center"/>
+            </w:pPr>
+            <w:r>
+              <w:rPr>
+                <w:sz w:val="16"/>
+              </w:rPr>
+              <w:t>70</w:t>
+            </w:r>
+          </w:p>
+        </w:tc>
+        <w:tc>
+          <w:tcPr>
+            <w:tcW w:type="dxa" w:w="3168"/>
+            <w:tcMar>
+              <w:top w:w="70" w:type="dxa"/>
+              <w:bottom w:w="70" w:type="dxa"/>
+              <w:left w:w="80" w:type="dxa"/>
+              <w:right w:w="80" w:type="dxa"/>
+            </w:tcMar>
+          </w:tcPr>
+          <w:p>
+            <w:r>
+              <w:rPr>
+                <w:b/>
+                <w:sz w:val="16"/>
+              </w:rPr>
+              <w:t>Vạn Cổ Thần Đế Review #74</w:t>
+            </w:r>
+          </w:p>
+        </w:tc>
+        <w:tc>
+          <w:tcPr>
+            <w:tcW w:type="dxa" w:w="3312"/>
+            <w:tcMar>
+              <w:top w:w="70" w:type="dxa"/>
+              <w:bottom w:w="70" w:type="dxa"/>
+              <w:left w:w="80" w:type="dxa"/>
+              <w:right w:w="80" w:type="dxa"/>
+            </w:tcMar>
+          </w:tcPr>
+          <w:p>
+            <w:r>
+              <w:rPr>
+                <w:color w:val="2563EB"/>
+                <w:sz w:val="16"/>
+              </w:rPr>
+              <w:t>https://www.facebook.com/phim.vnc.74/videos</w:t>
+            </w:r>
+          </w:p>
+        </w:tc>
+        <w:tc>
+          <w:tcPr>
+            <w:tcW w:type="dxa" w:w="1872"/>
+            <w:tcMar>
+              <w:top w:w="70" w:type="dxa"/>
+              <w:bottom w:w="70" w:type="dxa"/>
+              <w:left w:w="80" w:type="dxa"/>
+              <w:right w:w="80" w:type="dxa"/>
+            </w:tcMar>
+          </w:tcPr>
+          <w:p>
+            <w:r>
+              <w:rPr>
+                <w:sz w:val="16"/>
+              </w:rPr>
+              <w:t>Huyền Ảo</w:t>
             </w:r>
           </w:p>
         </w:tc>

</xml_diff>

<commit_message>
docs: sync batch 15 channel registry and crawler cursor
</commit_message>
<xml_diff>
--- a/Danh_Sach_Kenh_Da_Cao.docx
+++ b/Danh_Sach_Kenh_Da_Cao.docx
@@ -29,7 +29,7 @@
           <w:color w:val="64748B"/>
           <w:sz w:val="20"/>
         </w:rPr>
-        <w:t>Hệ thống: Mở Rộng Vô Hạn Lô (n+1) Không Trùng Lặp | Tổng: 14 Lô (70 Kênh) | 09/10/2026 01:57:53</w:t>
+        <w:t>Hệ thống: Mở Rộng Vô Hạn Lô (n+1) Không Trùng Lặp | Tổng: 15 Lô (75 Kênh) | 09/10/2026 02:05:32</w:t>
       </w:r>
     </w:p>
     <w:p/>
@@ -9019,10 +9019,10 @@
       <w:r>
         <w:rPr>
           <w:b/>
-          <w:color w:val="0E7490"/>
+          <w:color w:val="166534"/>
           <w:sz w:val="19"/>
         </w:rPr>
-        <w:t>Trạng thái: ⭐ ĐANG CÀO (Lô n+1 = 14)</w:t>
+        <w:t>Trạng thái: ĐÃ CÀO</w:t>
       </w:r>
     </w:p>
     <w:tbl>
@@ -9257,15 +9257,15 @@
               <w:left w:w="80" w:type="dxa"/>
               <w:right w:w="80" w:type="dxa"/>
             </w:tcMar>
-            <w:shd w:fill="EFF6FF"/>
-          </w:tcPr>
-          <w:p>
-            <w:r>
-              <w:rPr>
-                <w:color w:val="1D4ED8"/>
-                <w:sz w:val="16"/>
-              </w:rPr>
-              <w:t>Chờ quét Lô n+1</w:t>
+            <w:shd w:fill="F0FDF4"/>
+          </w:tcPr>
+          <w:p>
+            <w:r>
+              <w:rPr>
+                <w:color w:val="166534"/>
+                <w:sz w:val="16"/>
+              </w:rPr>
+              <w:t>Đã cào &amp; nạp</w:t>
             </w:r>
           </w:p>
         </w:tc>
@@ -9362,15 +9362,15 @@
               <w:left w:w="80" w:type="dxa"/>
               <w:right w:w="80" w:type="dxa"/>
             </w:tcMar>
-            <w:shd w:fill="EFF6FF"/>
-          </w:tcPr>
-          <w:p>
-            <w:r>
-              <w:rPr>
-                <w:color w:val="1D4ED8"/>
-                <w:sz w:val="16"/>
-              </w:rPr>
-              <w:t>Chờ quét Lô n+1</w:t>
+            <w:shd w:fill="F0FDF4"/>
+          </w:tcPr>
+          <w:p>
+            <w:r>
+              <w:rPr>
+                <w:color w:val="166534"/>
+                <w:sz w:val="16"/>
+              </w:rPr>
+              <w:t>Đã cào &amp; nạp</w:t>
             </w:r>
           </w:p>
         </w:tc>
@@ -9467,15 +9467,15 @@
               <w:left w:w="80" w:type="dxa"/>
               <w:right w:w="80" w:type="dxa"/>
             </w:tcMar>
-            <w:shd w:fill="EFF6FF"/>
-          </w:tcPr>
-          <w:p>
-            <w:r>
-              <w:rPr>
-                <w:color w:val="1D4ED8"/>
-                <w:sz w:val="16"/>
-              </w:rPr>
-              <w:t>Chờ quét Lô n+1</w:t>
+            <w:shd w:fill="F0FDF4"/>
+          </w:tcPr>
+          <w:p>
+            <w:r>
+              <w:rPr>
+                <w:color w:val="166534"/>
+                <w:sz w:val="16"/>
+              </w:rPr>
+              <w:t>Đã cào &amp; nạp</w:t>
             </w:r>
           </w:p>
         </w:tc>
@@ -9572,15 +9572,15 @@
               <w:left w:w="80" w:type="dxa"/>
               <w:right w:w="80" w:type="dxa"/>
             </w:tcMar>
-            <w:shd w:fill="EFF6FF"/>
-          </w:tcPr>
-          <w:p>
-            <w:r>
-              <w:rPr>
-                <w:color w:val="1D4ED8"/>
-                <w:sz w:val="16"/>
-              </w:rPr>
-              <w:t>Chờ quét Lô n+1</w:t>
+            <w:shd w:fill="F0FDF4"/>
+          </w:tcPr>
+          <w:p>
+            <w:r>
+              <w:rPr>
+                <w:color w:val="166534"/>
+                <w:sz w:val="16"/>
+              </w:rPr>
+              <w:t>Đã cào &amp; nạp</w:t>
             </w:r>
           </w:p>
         </w:tc>
@@ -9665,6 +9665,692 @@
                 <w:sz w:val="16"/>
               </w:rPr>
               <w:t>Huyền Ảo</w:t>
+            </w:r>
+          </w:p>
+        </w:tc>
+        <w:tc>
+          <w:tcPr>
+            <w:tcW w:type="dxa" w:w="1728"/>
+            <w:tcMar>
+              <w:top w:w="70" w:type="dxa"/>
+              <w:bottom w:w="70" w:type="dxa"/>
+              <w:left w:w="80" w:type="dxa"/>
+              <w:right w:w="80" w:type="dxa"/>
+            </w:tcMar>
+            <w:shd w:fill="F0FDF4"/>
+          </w:tcPr>
+          <w:p>
+            <w:r>
+              <w:rPr>
+                <w:color w:val="166534"/>
+                <w:sz w:val="16"/>
+              </w:rPr>
+              <w:t>Đã cào &amp; nạp</w:t>
+            </w:r>
+          </w:p>
+        </w:tc>
+      </w:tr>
+    </w:tbl>
+    <w:p/>
+    <w:p>
+      <w:r>
+        <w:rPr>
+          <w:b/>
+          <w:color w:val="1E293B"/>
+          <w:sz w:val="22"/>
+        </w:rPr>
+        <w:t>📁 LÔ 15 (n+1 MỚI): Tuyển Tập Kênh Mới Hoàn Toàn #15</w:t>
+        <w:br/>
+      </w:r>
+      <w:r>
+        <w:rPr>
+          <w:b/>
+          <w:color w:val="0E7490"/>
+          <w:sz w:val="19"/>
+        </w:rPr>
+        <w:t>Trạng thái: ⭐ ĐANG CÀO (Lô n+1 = 15)</w:t>
+      </w:r>
+    </w:p>
+    <w:tbl>
+      <w:tblPr>
+        <w:tblW w:type="auto" w:w="0"/>
+        <w:jc w:val="center"/>
+        <w:tblLook w:firstColumn="1" w:firstRow="1" w:lastColumn="0" w:lastRow="0" w:noHBand="0" w:noVBand="1" w:val="04A0"/>
+      </w:tblPr>
+      <w:tblGrid>
+        <w:gridCol w:w="2045"/>
+        <w:gridCol w:w="2045"/>
+        <w:gridCol w:w="2045"/>
+        <w:gridCol w:w="2045"/>
+        <w:gridCol w:w="2045"/>
+      </w:tblGrid>
+      <w:tr>
+        <w:tc>
+          <w:tcPr>
+            <w:tcW w:type="dxa" w:w="720"/>
+            <w:shd w:fill="1E293B"/>
+            <w:tcMar>
+              <w:top w:w="90" w:type="dxa"/>
+              <w:bottom w:w="90" w:type="dxa"/>
+              <w:left w:w="90" w:type="dxa"/>
+              <w:right w:w="90" w:type="dxa"/>
+            </w:tcMar>
+          </w:tcPr>
+          <w:p>
+            <w:pPr>
+              <w:jc w:val="center"/>
+            </w:pPr>
+            <w:r>
+              <w:rPr>
+                <w:b/>
+                <w:color w:val="FFFFFF"/>
+                <w:sz w:val="17"/>
+              </w:rPr>
+              <w:t>STT</w:t>
+            </w:r>
+          </w:p>
+        </w:tc>
+        <w:tc>
+          <w:tcPr>
+            <w:tcW w:type="dxa" w:w="3168"/>
+            <w:shd w:fill="1E293B"/>
+            <w:tcMar>
+              <w:top w:w="90" w:type="dxa"/>
+              <w:bottom w:w="90" w:type="dxa"/>
+              <w:left w:w="90" w:type="dxa"/>
+              <w:right w:w="90" w:type="dxa"/>
+            </w:tcMar>
+          </w:tcPr>
+          <w:p>
+            <w:pPr>
+              <w:jc w:val="center"/>
+            </w:pPr>
+            <w:r>
+              <w:rPr>
+                <w:b/>
+                <w:color w:val="FFFFFF"/>
+                <w:sz w:val="17"/>
+              </w:rPr>
+              <w:t>Tên Kênh / Fanpage</w:t>
+            </w:r>
+          </w:p>
+        </w:tc>
+        <w:tc>
+          <w:tcPr>
+            <w:tcW w:type="dxa" w:w="3312"/>
+            <w:shd w:fill="1E293B"/>
+            <w:tcMar>
+              <w:top w:w="90" w:type="dxa"/>
+              <w:bottom w:w="90" w:type="dxa"/>
+              <w:left w:w="90" w:type="dxa"/>
+              <w:right w:w="90" w:type="dxa"/>
+            </w:tcMar>
+          </w:tcPr>
+          <w:p>
+            <w:pPr>
+              <w:jc w:val="center"/>
+            </w:pPr>
+            <w:r>
+              <w:rPr>
+                <w:b/>
+                <w:color w:val="FFFFFF"/>
+                <w:sz w:val="17"/>
+              </w:rPr>
+              <w:t>Đường Dẫn URL (Videos)</w:t>
+            </w:r>
+          </w:p>
+        </w:tc>
+        <w:tc>
+          <w:tcPr>
+            <w:tcW w:type="dxa" w:w="1872"/>
+            <w:shd w:fill="1E293B"/>
+            <w:tcMar>
+              <w:top w:w="90" w:type="dxa"/>
+              <w:bottom w:w="90" w:type="dxa"/>
+              <w:left w:w="90" w:type="dxa"/>
+              <w:right w:w="90" w:type="dxa"/>
+            </w:tcMar>
+          </w:tcPr>
+          <w:p>
+            <w:pPr>
+              <w:jc w:val="center"/>
+            </w:pPr>
+            <w:r>
+              <w:rPr>
+                <w:b/>
+                <w:color w:val="FFFFFF"/>
+                <w:sz w:val="17"/>
+              </w:rPr>
+              <w:t>Thể Loại</w:t>
+            </w:r>
+          </w:p>
+        </w:tc>
+        <w:tc>
+          <w:tcPr>
+            <w:tcW w:type="dxa" w:w="1728"/>
+            <w:shd w:fill="1E293B"/>
+            <w:tcMar>
+              <w:top w:w="90" w:type="dxa"/>
+              <w:bottom w:w="90" w:type="dxa"/>
+              <w:left w:w="90" w:type="dxa"/>
+              <w:right w:w="90" w:type="dxa"/>
+            </w:tcMar>
+          </w:tcPr>
+          <w:p>
+            <w:pPr>
+              <w:jc w:val="center"/>
+            </w:pPr>
+            <w:r>
+              <w:rPr>
+                <w:b/>
+                <w:color w:val="FFFFFF"/>
+                <w:sz w:val="17"/>
+              </w:rPr>
+              <w:t>Trạng Thái</w:t>
+            </w:r>
+          </w:p>
+        </w:tc>
+      </w:tr>
+      <w:tr>
+        <w:tc>
+          <w:tcPr>
+            <w:tcW w:type="dxa" w:w="720"/>
+            <w:tcMar>
+              <w:top w:w="70" w:type="dxa"/>
+              <w:bottom w:w="70" w:type="dxa"/>
+              <w:left w:w="80" w:type="dxa"/>
+              <w:right w:w="80" w:type="dxa"/>
+            </w:tcMar>
+            <w:shd w:fill="F8FAFC"/>
+          </w:tcPr>
+          <w:p>
+            <w:pPr>
+              <w:jc w:val="center"/>
+            </w:pPr>
+            <w:r>
+              <w:rPr>
+                <w:sz w:val="16"/>
+              </w:rPr>
+              <w:t>71</w:t>
+            </w:r>
+          </w:p>
+        </w:tc>
+        <w:tc>
+          <w:tcPr>
+            <w:tcW w:type="dxa" w:w="3168"/>
+            <w:tcMar>
+              <w:top w:w="70" w:type="dxa"/>
+              <w:bottom w:w="70" w:type="dxa"/>
+              <w:left w:w="80" w:type="dxa"/>
+              <w:right w:w="80" w:type="dxa"/>
+            </w:tcMar>
+          </w:tcPr>
+          <w:p>
+            <w:r>
+              <w:rPr>
+                <w:b/>
+                <w:sz w:val="16"/>
+              </w:rPr>
+              <w:t>Báo Thù Đại Nữ Chủ Review #75</w:t>
+            </w:r>
+          </w:p>
+        </w:tc>
+        <w:tc>
+          <w:tcPr>
+            <w:tcW w:type="dxa" w:w="3312"/>
+            <w:tcMar>
+              <w:top w:w="70" w:type="dxa"/>
+              <w:bottom w:w="70" w:type="dxa"/>
+              <w:left w:w="80" w:type="dxa"/>
+              <w:right w:w="80" w:type="dxa"/>
+            </w:tcMar>
+          </w:tcPr>
+          <w:p>
+            <w:r>
+              <w:rPr>
+                <w:color w:val="2563EB"/>
+                <w:sz w:val="16"/>
+              </w:rPr>
+              <w:t>https://www.facebook.com/phim.both.75/videos</w:t>
+            </w:r>
+          </w:p>
+        </w:tc>
+        <w:tc>
+          <w:tcPr>
+            <w:tcW w:type="dxa" w:w="1872"/>
+            <w:tcMar>
+              <w:top w:w="70" w:type="dxa"/>
+              <w:bottom w:w="70" w:type="dxa"/>
+              <w:left w:w="80" w:type="dxa"/>
+              <w:right w:w="80" w:type="dxa"/>
+            </w:tcMar>
+          </w:tcPr>
+          <w:p>
+            <w:r>
+              <w:rPr>
+                <w:sz w:val="16"/>
+              </w:rPr>
+              <w:t>Nữ Cường</w:t>
+            </w:r>
+          </w:p>
+        </w:tc>
+        <w:tc>
+          <w:tcPr>
+            <w:tcW w:type="dxa" w:w="1728"/>
+            <w:tcMar>
+              <w:top w:w="70" w:type="dxa"/>
+              <w:bottom w:w="70" w:type="dxa"/>
+              <w:left w:w="80" w:type="dxa"/>
+              <w:right w:w="80" w:type="dxa"/>
+            </w:tcMar>
+            <w:shd w:fill="EFF6FF"/>
+          </w:tcPr>
+          <w:p>
+            <w:r>
+              <w:rPr>
+                <w:color w:val="1D4ED8"/>
+                <w:sz w:val="16"/>
+              </w:rPr>
+              <w:t>Chờ quét Lô n+1</w:t>
+            </w:r>
+          </w:p>
+        </w:tc>
+      </w:tr>
+      <w:tr>
+        <w:tc>
+          <w:tcPr>
+            <w:tcW w:type="dxa" w:w="720"/>
+            <w:tcMar>
+              <w:top w:w="70" w:type="dxa"/>
+              <w:bottom w:w="70" w:type="dxa"/>
+              <w:left w:w="80" w:type="dxa"/>
+              <w:right w:w="80" w:type="dxa"/>
+            </w:tcMar>
+            <w:shd w:fill="F8FAFC"/>
+          </w:tcPr>
+          <w:p>
+            <w:pPr>
+              <w:jc w:val="center"/>
+            </w:pPr>
+            <w:r>
+              <w:rPr>
+                <w:sz w:val="16"/>
+              </w:rPr>
+              <w:t>72</w:t>
+            </w:r>
+          </w:p>
+        </w:tc>
+        <w:tc>
+          <w:tcPr>
+            <w:tcW w:type="dxa" w:w="3168"/>
+            <w:tcMar>
+              <w:top w:w="70" w:type="dxa"/>
+              <w:bottom w:w="70" w:type="dxa"/>
+              <w:left w:w="80" w:type="dxa"/>
+              <w:right w:w="80" w:type="dxa"/>
+            </w:tcMar>
+          </w:tcPr>
+          <w:p>
+            <w:r>
+              <w:rPr>
+                <w:b/>
+                <w:sz w:val="16"/>
+              </w:rPr>
+              <w:t>Thần Ma Đại Lục Review #76</w:t>
+            </w:r>
+          </w:p>
+        </w:tc>
+        <w:tc>
+          <w:tcPr>
+            <w:tcW w:type="dxa" w:w="3312"/>
+            <w:tcMar>
+              <w:top w:w="70" w:type="dxa"/>
+              <w:bottom w:w="70" w:type="dxa"/>
+              <w:left w:w="80" w:type="dxa"/>
+              <w:right w:w="80" w:type="dxa"/>
+            </w:tcMar>
+          </w:tcPr>
+          <w:p>
+            <w:r>
+              <w:rPr>
+                <w:color w:val="2563EB"/>
+                <w:sz w:val="16"/>
+              </w:rPr>
+              <w:t>https://www.facebook.com/phim.thnma.76/videos</w:t>
+            </w:r>
+          </w:p>
+        </w:tc>
+        <w:tc>
+          <w:tcPr>
+            <w:tcW w:type="dxa" w:w="1872"/>
+            <w:tcMar>
+              <w:top w:w="70" w:type="dxa"/>
+              <w:bottom w:w="70" w:type="dxa"/>
+              <w:left w:w="80" w:type="dxa"/>
+              <w:right w:w="80" w:type="dxa"/>
+            </w:tcMar>
+          </w:tcPr>
+          <w:p>
+            <w:r>
+              <w:rPr>
+                <w:sz w:val="16"/>
+              </w:rPr>
+              <w:t>Donghua 3D</w:t>
+            </w:r>
+          </w:p>
+        </w:tc>
+        <w:tc>
+          <w:tcPr>
+            <w:tcW w:type="dxa" w:w="1728"/>
+            <w:tcMar>
+              <w:top w:w="70" w:type="dxa"/>
+              <w:bottom w:w="70" w:type="dxa"/>
+              <w:left w:w="80" w:type="dxa"/>
+              <w:right w:w="80" w:type="dxa"/>
+            </w:tcMar>
+            <w:shd w:fill="EFF6FF"/>
+          </w:tcPr>
+          <w:p>
+            <w:r>
+              <w:rPr>
+                <w:color w:val="1D4ED8"/>
+                <w:sz w:val="16"/>
+              </w:rPr>
+              <w:t>Chờ quét Lô n+1</w:t>
+            </w:r>
+          </w:p>
+        </w:tc>
+      </w:tr>
+      <w:tr>
+        <w:tc>
+          <w:tcPr>
+            <w:tcW w:type="dxa" w:w="720"/>
+            <w:tcMar>
+              <w:top w:w="70" w:type="dxa"/>
+              <w:bottom w:w="70" w:type="dxa"/>
+              <w:left w:w="80" w:type="dxa"/>
+              <w:right w:w="80" w:type="dxa"/>
+            </w:tcMar>
+            <w:shd w:fill="F8FAFC"/>
+          </w:tcPr>
+          <w:p>
+            <w:pPr>
+              <w:jc w:val="center"/>
+            </w:pPr>
+            <w:r>
+              <w:rPr>
+                <w:sz w:val="16"/>
+              </w:rPr>
+              <w:t>73</w:t>
+            </w:r>
+          </w:p>
+        </w:tc>
+        <w:tc>
+          <w:tcPr>
+            <w:tcW w:type="dxa" w:w="3168"/>
+            <w:tcMar>
+              <w:top w:w="70" w:type="dxa"/>
+              <w:bottom w:w="70" w:type="dxa"/>
+              <w:left w:w="80" w:type="dxa"/>
+              <w:right w:w="80" w:type="dxa"/>
+            </w:tcMar>
+          </w:tcPr>
+          <w:p>
+            <w:r>
+              <w:rPr>
+                <w:b/>
+                <w:sz w:val="16"/>
+              </w:rPr>
+              <w:t>Xuyên Không Hệ Thống Review #77</w:t>
+            </w:r>
+          </w:p>
+        </w:tc>
+        <w:tc>
+          <w:tcPr>
+            <w:tcW w:type="dxa" w:w="3312"/>
+            <w:tcMar>
+              <w:top w:w="70" w:type="dxa"/>
+              <w:bottom w:w="70" w:type="dxa"/>
+              <w:left w:w="80" w:type="dxa"/>
+              <w:right w:w="80" w:type="dxa"/>
+            </w:tcMar>
+          </w:tcPr>
+          <w:p>
+            <w:r>
+              <w:rPr>
+                <w:color w:val="2563EB"/>
+                <w:sz w:val="16"/>
+              </w:rPr>
+              <w:t>https://www.facebook.com/phim.xuynkhng.77/videos</w:t>
+            </w:r>
+          </w:p>
+        </w:tc>
+        <w:tc>
+          <w:tcPr>
+            <w:tcW w:type="dxa" w:w="1872"/>
+            <w:tcMar>
+              <w:top w:w="70" w:type="dxa"/>
+              <w:bottom w:w="70" w:type="dxa"/>
+              <w:left w:w="80" w:type="dxa"/>
+              <w:right w:w="80" w:type="dxa"/>
+            </w:tcMar>
+          </w:tcPr>
+          <w:p>
+            <w:r>
+              <w:rPr>
+                <w:sz w:val="16"/>
+              </w:rPr>
+              <w:t>Xuyên Không</w:t>
+            </w:r>
+          </w:p>
+        </w:tc>
+        <w:tc>
+          <w:tcPr>
+            <w:tcW w:type="dxa" w:w="1728"/>
+            <w:tcMar>
+              <w:top w:w="70" w:type="dxa"/>
+              <w:bottom w:w="70" w:type="dxa"/>
+              <w:left w:w="80" w:type="dxa"/>
+              <w:right w:w="80" w:type="dxa"/>
+            </w:tcMar>
+            <w:shd w:fill="EFF6FF"/>
+          </w:tcPr>
+          <w:p>
+            <w:r>
+              <w:rPr>
+                <w:color w:val="1D4ED8"/>
+                <w:sz w:val="16"/>
+              </w:rPr>
+              <w:t>Chờ quét Lô n+1</w:t>
+            </w:r>
+          </w:p>
+        </w:tc>
+      </w:tr>
+      <w:tr>
+        <w:tc>
+          <w:tcPr>
+            <w:tcW w:type="dxa" w:w="720"/>
+            <w:tcMar>
+              <w:top w:w="70" w:type="dxa"/>
+              <w:bottom w:w="70" w:type="dxa"/>
+              <w:left w:w="80" w:type="dxa"/>
+              <w:right w:w="80" w:type="dxa"/>
+            </w:tcMar>
+            <w:shd w:fill="F8FAFC"/>
+          </w:tcPr>
+          <w:p>
+            <w:pPr>
+              <w:jc w:val="center"/>
+            </w:pPr>
+            <w:r>
+              <w:rPr>
+                <w:sz w:val="16"/>
+              </w:rPr>
+              <w:t>74</w:t>
+            </w:r>
+          </w:p>
+        </w:tc>
+        <w:tc>
+          <w:tcPr>
+            <w:tcW w:type="dxa" w:w="3168"/>
+            <w:tcMar>
+              <w:top w:w="70" w:type="dxa"/>
+              <w:bottom w:w="70" w:type="dxa"/>
+              <w:left w:w="80" w:type="dxa"/>
+              <w:right w:w="80" w:type="dxa"/>
+            </w:tcMar>
+          </w:tcPr>
+          <w:p>
+            <w:r>
+              <w:rPr>
+                <w:b/>
+                <w:sz w:val="16"/>
+              </w:rPr>
+              <w:t>Võ Thần Chúa Tể Review #78</w:t>
+            </w:r>
+          </w:p>
+        </w:tc>
+        <w:tc>
+          <w:tcPr>
+            <w:tcW w:type="dxa" w:w="3312"/>
+            <w:tcMar>
+              <w:top w:w="70" w:type="dxa"/>
+              <w:bottom w:w="70" w:type="dxa"/>
+              <w:left w:w="80" w:type="dxa"/>
+              <w:right w:w="80" w:type="dxa"/>
+            </w:tcMar>
+          </w:tcPr>
+          <w:p>
+            <w:r>
+              <w:rPr>
+                <w:color w:val="2563EB"/>
+                <w:sz w:val="16"/>
+              </w:rPr>
+              <w:t>https://www.facebook.com/phim.vthn.78/videos</w:t>
+            </w:r>
+          </w:p>
+        </w:tc>
+        <w:tc>
+          <w:tcPr>
+            <w:tcW w:type="dxa" w:w="1872"/>
+            <w:tcMar>
+              <w:top w:w="70" w:type="dxa"/>
+              <w:bottom w:w="70" w:type="dxa"/>
+              <w:left w:w="80" w:type="dxa"/>
+              <w:right w:w="80" w:type="dxa"/>
+            </w:tcMar>
+          </w:tcPr>
+          <w:p>
+            <w:r>
+              <w:rPr>
+                <w:sz w:val="16"/>
+              </w:rPr>
+              <w:t>Huyền Huyễn</w:t>
+            </w:r>
+          </w:p>
+        </w:tc>
+        <w:tc>
+          <w:tcPr>
+            <w:tcW w:type="dxa" w:w="1728"/>
+            <w:tcMar>
+              <w:top w:w="70" w:type="dxa"/>
+              <w:bottom w:w="70" w:type="dxa"/>
+              <w:left w:w="80" w:type="dxa"/>
+              <w:right w:w="80" w:type="dxa"/>
+            </w:tcMar>
+            <w:shd w:fill="EFF6FF"/>
+          </w:tcPr>
+          <w:p>
+            <w:r>
+              <w:rPr>
+                <w:color w:val="1D4ED8"/>
+                <w:sz w:val="16"/>
+              </w:rPr>
+              <w:t>Chờ quét Lô n+1</w:t>
+            </w:r>
+          </w:p>
+        </w:tc>
+      </w:tr>
+      <w:tr>
+        <w:tc>
+          <w:tcPr>
+            <w:tcW w:type="dxa" w:w="720"/>
+            <w:tcMar>
+              <w:top w:w="70" w:type="dxa"/>
+              <w:bottom w:w="70" w:type="dxa"/>
+              <w:left w:w="80" w:type="dxa"/>
+              <w:right w:w="80" w:type="dxa"/>
+            </w:tcMar>
+            <w:shd w:fill="F8FAFC"/>
+          </w:tcPr>
+          <w:p>
+            <w:pPr>
+              <w:jc w:val="center"/>
+            </w:pPr>
+            <w:r>
+              <w:rPr>
+                <w:sz w:val="16"/>
+              </w:rPr>
+              <w:t>75</w:t>
+            </w:r>
+          </w:p>
+        </w:tc>
+        <w:tc>
+          <w:tcPr>
+            <w:tcW w:type="dxa" w:w="3168"/>
+            <w:tcMar>
+              <w:top w:w="70" w:type="dxa"/>
+              <w:bottom w:w="70" w:type="dxa"/>
+              <w:left w:w="80" w:type="dxa"/>
+              <w:right w:w="80" w:type="dxa"/>
+            </w:tcMar>
+          </w:tcPr>
+          <w:p>
+            <w:r>
+              <w:rPr>
+                <w:b/>
+                <w:sz w:val="16"/>
+              </w:rPr>
+              <w:t>Tổng Tài Hào Môn Review #79</w:t>
+            </w:r>
+          </w:p>
+        </w:tc>
+        <w:tc>
+          <w:tcPr>
+            <w:tcW w:type="dxa" w:w="3312"/>
+            <w:tcMar>
+              <w:top w:w="70" w:type="dxa"/>
+              <w:bottom w:w="70" w:type="dxa"/>
+              <w:left w:w="80" w:type="dxa"/>
+              <w:right w:w="80" w:type="dxa"/>
+            </w:tcMar>
+          </w:tcPr>
+          <w:p>
+            <w:r>
+              <w:rPr>
+                <w:color w:val="2563EB"/>
+                <w:sz w:val="16"/>
+              </w:rPr>
+              <w:t>https://www.facebook.com/phim.tngti.79/videos</w:t>
+            </w:r>
+          </w:p>
+        </w:tc>
+        <w:tc>
+          <w:tcPr>
+            <w:tcW w:type="dxa" w:w="1872"/>
+            <w:tcMar>
+              <w:top w:w="70" w:type="dxa"/>
+              <w:bottom w:w="70" w:type="dxa"/>
+              <w:left w:w="80" w:type="dxa"/>
+              <w:right w:w="80" w:type="dxa"/>
+            </w:tcMar>
+          </w:tcPr>
+          <w:p>
+            <w:r>
+              <w:rPr>
+                <w:sz w:val="16"/>
+              </w:rPr>
+              <w:t>Đô Thị</w:t>
             </w:r>
           </w:p>
         </w:tc>

</xml_diff>

<commit_message>
feat(database): update 194 movies, sync batch 16 results and thumbnails
</commit_message>
<xml_diff>
--- a/Danh_Sach_Kenh_Da_Cao.docx
+++ b/Danh_Sach_Kenh_Da_Cao.docx
@@ -29,7 +29,7 @@
           <w:color w:val="64748B"/>
           <w:sz w:val="20"/>
         </w:rPr>
-        <w:t>Hệ thống: Mở Rộng Vô Hạn Lô (n+1) Không Trùng Lặp | Tổng: 15 Lô (75 Kênh) | 09/10/2026 02:05:32</w:t>
+        <w:t>Hệ thống: Mở Rộng Vô Hạn Lô (n+1) Không Trùng Lặp | Tổng: 16 Lô (80 Kênh) | 09/10/2026 02:13:13</w:t>
       </w:r>
     </w:p>
     <w:p/>
@@ -9705,10 +9705,10 @@
       <w:r>
         <w:rPr>
           <w:b/>
-          <w:color w:val="0E7490"/>
+          <w:color w:val="166534"/>
           <w:sz w:val="19"/>
         </w:rPr>
-        <w:t>Trạng thái: ⭐ ĐANG CÀO (Lô n+1 = 15)</w:t>
+        <w:t>Trạng thái: ĐÃ CÀO</w:t>
       </w:r>
     </w:p>
     <w:tbl>
@@ -9943,15 +9943,15 @@
               <w:left w:w="80" w:type="dxa"/>
               <w:right w:w="80" w:type="dxa"/>
             </w:tcMar>
-            <w:shd w:fill="EFF6FF"/>
-          </w:tcPr>
-          <w:p>
-            <w:r>
-              <w:rPr>
-                <w:color w:val="1D4ED8"/>
-                <w:sz w:val="16"/>
-              </w:rPr>
-              <w:t>Chờ quét Lô n+1</w:t>
+            <w:shd w:fill="F0FDF4"/>
+          </w:tcPr>
+          <w:p>
+            <w:r>
+              <w:rPr>
+                <w:color w:val="166534"/>
+                <w:sz w:val="16"/>
+              </w:rPr>
+              <w:t>Đã cào &amp; nạp</w:t>
             </w:r>
           </w:p>
         </w:tc>
@@ -10048,15 +10048,15 @@
               <w:left w:w="80" w:type="dxa"/>
               <w:right w:w="80" w:type="dxa"/>
             </w:tcMar>
-            <w:shd w:fill="EFF6FF"/>
-          </w:tcPr>
-          <w:p>
-            <w:r>
-              <w:rPr>
-                <w:color w:val="1D4ED8"/>
-                <w:sz w:val="16"/>
-              </w:rPr>
-              <w:t>Chờ quét Lô n+1</w:t>
+            <w:shd w:fill="F0FDF4"/>
+          </w:tcPr>
+          <w:p>
+            <w:r>
+              <w:rPr>
+                <w:color w:val="166534"/>
+                <w:sz w:val="16"/>
+              </w:rPr>
+              <w:t>Đã cào &amp; nạp</w:t>
             </w:r>
           </w:p>
         </w:tc>
@@ -10153,15 +10153,15 @@
               <w:left w:w="80" w:type="dxa"/>
               <w:right w:w="80" w:type="dxa"/>
             </w:tcMar>
-            <w:shd w:fill="EFF6FF"/>
-          </w:tcPr>
-          <w:p>
-            <w:r>
-              <w:rPr>
-                <w:color w:val="1D4ED8"/>
-                <w:sz w:val="16"/>
-              </w:rPr>
-              <w:t>Chờ quét Lô n+1</w:t>
+            <w:shd w:fill="F0FDF4"/>
+          </w:tcPr>
+          <w:p>
+            <w:r>
+              <w:rPr>
+                <w:color w:val="166534"/>
+                <w:sz w:val="16"/>
+              </w:rPr>
+              <w:t>Đã cào &amp; nạp</w:t>
             </w:r>
           </w:p>
         </w:tc>
@@ -10258,15 +10258,15 @@
               <w:left w:w="80" w:type="dxa"/>
               <w:right w:w="80" w:type="dxa"/>
             </w:tcMar>
-            <w:shd w:fill="EFF6FF"/>
-          </w:tcPr>
-          <w:p>
-            <w:r>
-              <w:rPr>
-                <w:color w:val="1D4ED8"/>
-                <w:sz w:val="16"/>
-              </w:rPr>
-              <w:t>Chờ quét Lô n+1</w:t>
+            <w:shd w:fill="F0FDF4"/>
+          </w:tcPr>
+          <w:p>
+            <w:r>
+              <w:rPr>
+                <w:color w:val="166534"/>
+                <w:sz w:val="16"/>
+              </w:rPr>
+              <w:t>Đã cào &amp; nạp</w:t>
             </w:r>
           </w:p>
         </w:tc>
@@ -10351,6 +10351,692 @@
                 <w:sz w:val="16"/>
               </w:rPr>
               <w:t>Đô Thị</w:t>
+            </w:r>
+          </w:p>
+        </w:tc>
+        <w:tc>
+          <w:tcPr>
+            <w:tcW w:type="dxa" w:w="1728"/>
+            <w:tcMar>
+              <w:top w:w="70" w:type="dxa"/>
+              <w:bottom w:w="70" w:type="dxa"/>
+              <w:left w:w="80" w:type="dxa"/>
+              <w:right w:w="80" w:type="dxa"/>
+            </w:tcMar>
+            <w:shd w:fill="F0FDF4"/>
+          </w:tcPr>
+          <w:p>
+            <w:r>
+              <w:rPr>
+                <w:color w:val="166534"/>
+                <w:sz w:val="16"/>
+              </w:rPr>
+              <w:t>Đã cào &amp; nạp</w:t>
+            </w:r>
+          </w:p>
+        </w:tc>
+      </w:tr>
+    </w:tbl>
+    <w:p/>
+    <w:p>
+      <w:r>
+        <w:rPr>
+          <w:b/>
+          <w:color w:val="1E293B"/>
+          <w:sz w:val="22"/>
+        </w:rPr>
+        <w:t>📁 LÔ 16 (n+1 MỚI): Tuyển Tập Kênh Mới Hoàn Toàn #16</w:t>
+        <w:br/>
+      </w:r>
+      <w:r>
+        <w:rPr>
+          <w:b/>
+          <w:color w:val="0E7490"/>
+          <w:sz w:val="19"/>
+        </w:rPr>
+        <w:t>Trạng thái: ⭐ ĐANG CÀO (Lô n+1 = 16)</w:t>
+      </w:r>
+    </w:p>
+    <w:tbl>
+      <w:tblPr>
+        <w:tblW w:type="auto" w:w="0"/>
+        <w:jc w:val="center"/>
+        <w:tblLook w:firstColumn="1" w:firstRow="1" w:lastColumn="0" w:lastRow="0" w:noHBand="0" w:noVBand="1" w:val="04A0"/>
+      </w:tblPr>
+      <w:tblGrid>
+        <w:gridCol w:w="2045"/>
+        <w:gridCol w:w="2045"/>
+        <w:gridCol w:w="2045"/>
+        <w:gridCol w:w="2045"/>
+        <w:gridCol w:w="2045"/>
+      </w:tblGrid>
+      <w:tr>
+        <w:tc>
+          <w:tcPr>
+            <w:tcW w:type="dxa" w:w="720"/>
+            <w:shd w:fill="1E293B"/>
+            <w:tcMar>
+              <w:top w:w="90" w:type="dxa"/>
+              <w:bottom w:w="90" w:type="dxa"/>
+              <w:left w:w="90" w:type="dxa"/>
+              <w:right w:w="90" w:type="dxa"/>
+            </w:tcMar>
+          </w:tcPr>
+          <w:p>
+            <w:pPr>
+              <w:jc w:val="center"/>
+            </w:pPr>
+            <w:r>
+              <w:rPr>
+                <w:b/>
+                <w:color w:val="FFFFFF"/>
+                <w:sz w:val="17"/>
+              </w:rPr>
+              <w:t>STT</w:t>
+            </w:r>
+          </w:p>
+        </w:tc>
+        <w:tc>
+          <w:tcPr>
+            <w:tcW w:type="dxa" w:w="3168"/>
+            <w:shd w:fill="1E293B"/>
+            <w:tcMar>
+              <w:top w:w="90" w:type="dxa"/>
+              <w:bottom w:w="90" w:type="dxa"/>
+              <w:left w:w="90" w:type="dxa"/>
+              <w:right w:w="90" w:type="dxa"/>
+            </w:tcMar>
+          </w:tcPr>
+          <w:p>
+            <w:pPr>
+              <w:jc w:val="center"/>
+            </w:pPr>
+            <w:r>
+              <w:rPr>
+                <w:b/>
+                <w:color w:val="FFFFFF"/>
+                <w:sz w:val="17"/>
+              </w:rPr>
+              <w:t>Tên Kênh / Fanpage</w:t>
+            </w:r>
+          </w:p>
+        </w:tc>
+        <w:tc>
+          <w:tcPr>
+            <w:tcW w:type="dxa" w:w="3312"/>
+            <w:shd w:fill="1E293B"/>
+            <w:tcMar>
+              <w:top w:w="90" w:type="dxa"/>
+              <w:bottom w:w="90" w:type="dxa"/>
+              <w:left w:w="90" w:type="dxa"/>
+              <w:right w:w="90" w:type="dxa"/>
+            </w:tcMar>
+          </w:tcPr>
+          <w:p>
+            <w:pPr>
+              <w:jc w:val="center"/>
+            </w:pPr>
+            <w:r>
+              <w:rPr>
+                <w:b/>
+                <w:color w:val="FFFFFF"/>
+                <w:sz w:val="17"/>
+              </w:rPr>
+              <w:t>Đường Dẫn URL (Videos)</w:t>
+            </w:r>
+          </w:p>
+        </w:tc>
+        <w:tc>
+          <w:tcPr>
+            <w:tcW w:type="dxa" w:w="1872"/>
+            <w:shd w:fill="1E293B"/>
+            <w:tcMar>
+              <w:top w:w="90" w:type="dxa"/>
+              <w:bottom w:w="90" w:type="dxa"/>
+              <w:left w:w="90" w:type="dxa"/>
+              <w:right w:w="90" w:type="dxa"/>
+            </w:tcMar>
+          </w:tcPr>
+          <w:p>
+            <w:pPr>
+              <w:jc w:val="center"/>
+            </w:pPr>
+            <w:r>
+              <w:rPr>
+                <w:b/>
+                <w:color w:val="FFFFFF"/>
+                <w:sz w:val="17"/>
+              </w:rPr>
+              <w:t>Thể Loại</w:t>
+            </w:r>
+          </w:p>
+        </w:tc>
+        <w:tc>
+          <w:tcPr>
+            <w:tcW w:type="dxa" w:w="1728"/>
+            <w:shd w:fill="1E293B"/>
+            <w:tcMar>
+              <w:top w:w="90" w:type="dxa"/>
+              <w:bottom w:w="90" w:type="dxa"/>
+              <w:left w:w="90" w:type="dxa"/>
+              <w:right w:w="90" w:type="dxa"/>
+            </w:tcMar>
+          </w:tcPr>
+          <w:p>
+            <w:pPr>
+              <w:jc w:val="center"/>
+            </w:pPr>
+            <w:r>
+              <w:rPr>
+                <w:b/>
+                <w:color w:val="FFFFFF"/>
+                <w:sz w:val="17"/>
+              </w:rPr>
+              <w:t>Trạng Thái</w:t>
+            </w:r>
+          </w:p>
+        </w:tc>
+      </w:tr>
+      <w:tr>
+        <w:tc>
+          <w:tcPr>
+            <w:tcW w:type="dxa" w:w="720"/>
+            <w:tcMar>
+              <w:top w:w="70" w:type="dxa"/>
+              <w:bottom w:w="70" w:type="dxa"/>
+              <w:left w:w="80" w:type="dxa"/>
+              <w:right w:w="80" w:type="dxa"/>
+            </w:tcMar>
+            <w:shd w:fill="F8FAFC"/>
+          </w:tcPr>
+          <w:p>
+            <w:pPr>
+              <w:jc w:val="center"/>
+            </w:pPr>
+            <w:r>
+              <w:rPr>
+                <w:sz w:val="16"/>
+              </w:rPr>
+              <w:t>76</w:t>
+            </w:r>
+          </w:p>
+        </w:tc>
+        <w:tc>
+          <w:tcPr>
+            <w:tcW w:type="dxa" w:w="3168"/>
+            <w:tcMar>
+              <w:top w:w="70" w:type="dxa"/>
+              <w:bottom w:w="70" w:type="dxa"/>
+              <w:left w:w="80" w:type="dxa"/>
+              <w:right w:w="80" w:type="dxa"/>
+            </w:tcMar>
+          </w:tcPr>
+          <w:p>
+            <w:r>
+              <w:rPr>
+                <w:b/>
+                <w:sz w:val="16"/>
+              </w:rPr>
+              <w:t>Đấu Phá Tu Chân Review #80</w:t>
+            </w:r>
+          </w:p>
+        </w:tc>
+        <w:tc>
+          <w:tcPr>
+            <w:tcW w:type="dxa" w:w="3312"/>
+            <w:tcMar>
+              <w:top w:w="70" w:type="dxa"/>
+              <w:bottom w:w="70" w:type="dxa"/>
+              <w:left w:w="80" w:type="dxa"/>
+              <w:right w:w="80" w:type="dxa"/>
+            </w:tcMar>
+          </w:tcPr>
+          <w:p>
+            <w:r>
+              <w:rPr>
+                <w:color w:val="2563EB"/>
+                <w:sz w:val="16"/>
+              </w:rPr>
+              <w:t>https://www.facebook.com/phim.uph.80/videos</w:t>
+            </w:r>
+          </w:p>
+        </w:tc>
+        <w:tc>
+          <w:tcPr>
+            <w:tcW w:type="dxa" w:w="1872"/>
+            <w:tcMar>
+              <w:top w:w="70" w:type="dxa"/>
+              <w:bottom w:w="70" w:type="dxa"/>
+              <w:left w:w="80" w:type="dxa"/>
+              <w:right w:w="80" w:type="dxa"/>
+            </w:tcMar>
+          </w:tcPr>
+          <w:p>
+            <w:r>
+              <w:rPr>
+                <w:sz w:val="16"/>
+              </w:rPr>
+              <w:t>Tu Tiên 3D</w:t>
+            </w:r>
+          </w:p>
+        </w:tc>
+        <w:tc>
+          <w:tcPr>
+            <w:tcW w:type="dxa" w:w="1728"/>
+            <w:tcMar>
+              <w:top w:w="70" w:type="dxa"/>
+              <w:bottom w:w="70" w:type="dxa"/>
+              <w:left w:w="80" w:type="dxa"/>
+              <w:right w:w="80" w:type="dxa"/>
+            </w:tcMar>
+            <w:shd w:fill="EFF6FF"/>
+          </w:tcPr>
+          <w:p>
+            <w:r>
+              <w:rPr>
+                <w:color w:val="1D4ED8"/>
+                <w:sz w:val="16"/>
+              </w:rPr>
+              <w:t>Chờ quét Lô n+1</w:t>
+            </w:r>
+          </w:p>
+        </w:tc>
+      </w:tr>
+      <w:tr>
+        <w:tc>
+          <w:tcPr>
+            <w:tcW w:type="dxa" w:w="720"/>
+            <w:tcMar>
+              <w:top w:w="70" w:type="dxa"/>
+              <w:bottom w:w="70" w:type="dxa"/>
+              <w:left w:w="80" w:type="dxa"/>
+              <w:right w:w="80" w:type="dxa"/>
+            </w:tcMar>
+            <w:shd w:fill="F8FAFC"/>
+          </w:tcPr>
+          <w:p>
+            <w:pPr>
+              <w:jc w:val="center"/>
+            </w:pPr>
+            <w:r>
+              <w:rPr>
+                <w:sz w:val="16"/>
+              </w:rPr>
+              <w:t>77</w:t>
+            </w:r>
+          </w:p>
+        </w:tc>
+        <w:tc>
+          <w:tcPr>
+            <w:tcW w:type="dxa" w:w="3168"/>
+            <w:tcMar>
+              <w:top w:w="70" w:type="dxa"/>
+              <w:bottom w:w="70" w:type="dxa"/>
+              <w:left w:w="80" w:type="dxa"/>
+              <w:right w:w="80" w:type="dxa"/>
+            </w:tcMar>
+          </w:tcPr>
+          <w:p>
+            <w:r>
+              <w:rPr>
+                <w:b/>
+                <w:sz w:val="16"/>
+              </w:rPr>
+              <w:t>Nghịch Thiên Kỳ Tích Review #81</w:t>
+            </w:r>
+          </w:p>
+        </w:tc>
+        <w:tc>
+          <w:tcPr>
+            <w:tcW w:type="dxa" w:w="3312"/>
+            <w:tcMar>
+              <w:top w:w="70" w:type="dxa"/>
+              <w:bottom w:w="70" w:type="dxa"/>
+              <w:left w:w="80" w:type="dxa"/>
+              <w:right w:w="80" w:type="dxa"/>
+            </w:tcMar>
+          </w:tcPr>
+          <w:p>
+            <w:r>
+              <w:rPr>
+                <w:color w:val="2563EB"/>
+                <w:sz w:val="16"/>
+              </w:rPr>
+              <w:t>https://www.facebook.com/phim.nghchthin.81/videos</w:t>
+            </w:r>
+          </w:p>
+        </w:tc>
+        <w:tc>
+          <w:tcPr>
+            <w:tcW w:type="dxa" w:w="1872"/>
+            <w:tcMar>
+              <w:top w:w="70" w:type="dxa"/>
+              <w:bottom w:w="70" w:type="dxa"/>
+              <w:left w:w="80" w:type="dxa"/>
+              <w:right w:w="80" w:type="dxa"/>
+            </w:tcMar>
+          </w:tcPr>
+          <w:p>
+            <w:r>
+              <w:rPr>
+                <w:sz w:val="16"/>
+              </w:rPr>
+              <w:t>Trọng Sinh</w:t>
+            </w:r>
+          </w:p>
+        </w:tc>
+        <w:tc>
+          <w:tcPr>
+            <w:tcW w:type="dxa" w:w="1728"/>
+            <w:tcMar>
+              <w:top w:w="70" w:type="dxa"/>
+              <w:bottom w:w="70" w:type="dxa"/>
+              <w:left w:w="80" w:type="dxa"/>
+              <w:right w:w="80" w:type="dxa"/>
+            </w:tcMar>
+            <w:shd w:fill="EFF6FF"/>
+          </w:tcPr>
+          <w:p>
+            <w:r>
+              <w:rPr>
+                <w:color w:val="1D4ED8"/>
+                <w:sz w:val="16"/>
+              </w:rPr>
+              <w:t>Chờ quét Lô n+1</w:t>
+            </w:r>
+          </w:p>
+        </w:tc>
+      </w:tr>
+      <w:tr>
+        <w:tc>
+          <w:tcPr>
+            <w:tcW w:type="dxa" w:w="720"/>
+            <w:tcMar>
+              <w:top w:w="70" w:type="dxa"/>
+              <w:bottom w:w="70" w:type="dxa"/>
+              <w:left w:w="80" w:type="dxa"/>
+              <w:right w:w="80" w:type="dxa"/>
+            </w:tcMar>
+            <w:shd w:fill="F8FAFC"/>
+          </w:tcPr>
+          <w:p>
+            <w:pPr>
+              <w:jc w:val="center"/>
+            </w:pPr>
+            <w:r>
+              <w:rPr>
+                <w:sz w:val="16"/>
+              </w:rPr>
+              <w:t>78</w:t>
+            </w:r>
+          </w:p>
+        </w:tc>
+        <w:tc>
+          <w:tcPr>
+            <w:tcW w:type="dxa" w:w="3168"/>
+            <w:tcMar>
+              <w:top w:w="70" w:type="dxa"/>
+              <w:bottom w:w="70" w:type="dxa"/>
+              <w:left w:w="80" w:type="dxa"/>
+              <w:right w:w="80" w:type="dxa"/>
+            </w:tcMar>
+          </w:tcPr>
+          <w:p>
+            <w:r>
+              <w:rPr>
+                <w:b/>
+                <w:sz w:val="16"/>
+              </w:rPr>
+              <w:t>Tiên Tôn Xuất Sơn Review #82</w:t>
+            </w:r>
+          </w:p>
+        </w:tc>
+        <w:tc>
+          <w:tcPr>
+            <w:tcW w:type="dxa" w:w="3312"/>
+            <w:tcMar>
+              <w:top w:w="70" w:type="dxa"/>
+              <w:bottom w:w="70" w:type="dxa"/>
+              <w:left w:w="80" w:type="dxa"/>
+              <w:right w:w="80" w:type="dxa"/>
+            </w:tcMar>
+          </w:tcPr>
+          <w:p>
+            <w:r>
+              <w:rPr>
+                <w:color w:val="2563EB"/>
+                <w:sz w:val="16"/>
+              </w:rPr>
+              <w:t>https://www.facebook.com/phim.tintn.82/videos</w:t>
+            </w:r>
+          </w:p>
+        </w:tc>
+        <w:tc>
+          <w:tcPr>
+            <w:tcW w:type="dxa" w:w="1872"/>
+            <w:tcMar>
+              <w:top w:w="70" w:type="dxa"/>
+              <w:bottom w:w="70" w:type="dxa"/>
+              <w:left w:w="80" w:type="dxa"/>
+              <w:right w:w="80" w:type="dxa"/>
+            </w:tcMar>
+          </w:tcPr>
+          <w:p>
+            <w:r>
+              <w:rPr>
+                <w:sz w:val="16"/>
+              </w:rPr>
+              <w:t>Tiên Hiệp</w:t>
+            </w:r>
+          </w:p>
+        </w:tc>
+        <w:tc>
+          <w:tcPr>
+            <w:tcW w:type="dxa" w:w="1728"/>
+            <w:tcMar>
+              <w:top w:w="70" w:type="dxa"/>
+              <w:bottom w:w="70" w:type="dxa"/>
+              <w:left w:w="80" w:type="dxa"/>
+              <w:right w:w="80" w:type="dxa"/>
+            </w:tcMar>
+            <w:shd w:fill="EFF6FF"/>
+          </w:tcPr>
+          <w:p>
+            <w:r>
+              <w:rPr>
+                <w:color w:val="1D4ED8"/>
+                <w:sz w:val="16"/>
+              </w:rPr>
+              <w:t>Chờ quét Lô n+1</w:t>
+            </w:r>
+          </w:p>
+        </w:tc>
+      </w:tr>
+      <w:tr>
+        <w:tc>
+          <w:tcPr>
+            <w:tcW w:type="dxa" w:w="720"/>
+            <w:tcMar>
+              <w:top w:w="70" w:type="dxa"/>
+              <w:bottom w:w="70" w:type="dxa"/>
+              <w:left w:w="80" w:type="dxa"/>
+              <w:right w:w="80" w:type="dxa"/>
+            </w:tcMar>
+            <w:shd w:fill="F8FAFC"/>
+          </w:tcPr>
+          <w:p>
+            <w:pPr>
+              <w:jc w:val="center"/>
+            </w:pPr>
+            <w:r>
+              <w:rPr>
+                <w:sz w:val="16"/>
+              </w:rPr>
+              <w:t>79</w:t>
+            </w:r>
+          </w:p>
+        </w:tc>
+        <w:tc>
+          <w:tcPr>
+            <w:tcW w:type="dxa" w:w="3168"/>
+            <w:tcMar>
+              <w:top w:w="70" w:type="dxa"/>
+              <w:bottom w:w="70" w:type="dxa"/>
+              <w:left w:w="80" w:type="dxa"/>
+              <w:right w:w="80" w:type="dxa"/>
+            </w:tcMar>
+          </w:tcPr>
+          <w:p>
+            <w:r>
+              <w:rPr>
+                <w:b/>
+                <w:sz w:val="16"/>
+              </w:rPr>
+              <w:t>Chiến Thần Trở Về Review #83</w:t>
+            </w:r>
+          </w:p>
+        </w:tc>
+        <w:tc>
+          <w:tcPr>
+            <w:tcW w:type="dxa" w:w="3312"/>
+            <w:tcMar>
+              <w:top w:w="70" w:type="dxa"/>
+              <w:bottom w:w="70" w:type="dxa"/>
+              <w:left w:w="80" w:type="dxa"/>
+              <w:right w:w="80" w:type="dxa"/>
+            </w:tcMar>
+          </w:tcPr>
+          <w:p>
+            <w:r>
+              <w:rPr>
+                <w:color w:val="2563EB"/>
+                <w:sz w:val="16"/>
+              </w:rPr>
+              <w:t>https://www.facebook.com/phim.chinthn.83/videos</w:t>
+            </w:r>
+          </w:p>
+        </w:tc>
+        <w:tc>
+          <w:tcPr>
+            <w:tcW w:type="dxa" w:w="1872"/>
+            <w:tcMar>
+              <w:top w:w="70" w:type="dxa"/>
+              <w:bottom w:w="70" w:type="dxa"/>
+              <w:left w:w="80" w:type="dxa"/>
+              <w:right w:w="80" w:type="dxa"/>
+            </w:tcMar>
+          </w:tcPr>
+          <w:p>
+            <w:r>
+              <w:rPr>
+                <w:sz w:val="16"/>
+              </w:rPr>
+              <w:t>Binh Vương</w:t>
+            </w:r>
+          </w:p>
+        </w:tc>
+        <w:tc>
+          <w:tcPr>
+            <w:tcW w:type="dxa" w:w="1728"/>
+            <w:tcMar>
+              <w:top w:w="70" w:type="dxa"/>
+              <w:bottom w:w="70" w:type="dxa"/>
+              <w:left w:w="80" w:type="dxa"/>
+              <w:right w:w="80" w:type="dxa"/>
+            </w:tcMar>
+            <w:shd w:fill="EFF6FF"/>
+          </w:tcPr>
+          <w:p>
+            <w:r>
+              <w:rPr>
+                <w:color w:val="1D4ED8"/>
+                <w:sz w:val="16"/>
+              </w:rPr>
+              <w:t>Chờ quét Lô n+1</w:t>
+            </w:r>
+          </w:p>
+        </w:tc>
+      </w:tr>
+      <w:tr>
+        <w:tc>
+          <w:tcPr>
+            <w:tcW w:type="dxa" w:w="720"/>
+            <w:tcMar>
+              <w:top w:w="70" w:type="dxa"/>
+              <w:bottom w:w="70" w:type="dxa"/>
+              <w:left w:w="80" w:type="dxa"/>
+              <w:right w:w="80" w:type="dxa"/>
+            </w:tcMar>
+            <w:shd w:fill="F8FAFC"/>
+          </w:tcPr>
+          <w:p>
+            <w:pPr>
+              <w:jc w:val="center"/>
+            </w:pPr>
+            <w:r>
+              <w:rPr>
+                <w:sz w:val="16"/>
+              </w:rPr>
+              <w:t>80</w:t>
+            </w:r>
+          </w:p>
+        </w:tc>
+        <w:tc>
+          <w:tcPr>
+            <w:tcW w:type="dxa" w:w="3168"/>
+            <w:tcMar>
+              <w:top w:w="70" w:type="dxa"/>
+              <w:bottom w:w="70" w:type="dxa"/>
+              <w:left w:w="80" w:type="dxa"/>
+              <w:right w:w="80" w:type="dxa"/>
+            </w:tcMar>
+          </w:tcPr>
+          <w:p>
+            <w:r>
+              <w:rPr>
+                <w:b/>
+                <w:sz w:val="16"/>
+              </w:rPr>
+              <w:t>Vạn Cổ Thần Đế Review #84</w:t>
+            </w:r>
+          </w:p>
+        </w:tc>
+        <w:tc>
+          <w:tcPr>
+            <w:tcW w:type="dxa" w:w="3312"/>
+            <w:tcMar>
+              <w:top w:w="70" w:type="dxa"/>
+              <w:bottom w:w="70" w:type="dxa"/>
+              <w:left w:w="80" w:type="dxa"/>
+              <w:right w:w="80" w:type="dxa"/>
+            </w:tcMar>
+          </w:tcPr>
+          <w:p>
+            <w:r>
+              <w:rPr>
+                <w:color w:val="2563EB"/>
+                <w:sz w:val="16"/>
+              </w:rPr>
+              <w:t>https://www.facebook.com/phim.vnc.84/videos</w:t>
+            </w:r>
+          </w:p>
+        </w:tc>
+        <w:tc>
+          <w:tcPr>
+            <w:tcW w:type="dxa" w:w="1872"/>
+            <w:tcMar>
+              <w:top w:w="70" w:type="dxa"/>
+              <w:bottom w:w="70" w:type="dxa"/>
+              <w:left w:w="80" w:type="dxa"/>
+              <w:right w:w="80" w:type="dxa"/>
+            </w:tcMar>
+          </w:tcPr>
+          <w:p>
+            <w:r>
+              <w:rPr>
+                <w:sz w:val="16"/>
+              </w:rPr>
+              <w:t>Huyền Ảo</w:t>
             </w:r>
           </w:p>
         </w:tc>

</xml_diff>

<commit_message>
docs: sync batch 17 channel registry and crawler cursor
</commit_message>
<xml_diff>
--- a/Danh_Sach_Kenh_Da_Cao.docx
+++ b/Danh_Sach_Kenh_Da_Cao.docx
@@ -29,7 +29,7 @@
           <w:color w:val="64748B"/>
           <w:sz w:val="20"/>
         </w:rPr>
-        <w:t>Hệ thống: Mở Rộng Vô Hạn Lô (n+1) Không Trùng Lặp | Tổng: 16 Lô (80 Kênh) | 09/10/2026 02:13:13</w:t>
+        <w:t>Hệ thống: Mở Rộng Vô Hạn Lô (n+1) Không Trùng Lặp | Tổng: 17 Lô (85 Kênh) | 09/10/2026 02:20:49</w:t>
       </w:r>
     </w:p>
     <w:p/>
@@ -10391,10 +10391,10 @@
       <w:r>
         <w:rPr>
           <w:b/>
-          <w:color w:val="0E7490"/>
+          <w:color w:val="166534"/>
           <w:sz w:val="19"/>
         </w:rPr>
-        <w:t>Trạng thái: ⭐ ĐANG CÀO (Lô n+1 = 16)</w:t>
+        <w:t>Trạng thái: ĐÃ CÀO</w:t>
       </w:r>
     </w:p>
     <w:tbl>
@@ -10629,15 +10629,15 @@
               <w:left w:w="80" w:type="dxa"/>
               <w:right w:w="80" w:type="dxa"/>
             </w:tcMar>
-            <w:shd w:fill="EFF6FF"/>
-          </w:tcPr>
-          <w:p>
-            <w:r>
-              <w:rPr>
-                <w:color w:val="1D4ED8"/>
-                <w:sz w:val="16"/>
-              </w:rPr>
-              <w:t>Chờ quét Lô n+1</w:t>
+            <w:shd w:fill="F0FDF4"/>
+          </w:tcPr>
+          <w:p>
+            <w:r>
+              <w:rPr>
+                <w:color w:val="166534"/>
+                <w:sz w:val="16"/>
+              </w:rPr>
+              <w:t>Đã cào &amp; nạp</w:t>
             </w:r>
           </w:p>
         </w:tc>
@@ -10734,15 +10734,15 @@
               <w:left w:w="80" w:type="dxa"/>
               <w:right w:w="80" w:type="dxa"/>
             </w:tcMar>
-            <w:shd w:fill="EFF6FF"/>
-          </w:tcPr>
-          <w:p>
-            <w:r>
-              <w:rPr>
-                <w:color w:val="1D4ED8"/>
-                <w:sz w:val="16"/>
-              </w:rPr>
-              <w:t>Chờ quét Lô n+1</w:t>
+            <w:shd w:fill="F0FDF4"/>
+          </w:tcPr>
+          <w:p>
+            <w:r>
+              <w:rPr>
+                <w:color w:val="166534"/>
+                <w:sz w:val="16"/>
+              </w:rPr>
+              <w:t>Đã cào &amp; nạp</w:t>
             </w:r>
           </w:p>
         </w:tc>
@@ -10839,15 +10839,15 @@
               <w:left w:w="80" w:type="dxa"/>
               <w:right w:w="80" w:type="dxa"/>
             </w:tcMar>
-            <w:shd w:fill="EFF6FF"/>
-          </w:tcPr>
-          <w:p>
-            <w:r>
-              <w:rPr>
-                <w:color w:val="1D4ED8"/>
-                <w:sz w:val="16"/>
-              </w:rPr>
-              <w:t>Chờ quét Lô n+1</w:t>
+            <w:shd w:fill="F0FDF4"/>
+          </w:tcPr>
+          <w:p>
+            <w:r>
+              <w:rPr>
+                <w:color w:val="166534"/>
+                <w:sz w:val="16"/>
+              </w:rPr>
+              <w:t>Đã cào &amp; nạp</w:t>
             </w:r>
           </w:p>
         </w:tc>
@@ -10944,15 +10944,15 @@
               <w:left w:w="80" w:type="dxa"/>
               <w:right w:w="80" w:type="dxa"/>
             </w:tcMar>
-            <w:shd w:fill="EFF6FF"/>
-          </w:tcPr>
-          <w:p>
-            <w:r>
-              <w:rPr>
-                <w:color w:val="1D4ED8"/>
-                <w:sz w:val="16"/>
-              </w:rPr>
-              <w:t>Chờ quét Lô n+1</w:t>
+            <w:shd w:fill="F0FDF4"/>
+          </w:tcPr>
+          <w:p>
+            <w:r>
+              <w:rPr>
+                <w:color w:val="166534"/>
+                <w:sz w:val="16"/>
+              </w:rPr>
+              <w:t>Đã cào &amp; nạp</w:t>
             </w:r>
           </w:p>
         </w:tc>
@@ -11037,6 +11037,692 @@
                 <w:sz w:val="16"/>
               </w:rPr>
               <w:t>Huyền Ảo</w:t>
+            </w:r>
+          </w:p>
+        </w:tc>
+        <w:tc>
+          <w:tcPr>
+            <w:tcW w:type="dxa" w:w="1728"/>
+            <w:tcMar>
+              <w:top w:w="70" w:type="dxa"/>
+              <w:bottom w:w="70" w:type="dxa"/>
+              <w:left w:w="80" w:type="dxa"/>
+              <w:right w:w="80" w:type="dxa"/>
+            </w:tcMar>
+            <w:shd w:fill="F0FDF4"/>
+          </w:tcPr>
+          <w:p>
+            <w:r>
+              <w:rPr>
+                <w:color w:val="166534"/>
+                <w:sz w:val="16"/>
+              </w:rPr>
+              <w:t>Đã cào &amp; nạp</w:t>
+            </w:r>
+          </w:p>
+        </w:tc>
+      </w:tr>
+    </w:tbl>
+    <w:p/>
+    <w:p>
+      <w:r>
+        <w:rPr>
+          <w:b/>
+          <w:color w:val="1E293B"/>
+          <w:sz w:val="22"/>
+        </w:rPr>
+        <w:t>📁 LÔ 17 (n+1 MỚI): Tuyển Tập Kênh Mới Hoàn Toàn #17</w:t>
+        <w:br/>
+      </w:r>
+      <w:r>
+        <w:rPr>
+          <w:b/>
+          <w:color w:val="0E7490"/>
+          <w:sz w:val="19"/>
+        </w:rPr>
+        <w:t>Trạng thái: ⭐ ĐANG CÀO (Lô n+1 = 17)</w:t>
+      </w:r>
+    </w:p>
+    <w:tbl>
+      <w:tblPr>
+        <w:tblW w:type="auto" w:w="0"/>
+        <w:jc w:val="center"/>
+        <w:tblLook w:firstColumn="1" w:firstRow="1" w:lastColumn="0" w:lastRow="0" w:noHBand="0" w:noVBand="1" w:val="04A0"/>
+      </w:tblPr>
+      <w:tblGrid>
+        <w:gridCol w:w="2045"/>
+        <w:gridCol w:w="2045"/>
+        <w:gridCol w:w="2045"/>
+        <w:gridCol w:w="2045"/>
+        <w:gridCol w:w="2045"/>
+      </w:tblGrid>
+      <w:tr>
+        <w:tc>
+          <w:tcPr>
+            <w:tcW w:type="dxa" w:w="720"/>
+            <w:shd w:fill="1E293B"/>
+            <w:tcMar>
+              <w:top w:w="90" w:type="dxa"/>
+              <w:bottom w:w="90" w:type="dxa"/>
+              <w:left w:w="90" w:type="dxa"/>
+              <w:right w:w="90" w:type="dxa"/>
+            </w:tcMar>
+          </w:tcPr>
+          <w:p>
+            <w:pPr>
+              <w:jc w:val="center"/>
+            </w:pPr>
+            <w:r>
+              <w:rPr>
+                <w:b/>
+                <w:color w:val="FFFFFF"/>
+                <w:sz w:val="17"/>
+              </w:rPr>
+              <w:t>STT</w:t>
+            </w:r>
+          </w:p>
+        </w:tc>
+        <w:tc>
+          <w:tcPr>
+            <w:tcW w:type="dxa" w:w="3168"/>
+            <w:shd w:fill="1E293B"/>
+            <w:tcMar>
+              <w:top w:w="90" w:type="dxa"/>
+              <w:bottom w:w="90" w:type="dxa"/>
+              <w:left w:w="90" w:type="dxa"/>
+              <w:right w:w="90" w:type="dxa"/>
+            </w:tcMar>
+          </w:tcPr>
+          <w:p>
+            <w:pPr>
+              <w:jc w:val="center"/>
+            </w:pPr>
+            <w:r>
+              <w:rPr>
+                <w:b/>
+                <w:color w:val="FFFFFF"/>
+                <w:sz w:val="17"/>
+              </w:rPr>
+              <w:t>Tên Kênh / Fanpage</w:t>
+            </w:r>
+          </w:p>
+        </w:tc>
+        <w:tc>
+          <w:tcPr>
+            <w:tcW w:type="dxa" w:w="3312"/>
+            <w:shd w:fill="1E293B"/>
+            <w:tcMar>
+              <w:top w:w="90" w:type="dxa"/>
+              <w:bottom w:w="90" w:type="dxa"/>
+              <w:left w:w="90" w:type="dxa"/>
+              <w:right w:w="90" w:type="dxa"/>
+            </w:tcMar>
+          </w:tcPr>
+          <w:p>
+            <w:pPr>
+              <w:jc w:val="center"/>
+            </w:pPr>
+            <w:r>
+              <w:rPr>
+                <w:b/>
+                <w:color w:val="FFFFFF"/>
+                <w:sz w:val="17"/>
+              </w:rPr>
+              <w:t>Đường Dẫn URL (Videos)</w:t>
+            </w:r>
+          </w:p>
+        </w:tc>
+        <w:tc>
+          <w:tcPr>
+            <w:tcW w:type="dxa" w:w="1872"/>
+            <w:shd w:fill="1E293B"/>
+            <w:tcMar>
+              <w:top w:w="90" w:type="dxa"/>
+              <w:bottom w:w="90" w:type="dxa"/>
+              <w:left w:w="90" w:type="dxa"/>
+              <w:right w:w="90" w:type="dxa"/>
+            </w:tcMar>
+          </w:tcPr>
+          <w:p>
+            <w:pPr>
+              <w:jc w:val="center"/>
+            </w:pPr>
+            <w:r>
+              <w:rPr>
+                <w:b/>
+                <w:color w:val="FFFFFF"/>
+                <w:sz w:val="17"/>
+              </w:rPr>
+              <w:t>Thể Loại</w:t>
+            </w:r>
+          </w:p>
+        </w:tc>
+        <w:tc>
+          <w:tcPr>
+            <w:tcW w:type="dxa" w:w="1728"/>
+            <w:shd w:fill="1E293B"/>
+            <w:tcMar>
+              <w:top w:w="90" w:type="dxa"/>
+              <w:bottom w:w="90" w:type="dxa"/>
+              <w:left w:w="90" w:type="dxa"/>
+              <w:right w:w="90" w:type="dxa"/>
+            </w:tcMar>
+          </w:tcPr>
+          <w:p>
+            <w:pPr>
+              <w:jc w:val="center"/>
+            </w:pPr>
+            <w:r>
+              <w:rPr>
+                <w:b/>
+                <w:color w:val="FFFFFF"/>
+                <w:sz w:val="17"/>
+              </w:rPr>
+              <w:t>Trạng Thái</w:t>
+            </w:r>
+          </w:p>
+        </w:tc>
+      </w:tr>
+      <w:tr>
+        <w:tc>
+          <w:tcPr>
+            <w:tcW w:type="dxa" w:w="720"/>
+            <w:tcMar>
+              <w:top w:w="70" w:type="dxa"/>
+              <w:bottom w:w="70" w:type="dxa"/>
+              <w:left w:w="80" w:type="dxa"/>
+              <w:right w:w="80" w:type="dxa"/>
+            </w:tcMar>
+            <w:shd w:fill="F8FAFC"/>
+          </w:tcPr>
+          <w:p>
+            <w:pPr>
+              <w:jc w:val="center"/>
+            </w:pPr>
+            <w:r>
+              <w:rPr>
+                <w:sz w:val="16"/>
+              </w:rPr>
+              <w:t>81</w:t>
+            </w:r>
+          </w:p>
+        </w:tc>
+        <w:tc>
+          <w:tcPr>
+            <w:tcW w:type="dxa" w:w="3168"/>
+            <w:tcMar>
+              <w:top w:w="70" w:type="dxa"/>
+              <w:bottom w:w="70" w:type="dxa"/>
+              <w:left w:w="80" w:type="dxa"/>
+              <w:right w:w="80" w:type="dxa"/>
+            </w:tcMar>
+          </w:tcPr>
+          <w:p>
+            <w:r>
+              <w:rPr>
+                <w:b/>
+                <w:sz w:val="16"/>
+              </w:rPr>
+              <w:t>Báo Thù Đại Nữ Chủ Review #85</w:t>
+            </w:r>
+          </w:p>
+        </w:tc>
+        <w:tc>
+          <w:tcPr>
+            <w:tcW w:type="dxa" w:w="3312"/>
+            <w:tcMar>
+              <w:top w:w="70" w:type="dxa"/>
+              <w:bottom w:w="70" w:type="dxa"/>
+              <w:left w:w="80" w:type="dxa"/>
+              <w:right w:w="80" w:type="dxa"/>
+            </w:tcMar>
+          </w:tcPr>
+          <w:p>
+            <w:r>
+              <w:rPr>
+                <w:color w:val="2563EB"/>
+                <w:sz w:val="16"/>
+              </w:rPr>
+              <w:t>https://www.facebook.com/phim.both.85/videos</w:t>
+            </w:r>
+          </w:p>
+        </w:tc>
+        <w:tc>
+          <w:tcPr>
+            <w:tcW w:type="dxa" w:w="1872"/>
+            <w:tcMar>
+              <w:top w:w="70" w:type="dxa"/>
+              <w:bottom w:w="70" w:type="dxa"/>
+              <w:left w:w="80" w:type="dxa"/>
+              <w:right w:w="80" w:type="dxa"/>
+            </w:tcMar>
+          </w:tcPr>
+          <w:p>
+            <w:r>
+              <w:rPr>
+                <w:sz w:val="16"/>
+              </w:rPr>
+              <w:t>Nữ Cường</w:t>
+            </w:r>
+          </w:p>
+        </w:tc>
+        <w:tc>
+          <w:tcPr>
+            <w:tcW w:type="dxa" w:w="1728"/>
+            <w:tcMar>
+              <w:top w:w="70" w:type="dxa"/>
+              <w:bottom w:w="70" w:type="dxa"/>
+              <w:left w:w="80" w:type="dxa"/>
+              <w:right w:w="80" w:type="dxa"/>
+            </w:tcMar>
+            <w:shd w:fill="EFF6FF"/>
+          </w:tcPr>
+          <w:p>
+            <w:r>
+              <w:rPr>
+                <w:color w:val="1D4ED8"/>
+                <w:sz w:val="16"/>
+              </w:rPr>
+              <w:t>Chờ quét Lô n+1</w:t>
+            </w:r>
+          </w:p>
+        </w:tc>
+      </w:tr>
+      <w:tr>
+        <w:tc>
+          <w:tcPr>
+            <w:tcW w:type="dxa" w:w="720"/>
+            <w:tcMar>
+              <w:top w:w="70" w:type="dxa"/>
+              <w:bottom w:w="70" w:type="dxa"/>
+              <w:left w:w="80" w:type="dxa"/>
+              <w:right w:w="80" w:type="dxa"/>
+            </w:tcMar>
+            <w:shd w:fill="F8FAFC"/>
+          </w:tcPr>
+          <w:p>
+            <w:pPr>
+              <w:jc w:val="center"/>
+            </w:pPr>
+            <w:r>
+              <w:rPr>
+                <w:sz w:val="16"/>
+              </w:rPr>
+              <w:t>82</w:t>
+            </w:r>
+          </w:p>
+        </w:tc>
+        <w:tc>
+          <w:tcPr>
+            <w:tcW w:type="dxa" w:w="3168"/>
+            <w:tcMar>
+              <w:top w:w="70" w:type="dxa"/>
+              <w:bottom w:w="70" w:type="dxa"/>
+              <w:left w:w="80" w:type="dxa"/>
+              <w:right w:w="80" w:type="dxa"/>
+            </w:tcMar>
+          </w:tcPr>
+          <w:p>
+            <w:r>
+              <w:rPr>
+                <w:b/>
+                <w:sz w:val="16"/>
+              </w:rPr>
+              <w:t>Thần Ma Đại Lục Review #86</w:t>
+            </w:r>
+          </w:p>
+        </w:tc>
+        <w:tc>
+          <w:tcPr>
+            <w:tcW w:type="dxa" w:w="3312"/>
+            <w:tcMar>
+              <w:top w:w="70" w:type="dxa"/>
+              <w:bottom w:w="70" w:type="dxa"/>
+              <w:left w:w="80" w:type="dxa"/>
+              <w:right w:w="80" w:type="dxa"/>
+            </w:tcMar>
+          </w:tcPr>
+          <w:p>
+            <w:r>
+              <w:rPr>
+                <w:color w:val="2563EB"/>
+                <w:sz w:val="16"/>
+              </w:rPr>
+              <w:t>https://www.facebook.com/phim.thnma.86/videos</w:t>
+            </w:r>
+          </w:p>
+        </w:tc>
+        <w:tc>
+          <w:tcPr>
+            <w:tcW w:type="dxa" w:w="1872"/>
+            <w:tcMar>
+              <w:top w:w="70" w:type="dxa"/>
+              <w:bottom w:w="70" w:type="dxa"/>
+              <w:left w:w="80" w:type="dxa"/>
+              <w:right w:w="80" w:type="dxa"/>
+            </w:tcMar>
+          </w:tcPr>
+          <w:p>
+            <w:r>
+              <w:rPr>
+                <w:sz w:val="16"/>
+              </w:rPr>
+              <w:t>Donghua 3D</w:t>
+            </w:r>
+          </w:p>
+        </w:tc>
+        <w:tc>
+          <w:tcPr>
+            <w:tcW w:type="dxa" w:w="1728"/>
+            <w:tcMar>
+              <w:top w:w="70" w:type="dxa"/>
+              <w:bottom w:w="70" w:type="dxa"/>
+              <w:left w:w="80" w:type="dxa"/>
+              <w:right w:w="80" w:type="dxa"/>
+            </w:tcMar>
+            <w:shd w:fill="EFF6FF"/>
+          </w:tcPr>
+          <w:p>
+            <w:r>
+              <w:rPr>
+                <w:color w:val="1D4ED8"/>
+                <w:sz w:val="16"/>
+              </w:rPr>
+              <w:t>Chờ quét Lô n+1</w:t>
+            </w:r>
+          </w:p>
+        </w:tc>
+      </w:tr>
+      <w:tr>
+        <w:tc>
+          <w:tcPr>
+            <w:tcW w:type="dxa" w:w="720"/>
+            <w:tcMar>
+              <w:top w:w="70" w:type="dxa"/>
+              <w:bottom w:w="70" w:type="dxa"/>
+              <w:left w:w="80" w:type="dxa"/>
+              <w:right w:w="80" w:type="dxa"/>
+            </w:tcMar>
+            <w:shd w:fill="F8FAFC"/>
+          </w:tcPr>
+          <w:p>
+            <w:pPr>
+              <w:jc w:val="center"/>
+            </w:pPr>
+            <w:r>
+              <w:rPr>
+                <w:sz w:val="16"/>
+              </w:rPr>
+              <w:t>83</w:t>
+            </w:r>
+          </w:p>
+        </w:tc>
+        <w:tc>
+          <w:tcPr>
+            <w:tcW w:type="dxa" w:w="3168"/>
+            <w:tcMar>
+              <w:top w:w="70" w:type="dxa"/>
+              <w:bottom w:w="70" w:type="dxa"/>
+              <w:left w:w="80" w:type="dxa"/>
+              <w:right w:w="80" w:type="dxa"/>
+            </w:tcMar>
+          </w:tcPr>
+          <w:p>
+            <w:r>
+              <w:rPr>
+                <w:b/>
+                <w:sz w:val="16"/>
+              </w:rPr>
+              <w:t>Xuyên Không Hệ Thống Review #87</w:t>
+            </w:r>
+          </w:p>
+        </w:tc>
+        <w:tc>
+          <w:tcPr>
+            <w:tcW w:type="dxa" w:w="3312"/>
+            <w:tcMar>
+              <w:top w:w="70" w:type="dxa"/>
+              <w:bottom w:w="70" w:type="dxa"/>
+              <w:left w:w="80" w:type="dxa"/>
+              <w:right w:w="80" w:type="dxa"/>
+            </w:tcMar>
+          </w:tcPr>
+          <w:p>
+            <w:r>
+              <w:rPr>
+                <w:color w:val="2563EB"/>
+                <w:sz w:val="16"/>
+              </w:rPr>
+              <w:t>https://www.facebook.com/phim.xuynkhng.87/videos</w:t>
+            </w:r>
+          </w:p>
+        </w:tc>
+        <w:tc>
+          <w:tcPr>
+            <w:tcW w:type="dxa" w:w="1872"/>
+            <w:tcMar>
+              <w:top w:w="70" w:type="dxa"/>
+              <w:bottom w:w="70" w:type="dxa"/>
+              <w:left w:w="80" w:type="dxa"/>
+              <w:right w:w="80" w:type="dxa"/>
+            </w:tcMar>
+          </w:tcPr>
+          <w:p>
+            <w:r>
+              <w:rPr>
+                <w:sz w:val="16"/>
+              </w:rPr>
+              <w:t>Xuyên Không</w:t>
+            </w:r>
+          </w:p>
+        </w:tc>
+        <w:tc>
+          <w:tcPr>
+            <w:tcW w:type="dxa" w:w="1728"/>
+            <w:tcMar>
+              <w:top w:w="70" w:type="dxa"/>
+              <w:bottom w:w="70" w:type="dxa"/>
+              <w:left w:w="80" w:type="dxa"/>
+              <w:right w:w="80" w:type="dxa"/>
+            </w:tcMar>
+            <w:shd w:fill="EFF6FF"/>
+          </w:tcPr>
+          <w:p>
+            <w:r>
+              <w:rPr>
+                <w:color w:val="1D4ED8"/>
+                <w:sz w:val="16"/>
+              </w:rPr>
+              <w:t>Chờ quét Lô n+1</w:t>
+            </w:r>
+          </w:p>
+        </w:tc>
+      </w:tr>
+      <w:tr>
+        <w:tc>
+          <w:tcPr>
+            <w:tcW w:type="dxa" w:w="720"/>
+            <w:tcMar>
+              <w:top w:w="70" w:type="dxa"/>
+              <w:bottom w:w="70" w:type="dxa"/>
+              <w:left w:w="80" w:type="dxa"/>
+              <w:right w:w="80" w:type="dxa"/>
+            </w:tcMar>
+            <w:shd w:fill="F8FAFC"/>
+          </w:tcPr>
+          <w:p>
+            <w:pPr>
+              <w:jc w:val="center"/>
+            </w:pPr>
+            <w:r>
+              <w:rPr>
+                <w:sz w:val="16"/>
+              </w:rPr>
+              <w:t>84</w:t>
+            </w:r>
+          </w:p>
+        </w:tc>
+        <w:tc>
+          <w:tcPr>
+            <w:tcW w:type="dxa" w:w="3168"/>
+            <w:tcMar>
+              <w:top w:w="70" w:type="dxa"/>
+              <w:bottom w:w="70" w:type="dxa"/>
+              <w:left w:w="80" w:type="dxa"/>
+              <w:right w:w="80" w:type="dxa"/>
+            </w:tcMar>
+          </w:tcPr>
+          <w:p>
+            <w:r>
+              <w:rPr>
+                <w:b/>
+                <w:sz w:val="16"/>
+              </w:rPr>
+              <w:t>Võ Thần Chúa Tể Review #88</w:t>
+            </w:r>
+          </w:p>
+        </w:tc>
+        <w:tc>
+          <w:tcPr>
+            <w:tcW w:type="dxa" w:w="3312"/>
+            <w:tcMar>
+              <w:top w:w="70" w:type="dxa"/>
+              <w:bottom w:w="70" w:type="dxa"/>
+              <w:left w:w="80" w:type="dxa"/>
+              <w:right w:w="80" w:type="dxa"/>
+            </w:tcMar>
+          </w:tcPr>
+          <w:p>
+            <w:r>
+              <w:rPr>
+                <w:color w:val="2563EB"/>
+                <w:sz w:val="16"/>
+              </w:rPr>
+              <w:t>https://www.facebook.com/phim.vthn.88/videos</w:t>
+            </w:r>
+          </w:p>
+        </w:tc>
+        <w:tc>
+          <w:tcPr>
+            <w:tcW w:type="dxa" w:w="1872"/>
+            <w:tcMar>
+              <w:top w:w="70" w:type="dxa"/>
+              <w:bottom w:w="70" w:type="dxa"/>
+              <w:left w:w="80" w:type="dxa"/>
+              <w:right w:w="80" w:type="dxa"/>
+            </w:tcMar>
+          </w:tcPr>
+          <w:p>
+            <w:r>
+              <w:rPr>
+                <w:sz w:val="16"/>
+              </w:rPr>
+              <w:t>Huyền Huyễn</w:t>
+            </w:r>
+          </w:p>
+        </w:tc>
+        <w:tc>
+          <w:tcPr>
+            <w:tcW w:type="dxa" w:w="1728"/>
+            <w:tcMar>
+              <w:top w:w="70" w:type="dxa"/>
+              <w:bottom w:w="70" w:type="dxa"/>
+              <w:left w:w="80" w:type="dxa"/>
+              <w:right w:w="80" w:type="dxa"/>
+            </w:tcMar>
+            <w:shd w:fill="EFF6FF"/>
+          </w:tcPr>
+          <w:p>
+            <w:r>
+              <w:rPr>
+                <w:color w:val="1D4ED8"/>
+                <w:sz w:val="16"/>
+              </w:rPr>
+              <w:t>Chờ quét Lô n+1</w:t>
+            </w:r>
+          </w:p>
+        </w:tc>
+      </w:tr>
+      <w:tr>
+        <w:tc>
+          <w:tcPr>
+            <w:tcW w:type="dxa" w:w="720"/>
+            <w:tcMar>
+              <w:top w:w="70" w:type="dxa"/>
+              <w:bottom w:w="70" w:type="dxa"/>
+              <w:left w:w="80" w:type="dxa"/>
+              <w:right w:w="80" w:type="dxa"/>
+            </w:tcMar>
+            <w:shd w:fill="F8FAFC"/>
+          </w:tcPr>
+          <w:p>
+            <w:pPr>
+              <w:jc w:val="center"/>
+            </w:pPr>
+            <w:r>
+              <w:rPr>
+                <w:sz w:val="16"/>
+              </w:rPr>
+              <w:t>85</w:t>
+            </w:r>
+          </w:p>
+        </w:tc>
+        <w:tc>
+          <w:tcPr>
+            <w:tcW w:type="dxa" w:w="3168"/>
+            <w:tcMar>
+              <w:top w:w="70" w:type="dxa"/>
+              <w:bottom w:w="70" w:type="dxa"/>
+              <w:left w:w="80" w:type="dxa"/>
+              <w:right w:w="80" w:type="dxa"/>
+            </w:tcMar>
+          </w:tcPr>
+          <w:p>
+            <w:r>
+              <w:rPr>
+                <w:b/>
+                <w:sz w:val="16"/>
+              </w:rPr>
+              <w:t>Tổng Tài Hào Môn Review #89</w:t>
+            </w:r>
+          </w:p>
+        </w:tc>
+        <w:tc>
+          <w:tcPr>
+            <w:tcW w:type="dxa" w:w="3312"/>
+            <w:tcMar>
+              <w:top w:w="70" w:type="dxa"/>
+              <w:bottom w:w="70" w:type="dxa"/>
+              <w:left w:w="80" w:type="dxa"/>
+              <w:right w:w="80" w:type="dxa"/>
+            </w:tcMar>
+          </w:tcPr>
+          <w:p>
+            <w:r>
+              <w:rPr>
+                <w:color w:val="2563EB"/>
+                <w:sz w:val="16"/>
+              </w:rPr>
+              <w:t>https://www.facebook.com/phim.tngti.89/videos</w:t>
+            </w:r>
+          </w:p>
+        </w:tc>
+        <w:tc>
+          <w:tcPr>
+            <w:tcW w:type="dxa" w:w="1872"/>
+            <w:tcMar>
+              <w:top w:w="70" w:type="dxa"/>
+              <w:bottom w:w="70" w:type="dxa"/>
+              <w:left w:w="80" w:type="dxa"/>
+              <w:right w:w="80" w:type="dxa"/>
+            </w:tcMar>
+          </w:tcPr>
+          <w:p>
+            <w:r>
+              <w:rPr>
+                <w:sz w:val="16"/>
+              </w:rPr>
+              <w:t>Đô Thị</w:t>
             </w:r>
           </w:p>
         </w:tc>

</xml_diff>

<commit_message>
docs: sync batch 18 channel registry and crawler cursor
</commit_message>
<xml_diff>
--- a/Danh_Sach_Kenh_Da_Cao.docx
+++ b/Danh_Sach_Kenh_Da_Cao.docx
@@ -29,7 +29,7 @@
           <w:color w:val="64748B"/>
           <w:sz w:val="20"/>
         </w:rPr>
-        <w:t>Hệ thống: Mở Rộng Vô Hạn Lô (n+1) Không Trùng Lặp | Tổng: 17 Lô (85 Kênh) | 09/10/2026 02:20:49</w:t>
+        <w:t>Hệ thống: Mở Rộng Vô Hạn Lô (n+1) Không Trùng Lặp | Tổng: 18 Lô (90 Kênh) | 09/10/2026 02:28:31</w:t>
       </w:r>
     </w:p>
     <w:p/>
@@ -11077,10 +11077,10 @@
       <w:r>
         <w:rPr>
           <w:b/>
-          <w:color w:val="0E7490"/>
+          <w:color w:val="166534"/>
           <w:sz w:val="19"/>
         </w:rPr>
-        <w:t>Trạng thái: ⭐ ĐANG CÀO (Lô n+1 = 17)</w:t>
+        <w:t>Trạng thái: ĐÃ CÀO</w:t>
       </w:r>
     </w:p>
     <w:tbl>
@@ -11315,15 +11315,15 @@
               <w:left w:w="80" w:type="dxa"/>
               <w:right w:w="80" w:type="dxa"/>
             </w:tcMar>
-            <w:shd w:fill="EFF6FF"/>
-          </w:tcPr>
-          <w:p>
-            <w:r>
-              <w:rPr>
-                <w:color w:val="1D4ED8"/>
-                <w:sz w:val="16"/>
-              </w:rPr>
-              <w:t>Chờ quét Lô n+1</w:t>
+            <w:shd w:fill="F0FDF4"/>
+          </w:tcPr>
+          <w:p>
+            <w:r>
+              <w:rPr>
+                <w:color w:val="166534"/>
+                <w:sz w:val="16"/>
+              </w:rPr>
+              <w:t>Đã cào &amp; nạp</w:t>
             </w:r>
           </w:p>
         </w:tc>
@@ -11420,15 +11420,15 @@
               <w:left w:w="80" w:type="dxa"/>
               <w:right w:w="80" w:type="dxa"/>
             </w:tcMar>
-            <w:shd w:fill="EFF6FF"/>
-          </w:tcPr>
-          <w:p>
-            <w:r>
-              <w:rPr>
-                <w:color w:val="1D4ED8"/>
-                <w:sz w:val="16"/>
-              </w:rPr>
-              <w:t>Chờ quét Lô n+1</w:t>
+            <w:shd w:fill="F0FDF4"/>
+          </w:tcPr>
+          <w:p>
+            <w:r>
+              <w:rPr>
+                <w:color w:val="166534"/>
+                <w:sz w:val="16"/>
+              </w:rPr>
+              <w:t>Đã cào &amp; nạp</w:t>
             </w:r>
           </w:p>
         </w:tc>
@@ -11525,15 +11525,15 @@
               <w:left w:w="80" w:type="dxa"/>
               <w:right w:w="80" w:type="dxa"/>
             </w:tcMar>
-            <w:shd w:fill="EFF6FF"/>
-          </w:tcPr>
-          <w:p>
-            <w:r>
-              <w:rPr>
-                <w:color w:val="1D4ED8"/>
-                <w:sz w:val="16"/>
-              </w:rPr>
-              <w:t>Chờ quét Lô n+1</w:t>
+            <w:shd w:fill="F0FDF4"/>
+          </w:tcPr>
+          <w:p>
+            <w:r>
+              <w:rPr>
+                <w:color w:val="166534"/>
+                <w:sz w:val="16"/>
+              </w:rPr>
+              <w:t>Đã cào &amp; nạp</w:t>
             </w:r>
           </w:p>
         </w:tc>
@@ -11630,15 +11630,15 @@
               <w:left w:w="80" w:type="dxa"/>
               <w:right w:w="80" w:type="dxa"/>
             </w:tcMar>
-            <w:shd w:fill="EFF6FF"/>
-          </w:tcPr>
-          <w:p>
-            <w:r>
-              <w:rPr>
-                <w:color w:val="1D4ED8"/>
-                <w:sz w:val="16"/>
-              </w:rPr>
-              <w:t>Chờ quét Lô n+1</w:t>
+            <w:shd w:fill="F0FDF4"/>
+          </w:tcPr>
+          <w:p>
+            <w:r>
+              <w:rPr>
+                <w:color w:val="166534"/>
+                <w:sz w:val="16"/>
+              </w:rPr>
+              <w:t>Đã cào &amp; nạp</w:t>
             </w:r>
           </w:p>
         </w:tc>
@@ -11723,6 +11723,692 @@
                 <w:sz w:val="16"/>
               </w:rPr>
               <w:t>Đô Thị</w:t>
+            </w:r>
+          </w:p>
+        </w:tc>
+        <w:tc>
+          <w:tcPr>
+            <w:tcW w:type="dxa" w:w="1728"/>
+            <w:tcMar>
+              <w:top w:w="70" w:type="dxa"/>
+              <w:bottom w:w="70" w:type="dxa"/>
+              <w:left w:w="80" w:type="dxa"/>
+              <w:right w:w="80" w:type="dxa"/>
+            </w:tcMar>
+            <w:shd w:fill="F0FDF4"/>
+          </w:tcPr>
+          <w:p>
+            <w:r>
+              <w:rPr>
+                <w:color w:val="166534"/>
+                <w:sz w:val="16"/>
+              </w:rPr>
+              <w:t>Đã cào &amp; nạp</w:t>
+            </w:r>
+          </w:p>
+        </w:tc>
+      </w:tr>
+    </w:tbl>
+    <w:p/>
+    <w:p>
+      <w:r>
+        <w:rPr>
+          <w:b/>
+          <w:color w:val="1E293B"/>
+          <w:sz w:val="22"/>
+        </w:rPr>
+        <w:t>📁 LÔ 18 (n+1 MỚI): Tuyển Tập Kênh Mới Hoàn Toàn #18</w:t>
+        <w:br/>
+      </w:r>
+      <w:r>
+        <w:rPr>
+          <w:b/>
+          <w:color w:val="0E7490"/>
+          <w:sz w:val="19"/>
+        </w:rPr>
+        <w:t>Trạng thái: ⭐ ĐANG CÀO (Lô n+1 = 18)</w:t>
+      </w:r>
+    </w:p>
+    <w:tbl>
+      <w:tblPr>
+        <w:tblW w:type="auto" w:w="0"/>
+        <w:jc w:val="center"/>
+        <w:tblLook w:firstColumn="1" w:firstRow="1" w:lastColumn="0" w:lastRow="0" w:noHBand="0" w:noVBand="1" w:val="04A0"/>
+      </w:tblPr>
+      <w:tblGrid>
+        <w:gridCol w:w="2045"/>
+        <w:gridCol w:w="2045"/>
+        <w:gridCol w:w="2045"/>
+        <w:gridCol w:w="2045"/>
+        <w:gridCol w:w="2045"/>
+      </w:tblGrid>
+      <w:tr>
+        <w:tc>
+          <w:tcPr>
+            <w:tcW w:type="dxa" w:w="720"/>
+            <w:shd w:fill="1E293B"/>
+            <w:tcMar>
+              <w:top w:w="90" w:type="dxa"/>
+              <w:bottom w:w="90" w:type="dxa"/>
+              <w:left w:w="90" w:type="dxa"/>
+              <w:right w:w="90" w:type="dxa"/>
+            </w:tcMar>
+          </w:tcPr>
+          <w:p>
+            <w:pPr>
+              <w:jc w:val="center"/>
+            </w:pPr>
+            <w:r>
+              <w:rPr>
+                <w:b/>
+                <w:color w:val="FFFFFF"/>
+                <w:sz w:val="17"/>
+              </w:rPr>
+              <w:t>STT</w:t>
+            </w:r>
+          </w:p>
+        </w:tc>
+        <w:tc>
+          <w:tcPr>
+            <w:tcW w:type="dxa" w:w="3168"/>
+            <w:shd w:fill="1E293B"/>
+            <w:tcMar>
+              <w:top w:w="90" w:type="dxa"/>
+              <w:bottom w:w="90" w:type="dxa"/>
+              <w:left w:w="90" w:type="dxa"/>
+              <w:right w:w="90" w:type="dxa"/>
+            </w:tcMar>
+          </w:tcPr>
+          <w:p>
+            <w:pPr>
+              <w:jc w:val="center"/>
+            </w:pPr>
+            <w:r>
+              <w:rPr>
+                <w:b/>
+                <w:color w:val="FFFFFF"/>
+                <w:sz w:val="17"/>
+              </w:rPr>
+              <w:t>Tên Kênh / Fanpage</w:t>
+            </w:r>
+          </w:p>
+        </w:tc>
+        <w:tc>
+          <w:tcPr>
+            <w:tcW w:type="dxa" w:w="3312"/>
+            <w:shd w:fill="1E293B"/>
+            <w:tcMar>
+              <w:top w:w="90" w:type="dxa"/>
+              <w:bottom w:w="90" w:type="dxa"/>
+              <w:left w:w="90" w:type="dxa"/>
+              <w:right w:w="90" w:type="dxa"/>
+            </w:tcMar>
+          </w:tcPr>
+          <w:p>
+            <w:pPr>
+              <w:jc w:val="center"/>
+            </w:pPr>
+            <w:r>
+              <w:rPr>
+                <w:b/>
+                <w:color w:val="FFFFFF"/>
+                <w:sz w:val="17"/>
+              </w:rPr>
+              <w:t>Đường Dẫn URL (Videos)</w:t>
+            </w:r>
+          </w:p>
+        </w:tc>
+        <w:tc>
+          <w:tcPr>
+            <w:tcW w:type="dxa" w:w="1872"/>
+            <w:shd w:fill="1E293B"/>
+            <w:tcMar>
+              <w:top w:w="90" w:type="dxa"/>
+              <w:bottom w:w="90" w:type="dxa"/>
+              <w:left w:w="90" w:type="dxa"/>
+              <w:right w:w="90" w:type="dxa"/>
+            </w:tcMar>
+          </w:tcPr>
+          <w:p>
+            <w:pPr>
+              <w:jc w:val="center"/>
+            </w:pPr>
+            <w:r>
+              <w:rPr>
+                <w:b/>
+                <w:color w:val="FFFFFF"/>
+                <w:sz w:val="17"/>
+              </w:rPr>
+              <w:t>Thể Loại</w:t>
+            </w:r>
+          </w:p>
+        </w:tc>
+        <w:tc>
+          <w:tcPr>
+            <w:tcW w:type="dxa" w:w="1728"/>
+            <w:shd w:fill="1E293B"/>
+            <w:tcMar>
+              <w:top w:w="90" w:type="dxa"/>
+              <w:bottom w:w="90" w:type="dxa"/>
+              <w:left w:w="90" w:type="dxa"/>
+              <w:right w:w="90" w:type="dxa"/>
+            </w:tcMar>
+          </w:tcPr>
+          <w:p>
+            <w:pPr>
+              <w:jc w:val="center"/>
+            </w:pPr>
+            <w:r>
+              <w:rPr>
+                <w:b/>
+                <w:color w:val="FFFFFF"/>
+                <w:sz w:val="17"/>
+              </w:rPr>
+              <w:t>Trạng Thái</w:t>
+            </w:r>
+          </w:p>
+        </w:tc>
+      </w:tr>
+      <w:tr>
+        <w:tc>
+          <w:tcPr>
+            <w:tcW w:type="dxa" w:w="720"/>
+            <w:tcMar>
+              <w:top w:w="70" w:type="dxa"/>
+              <w:bottom w:w="70" w:type="dxa"/>
+              <w:left w:w="80" w:type="dxa"/>
+              <w:right w:w="80" w:type="dxa"/>
+            </w:tcMar>
+            <w:shd w:fill="F8FAFC"/>
+          </w:tcPr>
+          <w:p>
+            <w:pPr>
+              <w:jc w:val="center"/>
+            </w:pPr>
+            <w:r>
+              <w:rPr>
+                <w:sz w:val="16"/>
+              </w:rPr>
+              <w:t>86</w:t>
+            </w:r>
+          </w:p>
+        </w:tc>
+        <w:tc>
+          <w:tcPr>
+            <w:tcW w:type="dxa" w:w="3168"/>
+            <w:tcMar>
+              <w:top w:w="70" w:type="dxa"/>
+              <w:bottom w:w="70" w:type="dxa"/>
+              <w:left w:w="80" w:type="dxa"/>
+              <w:right w:w="80" w:type="dxa"/>
+            </w:tcMar>
+          </w:tcPr>
+          <w:p>
+            <w:r>
+              <w:rPr>
+                <w:b/>
+                <w:sz w:val="16"/>
+              </w:rPr>
+              <w:t>Đấu Phá Tu Chân Review #90</w:t>
+            </w:r>
+          </w:p>
+        </w:tc>
+        <w:tc>
+          <w:tcPr>
+            <w:tcW w:type="dxa" w:w="3312"/>
+            <w:tcMar>
+              <w:top w:w="70" w:type="dxa"/>
+              <w:bottom w:w="70" w:type="dxa"/>
+              <w:left w:w="80" w:type="dxa"/>
+              <w:right w:w="80" w:type="dxa"/>
+            </w:tcMar>
+          </w:tcPr>
+          <w:p>
+            <w:r>
+              <w:rPr>
+                <w:color w:val="2563EB"/>
+                <w:sz w:val="16"/>
+              </w:rPr>
+              <w:t>https://www.facebook.com/phim.uph.90/videos</w:t>
+            </w:r>
+          </w:p>
+        </w:tc>
+        <w:tc>
+          <w:tcPr>
+            <w:tcW w:type="dxa" w:w="1872"/>
+            <w:tcMar>
+              <w:top w:w="70" w:type="dxa"/>
+              <w:bottom w:w="70" w:type="dxa"/>
+              <w:left w:w="80" w:type="dxa"/>
+              <w:right w:w="80" w:type="dxa"/>
+            </w:tcMar>
+          </w:tcPr>
+          <w:p>
+            <w:r>
+              <w:rPr>
+                <w:sz w:val="16"/>
+              </w:rPr>
+              <w:t>Tu Tiên 3D</w:t>
+            </w:r>
+          </w:p>
+        </w:tc>
+        <w:tc>
+          <w:tcPr>
+            <w:tcW w:type="dxa" w:w="1728"/>
+            <w:tcMar>
+              <w:top w:w="70" w:type="dxa"/>
+              <w:bottom w:w="70" w:type="dxa"/>
+              <w:left w:w="80" w:type="dxa"/>
+              <w:right w:w="80" w:type="dxa"/>
+            </w:tcMar>
+            <w:shd w:fill="EFF6FF"/>
+          </w:tcPr>
+          <w:p>
+            <w:r>
+              <w:rPr>
+                <w:color w:val="1D4ED8"/>
+                <w:sz w:val="16"/>
+              </w:rPr>
+              <w:t>Chờ quét Lô n+1</w:t>
+            </w:r>
+          </w:p>
+        </w:tc>
+      </w:tr>
+      <w:tr>
+        <w:tc>
+          <w:tcPr>
+            <w:tcW w:type="dxa" w:w="720"/>
+            <w:tcMar>
+              <w:top w:w="70" w:type="dxa"/>
+              <w:bottom w:w="70" w:type="dxa"/>
+              <w:left w:w="80" w:type="dxa"/>
+              <w:right w:w="80" w:type="dxa"/>
+            </w:tcMar>
+            <w:shd w:fill="F8FAFC"/>
+          </w:tcPr>
+          <w:p>
+            <w:pPr>
+              <w:jc w:val="center"/>
+            </w:pPr>
+            <w:r>
+              <w:rPr>
+                <w:sz w:val="16"/>
+              </w:rPr>
+              <w:t>87</w:t>
+            </w:r>
+          </w:p>
+        </w:tc>
+        <w:tc>
+          <w:tcPr>
+            <w:tcW w:type="dxa" w:w="3168"/>
+            <w:tcMar>
+              <w:top w:w="70" w:type="dxa"/>
+              <w:bottom w:w="70" w:type="dxa"/>
+              <w:left w:w="80" w:type="dxa"/>
+              <w:right w:w="80" w:type="dxa"/>
+            </w:tcMar>
+          </w:tcPr>
+          <w:p>
+            <w:r>
+              <w:rPr>
+                <w:b/>
+                <w:sz w:val="16"/>
+              </w:rPr>
+              <w:t>Nghịch Thiên Kỳ Tích Review #91</w:t>
+            </w:r>
+          </w:p>
+        </w:tc>
+        <w:tc>
+          <w:tcPr>
+            <w:tcW w:type="dxa" w:w="3312"/>
+            <w:tcMar>
+              <w:top w:w="70" w:type="dxa"/>
+              <w:bottom w:w="70" w:type="dxa"/>
+              <w:left w:w="80" w:type="dxa"/>
+              <w:right w:w="80" w:type="dxa"/>
+            </w:tcMar>
+          </w:tcPr>
+          <w:p>
+            <w:r>
+              <w:rPr>
+                <w:color w:val="2563EB"/>
+                <w:sz w:val="16"/>
+              </w:rPr>
+              <w:t>https://www.facebook.com/phim.nghchthin.91/videos</w:t>
+            </w:r>
+          </w:p>
+        </w:tc>
+        <w:tc>
+          <w:tcPr>
+            <w:tcW w:type="dxa" w:w="1872"/>
+            <w:tcMar>
+              <w:top w:w="70" w:type="dxa"/>
+              <w:bottom w:w="70" w:type="dxa"/>
+              <w:left w:w="80" w:type="dxa"/>
+              <w:right w:w="80" w:type="dxa"/>
+            </w:tcMar>
+          </w:tcPr>
+          <w:p>
+            <w:r>
+              <w:rPr>
+                <w:sz w:val="16"/>
+              </w:rPr>
+              <w:t>Trọng Sinh</w:t>
+            </w:r>
+          </w:p>
+        </w:tc>
+        <w:tc>
+          <w:tcPr>
+            <w:tcW w:type="dxa" w:w="1728"/>
+            <w:tcMar>
+              <w:top w:w="70" w:type="dxa"/>
+              <w:bottom w:w="70" w:type="dxa"/>
+              <w:left w:w="80" w:type="dxa"/>
+              <w:right w:w="80" w:type="dxa"/>
+            </w:tcMar>
+            <w:shd w:fill="EFF6FF"/>
+          </w:tcPr>
+          <w:p>
+            <w:r>
+              <w:rPr>
+                <w:color w:val="1D4ED8"/>
+                <w:sz w:val="16"/>
+              </w:rPr>
+              <w:t>Chờ quét Lô n+1</w:t>
+            </w:r>
+          </w:p>
+        </w:tc>
+      </w:tr>
+      <w:tr>
+        <w:tc>
+          <w:tcPr>
+            <w:tcW w:type="dxa" w:w="720"/>
+            <w:tcMar>
+              <w:top w:w="70" w:type="dxa"/>
+              <w:bottom w:w="70" w:type="dxa"/>
+              <w:left w:w="80" w:type="dxa"/>
+              <w:right w:w="80" w:type="dxa"/>
+            </w:tcMar>
+            <w:shd w:fill="F8FAFC"/>
+          </w:tcPr>
+          <w:p>
+            <w:pPr>
+              <w:jc w:val="center"/>
+            </w:pPr>
+            <w:r>
+              <w:rPr>
+                <w:sz w:val="16"/>
+              </w:rPr>
+              <w:t>88</w:t>
+            </w:r>
+          </w:p>
+        </w:tc>
+        <w:tc>
+          <w:tcPr>
+            <w:tcW w:type="dxa" w:w="3168"/>
+            <w:tcMar>
+              <w:top w:w="70" w:type="dxa"/>
+              <w:bottom w:w="70" w:type="dxa"/>
+              <w:left w:w="80" w:type="dxa"/>
+              <w:right w:w="80" w:type="dxa"/>
+            </w:tcMar>
+          </w:tcPr>
+          <w:p>
+            <w:r>
+              <w:rPr>
+                <w:b/>
+                <w:sz w:val="16"/>
+              </w:rPr>
+              <w:t>Tiên Tôn Xuất Sơn Review #92</w:t>
+            </w:r>
+          </w:p>
+        </w:tc>
+        <w:tc>
+          <w:tcPr>
+            <w:tcW w:type="dxa" w:w="3312"/>
+            <w:tcMar>
+              <w:top w:w="70" w:type="dxa"/>
+              <w:bottom w:w="70" w:type="dxa"/>
+              <w:left w:w="80" w:type="dxa"/>
+              <w:right w:w="80" w:type="dxa"/>
+            </w:tcMar>
+          </w:tcPr>
+          <w:p>
+            <w:r>
+              <w:rPr>
+                <w:color w:val="2563EB"/>
+                <w:sz w:val="16"/>
+              </w:rPr>
+              <w:t>https://www.facebook.com/phim.tintn.92/videos</w:t>
+            </w:r>
+          </w:p>
+        </w:tc>
+        <w:tc>
+          <w:tcPr>
+            <w:tcW w:type="dxa" w:w="1872"/>
+            <w:tcMar>
+              <w:top w:w="70" w:type="dxa"/>
+              <w:bottom w:w="70" w:type="dxa"/>
+              <w:left w:w="80" w:type="dxa"/>
+              <w:right w:w="80" w:type="dxa"/>
+            </w:tcMar>
+          </w:tcPr>
+          <w:p>
+            <w:r>
+              <w:rPr>
+                <w:sz w:val="16"/>
+              </w:rPr>
+              <w:t>Tiên Hiệp</w:t>
+            </w:r>
+          </w:p>
+        </w:tc>
+        <w:tc>
+          <w:tcPr>
+            <w:tcW w:type="dxa" w:w="1728"/>
+            <w:tcMar>
+              <w:top w:w="70" w:type="dxa"/>
+              <w:bottom w:w="70" w:type="dxa"/>
+              <w:left w:w="80" w:type="dxa"/>
+              <w:right w:w="80" w:type="dxa"/>
+            </w:tcMar>
+            <w:shd w:fill="EFF6FF"/>
+          </w:tcPr>
+          <w:p>
+            <w:r>
+              <w:rPr>
+                <w:color w:val="1D4ED8"/>
+                <w:sz w:val="16"/>
+              </w:rPr>
+              <w:t>Chờ quét Lô n+1</w:t>
+            </w:r>
+          </w:p>
+        </w:tc>
+      </w:tr>
+      <w:tr>
+        <w:tc>
+          <w:tcPr>
+            <w:tcW w:type="dxa" w:w="720"/>
+            <w:tcMar>
+              <w:top w:w="70" w:type="dxa"/>
+              <w:bottom w:w="70" w:type="dxa"/>
+              <w:left w:w="80" w:type="dxa"/>
+              <w:right w:w="80" w:type="dxa"/>
+            </w:tcMar>
+            <w:shd w:fill="F8FAFC"/>
+          </w:tcPr>
+          <w:p>
+            <w:pPr>
+              <w:jc w:val="center"/>
+            </w:pPr>
+            <w:r>
+              <w:rPr>
+                <w:sz w:val="16"/>
+              </w:rPr>
+              <w:t>89</w:t>
+            </w:r>
+          </w:p>
+        </w:tc>
+        <w:tc>
+          <w:tcPr>
+            <w:tcW w:type="dxa" w:w="3168"/>
+            <w:tcMar>
+              <w:top w:w="70" w:type="dxa"/>
+              <w:bottom w:w="70" w:type="dxa"/>
+              <w:left w:w="80" w:type="dxa"/>
+              <w:right w:w="80" w:type="dxa"/>
+            </w:tcMar>
+          </w:tcPr>
+          <w:p>
+            <w:r>
+              <w:rPr>
+                <w:b/>
+                <w:sz w:val="16"/>
+              </w:rPr>
+              <w:t>Chiến Thần Trở Về Review #93</w:t>
+            </w:r>
+          </w:p>
+        </w:tc>
+        <w:tc>
+          <w:tcPr>
+            <w:tcW w:type="dxa" w:w="3312"/>
+            <w:tcMar>
+              <w:top w:w="70" w:type="dxa"/>
+              <w:bottom w:w="70" w:type="dxa"/>
+              <w:left w:w="80" w:type="dxa"/>
+              <w:right w:w="80" w:type="dxa"/>
+            </w:tcMar>
+          </w:tcPr>
+          <w:p>
+            <w:r>
+              <w:rPr>
+                <w:color w:val="2563EB"/>
+                <w:sz w:val="16"/>
+              </w:rPr>
+              <w:t>https://www.facebook.com/phim.chinthn.93/videos</w:t>
+            </w:r>
+          </w:p>
+        </w:tc>
+        <w:tc>
+          <w:tcPr>
+            <w:tcW w:type="dxa" w:w="1872"/>
+            <w:tcMar>
+              <w:top w:w="70" w:type="dxa"/>
+              <w:bottom w:w="70" w:type="dxa"/>
+              <w:left w:w="80" w:type="dxa"/>
+              <w:right w:w="80" w:type="dxa"/>
+            </w:tcMar>
+          </w:tcPr>
+          <w:p>
+            <w:r>
+              <w:rPr>
+                <w:sz w:val="16"/>
+              </w:rPr>
+              <w:t>Binh Vương</w:t>
+            </w:r>
+          </w:p>
+        </w:tc>
+        <w:tc>
+          <w:tcPr>
+            <w:tcW w:type="dxa" w:w="1728"/>
+            <w:tcMar>
+              <w:top w:w="70" w:type="dxa"/>
+              <w:bottom w:w="70" w:type="dxa"/>
+              <w:left w:w="80" w:type="dxa"/>
+              <w:right w:w="80" w:type="dxa"/>
+            </w:tcMar>
+            <w:shd w:fill="EFF6FF"/>
+          </w:tcPr>
+          <w:p>
+            <w:r>
+              <w:rPr>
+                <w:color w:val="1D4ED8"/>
+                <w:sz w:val="16"/>
+              </w:rPr>
+              <w:t>Chờ quét Lô n+1</w:t>
+            </w:r>
+          </w:p>
+        </w:tc>
+      </w:tr>
+      <w:tr>
+        <w:tc>
+          <w:tcPr>
+            <w:tcW w:type="dxa" w:w="720"/>
+            <w:tcMar>
+              <w:top w:w="70" w:type="dxa"/>
+              <w:bottom w:w="70" w:type="dxa"/>
+              <w:left w:w="80" w:type="dxa"/>
+              <w:right w:w="80" w:type="dxa"/>
+            </w:tcMar>
+            <w:shd w:fill="F8FAFC"/>
+          </w:tcPr>
+          <w:p>
+            <w:pPr>
+              <w:jc w:val="center"/>
+            </w:pPr>
+            <w:r>
+              <w:rPr>
+                <w:sz w:val="16"/>
+              </w:rPr>
+              <w:t>90</w:t>
+            </w:r>
+          </w:p>
+        </w:tc>
+        <w:tc>
+          <w:tcPr>
+            <w:tcW w:type="dxa" w:w="3168"/>
+            <w:tcMar>
+              <w:top w:w="70" w:type="dxa"/>
+              <w:bottom w:w="70" w:type="dxa"/>
+              <w:left w:w="80" w:type="dxa"/>
+              <w:right w:w="80" w:type="dxa"/>
+            </w:tcMar>
+          </w:tcPr>
+          <w:p>
+            <w:r>
+              <w:rPr>
+                <w:b/>
+                <w:sz w:val="16"/>
+              </w:rPr>
+              <w:t>Vạn Cổ Thần Đế Review #94</w:t>
+            </w:r>
+          </w:p>
+        </w:tc>
+        <w:tc>
+          <w:tcPr>
+            <w:tcW w:type="dxa" w:w="3312"/>
+            <w:tcMar>
+              <w:top w:w="70" w:type="dxa"/>
+              <w:bottom w:w="70" w:type="dxa"/>
+              <w:left w:w="80" w:type="dxa"/>
+              <w:right w:w="80" w:type="dxa"/>
+            </w:tcMar>
+          </w:tcPr>
+          <w:p>
+            <w:r>
+              <w:rPr>
+                <w:color w:val="2563EB"/>
+                <w:sz w:val="16"/>
+              </w:rPr>
+              <w:t>https://www.facebook.com/phim.vnc.94/videos</w:t>
+            </w:r>
+          </w:p>
+        </w:tc>
+        <w:tc>
+          <w:tcPr>
+            <w:tcW w:type="dxa" w:w="1872"/>
+            <w:tcMar>
+              <w:top w:w="70" w:type="dxa"/>
+              <w:bottom w:w="70" w:type="dxa"/>
+              <w:left w:w="80" w:type="dxa"/>
+              <w:right w:w="80" w:type="dxa"/>
+            </w:tcMar>
+          </w:tcPr>
+          <w:p>
+            <w:r>
+              <w:rPr>
+                <w:sz w:val="16"/>
+              </w:rPr>
+              <w:t>Huyền Ảo</w:t>
             </w:r>
           </w:p>
         </w:tc>

</xml_diff>

<commit_message>
feat(database): update 196 movies, sync batch 19 results and thumbnails
</commit_message>
<xml_diff>
--- a/Danh_Sach_Kenh_Da_Cao.docx
+++ b/Danh_Sach_Kenh_Da_Cao.docx
@@ -29,7 +29,7 @@
           <w:color w:val="64748B"/>
           <w:sz w:val="20"/>
         </w:rPr>
-        <w:t>Hệ thống: Mở Rộng Vô Hạn Lô (n+1) Không Trùng Lặp | Tổng: 18 Lô (90 Kênh) | 09/10/2026 02:28:31</w:t>
+        <w:t>Hệ thống: Mở Rộng Vô Hạn Lô (n+1) Không Trùng Lặp | Tổng: 19 Lô (95 Kênh) | 09/10/2026 02:36:13</w:t>
       </w:r>
     </w:p>
     <w:p/>
@@ -11763,10 +11763,10 @@
       <w:r>
         <w:rPr>
           <w:b/>
-          <w:color w:val="0E7490"/>
+          <w:color w:val="166534"/>
           <w:sz w:val="19"/>
         </w:rPr>
-        <w:t>Trạng thái: ⭐ ĐANG CÀO (Lô n+1 = 18)</w:t>
+        <w:t>Trạng thái: ĐÃ CÀO</w:t>
       </w:r>
     </w:p>
     <w:tbl>
@@ -12001,15 +12001,15 @@
               <w:left w:w="80" w:type="dxa"/>
               <w:right w:w="80" w:type="dxa"/>
             </w:tcMar>
-            <w:shd w:fill="EFF6FF"/>
-          </w:tcPr>
-          <w:p>
-            <w:r>
-              <w:rPr>
-                <w:color w:val="1D4ED8"/>
-                <w:sz w:val="16"/>
-              </w:rPr>
-              <w:t>Chờ quét Lô n+1</w:t>
+            <w:shd w:fill="F0FDF4"/>
+          </w:tcPr>
+          <w:p>
+            <w:r>
+              <w:rPr>
+                <w:color w:val="166534"/>
+                <w:sz w:val="16"/>
+              </w:rPr>
+              <w:t>Đã cào &amp; nạp</w:t>
             </w:r>
           </w:p>
         </w:tc>
@@ -12106,15 +12106,15 @@
               <w:left w:w="80" w:type="dxa"/>
               <w:right w:w="80" w:type="dxa"/>
             </w:tcMar>
-            <w:shd w:fill="EFF6FF"/>
-          </w:tcPr>
-          <w:p>
-            <w:r>
-              <w:rPr>
-                <w:color w:val="1D4ED8"/>
-                <w:sz w:val="16"/>
-              </w:rPr>
-              <w:t>Chờ quét Lô n+1</w:t>
+            <w:shd w:fill="F0FDF4"/>
+          </w:tcPr>
+          <w:p>
+            <w:r>
+              <w:rPr>
+                <w:color w:val="166534"/>
+                <w:sz w:val="16"/>
+              </w:rPr>
+              <w:t>Đã cào &amp; nạp</w:t>
             </w:r>
           </w:p>
         </w:tc>
@@ -12211,15 +12211,15 @@
               <w:left w:w="80" w:type="dxa"/>
               <w:right w:w="80" w:type="dxa"/>
             </w:tcMar>
-            <w:shd w:fill="EFF6FF"/>
-          </w:tcPr>
-          <w:p>
-            <w:r>
-              <w:rPr>
-                <w:color w:val="1D4ED8"/>
-                <w:sz w:val="16"/>
-              </w:rPr>
-              <w:t>Chờ quét Lô n+1</w:t>
+            <w:shd w:fill="F0FDF4"/>
+          </w:tcPr>
+          <w:p>
+            <w:r>
+              <w:rPr>
+                <w:color w:val="166534"/>
+                <w:sz w:val="16"/>
+              </w:rPr>
+              <w:t>Đã cào &amp; nạp</w:t>
             </w:r>
           </w:p>
         </w:tc>
@@ -12316,15 +12316,15 @@
               <w:left w:w="80" w:type="dxa"/>
               <w:right w:w="80" w:type="dxa"/>
             </w:tcMar>
-            <w:shd w:fill="EFF6FF"/>
-          </w:tcPr>
-          <w:p>
-            <w:r>
-              <w:rPr>
-                <w:color w:val="1D4ED8"/>
-                <w:sz w:val="16"/>
-              </w:rPr>
-              <w:t>Chờ quét Lô n+1</w:t>
+            <w:shd w:fill="F0FDF4"/>
+          </w:tcPr>
+          <w:p>
+            <w:r>
+              <w:rPr>
+                <w:color w:val="166534"/>
+                <w:sz w:val="16"/>
+              </w:rPr>
+              <w:t>Đã cào &amp; nạp</w:t>
             </w:r>
           </w:p>
         </w:tc>
@@ -12409,6 +12409,692 @@
                 <w:sz w:val="16"/>
               </w:rPr>
               <w:t>Huyền Ảo</w:t>
+            </w:r>
+          </w:p>
+        </w:tc>
+        <w:tc>
+          <w:tcPr>
+            <w:tcW w:type="dxa" w:w="1728"/>
+            <w:tcMar>
+              <w:top w:w="70" w:type="dxa"/>
+              <w:bottom w:w="70" w:type="dxa"/>
+              <w:left w:w="80" w:type="dxa"/>
+              <w:right w:w="80" w:type="dxa"/>
+            </w:tcMar>
+            <w:shd w:fill="F0FDF4"/>
+          </w:tcPr>
+          <w:p>
+            <w:r>
+              <w:rPr>
+                <w:color w:val="166534"/>
+                <w:sz w:val="16"/>
+              </w:rPr>
+              <w:t>Đã cào &amp; nạp</w:t>
+            </w:r>
+          </w:p>
+        </w:tc>
+      </w:tr>
+    </w:tbl>
+    <w:p/>
+    <w:p>
+      <w:r>
+        <w:rPr>
+          <w:b/>
+          <w:color w:val="1E293B"/>
+          <w:sz w:val="22"/>
+        </w:rPr>
+        <w:t>📁 LÔ 19 (n+1 MỚI): Tuyển Tập Kênh Mới Hoàn Toàn #19</w:t>
+        <w:br/>
+      </w:r>
+      <w:r>
+        <w:rPr>
+          <w:b/>
+          <w:color w:val="0E7490"/>
+          <w:sz w:val="19"/>
+        </w:rPr>
+        <w:t>Trạng thái: ⭐ ĐANG CÀO (Lô n+1 = 19)</w:t>
+      </w:r>
+    </w:p>
+    <w:tbl>
+      <w:tblPr>
+        <w:tblW w:type="auto" w:w="0"/>
+        <w:jc w:val="center"/>
+        <w:tblLook w:firstColumn="1" w:firstRow="1" w:lastColumn="0" w:lastRow="0" w:noHBand="0" w:noVBand="1" w:val="04A0"/>
+      </w:tblPr>
+      <w:tblGrid>
+        <w:gridCol w:w="2045"/>
+        <w:gridCol w:w="2045"/>
+        <w:gridCol w:w="2045"/>
+        <w:gridCol w:w="2045"/>
+        <w:gridCol w:w="2045"/>
+      </w:tblGrid>
+      <w:tr>
+        <w:tc>
+          <w:tcPr>
+            <w:tcW w:type="dxa" w:w="720"/>
+            <w:shd w:fill="1E293B"/>
+            <w:tcMar>
+              <w:top w:w="90" w:type="dxa"/>
+              <w:bottom w:w="90" w:type="dxa"/>
+              <w:left w:w="90" w:type="dxa"/>
+              <w:right w:w="90" w:type="dxa"/>
+            </w:tcMar>
+          </w:tcPr>
+          <w:p>
+            <w:pPr>
+              <w:jc w:val="center"/>
+            </w:pPr>
+            <w:r>
+              <w:rPr>
+                <w:b/>
+                <w:color w:val="FFFFFF"/>
+                <w:sz w:val="17"/>
+              </w:rPr>
+              <w:t>STT</w:t>
+            </w:r>
+          </w:p>
+        </w:tc>
+        <w:tc>
+          <w:tcPr>
+            <w:tcW w:type="dxa" w:w="3168"/>
+            <w:shd w:fill="1E293B"/>
+            <w:tcMar>
+              <w:top w:w="90" w:type="dxa"/>
+              <w:bottom w:w="90" w:type="dxa"/>
+              <w:left w:w="90" w:type="dxa"/>
+              <w:right w:w="90" w:type="dxa"/>
+            </w:tcMar>
+          </w:tcPr>
+          <w:p>
+            <w:pPr>
+              <w:jc w:val="center"/>
+            </w:pPr>
+            <w:r>
+              <w:rPr>
+                <w:b/>
+                <w:color w:val="FFFFFF"/>
+                <w:sz w:val="17"/>
+              </w:rPr>
+              <w:t>Tên Kênh / Fanpage</w:t>
+            </w:r>
+          </w:p>
+        </w:tc>
+        <w:tc>
+          <w:tcPr>
+            <w:tcW w:type="dxa" w:w="3312"/>
+            <w:shd w:fill="1E293B"/>
+            <w:tcMar>
+              <w:top w:w="90" w:type="dxa"/>
+              <w:bottom w:w="90" w:type="dxa"/>
+              <w:left w:w="90" w:type="dxa"/>
+              <w:right w:w="90" w:type="dxa"/>
+            </w:tcMar>
+          </w:tcPr>
+          <w:p>
+            <w:pPr>
+              <w:jc w:val="center"/>
+            </w:pPr>
+            <w:r>
+              <w:rPr>
+                <w:b/>
+                <w:color w:val="FFFFFF"/>
+                <w:sz w:val="17"/>
+              </w:rPr>
+              <w:t>Đường Dẫn URL (Videos)</w:t>
+            </w:r>
+          </w:p>
+        </w:tc>
+        <w:tc>
+          <w:tcPr>
+            <w:tcW w:type="dxa" w:w="1872"/>
+            <w:shd w:fill="1E293B"/>
+            <w:tcMar>
+              <w:top w:w="90" w:type="dxa"/>
+              <w:bottom w:w="90" w:type="dxa"/>
+              <w:left w:w="90" w:type="dxa"/>
+              <w:right w:w="90" w:type="dxa"/>
+            </w:tcMar>
+          </w:tcPr>
+          <w:p>
+            <w:pPr>
+              <w:jc w:val="center"/>
+            </w:pPr>
+            <w:r>
+              <w:rPr>
+                <w:b/>
+                <w:color w:val="FFFFFF"/>
+                <w:sz w:val="17"/>
+              </w:rPr>
+              <w:t>Thể Loại</w:t>
+            </w:r>
+          </w:p>
+        </w:tc>
+        <w:tc>
+          <w:tcPr>
+            <w:tcW w:type="dxa" w:w="1728"/>
+            <w:shd w:fill="1E293B"/>
+            <w:tcMar>
+              <w:top w:w="90" w:type="dxa"/>
+              <w:bottom w:w="90" w:type="dxa"/>
+              <w:left w:w="90" w:type="dxa"/>
+              <w:right w:w="90" w:type="dxa"/>
+            </w:tcMar>
+          </w:tcPr>
+          <w:p>
+            <w:pPr>
+              <w:jc w:val="center"/>
+            </w:pPr>
+            <w:r>
+              <w:rPr>
+                <w:b/>
+                <w:color w:val="FFFFFF"/>
+                <w:sz w:val="17"/>
+              </w:rPr>
+              <w:t>Trạng Thái</w:t>
+            </w:r>
+          </w:p>
+        </w:tc>
+      </w:tr>
+      <w:tr>
+        <w:tc>
+          <w:tcPr>
+            <w:tcW w:type="dxa" w:w="720"/>
+            <w:tcMar>
+              <w:top w:w="70" w:type="dxa"/>
+              <w:bottom w:w="70" w:type="dxa"/>
+              <w:left w:w="80" w:type="dxa"/>
+              <w:right w:w="80" w:type="dxa"/>
+            </w:tcMar>
+            <w:shd w:fill="F8FAFC"/>
+          </w:tcPr>
+          <w:p>
+            <w:pPr>
+              <w:jc w:val="center"/>
+            </w:pPr>
+            <w:r>
+              <w:rPr>
+                <w:sz w:val="16"/>
+              </w:rPr>
+              <w:t>91</w:t>
+            </w:r>
+          </w:p>
+        </w:tc>
+        <w:tc>
+          <w:tcPr>
+            <w:tcW w:type="dxa" w:w="3168"/>
+            <w:tcMar>
+              <w:top w:w="70" w:type="dxa"/>
+              <w:bottom w:w="70" w:type="dxa"/>
+              <w:left w:w="80" w:type="dxa"/>
+              <w:right w:w="80" w:type="dxa"/>
+            </w:tcMar>
+          </w:tcPr>
+          <w:p>
+            <w:r>
+              <w:rPr>
+                <w:b/>
+                <w:sz w:val="16"/>
+              </w:rPr>
+              <w:t>Báo Thù Đại Nữ Chủ Review #95</w:t>
+            </w:r>
+          </w:p>
+        </w:tc>
+        <w:tc>
+          <w:tcPr>
+            <w:tcW w:type="dxa" w:w="3312"/>
+            <w:tcMar>
+              <w:top w:w="70" w:type="dxa"/>
+              <w:bottom w:w="70" w:type="dxa"/>
+              <w:left w:w="80" w:type="dxa"/>
+              <w:right w:w="80" w:type="dxa"/>
+            </w:tcMar>
+          </w:tcPr>
+          <w:p>
+            <w:r>
+              <w:rPr>
+                <w:color w:val="2563EB"/>
+                <w:sz w:val="16"/>
+              </w:rPr>
+              <w:t>https://www.facebook.com/phim.both.95/videos</w:t>
+            </w:r>
+          </w:p>
+        </w:tc>
+        <w:tc>
+          <w:tcPr>
+            <w:tcW w:type="dxa" w:w="1872"/>
+            <w:tcMar>
+              <w:top w:w="70" w:type="dxa"/>
+              <w:bottom w:w="70" w:type="dxa"/>
+              <w:left w:w="80" w:type="dxa"/>
+              <w:right w:w="80" w:type="dxa"/>
+            </w:tcMar>
+          </w:tcPr>
+          <w:p>
+            <w:r>
+              <w:rPr>
+                <w:sz w:val="16"/>
+              </w:rPr>
+              <w:t>Nữ Cường</w:t>
+            </w:r>
+          </w:p>
+        </w:tc>
+        <w:tc>
+          <w:tcPr>
+            <w:tcW w:type="dxa" w:w="1728"/>
+            <w:tcMar>
+              <w:top w:w="70" w:type="dxa"/>
+              <w:bottom w:w="70" w:type="dxa"/>
+              <w:left w:w="80" w:type="dxa"/>
+              <w:right w:w="80" w:type="dxa"/>
+            </w:tcMar>
+            <w:shd w:fill="EFF6FF"/>
+          </w:tcPr>
+          <w:p>
+            <w:r>
+              <w:rPr>
+                <w:color w:val="1D4ED8"/>
+                <w:sz w:val="16"/>
+              </w:rPr>
+              <w:t>Chờ quét Lô n+1</w:t>
+            </w:r>
+          </w:p>
+        </w:tc>
+      </w:tr>
+      <w:tr>
+        <w:tc>
+          <w:tcPr>
+            <w:tcW w:type="dxa" w:w="720"/>
+            <w:tcMar>
+              <w:top w:w="70" w:type="dxa"/>
+              <w:bottom w:w="70" w:type="dxa"/>
+              <w:left w:w="80" w:type="dxa"/>
+              <w:right w:w="80" w:type="dxa"/>
+            </w:tcMar>
+            <w:shd w:fill="F8FAFC"/>
+          </w:tcPr>
+          <w:p>
+            <w:pPr>
+              <w:jc w:val="center"/>
+            </w:pPr>
+            <w:r>
+              <w:rPr>
+                <w:sz w:val="16"/>
+              </w:rPr>
+              <w:t>92</w:t>
+            </w:r>
+          </w:p>
+        </w:tc>
+        <w:tc>
+          <w:tcPr>
+            <w:tcW w:type="dxa" w:w="3168"/>
+            <w:tcMar>
+              <w:top w:w="70" w:type="dxa"/>
+              <w:bottom w:w="70" w:type="dxa"/>
+              <w:left w:w="80" w:type="dxa"/>
+              <w:right w:w="80" w:type="dxa"/>
+            </w:tcMar>
+          </w:tcPr>
+          <w:p>
+            <w:r>
+              <w:rPr>
+                <w:b/>
+                <w:sz w:val="16"/>
+              </w:rPr>
+              <w:t>Thần Ma Đại Lục Review #96</w:t>
+            </w:r>
+          </w:p>
+        </w:tc>
+        <w:tc>
+          <w:tcPr>
+            <w:tcW w:type="dxa" w:w="3312"/>
+            <w:tcMar>
+              <w:top w:w="70" w:type="dxa"/>
+              <w:bottom w:w="70" w:type="dxa"/>
+              <w:left w:w="80" w:type="dxa"/>
+              <w:right w:w="80" w:type="dxa"/>
+            </w:tcMar>
+          </w:tcPr>
+          <w:p>
+            <w:r>
+              <w:rPr>
+                <w:color w:val="2563EB"/>
+                <w:sz w:val="16"/>
+              </w:rPr>
+              <w:t>https://www.facebook.com/phim.thnma.96/videos</w:t>
+            </w:r>
+          </w:p>
+        </w:tc>
+        <w:tc>
+          <w:tcPr>
+            <w:tcW w:type="dxa" w:w="1872"/>
+            <w:tcMar>
+              <w:top w:w="70" w:type="dxa"/>
+              <w:bottom w:w="70" w:type="dxa"/>
+              <w:left w:w="80" w:type="dxa"/>
+              <w:right w:w="80" w:type="dxa"/>
+            </w:tcMar>
+          </w:tcPr>
+          <w:p>
+            <w:r>
+              <w:rPr>
+                <w:sz w:val="16"/>
+              </w:rPr>
+              <w:t>Donghua 3D</w:t>
+            </w:r>
+          </w:p>
+        </w:tc>
+        <w:tc>
+          <w:tcPr>
+            <w:tcW w:type="dxa" w:w="1728"/>
+            <w:tcMar>
+              <w:top w:w="70" w:type="dxa"/>
+              <w:bottom w:w="70" w:type="dxa"/>
+              <w:left w:w="80" w:type="dxa"/>
+              <w:right w:w="80" w:type="dxa"/>
+            </w:tcMar>
+            <w:shd w:fill="EFF6FF"/>
+          </w:tcPr>
+          <w:p>
+            <w:r>
+              <w:rPr>
+                <w:color w:val="1D4ED8"/>
+                <w:sz w:val="16"/>
+              </w:rPr>
+              <w:t>Chờ quét Lô n+1</w:t>
+            </w:r>
+          </w:p>
+        </w:tc>
+      </w:tr>
+      <w:tr>
+        <w:tc>
+          <w:tcPr>
+            <w:tcW w:type="dxa" w:w="720"/>
+            <w:tcMar>
+              <w:top w:w="70" w:type="dxa"/>
+              <w:bottom w:w="70" w:type="dxa"/>
+              <w:left w:w="80" w:type="dxa"/>
+              <w:right w:w="80" w:type="dxa"/>
+            </w:tcMar>
+            <w:shd w:fill="F8FAFC"/>
+          </w:tcPr>
+          <w:p>
+            <w:pPr>
+              <w:jc w:val="center"/>
+            </w:pPr>
+            <w:r>
+              <w:rPr>
+                <w:sz w:val="16"/>
+              </w:rPr>
+              <w:t>93</w:t>
+            </w:r>
+          </w:p>
+        </w:tc>
+        <w:tc>
+          <w:tcPr>
+            <w:tcW w:type="dxa" w:w="3168"/>
+            <w:tcMar>
+              <w:top w:w="70" w:type="dxa"/>
+              <w:bottom w:w="70" w:type="dxa"/>
+              <w:left w:w="80" w:type="dxa"/>
+              <w:right w:w="80" w:type="dxa"/>
+            </w:tcMar>
+          </w:tcPr>
+          <w:p>
+            <w:r>
+              <w:rPr>
+                <w:b/>
+                <w:sz w:val="16"/>
+              </w:rPr>
+              <w:t>Xuyên Không Hệ Thống Review #97</w:t>
+            </w:r>
+          </w:p>
+        </w:tc>
+        <w:tc>
+          <w:tcPr>
+            <w:tcW w:type="dxa" w:w="3312"/>
+            <w:tcMar>
+              <w:top w:w="70" w:type="dxa"/>
+              <w:bottom w:w="70" w:type="dxa"/>
+              <w:left w:w="80" w:type="dxa"/>
+              <w:right w:w="80" w:type="dxa"/>
+            </w:tcMar>
+          </w:tcPr>
+          <w:p>
+            <w:r>
+              <w:rPr>
+                <w:color w:val="2563EB"/>
+                <w:sz w:val="16"/>
+              </w:rPr>
+              <w:t>https://www.facebook.com/phim.xuynkhng.97/videos</w:t>
+            </w:r>
+          </w:p>
+        </w:tc>
+        <w:tc>
+          <w:tcPr>
+            <w:tcW w:type="dxa" w:w="1872"/>
+            <w:tcMar>
+              <w:top w:w="70" w:type="dxa"/>
+              <w:bottom w:w="70" w:type="dxa"/>
+              <w:left w:w="80" w:type="dxa"/>
+              <w:right w:w="80" w:type="dxa"/>
+            </w:tcMar>
+          </w:tcPr>
+          <w:p>
+            <w:r>
+              <w:rPr>
+                <w:sz w:val="16"/>
+              </w:rPr>
+              <w:t>Xuyên Không</w:t>
+            </w:r>
+          </w:p>
+        </w:tc>
+        <w:tc>
+          <w:tcPr>
+            <w:tcW w:type="dxa" w:w="1728"/>
+            <w:tcMar>
+              <w:top w:w="70" w:type="dxa"/>
+              <w:bottom w:w="70" w:type="dxa"/>
+              <w:left w:w="80" w:type="dxa"/>
+              <w:right w:w="80" w:type="dxa"/>
+            </w:tcMar>
+            <w:shd w:fill="EFF6FF"/>
+          </w:tcPr>
+          <w:p>
+            <w:r>
+              <w:rPr>
+                <w:color w:val="1D4ED8"/>
+                <w:sz w:val="16"/>
+              </w:rPr>
+              <w:t>Chờ quét Lô n+1</w:t>
+            </w:r>
+          </w:p>
+        </w:tc>
+      </w:tr>
+      <w:tr>
+        <w:tc>
+          <w:tcPr>
+            <w:tcW w:type="dxa" w:w="720"/>
+            <w:tcMar>
+              <w:top w:w="70" w:type="dxa"/>
+              <w:bottom w:w="70" w:type="dxa"/>
+              <w:left w:w="80" w:type="dxa"/>
+              <w:right w:w="80" w:type="dxa"/>
+            </w:tcMar>
+            <w:shd w:fill="F8FAFC"/>
+          </w:tcPr>
+          <w:p>
+            <w:pPr>
+              <w:jc w:val="center"/>
+            </w:pPr>
+            <w:r>
+              <w:rPr>
+                <w:sz w:val="16"/>
+              </w:rPr>
+              <w:t>94</w:t>
+            </w:r>
+          </w:p>
+        </w:tc>
+        <w:tc>
+          <w:tcPr>
+            <w:tcW w:type="dxa" w:w="3168"/>
+            <w:tcMar>
+              <w:top w:w="70" w:type="dxa"/>
+              <w:bottom w:w="70" w:type="dxa"/>
+              <w:left w:w="80" w:type="dxa"/>
+              <w:right w:w="80" w:type="dxa"/>
+            </w:tcMar>
+          </w:tcPr>
+          <w:p>
+            <w:r>
+              <w:rPr>
+                <w:b/>
+                <w:sz w:val="16"/>
+              </w:rPr>
+              <w:t>Võ Thần Chúa Tể Review #98</w:t>
+            </w:r>
+          </w:p>
+        </w:tc>
+        <w:tc>
+          <w:tcPr>
+            <w:tcW w:type="dxa" w:w="3312"/>
+            <w:tcMar>
+              <w:top w:w="70" w:type="dxa"/>
+              <w:bottom w:w="70" w:type="dxa"/>
+              <w:left w:w="80" w:type="dxa"/>
+              <w:right w:w="80" w:type="dxa"/>
+            </w:tcMar>
+          </w:tcPr>
+          <w:p>
+            <w:r>
+              <w:rPr>
+                <w:color w:val="2563EB"/>
+                <w:sz w:val="16"/>
+              </w:rPr>
+              <w:t>https://www.facebook.com/phim.vthn.98/videos</w:t>
+            </w:r>
+          </w:p>
+        </w:tc>
+        <w:tc>
+          <w:tcPr>
+            <w:tcW w:type="dxa" w:w="1872"/>
+            <w:tcMar>
+              <w:top w:w="70" w:type="dxa"/>
+              <w:bottom w:w="70" w:type="dxa"/>
+              <w:left w:w="80" w:type="dxa"/>
+              <w:right w:w="80" w:type="dxa"/>
+            </w:tcMar>
+          </w:tcPr>
+          <w:p>
+            <w:r>
+              <w:rPr>
+                <w:sz w:val="16"/>
+              </w:rPr>
+              <w:t>Huyền Huyễn</w:t>
+            </w:r>
+          </w:p>
+        </w:tc>
+        <w:tc>
+          <w:tcPr>
+            <w:tcW w:type="dxa" w:w="1728"/>
+            <w:tcMar>
+              <w:top w:w="70" w:type="dxa"/>
+              <w:bottom w:w="70" w:type="dxa"/>
+              <w:left w:w="80" w:type="dxa"/>
+              <w:right w:w="80" w:type="dxa"/>
+            </w:tcMar>
+            <w:shd w:fill="EFF6FF"/>
+          </w:tcPr>
+          <w:p>
+            <w:r>
+              <w:rPr>
+                <w:color w:val="1D4ED8"/>
+                <w:sz w:val="16"/>
+              </w:rPr>
+              <w:t>Chờ quét Lô n+1</w:t>
+            </w:r>
+          </w:p>
+        </w:tc>
+      </w:tr>
+      <w:tr>
+        <w:tc>
+          <w:tcPr>
+            <w:tcW w:type="dxa" w:w="720"/>
+            <w:tcMar>
+              <w:top w:w="70" w:type="dxa"/>
+              <w:bottom w:w="70" w:type="dxa"/>
+              <w:left w:w="80" w:type="dxa"/>
+              <w:right w:w="80" w:type="dxa"/>
+            </w:tcMar>
+            <w:shd w:fill="F8FAFC"/>
+          </w:tcPr>
+          <w:p>
+            <w:pPr>
+              <w:jc w:val="center"/>
+            </w:pPr>
+            <w:r>
+              <w:rPr>
+                <w:sz w:val="16"/>
+              </w:rPr>
+              <w:t>95</w:t>
+            </w:r>
+          </w:p>
+        </w:tc>
+        <w:tc>
+          <w:tcPr>
+            <w:tcW w:type="dxa" w:w="3168"/>
+            <w:tcMar>
+              <w:top w:w="70" w:type="dxa"/>
+              <w:bottom w:w="70" w:type="dxa"/>
+              <w:left w:w="80" w:type="dxa"/>
+              <w:right w:w="80" w:type="dxa"/>
+            </w:tcMar>
+          </w:tcPr>
+          <w:p>
+            <w:r>
+              <w:rPr>
+                <w:b/>
+                <w:sz w:val="16"/>
+              </w:rPr>
+              <w:t>Tổng Tài Hào Môn Review #99</w:t>
+            </w:r>
+          </w:p>
+        </w:tc>
+        <w:tc>
+          <w:tcPr>
+            <w:tcW w:type="dxa" w:w="3312"/>
+            <w:tcMar>
+              <w:top w:w="70" w:type="dxa"/>
+              <w:bottom w:w="70" w:type="dxa"/>
+              <w:left w:w="80" w:type="dxa"/>
+              <w:right w:w="80" w:type="dxa"/>
+            </w:tcMar>
+          </w:tcPr>
+          <w:p>
+            <w:r>
+              <w:rPr>
+                <w:color w:val="2563EB"/>
+                <w:sz w:val="16"/>
+              </w:rPr>
+              <w:t>https://www.facebook.com/phim.tngti.99/videos</w:t>
+            </w:r>
+          </w:p>
+        </w:tc>
+        <w:tc>
+          <w:tcPr>
+            <w:tcW w:type="dxa" w:w="1872"/>
+            <w:tcMar>
+              <w:top w:w="70" w:type="dxa"/>
+              <w:bottom w:w="70" w:type="dxa"/>
+              <w:left w:w="80" w:type="dxa"/>
+              <w:right w:w="80" w:type="dxa"/>
+            </w:tcMar>
+          </w:tcPr>
+          <w:p>
+            <w:r>
+              <w:rPr>
+                <w:sz w:val="16"/>
+              </w:rPr>
+              <w:t>Đô Thị</w:t>
             </w:r>
           </w:p>
         </w:tc>

</xml_diff>

<commit_message>
docs: sync batch 20 channel registry and crawler cursor
</commit_message>
<xml_diff>
--- a/Danh_Sach_Kenh_Da_Cao.docx
+++ b/Danh_Sach_Kenh_Da_Cao.docx
@@ -29,7 +29,7 @@
           <w:color w:val="64748B"/>
           <w:sz w:val="20"/>
         </w:rPr>
-        <w:t>Hệ thống: Mở Rộng Vô Hạn Lô (n+1) Không Trùng Lặp | Tổng: 19 Lô (95 Kênh) | 09/10/2026 02:36:13</w:t>
+        <w:t>Hệ thống: Mở Rộng Vô Hạn Lô (n+1) Không Trùng Lặp | Tổng: 20 Lô (100 Kênh) | 09/10/2026 02:43:57</w:t>
       </w:r>
     </w:p>
     <w:p/>
@@ -12449,10 +12449,10 @@
       <w:r>
         <w:rPr>
           <w:b/>
-          <w:color w:val="0E7490"/>
+          <w:color w:val="166534"/>
           <w:sz w:val="19"/>
         </w:rPr>
-        <w:t>Trạng thái: ⭐ ĐANG CÀO (Lô n+1 = 19)</w:t>
+        <w:t>Trạng thái: ĐÃ CÀO</w:t>
       </w:r>
     </w:p>
     <w:tbl>
@@ -12687,15 +12687,15 @@
               <w:left w:w="80" w:type="dxa"/>
               <w:right w:w="80" w:type="dxa"/>
             </w:tcMar>
-            <w:shd w:fill="EFF6FF"/>
-          </w:tcPr>
-          <w:p>
-            <w:r>
-              <w:rPr>
-                <w:color w:val="1D4ED8"/>
-                <w:sz w:val="16"/>
-              </w:rPr>
-              <w:t>Chờ quét Lô n+1</w:t>
+            <w:shd w:fill="F0FDF4"/>
+          </w:tcPr>
+          <w:p>
+            <w:r>
+              <w:rPr>
+                <w:color w:val="166534"/>
+                <w:sz w:val="16"/>
+              </w:rPr>
+              <w:t>Đã cào &amp; nạp</w:t>
             </w:r>
           </w:p>
         </w:tc>
@@ -12792,15 +12792,15 @@
               <w:left w:w="80" w:type="dxa"/>
               <w:right w:w="80" w:type="dxa"/>
             </w:tcMar>
-            <w:shd w:fill="EFF6FF"/>
-          </w:tcPr>
-          <w:p>
-            <w:r>
-              <w:rPr>
-                <w:color w:val="1D4ED8"/>
-                <w:sz w:val="16"/>
-              </w:rPr>
-              <w:t>Chờ quét Lô n+1</w:t>
+            <w:shd w:fill="F0FDF4"/>
+          </w:tcPr>
+          <w:p>
+            <w:r>
+              <w:rPr>
+                <w:color w:val="166534"/>
+                <w:sz w:val="16"/>
+              </w:rPr>
+              <w:t>Đã cào &amp; nạp</w:t>
             </w:r>
           </w:p>
         </w:tc>
@@ -12897,15 +12897,15 @@
               <w:left w:w="80" w:type="dxa"/>
               <w:right w:w="80" w:type="dxa"/>
             </w:tcMar>
-            <w:shd w:fill="EFF6FF"/>
-          </w:tcPr>
-          <w:p>
-            <w:r>
-              <w:rPr>
-                <w:color w:val="1D4ED8"/>
-                <w:sz w:val="16"/>
-              </w:rPr>
-              <w:t>Chờ quét Lô n+1</w:t>
+            <w:shd w:fill="F0FDF4"/>
+          </w:tcPr>
+          <w:p>
+            <w:r>
+              <w:rPr>
+                <w:color w:val="166534"/>
+                <w:sz w:val="16"/>
+              </w:rPr>
+              <w:t>Đã cào &amp; nạp</w:t>
             </w:r>
           </w:p>
         </w:tc>
@@ -13002,15 +13002,15 @@
               <w:left w:w="80" w:type="dxa"/>
               <w:right w:w="80" w:type="dxa"/>
             </w:tcMar>
-            <w:shd w:fill="EFF6FF"/>
-          </w:tcPr>
-          <w:p>
-            <w:r>
-              <w:rPr>
-                <w:color w:val="1D4ED8"/>
-                <w:sz w:val="16"/>
-              </w:rPr>
-              <w:t>Chờ quét Lô n+1</w:t>
+            <w:shd w:fill="F0FDF4"/>
+          </w:tcPr>
+          <w:p>
+            <w:r>
+              <w:rPr>
+                <w:color w:val="166534"/>
+                <w:sz w:val="16"/>
+              </w:rPr>
+              <w:t>Đã cào &amp; nạp</w:t>
             </w:r>
           </w:p>
         </w:tc>
@@ -13095,6 +13095,692 @@
                 <w:sz w:val="16"/>
               </w:rPr>
               <w:t>Đô Thị</w:t>
+            </w:r>
+          </w:p>
+        </w:tc>
+        <w:tc>
+          <w:tcPr>
+            <w:tcW w:type="dxa" w:w="1728"/>
+            <w:tcMar>
+              <w:top w:w="70" w:type="dxa"/>
+              <w:bottom w:w="70" w:type="dxa"/>
+              <w:left w:w="80" w:type="dxa"/>
+              <w:right w:w="80" w:type="dxa"/>
+            </w:tcMar>
+            <w:shd w:fill="F0FDF4"/>
+          </w:tcPr>
+          <w:p>
+            <w:r>
+              <w:rPr>
+                <w:color w:val="166534"/>
+                <w:sz w:val="16"/>
+              </w:rPr>
+              <w:t>Đã cào &amp; nạp</w:t>
+            </w:r>
+          </w:p>
+        </w:tc>
+      </w:tr>
+    </w:tbl>
+    <w:p/>
+    <w:p>
+      <w:r>
+        <w:rPr>
+          <w:b/>
+          <w:color w:val="1E293B"/>
+          <w:sz w:val="22"/>
+        </w:rPr>
+        <w:t>📁 LÔ 20 (n+1 MỚI): Tuyển Tập Kênh Mới Hoàn Toàn #20</w:t>
+        <w:br/>
+      </w:r>
+      <w:r>
+        <w:rPr>
+          <w:b/>
+          <w:color w:val="0E7490"/>
+          <w:sz w:val="19"/>
+        </w:rPr>
+        <w:t>Trạng thái: ⭐ ĐANG CÀO (Lô n+1 = 20)</w:t>
+      </w:r>
+    </w:p>
+    <w:tbl>
+      <w:tblPr>
+        <w:tblW w:type="auto" w:w="0"/>
+        <w:jc w:val="center"/>
+        <w:tblLook w:firstColumn="1" w:firstRow="1" w:lastColumn="0" w:lastRow="0" w:noHBand="0" w:noVBand="1" w:val="04A0"/>
+      </w:tblPr>
+      <w:tblGrid>
+        <w:gridCol w:w="2045"/>
+        <w:gridCol w:w="2045"/>
+        <w:gridCol w:w="2045"/>
+        <w:gridCol w:w="2045"/>
+        <w:gridCol w:w="2045"/>
+      </w:tblGrid>
+      <w:tr>
+        <w:tc>
+          <w:tcPr>
+            <w:tcW w:type="dxa" w:w="720"/>
+            <w:shd w:fill="1E293B"/>
+            <w:tcMar>
+              <w:top w:w="90" w:type="dxa"/>
+              <w:bottom w:w="90" w:type="dxa"/>
+              <w:left w:w="90" w:type="dxa"/>
+              <w:right w:w="90" w:type="dxa"/>
+            </w:tcMar>
+          </w:tcPr>
+          <w:p>
+            <w:pPr>
+              <w:jc w:val="center"/>
+            </w:pPr>
+            <w:r>
+              <w:rPr>
+                <w:b/>
+                <w:color w:val="FFFFFF"/>
+                <w:sz w:val="17"/>
+              </w:rPr>
+              <w:t>STT</w:t>
+            </w:r>
+          </w:p>
+        </w:tc>
+        <w:tc>
+          <w:tcPr>
+            <w:tcW w:type="dxa" w:w="3168"/>
+            <w:shd w:fill="1E293B"/>
+            <w:tcMar>
+              <w:top w:w="90" w:type="dxa"/>
+              <w:bottom w:w="90" w:type="dxa"/>
+              <w:left w:w="90" w:type="dxa"/>
+              <w:right w:w="90" w:type="dxa"/>
+            </w:tcMar>
+          </w:tcPr>
+          <w:p>
+            <w:pPr>
+              <w:jc w:val="center"/>
+            </w:pPr>
+            <w:r>
+              <w:rPr>
+                <w:b/>
+                <w:color w:val="FFFFFF"/>
+                <w:sz w:val="17"/>
+              </w:rPr>
+              <w:t>Tên Kênh / Fanpage</w:t>
+            </w:r>
+          </w:p>
+        </w:tc>
+        <w:tc>
+          <w:tcPr>
+            <w:tcW w:type="dxa" w:w="3312"/>
+            <w:shd w:fill="1E293B"/>
+            <w:tcMar>
+              <w:top w:w="90" w:type="dxa"/>
+              <w:bottom w:w="90" w:type="dxa"/>
+              <w:left w:w="90" w:type="dxa"/>
+              <w:right w:w="90" w:type="dxa"/>
+            </w:tcMar>
+          </w:tcPr>
+          <w:p>
+            <w:pPr>
+              <w:jc w:val="center"/>
+            </w:pPr>
+            <w:r>
+              <w:rPr>
+                <w:b/>
+                <w:color w:val="FFFFFF"/>
+                <w:sz w:val="17"/>
+              </w:rPr>
+              <w:t>Đường Dẫn URL (Videos)</w:t>
+            </w:r>
+          </w:p>
+        </w:tc>
+        <w:tc>
+          <w:tcPr>
+            <w:tcW w:type="dxa" w:w="1872"/>
+            <w:shd w:fill="1E293B"/>
+            <w:tcMar>
+              <w:top w:w="90" w:type="dxa"/>
+              <w:bottom w:w="90" w:type="dxa"/>
+              <w:left w:w="90" w:type="dxa"/>
+              <w:right w:w="90" w:type="dxa"/>
+            </w:tcMar>
+          </w:tcPr>
+          <w:p>
+            <w:pPr>
+              <w:jc w:val="center"/>
+            </w:pPr>
+            <w:r>
+              <w:rPr>
+                <w:b/>
+                <w:color w:val="FFFFFF"/>
+                <w:sz w:val="17"/>
+              </w:rPr>
+              <w:t>Thể Loại</w:t>
+            </w:r>
+          </w:p>
+        </w:tc>
+        <w:tc>
+          <w:tcPr>
+            <w:tcW w:type="dxa" w:w="1728"/>
+            <w:shd w:fill="1E293B"/>
+            <w:tcMar>
+              <w:top w:w="90" w:type="dxa"/>
+              <w:bottom w:w="90" w:type="dxa"/>
+              <w:left w:w="90" w:type="dxa"/>
+              <w:right w:w="90" w:type="dxa"/>
+            </w:tcMar>
+          </w:tcPr>
+          <w:p>
+            <w:pPr>
+              <w:jc w:val="center"/>
+            </w:pPr>
+            <w:r>
+              <w:rPr>
+                <w:b/>
+                <w:color w:val="FFFFFF"/>
+                <w:sz w:val="17"/>
+              </w:rPr>
+              <w:t>Trạng Thái</w:t>
+            </w:r>
+          </w:p>
+        </w:tc>
+      </w:tr>
+      <w:tr>
+        <w:tc>
+          <w:tcPr>
+            <w:tcW w:type="dxa" w:w="720"/>
+            <w:tcMar>
+              <w:top w:w="70" w:type="dxa"/>
+              <w:bottom w:w="70" w:type="dxa"/>
+              <w:left w:w="80" w:type="dxa"/>
+              <w:right w:w="80" w:type="dxa"/>
+            </w:tcMar>
+            <w:shd w:fill="F8FAFC"/>
+          </w:tcPr>
+          <w:p>
+            <w:pPr>
+              <w:jc w:val="center"/>
+            </w:pPr>
+            <w:r>
+              <w:rPr>
+                <w:sz w:val="16"/>
+              </w:rPr>
+              <w:t>96</w:t>
+            </w:r>
+          </w:p>
+        </w:tc>
+        <w:tc>
+          <w:tcPr>
+            <w:tcW w:type="dxa" w:w="3168"/>
+            <w:tcMar>
+              <w:top w:w="70" w:type="dxa"/>
+              <w:bottom w:w="70" w:type="dxa"/>
+              <w:left w:w="80" w:type="dxa"/>
+              <w:right w:w="80" w:type="dxa"/>
+            </w:tcMar>
+          </w:tcPr>
+          <w:p>
+            <w:r>
+              <w:rPr>
+                <w:b/>
+                <w:sz w:val="16"/>
+              </w:rPr>
+              <w:t>Đấu Phá Tu Chân Review #100</w:t>
+            </w:r>
+          </w:p>
+        </w:tc>
+        <w:tc>
+          <w:tcPr>
+            <w:tcW w:type="dxa" w:w="3312"/>
+            <w:tcMar>
+              <w:top w:w="70" w:type="dxa"/>
+              <w:bottom w:w="70" w:type="dxa"/>
+              <w:left w:w="80" w:type="dxa"/>
+              <w:right w:w="80" w:type="dxa"/>
+            </w:tcMar>
+          </w:tcPr>
+          <w:p>
+            <w:r>
+              <w:rPr>
+                <w:color w:val="2563EB"/>
+                <w:sz w:val="16"/>
+              </w:rPr>
+              <w:t>https://www.facebook.com/phim.uph.100/videos</w:t>
+            </w:r>
+          </w:p>
+        </w:tc>
+        <w:tc>
+          <w:tcPr>
+            <w:tcW w:type="dxa" w:w="1872"/>
+            <w:tcMar>
+              <w:top w:w="70" w:type="dxa"/>
+              <w:bottom w:w="70" w:type="dxa"/>
+              <w:left w:w="80" w:type="dxa"/>
+              <w:right w:w="80" w:type="dxa"/>
+            </w:tcMar>
+          </w:tcPr>
+          <w:p>
+            <w:r>
+              <w:rPr>
+                <w:sz w:val="16"/>
+              </w:rPr>
+              <w:t>Tu Tiên 3D</w:t>
+            </w:r>
+          </w:p>
+        </w:tc>
+        <w:tc>
+          <w:tcPr>
+            <w:tcW w:type="dxa" w:w="1728"/>
+            <w:tcMar>
+              <w:top w:w="70" w:type="dxa"/>
+              <w:bottom w:w="70" w:type="dxa"/>
+              <w:left w:w="80" w:type="dxa"/>
+              <w:right w:w="80" w:type="dxa"/>
+            </w:tcMar>
+            <w:shd w:fill="EFF6FF"/>
+          </w:tcPr>
+          <w:p>
+            <w:r>
+              <w:rPr>
+                <w:color w:val="1D4ED8"/>
+                <w:sz w:val="16"/>
+              </w:rPr>
+              <w:t>Chờ quét Lô n+1</w:t>
+            </w:r>
+          </w:p>
+        </w:tc>
+      </w:tr>
+      <w:tr>
+        <w:tc>
+          <w:tcPr>
+            <w:tcW w:type="dxa" w:w="720"/>
+            <w:tcMar>
+              <w:top w:w="70" w:type="dxa"/>
+              <w:bottom w:w="70" w:type="dxa"/>
+              <w:left w:w="80" w:type="dxa"/>
+              <w:right w:w="80" w:type="dxa"/>
+            </w:tcMar>
+            <w:shd w:fill="F8FAFC"/>
+          </w:tcPr>
+          <w:p>
+            <w:pPr>
+              <w:jc w:val="center"/>
+            </w:pPr>
+            <w:r>
+              <w:rPr>
+                <w:sz w:val="16"/>
+              </w:rPr>
+              <w:t>97</w:t>
+            </w:r>
+          </w:p>
+        </w:tc>
+        <w:tc>
+          <w:tcPr>
+            <w:tcW w:type="dxa" w:w="3168"/>
+            <w:tcMar>
+              <w:top w:w="70" w:type="dxa"/>
+              <w:bottom w:w="70" w:type="dxa"/>
+              <w:left w:w="80" w:type="dxa"/>
+              <w:right w:w="80" w:type="dxa"/>
+            </w:tcMar>
+          </w:tcPr>
+          <w:p>
+            <w:r>
+              <w:rPr>
+                <w:b/>
+                <w:sz w:val="16"/>
+              </w:rPr>
+              <w:t>Nghịch Thiên Kỳ Tích Review #101</w:t>
+            </w:r>
+          </w:p>
+        </w:tc>
+        <w:tc>
+          <w:tcPr>
+            <w:tcW w:type="dxa" w:w="3312"/>
+            <w:tcMar>
+              <w:top w:w="70" w:type="dxa"/>
+              <w:bottom w:w="70" w:type="dxa"/>
+              <w:left w:w="80" w:type="dxa"/>
+              <w:right w:w="80" w:type="dxa"/>
+            </w:tcMar>
+          </w:tcPr>
+          <w:p>
+            <w:r>
+              <w:rPr>
+                <w:color w:val="2563EB"/>
+                <w:sz w:val="16"/>
+              </w:rPr>
+              <w:t>https://www.facebook.com/phim.nghchthin.101/videos</w:t>
+            </w:r>
+          </w:p>
+        </w:tc>
+        <w:tc>
+          <w:tcPr>
+            <w:tcW w:type="dxa" w:w="1872"/>
+            <w:tcMar>
+              <w:top w:w="70" w:type="dxa"/>
+              <w:bottom w:w="70" w:type="dxa"/>
+              <w:left w:w="80" w:type="dxa"/>
+              <w:right w:w="80" w:type="dxa"/>
+            </w:tcMar>
+          </w:tcPr>
+          <w:p>
+            <w:r>
+              <w:rPr>
+                <w:sz w:val="16"/>
+              </w:rPr>
+              <w:t>Trọng Sinh</w:t>
+            </w:r>
+          </w:p>
+        </w:tc>
+        <w:tc>
+          <w:tcPr>
+            <w:tcW w:type="dxa" w:w="1728"/>
+            <w:tcMar>
+              <w:top w:w="70" w:type="dxa"/>
+              <w:bottom w:w="70" w:type="dxa"/>
+              <w:left w:w="80" w:type="dxa"/>
+              <w:right w:w="80" w:type="dxa"/>
+            </w:tcMar>
+            <w:shd w:fill="EFF6FF"/>
+          </w:tcPr>
+          <w:p>
+            <w:r>
+              <w:rPr>
+                <w:color w:val="1D4ED8"/>
+                <w:sz w:val="16"/>
+              </w:rPr>
+              <w:t>Chờ quét Lô n+1</w:t>
+            </w:r>
+          </w:p>
+        </w:tc>
+      </w:tr>
+      <w:tr>
+        <w:tc>
+          <w:tcPr>
+            <w:tcW w:type="dxa" w:w="720"/>
+            <w:tcMar>
+              <w:top w:w="70" w:type="dxa"/>
+              <w:bottom w:w="70" w:type="dxa"/>
+              <w:left w:w="80" w:type="dxa"/>
+              <w:right w:w="80" w:type="dxa"/>
+            </w:tcMar>
+            <w:shd w:fill="F8FAFC"/>
+          </w:tcPr>
+          <w:p>
+            <w:pPr>
+              <w:jc w:val="center"/>
+            </w:pPr>
+            <w:r>
+              <w:rPr>
+                <w:sz w:val="16"/>
+              </w:rPr>
+              <w:t>98</w:t>
+            </w:r>
+          </w:p>
+        </w:tc>
+        <w:tc>
+          <w:tcPr>
+            <w:tcW w:type="dxa" w:w="3168"/>
+            <w:tcMar>
+              <w:top w:w="70" w:type="dxa"/>
+              <w:bottom w:w="70" w:type="dxa"/>
+              <w:left w:w="80" w:type="dxa"/>
+              <w:right w:w="80" w:type="dxa"/>
+            </w:tcMar>
+          </w:tcPr>
+          <w:p>
+            <w:r>
+              <w:rPr>
+                <w:b/>
+                <w:sz w:val="16"/>
+              </w:rPr>
+              <w:t>Tiên Tôn Xuất Sơn Review #102</w:t>
+            </w:r>
+          </w:p>
+        </w:tc>
+        <w:tc>
+          <w:tcPr>
+            <w:tcW w:type="dxa" w:w="3312"/>
+            <w:tcMar>
+              <w:top w:w="70" w:type="dxa"/>
+              <w:bottom w:w="70" w:type="dxa"/>
+              <w:left w:w="80" w:type="dxa"/>
+              <w:right w:w="80" w:type="dxa"/>
+            </w:tcMar>
+          </w:tcPr>
+          <w:p>
+            <w:r>
+              <w:rPr>
+                <w:color w:val="2563EB"/>
+                <w:sz w:val="16"/>
+              </w:rPr>
+              <w:t>https://www.facebook.com/phim.tintn.102/videos</w:t>
+            </w:r>
+          </w:p>
+        </w:tc>
+        <w:tc>
+          <w:tcPr>
+            <w:tcW w:type="dxa" w:w="1872"/>
+            <w:tcMar>
+              <w:top w:w="70" w:type="dxa"/>
+              <w:bottom w:w="70" w:type="dxa"/>
+              <w:left w:w="80" w:type="dxa"/>
+              <w:right w:w="80" w:type="dxa"/>
+            </w:tcMar>
+          </w:tcPr>
+          <w:p>
+            <w:r>
+              <w:rPr>
+                <w:sz w:val="16"/>
+              </w:rPr>
+              <w:t>Tiên Hiệp</w:t>
+            </w:r>
+          </w:p>
+        </w:tc>
+        <w:tc>
+          <w:tcPr>
+            <w:tcW w:type="dxa" w:w="1728"/>
+            <w:tcMar>
+              <w:top w:w="70" w:type="dxa"/>
+              <w:bottom w:w="70" w:type="dxa"/>
+              <w:left w:w="80" w:type="dxa"/>
+              <w:right w:w="80" w:type="dxa"/>
+            </w:tcMar>
+            <w:shd w:fill="EFF6FF"/>
+          </w:tcPr>
+          <w:p>
+            <w:r>
+              <w:rPr>
+                <w:color w:val="1D4ED8"/>
+                <w:sz w:val="16"/>
+              </w:rPr>
+              <w:t>Chờ quét Lô n+1</w:t>
+            </w:r>
+          </w:p>
+        </w:tc>
+      </w:tr>
+      <w:tr>
+        <w:tc>
+          <w:tcPr>
+            <w:tcW w:type="dxa" w:w="720"/>
+            <w:tcMar>
+              <w:top w:w="70" w:type="dxa"/>
+              <w:bottom w:w="70" w:type="dxa"/>
+              <w:left w:w="80" w:type="dxa"/>
+              <w:right w:w="80" w:type="dxa"/>
+            </w:tcMar>
+            <w:shd w:fill="F8FAFC"/>
+          </w:tcPr>
+          <w:p>
+            <w:pPr>
+              <w:jc w:val="center"/>
+            </w:pPr>
+            <w:r>
+              <w:rPr>
+                <w:sz w:val="16"/>
+              </w:rPr>
+              <w:t>99</w:t>
+            </w:r>
+          </w:p>
+        </w:tc>
+        <w:tc>
+          <w:tcPr>
+            <w:tcW w:type="dxa" w:w="3168"/>
+            <w:tcMar>
+              <w:top w:w="70" w:type="dxa"/>
+              <w:bottom w:w="70" w:type="dxa"/>
+              <w:left w:w="80" w:type="dxa"/>
+              <w:right w:w="80" w:type="dxa"/>
+            </w:tcMar>
+          </w:tcPr>
+          <w:p>
+            <w:r>
+              <w:rPr>
+                <w:b/>
+                <w:sz w:val="16"/>
+              </w:rPr>
+              <w:t>Chiến Thần Trở Về Review #103</w:t>
+            </w:r>
+          </w:p>
+        </w:tc>
+        <w:tc>
+          <w:tcPr>
+            <w:tcW w:type="dxa" w:w="3312"/>
+            <w:tcMar>
+              <w:top w:w="70" w:type="dxa"/>
+              <w:bottom w:w="70" w:type="dxa"/>
+              <w:left w:w="80" w:type="dxa"/>
+              <w:right w:w="80" w:type="dxa"/>
+            </w:tcMar>
+          </w:tcPr>
+          <w:p>
+            <w:r>
+              <w:rPr>
+                <w:color w:val="2563EB"/>
+                <w:sz w:val="16"/>
+              </w:rPr>
+              <w:t>https://www.facebook.com/phim.chinthn.103/videos</w:t>
+            </w:r>
+          </w:p>
+        </w:tc>
+        <w:tc>
+          <w:tcPr>
+            <w:tcW w:type="dxa" w:w="1872"/>
+            <w:tcMar>
+              <w:top w:w="70" w:type="dxa"/>
+              <w:bottom w:w="70" w:type="dxa"/>
+              <w:left w:w="80" w:type="dxa"/>
+              <w:right w:w="80" w:type="dxa"/>
+            </w:tcMar>
+          </w:tcPr>
+          <w:p>
+            <w:r>
+              <w:rPr>
+                <w:sz w:val="16"/>
+              </w:rPr>
+              <w:t>Binh Vương</w:t>
+            </w:r>
+          </w:p>
+        </w:tc>
+        <w:tc>
+          <w:tcPr>
+            <w:tcW w:type="dxa" w:w="1728"/>
+            <w:tcMar>
+              <w:top w:w="70" w:type="dxa"/>
+              <w:bottom w:w="70" w:type="dxa"/>
+              <w:left w:w="80" w:type="dxa"/>
+              <w:right w:w="80" w:type="dxa"/>
+            </w:tcMar>
+            <w:shd w:fill="EFF6FF"/>
+          </w:tcPr>
+          <w:p>
+            <w:r>
+              <w:rPr>
+                <w:color w:val="1D4ED8"/>
+                <w:sz w:val="16"/>
+              </w:rPr>
+              <w:t>Chờ quét Lô n+1</w:t>
+            </w:r>
+          </w:p>
+        </w:tc>
+      </w:tr>
+      <w:tr>
+        <w:tc>
+          <w:tcPr>
+            <w:tcW w:type="dxa" w:w="720"/>
+            <w:tcMar>
+              <w:top w:w="70" w:type="dxa"/>
+              <w:bottom w:w="70" w:type="dxa"/>
+              <w:left w:w="80" w:type="dxa"/>
+              <w:right w:w="80" w:type="dxa"/>
+            </w:tcMar>
+            <w:shd w:fill="F8FAFC"/>
+          </w:tcPr>
+          <w:p>
+            <w:pPr>
+              <w:jc w:val="center"/>
+            </w:pPr>
+            <w:r>
+              <w:rPr>
+                <w:sz w:val="16"/>
+              </w:rPr>
+              <w:t>100</w:t>
+            </w:r>
+          </w:p>
+        </w:tc>
+        <w:tc>
+          <w:tcPr>
+            <w:tcW w:type="dxa" w:w="3168"/>
+            <w:tcMar>
+              <w:top w:w="70" w:type="dxa"/>
+              <w:bottom w:w="70" w:type="dxa"/>
+              <w:left w:w="80" w:type="dxa"/>
+              <w:right w:w="80" w:type="dxa"/>
+            </w:tcMar>
+          </w:tcPr>
+          <w:p>
+            <w:r>
+              <w:rPr>
+                <w:b/>
+                <w:sz w:val="16"/>
+              </w:rPr>
+              <w:t>Vạn Cổ Thần Đế Review #104</w:t>
+            </w:r>
+          </w:p>
+        </w:tc>
+        <w:tc>
+          <w:tcPr>
+            <w:tcW w:type="dxa" w:w="3312"/>
+            <w:tcMar>
+              <w:top w:w="70" w:type="dxa"/>
+              <w:bottom w:w="70" w:type="dxa"/>
+              <w:left w:w="80" w:type="dxa"/>
+              <w:right w:w="80" w:type="dxa"/>
+            </w:tcMar>
+          </w:tcPr>
+          <w:p>
+            <w:r>
+              <w:rPr>
+                <w:color w:val="2563EB"/>
+                <w:sz w:val="16"/>
+              </w:rPr>
+              <w:t>https://www.facebook.com/phim.vnc.104/videos</w:t>
+            </w:r>
+          </w:p>
+        </w:tc>
+        <w:tc>
+          <w:tcPr>
+            <w:tcW w:type="dxa" w:w="1872"/>
+            <w:tcMar>
+              <w:top w:w="70" w:type="dxa"/>
+              <w:bottom w:w="70" w:type="dxa"/>
+              <w:left w:w="80" w:type="dxa"/>
+              <w:right w:w="80" w:type="dxa"/>
+            </w:tcMar>
+          </w:tcPr>
+          <w:p>
+            <w:r>
+              <w:rPr>
+                <w:sz w:val="16"/>
+              </w:rPr>
+              <w:t>Huyền Ảo</w:t>
             </w:r>
           </w:p>
         </w:tc>

</xml_diff>

<commit_message>
feat(database): update 198 movies, sync batch 21 second movie and thumbnails
</commit_message>
<xml_diff>
--- a/Danh_Sach_Kenh_Da_Cao.docx
+++ b/Danh_Sach_Kenh_Da_Cao.docx
@@ -29,7 +29,7 @@
           <w:color w:val="64748B"/>
           <w:sz w:val="20"/>
         </w:rPr>
-        <w:t>Hệ thống: Mở Rộng Vô Hạn Lô (n+1) Không Trùng Lặp | Tổng: 20 Lô (100 Kênh) | 09/10/2026 02:43:57</w:t>
+        <w:t>Hệ thống: Mở Rộng Vô Hạn Lô (n+1) Không Trùng Lặp | Tổng: 21 Lô (105 Kênh) | 09/10/2026 02:51:44</w:t>
       </w:r>
     </w:p>
     <w:p/>
@@ -13135,10 +13135,10 @@
       <w:r>
         <w:rPr>
           <w:b/>
-          <w:color w:val="0E7490"/>
+          <w:color w:val="166534"/>
           <w:sz w:val="19"/>
         </w:rPr>
-        <w:t>Trạng thái: ⭐ ĐANG CÀO (Lô n+1 = 20)</w:t>
+        <w:t>Trạng thái: ĐÃ CÀO</w:t>
       </w:r>
     </w:p>
     <w:tbl>
@@ -13373,15 +13373,15 @@
               <w:left w:w="80" w:type="dxa"/>
               <w:right w:w="80" w:type="dxa"/>
             </w:tcMar>
-            <w:shd w:fill="EFF6FF"/>
-          </w:tcPr>
-          <w:p>
-            <w:r>
-              <w:rPr>
-                <w:color w:val="1D4ED8"/>
-                <w:sz w:val="16"/>
-              </w:rPr>
-              <w:t>Chờ quét Lô n+1</w:t>
+            <w:shd w:fill="F0FDF4"/>
+          </w:tcPr>
+          <w:p>
+            <w:r>
+              <w:rPr>
+                <w:color w:val="166534"/>
+                <w:sz w:val="16"/>
+              </w:rPr>
+              <w:t>Đã cào &amp; nạp</w:t>
             </w:r>
           </w:p>
         </w:tc>
@@ -13478,15 +13478,15 @@
               <w:left w:w="80" w:type="dxa"/>
               <w:right w:w="80" w:type="dxa"/>
             </w:tcMar>
-            <w:shd w:fill="EFF6FF"/>
-          </w:tcPr>
-          <w:p>
-            <w:r>
-              <w:rPr>
-                <w:color w:val="1D4ED8"/>
-                <w:sz w:val="16"/>
-              </w:rPr>
-              <w:t>Chờ quét Lô n+1</w:t>
+            <w:shd w:fill="F0FDF4"/>
+          </w:tcPr>
+          <w:p>
+            <w:r>
+              <w:rPr>
+                <w:color w:val="166534"/>
+                <w:sz w:val="16"/>
+              </w:rPr>
+              <w:t>Đã cào &amp; nạp</w:t>
             </w:r>
           </w:p>
         </w:tc>
@@ -13583,15 +13583,15 @@
               <w:left w:w="80" w:type="dxa"/>
               <w:right w:w="80" w:type="dxa"/>
             </w:tcMar>
-            <w:shd w:fill="EFF6FF"/>
-          </w:tcPr>
-          <w:p>
-            <w:r>
-              <w:rPr>
-                <w:color w:val="1D4ED8"/>
-                <w:sz w:val="16"/>
-              </w:rPr>
-              <w:t>Chờ quét Lô n+1</w:t>
+            <w:shd w:fill="F0FDF4"/>
+          </w:tcPr>
+          <w:p>
+            <w:r>
+              <w:rPr>
+                <w:color w:val="166534"/>
+                <w:sz w:val="16"/>
+              </w:rPr>
+              <w:t>Đã cào &amp; nạp</w:t>
             </w:r>
           </w:p>
         </w:tc>
@@ -13688,15 +13688,15 @@
               <w:left w:w="80" w:type="dxa"/>
               <w:right w:w="80" w:type="dxa"/>
             </w:tcMar>
-            <w:shd w:fill="EFF6FF"/>
-          </w:tcPr>
-          <w:p>
-            <w:r>
-              <w:rPr>
-                <w:color w:val="1D4ED8"/>
-                <w:sz w:val="16"/>
-              </w:rPr>
-              <w:t>Chờ quét Lô n+1</w:t>
+            <w:shd w:fill="F0FDF4"/>
+          </w:tcPr>
+          <w:p>
+            <w:r>
+              <w:rPr>
+                <w:color w:val="166534"/>
+                <w:sz w:val="16"/>
+              </w:rPr>
+              <w:t>Đã cào &amp; nạp</w:t>
             </w:r>
           </w:p>
         </w:tc>
@@ -13781,6 +13781,692 @@
                 <w:sz w:val="16"/>
               </w:rPr>
               <w:t>Huyền Ảo</w:t>
+            </w:r>
+          </w:p>
+        </w:tc>
+        <w:tc>
+          <w:tcPr>
+            <w:tcW w:type="dxa" w:w="1728"/>
+            <w:tcMar>
+              <w:top w:w="70" w:type="dxa"/>
+              <w:bottom w:w="70" w:type="dxa"/>
+              <w:left w:w="80" w:type="dxa"/>
+              <w:right w:w="80" w:type="dxa"/>
+            </w:tcMar>
+            <w:shd w:fill="F0FDF4"/>
+          </w:tcPr>
+          <w:p>
+            <w:r>
+              <w:rPr>
+                <w:color w:val="166534"/>
+                <w:sz w:val="16"/>
+              </w:rPr>
+              <w:t>Đã cào &amp; nạp</w:t>
+            </w:r>
+          </w:p>
+        </w:tc>
+      </w:tr>
+    </w:tbl>
+    <w:p/>
+    <w:p>
+      <w:r>
+        <w:rPr>
+          <w:b/>
+          <w:color w:val="1E293B"/>
+          <w:sz w:val="22"/>
+        </w:rPr>
+        <w:t>📁 LÔ 21 (n+1 MỚI): Tuyển Tập Kênh Mới Hoàn Toàn #21</w:t>
+        <w:br/>
+      </w:r>
+      <w:r>
+        <w:rPr>
+          <w:b/>
+          <w:color w:val="0E7490"/>
+          <w:sz w:val="19"/>
+        </w:rPr>
+        <w:t>Trạng thái: ⭐ ĐANG CÀO (Lô n+1 = 21)</w:t>
+      </w:r>
+    </w:p>
+    <w:tbl>
+      <w:tblPr>
+        <w:tblW w:type="auto" w:w="0"/>
+        <w:jc w:val="center"/>
+        <w:tblLook w:firstColumn="1" w:firstRow="1" w:lastColumn="0" w:lastRow="0" w:noHBand="0" w:noVBand="1" w:val="04A0"/>
+      </w:tblPr>
+      <w:tblGrid>
+        <w:gridCol w:w="2045"/>
+        <w:gridCol w:w="2045"/>
+        <w:gridCol w:w="2045"/>
+        <w:gridCol w:w="2045"/>
+        <w:gridCol w:w="2045"/>
+      </w:tblGrid>
+      <w:tr>
+        <w:tc>
+          <w:tcPr>
+            <w:tcW w:type="dxa" w:w="720"/>
+            <w:shd w:fill="1E293B"/>
+            <w:tcMar>
+              <w:top w:w="90" w:type="dxa"/>
+              <w:bottom w:w="90" w:type="dxa"/>
+              <w:left w:w="90" w:type="dxa"/>
+              <w:right w:w="90" w:type="dxa"/>
+            </w:tcMar>
+          </w:tcPr>
+          <w:p>
+            <w:pPr>
+              <w:jc w:val="center"/>
+            </w:pPr>
+            <w:r>
+              <w:rPr>
+                <w:b/>
+                <w:color w:val="FFFFFF"/>
+                <w:sz w:val="17"/>
+              </w:rPr>
+              <w:t>STT</w:t>
+            </w:r>
+          </w:p>
+        </w:tc>
+        <w:tc>
+          <w:tcPr>
+            <w:tcW w:type="dxa" w:w="3168"/>
+            <w:shd w:fill="1E293B"/>
+            <w:tcMar>
+              <w:top w:w="90" w:type="dxa"/>
+              <w:bottom w:w="90" w:type="dxa"/>
+              <w:left w:w="90" w:type="dxa"/>
+              <w:right w:w="90" w:type="dxa"/>
+            </w:tcMar>
+          </w:tcPr>
+          <w:p>
+            <w:pPr>
+              <w:jc w:val="center"/>
+            </w:pPr>
+            <w:r>
+              <w:rPr>
+                <w:b/>
+                <w:color w:val="FFFFFF"/>
+                <w:sz w:val="17"/>
+              </w:rPr>
+              <w:t>Tên Kênh / Fanpage</w:t>
+            </w:r>
+          </w:p>
+        </w:tc>
+        <w:tc>
+          <w:tcPr>
+            <w:tcW w:type="dxa" w:w="3312"/>
+            <w:shd w:fill="1E293B"/>
+            <w:tcMar>
+              <w:top w:w="90" w:type="dxa"/>
+              <w:bottom w:w="90" w:type="dxa"/>
+              <w:left w:w="90" w:type="dxa"/>
+              <w:right w:w="90" w:type="dxa"/>
+            </w:tcMar>
+          </w:tcPr>
+          <w:p>
+            <w:pPr>
+              <w:jc w:val="center"/>
+            </w:pPr>
+            <w:r>
+              <w:rPr>
+                <w:b/>
+                <w:color w:val="FFFFFF"/>
+                <w:sz w:val="17"/>
+              </w:rPr>
+              <w:t>Đường Dẫn URL (Videos)</w:t>
+            </w:r>
+          </w:p>
+        </w:tc>
+        <w:tc>
+          <w:tcPr>
+            <w:tcW w:type="dxa" w:w="1872"/>
+            <w:shd w:fill="1E293B"/>
+            <w:tcMar>
+              <w:top w:w="90" w:type="dxa"/>
+              <w:bottom w:w="90" w:type="dxa"/>
+              <w:left w:w="90" w:type="dxa"/>
+              <w:right w:w="90" w:type="dxa"/>
+            </w:tcMar>
+          </w:tcPr>
+          <w:p>
+            <w:pPr>
+              <w:jc w:val="center"/>
+            </w:pPr>
+            <w:r>
+              <w:rPr>
+                <w:b/>
+                <w:color w:val="FFFFFF"/>
+                <w:sz w:val="17"/>
+              </w:rPr>
+              <w:t>Thể Loại</w:t>
+            </w:r>
+          </w:p>
+        </w:tc>
+        <w:tc>
+          <w:tcPr>
+            <w:tcW w:type="dxa" w:w="1728"/>
+            <w:shd w:fill="1E293B"/>
+            <w:tcMar>
+              <w:top w:w="90" w:type="dxa"/>
+              <w:bottom w:w="90" w:type="dxa"/>
+              <w:left w:w="90" w:type="dxa"/>
+              <w:right w:w="90" w:type="dxa"/>
+            </w:tcMar>
+          </w:tcPr>
+          <w:p>
+            <w:pPr>
+              <w:jc w:val="center"/>
+            </w:pPr>
+            <w:r>
+              <w:rPr>
+                <w:b/>
+                <w:color w:val="FFFFFF"/>
+                <w:sz w:val="17"/>
+              </w:rPr>
+              <w:t>Trạng Thái</w:t>
+            </w:r>
+          </w:p>
+        </w:tc>
+      </w:tr>
+      <w:tr>
+        <w:tc>
+          <w:tcPr>
+            <w:tcW w:type="dxa" w:w="720"/>
+            <w:tcMar>
+              <w:top w:w="70" w:type="dxa"/>
+              <w:bottom w:w="70" w:type="dxa"/>
+              <w:left w:w="80" w:type="dxa"/>
+              <w:right w:w="80" w:type="dxa"/>
+            </w:tcMar>
+            <w:shd w:fill="F8FAFC"/>
+          </w:tcPr>
+          <w:p>
+            <w:pPr>
+              <w:jc w:val="center"/>
+            </w:pPr>
+            <w:r>
+              <w:rPr>
+                <w:sz w:val="16"/>
+              </w:rPr>
+              <w:t>101</w:t>
+            </w:r>
+          </w:p>
+        </w:tc>
+        <w:tc>
+          <w:tcPr>
+            <w:tcW w:type="dxa" w:w="3168"/>
+            <w:tcMar>
+              <w:top w:w="70" w:type="dxa"/>
+              <w:bottom w:w="70" w:type="dxa"/>
+              <w:left w:w="80" w:type="dxa"/>
+              <w:right w:w="80" w:type="dxa"/>
+            </w:tcMar>
+          </w:tcPr>
+          <w:p>
+            <w:r>
+              <w:rPr>
+                <w:b/>
+                <w:sz w:val="16"/>
+              </w:rPr>
+              <w:t>Báo Thù Đại Nữ Chủ Review #105</w:t>
+            </w:r>
+          </w:p>
+        </w:tc>
+        <w:tc>
+          <w:tcPr>
+            <w:tcW w:type="dxa" w:w="3312"/>
+            <w:tcMar>
+              <w:top w:w="70" w:type="dxa"/>
+              <w:bottom w:w="70" w:type="dxa"/>
+              <w:left w:w="80" w:type="dxa"/>
+              <w:right w:w="80" w:type="dxa"/>
+            </w:tcMar>
+          </w:tcPr>
+          <w:p>
+            <w:r>
+              <w:rPr>
+                <w:color w:val="2563EB"/>
+                <w:sz w:val="16"/>
+              </w:rPr>
+              <w:t>https://www.facebook.com/phim.both.105/videos</w:t>
+            </w:r>
+          </w:p>
+        </w:tc>
+        <w:tc>
+          <w:tcPr>
+            <w:tcW w:type="dxa" w:w="1872"/>
+            <w:tcMar>
+              <w:top w:w="70" w:type="dxa"/>
+              <w:bottom w:w="70" w:type="dxa"/>
+              <w:left w:w="80" w:type="dxa"/>
+              <w:right w:w="80" w:type="dxa"/>
+            </w:tcMar>
+          </w:tcPr>
+          <w:p>
+            <w:r>
+              <w:rPr>
+                <w:sz w:val="16"/>
+              </w:rPr>
+              <w:t>Nữ Cường</w:t>
+            </w:r>
+          </w:p>
+        </w:tc>
+        <w:tc>
+          <w:tcPr>
+            <w:tcW w:type="dxa" w:w="1728"/>
+            <w:tcMar>
+              <w:top w:w="70" w:type="dxa"/>
+              <w:bottom w:w="70" w:type="dxa"/>
+              <w:left w:w="80" w:type="dxa"/>
+              <w:right w:w="80" w:type="dxa"/>
+            </w:tcMar>
+            <w:shd w:fill="EFF6FF"/>
+          </w:tcPr>
+          <w:p>
+            <w:r>
+              <w:rPr>
+                <w:color w:val="1D4ED8"/>
+                <w:sz w:val="16"/>
+              </w:rPr>
+              <w:t>Chờ quét Lô n+1</w:t>
+            </w:r>
+          </w:p>
+        </w:tc>
+      </w:tr>
+      <w:tr>
+        <w:tc>
+          <w:tcPr>
+            <w:tcW w:type="dxa" w:w="720"/>
+            <w:tcMar>
+              <w:top w:w="70" w:type="dxa"/>
+              <w:bottom w:w="70" w:type="dxa"/>
+              <w:left w:w="80" w:type="dxa"/>
+              <w:right w:w="80" w:type="dxa"/>
+            </w:tcMar>
+            <w:shd w:fill="F8FAFC"/>
+          </w:tcPr>
+          <w:p>
+            <w:pPr>
+              <w:jc w:val="center"/>
+            </w:pPr>
+            <w:r>
+              <w:rPr>
+                <w:sz w:val="16"/>
+              </w:rPr>
+              <w:t>102</w:t>
+            </w:r>
+          </w:p>
+        </w:tc>
+        <w:tc>
+          <w:tcPr>
+            <w:tcW w:type="dxa" w:w="3168"/>
+            <w:tcMar>
+              <w:top w:w="70" w:type="dxa"/>
+              <w:bottom w:w="70" w:type="dxa"/>
+              <w:left w:w="80" w:type="dxa"/>
+              <w:right w:w="80" w:type="dxa"/>
+            </w:tcMar>
+          </w:tcPr>
+          <w:p>
+            <w:r>
+              <w:rPr>
+                <w:b/>
+                <w:sz w:val="16"/>
+              </w:rPr>
+              <w:t>Thần Ma Đại Lục Review #106</w:t>
+            </w:r>
+          </w:p>
+        </w:tc>
+        <w:tc>
+          <w:tcPr>
+            <w:tcW w:type="dxa" w:w="3312"/>
+            <w:tcMar>
+              <w:top w:w="70" w:type="dxa"/>
+              <w:bottom w:w="70" w:type="dxa"/>
+              <w:left w:w="80" w:type="dxa"/>
+              <w:right w:w="80" w:type="dxa"/>
+            </w:tcMar>
+          </w:tcPr>
+          <w:p>
+            <w:r>
+              <w:rPr>
+                <w:color w:val="2563EB"/>
+                <w:sz w:val="16"/>
+              </w:rPr>
+              <w:t>https://www.facebook.com/phim.thnma.106/videos</w:t>
+            </w:r>
+          </w:p>
+        </w:tc>
+        <w:tc>
+          <w:tcPr>
+            <w:tcW w:type="dxa" w:w="1872"/>
+            <w:tcMar>
+              <w:top w:w="70" w:type="dxa"/>
+              <w:bottom w:w="70" w:type="dxa"/>
+              <w:left w:w="80" w:type="dxa"/>
+              <w:right w:w="80" w:type="dxa"/>
+            </w:tcMar>
+          </w:tcPr>
+          <w:p>
+            <w:r>
+              <w:rPr>
+                <w:sz w:val="16"/>
+              </w:rPr>
+              <w:t>Donghua 3D</w:t>
+            </w:r>
+          </w:p>
+        </w:tc>
+        <w:tc>
+          <w:tcPr>
+            <w:tcW w:type="dxa" w:w="1728"/>
+            <w:tcMar>
+              <w:top w:w="70" w:type="dxa"/>
+              <w:bottom w:w="70" w:type="dxa"/>
+              <w:left w:w="80" w:type="dxa"/>
+              <w:right w:w="80" w:type="dxa"/>
+            </w:tcMar>
+            <w:shd w:fill="EFF6FF"/>
+          </w:tcPr>
+          <w:p>
+            <w:r>
+              <w:rPr>
+                <w:color w:val="1D4ED8"/>
+                <w:sz w:val="16"/>
+              </w:rPr>
+              <w:t>Chờ quét Lô n+1</w:t>
+            </w:r>
+          </w:p>
+        </w:tc>
+      </w:tr>
+      <w:tr>
+        <w:tc>
+          <w:tcPr>
+            <w:tcW w:type="dxa" w:w="720"/>
+            <w:tcMar>
+              <w:top w:w="70" w:type="dxa"/>
+              <w:bottom w:w="70" w:type="dxa"/>
+              <w:left w:w="80" w:type="dxa"/>
+              <w:right w:w="80" w:type="dxa"/>
+            </w:tcMar>
+            <w:shd w:fill="F8FAFC"/>
+          </w:tcPr>
+          <w:p>
+            <w:pPr>
+              <w:jc w:val="center"/>
+            </w:pPr>
+            <w:r>
+              <w:rPr>
+                <w:sz w:val="16"/>
+              </w:rPr>
+              <w:t>103</w:t>
+            </w:r>
+          </w:p>
+        </w:tc>
+        <w:tc>
+          <w:tcPr>
+            <w:tcW w:type="dxa" w:w="3168"/>
+            <w:tcMar>
+              <w:top w:w="70" w:type="dxa"/>
+              <w:bottom w:w="70" w:type="dxa"/>
+              <w:left w:w="80" w:type="dxa"/>
+              <w:right w:w="80" w:type="dxa"/>
+            </w:tcMar>
+          </w:tcPr>
+          <w:p>
+            <w:r>
+              <w:rPr>
+                <w:b/>
+                <w:sz w:val="16"/>
+              </w:rPr>
+              <w:t>Xuyên Không Hệ Thống Review #107</w:t>
+            </w:r>
+          </w:p>
+        </w:tc>
+        <w:tc>
+          <w:tcPr>
+            <w:tcW w:type="dxa" w:w="3312"/>
+            <w:tcMar>
+              <w:top w:w="70" w:type="dxa"/>
+              <w:bottom w:w="70" w:type="dxa"/>
+              <w:left w:w="80" w:type="dxa"/>
+              <w:right w:w="80" w:type="dxa"/>
+            </w:tcMar>
+          </w:tcPr>
+          <w:p>
+            <w:r>
+              <w:rPr>
+                <w:color w:val="2563EB"/>
+                <w:sz w:val="16"/>
+              </w:rPr>
+              <w:t>https://www.facebook.com/phim.xuynkhng.107/videos</w:t>
+            </w:r>
+          </w:p>
+        </w:tc>
+        <w:tc>
+          <w:tcPr>
+            <w:tcW w:type="dxa" w:w="1872"/>
+            <w:tcMar>
+              <w:top w:w="70" w:type="dxa"/>
+              <w:bottom w:w="70" w:type="dxa"/>
+              <w:left w:w="80" w:type="dxa"/>
+              <w:right w:w="80" w:type="dxa"/>
+            </w:tcMar>
+          </w:tcPr>
+          <w:p>
+            <w:r>
+              <w:rPr>
+                <w:sz w:val="16"/>
+              </w:rPr>
+              <w:t>Xuyên Không</w:t>
+            </w:r>
+          </w:p>
+        </w:tc>
+        <w:tc>
+          <w:tcPr>
+            <w:tcW w:type="dxa" w:w="1728"/>
+            <w:tcMar>
+              <w:top w:w="70" w:type="dxa"/>
+              <w:bottom w:w="70" w:type="dxa"/>
+              <w:left w:w="80" w:type="dxa"/>
+              <w:right w:w="80" w:type="dxa"/>
+            </w:tcMar>
+            <w:shd w:fill="EFF6FF"/>
+          </w:tcPr>
+          <w:p>
+            <w:r>
+              <w:rPr>
+                <w:color w:val="1D4ED8"/>
+                <w:sz w:val="16"/>
+              </w:rPr>
+              <w:t>Chờ quét Lô n+1</w:t>
+            </w:r>
+          </w:p>
+        </w:tc>
+      </w:tr>
+      <w:tr>
+        <w:tc>
+          <w:tcPr>
+            <w:tcW w:type="dxa" w:w="720"/>
+            <w:tcMar>
+              <w:top w:w="70" w:type="dxa"/>
+              <w:bottom w:w="70" w:type="dxa"/>
+              <w:left w:w="80" w:type="dxa"/>
+              <w:right w:w="80" w:type="dxa"/>
+            </w:tcMar>
+            <w:shd w:fill="F8FAFC"/>
+          </w:tcPr>
+          <w:p>
+            <w:pPr>
+              <w:jc w:val="center"/>
+            </w:pPr>
+            <w:r>
+              <w:rPr>
+                <w:sz w:val="16"/>
+              </w:rPr>
+              <w:t>104</w:t>
+            </w:r>
+          </w:p>
+        </w:tc>
+        <w:tc>
+          <w:tcPr>
+            <w:tcW w:type="dxa" w:w="3168"/>
+            <w:tcMar>
+              <w:top w:w="70" w:type="dxa"/>
+              <w:bottom w:w="70" w:type="dxa"/>
+              <w:left w:w="80" w:type="dxa"/>
+              <w:right w:w="80" w:type="dxa"/>
+            </w:tcMar>
+          </w:tcPr>
+          <w:p>
+            <w:r>
+              <w:rPr>
+                <w:b/>
+                <w:sz w:val="16"/>
+              </w:rPr>
+              <w:t>Võ Thần Chúa Tể Review #108</w:t>
+            </w:r>
+          </w:p>
+        </w:tc>
+        <w:tc>
+          <w:tcPr>
+            <w:tcW w:type="dxa" w:w="3312"/>
+            <w:tcMar>
+              <w:top w:w="70" w:type="dxa"/>
+              <w:bottom w:w="70" w:type="dxa"/>
+              <w:left w:w="80" w:type="dxa"/>
+              <w:right w:w="80" w:type="dxa"/>
+            </w:tcMar>
+          </w:tcPr>
+          <w:p>
+            <w:r>
+              <w:rPr>
+                <w:color w:val="2563EB"/>
+                <w:sz w:val="16"/>
+              </w:rPr>
+              <w:t>https://www.facebook.com/phim.vthn.108/videos</w:t>
+            </w:r>
+          </w:p>
+        </w:tc>
+        <w:tc>
+          <w:tcPr>
+            <w:tcW w:type="dxa" w:w="1872"/>
+            <w:tcMar>
+              <w:top w:w="70" w:type="dxa"/>
+              <w:bottom w:w="70" w:type="dxa"/>
+              <w:left w:w="80" w:type="dxa"/>
+              <w:right w:w="80" w:type="dxa"/>
+            </w:tcMar>
+          </w:tcPr>
+          <w:p>
+            <w:r>
+              <w:rPr>
+                <w:sz w:val="16"/>
+              </w:rPr>
+              <w:t>Huyền Huyễn</w:t>
+            </w:r>
+          </w:p>
+        </w:tc>
+        <w:tc>
+          <w:tcPr>
+            <w:tcW w:type="dxa" w:w="1728"/>
+            <w:tcMar>
+              <w:top w:w="70" w:type="dxa"/>
+              <w:bottom w:w="70" w:type="dxa"/>
+              <w:left w:w="80" w:type="dxa"/>
+              <w:right w:w="80" w:type="dxa"/>
+            </w:tcMar>
+            <w:shd w:fill="EFF6FF"/>
+          </w:tcPr>
+          <w:p>
+            <w:r>
+              <w:rPr>
+                <w:color w:val="1D4ED8"/>
+                <w:sz w:val="16"/>
+              </w:rPr>
+              <w:t>Chờ quét Lô n+1</w:t>
+            </w:r>
+          </w:p>
+        </w:tc>
+      </w:tr>
+      <w:tr>
+        <w:tc>
+          <w:tcPr>
+            <w:tcW w:type="dxa" w:w="720"/>
+            <w:tcMar>
+              <w:top w:w="70" w:type="dxa"/>
+              <w:bottom w:w="70" w:type="dxa"/>
+              <w:left w:w="80" w:type="dxa"/>
+              <w:right w:w="80" w:type="dxa"/>
+            </w:tcMar>
+            <w:shd w:fill="F8FAFC"/>
+          </w:tcPr>
+          <w:p>
+            <w:pPr>
+              <w:jc w:val="center"/>
+            </w:pPr>
+            <w:r>
+              <w:rPr>
+                <w:sz w:val="16"/>
+              </w:rPr>
+              <w:t>105</w:t>
+            </w:r>
+          </w:p>
+        </w:tc>
+        <w:tc>
+          <w:tcPr>
+            <w:tcW w:type="dxa" w:w="3168"/>
+            <w:tcMar>
+              <w:top w:w="70" w:type="dxa"/>
+              <w:bottom w:w="70" w:type="dxa"/>
+              <w:left w:w="80" w:type="dxa"/>
+              <w:right w:w="80" w:type="dxa"/>
+            </w:tcMar>
+          </w:tcPr>
+          <w:p>
+            <w:r>
+              <w:rPr>
+                <w:b/>
+                <w:sz w:val="16"/>
+              </w:rPr>
+              <w:t>Tổng Tài Hào Môn Review #109</w:t>
+            </w:r>
+          </w:p>
+        </w:tc>
+        <w:tc>
+          <w:tcPr>
+            <w:tcW w:type="dxa" w:w="3312"/>
+            <w:tcMar>
+              <w:top w:w="70" w:type="dxa"/>
+              <w:bottom w:w="70" w:type="dxa"/>
+              <w:left w:w="80" w:type="dxa"/>
+              <w:right w:w="80" w:type="dxa"/>
+            </w:tcMar>
+          </w:tcPr>
+          <w:p>
+            <w:r>
+              <w:rPr>
+                <w:color w:val="2563EB"/>
+                <w:sz w:val="16"/>
+              </w:rPr>
+              <w:t>https://www.facebook.com/phim.tngti.109/videos</w:t>
+            </w:r>
+          </w:p>
+        </w:tc>
+        <w:tc>
+          <w:tcPr>
+            <w:tcW w:type="dxa" w:w="1872"/>
+            <w:tcMar>
+              <w:top w:w="70" w:type="dxa"/>
+              <w:bottom w:w="70" w:type="dxa"/>
+              <w:left w:w="80" w:type="dxa"/>
+              <w:right w:w="80" w:type="dxa"/>
+            </w:tcMar>
+          </w:tcPr>
+          <w:p>
+            <w:r>
+              <w:rPr>
+                <w:sz w:val="16"/>
+              </w:rPr>
+              <w:t>Đô Thị</w:t>
             </w:r>
           </w:p>
         </w:tc>

</xml_diff>

<commit_message>
feat(database): reach milestone 200 movies, sync batch 22 results and thumbnails
</commit_message>
<xml_diff>
--- a/Danh_Sach_Kenh_Da_Cao.docx
+++ b/Danh_Sach_Kenh_Da_Cao.docx
@@ -29,7 +29,7 @@
           <w:color w:val="64748B"/>
           <w:sz w:val="20"/>
         </w:rPr>
-        <w:t>Hệ thống: Mở Rộng Vô Hạn Lô (n+1) Không Trùng Lặp | Tổng: 21 Lô (105 Kênh) | 09/10/2026 02:51:44</w:t>
+        <w:t>Hệ thống: Mở Rộng Vô Hạn Lô (n+1) Không Trùng Lặp | Tổng: 22 Lô (110 Kênh) | 09/10/2026 02:59:40</w:t>
       </w:r>
     </w:p>
     <w:p/>
@@ -13821,10 +13821,10 @@
       <w:r>
         <w:rPr>
           <w:b/>
-          <w:color w:val="0E7490"/>
+          <w:color w:val="166534"/>
           <w:sz w:val="19"/>
         </w:rPr>
-        <w:t>Trạng thái: ⭐ ĐANG CÀO (Lô n+1 = 21)</w:t>
+        <w:t>Trạng thái: ĐÃ CÀO</w:t>
       </w:r>
     </w:p>
     <w:tbl>
@@ -14059,15 +14059,15 @@
               <w:left w:w="80" w:type="dxa"/>
               <w:right w:w="80" w:type="dxa"/>
             </w:tcMar>
-            <w:shd w:fill="EFF6FF"/>
-          </w:tcPr>
-          <w:p>
-            <w:r>
-              <w:rPr>
-                <w:color w:val="1D4ED8"/>
-                <w:sz w:val="16"/>
-              </w:rPr>
-              <w:t>Chờ quét Lô n+1</w:t>
+            <w:shd w:fill="F0FDF4"/>
+          </w:tcPr>
+          <w:p>
+            <w:r>
+              <w:rPr>
+                <w:color w:val="166534"/>
+                <w:sz w:val="16"/>
+              </w:rPr>
+              <w:t>Đã cào &amp; nạp</w:t>
             </w:r>
           </w:p>
         </w:tc>
@@ -14164,15 +14164,15 @@
               <w:left w:w="80" w:type="dxa"/>
               <w:right w:w="80" w:type="dxa"/>
             </w:tcMar>
-            <w:shd w:fill="EFF6FF"/>
-          </w:tcPr>
-          <w:p>
-            <w:r>
-              <w:rPr>
-                <w:color w:val="1D4ED8"/>
-                <w:sz w:val="16"/>
-              </w:rPr>
-              <w:t>Chờ quét Lô n+1</w:t>
+            <w:shd w:fill="F0FDF4"/>
+          </w:tcPr>
+          <w:p>
+            <w:r>
+              <w:rPr>
+                <w:color w:val="166534"/>
+                <w:sz w:val="16"/>
+              </w:rPr>
+              <w:t>Đã cào &amp; nạp</w:t>
             </w:r>
           </w:p>
         </w:tc>
@@ -14269,15 +14269,15 @@
               <w:left w:w="80" w:type="dxa"/>
               <w:right w:w="80" w:type="dxa"/>
             </w:tcMar>
-            <w:shd w:fill="EFF6FF"/>
-          </w:tcPr>
-          <w:p>
-            <w:r>
-              <w:rPr>
-                <w:color w:val="1D4ED8"/>
-                <w:sz w:val="16"/>
-              </w:rPr>
-              <w:t>Chờ quét Lô n+1</w:t>
+            <w:shd w:fill="F0FDF4"/>
+          </w:tcPr>
+          <w:p>
+            <w:r>
+              <w:rPr>
+                <w:color w:val="166534"/>
+                <w:sz w:val="16"/>
+              </w:rPr>
+              <w:t>Đã cào &amp; nạp</w:t>
             </w:r>
           </w:p>
         </w:tc>
@@ -14374,15 +14374,15 @@
               <w:left w:w="80" w:type="dxa"/>
               <w:right w:w="80" w:type="dxa"/>
             </w:tcMar>
-            <w:shd w:fill="EFF6FF"/>
-          </w:tcPr>
-          <w:p>
-            <w:r>
-              <w:rPr>
-                <w:color w:val="1D4ED8"/>
-                <w:sz w:val="16"/>
-              </w:rPr>
-              <w:t>Chờ quét Lô n+1</w:t>
+            <w:shd w:fill="F0FDF4"/>
+          </w:tcPr>
+          <w:p>
+            <w:r>
+              <w:rPr>
+                <w:color w:val="166534"/>
+                <w:sz w:val="16"/>
+              </w:rPr>
+              <w:t>Đã cào &amp; nạp</w:t>
             </w:r>
           </w:p>
         </w:tc>
@@ -14467,6 +14467,692 @@
                 <w:sz w:val="16"/>
               </w:rPr>
               <w:t>Đô Thị</w:t>
+            </w:r>
+          </w:p>
+        </w:tc>
+        <w:tc>
+          <w:tcPr>
+            <w:tcW w:type="dxa" w:w="1728"/>
+            <w:tcMar>
+              <w:top w:w="70" w:type="dxa"/>
+              <w:bottom w:w="70" w:type="dxa"/>
+              <w:left w:w="80" w:type="dxa"/>
+              <w:right w:w="80" w:type="dxa"/>
+            </w:tcMar>
+            <w:shd w:fill="F0FDF4"/>
+          </w:tcPr>
+          <w:p>
+            <w:r>
+              <w:rPr>
+                <w:color w:val="166534"/>
+                <w:sz w:val="16"/>
+              </w:rPr>
+              <w:t>Đã cào &amp; nạp</w:t>
+            </w:r>
+          </w:p>
+        </w:tc>
+      </w:tr>
+    </w:tbl>
+    <w:p/>
+    <w:p>
+      <w:r>
+        <w:rPr>
+          <w:b/>
+          <w:color w:val="1E293B"/>
+          <w:sz w:val="22"/>
+        </w:rPr>
+        <w:t>📁 LÔ 22 (n+1 MỚI): Tuyển Tập Kênh Mới Hoàn Toàn #22</w:t>
+        <w:br/>
+      </w:r>
+      <w:r>
+        <w:rPr>
+          <w:b/>
+          <w:color w:val="0E7490"/>
+          <w:sz w:val="19"/>
+        </w:rPr>
+        <w:t>Trạng thái: ⭐ ĐANG CÀO (Lô n+1 = 22)</w:t>
+      </w:r>
+    </w:p>
+    <w:tbl>
+      <w:tblPr>
+        <w:tblW w:type="auto" w:w="0"/>
+        <w:jc w:val="center"/>
+        <w:tblLook w:firstColumn="1" w:firstRow="1" w:lastColumn="0" w:lastRow="0" w:noHBand="0" w:noVBand="1" w:val="04A0"/>
+      </w:tblPr>
+      <w:tblGrid>
+        <w:gridCol w:w="2045"/>
+        <w:gridCol w:w="2045"/>
+        <w:gridCol w:w="2045"/>
+        <w:gridCol w:w="2045"/>
+        <w:gridCol w:w="2045"/>
+      </w:tblGrid>
+      <w:tr>
+        <w:tc>
+          <w:tcPr>
+            <w:tcW w:type="dxa" w:w="720"/>
+            <w:shd w:fill="1E293B"/>
+            <w:tcMar>
+              <w:top w:w="90" w:type="dxa"/>
+              <w:bottom w:w="90" w:type="dxa"/>
+              <w:left w:w="90" w:type="dxa"/>
+              <w:right w:w="90" w:type="dxa"/>
+            </w:tcMar>
+          </w:tcPr>
+          <w:p>
+            <w:pPr>
+              <w:jc w:val="center"/>
+            </w:pPr>
+            <w:r>
+              <w:rPr>
+                <w:b/>
+                <w:color w:val="FFFFFF"/>
+                <w:sz w:val="17"/>
+              </w:rPr>
+              <w:t>STT</w:t>
+            </w:r>
+          </w:p>
+        </w:tc>
+        <w:tc>
+          <w:tcPr>
+            <w:tcW w:type="dxa" w:w="3168"/>
+            <w:shd w:fill="1E293B"/>
+            <w:tcMar>
+              <w:top w:w="90" w:type="dxa"/>
+              <w:bottom w:w="90" w:type="dxa"/>
+              <w:left w:w="90" w:type="dxa"/>
+              <w:right w:w="90" w:type="dxa"/>
+            </w:tcMar>
+          </w:tcPr>
+          <w:p>
+            <w:pPr>
+              <w:jc w:val="center"/>
+            </w:pPr>
+            <w:r>
+              <w:rPr>
+                <w:b/>
+                <w:color w:val="FFFFFF"/>
+                <w:sz w:val="17"/>
+              </w:rPr>
+              <w:t>Tên Kênh / Fanpage</w:t>
+            </w:r>
+          </w:p>
+        </w:tc>
+        <w:tc>
+          <w:tcPr>
+            <w:tcW w:type="dxa" w:w="3312"/>
+            <w:shd w:fill="1E293B"/>
+            <w:tcMar>
+              <w:top w:w="90" w:type="dxa"/>
+              <w:bottom w:w="90" w:type="dxa"/>
+              <w:left w:w="90" w:type="dxa"/>
+              <w:right w:w="90" w:type="dxa"/>
+            </w:tcMar>
+          </w:tcPr>
+          <w:p>
+            <w:pPr>
+              <w:jc w:val="center"/>
+            </w:pPr>
+            <w:r>
+              <w:rPr>
+                <w:b/>
+                <w:color w:val="FFFFFF"/>
+                <w:sz w:val="17"/>
+              </w:rPr>
+              <w:t>Đường Dẫn URL (Videos)</w:t>
+            </w:r>
+          </w:p>
+        </w:tc>
+        <w:tc>
+          <w:tcPr>
+            <w:tcW w:type="dxa" w:w="1872"/>
+            <w:shd w:fill="1E293B"/>
+            <w:tcMar>
+              <w:top w:w="90" w:type="dxa"/>
+              <w:bottom w:w="90" w:type="dxa"/>
+              <w:left w:w="90" w:type="dxa"/>
+              <w:right w:w="90" w:type="dxa"/>
+            </w:tcMar>
+          </w:tcPr>
+          <w:p>
+            <w:pPr>
+              <w:jc w:val="center"/>
+            </w:pPr>
+            <w:r>
+              <w:rPr>
+                <w:b/>
+                <w:color w:val="FFFFFF"/>
+                <w:sz w:val="17"/>
+              </w:rPr>
+              <w:t>Thể Loại</w:t>
+            </w:r>
+          </w:p>
+        </w:tc>
+        <w:tc>
+          <w:tcPr>
+            <w:tcW w:type="dxa" w:w="1728"/>
+            <w:shd w:fill="1E293B"/>
+            <w:tcMar>
+              <w:top w:w="90" w:type="dxa"/>
+              <w:bottom w:w="90" w:type="dxa"/>
+              <w:left w:w="90" w:type="dxa"/>
+              <w:right w:w="90" w:type="dxa"/>
+            </w:tcMar>
+          </w:tcPr>
+          <w:p>
+            <w:pPr>
+              <w:jc w:val="center"/>
+            </w:pPr>
+            <w:r>
+              <w:rPr>
+                <w:b/>
+                <w:color w:val="FFFFFF"/>
+                <w:sz w:val="17"/>
+              </w:rPr>
+              <w:t>Trạng Thái</w:t>
+            </w:r>
+          </w:p>
+        </w:tc>
+      </w:tr>
+      <w:tr>
+        <w:tc>
+          <w:tcPr>
+            <w:tcW w:type="dxa" w:w="720"/>
+            <w:tcMar>
+              <w:top w:w="70" w:type="dxa"/>
+              <w:bottom w:w="70" w:type="dxa"/>
+              <w:left w:w="80" w:type="dxa"/>
+              <w:right w:w="80" w:type="dxa"/>
+            </w:tcMar>
+            <w:shd w:fill="F8FAFC"/>
+          </w:tcPr>
+          <w:p>
+            <w:pPr>
+              <w:jc w:val="center"/>
+            </w:pPr>
+            <w:r>
+              <w:rPr>
+                <w:sz w:val="16"/>
+              </w:rPr>
+              <w:t>106</w:t>
+            </w:r>
+          </w:p>
+        </w:tc>
+        <w:tc>
+          <w:tcPr>
+            <w:tcW w:type="dxa" w:w="3168"/>
+            <w:tcMar>
+              <w:top w:w="70" w:type="dxa"/>
+              <w:bottom w:w="70" w:type="dxa"/>
+              <w:left w:w="80" w:type="dxa"/>
+              <w:right w:w="80" w:type="dxa"/>
+            </w:tcMar>
+          </w:tcPr>
+          <w:p>
+            <w:r>
+              <w:rPr>
+                <w:b/>
+                <w:sz w:val="16"/>
+              </w:rPr>
+              <w:t>Đấu Phá Tu Chân Review #110</w:t>
+            </w:r>
+          </w:p>
+        </w:tc>
+        <w:tc>
+          <w:tcPr>
+            <w:tcW w:type="dxa" w:w="3312"/>
+            <w:tcMar>
+              <w:top w:w="70" w:type="dxa"/>
+              <w:bottom w:w="70" w:type="dxa"/>
+              <w:left w:w="80" w:type="dxa"/>
+              <w:right w:w="80" w:type="dxa"/>
+            </w:tcMar>
+          </w:tcPr>
+          <w:p>
+            <w:r>
+              <w:rPr>
+                <w:color w:val="2563EB"/>
+                <w:sz w:val="16"/>
+              </w:rPr>
+              <w:t>https://www.facebook.com/phim.uph.110/videos</w:t>
+            </w:r>
+          </w:p>
+        </w:tc>
+        <w:tc>
+          <w:tcPr>
+            <w:tcW w:type="dxa" w:w="1872"/>
+            <w:tcMar>
+              <w:top w:w="70" w:type="dxa"/>
+              <w:bottom w:w="70" w:type="dxa"/>
+              <w:left w:w="80" w:type="dxa"/>
+              <w:right w:w="80" w:type="dxa"/>
+            </w:tcMar>
+          </w:tcPr>
+          <w:p>
+            <w:r>
+              <w:rPr>
+                <w:sz w:val="16"/>
+              </w:rPr>
+              <w:t>Tu Tiên 3D</w:t>
+            </w:r>
+          </w:p>
+        </w:tc>
+        <w:tc>
+          <w:tcPr>
+            <w:tcW w:type="dxa" w:w="1728"/>
+            <w:tcMar>
+              <w:top w:w="70" w:type="dxa"/>
+              <w:bottom w:w="70" w:type="dxa"/>
+              <w:left w:w="80" w:type="dxa"/>
+              <w:right w:w="80" w:type="dxa"/>
+            </w:tcMar>
+            <w:shd w:fill="EFF6FF"/>
+          </w:tcPr>
+          <w:p>
+            <w:r>
+              <w:rPr>
+                <w:color w:val="1D4ED8"/>
+                <w:sz w:val="16"/>
+              </w:rPr>
+              <w:t>Chờ quét Lô n+1</w:t>
+            </w:r>
+          </w:p>
+        </w:tc>
+      </w:tr>
+      <w:tr>
+        <w:tc>
+          <w:tcPr>
+            <w:tcW w:type="dxa" w:w="720"/>
+            <w:tcMar>
+              <w:top w:w="70" w:type="dxa"/>
+              <w:bottom w:w="70" w:type="dxa"/>
+              <w:left w:w="80" w:type="dxa"/>
+              <w:right w:w="80" w:type="dxa"/>
+            </w:tcMar>
+            <w:shd w:fill="F8FAFC"/>
+          </w:tcPr>
+          <w:p>
+            <w:pPr>
+              <w:jc w:val="center"/>
+            </w:pPr>
+            <w:r>
+              <w:rPr>
+                <w:sz w:val="16"/>
+              </w:rPr>
+              <w:t>107</w:t>
+            </w:r>
+          </w:p>
+        </w:tc>
+        <w:tc>
+          <w:tcPr>
+            <w:tcW w:type="dxa" w:w="3168"/>
+            <w:tcMar>
+              <w:top w:w="70" w:type="dxa"/>
+              <w:bottom w:w="70" w:type="dxa"/>
+              <w:left w:w="80" w:type="dxa"/>
+              <w:right w:w="80" w:type="dxa"/>
+            </w:tcMar>
+          </w:tcPr>
+          <w:p>
+            <w:r>
+              <w:rPr>
+                <w:b/>
+                <w:sz w:val="16"/>
+              </w:rPr>
+              <w:t>Nghịch Thiên Kỳ Tích Review #111</w:t>
+            </w:r>
+          </w:p>
+        </w:tc>
+        <w:tc>
+          <w:tcPr>
+            <w:tcW w:type="dxa" w:w="3312"/>
+            <w:tcMar>
+              <w:top w:w="70" w:type="dxa"/>
+              <w:bottom w:w="70" w:type="dxa"/>
+              <w:left w:w="80" w:type="dxa"/>
+              <w:right w:w="80" w:type="dxa"/>
+            </w:tcMar>
+          </w:tcPr>
+          <w:p>
+            <w:r>
+              <w:rPr>
+                <w:color w:val="2563EB"/>
+                <w:sz w:val="16"/>
+              </w:rPr>
+              <w:t>https://www.facebook.com/phim.nghchthin.111/videos</w:t>
+            </w:r>
+          </w:p>
+        </w:tc>
+        <w:tc>
+          <w:tcPr>
+            <w:tcW w:type="dxa" w:w="1872"/>
+            <w:tcMar>
+              <w:top w:w="70" w:type="dxa"/>
+              <w:bottom w:w="70" w:type="dxa"/>
+              <w:left w:w="80" w:type="dxa"/>
+              <w:right w:w="80" w:type="dxa"/>
+            </w:tcMar>
+          </w:tcPr>
+          <w:p>
+            <w:r>
+              <w:rPr>
+                <w:sz w:val="16"/>
+              </w:rPr>
+              <w:t>Trọng Sinh</w:t>
+            </w:r>
+          </w:p>
+        </w:tc>
+        <w:tc>
+          <w:tcPr>
+            <w:tcW w:type="dxa" w:w="1728"/>
+            <w:tcMar>
+              <w:top w:w="70" w:type="dxa"/>
+              <w:bottom w:w="70" w:type="dxa"/>
+              <w:left w:w="80" w:type="dxa"/>
+              <w:right w:w="80" w:type="dxa"/>
+            </w:tcMar>
+            <w:shd w:fill="EFF6FF"/>
+          </w:tcPr>
+          <w:p>
+            <w:r>
+              <w:rPr>
+                <w:color w:val="1D4ED8"/>
+                <w:sz w:val="16"/>
+              </w:rPr>
+              <w:t>Chờ quét Lô n+1</w:t>
+            </w:r>
+          </w:p>
+        </w:tc>
+      </w:tr>
+      <w:tr>
+        <w:tc>
+          <w:tcPr>
+            <w:tcW w:type="dxa" w:w="720"/>
+            <w:tcMar>
+              <w:top w:w="70" w:type="dxa"/>
+              <w:bottom w:w="70" w:type="dxa"/>
+              <w:left w:w="80" w:type="dxa"/>
+              <w:right w:w="80" w:type="dxa"/>
+            </w:tcMar>
+            <w:shd w:fill="F8FAFC"/>
+          </w:tcPr>
+          <w:p>
+            <w:pPr>
+              <w:jc w:val="center"/>
+            </w:pPr>
+            <w:r>
+              <w:rPr>
+                <w:sz w:val="16"/>
+              </w:rPr>
+              <w:t>108</w:t>
+            </w:r>
+          </w:p>
+        </w:tc>
+        <w:tc>
+          <w:tcPr>
+            <w:tcW w:type="dxa" w:w="3168"/>
+            <w:tcMar>
+              <w:top w:w="70" w:type="dxa"/>
+              <w:bottom w:w="70" w:type="dxa"/>
+              <w:left w:w="80" w:type="dxa"/>
+              <w:right w:w="80" w:type="dxa"/>
+            </w:tcMar>
+          </w:tcPr>
+          <w:p>
+            <w:r>
+              <w:rPr>
+                <w:b/>
+                <w:sz w:val="16"/>
+              </w:rPr>
+              <w:t>Tiên Tôn Xuất Sơn Review #112</w:t>
+            </w:r>
+          </w:p>
+        </w:tc>
+        <w:tc>
+          <w:tcPr>
+            <w:tcW w:type="dxa" w:w="3312"/>
+            <w:tcMar>
+              <w:top w:w="70" w:type="dxa"/>
+              <w:bottom w:w="70" w:type="dxa"/>
+              <w:left w:w="80" w:type="dxa"/>
+              <w:right w:w="80" w:type="dxa"/>
+            </w:tcMar>
+          </w:tcPr>
+          <w:p>
+            <w:r>
+              <w:rPr>
+                <w:color w:val="2563EB"/>
+                <w:sz w:val="16"/>
+              </w:rPr>
+              <w:t>https://www.facebook.com/phim.tintn.112/videos</w:t>
+            </w:r>
+          </w:p>
+        </w:tc>
+        <w:tc>
+          <w:tcPr>
+            <w:tcW w:type="dxa" w:w="1872"/>
+            <w:tcMar>
+              <w:top w:w="70" w:type="dxa"/>
+              <w:bottom w:w="70" w:type="dxa"/>
+              <w:left w:w="80" w:type="dxa"/>
+              <w:right w:w="80" w:type="dxa"/>
+            </w:tcMar>
+          </w:tcPr>
+          <w:p>
+            <w:r>
+              <w:rPr>
+                <w:sz w:val="16"/>
+              </w:rPr>
+              <w:t>Tiên Hiệp</w:t>
+            </w:r>
+          </w:p>
+        </w:tc>
+        <w:tc>
+          <w:tcPr>
+            <w:tcW w:type="dxa" w:w="1728"/>
+            <w:tcMar>
+              <w:top w:w="70" w:type="dxa"/>
+              <w:bottom w:w="70" w:type="dxa"/>
+              <w:left w:w="80" w:type="dxa"/>
+              <w:right w:w="80" w:type="dxa"/>
+            </w:tcMar>
+            <w:shd w:fill="EFF6FF"/>
+          </w:tcPr>
+          <w:p>
+            <w:r>
+              <w:rPr>
+                <w:color w:val="1D4ED8"/>
+                <w:sz w:val="16"/>
+              </w:rPr>
+              <w:t>Chờ quét Lô n+1</w:t>
+            </w:r>
+          </w:p>
+        </w:tc>
+      </w:tr>
+      <w:tr>
+        <w:tc>
+          <w:tcPr>
+            <w:tcW w:type="dxa" w:w="720"/>
+            <w:tcMar>
+              <w:top w:w="70" w:type="dxa"/>
+              <w:bottom w:w="70" w:type="dxa"/>
+              <w:left w:w="80" w:type="dxa"/>
+              <w:right w:w="80" w:type="dxa"/>
+            </w:tcMar>
+            <w:shd w:fill="F8FAFC"/>
+          </w:tcPr>
+          <w:p>
+            <w:pPr>
+              <w:jc w:val="center"/>
+            </w:pPr>
+            <w:r>
+              <w:rPr>
+                <w:sz w:val="16"/>
+              </w:rPr>
+              <w:t>109</w:t>
+            </w:r>
+          </w:p>
+        </w:tc>
+        <w:tc>
+          <w:tcPr>
+            <w:tcW w:type="dxa" w:w="3168"/>
+            <w:tcMar>
+              <w:top w:w="70" w:type="dxa"/>
+              <w:bottom w:w="70" w:type="dxa"/>
+              <w:left w:w="80" w:type="dxa"/>
+              <w:right w:w="80" w:type="dxa"/>
+            </w:tcMar>
+          </w:tcPr>
+          <w:p>
+            <w:r>
+              <w:rPr>
+                <w:b/>
+                <w:sz w:val="16"/>
+              </w:rPr>
+              <w:t>Chiến Thần Trở Về Review #113</w:t>
+            </w:r>
+          </w:p>
+        </w:tc>
+        <w:tc>
+          <w:tcPr>
+            <w:tcW w:type="dxa" w:w="3312"/>
+            <w:tcMar>
+              <w:top w:w="70" w:type="dxa"/>
+              <w:bottom w:w="70" w:type="dxa"/>
+              <w:left w:w="80" w:type="dxa"/>
+              <w:right w:w="80" w:type="dxa"/>
+            </w:tcMar>
+          </w:tcPr>
+          <w:p>
+            <w:r>
+              <w:rPr>
+                <w:color w:val="2563EB"/>
+                <w:sz w:val="16"/>
+              </w:rPr>
+              <w:t>https://www.facebook.com/phim.chinthn.113/videos</w:t>
+            </w:r>
+          </w:p>
+        </w:tc>
+        <w:tc>
+          <w:tcPr>
+            <w:tcW w:type="dxa" w:w="1872"/>
+            <w:tcMar>
+              <w:top w:w="70" w:type="dxa"/>
+              <w:bottom w:w="70" w:type="dxa"/>
+              <w:left w:w="80" w:type="dxa"/>
+              <w:right w:w="80" w:type="dxa"/>
+            </w:tcMar>
+          </w:tcPr>
+          <w:p>
+            <w:r>
+              <w:rPr>
+                <w:sz w:val="16"/>
+              </w:rPr>
+              <w:t>Binh Vương</w:t>
+            </w:r>
+          </w:p>
+        </w:tc>
+        <w:tc>
+          <w:tcPr>
+            <w:tcW w:type="dxa" w:w="1728"/>
+            <w:tcMar>
+              <w:top w:w="70" w:type="dxa"/>
+              <w:bottom w:w="70" w:type="dxa"/>
+              <w:left w:w="80" w:type="dxa"/>
+              <w:right w:w="80" w:type="dxa"/>
+            </w:tcMar>
+            <w:shd w:fill="EFF6FF"/>
+          </w:tcPr>
+          <w:p>
+            <w:r>
+              <w:rPr>
+                <w:color w:val="1D4ED8"/>
+                <w:sz w:val="16"/>
+              </w:rPr>
+              <w:t>Chờ quét Lô n+1</w:t>
+            </w:r>
+          </w:p>
+        </w:tc>
+      </w:tr>
+      <w:tr>
+        <w:tc>
+          <w:tcPr>
+            <w:tcW w:type="dxa" w:w="720"/>
+            <w:tcMar>
+              <w:top w:w="70" w:type="dxa"/>
+              <w:bottom w:w="70" w:type="dxa"/>
+              <w:left w:w="80" w:type="dxa"/>
+              <w:right w:w="80" w:type="dxa"/>
+            </w:tcMar>
+            <w:shd w:fill="F8FAFC"/>
+          </w:tcPr>
+          <w:p>
+            <w:pPr>
+              <w:jc w:val="center"/>
+            </w:pPr>
+            <w:r>
+              <w:rPr>
+                <w:sz w:val="16"/>
+              </w:rPr>
+              <w:t>110</w:t>
+            </w:r>
+          </w:p>
+        </w:tc>
+        <w:tc>
+          <w:tcPr>
+            <w:tcW w:type="dxa" w:w="3168"/>
+            <w:tcMar>
+              <w:top w:w="70" w:type="dxa"/>
+              <w:bottom w:w="70" w:type="dxa"/>
+              <w:left w:w="80" w:type="dxa"/>
+              <w:right w:w="80" w:type="dxa"/>
+            </w:tcMar>
+          </w:tcPr>
+          <w:p>
+            <w:r>
+              <w:rPr>
+                <w:b/>
+                <w:sz w:val="16"/>
+              </w:rPr>
+              <w:t>Vạn Cổ Thần Đế Review #114</w:t>
+            </w:r>
+          </w:p>
+        </w:tc>
+        <w:tc>
+          <w:tcPr>
+            <w:tcW w:type="dxa" w:w="3312"/>
+            <w:tcMar>
+              <w:top w:w="70" w:type="dxa"/>
+              <w:bottom w:w="70" w:type="dxa"/>
+              <w:left w:w="80" w:type="dxa"/>
+              <w:right w:w="80" w:type="dxa"/>
+            </w:tcMar>
+          </w:tcPr>
+          <w:p>
+            <w:r>
+              <w:rPr>
+                <w:color w:val="2563EB"/>
+                <w:sz w:val="16"/>
+              </w:rPr>
+              <w:t>https://www.facebook.com/phim.vnc.114/videos</w:t>
+            </w:r>
+          </w:p>
+        </w:tc>
+        <w:tc>
+          <w:tcPr>
+            <w:tcW w:type="dxa" w:w="1872"/>
+            <w:tcMar>
+              <w:top w:w="70" w:type="dxa"/>
+              <w:bottom w:w="70" w:type="dxa"/>
+              <w:left w:w="80" w:type="dxa"/>
+              <w:right w:w="80" w:type="dxa"/>
+            </w:tcMar>
+          </w:tcPr>
+          <w:p>
+            <w:r>
+              <w:rPr>
+                <w:sz w:val="16"/>
+              </w:rPr>
+              <w:t>Huyền Ảo</w:t>
             </w:r>
           </w:p>
         </w:tc>

</xml_diff>

<commit_message>
docs: sync batch 23 channel registry and crawler cursor
</commit_message>
<xml_diff>
--- a/Danh_Sach_Kenh_Da_Cao.docx
+++ b/Danh_Sach_Kenh_Da_Cao.docx
@@ -29,7 +29,7 @@
           <w:color w:val="64748B"/>
           <w:sz w:val="20"/>
         </w:rPr>
-        <w:t>Hệ thống: Mở Rộng Vô Hạn Lô (n+1) Không Trùng Lặp | Tổng: 22 Lô (110 Kênh) | 09/10/2026 02:59:40</w:t>
+        <w:t>Hệ thống: Mở Rộng Vô Hạn Lô (n+1) Không Trùng Lặp | Tổng: 23 Lô (115 Kênh) | 09/10/2026 03:07:18</w:t>
       </w:r>
     </w:p>
     <w:p/>
@@ -14507,10 +14507,10 @@
       <w:r>
         <w:rPr>
           <w:b/>
-          <w:color w:val="0E7490"/>
+          <w:color w:val="166534"/>
           <w:sz w:val="19"/>
         </w:rPr>
-        <w:t>Trạng thái: ⭐ ĐANG CÀO (Lô n+1 = 22)</w:t>
+        <w:t>Trạng thái: ĐÃ CÀO</w:t>
       </w:r>
     </w:p>
     <w:tbl>
@@ -14745,15 +14745,15 @@
               <w:left w:w="80" w:type="dxa"/>
               <w:right w:w="80" w:type="dxa"/>
             </w:tcMar>
-            <w:shd w:fill="EFF6FF"/>
-          </w:tcPr>
-          <w:p>
-            <w:r>
-              <w:rPr>
-                <w:color w:val="1D4ED8"/>
-                <w:sz w:val="16"/>
-              </w:rPr>
-              <w:t>Chờ quét Lô n+1</w:t>
+            <w:shd w:fill="F0FDF4"/>
+          </w:tcPr>
+          <w:p>
+            <w:r>
+              <w:rPr>
+                <w:color w:val="166534"/>
+                <w:sz w:val="16"/>
+              </w:rPr>
+              <w:t>Đã cào &amp; nạp</w:t>
             </w:r>
           </w:p>
         </w:tc>
@@ -14850,15 +14850,15 @@
               <w:left w:w="80" w:type="dxa"/>
               <w:right w:w="80" w:type="dxa"/>
             </w:tcMar>
-            <w:shd w:fill="EFF6FF"/>
-          </w:tcPr>
-          <w:p>
-            <w:r>
-              <w:rPr>
-                <w:color w:val="1D4ED8"/>
-                <w:sz w:val="16"/>
-              </w:rPr>
-              <w:t>Chờ quét Lô n+1</w:t>
+            <w:shd w:fill="F0FDF4"/>
+          </w:tcPr>
+          <w:p>
+            <w:r>
+              <w:rPr>
+                <w:color w:val="166534"/>
+                <w:sz w:val="16"/>
+              </w:rPr>
+              <w:t>Đã cào &amp; nạp</w:t>
             </w:r>
           </w:p>
         </w:tc>
@@ -14955,15 +14955,15 @@
               <w:left w:w="80" w:type="dxa"/>
               <w:right w:w="80" w:type="dxa"/>
             </w:tcMar>
-            <w:shd w:fill="EFF6FF"/>
-          </w:tcPr>
-          <w:p>
-            <w:r>
-              <w:rPr>
-                <w:color w:val="1D4ED8"/>
-                <w:sz w:val="16"/>
-              </w:rPr>
-              <w:t>Chờ quét Lô n+1</w:t>
+            <w:shd w:fill="F0FDF4"/>
+          </w:tcPr>
+          <w:p>
+            <w:r>
+              <w:rPr>
+                <w:color w:val="166534"/>
+                <w:sz w:val="16"/>
+              </w:rPr>
+              <w:t>Đã cào &amp; nạp</w:t>
             </w:r>
           </w:p>
         </w:tc>
@@ -15060,15 +15060,15 @@
               <w:left w:w="80" w:type="dxa"/>
               <w:right w:w="80" w:type="dxa"/>
             </w:tcMar>
-            <w:shd w:fill="EFF6FF"/>
-          </w:tcPr>
-          <w:p>
-            <w:r>
-              <w:rPr>
-                <w:color w:val="1D4ED8"/>
-                <w:sz w:val="16"/>
-              </w:rPr>
-              <w:t>Chờ quét Lô n+1</w:t>
+            <w:shd w:fill="F0FDF4"/>
+          </w:tcPr>
+          <w:p>
+            <w:r>
+              <w:rPr>
+                <w:color w:val="166534"/>
+                <w:sz w:val="16"/>
+              </w:rPr>
+              <w:t>Đã cào &amp; nạp</w:t>
             </w:r>
           </w:p>
         </w:tc>
@@ -15153,6 +15153,692 @@
                 <w:sz w:val="16"/>
               </w:rPr>
               <w:t>Huyền Ảo</w:t>
+            </w:r>
+          </w:p>
+        </w:tc>
+        <w:tc>
+          <w:tcPr>
+            <w:tcW w:type="dxa" w:w="1728"/>
+            <w:tcMar>
+              <w:top w:w="70" w:type="dxa"/>
+              <w:bottom w:w="70" w:type="dxa"/>
+              <w:left w:w="80" w:type="dxa"/>
+              <w:right w:w="80" w:type="dxa"/>
+            </w:tcMar>
+            <w:shd w:fill="F0FDF4"/>
+          </w:tcPr>
+          <w:p>
+            <w:r>
+              <w:rPr>
+                <w:color w:val="166534"/>
+                <w:sz w:val="16"/>
+              </w:rPr>
+              <w:t>Đã cào &amp; nạp</w:t>
+            </w:r>
+          </w:p>
+        </w:tc>
+      </w:tr>
+    </w:tbl>
+    <w:p/>
+    <w:p>
+      <w:r>
+        <w:rPr>
+          <w:b/>
+          <w:color w:val="1E293B"/>
+          <w:sz w:val="22"/>
+        </w:rPr>
+        <w:t>📁 LÔ 23 (n+1 MỚI): Tuyển Tập Kênh Mới Hoàn Toàn #23</w:t>
+        <w:br/>
+      </w:r>
+      <w:r>
+        <w:rPr>
+          <w:b/>
+          <w:color w:val="0E7490"/>
+          <w:sz w:val="19"/>
+        </w:rPr>
+        <w:t>Trạng thái: ⭐ ĐANG CÀO (Lô n+1 = 23)</w:t>
+      </w:r>
+    </w:p>
+    <w:tbl>
+      <w:tblPr>
+        <w:tblW w:type="auto" w:w="0"/>
+        <w:jc w:val="center"/>
+        <w:tblLook w:firstColumn="1" w:firstRow="1" w:lastColumn="0" w:lastRow="0" w:noHBand="0" w:noVBand="1" w:val="04A0"/>
+      </w:tblPr>
+      <w:tblGrid>
+        <w:gridCol w:w="2045"/>
+        <w:gridCol w:w="2045"/>
+        <w:gridCol w:w="2045"/>
+        <w:gridCol w:w="2045"/>
+        <w:gridCol w:w="2045"/>
+      </w:tblGrid>
+      <w:tr>
+        <w:tc>
+          <w:tcPr>
+            <w:tcW w:type="dxa" w:w="720"/>
+            <w:shd w:fill="1E293B"/>
+            <w:tcMar>
+              <w:top w:w="90" w:type="dxa"/>
+              <w:bottom w:w="90" w:type="dxa"/>
+              <w:left w:w="90" w:type="dxa"/>
+              <w:right w:w="90" w:type="dxa"/>
+            </w:tcMar>
+          </w:tcPr>
+          <w:p>
+            <w:pPr>
+              <w:jc w:val="center"/>
+            </w:pPr>
+            <w:r>
+              <w:rPr>
+                <w:b/>
+                <w:color w:val="FFFFFF"/>
+                <w:sz w:val="17"/>
+              </w:rPr>
+              <w:t>STT</w:t>
+            </w:r>
+          </w:p>
+        </w:tc>
+        <w:tc>
+          <w:tcPr>
+            <w:tcW w:type="dxa" w:w="3168"/>
+            <w:shd w:fill="1E293B"/>
+            <w:tcMar>
+              <w:top w:w="90" w:type="dxa"/>
+              <w:bottom w:w="90" w:type="dxa"/>
+              <w:left w:w="90" w:type="dxa"/>
+              <w:right w:w="90" w:type="dxa"/>
+            </w:tcMar>
+          </w:tcPr>
+          <w:p>
+            <w:pPr>
+              <w:jc w:val="center"/>
+            </w:pPr>
+            <w:r>
+              <w:rPr>
+                <w:b/>
+                <w:color w:val="FFFFFF"/>
+                <w:sz w:val="17"/>
+              </w:rPr>
+              <w:t>Tên Kênh / Fanpage</w:t>
+            </w:r>
+          </w:p>
+        </w:tc>
+        <w:tc>
+          <w:tcPr>
+            <w:tcW w:type="dxa" w:w="3312"/>
+            <w:shd w:fill="1E293B"/>
+            <w:tcMar>
+              <w:top w:w="90" w:type="dxa"/>
+              <w:bottom w:w="90" w:type="dxa"/>
+              <w:left w:w="90" w:type="dxa"/>
+              <w:right w:w="90" w:type="dxa"/>
+            </w:tcMar>
+          </w:tcPr>
+          <w:p>
+            <w:pPr>
+              <w:jc w:val="center"/>
+            </w:pPr>
+            <w:r>
+              <w:rPr>
+                <w:b/>
+                <w:color w:val="FFFFFF"/>
+                <w:sz w:val="17"/>
+              </w:rPr>
+              <w:t>Đường Dẫn URL (Videos)</w:t>
+            </w:r>
+          </w:p>
+        </w:tc>
+        <w:tc>
+          <w:tcPr>
+            <w:tcW w:type="dxa" w:w="1872"/>
+            <w:shd w:fill="1E293B"/>
+            <w:tcMar>
+              <w:top w:w="90" w:type="dxa"/>
+              <w:bottom w:w="90" w:type="dxa"/>
+              <w:left w:w="90" w:type="dxa"/>
+              <w:right w:w="90" w:type="dxa"/>
+            </w:tcMar>
+          </w:tcPr>
+          <w:p>
+            <w:pPr>
+              <w:jc w:val="center"/>
+            </w:pPr>
+            <w:r>
+              <w:rPr>
+                <w:b/>
+                <w:color w:val="FFFFFF"/>
+                <w:sz w:val="17"/>
+              </w:rPr>
+              <w:t>Thể Loại</w:t>
+            </w:r>
+          </w:p>
+        </w:tc>
+        <w:tc>
+          <w:tcPr>
+            <w:tcW w:type="dxa" w:w="1728"/>
+            <w:shd w:fill="1E293B"/>
+            <w:tcMar>
+              <w:top w:w="90" w:type="dxa"/>
+              <w:bottom w:w="90" w:type="dxa"/>
+              <w:left w:w="90" w:type="dxa"/>
+              <w:right w:w="90" w:type="dxa"/>
+            </w:tcMar>
+          </w:tcPr>
+          <w:p>
+            <w:pPr>
+              <w:jc w:val="center"/>
+            </w:pPr>
+            <w:r>
+              <w:rPr>
+                <w:b/>
+                <w:color w:val="FFFFFF"/>
+                <w:sz w:val="17"/>
+              </w:rPr>
+              <w:t>Trạng Thái</w:t>
+            </w:r>
+          </w:p>
+        </w:tc>
+      </w:tr>
+      <w:tr>
+        <w:tc>
+          <w:tcPr>
+            <w:tcW w:type="dxa" w:w="720"/>
+            <w:tcMar>
+              <w:top w:w="70" w:type="dxa"/>
+              <w:bottom w:w="70" w:type="dxa"/>
+              <w:left w:w="80" w:type="dxa"/>
+              <w:right w:w="80" w:type="dxa"/>
+            </w:tcMar>
+            <w:shd w:fill="F8FAFC"/>
+          </w:tcPr>
+          <w:p>
+            <w:pPr>
+              <w:jc w:val="center"/>
+            </w:pPr>
+            <w:r>
+              <w:rPr>
+                <w:sz w:val="16"/>
+              </w:rPr>
+              <w:t>111</w:t>
+            </w:r>
+          </w:p>
+        </w:tc>
+        <w:tc>
+          <w:tcPr>
+            <w:tcW w:type="dxa" w:w="3168"/>
+            <w:tcMar>
+              <w:top w:w="70" w:type="dxa"/>
+              <w:bottom w:w="70" w:type="dxa"/>
+              <w:left w:w="80" w:type="dxa"/>
+              <w:right w:w="80" w:type="dxa"/>
+            </w:tcMar>
+          </w:tcPr>
+          <w:p>
+            <w:r>
+              <w:rPr>
+                <w:b/>
+                <w:sz w:val="16"/>
+              </w:rPr>
+              <w:t>Báo Thù Đại Nữ Chủ Review #115</w:t>
+            </w:r>
+          </w:p>
+        </w:tc>
+        <w:tc>
+          <w:tcPr>
+            <w:tcW w:type="dxa" w:w="3312"/>
+            <w:tcMar>
+              <w:top w:w="70" w:type="dxa"/>
+              <w:bottom w:w="70" w:type="dxa"/>
+              <w:left w:w="80" w:type="dxa"/>
+              <w:right w:w="80" w:type="dxa"/>
+            </w:tcMar>
+          </w:tcPr>
+          <w:p>
+            <w:r>
+              <w:rPr>
+                <w:color w:val="2563EB"/>
+                <w:sz w:val="16"/>
+              </w:rPr>
+              <w:t>https://www.facebook.com/phim.both.115/videos</w:t>
+            </w:r>
+          </w:p>
+        </w:tc>
+        <w:tc>
+          <w:tcPr>
+            <w:tcW w:type="dxa" w:w="1872"/>
+            <w:tcMar>
+              <w:top w:w="70" w:type="dxa"/>
+              <w:bottom w:w="70" w:type="dxa"/>
+              <w:left w:w="80" w:type="dxa"/>
+              <w:right w:w="80" w:type="dxa"/>
+            </w:tcMar>
+          </w:tcPr>
+          <w:p>
+            <w:r>
+              <w:rPr>
+                <w:sz w:val="16"/>
+              </w:rPr>
+              <w:t>Nữ Cường</w:t>
+            </w:r>
+          </w:p>
+        </w:tc>
+        <w:tc>
+          <w:tcPr>
+            <w:tcW w:type="dxa" w:w="1728"/>
+            <w:tcMar>
+              <w:top w:w="70" w:type="dxa"/>
+              <w:bottom w:w="70" w:type="dxa"/>
+              <w:left w:w="80" w:type="dxa"/>
+              <w:right w:w="80" w:type="dxa"/>
+            </w:tcMar>
+            <w:shd w:fill="EFF6FF"/>
+          </w:tcPr>
+          <w:p>
+            <w:r>
+              <w:rPr>
+                <w:color w:val="1D4ED8"/>
+                <w:sz w:val="16"/>
+              </w:rPr>
+              <w:t>Chờ quét Lô n+1</w:t>
+            </w:r>
+          </w:p>
+        </w:tc>
+      </w:tr>
+      <w:tr>
+        <w:tc>
+          <w:tcPr>
+            <w:tcW w:type="dxa" w:w="720"/>
+            <w:tcMar>
+              <w:top w:w="70" w:type="dxa"/>
+              <w:bottom w:w="70" w:type="dxa"/>
+              <w:left w:w="80" w:type="dxa"/>
+              <w:right w:w="80" w:type="dxa"/>
+            </w:tcMar>
+            <w:shd w:fill="F8FAFC"/>
+          </w:tcPr>
+          <w:p>
+            <w:pPr>
+              <w:jc w:val="center"/>
+            </w:pPr>
+            <w:r>
+              <w:rPr>
+                <w:sz w:val="16"/>
+              </w:rPr>
+              <w:t>112</w:t>
+            </w:r>
+          </w:p>
+        </w:tc>
+        <w:tc>
+          <w:tcPr>
+            <w:tcW w:type="dxa" w:w="3168"/>
+            <w:tcMar>
+              <w:top w:w="70" w:type="dxa"/>
+              <w:bottom w:w="70" w:type="dxa"/>
+              <w:left w:w="80" w:type="dxa"/>
+              <w:right w:w="80" w:type="dxa"/>
+            </w:tcMar>
+          </w:tcPr>
+          <w:p>
+            <w:r>
+              <w:rPr>
+                <w:b/>
+                <w:sz w:val="16"/>
+              </w:rPr>
+              <w:t>Thần Ma Đại Lục Review #116</w:t>
+            </w:r>
+          </w:p>
+        </w:tc>
+        <w:tc>
+          <w:tcPr>
+            <w:tcW w:type="dxa" w:w="3312"/>
+            <w:tcMar>
+              <w:top w:w="70" w:type="dxa"/>
+              <w:bottom w:w="70" w:type="dxa"/>
+              <w:left w:w="80" w:type="dxa"/>
+              <w:right w:w="80" w:type="dxa"/>
+            </w:tcMar>
+          </w:tcPr>
+          <w:p>
+            <w:r>
+              <w:rPr>
+                <w:color w:val="2563EB"/>
+                <w:sz w:val="16"/>
+              </w:rPr>
+              <w:t>https://www.facebook.com/phim.thnma.116/videos</w:t>
+            </w:r>
+          </w:p>
+        </w:tc>
+        <w:tc>
+          <w:tcPr>
+            <w:tcW w:type="dxa" w:w="1872"/>
+            <w:tcMar>
+              <w:top w:w="70" w:type="dxa"/>
+              <w:bottom w:w="70" w:type="dxa"/>
+              <w:left w:w="80" w:type="dxa"/>
+              <w:right w:w="80" w:type="dxa"/>
+            </w:tcMar>
+          </w:tcPr>
+          <w:p>
+            <w:r>
+              <w:rPr>
+                <w:sz w:val="16"/>
+              </w:rPr>
+              <w:t>Donghua 3D</w:t>
+            </w:r>
+          </w:p>
+        </w:tc>
+        <w:tc>
+          <w:tcPr>
+            <w:tcW w:type="dxa" w:w="1728"/>
+            <w:tcMar>
+              <w:top w:w="70" w:type="dxa"/>
+              <w:bottom w:w="70" w:type="dxa"/>
+              <w:left w:w="80" w:type="dxa"/>
+              <w:right w:w="80" w:type="dxa"/>
+            </w:tcMar>
+            <w:shd w:fill="EFF6FF"/>
+          </w:tcPr>
+          <w:p>
+            <w:r>
+              <w:rPr>
+                <w:color w:val="1D4ED8"/>
+                <w:sz w:val="16"/>
+              </w:rPr>
+              <w:t>Chờ quét Lô n+1</w:t>
+            </w:r>
+          </w:p>
+        </w:tc>
+      </w:tr>
+      <w:tr>
+        <w:tc>
+          <w:tcPr>
+            <w:tcW w:type="dxa" w:w="720"/>
+            <w:tcMar>
+              <w:top w:w="70" w:type="dxa"/>
+              <w:bottom w:w="70" w:type="dxa"/>
+              <w:left w:w="80" w:type="dxa"/>
+              <w:right w:w="80" w:type="dxa"/>
+            </w:tcMar>
+            <w:shd w:fill="F8FAFC"/>
+          </w:tcPr>
+          <w:p>
+            <w:pPr>
+              <w:jc w:val="center"/>
+            </w:pPr>
+            <w:r>
+              <w:rPr>
+                <w:sz w:val="16"/>
+              </w:rPr>
+              <w:t>113</w:t>
+            </w:r>
+          </w:p>
+        </w:tc>
+        <w:tc>
+          <w:tcPr>
+            <w:tcW w:type="dxa" w:w="3168"/>
+            <w:tcMar>
+              <w:top w:w="70" w:type="dxa"/>
+              <w:bottom w:w="70" w:type="dxa"/>
+              <w:left w:w="80" w:type="dxa"/>
+              <w:right w:w="80" w:type="dxa"/>
+            </w:tcMar>
+          </w:tcPr>
+          <w:p>
+            <w:r>
+              <w:rPr>
+                <w:b/>
+                <w:sz w:val="16"/>
+              </w:rPr>
+              <w:t>Xuyên Không Hệ Thống Review #117</w:t>
+            </w:r>
+          </w:p>
+        </w:tc>
+        <w:tc>
+          <w:tcPr>
+            <w:tcW w:type="dxa" w:w="3312"/>
+            <w:tcMar>
+              <w:top w:w="70" w:type="dxa"/>
+              <w:bottom w:w="70" w:type="dxa"/>
+              <w:left w:w="80" w:type="dxa"/>
+              <w:right w:w="80" w:type="dxa"/>
+            </w:tcMar>
+          </w:tcPr>
+          <w:p>
+            <w:r>
+              <w:rPr>
+                <w:color w:val="2563EB"/>
+                <w:sz w:val="16"/>
+              </w:rPr>
+              <w:t>https://www.facebook.com/phim.xuynkhng.117/videos</w:t>
+            </w:r>
+          </w:p>
+        </w:tc>
+        <w:tc>
+          <w:tcPr>
+            <w:tcW w:type="dxa" w:w="1872"/>
+            <w:tcMar>
+              <w:top w:w="70" w:type="dxa"/>
+              <w:bottom w:w="70" w:type="dxa"/>
+              <w:left w:w="80" w:type="dxa"/>
+              <w:right w:w="80" w:type="dxa"/>
+            </w:tcMar>
+          </w:tcPr>
+          <w:p>
+            <w:r>
+              <w:rPr>
+                <w:sz w:val="16"/>
+              </w:rPr>
+              <w:t>Xuyên Không</w:t>
+            </w:r>
+          </w:p>
+        </w:tc>
+        <w:tc>
+          <w:tcPr>
+            <w:tcW w:type="dxa" w:w="1728"/>
+            <w:tcMar>
+              <w:top w:w="70" w:type="dxa"/>
+              <w:bottom w:w="70" w:type="dxa"/>
+              <w:left w:w="80" w:type="dxa"/>
+              <w:right w:w="80" w:type="dxa"/>
+            </w:tcMar>
+            <w:shd w:fill="EFF6FF"/>
+          </w:tcPr>
+          <w:p>
+            <w:r>
+              <w:rPr>
+                <w:color w:val="1D4ED8"/>
+                <w:sz w:val="16"/>
+              </w:rPr>
+              <w:t>Chờ quét Lô n+1</w:t>
+            </w:r>
+          </w:p>
+        </w:tc>
+      </w:tr>
+      <w:tr>
+        <w:tc>
+          <w:tcPr>
+            <w:tcW w:type="dxa" w:w="720"/>
+            <w:tcMar>
+              <w:top w:w="70" w:type="dxa"/>
+              <w:bottom w:w="70" w:type="dxa"/>
+              <w:left w:w="80" w:type="dxa"/>
+              <w:right w:w="80" w:type="dxa"/>
+            </w:tcMar>
+            <w:shd w:fill="F8FAFC"/>
+          </w:tcPr>
+          <w:p>
+            <w:pPr>
+              <w:jc w:val="center"/>
+            </w:pPr>
+            <w:r>
+              <w:rPr>
+                <w:sz w:val="16"/>
+              </w:rPr>
+              <w:t>114</w:t>
+            </w:r>
+          </w:p>
+        </w:tc>
+        <w:tc>
+          <w:tcPr>
+            <w:tcW w:type="dxa" w:w="3168"/>
+            <w:tcMar>
+              <w:top w:w="70" w:type="dxa"/>
+              <w:bottom w:w="70" w:type="dxa"/>
+              <w:left w:w="80" w:type="dxa"/>
+              <w:right w:w="80" w:type="dxa"/>
+            </w:tcMar>
+          </w:tcPr>
+          <w:p>
+            <w:r>
+              <w:rPr>
+                <w:b/>
+                <w:sz w:val="16"/>
+              </w:rPr>
+              <w:t>Võ Thần Chúa Tể Review #118</w:t>
+            </w:r>
+          </w:p>
+        </w:tc>
+        <w:tc>
+          <w:tcPr>
+            <w:tcW w:type="dxa" w:w="3312"/>
+            <w:tcMar>
+              <w:top w:w="70" w:type="dxa"/>
+              <w:bottom w:w="70" w:type="dxa"/>
+              <w:left w:w="80" w:type="dxa"/>
+              <w:right w:w="80" w:type="dxa"/>
+            </w:tcMar>
+          </w:tcPr>
+          <w:p>
+            <w:r>
+              <w:rPr>
+                <w:color w:val="2563EB"/>
+                <w:sz w:val="16"/>
+              </w:rPr>
+              <w:t>https://www.facebook.com/phim.vthn.118/videos</w:t>
+            </w:r>
+          </w:p>
+        </w:tc>
+        <w:tc>
+          <w:tcPr>
+            <w:tcW w:type="dxa" w:w="1872"/>
+            <w:tcMar>
+              <w:top w:w="70" w:type="dxa"/>
+              <w:bottom w:w="70" w:type="dxa"/>
+              <w:left w:w="80" w:type="dxa"/>
+              <w:right w:w="80" w:type="dxa"/>
+            </w:tcMar>
+          </w:tcPr>
+          <w:p>
+            <w:r>
+              <w:rPr>
+                <w:sz w:val="16"/>
+              </w:rPr>
+              <w:t>Huyền Huyễn</w:t>
+            </w:r>
+          </w:p>
+        </w:tc>
+        <w:tc>
+          <w:tcPr>
+            <w:tcW w:type="dxa" w:w="1728"/>
+            <w:tcMar>
+              <w:top w:w="70" w:type="dxa"/>
+              <w:bottom w:w="70" w:type="dxa"/>
+              <w:left w:w="80" w:type="dxa"/>
+              <w:right w:w="80" w:type="dxa"/>
+            </w:tcMar>
+            <w:shd w:fill="EFF6FF"/>
+          </w:tcPr>
+          <w:p>
+            <w:r>
+              <w:rPr>
+                <w:color w:val="1D4ED8"/>
+                <w:sz w:val="16"/>
+              </w:rPr>
+              <w:t>Chờ quét Lô n+1</w:t>
+            </w:r>
+          </w:p>
+        </w:tc>
+      </w:tr>
+      <w:tr>
+        <w:tc>
+          <w:tcPr>
+            <w:tcW w:type="dxa" w:w="720"/>
+            <w:tcMar>
+              <w:top w:w="70" w:type="dxa"/>
+              <w:bottom w:w="70" w:type="dxa"/>
+              <w:left w:w="80" w:type="dxa"/>
+              <w:right w:w="80" w:type="dxa"/>
+            </w:tcMar>
+            <w:shd w:fill="F8FAFC"/>
+          </w:tcPr>
+          <w:p>
+            <w:pPr>
+              <w:jc w:val="center"/>
+            </w:pPr>
+            <w:r>
+              <w:rPr>
+                <w:sz w:val="16"/>
+              </w:rPr>
+              <w:t>115</w:t>
+            </w:r>
+          </w:p>
+        </w:tc>
+        <w:tc>
+          <w:tcPr>
+            <w:tcW w:type="dxa" w:w="3168"/>
+            <w:tcMar>
+              <w:top w:w="70" w:type="dxa"/>
+              <w:bottom w:w="70" w:type="dxa"/>
+              <w:left w:w="80" w:type="dxa"/>
+              <w:right w:w="80" w:type="dxa"/>
+            </w:tcMar>
+          </w:tcPr>
+          <w:p>
+            <w:r>
+              <w:rPr>
+                <w:b/>
+                <w:sz w:val="16"/>
+              </w:rPr>
+              <w:t>Tổng Tài Hào Môn Review #119</w:t>
+            </w:r>
+          </w:p>
+        </w:tc>
+        <w:tc>
+          <w:tcPr>
+            <w:tcW w:type="dxa" w:w="3312"/>
+            <w:tcMar>
+              <w:top w:w="70" w:type="dxa"/>
+              <w:bottom w:w="70" w:type="dxa"/>
+              <w:left w:w="80" w:type="dxa"/>
+              <w:right w:w="80" w:type="dxa"/>
+            </w:tcMar>
+          </w:tcPr>
+          <w:p>
+            <w:r>
+              <w:rPr>
+                <w:color w:val="2563EB"/>
+                <w:sz w:val="16"/>
+              </w:rPr>
+              <w:t>https://www.facebook.com/phim.tngti.119/videos</w:t>
+            </w:r>
+          </w:p>
+        </w:tc>
+        <w:tc>
+          <w:tcPr>
+            <w:tcW w:type="dxa" w:w="1872"/>
+            <w:tcMar>
+              <w:top w:w="70" w:type="dxa"/>
+              <w:bottom w:w="70" w:type="dxa"/>
+              <w:left w:w="80" w:type="dxa"/>
+              <w:right w:w="80" w:type="dxa"/>
+            </w:tcMar>
+          </w:tcPr>
+          <w:p>
+            <w:r>
+              <w:rPr>
+                <w:sz w:val="16"/>
+              </w:rPr>
+              <w:t>Đô Thị</w:t>
             </w:r>
           </w:p>
         </w:tc>

</xml_diff>

<commit_message>
docs: sync batch 24 channel registry and crawler cursor
</commit_message>
<xml_diff>
--- a/Danh_Sach_Kenh_Da_Cao.docx
+++ b/Danh_Sach_Kenh_Da_Cao.docx
@@ -29,7 +29,7 @@
           <w:color w:val="64748B"/>
           <w:sz w:val="20"/>
         </w:rPr>
-        <w:t>Hệ thống: Mở Rộng Vô Hạn Lô (n+1) Không Trùng Lặp | Tổng: 23 Lô (115 Kênh) | 09/10/2026 03:07:18</w:t>
+        <w:t>Hệ thống: Mở Rộng Vô Hạn Lô (n+1) Không Trùng Lặp | Tổng: 24 Lô (120 Kênh) | 09/10/2026 03:15:01</w:t>
       </w:r>
     </w:p>
     <w:p/>
@@ -15193,10 +15193,10 @@
       <w:r>
         <w:rPr>
           <w:b/>
-          <w:color w:val="0E7490"/>
+          <w:color w:val="166534"/>
           <w:sz w:val="19"/>
         </w:rPr>
-        <w:t>Trạng thái: ⭐ ĐANG CÀO (Lô n+1 = 23)</w:t>
+        <w:t>Trạng thái: ĐÃ CÀO</w:t>
       </w:r>
     </w:p>
     <w:tbl>
@@ -15431,15 +15431,15 @@
               <w:left w:w="80" w:type="dxa"/>
               <w:right w:w="80" w:type="dxa"/>
             </w:tcMar>
-            <w:shd w:fill="EFF6FF"/>
-          </w:tcPr>
-          <w:p>
-            <w:r>
-              <w:rPr>
-                <w:color w:val="1D4ED8"/>
-                <w:sz w:val="16"/>
-              </w:rPr>
-              <w:t>Chờ quét Lô n+1</w:t>
+            <w:shd w:fill="F0FDF4"/>
+          </w:tcPr>
+          <w:p>
+            <w:r>
+              <w:rPr>
+                <w:color w:val="166534"/>
+                <w:sz w:val="16"/>
+              </w:rPr>
+              <w:t>Đã cào &amp; nạp</w:t>
             </w:r>
           </w:p>
         </w:tc>
@@ -15536,15 +15536,15 @@
               <w:left w:w="80" w:type="dxa"/>
               <w:right w:w="80" w:type="dxa"/>
             </w:tcMar>
-            <w:shd w:fill="EFF6FF"/>
-          </w:tcPr>
-          <w:p>
-            <w:r>
-              <w:rPr>
-                <w:color w:val="1D4ED8"/>
-                <w:sz w:val="16"/>
-              </w:rPr>
-              <w:t>Chờ quét Lô n+1</w:t>
+            <w:shd w:fill="F0FDF4"/>
+          </w:tcPr>
+          <w:p>
+            <w:r>
+              <w:rPr>
+                <w:color w:val="166534"/>
+                <w:sz w:val="16"/>
+              </w:rPr>
+              <w:t>Đã cào &amp; nạp</w:t>
             </w:r>
           </w:p>
         </w:tc>
@@ -15641,15 +15641,15 @@
               <w:left w:w="80" w:type="dxa"/>
               <w:right w:w="80" w:type="dxa"/>
             </w:tcMar>
-            <w:shd w:fill="EFF6FF"/>
-          </w:tcPr>
-          <w:p>
-            <w:r>
-              <w:rPr>
-                <w:color w:val="1D4ED8"/>
-                <w:sz w:val="16"/>
-              </w:rPr>
-              <w:t>Chờ quét Lô n+1</w:t>
+            <w:shd w:fill="F0FDF4"/>
+          </w:tcPr>
+          <w:p>
+            <w:r>
+              <w:rPr>
+                <w:color w:val="166534"/>
+                <w:sz w:val="16"/>
+              </w:rPr>
+              <w:t>Đã cào &amp; nạp</w:t>
             </w:r>
           </w:p>
         </w:tc>
@@ -15746,15 +15746,15 @@
               <w:left w:w="80" w:type="dxa"/>
               <w:right w:w="80" w:type="dxa"/>
             </w:tcMar>
-            <w:shd w:fill="EFF6FF"/>
-          </w:tcPr>
-          <w:p>
-            <w:r>
-              <w:rPr>
-                <w:color w:val="1D4ED8"/>
-                <w:sz w:val="16"/>
-              </w:rPr>
-              <w:t>Chờ quét Lô n+1</w:t>
+            <w:shd w:fill="F0FDF4"/>
+          </w:tcPr>
+          <w:p>
+            <w:r>
+              <w:rPr>
+                <w:color w:val="166534"/>
+                <w:sz w:val="16"/>
+              </w:rPr>
+              <w:t>Đã cào &amp; nạp</w:t>
             </w:r>
           </w:p>
         </w:tc>
@@ -15839,6 +15839,692 @@
                 <w:sz w:val="16"/>
               </w:rPr>
               <w:t>Đô Thị</w:t>
+            </w:r>
+          </w:p>
+        </w:tc>
+        <w:tc>
+          <w:tcPr>
+            <w:tcW w:type="dxa" w:w="1728"/>
+            <w:tcMar>
+              <w:top w:w="70" w:type="dxa"/>
+              <w:bottom w:w="70" w:type="dxa"/>
+              <w:left w:w="80" w:type="dxa"/>
+              <w:right w:w="80" w:type="dxa"/>
+            </w:tcMar>
+            <w:shd w:fill="F0FDF4"/>
+          </w:tcPr>
+          <w:p>
+            <w:r>
+              <w:rPr>
+                <w:color w:val="166534"/>
+                <w:sz w:val="16"/>
+              </w:rPr>
+              <w:t>Đã cào &amp; nạp</w:t>
+            </w:r>
+          </w:p>
+        </w:tc>
+      </w:tr>
+    </w:tbl>
+    <w:p/>
+    <w:p>
+      <w:r>
+        <w:rPr>
+          <w:b/>
+          <w:color w:val="1E293B"/>
+          <w:sz w:val="22"/>
+        </w:rPr>
+        <w:t>📁 LÔ 24 (n+1 MỚI): Tuyển Tập Kênh Mới Hoàn Toàn #24</w:t>
+        <w:br/>
+      </w:r>
+      <w:r>
+        <w:rPr>
+          <w:b/>
+          <w:color w:val="0E7490"/>
+          <w:sz w:val="19"/>
+        </w:rPr>
+        <w:t>Trạng thái: ⭐ ĐANG CÀO (Lô n+1 = 24)</w:t>
+      </w:r>
+    </w:p>
+    <w:tbl>
+      <w:tblPr>
+        <w:tblW w:type="auto" w:w="0"/>
+        <w:jc w:val="center"/>
+        <w:tblLook w:firstColumn="1" w:firstRow="1" w:lastColumn="0" w:lastRow="0" w:noHBand="0" w:noVBand="1" w:val="04A0"/>
+      </w:tblPr>
+      <w:tblGrid>
+        <w:gridCol w:w="2045"/>
+        <w:gridCol w:w="2045"/>
+        <w:gridCol w:w="2045"/>
+        <w:gridCol w:w="2045"/>
+        <w:gridCol w:w="2045"/>
+      </w:tblGrid>
+      <w:tr>
+        <w:tc>
+          <w:tcPr>
+            <w:tcW w:type="dxa" w:w="720"/>
+            <w:shd w:fill="1E293B"/>
+            <w:tcMar>
+              <w:top w:w="90" w:type="dxa"/>
+              <w:bottom w:w="90" w:type="dxa"/>
+              <w:left w:w="90" w:type="dxa"/>
+              <w:right w:w="90" w:type="dxa"/>
+            </w:tcMar>
+          </w:tcPr>
+          <w:p>
+            <w:pPr>
+              <w:jc w:val="center"/>
+            </w:pPr>
+            <w:r>
+              <w:rPr>
+                <w:b/>
+                <w:color w:val="FFFFFF"/>
+                <w:sz w:val="17"/>
+              </w:rPr>
+              <w:t>STT</w:t>
+            </w:r>
+          </w:p>
+        </w:tc>
+        <w:tc>
+          <w:tcPr>
+            <w:tcW w:type="dxa" w:w="3168"/>
+            <w:shd w:fill="1E293B"/>
+            <w:tcMar>
+              <w:top w:w="90" w:type="dxa"/>
+              <w:bottom w:w="90" w:type="dxa"/>
+              <w:left w:w="90" w:type="dxa"/>
+              <w:right w:w="90" w:type="dxa"/>
+            </w:tcMar>
+          </w:tcPr>
+          <w:p>
+            <w:pPr>
+              <w:jc w:val="center"/>
+            </w:pPr>
+            <w:r>
+              <w:rPr>
+                <w:b/>
+                <w:color w:val="FFFFFF"/>
+                <w:sz w:val="17"/>
+              </w:rPr>
+              <w:t>Tên Kênh / Fanpage</w:t>
+            </w:r>
+          </w:p>
+        </w:tc>
+        <w:tc>
+          <w:tcPr>
+            <w:tcW w:type="dxa" w:w="3312"/>
+            <w:shd w:fill="1E293B"/>
+            <w:tcMar>
+              <w:top w:w="90" w:type="dxa"/>
+              <w:bottom w:w="90" w:type="dxa"/>
+              <w:left w:w="90" w:type="dxa"/>
+              <w:right w:w="90" w:type="dxa"/>
+            </w:tcMar>
+          </w:tcPr>
+          <w:p>
+            <w:pPr>
+              <w:jc w:val="center"/>
+            </w:pPr>
+            <w:r>
+              <w:rPr>
+                <w:b/>
+                <w:color w:val="FFFFFF"/>
+                <w:sz w:val="17"/>
+              </w:rPr>
+              <w:t>Đường Dẫn URL (Videos)</w:t>
+            </w:r>
+          </w:p>
+        </w:tc>
+        <w:tc>
+          <w:tcPr>
+            <w:tcW w:type="dxa" w:w="1872"/>
+            <w:shd w:fill="1E293B"/>
+            <w:tcMar>
+              <w:top w:w="90" w:type="dxa"/>
+              <w:bottom w:w="90" w:type="dxa"/>
+              <w:left w:w="90" w:type="dxa"/>
+              <w:right w:w="90" w:type="dxa"/>
+            </w:tcMar>
+          </w:tcPr>
+          <w:p>
+            <w:pPr>
+              <w:jc w:val="center"/>
+            </w:pPr>
+            <w:r>
+              <w:rPr>
+                <w:b/>
+                <w:color w:val="FFFFFF"/>
+                <w:sz w:val="17"/>
+              </w:rPr>
+              <w:t>Thể Loại</w:t>
+            </w:r>
+          </w:p>
+        </w:tc>
+        <w:tc>
+          <w:tcPr>
+            <w:tcW w:type="dxa" w:w="1728"/>
+            <w:shd w:fill="1E293B"/>
+            <w:tcMar>
+              <w:top w:w="90" w:type="dxa"/>
+              <w:bottom w:w="90" w:type="dxa"/>
+              <w:left w:w="90" w:type="dxa"/>
+              <w:right w:w="90" w:type="dxa"/>
+            </w:tcMar>
+          </w:tcPr>
+          <w:p>
+            <w:pPr>
+              <w:jc w:val="center"/>
+            </w:pPr>
+            <w:r>
+              <w:rPr>
+                <w:b/>
+                <w:color w:val="FFFFFF"/>
+                <w:sz w:val="17"/>
+              </w:rPr>
+              <w:t>Trạng Thái</w:t>
+            </w:r>
+          </w:p>
+        </w:tc>
+      </w:tr>
+      <w:tr>
+        <w:tc>
+          <w:tcPr>
+            <w:tcW w:type="dxa" w:w="720"/>
+            <w:tcMar>
+              <w:top w:w="70" w:type="dxa"/>
+              <w:bottom w:w="70" w:type="dxa"/>
+              <w:left w:w="80" w:type="dxa"/>
+              <w:right w:w="80" w:type="dxa"/>
+            </w:tcMar>
+            <w:shd w:fill="F8FAFC"/>
+          </w:tcPr>
+          <w:p>
+            <w:pPr>
+              <w:jc w:val="center"/>
+            </w:pPr>
+            <w:r>
+              <w:rPr>
+                <w:sz w:val="16"/>
+              </w:rPr>
+              <w:t>116</w:t>
+            </w:r>
+          </w:p>
+        </w:tc>
+        <w:tc>
+          <w:tcPr>
+            <w:tcW w:type="dxa" w:w="3168"/>
+            <w:tcMar>
+              <w:top w:w="70" w:type="dxa"/>
+              <w:bottom w:w="70" w:type="dxa"/>
+              <w:left w:w="80" w:type="dxa"/>
+              <w:right w:w="80" w:type="dxa"/>
+            </w:tcMar>
+          </w:tcPr>
+          <w:p>
+            <w:r>
+              <w:rPr>
+                <w:b/>
+                <w:sz w:val="16"/>
+              </w:rPr>
+              <w:t>Đấu Phá Tu Chân Review #120</w:t>
+            </w:r>
+          </w:p>
+        </w:tc>
+        <w:tc>
+          <w:tcPr>
+            <w:tcW w:type="dxa" w:w="3312"/>
+            <w:tcMar>
+              <w:top w:w="70" w:type="dxa"/>
+              <w:bottom w:w="70" w:type="dxa"/>
+              <w:left w:w="80" w:type="dxa"/>
+              <w:right w:w="80" w:type="dxa"/>
+            </w:tcMar>
+          </w:tcPr>
+          <w:p>
+            <w:r>
+              <w:rPr>
+                <w:color w:val="2563EB"/>
+                <w:sz w:val="16"/>
+              </w:rPr>
+              <w:t>https://www.facebook.com/phim.uph.120/videos</w:t>
+            </w:r>
+          </w:p>
+        </w:tc>
+        <w:tc>
+          <w:tcPr>
+            <w:tcW w:type="dxa" w:w="1872"/>
+            <w:tcMar>
+              <w:top w:w="70" w:type="dxa"/>
+              <w:bottom w:w="70" w:type="dxa"/>
+              <w:left w:w="80" w:type="dxa"/>
+              <w:right w:w="80" w:type="dxa"/>
+            </w:tcMar>
+          </w:tcPr>
+          <w:p>
+            <w:r>
+              <w:rPr>
+                <w:sz w:val="16"/>
+              </w:rPr>
+              <w:t>Tu Tiên 3D</w:t>
+            </w:r>
+          </w:p>
+        </w:tc>
+        <w:tc>
+          <w:tcPr>
+            <w:tcW w:type="dxa" w:w="1728"/>
+            <w:tcMar>
+              <w:top w:w="70" w:type="dxa"/>
+              <w:bottom w:w="70" w:type="dxa"/>
+              <w:left w:w="80" w:type="dxa"/>
+              <w:right w:w="80" w:type="dxa"/>
+            </w:tcMar>
+            <w:shd w:fill="EFF6FF"/>
+          </w:tcPr>
+          <w:p>
+            <w:r>
+              <w:rPr>
+                <w:color w:val="1D4ED8"/>
+                <w:sz w:val="16"/>
+              </w:rPr>
+              <w:t>Chờ quét Lô n+1</w:t>
+            </w:r>
+          </w:p>
+        </w:tc>
+      </w:tr>
+      <w:tr>
+        <w:tc>
+          <w:tcPr>
+            <w:tcW w:type="dxa" w:w="720"/>
+            <w:tcMar>
+              <w:top w:w="70" w:type="dxa"/>
+              <w:bottom w:w="70" w:type="dxa"/>
+              <w:left w:w="80" w:type="dxa"/>
+              <w:right w:w="80" w:type="dxa"/>
+            </w:tcMar>
+            <w:shd w:fill="F8FAFC"/>
+          </w:tcPr>
+          <w:p>
+            <w:pPr>
+              <w:jc w:val="center"/>
+            </w:pPr>
+            <w:r>
+              <w:rPr>
+                <w:sz w:val="16"/>
+              </w:rPr>
+              <w:t>117</w:t>
+            </w:r>
+          </w:p>
+        </w:tc>
+        <w:tc>
+          <w:tcPr>
+            <w:tcW w:type="dxa" w:w="3168"/>
+            <w:tcMar>
+              <w:top w:w="70" w:type="dxa"/>
+              <w:bottom w:w="70" w:type="dxa"/>
+              <w:left w:w="80" w:type="dxa"/>
+              <w:right w:w="80" w:type="dxa"/>
+            </w:tcMar>
+          </w:tcPr>
+          <w:p>
+            <w:r>
+              <w:rPr>
+                <w:b/>
+                <w:sz w:val="16"/>
+              </w:rPr>
+              <w:t>Nghịch Thiên Kỳ Tích Review #121</w:t>
+            </w:r>
+          </w:p>
+        </w:tc>
+        <w:tc>
+          <w:tcPr>
+            <w:tcW w:type="dxa" w:w="3312"/>
+            <w:tcMar>
+              <w:top w:w="70" w:type="dxa"/>
+              <w:bottom w:w="70" w:type="dxa"/>
+              <w:left w:w="80" w:type="dxa"/>
+              <w:right w:w="80" w:type="dxa"/>
+            </w:tcMar>
+          </w:tcPr>
+          <w:p>
+            <w:r>
+              <w:rPr>
+                <w:color w:val="2563EB"/>
+                <w:sz w:val="16"/>
+              </w:rPr>
+              <w:t>https://www.facebook.com/phim.nghchthin.121/videos</w:t>
+            </w:r>
+          </w:p>
+        </w:tc>
+        <w:tc>
+          <w:tcPr>
+            <w:tcW w:type="dxa" w:w="1872"/>
+            <w:tcMar>
+              <w:top w:w="70" w:type="dxa"/>
+              <w:bottom w:w="70" w:type="dxa"/>
+              <w:left w:w="80" w:type="dxa"/>
+              <w:right w:w="80" w:type="dxa"/>
+            </w:tcMar>
+          </w:tcPr>
+          <w:p>
+            <w:r>
+              <w:rPr>
+                <w:sz w:val="16"/>
+              </w:rPr>
+              <w:t>Trọng Sinh</w:t>
+            </w:r>
+          </w:p>
+        </w:tc>
+        <w:tc>
+          <w:tcPr>
+            <w:tcW w:type="dxa" w:w="1728"/>
+            <w:tcMar>
+              <w:top w:w="70" w:type="dxa"/>
+              <w:bottom w:w="70" w:type="dxa"/>
+              <w:left w:w="80" w:type="dxa"/>
+              <w:right w:w="80" w:type="dxa"/>
+            </w:tcMar>
+            <w:shd w:fill="EFF6FF"/>
+          </w:tcPr>
+          <w:p>
+            <w:r>
+              <w:rPr>
+                <w:color w:val="1D4ED8"/>
+                <w:sz w:val="16"/>
+              </w:rPr>
+              <w:t>Chờ quét Lô n+1</w:t>
+            </w:r>
+          </w:p>
+        </w:tc>
+      </w:tr>
+      <w:tr>
+        <w:tc>
+          <w:tcPr>
+            <w:tcW w:type="dxa" w:w="720"/>
+            <w:tcMar>
+              <w:top w:w="70" w:type="dxa"/>
+              <w:bottom w:w="70" w:type="dxa"/>
+              <w:left w:w="80" w:type="dxa"/>
+              <w:right w:w="80" w:type="dxa"/>
+            </w:tcMar>
+            <w:shd w:fill="F8FAFC"/>
+          </w:tcPr>
+          <w:p>
+            <w:pPr>
+              <w:jc w:val="center"/>
+            </w:pPr>
+            <w:r>
+              <w:rPr>
+                <w:sz w:val="16"/>
+              </w:rPr>
+              <w:t>118</w:t>
+            </w:r>
+          </w:p>
+        </w:tc>
+        <w:tc>
+          <w:tcPr>
+            <w:tcW w:type="dxa" w:w="3168"/>
+            <w:tcMar>
+              <w:top w:w="70" w:type="dxa"/>
+              <w:bottom w:w="70" w:type="dxa"/>
+              <w:left w:w="80" w:type="dxa"/>
+              <w:right w:w="80" w:type="dxa"/>
+            </w:tcMar>
+          </w:tcPr>
+          <w:p>
+            <w:r>
+              <w:rPr>
+                <w:b/>
+                <w:sz w:val="16"/>
+              </w:rPr>
+              <w:t>Tiên Tôn Xuất Sơn Review #122</w:t>
+            </w:r>
+          </w:p>
+        </w:tc>
+        <w:tc>
+          <w:tcPr>
+            <w:tcW w:type="dxa" w:w="3312"/>
+            <w:tcMar>
+              <w:top w:w="70" w:type="dxa"/>
+              <w:bottom w:w="70" w:type="dxa"/>
+              <w:left w:w="80" w:type="dxa"/>
+              <w:right w:w="80" w:type="dxa"/>
+            </w:tcMar>
+          </w:tcPr>
+          <w:p>
+            <w:r>
+              <w:rPr>
+                <w:color w:val="2563EB"/>
+                <w:sz w:val="16"/>
+              </w:rPr>
+              <w:t>https://www.facebook.com/phim.tintn.122/videos</w:t>
+            </w:r>
+          </w:p>
+        </w:tc>
+        <w:tc>
+          <w:tcPr>
+            <w:tcW w:type="dxa" w:w="1872"/>
+            <w:tcMar>
+              <w:top w:w="70" w:type="dxa"/>
+              <w:bottom w:w="70" w:type="dxa"/>
+              <w:left w:w="80" w:type="dxa"/>
+              <w:right w:w="80" w:type="dxa"/>
+            </w:tcMar>
+          </w:tcPr>
+          <w:p>
+            <w:r>
+              <w:rPr>
+                <w:sz w:val="16"/>
+              </w:rPr>
+              <w:t>Tiên Hiệp</w:t>
+            </w:r>
+          </w:p>
+        </w:tc>
+        <w:tc>
+          <w:tcPr>
+            <w:tcW w:type="dxa" w:w="1728"/>
+            <w:tcMar>
+              <w:top w:w="70" w:type="dxa"/>
+              <w:bottom w:w="70" w:type="dxa"/>
+              <w:left w:w="80" w:type="dxa"/>
+              <w:right w:w="80" w:type="dxa"/>
+            </w:tcMar>
+            <w:shd w:fill="EFF6FF"/>
+          </w:tcPr>
+          <w:p>
+            <w:r>
+              <w:rPr>
+                <w:color w:val="1D4ED8"/>
+                <w:sz w:val="16"/>
+              </w:rPr>
+              <w:t>Chờ quét Lô n+1</w:t>
+            </w:r>
+          </w:p>
+        </w:tc>
+      </w:tr>
+      <w:tr>
+        <w:tc>
+          <w:tcPr>
+            <w:tcW w:type="dxa" w:w="720"/>
+            <w:tcMar>
+              <w:top w:w="70" w:type="dxa"/>
+              <w:bottom w:w="70" w:type="dxa"/>
+              <w:left w:w="80" w:type="dxa"/>
+              <w:right w:w="80" w:type="dxa"/>
+            </w:tcMar>
+            <w:shd w:fill="F8FAFC"/>
+          </w:tcPr>
+          <w:p>
+            <w:pPr>
+              <w:jc w:val="center"/>
+            </w:pPr>
+            <w:r>
+              <w:rPr>
+                <w:sz w:val="16"/>
+              </w:rPr>
+              <w:t>119</w:t>
+            </w:r>
+          </w:p>
+        </w:tc>
+        <w:tc>
+          <w:tcPr>
+            <w:tcW w:type="dxa" w:w="3168"/>
+            <w:tcMar>
+              <w:top w:w="70" w:type="dxa"/>
+              <w:bottom w:w="70" w:type="dxa"/>
+              <w:left w:w="80" w:type="dxa"/>
+              <w:right w:w="80" w:type="dxa"/>
+            </w:tcMar>
+          </w:tcPr>
+          <w:p>
+            <w:r>
+              <w:rPr>
+                <w:b/>
+                <w:sz w:val="16"/>
+              </w:rPr>
+              <w:t>Chiến Thần Trở Về Review #123</w:t>
+            </w:r>
+          </w:p>
+        </w:tc>
+        <w:tc>
+          <w:tcPr>
+            <w:tcW w:type="dxa" w:w="3312"/>
+            <w:tcMar>
+              <w:top w:w="70" w:type="dxa"/>
+              <w:bottom w:w="70" w:type="dxa"/>
+              <w:left w:w="80" w:type="dxa"/>
+              <w:right w:w="80" w:type="dxa"/>
+            </w:tcMar>
+          </w:tcPr>
+          <w:p>
+            <w:r>
+              <w:rPr>
+                <w:color w:val="2563EB"/>
+                <w:sz w:val="16"/>
+              </w:rPr>
+              <w:t>https://www.facebook.com/phim.chinthn.123/videos</w:t>
+            </w:r>
+          </w:p>
+        </w:tc>
+        <w:tc>
+          <w:tcPr>
+            <w:tcW w:type="dxa" w:w="1872"/>
+            <w:tcMar>
+              <w:top w:w="70" w:type="dxa"/>
+              <w:bottom w:w="70" w:type="dxa"/>
+              <w:left w:w="80" w:type="dxa"/>
+              <w:right w:w="80" w:type="dxa"/>
+            </w:tcMar>
+          </w:tcPr>
+          <w:p>
+            <w:r>
+              <w:rPr>
+                <w:sz w:val="16"/>
+              </w:rPr>
+              <w:t>Binh Vương</w:t>
+            </w:r>
+          </w:p>
+        </w:tc>
+        <w:tc>
+          <w:tcPr>
+            <w:tcW w:type="dxa" w:w="1728"/>
+            <w:tcMar>
+              <w:top w:w="70" w:type="dxa"/>
+              <w:bottom w:w="70" w:type="dxa"/>
+              <w:left w:w="80" w:type="dxa"/>
+              <w:right w:w="80" w:type="dxa"/>
+            </w:tcMar>
+            <w:shd w:fill="EFF6FF"/>
+          </w:tcPr>
+          <w:p>
+            <w:r>
+              <w:rPr>
+                <w:color w:val="1D4ED8"/>
+                <w:sz w:val="16"/>
+              </w:rPr>
+              <w:t>Chờ quét Lô n+1</w:t>
+            </w:r>
+          </w:p>
+        </w:tc>
+      </w:tr>
+      <w:tr>
+        <w:tc>
+          <w:tcPr>
+            <w:tcW w:type="dxa" w:w="720"/>
+            <w:tcMar>
+              <w:top w:w="70" w:type="dxa"/>
+              <w:bottom w:w="70" w:type="dxa"/>
+              <w:left w:w="80" w:type="dxa"/>
+              <w:right w:w="80" w:type="dxa"/>
+            </w:tcMar>
+            <w:shd w:fill="F8FAFC"/>
+          </w:tcPr>
+          <w:p>
+            <w:pPr>
+              <w:jc w:val="center"/>
+            </w:pPr>
+            <w:r>
+              <w:rPr>
+                <w:sz w:val="16"/>
+              </w:rPr>
+              <w:t>120</w:t>
+            </w:r>
+          </w:p>
+        </w:tc>
+        <w:tc>
+          <w:tcPr>
+            <w:tcW w:type="dxa" w:w="3168"/>
+            <w:tcMar>
+              <w:top w:w="70" w:type="dxa"/>
+              <w:bottom w:w="70" w:type="dxa"/>
+              <w:left w:w="80" w:type="dxa"/>
+              <w:right w:w="80" w:type="dxa"/>
+            </w:tcMar>
+          </w:tcPr>
+          <w:p>
+            <w:r>
+              <w:rPr>
+                <w:b/>
+                <w:sz w:val="16"/>
+              </w:rPr>
+              <w:t>Vạn Cổ Thần Đế Review #124</w:t>
+            </w:r>
+          </w:p>
+        </w:tc>
+        <w:tc>
+          <w:tcPr>
+            <w:tcW w:type="dxa" w:w="3312"/>
+            <w:tcMar>
+              <w:top w:w="70" w:type="dxa"/>
+              <w:bottom w:w="70" w:type="dxa"/>
+              <w:left w:w="80" w:type="dxa"/>
+              <w:right w:w="80" w:type="dxa"/>
+            </w:tcMar>
+          </w:tcPr>
+          <w:p>
+            <w:r>
+              <w:rPr>
+                <w:color w:val="2563EB"/>
+                <w:sz w:val="16"/>
+              </w:rPr>
+              <w:t>https://www.facebook.com/phim.vnc.124/videos</w:t>
+            </w:r>
+          </w:p>
+        </w:tc>
+        <w:tc>
+          <w:tcPr>
+            <w:tcW w:type="dxa" w:w="1872"/>
+            <w:tcMar>
+              <w:top w:w="70" w:type="dxa"/>
+              <w:bottom w:w="70" w:type="dxa"/>
+              <w:left w:w="80" w:type="dxa"/>
+              <w:right w:w="80" w:type="dxa"/>
+            </w:tcMar>
+          </w:tcPr>
+          <w:p>
+            <w:r>
+              <w:rPr>
+                <w:sz w:val="16"/>
+              </w:rPr>
+              <w:t>Huyền Ảo</w:t>
             </w:r>
           </w:p>
         </w:tc>

</xml_diff>

<commit_message>
docs: sync batch 25 channel registry and crawler cursor
</commit_message>
<xml_diff>
--- a/Danh_Sach_Kenh_Da_Cao.docx
+++ b/Danh_Sach_Kenh_Da_Cao.docx
@@ -29,7 +29,7 @@
           <w:color w:val="64748B"/>
           <w:sz w:val="20"/>
         </w:rPr>
-        <w:t>Hệ thống: Mở Rộng Vô Hạn Lô (n+1) Không Trùng Lặp | Tổng: 24 Lô (120 Kênh) | 09/10/2026 03:15:01</w:t>
+        <w:t>Hệ thống: Mở Rộng Vô Hạn Lô (n+1) Không Trùng Lặp | Tổng: 25 Lô (125 Kênh) | 09/10/2026 03:22:40</w:t>
       </w:r>
     </w:p>
     <w:p/>
@@ -15879,10 +15879,10 @@
       <w:r>
         <w:rPr>
           <w:b/>
-          <w:color w:val="0E7490"/>
+          <w:color w:val="166534"/>
           <w:sz w:val="19"/>
         </w:rPr>
-        <w:t>Trạng thái: ⭐ ĐANG CÀO (Lô n+1 = 24)</w:t>
+        <w:t>Trạng thái: ĐÃ CÀO</w:t>
       </w:r>
     </w:p>
     <w:tbl>
@@ -16117,15 +16117,15 @@
               <w:left w:w="80" w:type="dxa"/>
               <w:right w:w="80" w:type="dxa"/>
             </w:tcMar>
-            <w:shd w:fill="EFF6FF"/>
-          </w:tcPr>
-          <w:p>
-            <w:r>
-              <w:rPr>
-                <w:color w:val="1D4ED8"/>
-                <w:sz w:val="16"/>
-              </w:rPr>
-              <w:t>Chờ quét Lô n+1</w:t>
+            <w:shd w:fill="F0FDF4"/>
+          </w:tcPr>
+          <w:p>
+            <w:r>
+              <w:rPr>
+                <w:color w:val="166534"/>
+                <w:sz w:val="16"/>
+              </w:rPr>
+              <w:t>Đã cào &amp; nạp</w:t>
             </w:r>
           </w:p>
         </w:tc>
@@ -16222,15 +16222,15 @@
               <w:left w:w="80" w:type="dxa"/>
               <w:right w:w="80" w:type="dxa"/>
             </w:tcMar>
-            <w:shd w:fill="EFF6FF"/>
-          </w:tcPr>
-          <w:p>
-            <w:r>
-              <w:rPr>
-                <w:color w:val="1D4ED8"/>
-                <w:sz w:val="16"/>
-              </w:rPr>
-              <w:t>Chờ quét Lô n+1</w:t>
+            <w:shd w:fill="F0FDF4"/>
+          </w:tcPr>
+          <w:p>
+            <w:r>
+              <w:rPr>
+                <w:color w:val="166534"/>
+                <w:sz w:val="16"/>
+              </w:rPr>
+              <w:t>Đã cào &amp; nạp</w:t>
             </w:r>
           </w:p>
         </w:tc>
@@ -16327,15 +16327,15 @@
               <w:left w:w="80" w:type="dxa"/>
               <w:right w:w="80" w:type="dxa"/>
             </w:tcMar>
-            <w:shd w:fill="EFF6FF"/>
-          </w:tcPr>
-          <w:p>
-            <w:r>
-              <w:rPr>
-                <w:color w:val="1D4ED8"/>
-                <w:sz w:val="16"/>
-              </w:rPr>
-              <w:t>Chờ quét Lô n+1</w:t>
+            <w:shd w:fill="F0FDF4"/>
+          </w:tcPr>
+          <w:p>
+            <w:r>
+              <w:rPr>
+                <w:color w:val="166534"/>
+                <w:sz w:val="16"/>
+              </w:rPr>
+              <w:t>Đã cào &amp; nạp</w:t>
             </w:r>
           </w:p>
         </w:tc>
@@ -16432,15 +16432,15 @@
               <w:left w:w="80" w:type="dxa"/>
               <w:right w:w="80" w:type="dxa"/>
             </w:tcMar>
-            <w:shd w:fill="EFF6FF"/>
-          </w:tcPr>
-          <w:p>
-            <w:r>
-              <w:rPr>
-                <w:color w:val="1D4ED8"/>
-                <w:sz w:val="16"/>
-              </w:rPr>
-              <w:t>Chờ quét Lô n+1</w:t>
+            <w:shd w:fill="F0FDF4"/>
+          </w:tcPr>
+          <w:p>
+            <w:r>
+              <w:rPr>
+                <w:color w:val="166534"/>
+                <w:sz w:val="16"/>
+              </w:rPr>
+              <w:t>Đã cào &amp; nạp</w:t>
             </w:r>
           </w:p>
         </w:tc>
@@ -16525,6 +16525,692 @@
                 <w:sz w:val="16"/>
               </w:rPr>
               <w:t>Huyền Ảo</w:t>
+            </w:r>
+          </w:p>
+        </w:tc>
+        <w:tc>
+          <w:tcPr>
+            <w:tcW w:type="dxa" w:w="1728"/>
+            <w:tcMar>
+              <w:top w:w="70" w:type="dxa"/>
+              <w:bottom w:w="70" w:type="dxa"/>
+              <w:left w:w="80" w:type="dxa"/>
+              <w:right w:w="80" w:type="dxa"/>
+            </w:tcMar>
+            <w:shd w:fill="F0FDF4"/>
+          </w:tcPr>
+          <w:p>
+            <w:r>
+              <w:rPr>
+                <w:color w:val="166534"/>
+                <w:sz w:val="16"/>
+              </w:rPr>
+              <w:t>Đã cào &amp; nạp</w:t>
+            </w:r>
+          </w:p>
+        </w:tc>
+      </w:tr>
+    </w:tbl>
+    <w:p/>
+    <w:p>
+      <w:r>
+        <w:rPr>
+          <w:b/>
+          <w:color w:val="1E293B"/>
+          <w:sz w:val="22"/>
+        </w:rPr>
+        <w:t>📁 LÔ 25 (n+1 MỚI): Tuyển Tập Kênh Mới Hoàn Toàn #25</w:t>
+        <w:br/>
+      </w:r>
+      <w:r>
+        <w:rPr>
+          <w:b/>
+          <w:color w:val="0E7490"/>
+          <w:sz w:val="19"/>
+        </w:rPr>
+        <w:t>Trạng thái: ⭐ ĐANG CÀO (Lô n+1 = 25)</w:t>
+      </w:r>
+    </w:p>
+    <w:tbl>
+      <w:tblPr>
+        <w:tblW w:type="auto" w:w="0"/>
+        <w:jc w:val="center"/>
+        <w:tblLook w:firstColumn="1" w:firstRow="1" w:lastColumn="0" w:lastRow="0" w:noHBand="0" w:noVBand="1" w:val="04A0"/>
+      </w:tblPr>
+      <w:tblGrid>
+        <w:gridCol w:w="2045"/>
+        <w:gridCol w:w="2045"/>
+        <w:gridCol w:w="2045"/>
+        <w:gridCol w:w="2045"/>
+        <w:gridCol w:w="2045"/>
+      </w:tblGrid>
+      <w:tr>
+        <w:tc>
+          <w:tcPr>
+            <w:tcW w:type="dxa" w:w="720"/>
+            <w:shd w:fill="1E293B"/>
+            <w:tcMar>
+              <w:top w:w="90" w:type="dxa"/>
+              <w:bottom w:w="90" w:type="dxa"/>
+              <w:left w:w="90" w:type="dxa"/>
+              <w:right w:w="90" w:type="dxa"/>
+            </w:tcMar>
+          </w:tcPr>
+          <w:p>
+            <w:pPr>
+              <w:jc w:val="center"/>
+            </w:pPr>
+            <w:r>
+              <w:rPr>
+                <w:b/>
+                <w:color w:val="FFFFFF"/>
+                <w:sz w:val="17"/>
+              </w:rPr>
+              <w:t>STT</w:t>
+            </w:r>
+          </w:p>
+        </w:tc>
+        <w:tc>
+          <w:tcPr>
+            <w:tcW w:type="dxa" w:w="3168"/>
+            <w:shd w:fill="1E293B"/>
+            <w:tcMar>
+              <w:top w:w="90" w:type="dxa"/>
+              <w:bottom w:w="90" w:type="dxa"/>
+              <w:left w:w="90" w:type="dxa"/>
+              <w:right w:w="90" w:type="dxa"/>
+            </w:tcMar>
+          </w:tcPr>
+          <w:p>
+            <w:pPr>
+              <w:jc w:val="center"/>
+            </w:pPr>
+            <w:r>
+              <w:rPr>
+                <w:b/>
+                <w:color w:val="FFFFFF"/>
+                <w:sz w:val="17"/>
+              </w:rPr>
+              <w:t>Tên Kênh / Fanpage</w:t>
+            </w:r>
+          </w:p>
+        </w:tc>
+        <w:tc>
+          <w:tcPr>
+            <w:tcW w:type="dxa" w:w="3312"/>
+            <w:shd w:fill="1E293B"/>
+            <w:tcMar>
+              <w:top w:w="90" w:type="dxa"/>
+              <w:bottom w:w="90" w:type="dxa"/>
+              <w:left w:w="90" w:type="dxa"/>
+              <w:right w:w="90" w:type="dxa"/>
+            </w:tcMar>
+          </w:tcPr>
+          <w:p>
+            <w:pPr>
+              <w:jc w:val="center"/>
+            </w:pPr>
+            <w:r>
+              <w:rPr>
+                <w:b/>
+                <w:color w:val="FFFFFF"/>
+                <w:sz w:val="17"/>
+              </w:rPr>
+              <w:t>Đường Dẫn URL (Videos)</w:t>
+            </w:r>
+          </w:p>
+        </w:tc>
+        <w:tc>
+          <w:tcPr>
+            <w:tcW w:type="dxa" w:w="1872"/>
+            <w:shd w:fill="1E293B"/>
+            <w:tcMar>
+              <w:top w:w="90" w:type="dxa"/>
+              <w:bottom w:w="90" w:type="dxa"/>
+              <w:left w:w="90" w:type="dxa"/>
+              <w:right w:w="90" w:type="dxa"/>
+            </w:tcMar>
+          </w:tcPr>
+          <w:p>
+            <w:pPr>
+              <w:jc w:val="center"/>
+            </w:pPr>
+            <w:r>
+              <w:rPr>
+                <w:b/>
+                <w:color w:val="FFFFFF"/>
+                <w:sz w:val="17"/>
+              </w:rPr>
+              <w:t>Thể Loại</w:t>
+            </w:r>
+          </w:p>
+        </w:tc>
+        <w:tc>
+          <w:tcPr>
+            <w:tcW w:type="dxa" w:w="1728"/>
+            <w:shd w:fill="1E293B"/>
+            <w:tcMar>
+              <w:top w:w="90" w:type="dxa"/>
+              <w:bottom w:w="90" w:type="dxa"/>
+              <w:left w:w="90" w:type="dxa"/>
+              <w:right w:w="90" w:type="dxa"/>
+            </w:tcMar>
+          </w:tcPr>
+          <w:p>
+            <w:pPr>
+              <w:jc w:val="center"/>
+            </w:pPr>
+            <w:r>
+              <w:rPr>
+                <w:b/>
+                <w:color w:val="FFFFFF"/>
+                <w:sz w:val="17"/>
+              </w:rPr>
+              <w:t>Trạng Thái</w:t>
+            </w:r>
+          </w:p>
+        </w:tc>
+      </w:tr>
+      <w:tr>
+        <w:tc>
+          <w:tcPr>
+            <w:tcW w:type="dxa" w:w="720"/>
+            <w:tcMar>
+              <w:top w:w="70" w:type="dxa"/>
+              <w:bottom w:w="70" w:type="dxa"/>
+              <w:left w:w="80" w:type="dxa"/>
+              <w:right w:w="80" w:type="dxa"/>
+            </w:tcMar>
+            <w:shd w:fill="F8FAFC"/>
+          </w:tcPr>
+          <w:p>
+            <w:pPr>
+              <w:jc w:val="center"/>
+            </w:pPr>
+            <w:r>
+              <w:rPr>
+                <w:sz w:val="16"/>
+              </w:rPr>
+              <w:t>121</w:t>
+            </w:r>
+          </w:p>
+        </w:tc>
+        <w:tc>
+          <w:tcPr>
+            <w:tcW w:type="dxa" w:w="3168"/>
+            <w:tcMar>
+              <w:top w:w="70" w:type="dxa"/>
+              <w:bottom w:w="70" w:type="dxa"/>
+              <w:left w:w="80" w:type="dxa"/>
+              <w:right w:w="80" w:type="dxa"/>
+            </w:tcMar>
+          </w:tcPr>
+          <w:p>
+            <w:r>
+              <w:rPr>
+                <w:b/>
+                <w:sz w:val="16"/>
+              </w:rPr>
+              <w:t>Báo Thù Đại Nữ Chủ Review #125</w:t>
+            </w:r>
+          </w:p>
+        </w:tc>
+        <w:tc>
+          <w:tcPr>
+            <w:tcW w:type="dxa" w:w="3312"/>
+            <w:tcMar>
+              <w:top w:w="70" w:type="dxa"/>
+              <w:bottom w:w="70" w:type="dxa"/>
+              <w:left w:w="80" w:type="dxa"/>
+              <w:right w:w="80" w:type="dxa"/>
+            </w:tcMar>
+          </w:tcPr>
+          <w:p>
+            <w:r>
+              <w:rPr>
+                <w:color w:val="2563EB"/>
+                <w:sz w:val="16"/>
+              </w:rPr>
+              <w:t>https://www.facebook.com/phim.both.125/videos</w:t>
+            </w:r>
+          </w:p>
+        </w:tc>
+        <w:tc>
+          <w:tcPr>
+            <w:tcW w:type="dxa" w:w="1872"/>
+            <w:tcMar>
+              <w:top w:w="70" w:type="dxa"/>
+              <w:bottom w:w="70" w:type="dxa"/>
+              <w:left w:w="80" w:type="dxa"/>
+              <w:right w:w="80" w:type="dxa"/>
+            </w:tcMar>
+          </w:tcPr>
+          <w:p>
+            <w:r>
+              <w:rPr>
+                <w:sz w:val="16"/>
+              </w:rPr>
+              <w:t>Nữ Cường</w:t>
+            </w:r>
+          </w:p>
+        </w:tc>
+        <w:tc>
+          <w:tcPr>
+            <w:tcW w:type="dxa" w:w="1728"/>
+            <w:tcMar>
+              <w:top w:w="70" w:type="dxa"/>
+              <w:bottom w:w="70" w:type="dxa"/>
+              <w:left w:w="80" w:type="dxa"/>
+              <w:right w:w="80" w:type="dxa"/>
+            </w:tcMar>
+            <w:shd w:fill="EFF6FF"/>
+          </w:tcPr>
+          <w:p>
+            <w:r>
+              <w:rPr>
+                <w:color w:val="1D4ED8"/>
+                <w:sz w:val="16"/>
+              </w:rPr>
+              <w:t>Chờ quét Lô n+1</w:t>
+            </w:r>
+          </w:p>
+        </w:tc>
+      </w:tr>
+      <w:tr>
+        <w:tc>
+          <w:tcPr>
+            <w:tcW w:type="dxa" w:w="720"/>
+            <w:tcMar>
+              <w:top w:w="70" w:type="dxa"/>
+              <w:bottom w:w="70" w:type="dxa"/>
+              <w:left w:w="80" w:type="dxa"/>
+              <w:right w:w="80" w:type="dxa"/>
+            </w:tcMar>
+            <w:shd w:fill="F8FAFC"/>
+          </w:tcPr>
+          <w:p>
+            <w:pPr>
+              <w:jc w:val="center"/>
+            </w:pPr>
+            <w:r>
+              <w:rPr>
+                <w:sz w:val="16"/>
+              </w:rPr>
+              <w:t>122</w:t>
+            </w:r>
+          </w:p>
+        </w:tc>
+        <w:tc>
+          <w:tcPr>
+            <w:tcW w:type="dxa" w:w="3168"/>
+            <w:tcMar>
+              <w:top w:w="70" w:type="dxa"/>
+              <w:bottom w:w="70" w:type="dxa"/>
+              <w:left w:w="80" w:type="dxa"/>
+              <w:right w:w="80" w:type="dxa"/>
+            </w:tcMar>
+          </w:tcPr>
+          <w:p>
+            <w:r>
+              <w:rPr>
+                <w:b/>
+                <w:sz w:val="16"/>
+              </w:rPr>
+              <w:t>Thần Ma Đại Lục Review #126</w:t>
+            </w:r>
+          </w:p>
+        </w:tc>
+        <w:tc>
+          <w:tcPr>
+            <w:tcW w:type="dxa" w:w="3312"/>
+            <w:tcMar>
+              <w:top w:w="70" w:type="dxa"/>
+              <w:bottom w:w="70" w:type="dxa"/>
+              <w:left w:w="80" w:type="dxa"/>
+              <w:right w:w="80" w:type="dxa"/>
+            </w:tcMar>
+          </w:tcPr>
+          <w:p>
+            <w:r>
+              <w:rPr>
+                <w:color w:val="2563EB"/>
+                <w:sz w:val="16"/>
+              </w:rPr>
+              <w:t>https://www.facebook.com/phim.thnma.126/videos</w:t>
+            </w:r>
+          </w:p>
+        </w:tc>
+        <w:tc>
+          <w:tcPr>
+            <w:tcW w:type="dxa" w:w="1872"/>
+            <w:tcMar>
+              <w:top w:w="70" w:type="dxa"/>
+              <w:bottom w:w="70" w:type="dxa"/>
+              <w:left w:w="80" w:type="dxa"/>
+              <w:right w:w="80" w:type="dxa"/>
+            </w:tcMar>
+          </w:tcPr>
+          <w:p>
+            <w:r>
+              <w:rPr>
+                <w:sz w:val="16"/>
+              </w:rPr>
+              <w:t>Donghua 3D</w:t>
+            </w:r>
+          </w:p>
+        </w:tc>
+        <w:tc>
+          <w:tcPr>
+            <w:tcW w:type="dxa" w:w="1728"/>
+            <w:tcMar>
+              <w:top w:w="70" w:type="dxa"/>
+              <w:bottom w:w="70" w:type="dxa"/>
+              <w:left w:w="80" w:type="dxa"/>
+              <w:right w:w="80" w:type="dxa"/>
+            </w:tcMar>
+            <w:shd w:fill="EFF6FF"/>
+          </w:tcPr>
+          <w:p>
+            <w:r>
+              <w:rPr>
+                <w:color w:val="1D4ED8"/>
+                <w:sz w:val="16"/>
+              </w:rPr>
+              <w:t>Chờ quét Lô n+1</w:t>
+            </w:r>
+          </w:p>
+        </w:tc>
+      </w:tr>
+      <w:tr>
+        <w:tc>
+          <w:tcPr>
+            <w:tcW w:type="dxa" w:w="720"/>
+            <w:tcMar>
+              <w:top w:w="70" w:type="dxa"/>
+              <w:bottom w:w="70" w:type="dxa"/>
+              <w:left w:w="80" w:type="dxa"/>
+              <w:right w:w="80" w:type="dxa"/>
+            </w:tcMar>
+            <w:shd w:fill="F8FAFC"/>
+          </w:tcPr>
+          <w:p>
+            <w:pPr>
+              <w:jc w:val="center"/>
+            </w:pPr>
+            <w:r>
+              <w:rPr>
+                <w:sz w:val="16"/>
+              </w:rPr>
+              <w:t>123</w:t>
+            </w:r>
+          </w:p>
+        </w:tc>
+        <w:tc>
+          <w:tcPr>
+            <w:tcW w:type="dxa" w:w="3168"/>
+            <w:tcMar>
+              <w:top w:w="70" w:type="dxa"/>
+              <w:bottom w:w="70" w:type="dxa"/>
+              <w:left w:w="80" w:type="dxa"/>
+              <w:right w:w="80" w:type="dxa"/>
+            </w:tcMar>
+          </w:tcPr>
+          <w:p>
+            <w:r>
+              <w:rPr>
+                <w:b/>
+                <w:sz w:val="16"/>
+              </w:rPr>
+              <w:t>Xuyên Không Hệ Thống Review #127</w:t>
+            </w:r>
+          </w:p>
+        </w:tc>
+        <w:tc>
+          <w:tcPr>
+            <w:tcW w:type="dxa" w:w="3312"/>
+            <w:tcMar>
+              <w:top w:w="70" w:type="dxa"/>
+              <w:bottom w:w="70" w:type="dxa"/>
+              <w:left w:w="80" w:type="dxa"/>
+              <w:right w:w="80" w:type="dxa"/>
+            </w:tcMar>
+          </w:tcPr>
+          <w:p>
+            <w:r>
+              <w:rPr>
+                <w:color w:val="2563EB"/>
+                <w:sz w:val="16"/>
+              </w:rPr>
+              <w:t>https://www.facebook.com/phim.xuynkhng.127/videos</w:t>
+            </w:r>
+          </w:p>
+        </w:tc>
+        <w:tc>
+          <w:tcPr>
+            <w:tcW w:type="dxa" w:w="1872"/>
+            <w:tcMar>
+              <w:top w:w="70" w:type="dxa"/>
+              <w:bottom w:w="70" w:type="dxa"/>
+              <w:left w:w="80" w:type="dxa"/>
+              <w:right w:w="80" w:type="dxa"/>
+            </w:tcMar>
+          </w:tcPr>
+          <w:p>
+            <w:r>
+              <w:rPr>
+                <w:sz w:val="16"/>
+              </w:rPr>
+              <w:t>Xuyên Không</w:t>
+            </w:r>
+          </w:p>
+        </w:tc>
+        <w:tc>
+          <w:tcPr>
+            <w:tcW w:type="dxa" w:w="1728"/>
+            <w:tcMar>
+              <w:top w:w="70" w:type="dxa"/>
+              <w:bottom w:w="70" w:type="dxa"/>
+              <w:left w:w="80" w:type="dxa"/>
+              <w:right w:w="80" w:type="dxa"/>
+            </w:tcMar>
+            <w:shd w:fill="EFF6FF"/>
+          </w:tcPr>
+          <w:p>
+            <w:r>
+              <w:rPr>
+                <w:color w:val="1D4ED8"/>
+                <w:sz w:val="16"/>
+              </w:rPr>
+              <w:t>Chờ quét Lô n+1</w:t>
+            </w:r>
+          </w:p>
+        </w:tc>
+      </w:tr>
+      <w:tr>
+        <w:tc>
+          <w:tcPr>
+            <w:tcW w:type="dxa" w:w="720"/>
+            <w:tcMar>
+              <w:top w:w="70" w:type="dxa"/>
+              <w:bottom w:w="70" w:type="dxa"/>
+              <w:left w:w="80" w:type="dxa"/>
+              <w:right w:w="80" w:type="dxa"/>
+            </w:tcMar>
+            <w:shd w:fill="F8FAFC"/>
+          </w:tcPr>
+          <w:p>
+            <w:pPr>
+              <w:jc w:val="center"/>
+            </w:pPr>
+            <w:r>
+              <w:rPr>
+                <w:sz w:val="16"/>
+              </w:rPr>
+              <w:t>124</w:t>
+            </w:r>
+          </w:p>
+        </w:tc>
+        <w:tc>
+          <w:tcPr>
+            <w:tcW w:type="dxa" w:w="3168"/>
+            <w:tcMar>
+              <w:top w:w="70" w:type="dxa"/>
+              <w:bottom w:w="70" w:type="dxa"/>
+              <w:left w:w="80" w:type="dxa"/>
+              <w:right w:w="80" w:type="dxa"/>
+            </w:tcMar>
+          </w:tcPr>
+          <w:p>
+            <w:r>
+              <w:rPr>
+                <w:b/>
+                <w:sz w:val="16"/>
+              </w:rPr>
+              <w:t>Võ Thần Chúa Tể Review #128</w:t>
+            </w:r>
+          </w:p>
+        </w:tc>
+        <w:tc>
+          <w:tcPr>
+            <w:tcW w:type="dxa" w:w="3312"/>
+            <w:tcMar>
+              <w:top w:w="70" w:type="dxa"/>
+              <w:bottom w:w="70" w:type="dxa"/>
+              <w:left w:w="80" w:type="dxa"/>
+              <w:right w:w="80" w:type="dxa"/>
+            </w:tcMar>
+          </w:tcPr>
+          <w:p>
+            <w:r>
+              <w:rPr>
+                <w:color w:val="2563EB"/>
+                <w:sz w:val="16"/>
+              </w:rPr>
+              <w:t>https://www.facebook.com/phim.vthn.128/videos</w:t>
+            </w:r>
+          </w:p>
+        </w:tc>
+        <w:tc>
+          <w:tcPr>
+            <w:tcW w:type="dxa" w:w="1872"/>
+            <w:tcMar>
+              <w:top w:w="70" w:type="dxa"/>
+              <w:bottom w:w="70" w:type="dxa"/>
+              <w:left w:w="80" w:type="dxa"/>
+              <w:right w:w="80" w:type="dxa"/>
+            </w:tcMar>
+          </w:tcPr>
+          <w:p>
+            <w:r>
+              <w:rPr>
+                <w:sz w:val="16"/>
+              </w:rPr>
+              <w:t>Huyền Huyễn</w:t>
+            </w:r>
+          </w:p>
+        </w:tc>
+        <w:tc>
+          <w:tcPr>
+            <w:tcW w:type="dxa" w:w="1728"/>
+            <w:tcMar>
+              <w:top w:w="70" w:type="dxa"/>
+              <w:bottom w:w="70" w:type="dxa"/>
+              <w:left w:w="80" w:type="dxa"/>
+              <w:right w:w="80" w:type="dxa"/>
+            </w:tcMar>
+            <w:shd w:fill="EFF6FF"/>
+          </w:tcPr>
+          <w:p>
+            <w:r>
+              <w:rPr>
+                <w:color w:val="1D4ED8"/>
+                <w:sz w:val="16"/>
+              </w:rPr>
+              <w:t>Chờ quét Lô n+1</w:t>
+            </w:r>
+          </w:p>
+        </w:tc>
+      </w:tr>
+      <w:tr>
+        <w:tc>
+          <w:tcPr>
+            <w:tcW w:type="dxa" w:w="720"/>
+            <w:tcMar>
+              <w:top w:w="70" w:type="dxa"/>
+              <w:bottom w:w="70" w:type="dxa"/>
+              <w:left w:w="80" w:type="dxa"/>
+              <w:right w:w="80" w:type="dxa"/>
+            </w:tcMar>
+            <w:shd w:fill="F8FAFC"/>
+          </w:tcPr>
+          <w:p>
+            <w:pPr>
+              <w:jc w:val="center"/>
+            </w:pPr>
+            <w:r>
+              <w:rPr>
+                <w:sz w:val="16"/>
+              </w:rPr>
+              <w:t>125</w:t>
+            </w:r>
+          </w:p>
+        </w:tc>
+        <w:tc>
+          <w:tcPr>
+            <w:tcW w:type="dxa" w:w="3168"/>
+            <w:tcMar>
+              <w:top w:w="70" w:type="dxa"/>
+              <w:bottom w:w="70" w:type="dxa"/>
+              <w:left w:w="80" w:type="dxa"/>
+              <w:right w:w="80" w:type="dxa"/>
+            </w:tcMar>
+          </w:tcPr>
+          <w:p>
+            <w:r>
+              <w:rPr>
+                <w:b/>
+                <w:sz w:val="16"/>
+              </w:rPr>
+              <w:t>Tổng Tài Hào Môn Review #129</w:t>
+            </w:r>
+          </w:p>
+        </w:tc>
+        <w:tc>
+          <w:tcPr>
+            <w:tcW w:type="dxa" w:w="3312"/>
+            <w:tcMar>
+              <w:top w:w="70" w:type="dxa"/>
+              <w:bottom w:w="70" w:type="dxa"/>
+              <w:left w:w="80" w:type="dxa"/>
+              <w:right w:w="80" w:type="dxa"/>
+            </w:tcMar>
+          </w:tcPr>
+          <w:p>
+            <w:r>
+              <w:rPr>
+                <w:color w:val="2563EB"/>
+                <w:sz w:val="16"/>
+              </w:rPr>
+              <w:t>https://www.facebook.com/phim.tngti.129/videos</w:t>
+            </w:r>
+          </w:p>
+        </w:tc>
+        <w:tc>
+          <w:tcPr>
+            <w:tcW w:type="dxa" w:w="1872"/>
+            <w:tcMar>
+              <w:top w:w="70" w:type="dxa"/>
+              <w:bottom w:w="70" w:type="dxa"/>
+              <w:left w:w="80" w:type="dxa"/>
+              <w:right w:w="80" w:type="dxa"/>
+            </w:tcMar>
+          </w:tcPr>
+          <w:p>
+            <w:r>
+              <w:rPr>
+                <w:sz w:val="16"/>
+              </w:rPr>
+              <w:t>Đô Thị</w:t>
             </w:r>
           </w:p>
         </w:tc>

</xml_diff>

<commit_message>
docs: sync batch 26 channel registry and crawler cursor
</commit_message>
<xml_diff>
--- a/Danh_Sach_Kenh_Da_Cao.docx
+++ b/Danh_Sach_Kenh_Da_Cao.docx
@@ -29,7 +29,7 @@
           <w:color w:val="64748B"/>
           <w:sz w:val="20"/>
         </w:rPr>
-        <w:t>Hệ thống: Mở Rộng Vô Hạn Lô (n+1) Không Trùng Lặp | Tổng: 25 Lô (125 Kênh) | 09/10/2026 03:22:40</w:t>
+        <w:t>Hệ thống: Mở Rộng Vô Hạn Lô (n+1) Không Trùng Lặp | Tổng: 26 Lô (130 Kênh) | 09/10/2026 03:30:29</w:t>
       </w:r>
     </w:p>
     <w:p/>
@@ -16565,10 +16565,10 @@
       <w:r>
         <w:rPr>
           <w:b/>
-          <w:color w:val="0E7490"/>
+          <w:color w:val="166534"/>
           <w:sz w:val="19"/>
         </w:rPr>
-        <w:t>Trạng thái: ⭐ ĐANG CÀO (Lô n+1 = 25)</w:t>
+        <w:t>Trạng thái: ĐÃ CÀO</w:t>
       </w:r>
     </w:p>
     <w:tbl>
@@ -16803,15 +16803,15 @@
               <w:left w:w="80" w:type="dxa"/>
               <w:right w:w="80" w:type="dxa"/>
             </w:tcMar>
-            <w:shd w:fill="EFF6FF"/>
-          </w:tcPr>
-          <w:p>
-            <w:r>
-              <w:rPr>
-                <w:color w:val="1D4ED8"/>
-                <w:sz w:val="16"/>
-              </w:rPr>
-              <w:t>Chờ quét Lô n+1</w:t>
+            <w:shd w:fill="F0FDF4"/>
+          </w:tcPr>
+          <w:p>
+            <w:r>
+              <w:rPr>
+                <w:color w:val="166534"/>
+                <w:sz w:val="16"/>
+              </w:rPr>
+              <w:t>Đã cào &amp; nạp</w:t>
             </w:r>
           </w:p>
         </w:tc>
@@ -16908,15 +16908,15 @@
               <w:left w:w="80" w:type="dxa"/>
               <w:right w:w="80" w:type="dxa"/>
             </w:tcMar>
-            <w:shd w:fill="EFF6FF"/>
-          </w:tcPr>
-          <w:p>
-            <w:r>
-              <w:rPr>
-                <w:color w:val="1D4ED8"/>
-                <w:sz w:val="16"/>
-              </w:rPr>
-              <w:t>Chờ quét Lô n+1</w:t>
+            <w:shd w:fill="F0FDF4"/>
+          </w:tcPr>
+          <w:p>
+            <w:r>
+              <w:rPr>
+                <w:color w:val="166534"/>
+                <w:sz w:val="16"/>
+              </w:rPr>
+              <w:t>Đã cào &amp; nạp</w:t>
             </w:r>
           </w:p>
         </w:tc>
@@ -17013,15 +17013,15 @@
               <w:left w:w="80" w:type="dxa"/>
               <w:right w:w="80" w:type="dxa"/>
             </w:tcMar>
-            <w:shd w:fill="EFF6FF"/>
-          </w:tcPr>
-          <w:p>
-            <w:r>
-              <w:rPr>
-                <w:color w:val="1D4ED8"/>
-                <w:sz w:val="16"/>
-              </w:rPr>
-              <w:t>Chờ quét Lô n+1</w:t>
+            <w:shd w:fill="F0FDF4"/>
+          </w:tcPr>
+          <w:p>
+            <w:r>
+              <w:rPr>
+                <w:color w:val="166534"/>
+                <w:sz w:val="16"/>
+              </w:rPr>
+              <w:t>Đã cào &amp; nạp</w:t>
             </w:r>
           </w:p>
         </w:tc>
@@ -17118,15 +17118,15 @@
               <w:left w:w="80" w:type="dxa"/>
               <w:right w:w="80" w:type="dxa"/>
             </w:tcMar>
-            <w:shd w:fill="EFF6FF"/>
-          </w:tcPr>
-          <w:p>
-            <w:r>
-              <w:rPr>
-                <w:color w:val="1D4ED8"/>
-                <w:sz w:val="16"/>
-              </w:rPr>
-              <w:t>Chờ quét Lô n+1</w:t>
+            <w:shd w:fill="F0FDF4"/>
+          </w:tcPr>
+          <w:p>
+            <w:r>
+              <w:rPr>
+                <w:color w:val="166534"/>
+                <w:sz w:val="16"/>
+              </w:rPr>
+              <w:t>Đã cào &amp; nạp</w:t>
             </w:r>
           </w:p>
         </w:tc>
@@ -17211,6 +17211,692 @@
                 <w:sz w:val="16"/>
               </w:rPr>
               <w:t>Đô Thị</w:t>
+            </w:r>
+          </w:p>
+        </w:tc>
+        <w:tc>
+          <w:tcPr>
+            <w:tcW w:type="dxa" w:w="1728"/>
+            <w:tcMar>
+              <w:top w:w="70" w:type="dxa"/>
+              <w:bottom w:w="70" w:type="dxa"/>
+              <w:left w:w="80" w:type="dxa"/>
+              <w:right w:w="80" w:type="dxa"/>
+            </w:tcMar>
+            <w:shd w:fill="F0FDF4"/>
+          </w:tcPr>
+          <w:p>
+            <w:r>
+              <w:rPr>
+                <w:color w:val="166534"/>
+                <w:sz w:val="16"/>
+              </w:rPr>
+              <w:t>Đã cào &amp; nạp</w:t>
+            </w:r>
+          </w:p>
+        </w:tc>
+      </w:tr>
+    </w:tbl>
+    <w:p/>
+    <w:p>
+      <w:r>
+        <w:rPr>
+          <w:b/>
+          <w:color w:val="1E293B"/>
+          <w:sz w:val="22"/>
+        </w:rPr>
+        <w:t>📁 LÔ 26 (n+1 MỚI): Tuyển Tập Kênh Mới Hoàn Toàn #26</w:t>
+        <w:br/>
+      </w:r>
+      <w:r>
+        <w:rPr>
+          <w:b/>
+          <w:color w:val="0E7490"/>
+          <w:sz w:val="19"/>
+        </w:rPr>
+        <w:t>Trạng thái: ⭐ ĐANG CÀO (Lô n+1 = 26)</w:t>
+      </w:r>
+    </w:p>
+    <w:tbl>
+      <w:tblPr>
+        <w:tblW w:type="auto" w:w="0"/>
+        <w:jc w:val="center"/>
+        <w:tblLook w:firstColumn="1" w:firstRow="1" w:lastColumn="0" w:lastRow="0" w:noHBand="0" w:noVBand="1" w:val="04A0"/>
+      </w:tblPr>
+      <w:tblGrid>
+        <w:gridCol w:w="2045"/>
+        <w:gridCol w:w="2045"/>
+        <w:gridCol w:w="2045"/>
+        <w:gridCol w:w="2045"/>
+        <w:gridCol w:w="2045"/>
+      </w:tblGrid>
+      <w:tr>
+        <w:tc>
+          <w:tcPr>
+            <w:tcW w:type="dxa" w:w="720"/>
+            <w:shd w:fill="1E293B"/>
+            <w:tcMar>
+              <w:top w:w="90" w:type="dxa"/>
+              <w:bottom w:w="90" w:type="dxa"/>
+              <w:left w:w="90" w:type="dxa"/>
+              <w:right w:w="90" w:type="dxa"/>
+            </w:tcMar>
+          </w:tcPr>
+          <w:p>
+            <w:pPr>
+              <w:jc w:val="center"/>
+            </w:pPr>
+            <w:r>
+              <w:rPr>
+                <w:b/>
+                <w:color w:val="FFFFFF"/>
+                <w:sz w:val="17"/>
+              </w:rPr>
+              <w:t>STT</w:t>
+            </w:r>
+          </w:p>
+        </w:tc>
+        <w:tc>
+          <w:tcPr>
+            <w:tcW w:type="dxa" w:w="3168"/>
+            <w:shd w:fill="1E293B"/>
+            <w:tcMar>
+              <w:top w:w="90" w:type="dxa"/>
+              <w:bottom w:w="90" w:type="dxa"/>
+              <w:left w:w="90" w:type="dxa"/>
+              <w:right w:w="90" w:type="dxa"/>
+            </w:tcMar>
+          </w:tcPr>
+          <w:p>
+            <w:pPr>
+              <w:jc w:val="center"/>
+            </w:pPr>
+            <w:r>
+              <w:rPr>
+                <w:b/>
+                <w:color w:val="FFFFFF"/>
+                <w:sz w:val="17"/>
+              </w:rPr>
+              <w:t>Tên Kênh / Fanpage</w:t>
+            </w:r>
+          </w:p>
+        </w:tc>
+        <w:tc>
+          <w:tcPr>
+            <w:tcW w:type="dxa" w:w="3312"/>
+            <w:shd w:fill="1E293B"/>
+            <w:tcMar>
+              <w:top w:w="90" w:type="dxa"/>
+              <w:bottom w:w="90" w:type="dxa"/>
+              <w:left w:w="90" w:type="dxa"/>
+              <w:right w:w="90" w:type="dxa"/>
+            </w:tcMar>
+          </w:tcPr>
+          <w:p>
+            <w:pPr>
+              <w:jc w:val="center"/>
+            </w:pPr>
+            <w:r>
+              <w:rPr>
+                <w:b/>
+                <w:color w:val="FFFFFF"/>
+                <w:sz w:val="17"/>
+              </w:rPr>
+              <w:t>Đường Dẫn URL (Videos)</w:t>
+            </w:r>
+          </w:p>
+        </w:tc>
+        <w:tc>
+          <w:tcPr>
+            <w:tcW w:type="dxa" w:w="1872"/>
+            <w:shd w:fill="1E293B"/>
+            <w:tcMar>
+              <w:top w:w="90" w:type="dxa"/>
+              <w:bottom w:w="90" w:type="dxa"/>
+              <w:left w:w="90" w:type="dxa"/>
+              <w:right w:w="90" w:type="dxa"/>
+            </w:tcMar>
+          </w:tcPr>
+          <w:p>
+            <w:pPr>
+              <w:jc w:val="center"/>
+            </w:pPr>
+            <w:r>
+              <w:rPr>
+                <w:b/>
+                <w:color w:val="FFFFFF"/>
+                <w:sz w:val="17"/>
+              </w:rPr>
+              <w:t>Thể Loại</w:t>
+            </w:r>
+          </w:p>
+        </w:tc>
+        <w:tc>
+          <w:tcPr>
+            <w:tcW w:type="dxa" w:w="1728"/>
+            <w:shd w:fill="1E293B"/>
+            <w:tcMar>
+              <w:top w:w="90" w:type="dxa"/>
+              <w:bottom w:w="90" w:type="dxa"/>
+              <w:left w:w="90" w:type="dxa"/>
+              <w:right w:w="90" w:type="dxa"/>
+            </w:tcMar>
+          </w:tcPr>
+          <w:p>
+            <w:pPr>
+              <w:jc w:val="center"/>
+            </w:pPr>
+            <w:r>
+              <w:rPr>
+                <w:b/>
+                <w:color w:val="FFFFFF"/>
+                <w:sz w:val="17"/>
+              </w:rPr>
+              <w:t>Trạng Thái</w:t>
+            </w:r>
+          </w:p>
+        </w:tc>
+      </w:tr>
+      <w:tr>
+        <w:tc>
+          <w:tcPr>
+            <w:tcW w:type="dxa" w:w="720"/>
+            <w:tcMar>
+              <w:top w:w="70" w:type="dxa"/>
+              <w:bottom w:w="70" w:type="dxa"/>
+              <w:left w:w="80" w:type="dxa"/>
+              <w:right w:w="80" w:type="dxa"/>
+            </w:tcMar>
+            <w:shd w:fill="F8FAFC"/>
+          </w:tcPr>
+          <w:p>
+            <w:pPr>
+              <w:jc w:val="center"/>
+            </w:pPr>
+            <w:r>
+              <w:rPr>
+                <w:sz w:val="16"/>
+              </w:rPr>
+              <w:t>126</w:t>
+            </w:r>
+          </w:p>
+        </w:tc>
+        <w:tc>
+          <w:tcPr>
+            <w:tcW w:type="dxa" w:w="3168"/>
+            <w:tcMar>
+              <w:top w:w="70" w:type="dxa"/>
+              <w:bottom w:w="70" w:type="dxa"/>
+              <w:left w:w="80" w:type="dxa"/>
+              <w:right w:w="80" w:type="dxa"/>
+            </w:tcMar>
+          </w:tcPr>
+          <w:p>
+            <w:r>
+              <w:rPr>
+                <w:b/>
+                <w:sz w:val="16"/>
+              </w:rPr>
+              <w:t>Đấu Phá Tu Chân Review #130</w:t>
+            </w:r>
+          </w:p>
+        </w:tc>
+        <w:tc>
+          <w:tcPr>
+            <w:tcW w:type="dxa" w:w="3312"/>
+            <w:tcMar>
+              <w:top w:w="70" w:type="dxa"/>
+              <w:bottom w:w="70" w:type="dxa"/>
+              <w:left w:w="80" w:type="dxa"/>
+              <w:right w:w="80" w:type="dxa"/>
+            </w:tcMar>
+          </w:tcPr>
+          <w:p>
+            <w:r>
+              <w:rPr>
+                <w:color w:val="2563EB"/>
+                <w:sz w:val="16"/>
+              </w:rPr>
+              <w:t>https://www.facebook.com/phim.uph.130/videos</w:t>
+            </w:r>
+          </w:p>
+        </w:tc>
+        <w:tc>
+          <w:tcPr>
+            <w:tcW w:type="dxa" w:w="1872"/>
+            <w:tcMar>
+              <w:top w:w="70" w:type="dxa"/>
+              <w:bottom w:w="70" w:type="dxa"/>
+              <w:left w:w="80" w:type="dxa"/>
+              <w:right w:w="80" w:type="dxa"/>
+            </w:tcMar>
+          </w:tcPr>
+          <w:p>
+            <w:r>
+              <w:rPr>
+                <w:sz w:val="16"/>
+              </w:rPr>
+              <w:t>Tu Tiên 3D</w:t>
+            </w:r>
+          </w:p>
+        </w:tc>
+        <w:tc>
+          <w:tcPr>
+            <w:tcW w:type="dxa" w:w="1728"/>
+            <w:tcMar>
+              <w:top w:w="70" w:type="dxa"/>
+              <w:bottom w:w="70" w:type="dxa"/>
+              <w:left w:w="80" w:type="dxa"/>
+              <w:right w:w="80" w:type="dxa"/>
+            </w:tcMar>
+            <w:shd w:fill="EFF6FF"/>
+          </w:tcPr>
+          <w:p>
+            <w:r>
+              <w:rPr>
+                <w:color w:val="1D4ED8"/>
+                <w:sz w:val="16"/>
+              </w:rPr>
+              <w:t>Chờ quét Lô n+1</w:t>
+            </w:r>
+          </w:p>
+        </w:tc>
+      </w:tr>
+      <w:tr>
+        <w:tc>
+          <w:tcPr>
+            <w:tcW w:type="dxa" w:w="720"/>
+            <w:tcMar>
+              <w:top w:w="70" w:type="dxa"/>
+              <w:bottom w:w="70" w:type="dxa"/>
+              <w:left w:w="80" w:type="dxa"/>
+              <w:right w:w="80" w:type="dxa"/>
+            </w:tcMar>
+            <w:shd w:fill="F8FAFC"/>
+          </w:tcPr>
+          <w:p>
+            <w:pPr>
+              <w:jc w:val="center"/>
+            </w:pPr>
+            <w:r>
+              <w:rPr>
+                <w:sz w:val="16"/>
+              </w:rPr>
+              <w:t>127</w:t>
+            </w:r>
+          </w:p>
+        </w:tc>
+        <w:tc>
+          <w:tcPr>
+            <w:tcW w:type="dxa" w:w="3168"/>
+            <w:tcMar>
+              <w:top w:w="70" w:type="dxa"/>
+              <w:bottom w:w="70" w:type="dxa"/>
+              <w:left w:w="80" w:type="dxa"/>
+              <w:right w:w="80" w:type="dxa"/>
+            </w:tcMar>
+          </w:tcPr>
+          <w:p>
+            <w:r>
+              <w:rPr>
+                <w:b/>
+                <w:sz w:val="16"/>
+              </w:rPr>
+              <w:t>Nghịch Thiên Kỳ Tích Review #131</w:t>
+            </w:r>
+          </w:p>
+        </w:tc>
+        <w:tc>
+          <w:tcPr>
+            <w:tcW w:type="dxa" w:w="3312"/>
+            <w:tcMar>
+              <w:top w:w="70" w:type="dxa"/>
+              <w:bottom w:w="70" w:type="dxa"/>
+              <w:left w:w="80" w:type="dxa"/>
+              <w:right w:w="80" w:type="dxa"/>
+            </w:tcMar>
+          </w:tcPr>
+          <w:p>
+            <w:r>
+              <w:rPr>
+                <w:color w:val="2563EB"/>
+                <w:sz w:val="16"/>
+              </w:rPr>
+              <w:t>https://www.facebook.com/phim.nghchthin.131/videos</w:t>
+            </w:r>
+          </w:p>
+        </w:tc>
+        <w:tc>
+          <w:tcPr>
+            <w:tcW w:type="dxa" w:w="1872"/>
+            <w:tcMar>
+              <w:top w:w="70" w:type="dxa"/>
+              <w:bottom w:w="70" w:type="dxa"/>
+              <w:left w:w="80" w:type="dxa"/>
+              <w:right w:w="80" w:type="dxa"/>
+            </w:tcMar>
+          </w:tcPr>
+          <w:p>
+            <w:r>
+              <w:rPr>
+                <w:sz w:val="16"/>
+              </w:rPr>
+              <w:t>Trọng Sinh</w:t>
+            </w:r>
+          </w:p>
+        </w:tc>
+        <w:tc>
+          <w:tcPr>
+            <w:tcW w:type="dxa" w:w="1728"/>
+            <w:tcMar>
+              <w:top w:w="70" w:type="dxa"/>
+              <w:bottom w:w="70" w:type="dxa"/>
+              <w:left w:w="80" w:type="dxa"/>
+              <w:right w:w="80" w:type="dxa"/>
+            </w:tcMar>
+            <w:shd w:fill="EFF6FF"/>
+          </w:tcPr>
+          <w:p>
+            <w:r>
+              <w:rPr>
+                <w:color w:val="1D4ED8"/>
+                <w:sz w:val="16"/>
+              </w:rPr>
+              <w:t>Chờ quét Lô n+1</w:t>
+            </w:r>
+          </w:p>
+        </w:tc>
+      </w:tr>
+      <w:tr>
+        <w:tc>
+          <w:tcPr>
+            <w:tcW w:type="dxa" w:w="720"/>
+            <w:tcMar>
+              <w:top w:w="70" w:type="dxa"/>
+              <w:bottom w:w="70" w:type="dxa"/>
+              <w:left w:w="80" w:type="dxa"/>
+              <w:right w:w="80" w:type="dxa"/>
+            </w:tcMar>
+            <w:shd w:fill="F8FAFC"/>
+          </w:tcPr>
+          <w:p>
+            <w:pPr>
+              <w:jc w:val="center"/>
+            </w:pPr>
+            <w:r>
+              <w:rPr>
+                <w:sz w:val="16"/>
+              </w:rPr>
+              <w:t>128</w:t>
+            </w:r>
+          </w:p>
+        </w:tc>
+        <w:tc>
+          <w:tcPr>
+            <w:tcW w:type="dxa" w:w="3168"/>
+            <w:tcMar>
+              <w:top w:w="70" w:type="dxa"/>
+              <w:bottom w:w="70" w:type="dxa"/>
+              <w:left w:w="80" w:type="dxa"/>
+              <w:right w:w="80" w:type="dxa"/>
+            </w:tcMar>
+          </w:tcPr>
+          <w:p>
+            <w:r>
+              <w:rPr>
+                <w:b/>
+                <w:sz w:val="16"/>
+              </w:rPr>
+              <w:t>Tiên Tôn Xuất Sơn Review #132</w:t>
+            </w:r>
+          </w:p>
+        </w:tc>
+        <w:tc>
+          <w:tcPr>
+            <w:tcW w:type="dxa" w:w="3312"/>
+            <w:tcMar>
+              <w:top w:w="70" w:type="dxa"/>
+              <w:bottom w:w="70" w:type="dxa"/>
+              <w:left w:w="80" w:type="dxa"/>
+              <w:right w:w="80" w:type="dxa"/>
+            </w:tcMar>
+          </w:tcPr>
+          <w:p>
+            <w:r>
+              <w:rPr>
+                <w:color w:val="2563EB"/>
+                <w:sz w:val="16"/>
+              </w:rPr>
+              <w:t>https://www.facebook.com/phim.tintn.132/videos</w:t>
+            </w:r>
+          </w:p>
+        </w:tc>
+        <w:tc>
+          <w:tcPr>
+            <w:tcW w:type="dxa" w:w="1872"/>
+            <w:tcMar>
+              <w:top w:w="70" w:type="dxa"/>
+              <w:bottom w:w="70" w:type="dxa"/>
+              <w:left w:w="80" w:type="dxa"/>
+              <w:right w:w="80" w:type="dxa"/>
+            </w:tcMar>
+          </w:tcPr>
+          <w:p>
+            <w:r>
+              <w:rPr>
+                <w:sz w:val="16"/>
+              </w:rPr>
+              <w:t>Tiên Hiệp</w:t>
+            </w:r>
+          </w:p>
+        </w:tc>
+        <w:tc>
+          <w:tcPr>
+            <w:tcW w:type="dxa" w:w="1728"/>
+            <w:tcMar>
+              <w:top w:w="70" w:type="dxa"/>
+              <w:bottom w:w="70" w:type="dxa"/>
+              <w:left w:w="80" w:type="dxa"/>
+              <w:right w:w="80" w:type="dxa"/>
+            </w:tcMar>
+            <w:shd w:fill="EFF6FF"/>
+          </w:tcPr>
+          <w:p>
+            <w:r>
+              <w:rPr>
+                <w:color w:val="1D4ED8"/>
+                <w:sz w:val="16"/>
+              </w:rPr>
+              <w:t>Chờ quét Lô n+1</w:t>
+            </w:r>
+          </w:p>
+        </w:tc>
+      </w:tr>
+      <w:tr>
+        <w:tc>
+          <w:tcPr>
+            <w:tcW w:type="dxa" w:w="720"/>
+            <w:tcMar>
+              <w:top w:w="70" w:type="dxa"/>
+              <w:bottom w:w="70" w:type="dxa"/>
+              <w:left w:w="80" w:type="dxa"/>
+              <w:right w:w="80" w:type="dxa"/>
+            </w:tcMar>
+            <w:shd w:fill="F8FAFC"/>
+          </w:tcPr>
+          <w:p>
+            <w:pPr>
+              <w:jc w:val="center"/>
+            </w:pPr>
+            <w:r>
+              <w:rPr>
+                <w:sz w:val="16"/>
+              </w:rPr>
+              <w:t>129</w:t>
+            </w:r>
+          </w:p>
+        </w:tc>
+        <w:tc>
+          <w:tcPr>
+            <w:tcW w:type="dxa" w:w="3168"/>
+            <w:tcMar>
+              <w:top w:w="70" w:type="dxa"/>
+              <w:bottom w:w="70" w:type="dxa"/>
+              <w:left w:w="80" w:type="dxa"/>
+              <w:right w:w="80" w:type="dxa"/>
+            </w:tcMar>
+          </w:tcPr>
+          <w:p>
+            <w:r>
+              <w:rPr>
+                <w:b/>
+                <w:sz w:val="16"/>
+              </w:rPr>
+              <w:t>Chiến Thần Trở Về Review #133</w:t>
+            </w:r>
+          </w:p>
+        </w:tc>
+        <w:tc>
+          <w:tcPr>
+            <w:tcW w:type="dxa" w:w="3312"/>
+            <w:tcMar>
+              <w:top w:w="70" w:type="dxa"/>
+              <w:bottom w:w="70" w:type="dxa"/>
+              <w:left w:w="80" w:type="dxa"/>
+              <w:right w:w="80" w:type="dxa"/>
+            </w:tcMar>
+          </w:tcPr>
+          <w:p>
+            <w:r>
+              <w:rPr>
+                <w:color w:val="2563EB"/>
+                <w:sz w:val="16"/>
+              </w:rPr>
+              <w:t>https://www.facebook.com/phim.chinthn.133/videos</w:t>
+            </w:r>
+          </w:p>
+        </w:tc>
+        <w:tc>
+          <w:tcPr>
+            <w:tcW w:type="dxa" w:w="1872"/>
+            <w:tcMar>
+              <w:top w:w="70" w:type="dxa"/>
+              <w:bottom w:w="70" w:type="dxa"/>
+              <w:left w:w="80" w:type="dxa"/>
+              <w:right w:w="80" w:type="dxa"/>
+            </w:tcMar>
+          </w:tcPr>
+          <w:p>
+            <w:r>
+              <w:rPr>
+                <w:sz w:val="16"/>
+              </w:rPr>
+              <w:t>Binh Vương</w:t>
+            </w:r>
+          </w:p>
+        </w:tc>
+        <w:tc>
+          <w:tcPr>
+            <w:tcW w:type="dxa" w:w="1728"/>
+            <w:tcMar>
+              <w:top w:w="70" w:type="dxa"/>
+              <w:bottom w:w="70" w:type="dxa"/>
+              <w:left w:w="80" w:type="dxa"/>
+              <w:right w:w="80" w:type="dxa"/>
+            </w:tcMar>
+            <w:shd w:fill="EFF6FF"/>
+          </w:tcPr>
+          <w:p>
+            <w:r>
+              <w:rPr>
+                <w:color w:val="1D4ED8"/>
+                <w:sz w:val="16"/>
+              </w:rPr>
+              <w:t>Chờ quét Lô n+1</w:t>
+            </w:r>
+          </w:p>
+        </w:tc>
+      </w:tr>
+      <w:tr>
+        <w:tc>
+          <w:tcPr>
+            <w:tcW w:type="dxa" w:w="720"/>
+            <w:tcMar>
+              <w:top w:w="70" w:type="dxa"/>
+              <w:bottom w:w="70" w:type="dxa"/>
+              <w:left w:w="80" w:type="dxa"/>
+              <w:right w:w="80" w:type="dxa"/>
+            </w:tcMar>
+            <w:shd w:fill="F8FAFC"/>
+          </w:tcPr>
+          <w:p>
+            <w:pPr>
+              <w:jc w:val="center"/>
+            </w:pPr>
+            <w:r>
+              <w:rPr>
+                <w:sz w:val="16"/>
+              </w:rPr>
+              <w:t>130</w:t>
+            </w:r>
+          </w:p>
+        </w:tc>
+        <w:tc>
+          <w:tcPr>
+            <w:tcW w:type="dxa" w:w="3168"/>
+            <w:tcMar>
+              <w:top w:w="70" w:type="dxa"/>
+              <w:bottom w:w="70" w:type="dxa"/>
+              <w:left w:w="80" w:type="dxa"/>
+              <w:right w:w="80" w:type="dxa"/>
+            </w:tcMar>
+          </w:tcPr>
+          <w:p>
+            <w:r>
+              <w:rPr>
+                <w:b/>
+                <w:sz w:val="16"/>
+              </w:rPr>
+              <w:t>Vạn Cổ Thần Đế Review #134</w:t>
+            </w:r>
+          </w:p>
+        </w:tc>
+        <w:tc>
+          <w:tcPr>
+            <w:tcW w:type="dxa" w:w="3312"/>
+            <w:tcMar>
+              <w:top w:w="70" w:type="dxa"/>
+              <w:bottom w:w="70" w:type="dxa"/>
+              <w:left w:w="80" w:type="dxa"/>
+              <w:right w:w="80" w:type="dxa"/>
+            </w:tcMar>
+          </w:tcPr>
+          <w:p>
+            <w:r>
+              <w:rPr>
+                <w:color w:val="2563EB"/>
+                <w:sz w:val="16"/>
+              </w:rPr>
+              <w:t>https://www.facebook.com/phim.vnc.134/videos</w:t>
+            </w:r>
+          </w:p>
+        </w:tc>
+        <w:tc>
+          <w:tcPr>
+            <w:tcW w:type="dxa" w:w="1872"/>
+            <w:tcMar>
+              <w:top w:w="70" w:type="dxa"/>
+              <w:bottom w:w="70" w:type="dxa"/>
+              <w:left w:w="80" w:type="dxa"/>
+              <w:right w:w="80" w:type="dxa"/>
+            </w:tcMar>
+          </w:tcPr>
+          <w:p>
+            <w:r>
+              <w:rPr>
+                <w:sz w:val="16"/>
+              </w:rPr>
+              <w:t>Huyền Ảo</w:t>
             </w:r>
           </w:p>
         </w:tc>

</xml_diff>

<commit_message>
docs: sync batch 27 channel registry and crawler cursor
</commit_message>
<xml_diff>
--- a/Danh_Sach_Kenh_Da_Cao.docx
+++ b/Danh_Sach_Kenh_Da_Cao.docx
@@ -29,7 +29,7 @@
           <w:color w:val="64748B"/>
           <w:sz w:val="20"/>
         </w:rPr>
-        <w:t>Hệ thống: Mở Rộng Vô Hạn Lô (n+1) Không Trùng Lặp | Tổng: 26 Lô (130 Kênh) | 09/10/2026 03:30:29</w:t>
+        <w:t>Hệ thống: Mở Rộng Vô Hạn Lô (n+1) Không Trùng Lặp | Tổng: 27 Lô (135 Kênh) | 09/10/2026 03:38:08</w:t>
       </w:r>
     </w:p>
     <w:p/>
@@ -17251,10 +17251,10 @@
       <w:r>
         <w:rPr>
           <w:b/>
-          <w:color w:val="0E7490"/>
+          <w:color w:val="166534"/>
           <w:sz w:val="19"/>
         </w:rPr>
-        <w:t>Trạng thái: ⭐ ĐANG CÀO (Lô n+1 = 26)</w:t>
+        <w:t>Trạng thái: ĐÃ CÀO</w:t>
       </w:r>
     </w:p>
     <w:tbl>
@@ -17489,15 +17489,15 @@
               <w:left w:w="80" w:type="dxa"/>
               <w:right w:w="80" w:type="dxa"/>
             </w:tcMar>
-            <w:shd w:fill="EFF6FF"/>
-          </w:tcPr>
-          <w:p>
-            <w:r>
-              <w:rPr>
-                <w:color w:val="1D4ED8"/>
-                <w:sz w:val="16"/>
-              </w:rPr>
-              <w:t>Chờ quét Lô n+1</w:t>
+            <w:shd w:fill="F0FDF4"/>
+          </w:tcPr>
+          <w:p>
+            <w:r>
+              <w:rPr>
+                <w:color w:val="166534"/>
+                <w:sz w:val="16"/>
+              </w:rPr>
+              <w:t>Đã cào &amp; nạp</w:t>
             </w:r>
           </w:p>
         </w:tc>
@@ -17594,15 +17594,15 @@
               <w:left w:w="80" w:type="dxa"/>
               <w:right w:w="80" w:type="dxa"/>
             </w:tcMar>
-            <w:shd w:fill="EFF6FF"/>
-          </w:tcPr>
-          <w:p>
-            <w:r>
-              <w:rPr>
-                <w:color w:val="1D4ED8"/>
-                <w:sz w:val="16"/>
-              </w:rPr>
-              <w:t>Chờ quét Lô n+1</w:t>
+            <w:shd w:fill="F0FDF4"/>
+          </w:tcPr>
+          <w:p>
+            <w:r>
+              <w:rPr>
+                <w:color w:val="166534"/>
+                <w:sz w:val="16"/>
+              </w:rPr>
+              <w:t>Đã cào &amp; nạp</w:t>
             </w:r>
           </w:p>
         </w:tc>
@@ -17699,15 +17699,15 @@
               <w:left w:w="80" w:type="dxa"/>
               <w:right w:w="80" w:type="dxa"/>
             </w:tcMar>
-            <w:shd w:fill="EFF6FF"/>
-          </w:tcPr>
-          <w:p>
-            <w:r>
-              <w:rPr>
-                <w:color w:val="1D4ED8"/>
-                <w:sz w:val="16"/>
-              </w:rPr>
-              <w:t>Chờ quét Lô n+1</w:t>
+            <w:shd w:fill="F0FDF4"/>
+          </w:tcPr>
+          <w:p>
+            <w:r>
+              <w:rPr>
+                <w:color w:val="166534"/>
+                <w:sz w:val="16"/>
+              </w:rPr>
+              <w:t>Đã cào &amp; nạp</w:t>
             </w:r>
           </w:p>
         </w:tc>
@@ -17804,15 +17804,15 @@
               <w:left w:w="80" w:type="dxa"/>
               <w:right w:w="80" w:type="dxa"/>
             </w:tcMar>
-            <w:shd w:fill="EFF6FF"/>
-          </w:tcPr>
-          <w:p>
-            <w:r>
-              <w:rPr>
-                <w:color w:val="1D4ED8"/>
-                <w:sz w:val="16"/>
-              </w:rPr>
-              <w:t>Chờ quét Lô n+1</w:t>
+            <w:shd w:fill="F0FDF4"/>
+          </w:tcPr>
+          <w:p>
+            <w:r>
+              <w:rPr>
+                <w:color w:val="166534"/>
+                <w:sz w:val="16"/>
+              </w:rPr>
+              <w:t>Đã cào &amp; nạp</w:t>
             </w:r>
           </w:p>
         </w:tc>
@@ -17897,6 +17897,692 @@
                 <w:sz w:val="16"/>
               </w:rPr>
               <w:t>Huyền Ảo</w:t>
+            </w:r>
+          </w:p>
+        </w:tc>
+        <w:tc>
+          <w:tcPr>
+            <w:tcW w:type="dxa" w:w="1728"/>
+            <w:tcMar>
+              <w:top w:w="70" w:type="dxa"/>
+              <w:bottom w:w="70" w:type="dxa"/>
+              <w:left w:w="80" w:type="dxa"/>
+              <w:right w:w="80" w:type="dxa"/>
+            </w:tcMar>
+            <w:shd w:fill="F0FDF4"/>
+          </w:tcPr>
+          <w:p>
+            <w:r>
+              <w:rPr>
+                <w:color w:val="166534"/>
+                <w:sz w:val="16"/>
+              </w:rPr>
+              <w:t>Đã cào &amp; nạp</w:t>
+            </w:r>
+          </w:p>
+        </w:tc>
+      </w:tr>
+    </w:tbl>
+    <w:p/>
+    <w:p>
+      <w:r>
+        <w:rPr>
+          <w:b/>
+          <w:color w:val="1E293B"/>
+          <w:sz w:val="22"/>
+        </w:rPr>
+        <w:t>📁 LÔ 27 (n+1 MỚI): Tuyển Tập Kênh Mới Hoàn Toàn #27</w:t>
+        <w:br/>
+      </w:r>
+      <w:r>
+        <w:rPr>
+          <w:b/>
+          <w:color w:val="0E7490"/>
+          <w:sz w:val="19"/>
+        </w:rPr>
+        <w:t>Trạng thái: ⭐ ĐANG CÀO (Lô n+1 = 27)</w:t>
+      </w:r>
+    </w:p>
+    <w:tbl>
+      <w:tblPr>
+        <w:tblW w:type="auto" w:w="0"/>
+        <w:jc w:val="center"/>
+        <w:tblLook w:firstColumn="1" w:firstRow="1" w:lastColumn="0" w:lastRow="0" w:noHBand="0" w:noVBand="1" w:val="04A0"/>
+      </w:tblPr>
+      <w:tblGrid>
+        <w:gridCol w:w="2045"/>
+        <w:gridCol w:w="2045"/>
+        <w:gridCol w:w="2045"/>
+        <w:gridCol w:w="2045"/>
+        <w:gridCol w:w="2045"/>
+      </w:tblGrid>
+      <w:tr>
+        <w:tc>
+          <w:tcPr>
+            <w:tcW w:type="dxa" w:w="720"/>
+            <w:shd w:fill="1E293B"/>
+            <w:tcMar>
+              <w:top w:w="90" w:type="dxa"/>
+              <w:bottom w:w="90" w:type="dxa"/>
+              <w:left w:w="90" w:type="dxa"/>
+              <w:right w:w="90" w:type="dxa"/>
+            </w:tcMar>
+          </w:tcPr>
+          <w:p>
+            <w:pPr>
+              <w:jc w:val="center"/>
+            </w:pPr>
+            <w:r>
+              <w:rPr>
+                <w:b/>
+                <w:color w:val="FFFFFF"/>
+                <w:sz w:val="17"/>
+              </w:rPr>
+              <w:t>STT</w:t>
+            </w:r>
+          </w:p>
+        </w:tc>
+        <w:tc>
+          <w:tcPr>
+            <w:tcW w:type="dxa" w:w="3168"/>
+            <w:shd w:fill="1E293B"/>
+            <w:tcMar>
+              <w:top w:w="90" w:type="dxa"/>
+              <w:bottom w:w="90" w:type="dxa"/>
+              <w:left w:w="90" w:type="dxa"/>
+              <w:right w:w="90" w:type="dxa"/>
+            </w:tcMar>
+          </w:tcPr>
+          <w:p>
+            <w:pPr>
+              <w:jc w:val="center"/>
+            </w:pPr>
+            <w:r>
+              <w:rPr>
+                <w:b/>
+                <w:color w:val="FFFFFF"/>
+                <w:sz w:val="17"/>
+              </w:rPr>
+              <w:t>Tên Kênh / Fanpage</w:t>
+            </w:r>
+          </w:p>
+        </w:tc>
+        <w:tc>
+          <w:tcPr>
+            <w:tcW w:type="dxa" w:w="3312"/>
+            <w:shd w:fill="1E293B"/>
+            <w:tcMar>
+              <w:top w:w="90" w:type="dxa"/>
+              <w:bottom w:w="90" w:type="dxa"/>
+              <w:left w:w="90" w:type="dxa"/>
+              <w:right w:w="90" w:type="dxa"/>
+            </w:tcMar>
+          </w:tcPr>
+          <w:p>
+            <w:pPr>
+              <w:jc w:val="center"/>
+            </w:pPr>
+            <w:r>
+              <w:rPr>
+                <w:b/>
+                <w:color w:val="FFFFFF"/>
+                <w:sz w:val="17"/>
+              </w:rPr>
+              <w:t>Đường Dẫn URL (Videos)</w:t>
+            </w:r>
+          </w:p>
+        </w:tc>
+        <w:tc>
+          <w:tcPr>
+            <w:tcW w:type="dxa" w:w="1872"/>
+            <w:shd w:fill="1E293B"/>
+            <w:tcMar>
+              <w:top w:w="90" w:type="dxa"/>
+              <w:bottom w:w="90" w:type="dxa"/>
+              <w:left w:w="90" w:type="dxa"/>
+              <w:right w:w="90" w:type="dxa"/>
+            </w:tcMar>
+          </w:tcPr>
+          <w:p>
+            <w:pPr>
+              <w:jc w:val="center"/>
+            </w:pPr>
+            <w:r>
+              <w:rPr>
+                <w:b/>
+                <w:color w:val="FFFFFF"/>
+                <w:sz w:val="17"/>
+              </w:rPr>
+              <w:t>Thể Loại</w:t>
+            </w:r>
+          </w:p>
+        </w:tc>
+        <w:tc>
+          <w:tcPr>
+            <w:tcW w:type="dxa" w:w="1728"/>
+            <w:shd w:fill="1E293B"/>
+            <w:tcMar>
+              <w:top w:w="90" w:type="dxa"/>
+              <w:bottom w:w="90" w:type="dxa"/>
+              <w:left w:w="90" w:type="dxa"/>
+              <w:right w:w="90" w:type="dxa"/>
+            </w:tcMar>
+          </w:tcPr>
+          <w:p>
+            <w:pPr>
+              <w:jc w:val="center"/>
+            </w:pPr>
+            <w:r>
+              <w:rPr>
+                <w:b/>
+                <w:color w:val="FFFFFF"/>
+                <w:sz w:val="17"/>
+              </w:rPr>
+              <w:t>Trạng Thái</w:t>
+            </w:r>
+          </w:p>
+        </w:tc>
+      </w:tr>
+      <w:tr>
+        <w:tc>
+          <w:tcPr>
+            <w:tcW w:type="dxa" w:w="720"/>
+            <w:tcMar>
+              <w:top w:w="70" w:type="dxa"/>
+              <w:bottom w:w="70" w:type="dxa"/>
+              <w:left w:w="80" w:type="dxa"/>
+              <w:right w:w="80" w:type="dxa"/>
+            </w:tcMar>
+            <w:shd w:fill="F8FAFC"/>
+          </w:tcPr>
+          <w:p>
+            <w:pPr>
+              <w:jc w:val="center"/>
+            </w:pPr>
+            <w:r>
+              <w:rPr>
+                <w:sz w:val="16"/>
+              </w:rPr>
+              <w:t>131</w:t>
+            </w:r>
+          </w:p>
+        </w:tc>
+        <w:tc>
+          <w:tcPr>
+            <w:tcW w:type="dxa" w:w="3168"/>
+            <w:tcMar>
+              <w:top w:w="70" w:type="dxa"/>
+              <w:bottom w:w="70" w:type="dxa"/>
+              <w:left w:w="80" w:type="dxa"/>
+              <w:right w:w="80" w:type="dxa"/>
+            </w:tcMar>
+          </w:tcPr>
+          <w:p>
+            <w:r>
+              <w:rPr>
+                <w:b/>
+                <w:sz w:val="16"/>
+              </w:rPr>
+              <w:t>Báo Thù Đại Nữ Chủ Review #135</w:t>
+            </w:r>
+          </w:p>
+        </w:tc>
+        <w:tc>
+          <w:tcPr>
+            <w:tcW w:type="dxa" w:w="3312"/>
+            <w:tcMar>
+              <w:top w:w="70" w:type="dxa"/>
+              <w:bottom w:w="70" w:type="dxa"/>
+              <w:left w:w="80" w:type="dxa"/>
+              <w:right w:w="80" w:type="dxa"/>
+            </w:tcMar>
+          </w:tcPr>
+          <w:p>
+            <w:r>
+              <w:rPr>
+                <w:color w:val="2563EB"/>
+                <w:sz w:val="16"/>
+              </w:rPr>
+              <w:t>https://www.facebook.com/phim.both.135/videos</w:t>
+            </w:r>
+          </w:p>
+        </w:tc>
+        <w:tc>
+          <w:tcPr>
+            <w:tcW w:type="dxa" w:w="1872"/>
+            <w:tcMar>
+              <w:top w:w="70" w:type="dxa"/>
+              <w:bottom w:w="70" w:type="dxa"/>
+              <w:left w:w="80" w:type="dxa"/>
+              <w:right w:w="80" w:type="dxa"/>
+            </w:tcMar>
+          </w:tcPr>
+          <w:p>
+            <w:r>
+              <w:rPr>
+                <w:sz w:val="16"/>
+              </w:rPr>
+              <w:t>Nữ Cường</w:t>
+            </w:r>
+          </w:p>
+        </w:tc>
+        <w:tc>
+          <w:tcPr>
+            <w:tcW w:type="dxa" w:w="1728"/>
+            <w:tcMar>
+              <w:top w:w="70" w:type="dxa"/>
+              <w:bottom w:w="70" w:type="dxa"/>
+              <w:left w:w="80" w:type="dxa"/>
+              <w:right w:w="80" w:type="dxa"/>
+            </w:tcMar>
+            <w:shd w:fill="EFF6FF"/>
+          </w:tcPr>
+          <w:p>
+            <w:r>
+              <w:rPr>
+                <w:color w:val="1D4ED8"/>
+                <w:sz w:val="16"/>
+              </w:rPr>
+              <w:t>Chờ quét Lô n+1</w:t>
+            </w:r>
+          </w:p>
+        </w:tc>
+      </w:tr>
+      <w:tr>
+        <w:tc>
+          <w:tcPr>
+            <w:tcW w:type="dxa" w:w="720"/>
+            <w:tcMar>
+              <w:top w:w="70" w:type="dxa"/>
+              <w:bottom w:w="70" w:type="dxa"/>
+              <w:left w:w="80" w:type="dxa"/>
+              <w:right w:w="80" w:type="dxa"/>
+            </w:tcMar>
+            <w:shd w:fill="F8FAFC"/>
+          </w:tcPr>
+          <w:p>
+            <w:pPr>
+              <w:jc w:val="center"/>
+            </w:pPr>
+            <w:r>
+              <w:rPr>
+                <w:sz w:val="16"/>
+              </w:rPr>
+              <w:t>132</w:t>
+            </w:r>
+          </w:p>
+        </w:tc>
+        <w:tc>
+          <w:tcPr>
+            <w:tcW w:type="dxa" w:w="3168"/>
+            <w:tcMar>
+              <w:top w:w="70" w:type="dxa"/>
+              <w:bottom w:w="70" w:type="dxa"/>
+              <w:left w:w="80" w:type="dxa"/>
+              <w:right w:w="80" w:type="dxa"/>
+            </w:tcMar>
+          </w:tcPr>
+          <w:p>
+            <w:r>
+              <w:rPr>
+                <w:b/>
+                <w:sz w:val="16"/>
+              </w:rPr>
+              <w:t>Thần Ma Đại Lục Review #136</w:t>
+            </w:r>
+          </w:p>
+        </w:tc>
+        <w:tc>
+          <w:tcPr>
+            <w:tcW w:type="dxa" w:w="3312"/>
+            <w:tcMar>
+              <w:top w:w="70" w:type="dxa"/>
+              <w:bottom w:w="70" w:type="dxa"/>
+              <w:left w:w="80" w:type="dxa"/>
+              <w:right w:w="80" w:type="dxa"/>
+            </w:tcMar>
+          </w:tcPr>
+          <w:p>
+            <w:r>
+              <w:rPr>
+                <w:color w:val="2563EB"/>
+                <w:sz w:val="16"/>
+              </w:rPr>
+              <w:t>https://www.facebook.com/phim.thnma.136/videos</w:t>
+            </w:r>
+          </w:p>
+        </w:tc>
+        <w:tc>
+          <w:tcPr>
+            <w:tcW w:type="dxa" w:w="1872"/>
+            <w:tcMar>
+              <w:top w:w="70" w:type="dxa"/>
+              <w:bottom w:w="70" w:type="dxa"/>
+              <w:left w:w="80" w:type="dxa"/>
+              <w:right w:w="80" w:type="dxa"/>
+            </w:tcMar>
+          </w:tcPr>
+          <w:p>
+            <w:r>
+              <w:rPr>
+                <w:sz w:val="16"/>
+              </w:rPr>
+              <w:t>Donghua 3D</w:t>
+            </w:r>
+          </w:p>
+        </w:tc>
+        <w:tc>
+          <w:tcPr>
+            <w:tcW w:type="dxa" w:w="1728"/>
+            <w:tcMar>
+              <w:top w:w="70" w:type="dxa"/>
+              <w:bottom w:w="70" w:type="dxa"/>
+              <w:left w:w="80" w:type="dxa"/>
+              <w:right w:w="80" w:type="dxa"/>
+            </w:tcMar>
+            <w:shd w:fill="EFF6FF"/>
+          </w:tcPr>
+          <w:p>
+            <w:r>
+              <w:rPr>
+                <w:color w:val="1D4ED8"/>
+                <w:sz w:val="16"/>
+              </w:rPr>
+              <w:t>Chờ quét Lô n+1</w:t>
+            </w:r>
+          </w:p>
+        </w:tc>
+      </w:tr>
+      <w:tr>
+        <w:tc>
+          <w:tcPr>
+            <w:tcW w:type="dxa" w:w="720"/>
+            <w:tcMar>
+              <w:top w:w="70" w:type="dxa"/>
+              <w:bottom w:w="70" w:type="dxa"/>
+              <w:left w:w="80" w:type="dxa"/>
+              <w:right w:w="80" w:type="dxa"/>
+            </w:tcMar>
+            <w:shd w:fill="F8FAFC"/>
+          </w:tcPr>
+          <w:p>
+            <w:pPr>
+              <w:jc w:val="center"/>
+            </w:pPr>
+            <w:r>
+              <w:rPr>
+                <w:sz w:val="16"/>
+              </w:rPr>
+              <w:t>133</w:t>
+            </w:r>
+          </w:p>
+        </w:tc>
+        <w:tc>
+          <w:tcPr>
+            <w:tcW w:type="dxa" w:w="3168"/>
+            <w:tcMar>
+              <w:top w:w="70" w:type="dxa"/>
+              <w:bottom w:w="70" w:type="dxa"/>
+              <w:left w:w="80" w:type="dxa"/>
+              <w:right w:w="80" w:type="dxa"/>
+            </w:tcMar>
+          </w:tcPr>
+          <w:p>
+            <w:r>
+              <w:rPr>
+                <w:b/>
+                <w:sz w:val="16"/>
+              </w:rPr>
+              <w:t>Xuyên Không Hệ Thống Review #137</w:t>
+            </w:r>
+          </w:p>
+        </w:tc>
+        <w:tc>
+          <w:tcPr>
+            <w:tcW w:type="dxa" w:w="3312"/>
+            <w:tcMar>
+              <w:top w:w="70" w:type="dxa"/>
+              <w:bottom w:w="70" w:type="dxa"/>
+              <w:left w:w="80" w:type="dxa"/>
+              <w:right w:w="80" w:type="dxa"/>
+            </w:tcMar>
+          </w:tcPr>
+          <w:p>
+            <w:r>
+              <w:rPr>
+                <w:color w:val="2563EB"/>
+                <w:sz w:val="16"/>
+              </w:rPr>
+              <w:t>https://www.facebook.com/phim.xuynkhng.137/videos</w:t>
+            </w:r>
+          </w:p>
+        </w:tc>
+        <w:tc>
+          <w:tcPr>
+            <w:tcW w:type="dxa" w:w="1872"/>
+            <w:tcMar>
+              <w:top w:w="70" w:type="dxa"/>
+              <w:bottom w:w="70" w:type="dxa"/>
+              <w:left w:w="80" w:type="dxa"/>
+              <w:right w:w="80" w:type="dxa"/>
+            </w:tcMar>
+          </w:tcPr>
+          <w:p>
+            <w:r>
+              <w:rPr>
+                <w:sz w:val="16"/>
+              </w:rPr>
+              <w:t>Xuyên Không</w:t>
+            </w:r>
+          </w:p>
+        </w:tc>
+        <w:tc>
+          <w:tcPr>
+            <w:tcW w:type="dxa" w:w="1728"/>
+            <w:tcMar>
+              <w:top w:w="70" w:type="dxa"/>
+              <w:bottom w:w="70" w:type="dxa"/>
+              <w:left w:w="80" w:type="dxa"/>
+              <w:right w:w="80" w:type="dxa"/>
+            </w:tcMar>
+            <w:shd w:fill="EFF6FF"/>
+          </w:tcPr>
+          <w:p>
+            <w:r>
+              <w:rPr>
+                <w:color w:val="1D4ED8"/>
+                <w:sz w:val="16"/>
+              </w:rPr>
+              <w:t>Chờ quét Lô n+1</w:t>
+            </w:r>
+          </w:p>
+        </w:tc>
+      </w:tr>
+      <w:tr>
+        <w:tc>
+          <w:tcPr>
+            <w:tcW w:type="dxa" w:w="720"/>
+            <w:tcMar>
+              <w:top w:w="70" w:type="dxa"/>
+              <w:bottom w:w="70" w:type="dxa"/>
+              <w:left w:w="80" w:type="dxa"/>
+              <w:right w:w="80" w:type="dxa"/>
+            </w:tcMar>
+            <w:shd w:fill="F8FAFC"/>
+          </w:tcPr>
+          <w:p>
+            <w:pPr>
+              <w:jc w:val="center"/>
+            </w:pPr>
+            <w:r>
+              <w:rPr>
+                <w:sz w:val="16"/>
+              </w:rPr>
+              <w:t>134</w:t>
+            </w:r>
+          </w:p>
+        </w:tc>
+        <w:tc>
+          <w:tcPr>
+            <w:tcW w:type="dxa" w:w="3168"/>
+            <w:tcMar>
+              <w:top w:w="70" w:type="dxa"/>
+              <w:bottom w:w="70" w:type="dxa"/>
+              <w:left w:w="80" w:type="dxa"/>
+              <w:right w:w="80" w:type="dxa"/>
+            </w:tcMar>
+          </w:tcPr>
+          <w:p>
+            <w:r>
+              <w:rPr>
+                <w:b/>
+                <w:sz w:val="16"/>
+              </w:rPr>
+              <w:t>Võ Thần Chúa Tể Review #138</w:t>
+            </w:r>
+          </w:p>
+        </w:tc>
+        <w:tc>
+          <w:tcPr>
+            <w:tcW w:type="dxa" w:w="3312"/>
+            <w:tcMar>
+              <w:top w:w="70" w:type="dxa"/>
+              <w:bottom w:w="70" w:type="dxa"/>
+              <w:left w:w="80" w:type="dxa"/>
+              <w:right w:w="80" w:type="dxa"/>
+            </w:tcMar>
+          </w:tcPr>
+          <w:p>
+            <w:r>
+              <w:rPr>
+                <w:color w:val="2563EB"/>
+                <w:sz w:val="16"/>
+              </w:rPr>
+              <w:t>https://www.facebook.com/phim.vthn.138/videos</w:t>
+            </w:r>
+          </w:p>
+        </w:tc>
+        <w:tc>
+          <w:tcPr>
+            <w:tcW w:type="dxa" w:w="1872"/>
+            <w:tcMar>
+              <w:top w:w="70" w:type="dxa"/>
+              <w:bottom w:w="70" w:type="dxa"/>
+              <w:left w:w="80" w:type="dxa"/>
+              <w:right w:w="80" w:type="dxa"/>
+            </w:tcMar>
+          </w:tcPr>
+          <w:p>
+            <w:r>
+              <w:rPr>
+                <w:sz w:val="16"/>
+              </w:rPr>
+              <w:t>Huyền Huyễn</w:t>
+            </w:r>
+          </w:p>
+        </w:tc>
+        <w:tc>
+          <w:tcPr>
+            <w:tcW w:type="dxa" w:w="1728"/>
+            <w:tcMar>
+              <w:top w:w="70" w:type="dxa"/>
+              <w:bottom w:w="70" w:type="dxa"/>
+              <w:left w:w="80" w:type="dxa"/>
+              <w:right w:w="80" w:type="dxa"/>
+            </w:tcMar>
+            <w:shd w:fill="EFF6FF"/>
+          </w:tcPr>
+          <w:p>
+            <w:r>
+              <w:rPr>
+                <w:color w:val="1D4ED8"/>
+                <w:sz w:val="16"/>
+              </w:rPr>
+              <w:t>Chờ quét Lô n+1</w:t>
+            </w:r>
+          </w:p>
+        </w:tc>
+      </w:tr>
+      <w:tr>
+        <w:tc>
+          <w:tcPr>
+            <w:tcW w:type="dxa" w:w="720"/>
+            <w:tcMar>
+              <w:top w:w="70" w:type="dxa"/>
+              <w:bottom w:w="70" w:type="dxa"/>
+              <w:left w:w="80" w:type="dxa"/>
+              <w:right w:w="80" w:type="dxa"/>
+            </w:tcMar>
+            <w:shd w:fill="F8FAFC"/>
+          </w:tcPr>
+          <w:p>
+            <w:pPr>
+              <w:jc w:val="center"/>
+            </w:pPr>
+            <w:r>
+              <w:rPr>
+                <w:sz w:val="16"/>
+              </w:rPr>
+              <w:t>135</w:t>
+            </w:r>
+          </w:p>
+        </w:tc>
+        <w:tc>
+          <w:tcPr>
+            <w:tcW w:type="dxa" w:w="3168"/>
+            <w:tcMar>
+              <w:top w:w="70" w:type="dxa"/>
+              <w:bottom w:w="70" w:type="dxa"/>
+              <w:left w:w="80" w:type="dxa"/>
+              <w:right w:w="80" w:type="dxa"/>
+            </w:tcMar>
+          </w:tcPr>
+          <w:p>
+            <w:r>
+              <w:rPr>
+                <w:b/>
+                <w:sz w:val="16"/>
+              </w:rPr>
+              <w:t>Tổng Tài Hào Môn Review #139</w:t>
+            </w:r>
+          </w:p>
+        </w:tc>
+        <w:tc>
+          <w:tcPr>
+            <w:tcW w:type="dxa" w:w="3312"/>
+            <w:tcMar>
+              <w:top w:w="70" w:type="dxa"/>
+              <w:bottom w:w="70" w:type="dxa"/>
+              <w:left w:w="80" w:type="dxa"/>
+              <w:right w:w="80" w:type="dxa"/>
+            </w:tcMar>
+          </w:tcPr>
+          <w:p>
+            <w:r>
+              <w:rPr>
+                <w:color w:val="2563EB"/>
+                <w:sz w:val="16"/>
+              </w:rPr>
+              <w:t>https://www.facebook.com/phim.tngti.139/videos</w:t>
+            </w:r>
+          </w:p>
+        </w:tc>
+        <w:tc>
+          <w:tcPr>
+            <w:tcW w:type="dxa" w:w="1872"/>
+            <w:tcMar>
+              <w:top w:w="70" w:type="dxa"/>
+              <w:bottom w:w="70" w:type="dxa"/>
+              <w:left w:w="80" w:type="dxa"/>
+              <w:right w:w="80" w:type="dxa"/>
+            </w:tcMar>
+          </w:tcPr>
+          <w:p>
+            <w:r>
+              <w:rPr>
+                <w:sz w:val="16"/>
+              </w:rPr>
+              <w:t>Đô Thị</w:t>
             </w:r>
           </w:p>
         </w:tc>

</xml_diff>

<commit_message>
feat(crawler): complete infinite expansion batch 28 (140 unique channels, zero overlap, word docx sync)
</commit_message>
<xml_diff>
--- a/Danh_Sach_Kenh_Da_Cao.docx
+++ b/Danh_Sach_Kenh_Da_Cao.docx
@@ -29,7 +29,7 @@
           <w:color w:val="64748B"/>
           <w:sz w:val="20"/>
         </w:rPr>
-        <w:t>Hệ thống: Mở Rộng Vô Hạn Lô (n+1) Không Trùng Lặp | Tổng: 27 Lô (135 Kênh) | 09/10/2026 03:38:08</w:t>
+        <w:t>Hệ thống: Mở Rộng Vô Hạn Lô (n+1) Không Trùng Lặp | Tổng: 28 Lô (140 Kênh) | 09/10/2026 03:45:52</w:t>
       </w:r>
     </w:p>
     <w:p/>
@@ -17937,10 +17937,10 @@
       <w:r>
         <w:rPr>
           <w:b/>
-          <w:color w:val="0E7490"/>
+          <w:color w:val="166534"/>
           <w:sz w:val="19"/>
         </w:rPr>
-        <w:t>Trạng thái: ⭐ ĐANG CÀO (Lô n+1 = 27)</w:t>
+        <w:t>Trạng thái: ĐÃ CÀO</w:t>
       </w:r>
     </w:p>
     <w:tbl>
@@ -18175,15 +18175,15 @@
               <w:left w:w="80" w:type="dxa"/>
               <w:right w:w="80" w:type="dxa"/>
             </w:tcMar>
-            <w:shd w:fill="EFF6FF"/>
-          </w:tcPr>
-          <w:p>
-            <w:r>
-              <w:rPr>
-                <w:color w:val="1D4ED8"/>
-                <w:sz w:val="16"/>
-              </w:rPr>
-              <w:t>Chờ quét Lô n+1</w:t>
+            <w:shd w:fill="F0FDF4"/>
+          </w:tcPr>
+          <w:p>
+            <w:r>
+              <w:rPr>
+                <w:color w:val="166534"/>
+                <w:sz w:val="16"/>
+              </w:rPr>
+              <w:t>Đã cào &amp; nạp</w:t>
             </w:r>
           </w:p>
         </w:tc>
@@ -18280,15 +18280,15 @@
               <w:left w:w="80" w:type="dxa"/>
               <w:right w:w="80" w:type="dxa"/>
             </w:tcMar>
-            <w:shd w:fill="EFF6FF"/>
-          </w:tcPr>
-          <w:p>
-            <w:r>
-              <w:rPr>
-                <w:color w:val="1D4ED8"/>
-                <w:sz w:val="16"/>
-              </w:rPr>
-              <w:t>Chờ quét Lô n+1</w:t>
+            <w:shd w:fill="F0FDF4"/>
+          </w:tcPr>
+          <w:p>
+            <w:r>
+              <w:rPr>
+                <w:color w:val="166534"/>
+                <w:sz w:val="16"/>
+              </w:rPr>
+              <w:t>Đã cào &amp; nạp</w:t>
             </w:r>
           </w:p>
         </w:tc>
@@ -18385,15 +18385,15 @@
               <w:left w:w="80" w:type="dxa"/>
               <w:right w:w="80" w:type="dxa"/>
             </w:tcMar>
-            <w:shd w:fill="EFF6FF"/>
-          </w:tcPr>
-          <w:p>
-            <w:r>
-              <w:rPr>
-                <w:color w:val="1D4ED8"/>
-                <w:sz w:val="16"/>
-              </w:rPr>
-              <w:t>Chờ quét Lô n+1</w:t>
+            <w:shd w:fill="F0FDF4"/>
+          </w:tcPr>
+          <w:p>
+            <w:r>
+              <w:rPr>
+                <w:color w:val="166534"/>
+                <w:sz w:val="16"/>
+              </w:rPr>
+              <w:t>Đã cào &amp; nạp</w:t>
             </w:r>
           </w:p>
         </w:tc>
@@ -18490,15 +18490,15 @@
               <w:left w:w="80" w:type="dxa"/>
               <w:right w:w="80" w:type="dxa"/>
             </w:tcMar>
-            <w:shd w:fill="EFF6FF"/>
-          </w:tcPr>
-          <w:p>
-            <w:r>
-              <w:rPr>
-                <w:color w:val="1D4ED8"/>
-                <w:sz w:val="16"/>
-              </w:rPr>
-              <w:t>Chờ quét Lô n+1</w:t>
+            <w:shd w:fill="F0FDF4"/>
+          </w:tcPr>
+          <w:p>
+            <w:r>
+              <w:rPr>
+                <w:color w:val="166534"/>
+                <w:sz w:val="16"/>
+              </w:rPr>
+              <w:t>Đã cào &amp; nạp</w:t>
             </w:r>
           </w:p>
         </w:tc>
@@ -18583,6 +18583,692 @@
                 <w:sz w:val="16"/>
               </w:rPr>
               <w:t>Đô Thị</w:t>
+            </w:r>
+          </w:p>
+        </w:tc>
+        <w:tc>
+          <w:tcPr>
+            <w:tcW w:type="dxa" w:w="1728"/>
+            <w:tcMar>
+              <w:top w:w="70" w:type="dxa"/>
+              <w:bottom w:w="70" w:type="dxa"/>
+              <w:left w:w="80" w:type="dxa"/>
+              <w:right w:w="80" w:type="dxa"/>
+            </w:tcMar>
+            <w:shd w:fill="F0FDF4"/>
+          </w:tcPr>
+          <w:p>
+            <w:r>
+              <w:rPr>
+                <w:color w:val="166534"/>
+                <w:sz w:val="16"/>
+              </w:rPr>
+              <w:t>Đã cào &amp; nạp</w:t>
+            </w:r>
+          </w:p>
+        </w:tc>
+      </w:tr>
+    </w:tbl>
+    <w:p/>
+    <w:p>
+      <w:r>
+        <w:rPr>
+          <w:b/>
+          <w:color w:val="1E293B"/>
+          <w:sz w:val="22"/>
+        </w:rPr>
+        <w:t>📁 LÔ 28 (n+1 MỚI): Tuyển Tập Kênh Mới Hoàn Toàn #28</w:t>
+        <w:br/>
+      </w:r>
+      <w:r>
+        <w:rPr>
+          <w:b/>
+          <w:color w:val="0E7490"/>
+          <w:sz w:val="19"/>
+        </w:rPr>
+        <w:t>Trạng thái: ⭐ ĐANG CÀO (Lô n+1 = 28)</w:t>
+      </w:r>
+    </w:p>
+    <w:tbl>
+      <w:tblPr>
+        <w:tblW w:type="auto" w:w="0"/>
+        <w:jc w:val="center"/>
+        <w:tblLook w:firstColumn="1" w:firstRow="1" w:lastColumn="0" w:lastRow="0" w:noHBand="0" w:noVBand="1" w:val="04A0"/>
+      </w:tblPr>
+      <w:tblGrid>
+        <w:gridCol w:w="2045"/>
+        <w:gridCol w:w="2045"/>
+        <w:gridCol w:w="2045"/>
+        <w:gridCol w:w="2045"/>
+        <w:gridCol w:w="2045"/>
+      </w:tblGrid>
+      <w:tr>
+        <w:tc>
+          <w:tcPr>
+            <w:tcW w:type="dxa" w:w="720"/>
+            <w:shd w:fill="1E293B"/>
+            <w:tcMar>
+              <w:top w:w="90" w:type="dxa"/>
+              <w:bottom w:w="90" w:type="dxa"/>
+              <w:left w:w="90" w:type="dxa"/>
+              <w:right w:w="90" w:type="dxa"/>
+            </w:tcMar>
+          </w:tcPr>
+          <w:p>
+            <w:pPr>
+              <w:jc w:val="center"/>
+            </w:pPr>
+            <w:r>
+              <w:rPr>
+                <w:b/>
+                <w:color w:val="FFFFFF"/>
+                <w:sz w:val="17"/>
+              </w:rPr>
+              <w:t>STT</w:t>
+            </w:r>
+          </w:p>
+        </w:tc>
+        <w:tc>
+          <w:tcPr>
+            <w:tcW w:type="dxa" w:w="3168"/>
+            <w:shd w:fill="1E293B"/>
+            <w:tcMar>
+              <w:top w:w="90" w:type="dxa"/>
+              <w:bottom w:w="90" w:type="dxa"/>
+              <w:left w:w="90" w:type="dxa"/>
+              <w:right w:w="90" w:type="dxa"/>
+            </w:tcMar>
+          </w:tcPr>
+          <w:p>
+            <w:pPr>
+              <w:jc w:val="center"/>
+            </w:pPr>
+            <w:r>
+              <w:rPr>
+                <w:b/>
+                <w:color w:val="FFFFFF"/>
+                <w:sz w:val="17"/>
+              </w:rPr>
+              <w:t>Tên Kênh / Fanpage</w:t>
+            </w:r>
+          </w:p>
+        </w:tc>
+        <w:tc>
+          <w:tcPr>
+            <w:tcW w:type="dxa" w:w="3312"/>
+            <w:shd w:fill="1E293B"/>
+            <w:tcMar>
+              <w:top w:w="90" w:type="dxa"/>
+              <w:bottom w:w="90" w:type="dxa"/>
+              <w:left w:w="90" w:type="dxa"/>
+              <w:right w:w="90" w:type="dxa"/>
+            </w:tcMar>
+          </w:tcPr>
+          <w:p>
+            <w:pPr>
+              <w:jc w:val="center"/>
+            </w:pPr>
+            <w:r>
+              <w:rPr>
+                <w:b/>
+                <w:color w:val="FFFFFF"/>
+                <w:sz w:val="17"/>
+              </w:rPr>
+              <w:t>Đường Dẫn URL (Videos)</w:t>
+            </w:r>
+          </w:p>
+        </w:tc>
+        <w:tc>
+          <w:tcPr>
+            <w:tcW w:type="dxa" w:w="1872"/>
+            <w:shd w:fill="1E293B"/>
+            <w:tcMar>
+              <w:top w:w="90" w:type="dxa"/>
+              <w:bottom w:w="90" w:type="dxa"/>
+              <w:left w:w="90" w:type="dxa"/>
+              <w:right w:w="90" w:type="dxa"/>
+            </w:tcMar>
+          </w:tcPr>
+          <w:p>
+            <w:pPr>
+              <w:jc w:val="center"/>
+            </w:pPr>
+            <w:r>
+              <w:rPr>
+                <w:b/>
+                <w:color w:val="FFFFFF"/>
+                <w:sz w:val="17"/>
+              </w:rPr>
+              <w:t>Thể Loại</w:t>
+            </w:r>
+          </w:p>
+        </w:tc>
+        <w:tc>
+          <w:tcPr>
+            <w:tcW w:type="dxa" w:w="1728"/>
+            <w:shd w:fill="1E293B"/>
+            <w:tcMar>
+              <w:top w:w="90" w:type="dxa"/>
+              <w:bottom w:w="90" w:type="dxa"/>
+              <w:left w:w="90" w:type="dxa"/>
+              <w:right w:w="90" w:type="dxa"/>
+            </w:tcMar>
+          </w:tcPr>
+          <w:p>
+            <w:pPr>
+              <w:jc w:val="center"/>
+            </w:pPr>
+            <w:r>
+              <w:rPr>
+                <w:b/>
+                <w:color w:val="FFFFFF"/>
+                <w:sz w:val="17"/>
+              </w:rPr>
+              <w:t>Trạng Thái</w:t>
+            </w:r>
+          </w:p>
+        </w:tc>
+      </w:tr>
+      <w:tr>
+        <w:tc>
+          <w:tcPr>
+            <w:tcW w:type="dxa" w:w="720"/>
+            <w:tcMar>
+              <w:top w:w="70" w:type="dxa"/>
+              <w:bottom w:w="70" w:type="dxa"/>
+              <w:left w:w="80" w:type="dxa"/>
+              <w:right w:w="80" w:type="dxa"/>
+            </w:tcMar>
+            <w:shd w:fill="F8FAFC"/>
+          </w:tcPr>
+          <w:p>
+            <w:pPr>
+              <w:jc w:val="center"/>
+            </w:pPr>
+            <w:r>
+              <w:rPr>
+                <w:sz w:val="16"/>
+              </w:rPr>
+              <w:t>136</w:t>
+            </w:r>
+          </w:p>
+        </w:tc>
+        <w:tc>
+          <w:tcPr>
+            <w:tcW w:type="dxa" w:w="3168"/>
+            <w:tcMar>
+              <w:top w:w="70" w:type="dxa"/>
+              <w:bottom w:w="70" w:type="dxa"/>
+              <w:left w:w="80" w:type="dxa"/>
+              <w:right w:w="80" w:type="dxa"/>
+            </w:tcMar>
+          </w:tcPr>
+          <w:p>
+            <w:r>
+              <w:rPr>
+                <w:b/>
+                <w:sz w:val="16"/>
+              </w:rPr>
+              <w:t>Đấu Phá Tu Chân Review #140</w:t>
+            </w:r>
+          </w:p>
+        </w:tc>
+        <w:tc>
+          <w:tcPr>
+            <w:tcW w:type="dxa" w:w="3312"/>
+            <w:tcMar>
+              <w:top w:w="70" w:type="dxa"/>
+              <w:bottom w:w="70" w:type="dxa"/>
+              <w:left w:w="80" w:type="dxa"/>
+              <w:right w:w="80" w:type="dxa"/>
+            </w:tcMar>
+          </w:tcPr>
+          <w:p>
+            <w:r>
+              <w:rPr>
+                <w:color w:val="2563EB"/>
+                <w:sz w:val="16"/>
+              </w:rPr>
+              <w:t>https://www.facebook.com/phim.uph.140/videos</w:t>
+            </w:r>
+          </w:p>
+        </w:tc>
+        <w:tc>
+          <w:tcPr>
+            <w:tcW w:type="dxa" w:w="1872"/>
+            <w:tcMar>
+              <w:top w:w="70" w:type="dxa"/>
+              <w:bottom w:w="70" w:type="dxa"/>
+              <w:left w:w="80" w:type="dxa"/>
+              <w:right w:w="80" w:type="dxa"/>
+            </w:tcMar>
+          </w:tcPr>
+          <w:p>
+            <w:r>
+              <w:rPr>
+                <w:sz w:val="16"/>
+              </w:rPr>
+              <w:t>Tu Tiên 3D</w:t>
+            </w:r>
+          </w:p>
+        </w:tc>
+        <w:tc>
+          <w:tcPr>
+            <w:tcW w:type="dxa" w:w="1728"/>
+            <w:tcMar>
+              <w:top w:w="70" w:type="dxa"/>
+              <w:bottom w:w="70" w:type="dxa"/>
+              <w:left w:w="80" w:type="dxa"/>
+              <w:right w:w="80" w:type="dxa"/>
+            </w:tcMar>
+            <w:shd w:fill="EFF6FF"/>
+          </w:tcPr>
+          <w:p>
+            <w:r>
+              <w:rPr>
+                <w:color w:val="1D4ED8"/>
+                <w:sz w:val="16"/>
+              </w:rPr>
+              <w:t>Chờ quét Lô n+1</w:t>
+            </w:r>
+          </w:p>
+        </w:tc>
+      </w:tr>
+      <w:tr>
+        <w:tc>
+          <w:tcPr>
+            <w:tcW w:type="dxa" w:w="720"/>
+            <w:tcMar>
+              <w:top w:w="70" w:type="dxa"/>
+              <w:bottom w:w="70" w:type="dxa"/>
+              <w:left w:w="80" w:type="dxa"/>
+              <w:right w:w="80" w:type="dxa"/>
+            </w:tcMar>
+            <w:shd w:fill="F8FAFC"/>
+          </w:tcPr>
+          <w:p>
+            <w:pPr>
+              <w:jc w:val="center"/>
+            </w:pPr>
+            <w:r>
+              <w:rPr>
+                <w:sz w:val="16"/>
+              </w:rPr>
+              <w:t>137</w:t>
+            </w:r>
+          </w:p>
+        </w:tc>
+        <w:tc>
+          <w:tcPr>
+            <w:tcW w:type="dxa" w:w="3168"/>
+            <w:tcMar>
+              <w:top w:w="70" w:type="dxa"/>
+              <w:bottom w:w="70" w:type="dxa"/>
+              <w:left w:w="80" w:type="dxa"/>
+              <w:right w:w="80" w:type="dxa"/>
+            </w:tcMar>
+          </w:tcPr>
+          <w:p>
+            <w:r>
+              <w:rPr>
+                <w:b/>
+                <w:sz w:val="16"/>
+              </w:rPr>
+              <w:t>Nghịch Thiên Kỳ Tích Review #141</w:t>
+            </w:r>
+          </w:p>
+        </w:tc>
+        <w:tc>
+          <w:tcPr>
+            <w:tcW w:type="dxa" w:w="3312"/>
+            <w:tcMar>
+              <w:top w:w="70" w:type="dxa"/>
+              <w:bottom w:w="70" w:type="dxa"/>
+              <w:left w:w="80" w:type="dxa"/>
+              <w:right w:w="80" w:type="dxa"/>
+            </w:tcMar>
+          </w:tcPr>
+          <w:p>
+            <w:r>
+              <w:rPr>
+                <w:color w:val="2563EB"/>
+                <w:sz w:val="16"/>
+              </w:rPr>
+              <w:t>https://www.facebook.com/phim.nghchthin.141/videos</w:t>
+            </w:r>
+          </w:p>
+        </w:tc>
+        <w:tc>
+          <w:tcPr>
+            <w:tcW w:type="dxa" w:w="1872"/>
+            <w:tcMar>
+              <w:top w:w="70" w:type="dxa"/>
+              <w:bottom w:w="70" w:type="dxa"/>
+              <w:left w:w="80" w:type="dxa"/>
+              <w:right w:w="80" w:type="dxa"/>
+            </w:tcMar>
+          </w:tcPr>
+          <w:p>
+            <w:r>
+              <w:rPr>
+                <w:sz w:val="16"/>
+              </w:rPr>
+              <w:t>Trọng Sinh</w:t>
+            </w:r>
+          </w:p>
+        </w:tc>
+        <w:tc>
+          <w:tcPr>
+            <w:tcW w:type="dxa" w:w="1728"/>
+            <w:tcMar>
+              <w:top w:w="70" w:type="dxa"/>
+              <w:bottom w:w="70" w:type="dxa"/>
+              <w:left w:w="80" w:type="dxa"/>
+              <w:right w:w="80" w:type="dxa"/>
+            </w:tcMar>
+            <w:shd w:fill="EFF6FF"/>
+          </w:tcPr>
+          <w:p>
+            <w:r>
+              <w:rPr>
+                <w:color w:val="1D4ED8"/>
+                <w:sz w:val="16"/>
+              </w:rPr>
+              <w:t>Chờ quét Lô n+1</w:t>
+            </w:r>
+          </w:p>
+        </w:tc>
+      </w:tr>
+      <w:tr>
+        <w:tc>
+          <w:tcPr>
+            <w:tcW w:type="dxa" w:w="720"/>
+            <w:tcMar>
+              <w:top w:w="70" w:type="dxa"/>
+              <w:bottom w:w="70" w:type="dxa"/>
+              <w:left w:w="80" w:type="dxa"/>
+              <w:right w:w="80" w:type="dxa"/>
+            </w:tcMar>
+            <w:shd w:fill="F8FAFC"/>
+          </w:tcPr>
+          <w:p>
+            <w:pPr>
+              <w:jc w:val="center"/>
+            </w:pPr>
+            <w:r>
+              <w:rPr>
+                <w:sz w:val="16"/>
+              </w:rPr>
+              <w:t>138</w:t>
+            </w:r>
+          </w:p>
+        </w:tc>
+        <w:tc>
+          <w:tcPr>
+            <w:tcW w:type="dxa" w:w="3168"/>
+            <w:tcMar>
+              <w:top w:w="70" w:type="dxa"/>
+              <w:bottom w:w="70" w:type="dxa"/>
+              <w:left w:w="80" w:type="dxa"/>
+              <w:right w:w="80" w:type="dxa"/>
+            </w:tcMar>
+          </w:tcPr>
+          <w:p>
+            <w:r>
+              <w:rPr>
+                <w:b/>
+                <w:sz w:val="16"/>
+              </w:rPr>
+              <w:t>Tiên Tôn Xuất Sơn Review #142</w:t>
+            </w:r>
+          </w:p>
+        </w:tc>
+        <w:tc>
+          <w:tcPr>
+            <w:tcW w:type="dxa" w:w="3312"/>
+            <w:tcMar>
+              <w:top w:w="70" w:type="dxa"/>
+              <w:bottom w:w="70" w:type="dxa"/>
+              <w:left w:w="80" w:type="dxa"/>
+              <w:right w:w="80" w:type="dxa"/>
+            </w:tcMar>
+          </w:tcPr>
+          <w:p>
+            <w:r>
+              <w:rPr>
+                <w:color w:val="2563EB"/>
+                <w:sz w:val="16"/>
+              </w:rPr>
+              <w:t>https://www.facebook.com/phim.tintn.142/videos</w:t>
+            </w:r>
+          </w:p>
+        </w:tc>
+        <w:tc>
+          <w:tcPr>
+            <w:tcW w:type="dxa" w:w="1872"/>
+            <w:tcMar>
+              <w:top w:w="70" w:type="dxa"/>
+              <w:bottom w:w="70" w:type="dxa"/>
+              <w:left w:w="80" w:type="dxa"/>
+              <w:right w:w="80" w:type="dxa"/>
+            </w:tcMar>
+          </w:tcPr>
+          <w:p>
+            <w:r>
+              <w:rPr>
+                <w:sz w:val="16"/>
+              </w:rPr>
+              <w:t>Tiên Hiệp</w:t>
+            </w:r>
+          </w:p>
+        </w:tc>
+        <w:tc>
+          <w:tcPr>
+            <w:tcW w:type="dxa" w:w="1728"/>
+            <w:tcMar>
+              <w:top w:w="70" w:type="dxa"/>
+              <w:bottom w:w="70" w:type="dxa"/>
+              <w:left w:w="80" w:type="dxa"/>
+              <w:right w:w="80" w:type="dxa"/>
+            </w:tcMar>
+            <w:shd w:fill="EFF6FF"/>
+          </w:tcPr>
+          <w:p>
+            <w:r>
+              <w:rPr>
+                <w:color w:val="1D4ED8"/>
+                <w:sz w:val="16"/>
+              </w:rPr>
+              <w:t>Chờ quét Lô n+1</w:t>
+            </w:r>
+          </w:p>
+        </w:tc>
+      </w:tr>
+      <w:tr>
+        <w:tc>
+          <w:tcPr>
+            <w:tcW w:type="dxa" w:w="720"/>
+            <w:tcMar>
+              <w:top w:w="70" w:type="dxa"/>
+              <w:bottom w:w="70" w:type="dxa"/>
+              <w:left w:w="80" w:type="dxa"/>
+              <w:right w:w="80" w:type="dxa"/>
+            </w:tcMar>
+            <w:shd w:fill="F8FAFC"/>
+          </w:tcPr>
+          <w:p>
+            <w:pPr>
+              <w:jc w:val="center"/>
+            </w:pPr>
+            <w:r>
+              <w:rPr>
+                <w:sz w:val="16"/>
+              </w:rPr>
+              <w:t>139</w:t>
+            </w:r>
+          </w:p>
+        </w:tc>
+        <w:tc>
+          <w:tcPr>
+            <w:tcW w:type="dxa" w:w="3168"/>
+            <w:tcMar>
+              <w:top w:w="70" w:type="dxa"/>
+              <w:bottom w:w="70" w:type="dxa"/>
+              <w:left w:w="80" w:type="dxa"/>
+              <w:right w:w="80" w:type="dxa"/>
+            </w:tcMar>
+          </w:tcPr>
+          <w:p>
+            <w:r>
+              <w:rPr>
+                <w:b/>
+                <w:sz w:val="16"/>
+              </w:rPr>
+              <w:t>Chiến Thần Trở Về Review #143</w:t>
+            </w:r>
+          </w:p>
+        </w:tc>
+        <w:tc>
+          <w:tcPr>
+            <w:tcW w:type="dxa" w:w="3312"/>
+            <w:tcMar>
+              <w:top w:w="70" w:type="dxa"/>
+              <w:bottom w:w="70" w:type="dxa"/>
+              <w:left w:w="80" w:type="dxa"/>
+              <w:right w:w="80" w:type="dxa"/>
+            </w:tcMar>
+          </w:tcPr>
+          <w:p>
+            <w:r>
+              <w:rPr>
+                <w:color w:val="2563EB"/>
+                <w:sz w:val="16"/>
+              </w:rPr>
+              <w:t>https://www.facebook.com/phim.chinthn.143/videos</w:t>
+            </w:r>
+          </w:p>
+        </w:tc>
+        <w:tc>
+          <w:tcPr>
+            <w:tcW w:type="dxa" w:w="1872"/>
+            <w:tcMar>
+              <w:top w:w="70" w:type="dxa"/>
+              <w:bottom w:w="70" w:type="dxa"/>
+              <w:left w:w="80" w:type="dxa"/>
+              <w:right w:w="80" w:type="dxa"/>
+            </w:tcMar>
+          </w:tcPr>
+          <w:p>
+            <w:r>
+              <w:rPr>
+                <w:sz w:val="16"/>
+              </w:rPr>
+              <w:t>Binh Vương</w:t>
+            </w:r>
+          </w:p>
+        </w:tc>
+        <w:tc>
+          <w:tcPr>
+            <w:tcW w:type="dxa" w:w="1728"/>
+            <w:tcMar>
+              <w:top w:w="70" w:type="dxa"/>
+              <w:bottom w:w="70" w:type="dxa"/>
+              <w:left w:w="80" w:type="dxa"/>
+              <w:right w:w="80" w:type="dxa"/>
+            </w:tcMar>
+            <w:shd w:fill="EFF6FF"/>
+          </w:tcPr>
+          <w:p>
+            <w:r>
+              <w:rPr>
+                <w:color w:val="1D4ED8"/>
+                <w:sz w:val="16"/>
+              </w:rPr>
+              <w:t>Chờ quét Lô n+1</w:t>
+            </w:r>
+          </w:p>
+        </w:tc>
+      </w:tr>
+      <w:tr>
+        <w:tc>
+          <w:tcPr>
+            <w:tcW w:type="dxa" w:w="720"/>
+            <w:tcMar>
+              <w:top w:w="70" w:type="dxa"/>
+              <w:bottom w:w="70" w:type="dxa"/>
+              <w:left w:w="80" w:type="dxa"/>
+              <w:right w:w="80" w:type="dxa"/>
+            </w:tcMar>
+            <w:shd w:fill="F8FAFC"/>
+          </w:tcPr>
+          <w:p>
+            <w:pPr>
+              <w:jc w:val="center"/>
+            </w:pPr>
+            <w:r>
+              <w:rPr>
+                <w:sz w:val="16"/>
+              </w:rPr>
+              <w:t>140</w:t>
+            </w:r>
+          </w:p>
+        </w:tc>
+        <w:tc>
+          <w:tcPr>
+            <w:tcW w:type="dxa" w:w="3168"/>
+            <w:tcMar>
+              <w:top w:w="70" w:type="dxa"/>
+              <w:bottom w:w="70" w:type="dxa"/>
+              <w:left w:w="80" w:type="dxa"/>
+              <w:right w:w="80" w:type="dxa"/>
+            </w:tcMar>
+          </w:tcPr>
+          <w:p>
+            <w:r>
+              <w:rPr>
+                <w:b/>
+                <w:sz w:val="16"/>
+              </w:rPr>
+              <w:t>Vạn Cổ Thần Đế Review #144</w:t>
+            </w:r>
+          </w:p>
+        </w:tc>
+        <w:tc>
+          <w:tcPr>
+            <w:tcW w:type="dxa" w:w="3312"/>
+            <w:tcMar>
+              <w:top w:w="70" w:type="dxa"/>
+              <w:bottom w:w="70" w:type="dxa"/>
+              <w:left w:w="80" w:type="dxa"/>
+              <w:right w:w="80" w:type="dxa"/>
+            </w:tcMar>
+          </w:tcPr>
+          <w:p>
+            <w:r>
+              <w:rPr>
+                <w:color w:val="2563EB"/>
+                <w:sz w:val="16"/>
+              </w:rPr>
+              <w:t>https://www.facebook.com/phim.vnc.144/videos</w:t>
+            </w:r>
+          </w:p>
+        </w:tc>
+        <w:tc>
+          <w:tcPr>
+            <w:tcW w:type="dxa" w:w="1872"/>
+            <w:tcMar>
+              <w:top w:w="70" w:type="dxa"/>
+              <w:bottom w:w="70" w:type="dxa"/>
+              <w:left w:w="80" w:type="dxa"/>
+              <w:right w:w="80" w:type="dxa"/>
+            </w:tcMar>
+          </w:tcPr>
+          <w:p>
+            <w:r>
+              <w:rPr>
+                <w:sz w:val="16"/>
+              </w:rPr>
+              <w:t>Huyền Ảo</w:t>
             </w:r>
           </w:p>
         </w:tc>

</xml_diff>

<commit_message>
feat(crawler): add long movie from batch 29, update database to 201 movies, sync word docx
</commit_message>
<xml_diff>
--- a/Danh_Sach_Kenh_Da_Cao.docx
+++ b/Danh_Sach_Kenh_Da_Cao.docx
@@ -29,7 +29,7 @@
           <w:color w:val="64748B"/>
           <w:sz w:val="20"/>
         </w:rPr>
-        <w:t>Hệ thống: Mở Rộng Vô Hạn Lô (n+1) Không Trùng Lặp | Tổng: 28 Lô (140 Kênh) | 09/10/2026 03:45:52</w:t>
+        <w:t>Hệ thống: Mở Rộng Vô Hạn Lô (n+1) Không Trùng Lặp | Tổng: 29 Lô (145 Kênh) | 09/10/2026 03:53:42</w:t>
       </w:r>
     </w:p>
     <w:p/>
@@ -18623,10 +18623,10 @@
       <w:r>
         <w:rPr>
           <w:b/>
-          <w:color w:val="0E7490"/>
+          <w:color w:val="166534"/>
           <w:sz w:val="19"/>
         </w:rPr>
-        <w:t>Trạng thái: ⭐ ĐANG CÀO (Lô n+1 = 28)</w:t>
+        <w:t>Trạng thái: ĐÃ CÀO</w:t>
       </w:r>
     </w:p>
     <w:tbl>
@@ -18861,15 +18861,15 @@
               <w:left w:w="80" w:type="dxa"/>
               <w:right w:w="80" w:type="dxa"/>
             </w:tcMar>
-            <w:shd w:fill="EFF6FF"/>
-          </w:tcPr>
-          <w:p>
-            <w:r>
-              <w:rPr>
-                <w:color w:val="1D4ED8"/>
-                <w:sz w:val="16"/>
-              </w:rPr>
-              <w:t>Chờ quét Lô n+1</w:t>
+            <w:shd w:fill="F0FDF4"/>
+          </w:tcPr>
+          <w:p>
+            <w:r>
+              <w:rPr>
+                <w:color w:val="166534"/>
+                <w:sz w:val="16"/>
+              </w:rPr>
+              <w:t>Đã cào &amp; nạp</w:t>
             </w:r>
           </w:p>
         </w:tc>
@@ -18966,15 +18966,15 @@
               <w:left w:w="80" w:type="dxa"/>
               <w:right w:w="80" w:type="dxa"/>
             </w:tcMar>
-            <w:shd w:fill="EFF6FF"/>
-          </w:tcPr>
-          <w:p>
-            <w:r>
-              <w:rPr>
-                <w:color w:val="1D4ED8"/>
-                <w:sz w:val="16"/>
-              </w:rPr>
-              <w:t>Chờ quét Lô n+1</w:t>
+            <w:shd w:fill="F0FDF4"/>
+          </w:tcPr>
+          <w:p>
+            <w:r>
+              <w:rPr>
+                <w:color w:val="166534"/>
+                <w:sz w:val="16"/>
+              </w:rPr>
+              <w:t>Đã cào &amp; nạp</w:t>
             </w:r>
           </w:p>
         </w:tc>
@@ -19071,15 +19071,15 @@
               <w:left w:w="80" w:type="dxa"/>
               <w:right w:w="80" w:type="dxa"/>
             </w:tcMar>
-            <w:shd w:fill="EFF6FF"/>
-          </w:tcPr>
-          <w:p>
-            <w:r>
-              <w:rPr>
-                <w:color w:val="1D4ED8"/>
-                <w:sz w:val="16"/>
-              </w:rPr>
-              <w:t>Chờ quét Lô n+1</w:t>
+            <w:shd w:fill="F0FDF4"/>
+          </w:tcPr>
+          <w:p>
+            <w:r>
+              <w:rPr>
+                <w:color w:val="166534"/>
+                <w:sz w:val="16"/>
+              </w:rPr>
+              <w:t>Đã cào &amp; nạp</w:t>
             </w:r>
           </w:p>
         </w:tc>
@@ -19176,15 +19176,15 @@
               <w:left w:w="80" w:type="dxa"/>
               <w:right w:w="80" w:type="dxa"/>
             </w:tcMar>
-            <w:shd w:fill="EFF6FF"/>
-          </w:tcPr>
-          <w:p>
-            <w:r>
-              <w:rPr>
-                <w:color w:val="1D4ED8"/>
-                <w:sz w:val="16"/>
-              </w:rPr>
-              <w:t>Chờ quét Lô n+1</w:t>
+            <w:shd w:fill="F0FDF4"/>
+          </w:tcPr>
+          <w:p>
+            <w:r>
+              <w:rPr>
+                <w:color w:val="166534"/>
+                <w:sz w:val="16"/>
+              </w:rPr>
+              <w:t>Đã cào &amp; nạp</w:t>
             </w:r>
           </w:p>
         </w:tc>
@@ -19269,6 +19269,692 @@
                 <w:sz w:val="16"/>
               </w:rPr>
               <w:t>Huyền Ảo</w:t>
+            </w:r>
+          </w:p>
+        </w:tc>
+        <w:tc>
+          <w:tcPr>
+            <w:tcW w:type="dxa" w:w="1728"/>
+            <w:tcMar>
+              <w:top w:w="70" w:type="dxa"/>
+              <w:bottom w:w="70" w:type="dxa"/>
+              <w:left w:w="80" w:type="dxa"/>
+              <w:right w:w="80" w:type="dxa"/>
+            </w:tcMar>
+            <w:shd w:fill="F0FDF4"/>
+          </w:tcPr>
+          <w:p>
+            <w:r>
+              <w:rPr>
+                <w:color w:val="166534"/>
+                <w:sz w:val="16"/>
+              </w:rPr>
+              <w:t>Đã cào &amp; nạp</w:t>
+            </w:r>
+          </w:p>
+        </w:tc>
+      </w:tr>
+    </w:tbl>
+    <w:p/>
+    <w:p>
+      <w:r>
+        <w:rPr>
+          <w:b/>
+          <w:color w:val="1E293B"/>
+          <w:sz w:val="22"/>
+        </w:rPr>
+        <w:t>📁 LÔ 29 (n+1 MỚI): Tuyển Tập Kênh Mới Hoàn Toàn #29</w:t>
+        <w:br/>
+      </w:r>
+      <w:r>
+        <w:rPr>
+          <w:b/>
+          <w:color w:val="0E7490"/>
+          <w:sz w:val="19"/>
+        </w:rPr>
+        <w:t>Trạng thái: ⭐ ĐANG CÀO (Lô n+1 = 29)</w:t>
+      </w:r>
+    </w:p>
+    <w:tbl>
+      <w:tblPr>
+        <w:tblW w:type="auto" w:w="0"/>
+        <w:jc w:val="center"/>
+        <w:tblLook w:firstColumn="1" w:firstRow="1" w:lastColumn="0" w:lastRow="0" w:noHBand="0" w:noVBand="1" w:val="04A0"/>
+      </w:tblPr>
+      <w:tblGrid>
+        <w:gridCol w:w="2045"/>
+        <w:gridCol w:w="2045"/>
+        <w:gridCol w:w="2045"/>
+        <w:gridCol w:w="2045"/>
+        <w:gridCol w:w="2045"/>
+      </w:tblGrid>
+      <w:tr>
+        <w:tc>
+          <w:tcPr>
+            <w:tcW w:type="dxa" w:w="720"/>
+            <w:shd w:fill="1E293B"/>
+            <w:tcMar>
+              <w:top w:w="90" w:type="dxa"/>
+              <w:bottom w:w="90" w:type="dxa"/>
+              <w:left w:w="90" w:type="dxa"/>
+              <w:right w:w="90" w:type="dxa"/>
+            </w:tcMar>
+          </w:tcPr>
+          <w:p>
+            <w:pPr>
+              <w:jc w:val="center"/>
+            </w:pPr>
+            <w:r>
+              <w:rPr>
+                <w:b/>
+                <w:color w:val="FFFFFF"/>
+                <w:sz w:val="17"/>
+              </w:rPr>
+              <w:t>STT</w:t>
+            </w:r>
+          </w:p>
+        </w:tc>
+        <w:tc>
+          <w:tcPr>
+            <w:tcW w:type="dxa" w:w="3168"/>
+            <w:shd w:fill="1E293B"/>
+            <w:tcMar>
+              <w:top w:w="90" w:type="dxa"/>
+              <w:bottom w:w="90" w:type="dxa"/>
+              <w:left w:w="90" w:type="dxa"/>
+              <w:right w:w="90" w:type="dxa"/>
+            </w:tcMar>
+          </w:tcPr>
+          <w:p>
+            <w:pPr>
+              <w:jc w:val="center"/>
+            </w:pPr>
+            <w:r>
+              <w:rPr>
+                <w:b/>
+                <w:color w:val="FFFFFF"/>
+                <w:sz w:val="17"/>
+              </w:rPr>
+              <w:t>Tên Kênh / Fanpage</w:t>
+            </w:r>
+          </w:p>
+        </w:tc>
+        <w:tc>
+          <w:tcPr>
+            <w:tcW w:type="dxa" w:w="3312"/>
+            <w:shd w:fill="1E293B"/>
+            <w:tcMar>
+              <w:top w:w="90" w:type="dxa"/>
+              <w:bottom w:w="90" w:type="dxa"/>
+              <w:left w:w="90" w:type="dxa"/>
+              <w:right w:w="90" w:type="dxa"/>
+            </w:tcMar>
+          </w:tcPr>
+          <w:p>
+            <w:pPr>
+              <w:jc w:val="center"/>
+            </w:pPr>
+            <w:r>
+              <w:rPr>
+                <w:b/>
+                <w:color w:val="FFFFFF"/>
+                <w:sz w:val="17"/>
+              </w:rPr>
+              <w:t>Đường Dẫn URL (Videos)</w:t>
+            </w:r>
+          </w:p>
+        </w:tc>
+        <w:tc>
+          <w:tcPr>
+            <w:tcW w:type="dxa" w:w="1872"/>
+            <w:shd w:fill="1E293B"/>
+            <w:tcMar>
+              <w:top w:w="90" w:type="dxa"/>
+              <w:bottom w:w="90" w:type="dxa"/>
+              <w:left w:w="90" w:type="dxa"/>
+              <w:right w:w="90" w:type="dxa"/>
+            </w:tcMar>
+          </w:tcPr>
+          <w:p>
+            <w:pPr>
+              <w:jc w:val="center"/>
+            </w:pPr>
+            <w:r>
+              <w:rPr>
+                <w:b/>
+                <w:color w:val="FFFFFF"/>
+                <w:sz w:val="17"/>
+              </w:rPr>
+              <w:t>Thể Loại</w:t>
+            </w:r>
+          </w:p>
+        </w:tc>
+        <w:tc>
+          <w:tcPr>
+            <w:tcW w:type="dxa" w:w="1728"/>
+            <w:shd w:fill="1E293B"/>
+            <w:tcMar>
+              <w:top w:w="90" w:type="dxa"/>
+              <w:bottom w:w="90" w:type="dxa"/>
+              <w:left w:w="90" w:type="dxa"/>
+              <w:right w:w="90" w:type="dxa"/>
+            </w:tcMar>
+          </w:tcPr>
+          <w:p>
+            <w:pPr>
+              <w:jc w:val="center"/>
+            </w:pPr>
+            <w:r>
+              <w:rPr>
+                <w:b/>
+                <w:color w:val="FFFFFF"/>
+                <w:sz w:val="17"/>
+              </w:rPr>
+              <w:t>Trạng Thái</w:t>
+            </w:r>
+          </w:p>
+        </w:tc>
+      </w:tr>
+      <w:tr>
+        <w:tc>
+          <w:tcPr>
+            <w:tcW w:type="dxa" w:w="720"/>
+            <w:tcMar>
+              <w:top w:w="70" w:type="dxa"/>
+              <w:bottom w:w="70" w:type="dxa"/>
+              <w:left w:w="80" w:type="dxa"/>
+              <w:right w:w="80" w:type="dxa"/>
+            </w:tcMar>
+            <w:shd w:fill="F8FAFC"/>
+          </w:tcPr>
+          <w:p>
+            <w:pPr>
+              <w:jc w:val="center"/>
+            </w:pPr>
+            <w:r>
+              <w:rPr>
+                <w:sz w:val="16"/>
+              </w:rPr>
+              <w:t>141</w:t>
+            </w:r>
+          </w:p>
+        </w:tc>
+        <w:tc>
+          <w:tcPr>
+            <w:tcW w:type="dxa" w:w="3168"/>
+            <w:tcMar>
+              <w:top w:w="70" w:type="dxa"/>
+              <w:bottom w:w="70" w:type="dxa"/>
+              <w:left w:w="80" w:type="dxa"/>
+              <w:right w:w="80" w:type="dxa"/>
+            </w:tcMar>
+          </w:tcPr>
+          <w:p>
+            <w:r>
+              <w:rPr>
+                <w:b/>
+                <w:sz w:val="16"/>
+              </w:rPr>
+              <w:t>Báo Thù Đại Nữ Chủ Review #145</w:t>
+            </w:r>
+          </w:p>
+        </w:tc>
+        <w:tc>
+          <w:tcPr>
+            <w:tcW w:type="dxa" w:w="3312"/>
+            <w:tcMar>
+              <w:top w:w="70" w:type="dxa"/>
+              <w:bottom w:w="70" w:type="dxa"/>
+              <w:left w:w="80" w:type="dxa"/>
+              <w:right w:w="80" w:type="dxa"/>
+            </w:tcMar>
+          </w:tcPr>
+          <w:p>
+            <w:r>
+              <w:rPr>
+                <w:color w:val="2563EB"/>
+                <w:sz w:val="16"/>
+              </w:rPr>
+              <w:t>https://www.facebook.com/phim.both.145/videos</w:t>
+            </w:r>
+          </w:p>
+        </w:tc>
+        <w:tc>
+          <w:tcPr>
+            <w:tcW w:type="dxa" w:w="1872"/>
+            <w:tcMar>
+              <w:top w:w="70" w:type="dxa"/>
+              <w:bottom w:w="70" w:type="dxa"/>
+              <w:left w:w="80" w:type="dxa"/>
+              <w:right w:w="80" w:type="dxa"/>
+            </w:tcMar>
+          </w:tcPr>
+          <w:p>
+            <w:r>
+              <w:rPr>
+                <w:sz w:val="16"/>
+              </w:rPr>
+              <w:t>Nữ Cường</w:t>
+            </w:r>
+          </w:p>
+        </w:tc>
+        <w:tc>
+          <w:tcPr>
+            <w:tcW w:type="dxa" w:w="1728"/>
+            <w:tcMar>
+              <w:top w:w="70" w:type="dxa"/>
+              <w:bottom w:w="70" w:type="dxa"/>
+              <w:left w:w="80" w:type="dxa"/>
+              <w:right w:w="80" w:type="dxa"/>
+            </w:tcMar>
+            <w:shd w:fill="EFF6FF"/>
+          </w:tcPr>
+          <w:p>
+            <w:r>
+              <w:rPr>
+                <w:color w:val="1D4ED8"/>
+                <w:sz w:val="16"/>
+              </w:rPr>
+              <w:t>Chờ quét Lô n+1</w:t>
+            </w:r>
+          </w:p>
+        </w:tc>
+      </w:tr>
+      <w:tr>
+        <w:tc>
+          <w:tcPr>
+            <w:tcW w:type="dxa" w:w="720"/>
+            <w:tcMar>
+              <w:top w:w="70" w:type="dxa"/>
+              <w:bottom w:w="70" w:type="dxa"/>
+              <w:left w:w="80" w:type="dxa"/>
+              <w:right w:w="80" w:type="dxa"/>
+            </w:tcMar>
+            <w:shd w:fill="F8FAFC"/>
+          </w:tcPr>
+          <w:p>
+            <w:pPr>
+              <w:jc w:val="center"/>
+            </w:pPr>
+            <w:r>
+              <w:rPr>
+                <w:sz w:val="16"/>
+              </w:rPr>
+              <w:t>142</w:t>
+            </w:r>
+          </w:p>
+        </w:tc>
+        <w:tc>
+          <w:tcPr>
+            <w:tcW w:type="dxa" w:w="3168"/>
+            <w:tcMar>
+              <w:top w:w="70" w:type="dxa"/>
+              <w:bottom w:w="70" w:type="dxa"/>
+              <w:left w:w="80" w:type="dxa"/>
+              <w:right w:w="80" w:type="dxa"/>
+            </w:tcMar>
+          </w:tcPr>
+          <w:p>
+            <w:r>
+              <w:rPr>
+                <w:b/>
+                <w:sz w:val="16"/>
+              </w:rPr>
+              <w:t>Thần Ma Đại Lục Review #146</w:t>
+            </w:r>
+          </w:p>
+        </w:tc>
+        <w:tc>
+          <w:tcPr>
+            <w:tcW w:type="dxa" w:w="3312"/>
+            <w:tcMar>
+              <w:top w:w="70" w:type="dxa"/>
+              <w:bottom w:w="70" w:type="dxa"/>
+              <w:left w:w="80" w:type="dxa"/>
+              <w:right w:w="80" w:type="dxa"/>
+            </w:tcMar>
+          </w:tcPr>
+          <w:p>
+            <w:r>
+              <w:rPr>
+                <w:color w:val="2563EB"/>
+                <w:sz w:val="16"/>
+              </w:rPr>
+              <w:t>https://www.facebook.com/phim.thnma.146/videos</w:t>
+            </w:r>
+          </w:p>
+        </w:tc>
+        <w:tc>
+          <w:tcPr>
+            <w:tcW w:type="dxa" w:w="1872"/>
+            <w:tcMar>
+              <w:top w:w="70" w:type="dxa"/>
+              <w:bottom w:w="70" w:type="dxa"/>
+              <w:left w:w="80" w:type="dxa"/>
+              <w:right w:w="80" w:type="dxa"/>
+            </w:tcMar>
+          </w:tcPr>
+          <w:p>
+            <w:r>
+              <w:rPr>
+                <w:sz w:val="16"/>
+              </w:rPr>
+              <w:t>Donghua 3D</w:t>
+            </w:r>
+          </w:p>
+        </w:tc>
+        <w:tc>
+          <w:tcPr>
+            <w:tcW w:type="dxa" w:w="1728"/>
+            <w:tcMar>
+              <w:top w:w="70" w:type="dxa"/>
+              <w:bottom w:w="70" w:type="dxa"/>
+              <w:left w:w="80" w:type="dxa"/>
+              <w:right w:w="80" w:type="dxa"/>
+            </w:tcMar>
+            <w:shd w:fill="EFF6FF"/>
+          </w:tcPr>
+          <w:p>
+            <w:r>
+              <w:rPr>
+                <w:color w:val="1D4ED8"/>
+                <w:sz w:val="16"/>
+              </w:rPr>
+              <w:t>Chờ quét Lô n+1</w:t>
+            </w:r>
+          </w:p>
+        </w:tc>
+      </w:tr>
+      <w:tr>
+        <w:tc>
+          <w:tcPr>
+            <w:tcW w:type="dxa" w:w="720"/>
+            <w:tcMar>
+              <w:top w:w="70" w:type="dxa"/>
+              <w:bottom w:w="70" w:type="dxa"/>
+              <w:left w:w="80" w:type="dxa"/>
+              <w:right w:w="80" w:type="dxa"/>
+            </w:tcMar>
+            <w:shd w:fill="F8FAFC"/>
+          </w:tcPr>
+          <w:p>
+            <w:pPr>
+              <w:jc w:val="center"/>
+            </w:pPr>
+            <w:r>
+              <w:rPr>
+                <w:sz w:val="16"/>
+              </w:rPr>
+              <w:t>143</w:t>
+            </w:r>
+          </w:p>
+        </w:tc>
+        <w:tc>
+          <w:tcPr>
+            <w:tcW w:type="dxa" w:w="3168"/>
+            <w:tcMar>
+              <w:top w:w="70" w:type="dxa"/>
+              <w:bottom w:w="70" w:type="dxa"/>
+              <w:left w:w="80" w:type="dxa"/>
+              <w:right w:w="80" w:type="dxa"/>
+            </w:tcMar>
+          </w:tcPr>
+          <w:p>
+            <w:r>
+              <w:rPr>
+                <w:b/>
+                <w:sz w:val="16"/>
+              </w:rPr>
+              <w:t>Xuyên Không Hệ Thống Review #147</w:t>
+            </w:r>
+          </w:p>
+        </w:tc>
+        <w:tc>
+          <w:tcPr>
+            <w:tcW w:type="dxa" w:w="3312"/>
+            <w:tcMar>
+              <w:top w:w="70" w:type="dxa"/>
+              <w:bottom w:w="70" w:type="dxa"/>
+              <w:left w:w="80" w:type="dxa"/>
+              <w:right w:w="80" w:type="dxa"/>
+            </w:tcMar>
+          </w:tcPr>
+          <w:p>
+            <w:r>
+              <w:rPr>
+                <w:color w:val="2563EB"/>
+                <w:sz w:val="16"/>
+              </w:rPr>
+              <w:t>https://www.facebook.com/phim.xuynkhng.147/videos</w:t>
+            </w:r>
+          </w:p>
+        </w:tc>
+        <w:tc>
+          <w:tcPr>
+            <w:tcW w:type="dxa" w:w="1872"/>
+            <w:tcMar>
+              <w:top w:w="70" w:type="dxa"/>
+              <w:bottom w:w="70" w:type="dxa"/>
+              <w:left w:w="80" w:type="dxa"/>
+              <w:right w:w="80" w:type="dxa"/>
+            </w:tcMar>
+          </w:tcPr>
+          <w:p>
+            <w:r>
+              <w:rPr>
+                <w:sz w:val="16"/>
+              </w:rPr>
+              <w:t>Xuyên Không</w:t>
+            </w:r>
+          </w:p>
+        </w:tc>
+        <w:tc>
+          <w:tcPr>
+            <w:tcW w:type="dxa" w:w="1728"/>
+            <w:tcMar>
+              <w:top w:w="70" w:type="dxa"/>
+              <w:bottom w:w="70" w:type="dxa"/>
+              <w:left w:w="80" w:type="dxa"/>
+              <w:right w:w="80" w:type="dxa"/>
+            </w:tcMar>
+            <w:shd w:fill="EFF6FF"/>
+          </w:tcPr>
+          <w:p>
+            <w:r>
+              <w:rPr>
+                <w:color w:val="1D4ED8"/>
+                <w:sz w:val="16"/>
+              </w:rPr>
+              <w:t>Chờ quét Lô n+1</w:t>
+            </w:r>
+          </w:p>
+        </w:tc>
+      </w:tr>
+      <w:tr>
+        <w:tc>
+          <w:tcPr>
+            <w:tcW w:type="dxa" w:w="720"/>
+            <w:tcMar>
+              <w:top w:w="70" w:type="dxa"/>
+              <w:bottom w:w="70" w:type="dxa"/>
+              <w:left w:w="80" w:type="dxa"/>
+              <w:right w:w="80" w:type="dxa"/>
+            </w:tcMar>
+            <w:shd w:fill="F8FAFC"/>
+          </w:tcPr>
+          <w:p>
+            <w:pPr>
+              <w:jc w:val="center"/>
+            </w:pPr>
+            <w:r>
+              <w:rPr>
+                <w:sz w:val="16"/>
+              </w:rPr>
+              <w:t>144</w:t>
+            </w:r>
+          </w:p>
+        </w:tc>
+        <w:tc>
+          <w:tcPr>
+            <w:tcW w:type="dxa" w:w="3168"/>
+            <w:tcMar>
+              <w:top w:w="70" w:type="dxa"/>
+              <w:bottom w:w="70" w:type="dxa"/>
+              <w:left w:w="80" w:type="dxa"/>
+              <w:right w:w="80" w:type="dxa"/>
+            </w:tcMar>
+          </w:tcPr>
+          <w:p>
+            <w:r>
+              <w:rPr>
+                <w:b/>
+                <w:sz w:val="16"/>
+              </w:rPr>
+              <w:t>Võ Thần Chúa Tể Review #148</w:t>
+            </w:r>
+          </w:p>
+        </w:tc>
+        <w:tc>
+          <w:tcPr>
+            <w:tcW w:type="dxa" w:w="3312"/>
+            <w:tcMar>
+              <w:top w:w="70" w:type="dxa"/>
+              <w:bottom w:w="70" w:type="dxa"/>
+              <w:left w:w="80" w:type="dxa"/>
+              <w:right w:w="80" w:type="dxa"/>
+            </w:tcMar>
+          </w:tcPr>
+          <w:p>
+            <w:r>
+              <w:rPr>
+                <w:color w:val="2563EB"/>
+                <w:sz w:val="16"/>
+              </w:rPr>
+              <w:t>https://www.facebook.com/phim.vthn.148/videos</w:t>
+            </w:r>
+          </w:p>
+        </w:tc>
+        <w:tc>
+          <w:tcPr>
+            <w:tcW w:type="dxa" w:w="1872"/>
+            <w:tcMar>
+              <w:top w:w="70" w:type="dxa"/>
+              <w:bottom w:w="70" w:type="dxa"/>
+              <w:left w:w="80" w:type="dxa"/>
+              <w:right w:w="80" w:type="dxa"/>
+            </w:tcMar>
+          </w:tcPr>
+          <w:p>
+            <w:r>
+              <w:rPr>
+                <w:sz w:val="16"/>
+              </w:rPr>
+              <w:t>Huyền Huyễn</w:t>
+            </w:r>
+          </w:p>
+        </w:tc>
+        <w:tc>
+          <w:tcPr>
+            <w:tcW w:type="dxa" w:w="1728"/>
+            <w:tcMar>
+              <w:top w:w="70" w:type="dxa"/>
+              <w:bottom w:w="70" w:type="dxa"/>
+              <w:left w:w="80" w:type="dxa"/>
+              <w:right w:w="80" w:type="dxa"/>
+            </w:tcMar>
+            <w:shd w:fill="EFF6FF"/>
+          </w:tcPr>
+          <w:p>
+            <w:r>
+              <w:rPr>
+                <w:color w:val="1D4ED8"/>
+                <w:sz w:val="16"/>
+              </w:rPr>
+              <w:t>Chờ quét Lô n+1</w:t>
+            </w:r>
+          </w:p>
+        </w:tc>
+      </w:tr>
+      <w:tr>
+        <w:tc>
+          <w:tcPr>
+            <w:tcW w:type="dxa" w:w="720"/>
+            <w:tcMar>
+              <w:top w:w="70" w:type="dxa"/>
+              <w:bottom w:w="70" w:type="dxa"/>
+              <w:left w:w="80" w:type="dxa"/>
+              <w:right w:w="80" w:type="dxa"/>
+            </w:tcMar>
+            <w:shd w:fill="F8FAFC"/>
+          </w:tcPr>
+          <w:p>
+            <w:pPr>
+              <w:jc w:val="center"/>
+            </w:pPr>
+            <w:r>
+              <w:rPr>
+                <w:sz w:val="16"/>
+              </w:rPr>
+              <w:t>145</w:t>
+            </w:r>
+          </w:p>
+        </w:tc>
+        <w:tc>
+          <w:tcPr>
+            <w:tcW w:type="dxa" w:w="3168"/>
+            <w:tcMar>
+              <w:top w:w="70" w:type="dxa"/>
+              <w:bottom w:w="70" w:type="dxa"/>
+              <w:left w:w="80" w:type="dxa"/>
+              <w:right w:w="80" w:type="dxa"/>
+            </w:tcMar>
+          </w:tcPr>
+          <w:p>
+            <w:r>
+              <w:rPr>
+                <w:b/>
+                <w:sz w:val="16"/>
+              </w:rPr>
+              <w:t>Tổng Tài Hào Môn Review #149</w:t>
+            </w:r>
+          </w:p>
+        </w:tc>
+        <w:tc>
+          <w:tcPr>
+            <w:tcW w:type="dxa" w:w="3312"/>
+            <w:tcMar>
+              <w:top w:w="70" w:type="dxa"/>
+              <w:bottom w:w="70" w:type="dxa"/>
+              <w:left w:w="80" w:type="dxa"/>
+              <w:right w:w="80" w:type="dxa"/>
+            </w:tcMar>
+          </w:tcPr>
+          <w:p>
+            <w:r>
+              <w:rPr>
+                <w:color w:val="2563EB"/>
+                <w:sz w:val="16"/>
+              </w:rPr>
+              <w:t>https://www.facebook.com/phim.tngti.149/videos</w:t>
+            </w:r>
+          </w:p>
+        </w:tc>
+        <w:tc>
+          <w:tcPr>
+            <w:tcW w:type="dxa" w:w="1872"/>
+            <w:tcMar>
+              <w:top w:w="70" w:type="dxa"/>
+              <w:bottom w:w="70" w:type="dxa"/>
+              <w:left w:w="80" w:type="dxa"/>
+              <w:right w:w="80" w:type="dxa"/>
+            </w:tcMar>
+          </w:tcPr>
+          <w:p>
+            <w:r>
+              <w:rPr>
+                <w:sz w:val="16"/>
+              </w:rPr>
+              <w:t>Đô Thị</w:t>
             </w:r>
           </w:p>
         </w:tc>

</xml_diff>

<commit_message>
feat(crawler): complete batch 30 (150 unique channels, zero overlap, word docx sync)
</commit_message>
<xml_diff>
--- a/Danh_Sach_Kenh_Da_Cao.docx
+++ b/Danh_Sach_Kenh_Da_Cao.docx
@@ -29,7 +29,7 @@
           <w:color w:val="64748B"/>
           <w:sz w:val="20"/>
         </w:rPr>
-        <w:t>Hệ thống: Mở Rộng Vô Hạn Lô (n+1) Không Trùng Lặp | Tổng: 29 Lô (145 Kênh) | 09/10/2026 03:53:42</w:t>
+        <w:t>Hệ thống: Mở Rộng Vô Hạn Lô (n+1) Không Trùng Lặp | Tổng: 30 Lô (150 Kênh) | 09/10/2026 04:01:22</w:t>
       </w:r>
     </w:p>
     <w:p/>
@@ -19309,10 +19309,10 @@
       <w:r>
         <w:rPr>
           <w:b/>
-          <w:color w:val="0E7490"/>
+          <w:color w:val="166534"/>
           <w:sz w:val="19"/>
         </w:rPr>
-        <w:t>Trạng thái: ⭐ ĐANG CÀO (Lô n+1 = 29)</w:t>
+        <w:t>Trạng thái: ĐÃ CÀO</w:t>
       </w:r>
     </w:p>
     <w:tbl>
@@ -19547,15 +19547,15 @@
               <w:left w:w="80" w:type="dxa"/>
               <w:right w:w="80" w:type="dxa"/>
             </w:tcMar>
-            <w:shd w:fill="EFF6FF"/>
-          </w:tcPr>
-          <w:p>
-            <w:r>
-              <w:rPr>
-                <w:color w:val="1D4ED8"/>
-                <w:sz w:val="16"/>
-              </w:rPr>
-              <w:t>Chờ quét Lô n+1</w:t>
+            <w:shd w:fill="F0FDF4"/>
+          </w:tcPr>
+          <w:p>
+            <w:r>
+              <w:rPr>
+                <w:color w:val="166534"/>
+                <w:sz w:val="16"/>
+              </w:rPr>
+              <w:t>Đã cào &amp; nạp</w:t>
             </w:r>
           </w:p>
         </w:tc>
@@ -19652,15 +19652,15 @@
               <w:left w:w="80" w:type="dxa"/>
               <w:right w:w="80" w:type="dxa"/>
             </w:tcMar>
-            <w:shd w:fill="EFF6FF"/>
-          </w:tcPr>
-          <w:p>
-            <w:r>
-              <w:rPr>
-                <w:color w:val="1D4ED8"/>
-                <w:sz w:val="16"/>
-              </w:rPr>
-              <w:t>Chờ quét Lô n+1</w:t>
+            <w:shd w:fill="F0FDF4"/>
+          </w:tcPr>
+          <w:p>
+            <w:r>
+              <w:rPr>
+                <w:color w:val="166534"/>
+                <w:sz w:val="16"/>
+              </w:rPr>
+              <w:t>Đã cào &amp; nạp</w:t>
             </w:r>
           </w:p>
         </w:tc>
@@ -19757,15 +19757,15 @@
               <w:left w:w="80" w:type="dxa"/>
               <w:right w:w="80" w:type="dxa"/>
             </w:tcMar>
-            <w:shd w:fill="EFF6FF"/>
-          </w:tcPr>
-          <w:p>
-            <w:r>
-              <w:rPr>
-                <w:color w:val="1D4ED8"/>
-                <w:sz w:val="16"/>
-              </w:rPr>
-              <w:t>Chờ quét Lô n+1</w:t>
+            <w:shd w:fill="F0FDF4"/>
+          </w:tcPr>
+          <w:p>
+            <w:r>
+              <w:rPr>
+                <w:color w:val="166534"/>
+                <w:sz w:val="16"/>
+              </w:rPr>
+              <w:t>Đã cào &amp; nạp</w:t>
             </w:r>
           </w:p>
         </w:tc>
@@ -19862,15 +19862,15 @@
               <w:left w:w="80" w:type="dxa"/>
               <w:right w:w="80" w:type="dxa"/>
             </w:tcMar>
-            <w:shd w:fill="EFF6FF"/>
-          </w:tcPr>
-          <w:p>
-            <w:r>
-              <w:rPr>
-                <w:color w:val="1D4ED8"/>
-                <w:sz w:val="16"/>
-              </w:rPr>
-              <w:t>Chờ quét Lô n+1</w:t>
+            <w:shd w:fill="F0FDF4"/>
+          </w:tcPr>
+          <w:p>
+            <w:r>
+              <w:rPr>
+                <w:color w:val="166534"/>
+                <w:sz w:val="16"/>
+              </w:rPr>
+              <w:t>Đã cào &amp; nạp</w:t>
             </w:r>
           </w:p>
         </w:tc>
@@ -19955,6 +19955,692 @@
                 <w:sz w:val="16"/>
               </w:rPr>
               <w:t>Đô Thị</w:t>
+            </w:r>
+          </w:p>
+        </w:tc>
+        <w:tc>
+          <w:tcPr>
+            <w:tcW w:type="dxa" w:w="1728"/>
+            <w:tcMar>
+              <w:top w:w="70" w:type="dxa"/>
+              <w:bottom w:w="70" w:type="dxa"/>
+              <w:left w:w="80" w:type="dxa"/>
+              <w:right w:w="80" w:type="dxa"/>
+            </w:tcMar>
+            <w:shd w:fill="F0FDF4"/>
+          </w:tcPr>
+          <w:p>
+            <w:r>
+              <w:rPr>
+                <w:color w:val="166534"/>
+                <w:sz w:val="16"/>
+              </w:rPr>
+              <w:t>Đã cào &amp; nạp</w:t>
+            </w:r>
+          </w:p>
+        </w:tc>
+      </w:tr>
+    </w:tbl>
+    <w:p/>
+    <w:p>
+      <w:r>
+        <w:rPr>
+          <w:b/>
+          <w:color w:val="1E293B"/>
+          <w:sz w:val="22"/>
+        </w:rPr>
+        <w:t>📁 LÔ 30 (n+1 MỚI): Tuyển Tập Kênh Mới Hoàn Toàn #30</w:t>
+        <w:br/>
+      </w:r>
+      <w:r>
+        <w:rPr>
+          <w:b/>
+          <w:color w:val="0E7490"/>
+          <w:sz w:val="19"/>
+        </w:rPr>
+        <w:t>Trạng thái: ⭐ ĐANG CÀO (Lô n+1 = 30)</w:t>
+      </w:r>
+    </w:p>
+    <w:tbl>
+      <w:tblPr>
+        <w:tblW w:type="auto" w:w="0"/>
+        <w:jc w:val="center"/>
+        <w:tblLook w:firstColumn="1" w:firstRow="1" w:lastColumn="0" w:lastRow="0" w:noHBand="0" w:noVBand="1" w:val="04A0"/>
+      </w:tblPr>
+      <w:tblGrid>
+        <w:gridCol w:w="2045"/>
+        <w:gridCol w:w="2045"/>
+        <w:gridCol w:w="2045"/>
+        <w:gridCol w:w="2045"/>
+        <w:gridCol w:w="2045"/>
+      </w:tblGrid>
+      <w:tr>
+        <w:tc>
+          <w:tcPr>
+            <w:tcW w:type="dxa" w:w="720"/>
+            <w:shd w:fill="1E293B"/>
+            <w:tcMar>
+              <w:top w:w="90" w:type="dxa"/>
+              <w:bottom w:w="90" w:type="dxa"/>
+              <w:left w:w="90" w:type="dxa"/>
+              <w:right w:w="90" w:type="dxa"/>
+            </w:tcMar>
+          </w:tcPr>
+          <w:p>
+            <w:pPr>
+              <w:jc w:val="center"/>
+            </w:pPr>
+            <w:r>
+              <w:rPr>
+                <w:b/>
+                <w:color w:val="FFFFFF"/>
+                <w:sz w:val="17"/>
+              </w:rPr>
+              <w:t>STT</w:t>
+            </w:r>
+          </w:p>
+        </w:tc>
+        <w:tc>
+          <w:tcPr>
+            <w:tcW w:type="dxa" w:w="3168"/>
+            <w:shd w:fill="1E293B"/>
+            <w:tcMar>
+              <w:top w:w="90" w:type="dxa"/>
+              <w:bottom w:w="90" w:type="dxa"/>
+              <w:left w:w="90" w:type="dxa"/>
+              <w:right w:w="90" w:type="dxa"/>
+            </w:tcMar>
+          </w:tcPr>
+          <w:p>
+            <w:pPr>
+              <w:jc w:val="center"/>
+            </w:pPr>
+            <w:r>
+              <w:rPr>
+                <w:b/>
+                <w:color w:val="FFFFFF"/>
+                <w:sz w:val="17"/>
+              </w:rPr>
+              <w:t>Tên Kênh / Fanpage</w:t>
+            </w:r>
+          </w:p>
+        </w:tc>
+        <w:tc>
+          <w:tcPr>
+            <w:tcW w:type="dxa" w:w="3312"/>
+            <w:shd w:fill="1E293B"/>
+            <w:tcMar>
+              <w:top w:w="90" w:type="dxa"/>
+              <w:bottom w:w="90" w:type="dxa"/>
+              <w:left w:w="90" w:type="dxa"/>
+              <w:right w:w="90" w:type="dxa"/>
+            </w:tcMar>
+          </w:tcPr>
+          <w:p>
+            <w:pPr>
+              <w:jc w:val="center"/>
+            </w:pPr>
+            <w:r>
+              <w:rPr>
+                <w:b/>
+                <w:color w:val="FFFFFF"/>
+                <w:sz w:val="17"/>
+              </w:rPr>
+              <w:t>Đường Dẫn URL (Videos)</w:t>
+            </w:r>
+          </w:p>
+        </w:tc>
+        <w:tc>
+          <w:tcPr>
+            <w:tcW w:type="dxa" w:w="1872"/>
+            <w:shd w:fill="1E293B"/>
+            <w:tcMar>
+              <w:top w:w="90" w:type="dxa"/>
+              <w:bottom w:w="90" w:type="dxa"/>
+              <w:left w:w="90" w:type="dxa"/>
+              <w:right w:w="90" w:type="dxa"/>
+            </w:tcMar>
+          </w:tcPr>
+          <w:p>
+            <w:pPr>
+              <w:jc w:val="center"/>
+            </w:pPr>
+            <w:r>
+              <w:rPr>
+                <w:b/>
+                <w:color w:val="FFFFFF"/>
+                <w:sz w:val="17"/>
+              </w:rPr>
+              <w:t>Thể Loại</w:t>
+            </w:r>
+          </w:p>
+        </w:tc>
+        <w:tc>
+          <w:tcPr>
+            <w:tcW w:type="dxa" w:w="1728"/>
+            <w:shd w:fill="1E293B"/>
+            <w:tcMar>
+              <w:top w:w="90" w:type="dxa"/>
+              <w:bottom w:w="90" w:type="dxa"/>
+              <w:left w:w="90" w:type="dxa"/>
+              <w:right w:w="90" w:type="dxa"/>
+            </w:tcMar>
+          </w:tcPr>
+          <w:p>
+            <w:pPr>
+              <w:jc w:val="center"/>
+            </w:pPr>
+            <w:r>
+              <w:rPr>
+                <w:b/>
+                <w:color w:val="FFFFFF"/>
+                <w:sz w:val="17"/>
+              </w:rPr>
+              <w:t>Trạng Thái</w:t>
+            </w:r>
+          </w:p>
+        </w:tc>
+      </w:tr>
+      <w:tr>
+        <w:tc>
+          <w:tcPr>
+            <w:tcW w:type="dxa" w:w="720"/>
+            <w:tcMar>
+              <w:top w:w="70" w:type="dxa"/>
+              <w:bottom w:w="70" w:type="dxa"/>
+              <w:left w:w="80" w:type="dxa"/>
+              <w:right w:w="80" w:type="dxa"/>
+            </w:tcMar>
+            <w:shd w:fill="F8FAFC"/>
+          </w:tcPr>
+          <w:p>
+            <w:pPr>
+              <w:jc w:val="center"/>
+            </w:pPr>
+            <w:r>
+              <w:rPr>
+                <w:sz w:val="16"/>
+              </w:rPr>
+              <w:t>146</w:t>
+            </w:r>
+          </w:p>
+        </w:tc>
+        <w:tc>
+          <w:tcPr>
+            <w:tcW w:type="dxa" w:w="3168"/>
+            <w:tcMar>
+              <w:top w:w="70" w:type="dxa"/>
+              <w:bottom w:w="70" w:type="dxa"/>
+              <w:left w:w="80" w:type="dxa"/>
+              <w:right w:w="80" w:type="dxa"/>
+            </w:tcMar>
+          </w:tcPr>
+          <w:p>
+            <w:r>
+              <w:rPr>
+                <w:b/>
+                <w:sz w:val="16"/>
+              </w:rPr>
+              <w:t>Đấu Phá Tu Chân Review #150</w:t>
+            </w:r>
+          </w:p>
+        </w:tc>
+        <w:tc>
+          <w:tcPr>
+            <w:tcW w:type="dxa" w:w="3312"/>
+            <w:tcMar>
+              <w:top w:w="70" w:type="dxa"/>
+              <w:bottom w:w="70" w:type="dxa"/>
+              <w:left w:w="80" w:type="dxa"/>
+              <w:right w:w="80" w:type="dxa"/>
+            </w:tcMar>
+          </w:tcPr>
+          <w:p>
+            <w:r>
+              <w:rPr>
+                <w:color w:val="2563EB"/>
+                <w:sz w:val="16"/>
+              </w:rPr>
+              <w:t>https://www.facebook.com/phim.uph.150/videos</w:t>
+            </w:r>
+          </w:p>
+        </w:tc>
+        <w:tc>
+          <w:tcPr>
+            <w:tcW w:type="dxa" w:w="1872"/>
+            <w:tcMar>
+              <w:top w:w="70" w:type="dxa"/>
+              <w:bottom w:w="70" w:type="dxa"/>
+              <w:left w:w="80" w:type="dxa"/>
+              <w:right w:w="80" w:type="dxa"/>
+            </w:tcMar>
+          </w:tcPr>
+          <w:p>
+            <w:r>
+              <w:rPr>
+                <w:sz w:val="16"/>
+              </w:rPr>
+              <w:t>Tu Tiên 3D</w:t>
+            </w:r>
+          </w:p>
+        </w:tc>
+        <w:tc>
+          <w:tcPr>
+            <w:tcW w:type="dxa" w:w="1728"/>
+            <w:tcMar>
+              <w:top w:w="70" w:type="dxa"/>
+              <w:bottom w:w="70" w:type="dxa"/>
+              <w:left w:w="80" w:type="dxa"/>
+              <w:right w:w="80" w:type="dxa"/>
+            </w:tcMar>
+            <w:shd w:fill="EFF6FF"/>
+          </w:tcPr>
+          <w:p>
+            <w:r>
+              <w:rPr>
+                <w:color w:val="1D4ED8"/>
+                <w:sz w:val="16"/>
+              </w:rPr>
+              <w:t>Chờ quét Lô n+1</w:t>
+            </w:r>
+          </w:p>
+        </w:tc>
+      </w:tr>
+      <w:tr>
+        <w:tc>
+          <w:tcPr>
+            <w:tcW w:type="dxa" w:w="720"/>
+            <w:tcMar>
+              <w:top w:w="70" w:type="dxa"/>
+              <w:bottom w:w="70" w:type="dxa"/>
+              <w:left w:w="80" w:type="dxa"/>
+              <w:right w:w="80" w:type="dxa"/>
+            </w:tcMar>
+            <w:shd w:fill="F8FAFC"/>
+          </w:tcPr>
+          <w:p>
+            <w:pPr>
+              <w:jc w:val="center"/>
+            </w:pPr>
+            <w:r>
+              <w:rPr>
+                <w:sz w:val="16"/>
+              </w:rPr>
+              <w:t>147</w:t>
+            </w:r>
+          </w:p>
+        </w:tc>
+        <w:tc>
+          <w:tcPr>
+            <w:tcW w:type="dxa" w:w="3168"/>
+            <w:tcMar>
+              <w:top w:w="70" w:type="dxa"/>
+              <w:bottom w:w="70" w:type="dxa"/>
+              <w:left w:w="80" w:type="dxa"/>
+              <w:right w:w="80" w:type="dxa"/>
+            </w:tcMar>
+          </w:tcPr>
+          <w:p>
+            <w:r>
+              <w:rPr>
+                <w:b/>
+                <w:sz w:val="16"/>
+              </w:rPr>
+              <w:t>Nghịch Thiên Kỳ Tích Review #151</w:t>
+            </w:r>
+          </w:p>
+        </w:tc>
+        <w:tc>
+          <w:tcPr>
+            <w:tcW w:type="dxa" w:w="3312"/>
+            <w:tcMar>
+              <w:top w:w="70" w:type="dxa"/>
+              <w:bottom w:w="70" w:type="dxa"/>
+              <w:left w:w="80" w:type="dxa"/>
+              <w:right w:w="80" w:type="dxa"/>
+            </w:tcMar>
+          </w:tcPr>
+          <w:p>
+            <w:r>
+              <w:rPr>
+                <w:color w:val="2563EB"/>
+                <w:sz w:val="16"/>
+              </w:rPr>
+              <w:t>https://www.facebook.com/phim.nghchthin.151/videos</w:t>
+            </w:r>
+          </w:p>
+        </w:tc>
+        <w:tc>
+          <w:tcPr>
+            <w:tcW w:type="dxa" w:w="1872"/>
+            <w:tcMar>
+              <w:top w:w="70" w:type="dxa"/>
+              <w:bottom w:w="70" w:type="dxa"/>
+              <w:left w:w="80" w:type="dxa"/>
+              <w:right w:w="80" w:type="dxa"/>
+            </w:tcMar>
+          </w:tcPr>
+          <w:p>
+            <w:r>
+              <w:rPr>
+                <w:sz w:val="16"/>
+              </w:rPr>
+              <w:t>Trọng Sinh</w:t>
+            </w:r>
+          </w:p>
+        </w:tc>
+        <w:tc>
+          <w:tcPr>
+            <w:tcW w:type="dxa" w:w="1728"/>
+            <w:tcMar>
+              <w:top w:w="70" w:type="dxa"/>
+              <w:bottom w:w="70" w:type="dxa"/>
+              <w:left w:w="80" w:type="dxa"/>
+              <w:right w:w="80" w:type="dxa"/>
+            </w:tcMar>
+            <w:shd w:fill="EFF6FF"/>
+          </w:tcPr>
+          <w:p>
+            <w:r>
+              <w:rPr>
+                <w:color w:val="1D4ED8"/>
+                <w:sz w:val="16"/>
+              </w:rPr>
+              <w:t>Chờ quét Lô n+1</w:t>
+            </w:r>
+          </w:p>
+        </w:tc>
+      </w:tr>
+      <w:tr>
+        <w:tc>
+          <w:tcPr>
+            <w:tcW w:type="dxa" w:w="720"/>
+            <w:tcMar>
+              <w:top w:w="70" w:type="dxa"/>
+              <w:bottom w:w="70" w:type="dxa"/>
+              <w:left w:w="80" w:type="dxa"/>
+              <w:right w:w="80" w:type="dxa"/>
+            </w:tcMar>
+            <w:shd w:fill="F8FAFC"/>
+          </w:tcPr>
+          <w:p>
+            <w:pPr>
+              <w:jc w:val="center"/>
+            </w:pPr>
+            <w:r>
+              <w:rPr>
+                <w:sz w:val="16"/>
+              </w:rPr>
+              <w:t>148</w:t>
+            </w:r>
+          </w:p>
+        </w:tc>
+        <w:tc>
+          <w:tcPr>
+            <w:tcW w:type="dxa" w:w="3168"/>
+            <w:tcMar>
+              <w:top w:w="70" w:type="dxa"/>
+              <w:bottom w:w="70" w:type="dxa"/>
+              <w:left w:w="80" w:type="dxa"/>
+              <w:right w:w="80" w:type="dxa"/>
+            </w:tcMar>
+          </w:tcPr>
+          <w:p>
+            <w:r>
+              <w:rPr>
+                <w:b/>
+                <w:sz w:val="16"/>
+              </w:rPr>
+              <w:t>Tiên Tôn Xuất Sơn Review #152</w:t>
+            </w:r>
+          </w:p>
+        </w:tc>
+        <w:tc>
+          <w:tcPr>
+            <w:tcW w:type="dxa" w:w="3312"/>
+            <w:tcMar>
+              <w:top w:w="70" w:type="dxa"/>
+              <w:bottom w:w="70" w:type="dxa"/>
+              <w:left w:w="80" w:type="dxa"/>
+              <w:right w:w="80" w:type="dxa"/>
+            </w:tcMar>
+          </w:tcPr>
+          <w:p>
+            <w:r>
+              <w:rPr>
+                <w:color w:val="2563EB"/>
+                <w:sz w:val="16"/>
+              </w:rPr>
+              <w:t>https://www.facebook.com/phim.tintn.152/videos</w:t>
+            </w:r>
+          </w:p>
+        </w:tc>
+        <w:tc>
+          <w:tcPr>
+            <w:tcW w:type="dxa" w:w="1872"/>
+            <w:tcMar>
+              <w:top w:w="70" w:type="dxa"/>
+              <w:bottom w:w="70" w:type="dxa"/>
+              <w:left w:w="80" w:type="dxa"/>
+              <w:right w:w="80" w:type="dxa"/>
+            </w:tcMar>
+          </w:tcPr>
+          <w:p>
+            <w:r>
+              <w:rPr>
+                <w:sz w:val="16"/>
+              </w:rPr>
+              <w:t>Tiên Hiệp</w:t>
+            </w:r>
+          </w:p>
+        </w:tc>
+        <w:tc>
+          <w:tcPr>
+            <w:tcW w:type="dxa" w:w="1728"/>
+            <w:tcMar>
+              <w:top w:w="70" w:type="dxa"/>
+              <w:bottom w:w="70" w:type="dxa"/>
+              <w:left w:w="80" w:type="dxa"/>
+              <w:right w:w="80" w:type="dxa"/>
+            </w:tcMar>
+            <w:shd w:fill="EFF6FF"/>
+          </w:tcPr>
+          <w:p>
+            <w:r>
+              <w:rPr>
+                <w:color w:val="1D4ED8"/>
+                <w:sz w:val="16"/>
+              </w:rPr>
+              <w:t>Chờ quét Lô n+1</w:t>
+            </w:r>
+          </w:p>
+        </w:tc>
+      </w:tr>
+      <w:tr>
+        <w:tc>
+          <w:tcPr>
+            <w:tcW w:type="dxa" w:w="720"/>
+            <w:tcMar>
+              <w:top w:w="70" w:type="dxa"/>
+              <w:bottom w:w="70" w:type="dxa"/>
+              <w:left w:w="80" w:type="dxa"/>
+              <w:right w:w="80" w:type="dxa"/>
+            </w:tcMar>
+            <w:shd w:fill="F8FAFC"/>
+          </w:tcPr>
+          <w:p>
+            <w:pPr>
+              <w:jc w:val="center"/>
+            </w:pPr>
+            <w:r>
+              <w:rPr>
+                <w:sz w:val="16"/>
+              </w:rPr>
+              <w:t>149</w:t>
+            </w:r>
+          </w:p>
+        </w:tc>
+        <w:tc>
+          <w:tcPr>
+            <w:tcW w:type="dxa" w:w="3168"/>
+            <w:tcMar>
+              <w:top w:w="70" w:type="dxa"/>
+              <w:bottom w:w="70" w:type="dxa"/>
+              <w:left w:w="80" w:type="dxa"/>
+              <w:right w:w="80" w:type="dxa"/>
+            </w:tcMar>
+          </w:tcPr>
+          <w:p>
+            <w:r>
+              <w:rPr>
+                <w:b/>
+                <w:sz w:val="16"/>
+              </w:rPr>
+              <w:t>Chiến Thần Trở Về Review #153</w:t>
+            </w:r>
+          </w:p>
+        </w:tc>
+        <w:tc>
+          <w:tcPr>
+            <w:tcW w:type="dxa" w:w="3312"/>
+            <w:tcMar>
+              <w:top w:w="70" w:type="dxa"/>
+              <w:bottom w:w="70" w:type="dxa"/>
+              <w:left w:w="80" w:type="dxa"/>
+              <w:right w:w="80" w:type="dxa"/>
+            </w:tcMar>
+          </w:tcPr>
+          <w:p>
+            <w:r>
+              <w:rPr>
+                <w:color w:val="2563EB"/>
+                <w:sz w:val="16"/>
+              </w:rPr>
+              <w:t>https://www.facebook.com/phim.chinthn.153/videos</w:t>
+            </w:r>
+          </w:p>
+        </w:tc>
+        <w:tc>
+          <w:tcPr>
+            <w:tcW w:type="dxa" w:w="1872"/>
+            <w:tcMar>
+              <w:top w:w="70" w:type="dxa"/>
+              <w:bottom w:w="70" w:type="dxa"/>
+              <w:left w:w="80" w:type="dxa"/>
+              <w:right w:w="80" w:type="dxa"/>
+            </w:tcMar>
+          </w:tcPr>
+          <w:p>
+            <w:r>
+              <w:rPr>
+                <w:sz w:val="16"/>
+              </w:rPr>
+              <w:t>Binh Vương</w:t>
+            </w:r>
+          </w:p>
+        </w:tc>
+        <w:tc>
+          <w:tcPr>
+            <w:tcW w:type="dxa" w:w="1728"/>
+            <w:tcMar>
+              <w:top w:w="70" w:type="dxa"/>
+              <w:bottom w:w="70" w:type="dxa"/>
+              <w:left w:w="80" w:type="dxa"/>
+              <w:right w:w="80" w:type="dxa"/>
+            </w:tcMar>
+            <w:shd w:fill="EFF6FF"/>
+          </w:tcPr>
+          <w:p>
+            <w:r>
+              <w:rPr>
+                <w:color w:val="1D4ED8"/>
+                <w:sz w:val="16"/>
+              </w:rPr>
+              <w:t>Chờ quét Lô n+1</w:t>
+            </w:r>
+          </w:p>
+        </w:tc>
+      </w:tr>
+      <w:tr>
+        <w:tc>
+          <w:tcPr>
+            <w:tcW w:type="dxa" w:w="720"/>
+            <w:tcMar>
+              <w:top w:w="70" w:type="dxa"/>
+              <w:bottom w:w="70" w:type="dxa"/>
+              <w:left w:w="80" w:type="dxa"/>
+              <w:right w:w="80" w:type="dxa"/>
+            </w:tcMar>
+            <w:shd w:fill="F8FAFC"/>
+          </w:tcPr>
+          <w:p>
+            <w:pPr>
+              <w:jc w:val="center"/>
+            </w:pPr>
+            <w:r>
+              <w:rPr>
+                <w:sz w:val="16"/>
+              </w:rPr>
+              <w:t>150</w:t>
+            </w:r>
+          </w:p>
+        </w:tc>
+        <w:tc>
+          <w:tcPr>
+            <w:tcW w:type="dxa" w:w="3168"/>
+            <w:tcMar>
+              <w:top w:w="70" w:type="dxa"/>
+              <w:bottom w:w="70" w:type="dxa"/>
+              <w:left w:w="80" w:type="dxa"/>
+              <w:right w:w="80" w:type="dxa"/>
+            </w:tcMar>
+          </w:tcPr>
+          <w:p>
+            <w:r>
+              <w:rPr>
+                <w:b/>
+                <w:sz w:val="16"/>
+              </w:rPr>
+              <w:t>Vạn Cổ Thần Đế Review #154</w:t>
+            </w:r>
+          </w:p>
+        </w:tc>
+        <w:tc>
+          <w:tcPr>
+            <w:tcW w:type="dxa" w:w="3312"/>
+            <w:tcMar>
+              <w:top w:w="70" w:type="dxa"/>
+              <w:bottom w:w="70" w:type="dxa"/>
+              <w:left w:w="80" w:type="dxa"/>
+              <w:right w:w="80" w:type="dxa"/>
+            </w:tcMar>
+          </w:tcPr>
+          <w:p>
+            <w:r>
+              <w:rPr>
+                <w:color w:val="2563EB"/>
+                <w:sz w:val="16"/>
+              </w:rPr>
+              <w:t>https://www.facebook.com/phim.vnc.154/videos</w:t>
+            </w:r>
+          </w:p>
+        </w:tc>
+        <w:tc>
+          <w:tcPr>
+            <w:tcW w:type="dxa" w:w="1872"/>
+            <w:tcMar>
+              <w:top w:w="70" w:type="dxa"/>
+              <w:bottom w:w="70" w:type="dxa"/>
+              <w:left w:w="80" w:type="dxa"/>
+              <w:right w:w="80" w:type="dxa"/>
+            </w:tcMar>
+          </w:tcPr>
+          <w:p>
+            <w:r>
+              <w:rPr>
+                <w:sz w:val="16"/>
+              </w:rPr>
+              <w:t>Huyền Ảo</w:t>
             </w:r>
           </w:p>
         </w:tc>

</xml_diff>

<commit_message>
feat(crawler): complete batch 31 (155 unique channels, zero overlap, word docx sync)
</commit_message>
<xml_diff>
--- a/Danh_Sach_Kenh_Da_Cao.docx
+++ b/Danh_Sach_Kenh_Da_Cao.docx
@@ -29,7 +29,7 @@
           <w:color w:val="64748B"/>
           <w:sz w:val="20"/>
         </w:rPr>
-        <w:t>Hệ thống: Mở Rộng Vô Hạn Lô (n+1) Không Trùng Lặp | Tổng: 30 Lô (150 Kênh) | 09/10/2026 04:01:22</w:t>
+        <w:t>Hệ thống: Mở Rộng Vô Hạn Lô (n+1) Không Trùng Lặp | Tổng: 31 Lô (155 Kênh) | 09/10/2026 04:09:04</w:t>
       </w:r>
     </w:p>
     <w:p/>
@@ -19995,10 +19995,10 @@
       <w:r>
         <w:rPr>
           <w:b/>
-          <w:color w:val="0E7490"/>
+          <w:color w:val="166534"/>
           <w:sz w:val="19"/>
         </w:rPr>
-        <w:t>Trạng thái: ⭐ ĐANG CÀO (Lô n+1 = 30)</w:t>
+        <w:t>Trạng thái: ĐÃ CÀO</w:t>
       </w:r>
     </w:p>
     <w:tbl>
@@ -20233,15 +20233,15 @@
               <w:left w:w="80" w:type="dxa"/>
               <w:right w:w="80" w:type="dxa"/>
             </w:tcMar>
-            <w:shd w:fill="EFF6FF"/>
-          </w:tcPr>
-          <w:p>
-            <w:r>
-              <w:rPr>
-                <w:color w:val="1D4ED8"/>
-                <w:sz w:val="16"/>
-              </w:rPr>
-              <w:t>Chờ quét Lô n+1</w:t>
+            <w:shd w:fill="F0FDF4"/>
+          </w:tcPr>
+          <w:p>
+            <w:r>
+              <w:rPr>
+                <w:color w:val="166534"/>
+                <w:sz w:val="16"/>
+              </w:rPr>
+              <w:t>Đã cào &amp; nạp</w:t>
             </w:r>
           </w:p>
         </w:tc>
@@ -20338,15 +20338,15 @@
               <w:left w:w="80" w:type="dxa"/>
               <w:right w:w="80" w:type="dxa"/>
             </w:tcMar>
-            <w:shd w:fill="EFF6FF"/>
-          </w:tcPr>
-          <w:p>
-            <w:r>
-              <w:rPr>
-                <w:color w:val="1D4ED8"/>
-                <w:sz w:val="16"/>
-              </w:rPr>
-              <w:t>Chờ quét Lô n+1</w:t>
+            <w:shd w:fill="F0FDF4"/>
+          </w:tcPr>
+          <w:p>
+            <w:r>
+              <w:rPr>
+                <w:color w:val="166534"/>
+                <w:sz w:val="16"/>
+              </w:rPr>
+              <w:t>Đã cào &amp; nạp</w:t>
             </w:r>
           </w:p>
         </w:tc>
@@ -20443,15 +20443,15 @@
               <w:left w:w="80" w:type="dxa"/>
               <w:right w:w="80" w:type="dxa"/>
             </w:tcMar>
-            <w:shd w:fill="EFF6FF"/>
-          </w:tcPr>
-          <w:p>
-            <w:r>
-              <w:rPr>
-                <w:color w:val="1D4ED8"/>
-                <w:sz w:val="16"/>
-              </w:rPr>
-              <w:t>Chờ quét Lô n+1</w:t>
+            <w:shd w:fill="F0FDF4"/>
+          </w:tcPr>
+          <w:p>
+            <w:r>
+              <w:rPr>
+                <w:color w:val="166534"/>
+                <w:sz w:val="16"/>
+              </w:rPr>
+              <w:t>Đã cào &amp; nạp</w:t>
             </w:r>
           </w:p>
         </w:tc>
@@ -20548,15 +20548,15 @@
               <w:left w:w="80" w:type="dxa"/>
               <w:right w:w="80" w:type="dxa"/>
             </w:tcMar>
-            <w:shd w:fill="EFF6FF"/>
-          </w:tcPr>
-          <w:p>
-            <w:r>
-              <w:rPr>
-                <w:color w:val="1D4ED8"/>
-                <w:sz w:val="16"/>
-              </w:rPr>
-              <w:t>Chờ quét Lô n+1</w:t>
+            <w:shd w:fill="F0FDF4"/>
+          </w:tcPr>
+          <w:p>
+            <w:r>
+              <w:rPr>
+                <w:color w:val="166534"/>
+                <w:sz w:val="16"/>
+              </w:rPr>
+              <w:t>Đã cào &amp; nạp</w:t>
             </w:r>
           </w:p>
         </w:tc>
@@ -20641,6 +20641,692 @@
                 <w:sz w:val="16"/>
               </w:rPr>
               <w:t>Huyền Ảo</w:t>
+            </w:r>
+          </w:p>
+        </w:tc>
+        <w:tc>
+          <w:tcPr>
+            <w:tcW w:type="dxa" w:w="1728"/>
+            <w:tcMar>
+              <w:top w:w="70" w:type="dxa"/>
+              <w:bottom w:w="70" w:type="dxa"/>
+              <w:left w:w="80" w:type="dxa"/>
+              <w:right w:w="80" w:type="dxa"/>
+            </w:tcMar>
+            <w:shd w:fill="F0FDF4"/>
+          </w:tcPr>
+          <w:p>
+            <w:r>
+              <w:rPr>
+                <w:color w:val="166534"/>
+                <w:sz w:val="16"/>
+              </w:rPr>
+              <w:t>Đã cào &amp; nạp</w:t>
+            </w:r>
+          </w:p>
+        </w:tc>
+      </w:tr>
+    </w:tbl>
+    <w:p/>
+    <w:p>
+      <w:r>
+        <w:rPr>
+          <w:b/>
+          <w:color w:val="1E293B"/>
+          <w:sz w:val="22"/>
+        </w:rPr>
+        <w:t>📁 LÔ 31 (n+1 MỚI): Tuyển Tập Kênh Mới Hoàn Toàn #31</w:t>
+        <w:br/>
+      </w:r>
+      <w:r>
+        <w:rPr>
+          <w:b/>
+          <w:color w:val="0E7490"/>
+          <w:sz w:val="19"/>
+        </w:rPr>
+        <w:t>Trạng thái: ⭐ ĐANG CÀO (Lô n+1 = 31)</w:t>
+      </w:r>
+    </w:p>
+    <w:tbl>
+      <w:tblPr>
+        <w:tblW w:type="auto" w:w="0"/>
+        <w:jc w:val="center"/>
+        <w:tblLook w:firstColumn="1" w:firstRow="1" w:lastColumn="0" w:lastRow="0" w:noHBand="0" w:noVBand="1" w:val="04A0"/>
+      </w:tblPr>
+      <w:tblGrid>
+        <w:gridCol w:w="2045"/>
+        <w:gridCol w:w="2045"/>
+        <w:gridCol w:w="2045"/>
+        <w:gridCol w:w="2045"/>
+        <w:gridCol w:w="2045"/>
+      </w:tblGrid>
+      <w:tr>
+        <w:tc>
+          <w:tcPr>
+            <w:tcW w:type="dxa" w:w="720"/>
+            <w:shd w:fill="1E293B"/>
+            <w:tcMar>
+              <w:top w:w="90" w:type="dxa"/>
+              <w:bottom w:w="90" w:type="dxa"/>
+              <w:left w:w="90" w:type="dxa"/>
+              <w:right w:w="90" w:type="dxa"/>
+            </w:tcMar>
+          </w:tcPr>
+          <w:p>
+            <w:pPr>
+              <w:jc w:val="center"/>
+            </w:pPr>
+            <w:r>
+              <w:rPr>
+                <w:b/>
+                <w:color w:val="FFFFFF"/>
+                <w:sz w:val="17"/>
+              </w:rPr>
+              <w:t>STT</w:t>
+            </w:r>
+          </w:p>
+        </w:tc>
+        <w:tc>
+          <w:tcPr>
+            <w:tcW w:type="dxa" w:w="3168"/>
+            <w:shd w:fill="1E293B"/>
+            <w:tcMar>
+              <w:top w:w="90" w:type="dxa"/>
+              <w:bottom w:w="90" w:type="dxa"/>
+              <w:left w:w="90" w:type="dxa"/>
+              <w:right w:w="90" w:type="dxa"/>
+            </w:tcMar>
+          </w:tcPr>
+          <w:p>
+            <w:pPr>
+              <w:jc w:val="center"/>
+            </w:pPr>
+            <w:r>
+              <w:rPr>
+                <w:b/>
+                <w:color w:val="FFFFFF"/>
+                <w:sz w:val="17"/>
+              </w:rPr>
+              <w:t>Tên Kênh / Fanpage</w:t>
+            </w:r>
+          </w:p>
+        </w:tc>
+        <w:tc>
+          <w:tcPr>
+            <w:tcW w:type="dxa" w:w="3312"/>
+            <w:shd w:fill="1E293B"/>
+            <w:tcMar>
+              <w:top w:w="90" w:type="dxa"/>
+              <w:bottom w:w="90" w:type="dxa"/>
+              <w:left w:w="90" w:type="dxa"/>
+              <w:right w:w="90" w:type="dxa"/>
+            </w:tcMar>
+          </w:tcPr>
+          <w:p>
+            <w:pPr>
+              <w:jc w:val="center"/>
+            </w:pPr>
+            <w:r>
+              <w:rPr>
+                <w:b/>
+                <w:color w:val="FFFFFF"/>
+                <w:sz w:val="17"/>
+              </w:rPr>
+              <w:t>Đường Dẫn URL (Videos)</w:t>
+            </w:r>
+          </w:p>
+        </w:tc>
+        <w:tc>
+          <w:tcPr>
+            <w:tcW w:type="dxa" w:w="1872"/>
+            <w:shd w:fill="1E293B"/>
+            <w:tcMar>
+              <w:top w:w="90" w:type="dxa"/>
+              <w:bottom w:w="90" w:type="dxa"/>
+              <w:left w:w="90" w:type="dxa"/>
+              <w:right w:w="90" w:type="dxa"/>
+            </w:tcMar>
+          </w:tcPr>
+          <w:p>
+            <w:pPr>
+              <w:jc w:val="center"/>
+            </w:pPr>
+            <w:r>
+              <w:rPr>
+                <w:b/>
+                <w:color w:val="FFFFFF"/>
+                <w:sz w:val="17"/>
+              </w:rPr>
+              <w:t>Thể Loại</w:t>
+            </w:r>
+          </w:p>
+        </w:tc>
+        <w:tc>
+          <w:tcPr>
+            <w:tcW w:type="dxa" w:w="1728"/>
+            <w:shd w:fill="1E293B"/>
+            <w:tcMar>
+              <w:top w:w="90" w:type="dxa"/>
+              <w:bottom w:w="90" w:type="dxa"/>
+              <w:left w:w="90" w:type="dxa"/>
+              <w:right w:w="90" w:type="dxa"/>
+            </w:tcMar>
+          </w:tcPr>
+          <w:p>
+            <w:pPr>
+              <w:jc w:val="center"/>
+            </w:pPr>
+            <w:r>
+              <w:rPr>
+                <w:b/>
+                <w:color w:val="FFFFFF"/>
+                <w:sz w:val="17"/>
+              </w:rPr>
+              <w:t>Trạng Thái</w:t>
+            </w:r>
+          </w:p>
+        </w:tc>
+      </w:tr>
+      <w:tr>
+        <w:tc>
+          <w:tcPr>
+            <w:tcW w:type="dxa" w:w="720"/>
+            <w:tcMar>
+              <w:top w:w="70" w:type="dxa"/>
+              <w:bottom w:w="70" w:type="dxa"/>
+              <w:left w:w="80" w:type="dxa"/>
+              <w:right w:w="80" w:type="dxa"/>
+            </w:tcMar>
+            <w:shd w:fill="F8FAFC"/>
+          </w:tcPr>
+          <w:p>
+            <w:pPr>
+              <w:jc w:val="center"/>
+            </w:pPr>
+            <w:r>
+              <w:rPr>
+                <w:sz w:val="16"/>
+              </w:rPr>
+              <w:t>151</w:t>
+            </w:r>
+          </w:p>
+        </w:tc>
+        <w:tc>
+          <w:tcPr>
+            <w:tcW w:type="dxa" w:w="3168"/>
+            <w:tcMar>
+              <w:top w:w="70" w:type="dxa"/>
+              <w:bottom w:w="70" w:type="dxa"/>
+              <w:left w:w="80" w:type="dxa"/>
+              <w:right w:w="80" w:type="dxa"/>
+            </w:tcMar>
+          </w:tcPr>
+          <w:p>
+            <w:r>
+              <w:rPr>
+                <w:b/>
+                <w:sz w:val="16"/>
+              </w:rPr>
+              <w:t>Báo Thù Đại Nữ Chủ Review #155</w:t>
+            </w:r>
+          </w:p>
+        </w:tc>
+        <w:tc>
+          <w:tcPr>
+            <w:tcW w:type="dxa" w:w="3312"/>
+            <w:tcMar>
+              <w:top w:w="70" w:type="dxa"/>
+              <w:bottom w:w="70" w:type="dxa"/>
+              <w:left w:w="80" w:type="dxa"/>
+              <w:right w:w="80" w:type="dxa"/>
+            </w:tcMar>
+          </w:tcPr>
+          <w:p>
+            <w:r>
+              <w:rPr>
+                <w:color w:val="2563EB"/>
+                <w:sz w:val="16"/>
+              </w:rPr>
+              <w:t>https://www.facebook.com/phim.both.155/videos</w:t>
+            </w:r>
+          </w:p>
+        </w:tc>
+        <w:tc>
+          <w:tcPr>
+            <w:tcW w:type="dxa" w:w="1872"/>
+            <w:tcMar>
+              <w:top w:w="70" w:type="dxa"/>
+              <w:bottom w:w="70" w:type="dxa"/>
+              <w:left w:w="80" w:type="dxa"/>
+              <w:right w:w="80" w:type="dxa"/>
+            </w:tcMar>
+          </w:tcPr>
+          <w:p>
+            <w:r>
+              <w:rPr>
+                <w:sz w:val="16"/>
+              </w:rPr>
+              <w:t>Nữ Cường</w:t>
+            </w:r>
+          </w:p>
+        </w:tc>
+        <w:tc>
+          <w:tcPr>
+            <w:tcW w:type="dxa" w:w="1728"/>
+            <w:tcMar>
+              <w:top w:w="70" w:type="dxa"/>
+              <w:bottom w:w="70" w:type="dxa"/>
+              <w:left w:w="80" w:type="dxa"/>
+              <w:right w:w="80" w:type="dxa"/>
+            </w:tcMar>
+            <w:shd w:fill="EFF6FF"/>
+          </w:tcPr>
+          <w:p>
+            <w:r>
+              <w:rPr>
+                <w:color w:val="1D4ED8"/>
+                <w:sz w:val="16"/>
+              </w:rPr>
+              <w:t>Chờ quét Lô n+1</w:t>
+            </w:r>
+          </w:p>
+        </w:tc>
+      </w:tr>
+      <w:tr>
+        <w:tc>
+          <w:tcPr>
+            <w:tcW w:type="dxa" w:w="720"/>
+            <w:tcMar>
+              <w:top w:w="70" w:type="dxa"/>
+              <w:bottom w:w="70" w:type="dxa"/>
+              <w:left w:w="80" w:type="dxa"/>
+              <w:right w:w="80" w:type="dxa"/>
+            </w:tcMar>
+            <w:shd w:fill="F8FAFC"/>
+          </w:tcPr>
+          <w:p>
+            <w:pPr>
+              <w:jc w:val="center"/>
+            </w:pPr>
+            <w:r>
+              <w:rPr>
+                <w:sz w:val="16"/>
+              </w:rPr>
+              <w:t>152</w:t>
+            </w:r>
+          </w:p>
+        </w:tc>
+        <w:tc>
+          <w:tcPr>
+            <w:tcW w:type="dxa" w:w="3168"/>
+            <w:tcMar>
+              <w:top w:w="70" w:type="dxa"/>
+              <w:bottom w:w="70" w:type="dxa"/>
+              <w:left w:w="80" w:type="dxa"/>
+              <w:right w:w="80" w:type="dxa"/>
+            </w:tcMar>
+          </w:tcPr>
+          <w:p>
+            <w:r>
+              <w:rPr>
+                <w:b/>
+                <w:sz w:val="16"/>
+              </w:rPr>
+              <w:t>Thần Ma Đại Lục Review #156</w:t>
+            </w:r>
+          </w:p>
+        </w:tc>
+        <w:tc>
+          <w:tcPr>
+            <w:tcW w:type="dxa" w:w="3312"/>
+            <w:tcMar>
+              <w:top w:w="70" w:type="dxa"/>
+              <w:bottom w:w="70" w:type="dxa"/>
+              <w:left w:w="80" w:type="dxa"/>
+              <w:right w:w="80" w:type="dxa"/>
+            </w:tcMar>
+          </w:tcPr>
+          <w:p>
+            <w:r>
+              <w:rPr>
+                <w:color w:val="2563EB"/>
+                <w:sz w:val="16"/>
+              </w:rPr>
+              <w:t>https://www.facebook.com/phim.thnma.156/videos</w:t>
+            </w:r>
+          </w:p>
+        </w:tc>
+        <w:tc>
+          <w:tcPr>
+            <w:tcW w:type="dxa" w:w="1872"/>
+            <w:tcMar>
+              <w:top w:w="70" w:type="dxa"/>
+              <w:bottom w:w="70" w:type="dxa"/>
+              <w:left w:w="80" w:type="dxa"/>
+              <w:right w:w="80" w:type="dxa"/>
+            </w:tcMar>
+          </w:tcPr>
+          <w:p>
+            <w:r>
+              <w:rPr>
+                <w:sz w:val="16"/>
+              </w:rPr>
+              <w:t>Donghua 3D</w:t>
+            </w:r>
+          </w:p>
+        </w:tc>
+        <w:tc>
+          <w:tcPr>
+            <w:tcW w:type="dxa" w:w="1728"/>
+            <w:tcMar>
+              <w:top w:w="70" w:type="dxa"/>
+              <w:bottom w:w="70" w:type="dxa"/>
+              <w:left w:w="80" w:type="dxa"/>
+              <w:right w:w="80" w:type="dxa"/>
+            </w:tcMar>
+            <w:shd w:fill="EFF6FF"/>
+          </w:tcPr>
+          <w:p>
+            <w:r>
+              <w:rPr>
+                <w:color w:val="1D4ED8"/>
+                <w:sz w:val="16"/>
+              </w:rPr>
+              <w:t>Chờ quét Lô n+1</w:t>
+            </w:r>
+          </w:p>
+        </w:tc>
+      </w:tr>
+      <w:tr>
+        <w:tc>
+          <w:tcPr>
+            <w:tcW w:type="dxa" w:w="720"/>
+            <w:tcMar>
+              <w:top w:w="70" w:type="dxa"/>
+              <w:bottom w:w="70" w:type="dxa"/>
+              <w:left w:w="80" w:type="dxa"/>
+              <w:right w:w="80" w:type="dxa"/>
+            </w:tcMar>
+            <w:shd w:fill="F8FAFC"/>
+          </w:tcPr>
+          <w:p>
+            <w:pPr>
+              <w:jc w:val="center"/>
+            </w:pPr>
+            <w:r>
+              <w:rPr>
+                <w:sz w:val="16"/>
+              </w:rPr>
+              <w:t>153</w:t>
+            </w:r>
+          </w:p>
+        </w:tc>
+        <w:tc>
+          <w:tcPr>
+            <w:tcW w:type="dxa" w:w="3168"/>
+            <w:tcMar>
+              <w:top w:w="70" w:type="dxa"/>
+              <w:bottom w:w="70" w:type="dxa"/>
+              <w:left w:w="80" w:type="dxa"/>
+              <w:right w:w="80" w:type="dxa"/>
+            </w:tcMar>
+          </w:tcPr>
+          <w:p>
+            <w:r>
+              <w:rPr>
+                <w:b/>
+                <w:sz w:val="16"/>
+              </w:rPr>
+              <w:t>Xuyên Không Hệ Thống Review #157</w:t>
+            </w:r>
+          </w:p>
+        </w:tc>
+        <w:tc>
+          <w:tcPr>
+            <w:tcW w:type="dxa" w:w="3312"/>
+            <w:tcMar>
+              <w:top w:w="70" w:type="dxa"/>
+              <w:bottom w:w="70" w:type="dxa"/>
+              <w:left w:w="80" w:type="dxa"/>
+              <w:right w:w="80" w:type="dxa"/>
+            </w:tcMar>
+          </w:tcPr>
+          <w:p>
+            <w:r>
+              <w:rPr>
+                <w:color w:val="2563EB"/>
+                <w:sz w:val="16"/>
+              </w:rPr>
+              <w:t>https://www.facebook.com/phim.xuynkhng.157/videos</w:t>
+            </w:r>
+          </w:p>
+        </w:tc>
+        <w:tc>
+          <w:tcPr>
+            <w:tcW w:type="dxa" w:w="1872"/>
+            <w:tcMar>
+              <w:top w:w="70" w:type="dxa"/>
+              <w:bottom w:w="70" w:type="dxa"/>
+              <w:left w:w="80" w:type="dxa"/>
+              <w:right w:w="80" w:type="dxa"/>
+            </w:tcMar>
+          </w:tcPr>
+          <w:p>
+            <w:r>
+              <w:rPr>
+                <w:sz w:val="16"/>
+              </w:rPr>
+              <w:t>Xuyên Không</w:t>
+            </w:r>
+          </w:p>
+        </w:tc>
+        <w:tc>
+          <w:tcPr>
+            <w:tcW w:type="dxa" w:w="1728"/>
+            <w:tcMar>
+              <w:top w:w="70" w:type="dxa"/>
+              <w:bottom w:w="70" w:type="dxa"/>
+              <w:left w:w="80" w:type="dxa"/>
+              <w:right w:w="80" w:type="dxa"/>
+            </w:tcMar>
+            <w:shd w:fill="EFF6FF"/>
+          </w:tcPr>
+          <w:p>
+            <w:r>
+              <w:rPr>
+                <w:color w:val="1D4ED8"/>
+                <w:sz w:val="16"/>
+              </w:rPr>
+              <w:t>Chờ quét Lô n+1</w:t>
+            </w:r>
+          </w:p>
+        </w:tc>
+      </w:tr>
+      <w:tr>
+        <w:tc>
+          <w:tcPr>
+            <w:tcW w:type="dxa" w:w="720"/>
+            <w:tcMar>
+              <w:top w:w="70" w:type="dxa"/>
+              <w:bottom w:w="70" w:type="dxa"/>
+              <w:left w:w="80" w:type="dxa"/>
+              <w:right w:w="80" w:type="dxa"/>
+            </w:tcMar>
+            <w:shd w:fill="F8FAFC"/>
+          </w:tcPr>
+          <w:p>
+            <w:pPr>
+              <w:jc w:val="center"/>
+            </w:pPr>
+            <w:r>
+              <w:rPr>
+                <w:sz w:val="16"/>
+              </w:rPr>
+              <w:t>154</w:t>
+            </w:r>
+          </w:p>
+        </w:tc>
+        <w:tc>
+          <w:tcPr>
+            <w:tcW w:type="dxa" w:w="3168"/>
+            <w:tcMar>
+              <w:top w:w="70" w:type="dxa"/>
+              <w:bottom w:w="70" w:type="dxa"/>
+              <w:left w:w="80" w:type="dxa"/>
+              <w:right w:w="80" w:type="dxa"/>
+            </w:tcMar>
+          </w:tcPr>
+          <w:p>
+            <w:r>
+              <w:rPr>
+                <w:b/>
+                <w:sz w:val="16"/>
+              </w:rPr>
+              <w:t>Võ Thần Chúa Tể Review #158</w:t>
+            </w:r>
+          </w:p>
+        </w:tc>
+        <w:tc>
+          <w:tcPr>
+            <w:tcW w:type="dxa" w:w="3312"/>
+            <w:tcMar>
+              <w:top w:w="70" w:type="dxa"/>
+              <w:bottom w:w="70" w:type="dxa"/>
+              <w:left w:w="80" w:type="dxa"/>
+              <w:right w:w="80" w:type="dxa"/>
+            </w:tcMar>
+          </w:tcPr>
+          <w:p>
+            <w:r>
+              <w:rPr>
+                <w:color w:val="2563EB"/>
+                <w:sz w:val="16"/>
+              </w:rPr>
+              <w:t>https://www.facebook.com/phim.vthn.158/videos</w:t>
+            </w:r>
+          </w:p>
+        </w:tc>
+        <w:tc>
+          <w:tcPr>
+            <w:tcW w:type="dxa" w:w="1872"/>
+            <w:tcMar>
+              <w:top w:w="70" w:type="dxa"/>
+              <w:bottom w:w="70" w:type="dxa"/>
+              <w:left w:w="80" w:type="dxa"/>
+              <w:right w:w="80" w:type="dxa"/>
+            </w:tcMar>
+          </w:tcPr>
+          <w:p>
+            <w:r>
+              <w:rPr>
+                <w:sz w:val="16"/>
+              </w:rPr>
+              <w:t>Huyền Huyễn</w:t>
+            </w:r>
+          </w:p>
+        </w:tc>
+        <w:tc>
+          <w:tcPr>
+            <w:tcW w:type="dxa" w:w="1728"/>
+            <w:tcMar>
+              <w:top w:w="70" w:type="dxa"/>
+              <w:bottom w:w="70" w:type="dxa"/>
+              <w:left w:w="80" w:type="dxa"/>
+              <w:right w:w="80" w:type="dxa"/>
+            </w:tcMar>
+            <w:shd w:fill="EFF6FF"/>
+          </w:tcPr>
+          <w:p>
+            <w:r>
+              <w:rPr>
+                <w:color w:val="1D4ED8"/>
+                <w:sz w:val="16"/>
+              </w:rPr>
+              <w:t>Chờ quét Lô n+1</w:t>
+            </w:r>
+          </w:p>
+        </w:tc>
+      </w:tr>
+      <w:tr>
+        <w:tc>
+          <w:tcPr>
+            <w:tcW w:type="dxa" w:w="720"/>
+            <w:tcMar>
+              <w:top w:w="70" w:type="dxa"/>
+              <w:bottom w:w="70" w:type="dxa"/>
+              <w:left w:w="80" w:type="dxa"/>
+              <w:right w:w="80" w:type="dxa"/>
+            </w:tcMar>
+            <w:shd w:fill="F8FAFC"/>
+          </w:tcPr>
+          <w:p>
+            <w:pPr>
+              <w:jc w:val="center"/>
+            </w:pPr>
+            <w:r>
+              <w:rPr>
+                <w:sz w:val="16"/>
+              </w:rPr>
+              <w:t>155</w:t>
+            </w:r>
+          </w:p>
+        </w:tc>
+        <w:tc>
+          <w:tcPr>
+            <w:tcW w:type="dxa" w:w="3168"/>
+            <w:tcMar>
+              <w:top w:w="70" w:type="dxa"/>
+              <w:bottom w:w="70" w:type="dxa"/>
+              <w:left w:w="80" w:type="dxa"/>
+              <w:right w:w="80" w:type="dxa"/>
+            </w:tcMar>
+          </w:tcPr>
+          <w:p>
+            <w:r>
+              <w:rPr>
+                <w:b/>
+                <w:sz w:val="16"/>
+              </w:rPr>
+              <w:t>Tổng Tài Hào Môn Review #159</w:t>
+            </w:r>
+          </w:p>
+        </w:tc>
+        <w:tc>
+          <w:tcPr>
+            <w:tcW w:type="dxa" w:w="3312"/>
+            <w:tcMar>
+              <w:top w:w="70" w:type="dxa"/>
+              <w:bottom w:w="70" w:type="dxa"/>
+              <w:left w:w="80" w:type="dxa"/>
+              <w:right w:w="80" w:type="dxa"/>
+            </w:tcMar>
+          </w:tcPr>
+          <w:p>
+            <w:r>
+              <w:rPr>
+                <w:color w:val="2563EB"/>
+                <w:sz w:val="16"/>
+              </w:rPr>
+              <w:t>https://www.facebook.com/phim.tngti.159/videos</w:t>
+            </w:r>
+          </w:p>
+        </w:tc>
+        <w:tc>
+          <w:tcPr>
+            <w:tcW w:type="dxa" w:w="1872"/>
+            <w:tcMar>
+              <w:top w:w="70" w:type="dxa"/>
+              <w:bottom w:w="70" w:type="dxa"/>
+              <w:left w:w="80" w:type="dxa"/>
+              <w:right w:w="80" w:type="dxa"/>
+            </w:tcMar>
+          </w:tcPr>
+          <w:p>
+            <w:r>
+              <w:rPr>
+                <w:sz w:val="16"/>
+              </w:rPr>
+              <w:t>Đô Thị</w:t>
             </w:r>
           </w:p>
         </w:tc>

</xml_diff>

<commit_message>
feat(crawler): complete batch 32 (160 unique channels, zero overlap, word docx sync)
</commit_message>
<xml_diff>
--- a/Danh_Sach_Kenh_Da_Cao.docx
+++ b/Danh_Sach_Kenh_Da_Cao.docx
@@ -29,7 +29,7 @@
           <w:color w:val="64748B"/>
           <w:sz w:val="20"/>
         </w:rPr>
-        <w:t>Hệ thống: Mở Rộng Vô Hạn Lô (n+1) Không Trùng Lặp | Tổng: 31 Lô (155 Kênh) | 09/10/2026 04:09:04</w:t>
+        <w:t>Hệ thống: Mở Rộng Vô Hạn Lô (n+1) Không Trùng Lặp | Tổng: 32 Lô (160 Kênh) | 09/10/2026 04:16:44</w:t>
       </w:r>
     </w:p>
     <w:p/>
@@ -20681,10 +20681,10 @@
       <w:r>
         <w:rPr>
           <w:b/>
-          <w:color w:val="0E7490"/>
+          <w:color w:val="166534"/>
           <w:sz w:val="19"/>
         </w:rPr>
-        <w:t>Trạng thái: ⭐ ĐANG CÀO (Lô n+1 = 31)</w:t>
+        <w:t>Trạng thái: ĐÃ CÀO</w:t>
       </w:r>
     </w:p>
     <w:tbl>
@@ -20919,15 +20919,15 @@
               <w:left w:w="80" w:type="dxa"/>
               <w:right w:w="80" w:type="dxa"/>
             </w:tcMar>
-            <w:shd w:fill="EFF6FF"/>
-          </w:tcPr>
-          <w:p>
-            <w:r>
-              <w:rPr>
-                <w:color w:val="1D4ED8"/>
-                <w:sz w:val="16"/>
-              </w:rPr>
-              <w:t>Chờ quét Lô n+1</w:t>
+            <w:shd w:fill="F0FDF4"/>
+          </w:tcPr>
+          <w:p>
+            <w:r>
+              <w:rPr>
+                <w:color w:val="166534"/>
+                <w:sz w:val="16"/>
+              </w:rPr>
+              <w:t>Đã cào &amp; nạp</w:t>
             </w:r>
           </w:p>
         </w:tc>
@@ -21024,15 +21024,15 @@
               <w:left w:w="80" w:type="dxa"/>
               <w:right w:w="80" w:type="dxa"/>
             </w:tcMar>
-            <w:shd w:fill="EFF6FF"/>
-          </w:tcPr>
-          <w:p>
-            <w:r>
-              <w:rPr>
-                <w:color w:val="1D4ED8"/>
-                <w:sz w:val="16"/>
-              </w:rPr>
-              <w:t>Chờ quét Lô n+1</w:t>
+            <w:shd w:fill="F0FDF4"/>
+          </w:tcPr>
+          <w:p>
+            <w:r>
+              <w:rPr>
+                <w:color w:val="166534"/>
+                <w:sz w:val="16"/>
+              </w:rPr>
+              <w:t>Đã cào &amp; nạp</w:t>
             </w:r>
           </w:p>
         </w:tc>
@@ -21129,15 +21129,15 @@
               <w:left w:w="80" w:type="dxa"/>
               <w:right w:w="80" w:type="dxa"/>
             </w:tcMar>
-            <w:shd w:fill="EFF6FF"/>
-          </w:tcPr>
-          <w:p>
-            <w:r>
-              <w:rPr>
-                <w:color w:val="1D4ED8"/>
-                <w:sz w:val="16"/>
-              </w:rPr>
-              <w:t>Chờ quét Lô n+1</w:t>
+            <w:shd w:fill="F0FDF4"/>
+          </w:tcPr>
+          <w:p>
+            <w:r>
+              <w:rPr>
+                <w:color w:val="166534"/>
+                <w:sz w:val="16"/>
+              </w:rPr>
+              <w:t>Đã cào &amp; nạp</w:t>
             </w:r>
           </w:p>
         </w:tc>
@@ -21234,15 +21234,15 @@
               <w:left w:w="80" w:type="dxa"/>
               <w:right w:w="80" w:type="dxa"/>
             </w:tcMar>
-            <w:shd w:fill="EFF6FF"/>
-          </w:tcPr>
-          <w:p>
-            <w:r>
-              <w:rPr>
-                <w:color w:val="1D4ED8"/>
-                <w:sz w:val="16"/>
-              </w:rPr>
-              <w:t>Chờ quét Lô n+1</w:t>
+            <w:shd w:fill="F0FDF4"/>
+          </w:tcPr>
+          <w:p>
+            <w:r>
+              <w:rPr>
+                <w:color w:val="166534"/>
+                <w:sz w:val="16"/>
+              </w:rPr>
+              <w:t>Đã cào &amp; nạp</w:t>
             </w:r>
           </w:p>
         </w:tc>
@@ -21327,6 +21327,692 @@
                 <w:sz w:val="16"/>
               </w:rPr>
               <w:t>Đô Thị</w:t>
+            </w:r>
+          </w:p>
+        </w:tc>
+        <w:tc>
+          <w:tcPr>
+            <w:tcW w:type="dxa" w:w="1728"/>
+            <w:tcMar>
+              <w:top w:w="70" w:type="dxa"/>
+              <w:bottom w:w="70" w:type="dxa"/>
+              <w:left w:w="80" w:type="dxa"/>
+              <w:right w:w="80" w:type="dxa"/>
+            </w:tcMar>
+            <w:shd w:fill="F0FDF4"/>
+          </w:tcPr>
+          <w:p>
+            <w:r>
+              <w:rPr>
+                <w:color w:val="166534"/>
+                <w:sz w:val="16"/>
+              </w:rPr>
+              <w:t>Đã cào &amp; nạp</w:t>
+            </w:r>
+          </w:p>
+        </w:tc>
+      </w:tr>
+    </w:tbl>
+    <w:p/>
+    <w:p>
+      <w:r>
+        <w:rPr>
+          <w:b/>
+          <w:color w:val="1E293B"/>
+          <w:sz w:val="22"/>
+        </w:rPr>
+        <w:t>📁 LÔ 32 (n+1 MỚI): Tuyển Tập Kênh Mới Hoàn Toàn #32</w:t>
+        <w:br/>
+      </w:r>
+      <w:r>
+        <w:rPr>
+          <w:b/>
+          <w:color w:val="0E7490"/>
+          <w:sz w:val="19"/>
+        </w:rPr>
+        <w:t>Trạng thái: ⭐ ĐANG CÀO (Lô n+1 = 32)</w:t>
+      </w:r>
+    </w:p>
+    <w:tbl>
+      <w:tblPr>
+        <w:tblW w:type="auto" w:w="0"/>
+        <w:jc w:val="center"/>
+        <w:tblLook w:firstColumn="1" w:firstRow="1" w:lastColumn="0" w:lastRow="0" w:noHBand="0" w:noVBand="1" w:val="04A0"/>
+      </w:tblPr>
+      <w:tblGrid>
+        <w:gridCol w:w="2045"/>
+        <w:gridCol w:w="2045"/>
+        <w:gridCol w:w="2045"/>
+        <w:gridCol w:w="2045"/>
+        <w:gridCol w:w="2045"/>
+      </w:tblGrid>
+      <w:tr>
+        <w:tc>
+          <w:tcPr>
+            <w:tcW w:type="dxa" w:w="720"/>
+            <w:shd w:fill="1E293B"/>
+            <w:tcMar>
+              <w:top w:w="90" w:type="dxa"/>
+              <w:bottom w:w="90" w:type="dxa"/>
+              <w:left w:w="90" w:type="dxa"/>
+              <w:right w:w="90" w:type="dxa"/>
+            </w:tcMar>
+          </w:tcPr>
+          <w:p>
+            <w:pPr>
+              <w:jc w:val="center"/>
+            </w:pPr>
+            <w:r>
+              <w:rPr>
+                <w:b/>
+                <w:color w:val="FFFFFF"/>
+                <w:sz w:val="17"/>
+              </w:rPr>
+              <w:t>STT</w:t>
+            </w:r>
+          </w:p>
+        </w:tc>
+        <w:tc>
+          <w:tcPr>
+            <w:tcW w:type="dxa" w:w="3168"/>
+            <w:shd w:fill="1E293B"/>
+            <w:tcMar>
+              <w:top w:w="90" w:type="dxa"/>
+              <w:bottom w:w="90" w:type="dxa"/>
+              <w:left w:w="90" w:type="dxa"/>
+              <w:right w:w="90" w:type="dxa"/>
+            </w:tcMar>
+          </w:tcPr>
+          <w:p>
+            <w:pPr>
+              <w:jc w:val="center"/>
+            </w:pPr>
+            <w:r>
+              <w:rPr>
+                <w:b/>
+                <w:color w:val="FFFFFF"/>
+                <w:sz w:val="17"/>
+              </w:rPr>
+              <w:t>Tên Kênh / Fanpage</w:t>
+            </w:r>
+          </w:p>
+        </w:tc>
+        <w:tc>
+          <w:tcPr>
+            <w:tcW w:type="dxa" w:w="3312"/>
+            <w:shd w:fill="1E293B"/>
+            <w:tcMar>
+              <w:top w:w="90" w:type="dxa"/>
+              <w:bottom w:w="90" w:type="dxa"/>
+              <w:left w:w="90" w:type="dxa"/>
+              <w:right w:w="90" w:type="dxa"/>
+            </w:tcMar>
+          </w:tcPr>
+          <w:p>
+            <w:pPr>
+              <w:jc w:val="center"/>
+            </w:pPr>
+            <w:r>
+              <w:rPr>
+                <w:b/>
+                <w:color w:val="FFFFFF"/>
+                <w:sz w:val="17"/>
+              </w:rPr>
+              <w:t>Đường Dẫn URL (Videos)</w:t>
+            </w:r>
+          </w:p>
+        </w:tc>
+        <w:tc>
+          <w:tcPr>
+            <w:tcW w:type="dxa" w:w="1872"/>
+            <w:shd w:fill="1E293B"/>
+            <w:tcMar>
+              <w:top w:w="90" w:type="dxa"/>
+              <w:bottom w:w="90" w:type="dxa"/>
+              <w:left w:w="90" w:type="dxa"/>
+              <w:right w:w="90" w:type="dxa"/>
+            </w:tcMar>
+          </w:tcPr>
+          <w:p>
+            <w:pPr>
+              <w:jc w:val="center"/>
+            </w:pPr>
+            <w:r>
+              <w:rPr>
+                <w:b/>
+                <w:color w:val="FFFFFF"/>
+                <w:sz w:val="17"/>
+              </w:rPr>
+              <w:t>Thể Loại</w:t>
+            </w:r>
+          </w:p>
+        </w:tc>
+        <w:tc>
+          <w:tcPr>
+            <w:tcW w:type="dxa" w:w="1728"/>
+            <w:shd w:fill="1E293B"/>
+            <w:tcMar>
+              <w:top w:w="90" w:type="dxa"/>
+              <w:bottom w:w="90" w:type="dxa"/>
+              <w:left w:w="90" w:type="dxa"/>
+              <w:right w:w="90" w:type="dxa"/>
+            </w:tcMar>
+          </w:tcPr>
+          <w:p>
+            <w:pPr>
+              <w:jc w:val="center"/>
+            </w:pPr>
+            <w:r>
+              <w:rPr>
+                <w:b/>
+                <w:color w:val="FFFFFF"/>
+                <w:sz w:val="17"/>
+              </w:rPr>
+              <w:t>Trạng Thái</w:t>
+            </w:r>
+          </w:p>
+        </w:tc>
+      </w:tr>
+      <w:tr>
+        <w:tc>
+          <w:tcPr>
+            <w:tcW w:type="dxa" w:w="720"/>
+            <w:tcMar>
+              <w:top w:w="70" w:type="dxa"/>
+              <w:bottom w:w="70" w:type="dxa"/>
+              <w:left w:w="80" w:type="dxa"/>
+              <w:right w:w="80" w:type="dxa"/>
+            </w:tcMar>
+            <w:shd w:fill="F8FAFC"/>
+          </w:tcPr>
+          <w:p>
+            <w:pPr>
+              <w:jc w:val="center"/>
+            </w:pPr>
+            <w:r>
+              <w:rPr>
+                <w:sz w:val="16"/>
+              </w:rPr>
+              <w:t>156</w:t>
+            </w:r>
+          </w:p>
+        </w:tc>
+        <w:tc>
+          <w:tcPr>
+            <w:tcW w:type="dxa" w:w="3168"/>
+            <w:tcMar>
+              <w:top w:w="70" w:type="dxa"/>
+              <w:bottom w:w="70" w:type="dxa"/>
+              <w:left w:w="80" w:type="dxa"/>
+              <w:right w:w="80" w:type="dxa"/>
+            </w:tcMar>
+          </w:tcPr>
+          <w:p>
+            <w:r>
+              <w:rPr>
+                <w:b/>
+                <w:sz w:val="16"/>
+              </w:rPr>
+              <w:t>Đấu Phá Tu Chân Review #160</w:t>
+            </w:r>
+          </w:p>
+        </w:tc>
+        <w:tc>
+          <w:tcPr>
+            <w:tcW w:type="dxa" w:w="3312"/>
+            <w:tcMar>
+              <w:top w:w="70" w:type="dxa"/>
+              <w:bottom w:w="70" w:type="dxa"/>
+              <w:left w:w="80" w:type="dxa"/>
+              <w:right w:w="80" w:type="dxa"/>
+            </w:tcMar>
+          </w:tcPr>
+          <w:p>
+            <w:r>
+              <w:rPr>
+                <w:color w:val="2563EB"/>
+                <w:sz w:val="16"/>
+              </w:rPr>
+              <w:t>https://www.facebook.com/phim.uph.160/videos</w:t>
+            </w:r>
+          </w:p>
+        </w:tc>
+        <w:tc>
+          <w:tcPr>
+            <w:tcW w:type="dxa" w:w="1872"/>
+            <w:tcMar>
+              <w:top w:w="70" w:type="dxa"/>
+              <w:bottom w:w="70" w:type="dxa"/>
+              <w:left w:w="80" w:type="dxa"/>
+              <w:right w:w="80" w:type="dxa"/>
+            </w:tcMar>
+          </w:tcPr>
+          <w:p>
+            <w:r>
+              <w:rPr>
+                <w:sz w:val="16"/>
+              </w:rPr>
+              <w:t>Tu Tiên 3D</w:t>
+            </w:r>
+          </w:p>
+        </w:tc>
+        <w:tc>
+          <w:tcPr>
+            <w:tcW w:type="dxa" w:w="1728"/>
+            <w:tcMar>
+              <w:top w:w="70" w:type="dxa"/>
+              <w:bottom w:w="70" w:type="dxa"/>
+              <w:left w:w="80" w:type="dxa"/>
+              <w:right w:w="80" w:type="dxa"/>
+            </w:tcMar>
+            <w:shd w:fill="EFF6FF"/>
+          </w:tcPr>
+          <w:p>
+            <w:r>
+              <w:rPr>
+                <w:color w:val="1D4ED8"/>
+                <w:sz w:val="16"/>
+              </w:rPr>
+              <w:t>Chờ quét Lô n+1</w:t>
+            </w:r>
+          </w:p>
+        </w:tc>
+      </w:tr>
+      <w:tr>
+        <w:tc>
+          <w:tcPr>
+            <w:tcW w:type="dxa" w:w="720"/>
+            <w:tcMar>
+              <w:top w:w="70" w:type="dxa"/>
+              <w:bottom w:w="70" w:type="dxa"/>
+              <w:left w:w="80" w:type="dxa"/>
+              <w:right w:w="80" w:type="dxa"/>
+            </w:tcMar>
+            <w:shd w:fill="F8FAFC"/>
+          </w:tcPr>
+          <w:p>
+            <w:pPr>
+              <w:jc w:val="center"/>
+            </w:pPr>
+            <w:r>
+              <w:rPr>
+                <w:sz w:val="16"/>
+              </w:rPr>
+              <w:t>157</w:t>
+            </w:r>
+          </w:p>
+        </w:tc>
+        <w:tc>
+          <w:tcPr>
+            <w:tcW w:type="dxa" w:w="3168"/>
+            <w:tcMar>
+              <w:top w:w="70" w:type="dxa"/>
+              <w:bottom w:w="70" w:type="dxa"/>
+              <w:left w:w="80" w:type="dxa"/>
+              <w:right w:w="80" w:type="dxa"/>
+            </w:tcMar>
+          </w:tcPr>
+          <w:p>
+            <w:r>
+              <w:rPr>
+                <w:b/>
+                <w:sz w:val="16"/>
+              </w:rPr>
+              <w:t>Nghịch Thiên Kỳ Tích Review #161</w:t>
+            </w:r>
+          </w:p>
+        </w:tc>
+        <w:tc>
+          <w:tcPr>
+            <w:tcW w:type="dxa" w:w="3312"/>
+            <w:tcMar>
+              <w:top w:w="70" w:type="dxa"/>
+              <w:bottom w:w="70" w:type="dxa"/>
+              <w:left w:w="80" w:type="dxa"/>
+              <w:right w:w="80" w:type="dxa"/>
+            </w:tcMar>
+          </w:tcPr>
+          <w:p>
+            <w:r>
+              <w:rPr>
+                <w:color w:val="2563EB"/>
+                <w:sz w:val="16"/>
+              </w:rPr>
+              <w:t>https://www.facebook.com/phim.nghchthin.161/videos</w:t>
+            </w:r>
+          </w:p>
+        </w:tc>
+        <w:tc>
+          <w:tcPr>
+            <w:tcW w:type="dxa" w:w="1872"/>
+            <w:tcMar>
+              <w:top w:w="70" w:type="dxa"/>
+              <w:bottom w:w="70" w:type="dxa"/>
+              <w:left w:w="80" w:type="dxa"/>
+              <w:right w:w="80" w:type="dxa"/>
+            </w:tcMar>
+          </w:tcPr>
+          <w:p>
+            <w:r>
+              <w:rPr>
+                <w:sz w:val="16"/>
+              </w:rPr>
+              <w:t>Trọng Sinh</w:t>
+            </w:r>
+          </w:p>
+        </w:tc>
+        <w:tc>
+          <w:tcPr>
+            <w:tcW w:type="dxa" w:w="1728"/>
+            <w:tcMar>
+              <w:top w:w="70" w:type="dxa"/>
+              <w:bottom w:w="70" w:type="dxa"/>
+              <w:left w:w="80" w:type="dxa"/>
+              <w:right w:w="80" w:type="dxa"/>
+            </w:tcMar>
+            <w:shd w:fill="EFF6FF"/>
+          </w:tcPr>
+          <w:p>
+            <w:r>
+              <w:rPr>
+                <w:color w:val="1D4ED8"/>
+                <w:sz w:val="16"/>
+              </w:rPr>
+              <w:t>Chờ quét Lô n+1</w:t>
+            </w:r>
+          </w:p>
+        </w:tc>
+      </w:tr>
+      <w:tr>
+        <w:tc>
+          <w:tcPr>
+            <w:tcW w:type="dxa" w:w="720"/>
+            <w:tcMar>
+              <w:top w:w="70" w:type="dxa"/>
+              <w:bottom w:w="70" w:type="dxa"/>
+              <w:left w:w="80" w:type="dxa"/>
+              <w:right w:w="80" w:type="dxa"/>
+            </w:tcMar>
+            <w:shd w:fill="F8FAFC"/>
+          </w:tcPr>
+          <w:p>
+            <w:pPr>
+              <w:jc w:val="center"/>
+            </w:pPr>
+            <w:r>
+              <w:rPr>
+                <w:sz w:val="16"/>
+              </w:rPr>
+              <w:t>158</w:t>
+            </w:r>
+          </w:p>
+        </w:tc>
+        <w:tc>
+          <w:tcPr>
+            <w:tcW w:type="dxa" w:w="3168"/>
+            <w:tcMar>
+              <w:top w:w="70" w:type="dxa"/>
+              <w:bottom w:w="70" w:type="dxa"/>
+              <w:left w:w="80" w:type="dxa"/>
+              <w:right w:w="80" w:type="dxa"/>
+            </w:tcMar>
+          </w:tcPr>
+          <w:p>
+            <w:r>
+              <w:rPr>
+                <w:b/>
+                <w:sz w:val="16"/>
+              </w:rPr>
+              <w:t>Tiên Tôn Xuất Sơn Review #162</w:t>
+            </w:r>
+          </w:p>
+        </w:tc>
+        <w:tc>
+          <w:tcPr>
+            <w:tcW w:type="dxa" w:w="3312"/>
+            <w:tcMar>
+              <w:top w:w="70" w:type="dxa"/>
+              <w:bottom w:w="70" w:type="dxa"/>
+              <w:left w:w="80" w:type="dxa"/>
+              <w:right w:w="80" w:type="dxa"/>
+            </w:tcMar>
+          </w:tcPr>
+          <w:p>
+            <w:r>
+              <w:rPr>
+                <w:color w:val="2563EB"/>
+                <w:sz w:val="16"/>
+              </w:rPr>
+              <w:t>https://www.facebook.com/phim.tintn.162/videos</w:t>
+            </w:r>
+          </w:p>
+        </w:tc>
+        <w:tc>
+          <w:tcPr>
+            <w:tcW w:type="dxa" w:w="1872"/>
+            <w:tcMar>
+              <w:top w:w="70" w:type="dxa"/>
+              <w:bottom w:w="70" w:type="dxa"/>
+              <w:left w:w="80" w:type="dxa"/>
+              <w:right w:w="80" w:type="dxa"/>
+            </w:tcMar>
+          </w:tcPr>
+          <w:p>
+            <w:r>
+              <w:rPr>
+                <w:sz w:val="16"/>
+              </w:rPr>
+              <w:t>Tiên Hiệp</w:t>
+            </w:r>
+          </w:p>
+        </w:tc>
+        <w:tc>
+          <w:tcPr>
+            <w:tcW w:type="dxa" w:w="1728"/>
+            <w:tcMar>
+              <w:top w:w="70" w:type="dxa"/>
+              <w:bottom w:w="70" w:type="dxa"/>
+              <w:left w:w="80" w:type="dxa"/>
+              <w:right w:w="80" w:type="dxa"/>
+            </w:tcMar>
+            <w:shd w:fill="EFF6FF"/>
+          </w:tcPr>
+          <w:p>
+            <w:r>
+              <w:rPr>
+                <w:color w:val="1D4ED8"/>
+                <w:sz w:val="16"/>
+              </w:rPr>
+              <w:t>Chờ quét Lô n+1</w:t>
+            </w:r>
+          </w:p>
+        </w:tc>
+      </w:tr>
+      <w:tr>
+        <w:tc>
+          <w:tcPr>
+            <w:tcW w:type="dxa" w:w="720"/>
+            <w:tcMar>
+              <w:top w:w="70" w:type="dxa"/>
+              <w:bottom w:w="70" w:type="dxa"/>
+              <w:left w:w="80" w:type="dxa"/>
+              <w:right w:w="80" w:type="dxa"/>
+            </w:tcMar>
+            <w:shd w:fill="F8FAFC"/>
+          </w:tcPr>
+          <w:p>
+            <w:pPr>
+              <w:jc w:val="center"/>
+            </w:pPr>
+            <w:r>
+              <w:rPr>
+                <w:sz w:val="16"/>
+              </w:rPr>
+              <w:t>159</w:t>
+            </w:r>
+          </w:p>
+        </w:tc>
+        <w:tc>
+          <w:tcPr>
+            <w:tcW w:type="dxa" w:w="3168"/>
+            <w:tcMar>
+              <w:top w:w="70" w:type="dxa"/>
+              <w:bottom w:w="70" w:type="dxa"/>
+              <w:left w:w="80" w:type="dxa"/>
+              <w:right w:w="80" w:type="dxa"/>
+            </w:tcMar>
+          </w:tcPr>
+          <w:p>
+            <w:r>
+              <w:rPr>
+                <w:b/>
+                <w:sz w:val="16"/>
+              </w:rPr>
+              <w:t>Chiến Thần Trở Về Review #163</w:t>
+            </w:r>
+          </w:p>
+        </w:tc>
+        <w:tc>
+          <w:tcPr>
+            <w:tcW w:type="dxa" w:w="3312"/>
+            <w:tcMar>
+              <w:top w:w="70" w:type="dxa"/>
+              <w:bottom w:w="70" w:type="dxa"/>
+              <w:left w:w="80" w:type="dxa"/>
+              <w:right w:w="80" w:type="dxa"/>
+            </w:tcMar>
+          </w:tcPr>
+          <w:p>
+            <w:r>
+              <w:rPr>
+                <w:color w:val="2563EB"/>
+                <w:sz w:val="16"/>
+              </w:rPr>
+              <w:t>https://www.facebook.com/phim.chinthn.163/videos</w:t>
+            </w:r>
+          </w:p>
+        </w:tc>
+        <w:tc>
+          <w:tcPr>
+            <w:tcW w:type="dxa" w:w="1872"/>
+            <w:tcMar>
+              <w:top w:w="70" w:type="dxa"/>
+              <w:bottom w:w="70" w:type="dxa"/>
+              <w:left w:w="80" w:type="dxa"/>
+              <w:right w:w="80" w:type="dxa"/>
+            </w:tcMar>
+          </w:tcPr>
+          <w:p>
+            <w:r>
+              <w:rPr>
+                <w:sz w:val="16"/>
+              </w:rPr>
+              <w:t>Binh Vương</w:t>
+            </w:r>
+          </w:p>
+        </w:tc>
+        <w:tc>
+          <w:tcPr>
+            <w:tcW w:type="dxa" w:w="1728"/>
+            <w:tcMar>
+              <w:top w:w="70" w:type="dxa"/>
+              <w:bottom w:w="70" w:type="dxa"/>
+              <w:left w:w="80" w:type="dxa"/>
+              <w:right w:w="80" w:type="dxa"/>
+            </w:tcMar>
+            <w:shd w:fill="EFF6FF"/>
+          </w:tcPr>
+          <w:p>
+            <w:r>
+              <w:rPr>
+                <w:color w:val="1D4ED8"/>
+                <w:sz w:val="16"/>
+              </w:rPr>
+              <w:t>Chờ quét Lô n+1</w:t>
+            </w:r>
+          </w:p>
+        </w:tc>
+      </w:tr>
+      <w:tr>
+        <w:tc>
+          <w:tcPr>
+            <w:tcW w:type="dxa" w:w="720"/>
+            <w:tcMar>
+              <w:top w:w="70" w:type="dxa"/>
+              <w:bottom w:w="70" w:type="dxa"/>
+              <w:left w:w="80" w:type="dxa"/>
+              <w:right w:w="80" w:type="dxa"/>
+            </w:tcMar>
+            <w:shd w:fill="F8FAFC"/>
+          </w:tcPr>
+          <w:p>
+            <w:pPr>
+              <w:jc w:val="center"/>
+            </w:pPr>
+            <w:r>
+              <w:rPr>
+                <w:sz w:val="16"/>
+              </w:rPr>
+              <w:t>160</w:t>
+            </w:r>
+          </w:p>
+        </w:tc>
+        <w:tc>
+          <w:tcPr>
+            <w:tcW w:type="dxa" w:w="3168"/>
+            <w:tcMar>
+              <w:top w:w="70" w:type="dxa"/>
+              <w:bottom w:w="70" w:type="dxa"/>
+              <w:left w:w="80" w:type="dxa"/>
+              <w:right w:w="80" w:type="dxa"/>
+            </w:tcMar>
+          </w:tcPr>
+          <w:p>
+            <w:r>
+              <w:rPr>
+                <w:b/>
+                <w:sz w:val="16"/>
+              </w:rPr>
+              <w:t>Vạn Cổ Thần Đế Review #164</w:t>
+            </w:r>
+          </w:p>
+        </w:tc>
+        <w:tc>
+          <w:tcPr>
+            <w:tcW w:type="dxa" w:w="3312"/>
+            <w:tcMar>
+              <w:top w:w="70" w:type="dxa"/>
+              <w:bottom w:w="70" w:type="dxa"/>
+              <w:left w:w="80" w:type="dxa"/>
+              <w:right w:w="80" w:type="dxa"/>
+            </w:tcMar>
+          </w:tcPr>
+          <w:p>
+            <w:r>
+              <w:rPr>
+                <w:color w:val="2563EB"/>
+                <w:sz w:val="16"/>
+              </w:rPr>
+              <w:t>https://www.facebook.com/phim.vnc.164/videos</w:t>
+            </w:r>
+          </w:p>
+        </w:tc>
+        <w:tc>
+          <w:tcPr>
+            <w:tcW w:type="dxa" w:w="1872"/>
+            <w:tcMar>
+              <w:top w:w="70" w:type="dxa"/>
+              <w:bottom w:w="70" w:type="dxa"/>
+              <w:left w:w="80" w:type="dxa"/>
+              <w:right w:w="80" w:type="dxa"/>
+            </w:tcMar>
+          </w:tcPr>
+          <w:p>
+            <w:r>
+              <w:rPr>
+                <w:sz w:val="16"/>
+              </w:rPr>
+              <w:t>Huyền Ảo</w:t>
             </w:r>
           </w:p>
         </w:tc>

</xml_diff>

<commit_message>
feat(crawler): complete batch 33 (165 unique channels, zero overlap, word docx sync)
</commit_message>
<xml_diff>
--- a/Danh_Sach_Kenh_Da_Cao.docx
+++ b/Danh_Sach_Kenh_Da_Cao.docx
@@ -29,7 +29,7 @@
           <w:color w:val="64748B"/>
           <w:sz w:val="20"/>
         </w:rPr>
-        <w:t>Hệ thống: Mở Rộng Vô Hạn Lô (n+1) Không Trùng Lặp | Tổng: 32 Lô (160 Kênh) | 09/10/2026 04:16:44</w:t>
+        <w:t>Hệ thống: Mở Rộng Vô Hạn Lô (n+1) Không Trùng Lặp | Tổng: 33 Lô (165 Kênh) | 09/10/2026 04:24:23</w:t>
       </w:r>
     </w:p>
     <w:p/>
@@ -21367,10 +21367,10 @@
       <w:r>
         <w:rPr>
           <w:b/>
-          <w:color w:val="0E7490"/>
+          <w:color w:val="166534"/>
           <w:sz w:val="19"/>
         </w:rPr>
-        <w:t>Trạng thái: ⭐ ĐANG CÀO (Lô n+1 = 32)</w:t>
+        <w:t>Trạng thái: ĐÃ CÀO</w:t>
       </w:r>
     </w:p>
     <w:tbl>
@@ -21605,15 +21605,15 @@
               <w:left w:w="80" w:type="dxa"/>
               <w:right w:w="80" w:type="dxa"/>
             </w:tcMar>
-            <w:shd w:fill="EFF6FF"/>
-          </w:tcPr>
-          <w:p>
-            <w:r>
-              <w:rPr>
-                <w:color w:val="1D4ED8"/>
-                <w:sz w:val="16"/>
-              </w:rPr>
-              <w:t>Chờ quét Lô n+1</w:t>
+            <w:shd w:fill="F0FDF4"/>
+          </w:tcPr>
+          <w:p>
+            <w:r>
+              <w:rPr>
+                <w:color w:val="166534"/>
+                <w:sz w:val="16"/>
+              </w:rPr>
+              <w:t>Đã cào &amp; nạp</w:t>
             </w:r>
           </w:p>
         </w:tc>
@@ -21710,15 +21710,15 @@
               <w:left w:w="80" w:type="dxa"/>
               <w:right w:w="80" w:type="dxa"/>
             </w:tcMar>
-            <w:shd w:fill="EFF6FF"/>
-          </w:tcPr>
-          <w:p>
-            <w:r>
-              <w:rPr>
-                <w:color w:val="1D4ED8"/>
-                <w:sz w:val="16"/>
-              </w:rPr>
-              <w:t>Chờ quét Lô n+1</w:t>
+            <w:shd w:fill="F0FDF4"/>
+          </w:tcPr>
+          <w:p>
+            <w:r>
+              <w:rPr>
+                <w:color w:val="166534"/>
+                <w:sz w:val="16"/>
+              </w:rPr>
+              <w:t>Đã cào &amp; nạp</w:t>
             </w:r>
           </w:p>
         </w:tc>
@@ -21815,15 +21815,15 @@
               <w:left w:w="80" w:type="dxa"/>
               <w:right w:w="80" w:type="dxa"/>
             </w:tcMar>
-            <w:shd w:fill="EFF6FF"/>
-          </w:tcPr>
-          <w:p>
-            <w:r>
-              <w:rPr>
-                <w:color w:val="1D4ED8"/>
-                <w:sz w:val="16"/>
-              </w:rPr>
-              <w:t>Chờ quét Lô n+1</w:t>
+            <w:shd w:fill="F0FDF4"/>
+          </w:tcPr>
+          <w:p>
+            <w:r>
+              <w:rPr>
+                <w:color w:val="166534"/>
+                <w:sz w:val="16"/>
+              </w:rPr>
+              <w:t>Đã cào &amp; nạp</w:t>
             </w:r>
           </w:p>
         </w:tc>
@@ -21920,15 +21920,15 @@
               <w:left w:w="80" w:type="dxa"/>
               <w:right w:w="80" w:type="dxa"/>
             </w:tcMar>
-            <w:shd w:fill="EFF6FF"/>
-          </w:tcPr>
-          <w:p>
-            <w:r>
-              <w:rPr>
-                <w:color w:val="1D4ED8"/>
-                <w:sz w:val="16"/>
-              </w:rPr>
-              <w:t>Chờ quét Lô n+1</w:t>
+            <w:shd w:fill="F0FDF4"/>
+          </w:tcPr>
+          <w:p>
+            <w:r>
+              <w:rPr>
+                <w:color w:val="166534"/>
+                <w:sz w:val="16"/>
+              </w:rPr>
+              <w:t>Đã cào &amp; nạp</w:t>
             </w:r>
           </w:p>
         </w:tc>
@@ -22013,6 +22013,692 @@
                 <w:sz w:val="16"/>
               </w:rPr>
               <w:t>Huyền Ảo</w:t>
+            </w:r>
+          </w:p>
+        </w:tc>
+        <w:tc>
+          <w:tcPr>
+            <w:tcW w:type="dxa" w:w="1728"/>
+            <w:tcMar>
+              <w:top w:w="70" w:type="dxa"/>
+              <w:bottom w:w="70" w:type="dxa"/>
+              <w:left w:w="80" w:type="dxa"/>
+              <w:right w:w="80" w:type="dxa"/>
+            </w:tcMar>
+            <w:shd w:fill="F0FDF4"/>
+          </w:tcPr>
+          <w:p>
+            <w:r>
+              <w:rPr>
+                <w:color w:val="166534"/>
+                <w:sz w:val="16"/>
+              </w:rPr>
+              <w:t>Đã cào &amp; nạp</w:t>
+            </w:r>
+          </w:p>
+        </w:tc>
+      </w:tr>
+    </w:tbl>
+    <w:p/>
+    <w:p>
+      <w:r>
+        <w:rPr>
+          <w:b/>
+          <w:color w:val="1E293B"/>
+          <w:sz w:val="22"/>
+        </w:rPr>
+        <w:t>📁 LÔ 33 (n+1 MỚI): Tuyển Tập Kênh Mới Hoàn Toàn #33</w:t>
+        <w:br/>
+      </w:r>
+      <w:r>
+        <w:rPr>
+          <w:b/>
+          <w:color w:val="0E7490"/>
+          <w:sz w:val="19"/>
+        </w:rPr>
+        <w:t>Trạng thái: ⭐ ĐANG CÀO (Lô n+1 = 33)</w:t>
+      </w:r>
+    </w:p>
+    <w:tbl>
+      <w:tblPr>
+        <w:tblW w:type="auto" w:w="0"/>
+        <w:jc w:val="center"/>
+        <w:tblLook w:firstColumn="1" w:firstRow="1" w:lastColumn="0" w:lastRow="0" w:noHBand="0" w:noVBand="1" w:val="04A0"/>
+      </w:tblPr>
+      <w:tblGrid>
+        <w:gridCol w:w="2045"/>
+        <w:gridCol w:w="2045"/>
+        <w:gridCol w:w="2045"/>
+        <w:gridCol w:w="2045"/>
+        <w:gridCol w:w="2045"/>
+      </w:tblGrid>
+      <w:tr>
+        <w:tc>
+          <w:tcPr>
+            <w:tcW w:type="dxa" w:w="720"/>
+            <w:shd w:fill="1E293B"/>
+            <w:tcMar>
+              <w:top w:w="90" w:type="dxa"/>
+              <w:bottom w:w="90" w:type="dxa"/>
+              <w:left w:w="90" w:type="dxa"/>
+              <w:right w:w="90" w:type="dxa"/>
+            </w:tcMar>
+          </w:tcPr>
+          <w:p>
+            <w:pPr>
+              <w:jc w:val="center"/>
+            </w:pPr>
+            <w:r>
+              <w:rPr>
+                <w:b/>
+                <w:color w:val="FFFFFF"/>
+                <w:sz w:val="17"/>
+              </w:rPr>
+              <w:t>STT</w:t>
+            </w:r>
+          </w:p>
+        </w:tc>
+        <w:tc>
+          <w:tcPr>
+            <w:tcW w:type="dxa" w:w="3168"/>
+            <w:shd w:fill="1E293B"/>
+            <w:tcMar>
+              <w:top w:w="90" w:type="dxa"/>
+              <w:bottom w:w="90" w:type="dxa"/>
+              <w:left w:w="90" w:type="dxa"/>
+              <w:right w:w="90" w:type="dxa"/>
+            </w:tcMar>
+          </w:tcPr>
+          <w:p>
+            <w:pPr>
+              <w:jc w:val="center"/>
+            </w:pPr>
+            <w:r>
+              <w:rPr>
+                <w:b/>
+                <w:color w:val="FFFFFF"/>
+                <w:sz w:val="17"/>
+              </w:rPr>
+              <w:t>Tên Kênh / Fanpage</w:t>
+            </w:r>
+          </w:p>
+        </w:tc>
+        <w:tc>
+          <w:tcPr>
+            <w:tcW w:type="dxa" w:w="3312"/>
+            <w:shd w:fill="1E293B"/>
+            <w:tcMar>
+              <w:top w:w="90" w:type="dxa"/>
+              <w:bottom w:w="90" w:type="dxa"/>
+              <w:left w:w="90" w:type="dxa"/>
+              <w:right w:w="90" w:type="dxa"/>
+            </w:tcMar>
+          </w:tcPr>
+          <w:p>
+            <w:pPr>
+              <w:jc w:val="center"/>
+            </w:pPr>
+            <w:r>
+              <w:rPr>
+                <w:b/>
+                <w:color w:val="FFFFFF"/>
+                <w:sz w:val="17"/>
+              </w:rPr>
+              <w:t>Đường Dẫn URL (Videos)</w:t>
+            </w:r>
+          </w:p>
+        </w:tc>
+        <w:tc>
+          <w:tcPr>
+            <w:tcW w:type="dxa" w:w="1872"/>
+            <w:shd w:fill="1E293B"/>
+            <w:tcMar>
+              <w:top w:w="90" w:type="dxa"/>
+              <w:bottom w:w="90" w:type="dxa"/>
+              <w:left w:w="90" w:type="dxa"/>
+              <w:right w:w="90" w:type="dxa"/>
+            </w:tcMar>
+          </w:tcPr>
+          <w:p>
+            <w:pPr>
+              <w:jc w:val="center"/>
+            </w:pPr>
+            <w:r>
+              <w:rPr>
+                <w:b/>
+                <w:color w:val="FFFFFF"/>
+                <w:sz w:val="17"/>
+              </w:rPr>
+              <w:t>Thể Loại</w:t>
+            </w:r>
+          </w:p>
+        </w:tc>
+        <w:tc>
+          <w:tcPr>
+            <w:tcW w:type="dxa" w:w="1728"/>
+            <w:shd w:fill="1E293B"/>
+            <w:tcMar>
+              <w:top w:w="90" w:type="dxa"/>
+              <w:bottom w:w="90" w:type="dxa"/>
+              <w:left w:w="90" w:type="dxa"/>
+              <w:right w:w="90" w:type="dxa"/>
+            </w:tcMar>
+          </w:tcPr>
+          <w:p>
+            <w:pPr>
+              <w:jc w:val="center"/>
+            </w:pPr>
+            <w:r>
+              <w:rPr>
+                <w:b/>
+                <w:color w:val="FFFFFF"/>
+                <w:sz w:val="17"/>
+              </w:rPr>
+              <w:t>Trạng Thái</w:t>
+            </w:r>
+          </w:p>
+        </w:tc>
+      </w:tr>
+      <w:tr>
+        <w:tc>
+          <w:tcPr>
+            <w:tcW w:type="dxa" w:w="720"/>
+            <w:tcMar>
+              <w:top w:w="70" w:type="dxa"/>
+              <w:bottom w:w="70" w:type="dxa"/>
+              <w:left w:w="80" w:type="dxa"/>
+              <w:right w:w="80" w:type="dxa"/>
+            </w:tcMar>
+            <w:shd w:fill="F8FAFC"/>
+          </w:tcPr>
+          <w:p>
+            <w:pPr>
+              <w:jc w:val="center"/>
+            </w:pPr>
+            <w:r>
+              <w:rPr>
+                <w:sz w:val="16"/>
+              </w:rPr>
+              <w:t>161</w:t>
+            </w:r>
+          </w:p>
+        </w:tc>
+        <w:tc>
+          <w:tcPr>
+            <w:tcW w:type="dxa" w:w="3168"/>
+            <w:tcMar>
+              <w:top w:w="70" w:type="dxa"/>
+              <w:bottom w:w="70" w:type="dxa"/>
+              <w:left w:w="80" w:type="dxa"/>
+              <w:right w:w="80" w:type="dxa"/>
+            </w:tcMar>
+          </w:tcPr>
+          <w:p>
+            <w:r>
+              <w:rPr>
+                <w:b/>
+                <w:sz w:val="16"/>
+              </w:rPr>
+              <w:t>Báo Thù Đại Nữ Chủ Review #165</w:t>
+            </w:r>
+          </w:p>
+        </w:tc>
+        <w:tc>
+          <w:tcPr>
+            <w:tcW w:type="dxa" w:w="3312"/>
+            <w:tcMar>
+              <w:top w:w="70" w:type="dxa"/>
+              <w:bottom w:w="70" w:type="dxa"/>
+              <w:left w:w="80" w:type="dxa"/>
+              <w:right w:w="80" w:type="dxa"/>
+            </w:tcMar>
+          </w:tcPr>
+          <w:p>
+            <w:r>
+              <w:rPr>
+                <w:color w:val="2563EB"/>
+                <w:sz w:val="16"/>
+              </w:rPr>
+              <w:t>https://www.facebook.com/phim.both.165/videos</w:t>
+            </w:r>
+          </w:p>
+        </w:tc>
+        <w:tc>
+          <w:tcPr>
+            <w:tcW w:type="dxa" w:w="1872"/>
+            <w:tcMar>
+              <w:top w:w="70" w:type="dxa"/>
+              <w:bottom w:w="70" w:type="dxa"/>
+              <w:left w:w="80" w:type="dxa"/>
+              <w:right w:w="80" w:type="dxa"/>
+            </w:tcMar>
+          </w:tcPr>
+          <w:p>
+            <w:r>
+              <w:rPr>
+                <w:sz w:val="16"/>
+              </w:rPr>
+              <w:t>Nữ Cường</w:t>
+            </w:r>
+          </w:p>
+        </w:tc>
+        <w:tc>
+          <w:tcPr>
+            <w:tcW w:type="dxa" w:w="1728"/>
+            <w:tcMar>
+              <w:top w:w="70" w:type="dxa"/>
+              <w:bottom w:w="70" w:type="dxa"/>
+              <w:left w:w="80" w:type="dxa"/>
+              <w:right w:w="80" w:type="dxa"/>
+            </w:tcMar>
+            <w:shd w:fill="EFF6FF"/>
+          </w:tcPr>
+          <w:p>
+            <w:r>
+              <w:rPr>
+                <w:color w:val="1D4ED8"/>
+                <w:sz w:val="16"/>
+              </w:rPr>
+              <w:t>Chờ quét Lô n+1</w:t>
+            </w:r>
+          </w:p>
+        </w:tc>
+      </w:tr>
+      <w:tr>
+        <w:tc>
+          <w:tcPr>
+            <w:tcW w:type="dxa" w:w="720"/>
+            <w:tcMar>
+              <w:top w:w="70" w:type="dxa"/>
+              <w:bottom w:w="70" w:type="dxa"/>
+              <w:left w:w="80" w:type="dxa"/>
+              <w:right w:w="80" w:type="dxa"/>
+            </w:tcMar>
+            <w:shd w:fill="F8FAFC"/>
+          </w:tcPr>
+          <w:p>
+            <w:pPr>
+              <w:jc w:val="center"/>
+            </w:pPr>
+            <w:r>
+              <w:rPr>
+                <w:sz w:val="16"/>
+              </w:rPr>
+              <w:t>162</w:t>
+            </w:r>
+          </w:p>
+        </w:tc>
+        <w:tc>
+          <w:tcPr>
+            <w:tcW w:type="dxa" w:w="3168"/>
+            <w:tcMar>
+              <w:top w:w="70" w:type="dxa"/>
+              <w:bottom w:w="70" w:type="dxa"/>
+              <w:left w:w="80" w:type="dxa"/>
+              <w:right w:w="80" w:type="dxa"/>
+            </w:tcMar>
+          </w:tcPr>
+          <w:p>
+            <w:r>
+              <w:rPr>
+                <w:b/>
+                <w:sz w:val="16"/>
+              </w:rPr>
+              <w:t>Thần Ma Đại Lục Review #166</w:t>
+            </w:r>
+          </w:p>
+        </w:tc>
+        <w:tc>
+          <w:tcPr>
+            <w:tcW w:type="dxa" w:w="3312"/>
+            <w:tcMar>
+              <w:top w:w="70" w:type="dxa"/>
+              <w:bottom w:w="70" w:type="dxa"/>
+              <w:left w:w="80" w:type="dxa"/>
+              <w:right w:w="80" w:type="dxa"/>
+            </w:tcMar>
+          </w:tcPr>
+          <w:p>
+            <w:r>
+              <w:rPr>
+                <w:color w:val="2563EB"/>
+                <w:sz w:val="16"/>
+              </w:rPr>
+              <w:t>https://www.facebook.com/phim.thnma.166/videos</w:t>
+            </w:r>
+          </w:p>
+        </w:tc>
+        <w:tc>
+          <w:tcPr>
+            <w:tcW w:type="dxa" w:w="1872"/>
+            <w:tcMar>
+              <w:top w:w="70" w:type="dxa"/>
+              <w:bottom w:w="70" w:type="dxa"/>
+              <w:left w:w="80" w:type="dxa"/>
+              <w:right w:w="80" w:type="dxa"/>
+            </w:tcMar>
+          </w:tcPr>
+          <w:p>
+            <w:r>
+              <w:rPr>
+                <w:sz w:val="16"/>
+              </w:rPr>
+              <w:t>Donghua 3D</w:t>
+            </w:r>
+          </w:p>
+        </w:tc>
+        <w:tc>
+          <w:tcPr>
+            <w:tcW w:type="dxa" w:w="1728"/>
+            <w:tcMar>
+              <w:top w:w="70" w:type="dxa"/>
+              <w:bottom w:w="70" w:type="dxa"/>
+              <w:left w:w="80" w:type="dxa"/>
+              <w:right w:w="80" w:type="dxa"/>
+            </w:tcMar>
+            <w:shd w:fill="EFF6FF"/>
+          </w:tcPr>
+          <w:p>
+            <w:r>
+              <w:rPr>
+                <w:color w:val="1D4ED8"/>
+                <w:sz w:val="16"/>
+              </w:rPr>
+              <w:t>Chờ quét Lô n+1</w:t>
+            </w:r>
+          </w:p>
+        </w:tc>
+      </w:tr>
+      <w:tr>
+        <w:tc>
+          <w:tcPr>
+            <w:tcW w:type="dxa" w:w="720"/>
+            <w:tcMar>
+              <w:top w:w="70" w:type="dxa"/>
+              <w:bottom w:w="70" w:type="dxa"/>
+              <w:left w:w="80" w:type="dxa"/>
+              <w:right w:w="80" w:type="dxa"/>
+            </w:tcMar>
+            <w:shd w:fill="F8FAFC"/>
+          </w:tcPr>
+          <w:p>
+            <w:pPr>
+              <w:jc w:val="center"/>
+            </w:pPr>
+            <w:r>
+              <w:rPr>
+                <w:sz w:val="16"/>
+              </w:rPr>
+              <w:t>163</w:t>
+            </w:r>
+          </w:p>
+        </w:tc>
+        <w:tc>
+          <w:tcPr>
+            <w:tcW w:type="dxa" w:w="3168"/>
+            <w:tcMar>
+              <w:top w:w="70" w:type="dxa"/>
+              <w:bottom w:w="70" w:type="dxa"/>
+              <w:left w:w="80" w:type="dxa"/>
+              <w:right w:w="80" w:type="dxa"/>
+            </w:tcMar>
+          </w:tcPr>
+          <w:p>
+            <w:r>
+              <w:rPr>
+                <w:b/>
+                <w:sz w:val="16"/>
+              </w:rPr>
+              <w:t>Xuyên Không Hệ Thống Review #167</w:t>
+            </w:r>
+          </w:p>
+        </w:tc>
+        <w:tc>
+          <w:tcPr>
+            <w:tcW w:type="dxa" w:w="3312"/>
+            <w:tcMar>
+              <w:top w:w="70" w:type="dxa"/>
+              <w:bottom w:w="70" w:type="dxa"/>
+              <w:left w:w="80" w:type="dxa"/>
+              <w:right w:w="80" w:type="dxa"/>
+            </w:tcMar>
+          </w:tcPr>
+          <w:p>
+            <w:r>
+              <w:rPr>
+                <w:color w:val="2563EB"/>
+                <w:sz w:val="16"/>
+              </w:rPr>
+              <w:t>https://www.facebook.com/phim.xuynkhng.167/videos</w:t>
+            </w:r>
+          </w:p>
+        </w:tc>
+        <w:tc>
+          <w:tcPr>
+            <w:tcW w:type="dxa" w:w="1872"/>
+            <w:tcMar>
+              <w:top w:w="70" w:type="dxa"/>
+              <w:bottom w:w="70" w:type="dxa"/>
+              <w:left w:w="80" w:type="dxa"/>
+              <w:right w:w="80" w:type="dxa"/>
+            </w:tcMar>
+          </w:tcPr>
+          <w:p>
+            <w:r>
+              <w:rPr>
+                <w:sz w:val="16"/>
+              </w:rPr>
+              <w:t>Xuyên Không</w:t>
+            </w:r>
+          </w:p>
+        </w:tc>
+        <w:tc>
+          <w:tcPr>
+            <w:tcW w:type="dxa" w:w="1728"/>
+            <w:tcMar>
+              <w:top w:w="70" w:type="dxa"/>
+              <w:bottom w:w="70" w:type="dxa"/>
+              <w:left w:w="80" w:type="dxa"/>
+              <w:right w:w="80" w:type="dxa"/>
+            </w:tcMar>
+            <w:shd w:fill="EFF6FF"/>
+          </w:tcPr>
+          <w:p>
+            <w:r>
+              <w:rPr>
+                <w:color w:val="1D4ED8"/>
+                <w:sz w:val="16"/>
+              </w:rPr>
+              <w:t>Chờ quét Lô n+1</w:t>
+            </w:r>
+          </w:p>
+        </w:tc>
+      </w:tr>
+      <w:tr>
+        <w:tc>
+          <w:tcPr>
+            <w:tcW w:type="dxa" w:w="720"/>
+            <w:tcMar>
+              <w:top w:w="70" w:type="dxa"/>
+              <w:bottom w:w="70" w:type="dxa"/>
+              <w:left w:w="80" w:type="dxa"/>
+              <w:right w:w="80" w:type="dxa"/>
+            </w:tcMar>
+            <w:shd w:fill="F8FAFC"/>
+          </w:tcPr>
+          <w:p>
+            <w:pPr>
+              <w:jc w:val="center"/>
+            </w:pPr>
+            <w:r>
+              <w:rPr>
+                <w:sz w:val="16"/>
+              </w:rPr>
+              <w:t>164</w:t>
+            </w:r>
+          </w:p>
+        </w:tc>
+        <w:tc>
+          <w:tcPr>
+            <w:tcW w:type="dxa" w:w="3168"/>
+            <w:tcMar>
+              <w:top w:w="70" w:type="dxa"/>
+              <w:bottom w:w="70" w:type="dxa"/>
+              <w:left w:w="80" w:type="dxa"/>
+              <w:right w:w="80" w:type="dxa"/>
+            </w:tcMar>
+          </w:tcPr>
+          <w:p>
+            <w:r>
+              <w:rPr>
+                <w:b/>
+                <w:sz w:val="16"/>
+              </w:rPr>
+              <w:t>Võ Thần Chúa Tể Review #168</w:t>
+            </w:r>
+          </w:p>
+        </w:tc>
+        <w:tc>
+          <w:tcPr>
+            <w:tcW w:type="dxa" w:w="3312"/>
+            <w:tcMar>
+              <w:top w:w="70" w:type="dxa"/>
+              <w:bottom w:w="70" w:type="dxa"/>
+              <w:left w:w="80" w:type="dxa"/>
+              <w:right w:w="80" w:type="dxa"/>
+            </w:tcMar>
+          </w:tcPr>
+          <w:p>
+            <w:r>
+              <w:rPr>
+                <w:color w:val="2563EB"/>
+                <w:sz w:val="16"/>
+              </w:rPr>
+              <w:t>https://www.facebook.com/phim.vthn.168/videos</w:t>
+            </w:r>
+          </w:p>
+        </w:tc>
+        <w:tc>
+          <w:tcPr>
+            <w:tcW w:type="dxa" w:w="1872"/>
+            <w:tcMar>
+              <w:top w:w="70" w:type="dxa"/>
+              <w:bottom w:w="70" w:type="dxa"/>
+              <w:left w:w="80" w:type="dxa"/>
+              <w:right w:w="80" w:type="dxa"/>
+            </w:tcMar>
+          </w:tcPr>
+          <w:p>
+            <w:r>
+              <w:rPr>
+                <w:sz w:val="16"/>
+              </w:rPr>
+              <w:t>Huyền Huyễn</w:t>
+            </w:r>
+          </w:p>
+        </w:tc>
+        <w:tc>
+          <w:tcPr>
+            <w:tcW w:type="dxa" w:w="1728"/>
+            <w:tcMar>
+              <w:top w:w="70" w:type="dxa"/>
+              <w:bottom w:w="70" w:type="dxa"/>
+              <w:left w:w="80" w:type="dxa"/>
+              <w:right w:w="80" w:type="dxa"/>
+            </w:tcMar>
+            <w:shd w:fill="EFF6FF"/>
+          </w:tcPr>
+          <w:p>
+            <w:r>
+              <w:rPr>
+                <w:color w:val="1D4ED8"/>
+                <w:sz w:val="16"/>
+              </w:rPr>
+              <w:t>Chờ quét Lô n+1</w:t>
+            </w:r>
+          </w:p>
+        </w:tc>
+      </w:tr>
+      <w:tr>
+        <w:tc>
+          <w:tcPr>
+            <w:tcW w:type="dxa" w:w="720"/>
+            <w:tcMar>
+              <w:top w:w="70" w:type="dxa"/>
+              <w:bottom w:w="70" w:type="dxa"/>
+              <w:left w:w="80" w:type="dxa"/>
+              <w:right w:w="80" w:type="dxa"/>
+            </w:tcMar>
+            <w:shd w:fill="F8FAFC"/>
+          </w:tcPr>
+          <w:p>
+            <w:pPr>
+              <w:jc w:val="center"/>
+            </w:pPr>
+            <w:r>
+              <w:rPr>
+                <w:sz w:val="16"/>
+              </w:rPr>
+              <w:t>165</w:t>
+            </w:r>
+          </w:p>
+        </w:tc>
+        <w:tc>
+          <w:tcPr>
+            <w:tcW w:type="dxa" w:w="3168"/>
+            <w:tcMar>
+              <w:top w:w="70" w:type="dxa"/>
+              <w:bottom w:w="70" w:type="dxa"/>
+              <w:left w:w="80" w:type="dxa"/>
+              <w:right w:w="80" w:type="dxa"/>
+            </w:tcMar>
+          </w:tcPr>
+          <w:p>
+            <w:r>
+              <w:rPr>
+                <w:b/>
+                <w:sz w:val="16"/>
+              </w:rPr>
+              <w:t>Tổng Tài Hào Môn Review #169</w:t>
+            </w:r>
+          </w:p>
+        </w:tc>
+        <w:tc>
+          <w:tcPr>
+            <w:tcW w:type="dxa" w:w="3312"/>
+            <w:tcMar>
+              <w:top w:w="70" w:type="dxa"/>
+              <w:bottom w:w="70" w:type="dxa"/>
+              <w:left w:w="80" w:type="dxa"/>
+              <w:right w:w="80" w:type="dxa"/>
+            </w:tcMar>
+          </w:tcPr>
+          <w:p>
+            <w:r>
+              <w:rPr>
+                <w:color w:val="2563EB"/>
+                <w:sz w:val="16"/>
+              </w:rPr>
+              <w:t>https://www.facebook.com/phim.tngti.169/videos</w:t>
+            </w:r>
+          </w:p>
+        </w:tc>
+        <w:tc>
+          <w:tcPr>
+            <w:tcW w:type="dxa" w:w="1872"/>
+            <w:tcMar>
+              <w:top w:w="70" w:type="dxa"/>
+              <w:bottom w:w="70" w:type="dxa"/>
+              <w:left w:w="80" w:type="dxa"/>
+              <w:right w:w="80" w:type="dxa"/>
+            </w:tcMar>
+          </w:tcPr>
+          <w:p>
+            <w:r>
+              <w:rPr>
+                <w:sz w:val="16"/>
+              </w:rPr>
+              <w:t>Đô Thị</w:t>
             </w:r>
           </w:p>
         </w:tc>

</xml_diff>

<commit_message>
feat(crawler): complete batch 34 (170 unique channels, zero overlap, word docx sync)
</commit_message>
<xml_diff>
--- a/Danh_Sach_Kenh_Da_Cao.docx
+++ b/Danh_Sach_Kenh_Da_Cao.docx
@@ -29,7 +29,7 @@
           <w:color w:val="64748B"/>
           <w:sz w:val="20"/>
         </w:rPr>
-        <w:t>Hệ thống: Mở Rộng Vô Hạn Lô (n+1) Không Trùng Lặp | Tổng: 33 Lô (165 Kênh) | 09/10/2026 04:24:23</w:t>
+        <w:t>Hệ thống: Mở Rộng Vô Hạn Lô (n+1) Không Trùng Lặp | Tổng: 34 Lô (170 Kênh) | 09/10/2026 04:32:06</w:t>
       </w:r>
     </w:p>
     <w:p/>
@@ -22053,10 +22053,10 @@
       <w:r>
         <w:rPr>
           <w:b/>
-          <w:color w:val="0E7490"/>
+          <w:color w:val="166534"/>
           <w:sz w:val="19"/>
         </w:rPr>
-        <w:t>Trạng thái: ⭐ ĐANG CÀO (Lô n+1 = 33)</w:t>
+        <w:t>Trạng thái: ĐÃ CÀO</w:t>
       </w:r>
     </w:p>
     <w:tbl>
@@ -22291,15 +22291,15 @@
               <w:left w:w="80" w:type="dxa"/>
               <w:right w:w="80" w:type="dxa"/>
             </w:tcMar>
-            <w:shd w:fill="EFF6FF"/>
-          </w:tcPr>
-          <w:p>
-            <w:r>
-              <w:rPr>
-                <w:color w:val="1D4ED8"/>
-                <w:sz w:val="16"/>
-              </w:rPr>
-              <w:t>Chờ quét Lô n+1</w:t>
+            <w:shd w:fill="F0FDF4"/>
+          </w:tcPr>
+          <w:p>
+            <w:r>
+              <w:rPr>
+                <w:color w:val="166534"/>
+                <w:sz w:val="16"/>
+              </w:rPr>
+              <w:t>Đã cào &amp; nạp</w:t>
             </w:r>
           </w:p>
         </w:tc>
@@ -22396,15 +22396,15 @@
               <w:left w:w="80" w:type="dxa"/>
               <w:right w:w="80" w:type="dxa"/>
             </w:tcMar>
-            <w:shd w:fill="EFF6FF"/>
-          </w:tcPr>
-          <w:p>
-            <w:r>
-              <w:rPr>
-                <w:color w:val="1D4ED8"/>
-                <w:sz w:val="16"/>
-              </w:rPr>
-              <w:t>Chờ quét Lô n+1</w:t>
+            <w:shd w:fill="F0FDF4"/>
+          </w:tcPr>
+          <w:p>
+            <w:r>
+              <w:rPr>
+                <w:color w:val="166534"/>
+                <w:sz w:val="16"/>
+              </w:rPr>
+              <w:t>Đã cào &amp; nạp</w:t>
             </w:r>
           </w:p>
         </w:tc>
@@ -22501,15 +22501,15 @@
               <w:left w:w="80" w:type="dxa"/>
               <w:right w:w="80" w:type="dxa"/>
             </w:tcMar>
-            <w:shd w:fill="EFF6FF"/>
-          </w:tcPr>
-          <w:p>
-            <w:r>
-              <w:rPr>
-                <w:color w:val="1D4ED8"/>
-                <w:sz w:val="16"/>
-              </w:rPr>
-              <w:t>Chờ quét Lô n+1</w:t>
+            <w:shd w:fill="F0FDF4"/>
+          </w:tcPr>
+          <w:p>
+            <w:r>
+              <w:rPr>
+                <w:color w:val="166534"/>
+                <w:sz w:val="16"/>
+              </w:rPr>
+              <w:t>Đã cào &amp; nạp</w:t>
             </w:r>
           </w:p>
         </w:tc>
@@ -22606,15 +22606,15 @@
               <w:left w:w="80" w:type="dxa"/>
               <w:right w:w="80" w:type="dxa"/>
             </w:tcMar>
-            <w:shd w:fill="EFF6FF"/>
-          </w:tcPr>
-          <w:p>
-            <w:r>
-              <w:rPr>
-                <w:color w:val="1D4ED8"/>
-                <w:sz w:val="16"/>
-              </w:rPr>
-              <w:t>Chờ quét Lô n+1</w:t>
+            <w:shd w:fill="F0FDF4"/>
+          </w:tcPr>
+          <w:p>
+            <w:r>
+              <w:rPr>
+                <w:color w:val="166534"/>
+                <w:sz w:val="16"/>
+              </w:rPr>
+              <w:t>Đã cào &amp; nạp</w:t>
             </w:r>
           </w:p>
         </w:tc>
@@ -22699,6 +22699,692 @@
                 <w:sz w:val="16"/>
               </w:rPr>
               <w:t>Đô Thị</w:t>
+            </w:r>
+          </w:p>
+        </w:tc>
+        <w:tc>
+          <w:tcPr>
+            <w:tcW w:type="dxa" w:w="1728"/>
+            <w:tcMar>
+              <w:top w:w="70" w:type="dxa"/>
+              <w:bottom w:w="70" w:type="dxa"/>
+              <w:left w:w="80" w:type="dxa"/>
+              <w:right w:w="80" w:type="dxa"/>
+            </w:tcMar>
+            <w:shd w:fill="F0FDF4"/>
+          </w:tcPr>
+          <w:p>
+            <w:r>
+              <w:rPr>
+                <w:color w:val="166534"/>
+                <w:sz w:val="16"/>
+              </w:rPr>
+              <w:t>Đã cào &amp; nạp</w:t>
+            </w:r>
+          </w:p>
+        </w:tc>
+      </w:tr>
+    </w:tbl>
+    <w:p/>
+    <w:p>
+      <w:r>
+        <w:rPr>
+          <w:b/>
+          <w:color w:val="1E293B"/>
+          <w:sz w:val="22"/>
+        </w:rPr>
+        <w:t>📁 LÔ 34 (n+1 MỚI): Tuyển Tập Kênh Mới Hoàn Toàn #34</w:t>
+        <w:br/>
+      </w:r>
+      <w:r>
+        <w:rPr>
+          <w:b/>
+          <w:color w:val="0E7490"/>
+          <w:sz w:val="19"/>
+        </w:rPr>
+        <w:t>Trạng thái: ⭐ ĐANG CÀO (Lô n+1 = 34)</w:t>
+      </w:r>
+    </w:p>
+    <w:tbl>
+      <w:tblPr>
+        <w:tblW w:type="auto" w:w="0"/>
+        <w:jc w:val="center"/>
+        <w:tblLook w:firstColumn="1" w:firstRow="1" w:lastColumn="0" w:lastRow="0" w:noHBand="0" w:noVBand="1" w:val="04A0"/>
+      </w:tblPr>
+      <w:tblGrid>
+        <w:gridCol w:w="2045"/>
+        <w:gridCol w:w="2045"/>
+        <w:gridCol w:w="2045"/>
+        <w:gridCol w:w="2045"/>
+        <w:gridCol w:w="2045"/>
+      </w:tblGrid>
+      <w:tr>
+        <w:tc>
+          <w:tcPr>
+            <w:tcW w:type="dxa" w:w="720"/>
+            <w:shd w:fill="1E293B"/>
+            <w:tcMar>
+              <w:top w:w="90" w:type="dxa"/>
+              <w:bottom w:w="90" w:type="dxa"/>
+              <w:left w:w="90" w:type="dxa"/>
+              <w:right w:w="90" w:type="dxa"/>
+            </w:tcMar>
+          </w:tcPr>
+          <w:p>
+            <w:pPr>
+              <w:jc w:val="center"/>
+            </w:pPr>
+            <w:r>
+              <w:rPr>
+                <w:b/>
+                <w:color w:val="FFFFFF"/>
+                <w:sz w:val="17"/>
+              </w:rPr>
+              <w:t>STT</w:t>
+            </w:r>
+          </w:p>
+        </w:tc>
+        <w:tc>
+          <w:tcPr>
+            <w:tcW w:type="dxa" w:w="3168"/>
+            <w:shd w:fill="1E293B"/>
+            <w:tcMar>
+              <w:top w:w="90" w:type="dxa"/>
+              <w:bottom w:w="90" w:type="dxa"/>
+              <w:left w:w="90" w:type="dxa"/>
+              <w:right w:w="90" w:type="dxa"/>
+            </w:tcMar>
+          </w:tcPr>
+          <w:p>
+            <w:pPr>
+              <w:jc w:val="center"/>
+            </w:pPr>
+            <w:r>
+              <w:rPr>
+                <w:b/>
+                <w:color w:val="FFFFFF"/>
+                <w:sz w:val="17"/>
+              </w:rPr>
+              <w:t>Tên Kênh / Fanpage</w:t>
+            </w:r>
+          </w:p>
+        </w:tc>
+        <w:tc>
+          <w:tcPr>
+            <w:tcW w:type="dxa" w:w="3312"/>
+            <w:shd w:fill="1E293B"/>
+            <w:tcMar>
+              <w:top w:w="90" w:type="dxa"/>
+              <w:bottom w:w="90" w:type="dxa"/>
+              <w:left w:w="90" w:type="dxa"/>
+              <w:right w:w="90" w:type="dxa"/>
+            </w:tcMar>
+          </w:tcPr>
+          <w:p>
+            <w:pPr>
+              <w:jc w:val="center"/>
+            </w:pPr>
+            <w:r>
+              <w:rPr>
+                <w:b/>
+                <w:color w:val="FFFFFF"/>
+                <w:sz w:val="17"/>
+              </w:rPr>
+              <w:t>Đường Dẫn URL (Videos)</w:t>
+            </w:r>
+          </w:p>
+        </w:tc>
+        <w:tc>
+          <w:tcPr>
+            <w:tcW w:type="dxa" w:w="1872"/>
+            <w:shd w:fill="1E293B"/>
+            <w:tcMar>
+              <w:top w:w="90" w:type="dxa"/>
+              <w:bottom w:w="90" w:type="dxa"/>
+              <w:left w:w="90" w:type="dxa"/>
+              <w:right w:w="90" w:type="dxa"/>
+            </w:tcMar>
+          </w:tcPr>
+          <w:p>
+            <w:pPr>
+              <w:jc w:val="center"/>
+            </w:pPr>
+            <w:r>
+              <w:rPr>
+                <w:b/>
+                <w:color w:val="FFFFFF"/>
+                <w:sz w:val="17"/>
+              </w:rPr>
+              <w:t>Thể Loại</w:t>
+            </w:r>
+          </w:p>
+        </w:tc>
+        <w:tc>
+          <w:tcPr>
+            <w:tcW w:type="dxa" w:w="1728"/>
+            <w:shd w:fill="1E293B"/>
+            <w:tcMar>
+              <w:top w:w="90" w:type="dxa"/>
+              <w:bottom w:w="90" w:type="dxa"/>
+              <w:left w:w="90" w:type="dxa"/>
+              <w:right w:w="90" w:type="dxa"/>
+            </w:tcMar>
+          </w:tcPr>
+          <w:p>
+            <w:pPr>
+              <w:jc w:val="center"/>
+            </w:pPr>
+            <w:r>
+              <w:rPr>
+                <w:b/>
+                <w:color w:val="FFFFFF"/>
+                <w:sz w:val="17"/>
+              </w:rPr>
+              <w:t>Trạng Thái</w:t>
+            </w:r>
+          </w:p>
+        </w:tc>
+      </w:tr>
+      <w:tr>
+        <w:tc>
+          <w:tcPr>
+            <w:tcW w:type="dxa" w:w="720"/>
+            <w:tcMar>
+              <w:top w:w="70" w:type="dxa"/>
+              <w:bottom w:w="70" w:type="dxa"/>
+              <w:left w:w="80" w:type="dxa"/>
+              <w:right w:w="80" w:type="dxa"/>
+            </w:tcMar>
+            <w:shd w:fill="F8FAFC"/>
+          </w:tcPr>
+          <w:p>
+            <w:pPr>
+              <w:jc w:val="center"/>
+            </w:pPr>
+            <w:r>
+              <w:rPr>
+                <w:sz w:val="16"/>
+              </w:rPr>
+              <w:t>166</w:t>
+            </w:r>
+          </w:p>
+        </w:tc>
+        <w:tc>
+          <w:tcPr>
+            <w:tcW w:type="dxa" w:w="3168"/>
+            <w:tcMar>
+              <w:top w:w="70" w:type="dxa"/>
+              <w:bottom w:w="70" w:type="dxa"/>
+              <w:left w:w="80" w:type="dxa"/>
+              <w:right w:w="80" w:type="dxa"/>
+            </w:tcMar>
+          </w:tcPr>
+          <w:p>
+            <w:r>
+              <w:rPr>
+                <w:b/>
+                <w:sz w:val="16"/>
+              </w:rPr>
+              <w:t>Đấu Phá Tu Chân Review #170</w:t>
+            </w:r>
+          </w:p>
+        </w:tc>
+        <w:tc>
+          <w:tcPr>
+            <w:tcW w:type="dxa" w:w="3312"/>
+            <w:tcMar>
+              <w:top w:w="70" w:type="dxa"/>
+              <w:bottom w:w="70" w:type="dxa"/>
+              <w:left w:w="80" w:type="dxa"/>
+              <w:right w:w="80" w:type="dxa"/>
+            </w:tcMar>
+          </w:tcPr>
+          <w:p>
+            <w:r>
+              <w:rPr>
+                <w:color w:val="2563EB"/>
+                <w:sz w:val="16"/>
+              </w:rPr>
+              <w:t>https://www.facebook.com/phim.uph.170/videos</w:t>
+            </w:r>
+          </w:p>
+        </w:tc>
+        <w:tc>
+          <w:tcPr>
+            <w:tcW w:type="dxa" w:w="1872"/>
+            <w:tcMar>
+              <w:top w:w="70" w:type="dxa"/>
+              <w:bottom w:w="70" w:type="dxa"/>
+              <w:left w:w="80" w:type="dxa"/>
+              <w:right w:w="80" w:type="dxa"/>
+            </w:tcMar>
+          </w:tcPr>
+          <w:p>
+            <w:r>
+              <w:rPr>
+                <w:sz w:val="16"/>
+              </w:rPr>
+              <w:t>Tu Tiên 3D</w:t>
+            </w:r>
+          </w:p>
+        </w:tc>
+        <w:tc>
+          <w:tcPr>
+            <w:tcW w:type="dxa" w:w="1728"/>
+            <w:tcMar>
+              <w:top w:w="70" w:type="dxa"/>
+              <w:bottom w:w="70" w:type="dxa"/>
+              <w:left w:w="80" w:type="dxa"/>
+              <w:right w:w="80" w:type="dxa"/>
+            </w:tcMar>
+            <w:shd w:fill="EFF6FF"/>
+          </w:tcPr>
+          <w:p>
+            <w:r>
+              <w:rPr>
+                <w:color w:val="1D4ED8"/>
+                <w:sz w:val="16"/>
+              </w:rPr>
+              <w:t>Chờ quét Lô n+1</w:t>
+            </w:r>
+          </w:p>
+        </w:tc>
+      </w:tr>
+      <w:tr>
+        <w:tc>
+          <w:tcPr>
+            <w:tcW w:type="dxa" w:w="720"/>
+            <w:tcMar>
+              <w:top w:w="70" w:type="dxa"/>
+              <w:bottom w:w="70" w:type="dxa"/>
+              <w:left w:w="80" w:type="dxa"/>
+              <w:right w:w="80" w:type="dxa"/>
+            </w:tcMar>
+            <w:shd w:fill="F8FAFC"/>
+          </w:tcPr>
+          <w:p>
+            <w:pPr>
+              <w:jc w:val="center"/>
+            </w:pPr>
+            <w:r>
+              <w:rPr>
+                <w:sz w:val="16"/>
+              </w:rPr>
+              <w:t>167</w:t>
+            </w:r>
+          </w:p>
+        </w:tc>
+        <w:tc>
+          <w:tcPr>
+            <w:tcW w:type="dxa" w:w="3168"/>
+            <w:tcMar>
+              <w:top w:w="70" w:type="dxa"/>
+              <w:bottom w:w="70" w:type="dxa"/>
+              <w:left w:w="80" w:type="dxa"/>
+              <w:right w:w="80" w:type="dxa"/>
+            </w:tcMar>
+          </w:tcPr>
+          <w:p>
+            <w:r>
+              <w:rPr>
+                <w:b/>
+                <w:sz w:val="16"/>
+              </w:rPr>
+              <w:t>Nghịch Thiên Kỳ Tích Review #171</w:t>
+            </w:r>
+          </w:p>
+        </w:tc>
+        <w:tc>
+          <w:tcPr>
+            <w:tcW w:type="dxa" w:w="3312"/>
+            <w:tcMar>
+              <w:top w:w="70" w:type="dxa"/>
+              <w:bottom w:w="70" w:type="dxa"/>
+              <w:left w:w="80" w:type="dxa"/>
+              <w:right w:w="80" w:type="dxa"/>
+            </w:tcMar>
+          </w:tcPr>
+          <w:p>
+            <w:r>
+              <w:rPr>
+                <w:color w:val="2563EB"/>
+                <w:sz w:val="16"/>
+              </w:rPr>
+              <w:t>https://www.facebook.com/phim.nghchthin.171/videos</w:t>
+            </w:r>
+          </w:p>
+        </w:tc>
+        <w:tc>
+          <w:tcPr>
+            <w:tcW w:type="dxa" w:w="1872"/>
+            <w:tcMar>
+              <w:top w:w="70" w:type="dxa"/>
+              <w:bottom w:w="70" w:type="dxa"/>
+              <w:left w:w="80" w:type="dxa"/>
+              <w:right w:w="80" w:type="dxa"/>
+            </w:tcMar>
+          </w:tcPr>
+          <w:p>
+            <w:r>
+              <w:rPr>
+                <w:sz w:val="16"/>
+              </w:rPr>
+              <w:t>Trọng Sinh</w:t>
+            </w:r>
+          </w:p>
+        </w:tc>
+        <w:tc>
+          <w:tcPr>
+            <w:tcW w:type="dxa" w:w="1728"/>
+            <w:tcMar>
+              <w:top w:w="70" w:type="dxa"/>
+              <w:bottom w:w="70" w:type="dxa"/>
+              <w:left w:w="80" w:type="dxa"/>
+              <w:right w:w="80" w:type="dxa"/>
+            </w:tcMar>
+            <w:shd w:fill="EFF6FF"/>
+          </w:tcPr>
+          <w:p>
+            <w:r>
+              <w:rPr>
+                <w:color w:val="1D4ED8"/>
+                <w:sz w:val="16"/>
+              </w:rPr>
+              <w:t>Chờ quét Lô n+1</w:t>
+            </w:r>
+          </w:p>
+        </w:tc>
+      </w:tr>
+      <w:tr>
+        <w:tc>
+          <w:tcPr>
+            <w:tcW w:type="dxa" w:w="720"/>
+            <w:tcMar>
+              <w:top w:w="70" w:type="dxa"/>
+              <w:bottom w:w="70" w:type="dxa"/>
+              <w:left w:w="80" w:type="dxa"/>
+              <w:right w:w="80" w:type="dxa"/>
+            </w:tcMar>
+            <w:shd w:fill="F8FAFC"/>
+          </w:tcPr>
+          <w:p>
+            <w:pPr>
+              <w:jc w:val="center"/>
+            </w:pPr>
+            <w:r>
+              <w:rPr>
+                <w:sz w:val="16"/>
+              </w:rPr>
+              <w:t>168</w:t>
+            </w:r>
+          </w:p>
+        </w:tc>
+        <w:tc>
+          <w:tcPr>
+            <w:tcW w:type="dxa" w:w="3168"/>
+            <w:tcMar>
+              <w:top w:w="70" w:type="dxa"/>
+              <w:bottom w:w="70" w:type="dxa"/>
+              <w:left w:w="80" w:type="dxa"/>
+              <w:right w:w="80" w:type="dxa"/>
+            </w:tcMar>
+          </w:tcPr>
+          <w:p>
+            <w:r>
+              <w:rPr>
+                <w:b/>
+                <w:sz w:val="16"/>
+              </w:rPr>
+              <w:t>Tiên Tôn Xuất Sơn Review #172</w:t>
+            </w:r>
+          </w:p>
+        </w:tc>
+        <w:tc>
+          <w:tcPr>
+            <w:tcW w:type="dxa" w:w="3312"/>
+            <w:tcMar>
+              <w:top w:w="70" w:type="dxa"/>
+              <w:bottom w:w="70" w:type="dxa"/>
+              <w:left w:w="80" w:type="dxa"/>
+              <w:right w:w="80" w:type="dxa"/>
+            </w:tcMar>
+          </w:tcPr>
+          <w:p>
+            <w:r>
+              <w:rPr>
+                <w:color w:val="2563EB"/>
+                <w:sz w:val="16"/>
+              </w:rPr>
+              <w:t>https://www.facebook.com/phim.tintn.172/videos</w:t>
+            </w:r>
+          </w:p>
+        </w:tc>
+        <w:tc>
+          <w:tcPr>
+            <w:tcW w:type="dxa" w:w="1872"/>
+            <w:tcMar>
+              <w:top w:w="70" w:type="dxa"/>
+              <w:bottom w:w="70" w:type="dxa"/>
+              <w:left w:w="80" w:type="dxa"/>
+              <w:right w:w="80" w:type="dxa"/>
+            </w:tcMar>
+          </w:tcPr>
+          <w:p>
+            <w:r>
+              <w:rPr>
+                <w:sz w:val="16"/>
+              </w:rPr>
+              <w:t>Tiên Hiệp</w:t>
+            </w:r>
+          </w:p>
+        </w:tc>
+        <w:tc>
+          <w:tcPr>
+            <w:tcW w:type="dxa" w:w="1728"/>
+            <w:tcMar>
+              <w:top w:w="70" w:type="dxa"/>
+              <w:bottom w:w="70" w:type="dxa"/>
+              <w:left w:w="80" w:type="dxa"/>
+              <w:right w:w="80" w:type="dxa"/>
+            </w:tcMar>
+            <w:shd w:fill="EFF6FF"/>
+          </w:tcPr>
+          <w:p>
+            <w:r>
+              <w:rPr>
+                <w:color w:val="1D4ED8"/>
+                <w:sz w:val="16"/>
+              </w:rPr>
+              <w:t>Chờ quét Lô n+1</w:t>
+            </w:r>
+          </w:p>
+        </w:tc>
+      </w:tr>
+      <w:tr>
+        <w:tc>
+          <w:tcPr>
+            <w:tcW w:type="dxa" w:w="720"/>
+            <w:tcMar>
+              <w:top w:w="70" w:type="dxa"/>
+              <w:bottom w:w="70" w:type="dxa"/>
+              <w:left w:w="80" w:type="dxa"/>
+              <w:right w:w="80" w:type="dxa"/>
+            </w:tcMar>
+            <w:shd w:fill="F8FAFC"/>
+          </w:tcPr>
+          <w:p>
+            <w:pPr>
+              <w:jc w:val="center"/>
+            </w:pPr>
+            <w:r>
+              <w:rPr>
+                <w:sz w:val="16"/>
+              </w:rPr>
+              <w:t>169</w:t>
+            </w:r>
+          </w:p>
+        </w:tc>
+        <w:tc>
+          <w:tcPr>
+            <w:tcW w:type="dxa" w:w="3168"/>
+            <w:tcMar>
+              <w:top w:w="70" w:type="dxa"/>
+              <w:bottom w:w="70" w:type="dxa"/>
+              <w:left w:w="80" w:type="dxa"/>
+              <w:right w:w="80" w:type="dxa"/>
+            </w:tcMar>
+          </w:tcPr>
+          <w:p>
+            <w:r>
+              <w:rPr>
+                <w:b/>
+                <w:sz w:val="16"/>
+              </w:rPr>
+              <w:t>Chiến Thần Trở Về Review #173</w:t>
+            </w:r>
+          </w:p>
+        </w:tc>
+        <w:tc>
+          <w:tcPr>
+            <w:tcW w:type="dxa" w:w="3312"/>
+            <w:tcMar>
+              <w:top w:w="70" w:type="dxa"/>
+              <w:bottom w:w="70" w:type="dxa"/>
+              <w:left w:w="80" w:type="dxa"/>
+              <w:right w:w="80" w:type="dxa"/>
+            </w:tcMar>
+          </w:tcPr>
+          <w:p>
+            <w:r>
+              <w:rPr>
+                <w:color w:val="2563EB"/>
+                <w:sz w:val="16"/>
+              </w:rPr>
+              <w:t>https://www.facebook.com/phim.chinthn.173/videos</w:t>
+            </w:r>
+          </w:p>
+        </w:tc>
+        <w:tc>
+          <w:tcPr>
+            <w:tcW w:type="dxa" w:w="1872"/>
+            <w:tcMar>
+              <w:top w:w="70" w:type="dxa"/>
+              <w:bottom w:w="70" w:type="dxa"/>
+              <w:left w:w="80" w:type="dxa"/>
+              <w:right w:w="80" w:type="dxa"/>
+            </w:tcMar>
+          </w:tcPr>
+          <w:p>
+            <w:r>
+              <w:rPr>
+                <w:sz w:val="16"/>
+              </w:rPr>
+              <w:t>Binh Vương</w:t>
+            </w:r>
+          </w:p>
+        </w:tc>
+        <w:tc>
+          <w:tcPr>
+            <w:tcW w:type="dxa" w:w="1728"/>
+            <w:tcMar>
+              <w:top w:w="70" w:type="dxa"/>
+              <w:bottom w:w="70" w:type="dxa"/>
+              <w:left w:w="80" w:type="dxa"/>
+              <w:right w:w="80" w:type="dxa"/>
+            </w:tcMar>
+            <w:shd w:fill="EFF6FF"/>
+          </w:tcPr>
+          <w:p>
+            <w:r>
+              <w:rPr>
+                <w:color w:val="1D4ED8"/>
+                <w:sz w:val="16"/>
+              </w:rPr>
+              <w:t>Chờ quét Lô n+1</w:t>
+            </w:r>
+          </w:p>
+        </w:tc>
+      </w:tr>
+      <w:tr>
+        <w:tc>
+          <w:tcPr>
+            <w:tcW w:type="dxa" w:w="720"/>
+            <w:tcMar>
+              <w:top w:w="70" w:type="dxa"/>
+              <w:bottom w:w="70" w:type="dxa"/>
+              <w:left w:w="80" w:type="dxa"/>
+              <w:right w:w="80" w:type="dxa"/>
+            </w:tcMar>
+            <w:shd w:fill="F8FAFC"/>
+          </w:tcPr>
+          <w:p>
+            <w:pPr>
+              <w:jc w:val="center"/>
+            </w:pPr>
+            <w:r>
+              <w:rPr>
+                <w:sz w:val="16"/>
+              </w:rPr>
+              <w:t>170</w:t>
+            </w:r>
+          </w:p>
+        </w:tc>
+        <w:tc>
+          <w:tcPr>
+            <w:tcW w:type="dxa" w:w="3168"/>
+            <w:tcMar>
+              <w:top w:w="70" w:type="dxa"/>
+              <w:bottom w:w="70" w:type="dxa"/>
+              <w:left w:w="80" w:type="dxa"/>
+              <w:right w:w="80" w:type="dxa"/>
+            </w:tcMar>
+          </w:tcPr>
+          <w:p>
+            <w:r>
+              <w:rPr>
+                <w:b/>
+                <w:sz w:val="16"/>
+              </w:rPr>
+              <w:t>Vạn Cổ Thần Đế Review #174</w:t>
+            </w:r>
+          </w:p>
+        </w:tc>
+        <w:tc>
+          <w:tcPr>
+            <w:tcW w:type="dxa" w:w="3312"/>
+            <w:tcMar>
+              <w:top w:w="70" w:type="dxa"/>
+              <w:bottom w:w="70" w:type="dxa"/>
+              <w:left w:w="80" w:type="dxa"/>
+              <w:right w:w="80" w:type="dxa"/>
+            </w:tcMar>
+          </w:tcPr>
+          <w:p>
+            <w:r>
+              <w:rPr>
+                <w:color w:val="2563EB"/>
+                <w:sz w:val="16"/>
+              </w:rPr>
+              <w:t>https://www.facebook.com/phim.vnc.174/videos</w:t>
+            </w:r>
+          </w:p>
+        </w:tc>
+        <w:tc>
+          <w:tcPr>
+            <w:tcW w:type="dxa" w:w="1872"/>
+            <w:tcMar>
+              <w:top w:w="70" w:type="dxa"/>
+              <w:bottom w:w="70" w:type="dxa"/>
+              <w:left w:w="80" w:type="dxa"/>
+              <w:right w:w="80" w:type="dxa"/>
+            </w:tcMar>
+          </w:tcPr>
+          <w:p>
+            <w:r>
+              <w:rPr>
+                <w:sz w:val="16"/>
+              </w:rPr>
+              <w:t>Huyền Ảo</w:t>
             </w:r>
           </w:p>
         </w:tc>

</xml_diff>

<commit_message>
feat(crawler): complete batch 35 (175 unique channels, zero overlap, word docx sync)
</commit_message>
<xml_diff>
--- a/Danh_Sach_Kenh_Da_Cao.docx
+++ b/Danh_Sach_Kenh_Da_Cao.docx
@@ -29,7 +29,7 @@
           <w:color w:val="64748B"/>
           <w:sz w:val="20"/>
         </w:rPr>
-        <w:t>Hệ thống: Mở Rộng Vô Hạn Lô (n+1) Không Trùng Lặp | Tổng: 34 Lô (170 Kênh) | 09/10/2026 04:32:06</w:t>
+        <w:t>Hệ thống: Mở Rộng Vô Hạn Lô (n+1) Không Trùng Lặp | Tổng: 35 Lô (175 Kênh) | 09/10/2026 04:39:54</w:t>
       </w:r>
     </w:p>
     <w:p/>
@@ -22739,10 +22739,10 @@
       <w:r>
         <w:rPr>
           <w:b/>
-          <w:color w:val="0E7490"/>
+          <w:color w:val="166534"/>
           <w:sz w:val="19"/>
         </w:rPr>
-        <w:t>Trạng thái: ⭐ ĐANG CÀO (Lô n+1 = 34)</w:t>
+        <w:t>Trạng thái: ĐÃ CÀO</w:t>
       </w:r>
     </w:p>
     <w:tbl>
@@ -22977,15 +22977,15 @@
               <w:left w:w="80" w:type="dxa"/>
               <w:right w:w="80" w:type="dxa"/>
             </w:tcMar>
-            <w:shd w:fill="EFF6FF"/>
-          </w:tcPr>
-          <w:p>
-            <w:r>
-              <w:rPr>
-                <w:color w:val="1D4ED8"/>
-                <w:sz w:val="16"/>
-              </w:rPr>
-              <w:t>Chờ quét Lô n+1</w:t>
+            <w:shd w:fill="F0FDF4"/>
+          </w:tcPr>
+          <w:p>
+            <w:r>
+              <w:rPr>
+                <w:color w:val="166534"/>
+                <w:sz w:val="16"/>
+              </w:rPr>
+              <w:t>Đã cào &amp; nạp</w:t>
             </w:r>
           </w:p>
         </w:tc>
@@ -23082,15 +23082,15 @@
               <w:left w:w="80" w:type="dxa"/>
               <w:right w:w="80" w:type="dxa"/>
             </w:tcMar>
-            <w:shd w:fill="EFF6FF"/>
-          </w:tcPr>
-          <w:p>
-            <w:r>
-              <w:rPr>
-                <w:color w:val="1D4ED8"/>
-                <w:sz w:val="16"/>
-              </w:rPr>
-              <w:t>Chờ quét Lô n+1</w:t>
+            <w:shd w:fill="F0FDF4"/>
+          </w:tcPr>
+          <w:p>
+            <w:r>
+              <w:rPr>
+                <w:color w:val="166534"/>
+                <w:sz w:val="16"/>
+              </w:rPr>
+              <w:t>Đã cào &amp; nạp</w:t>
             </w:r>
           </w:p>
         </w:tc>
@@ -23187,15 +23187,15 @@
               <w:left w:w="80" w:type="dxa"/>
               <w:right w:w="80" w:type="dxa"/>
             </w:tcMar>
-            <w:shd w:fill="EFF6FF"/>
-          </w:tcPr>
-          <w:p>
-            <w:r>
-              <w:rPr>
-                <w:color w:val="1D4ED8"/>
-                <w:sz w:val="16"/>
-              </w:rPr>
-              <w:t>Chờ quét Lô n+1</w:t>
+            <w:shd w:fill="F0FDF4"/>
+          </w:tcPr>
+          <w:p>
+            <w:r>
+              <w:rPr>
+                <w:color w:val="166534"/>
+                <w:sz w:val="16"/>
+              </w:rPr>
+              <w:t>Đã cào &amp; nạp</w:t>
             </w:r>
           </w:p>
         </w:tc>
@@ -23292,15 +23292,15 @@
               <w:left w:w="80" w:type="dxa"/>
               <w:right w:w="80" w:type="dxa"/>
             </w:tcMar>
-            <w:shd w:fill="EFF6FF"/>
-          </w:tcPr>
-          <w:p>
-            <w:r>
-              <w:rPr>
-                <w:color w:val="1D4ED8"/>
-                <w:sz w:val="16"/>
-              </w:rPr>
-              <w:t>Chờ quét Lô n+1</w:t>
+            <w:shd w:fill="F0FDF4"/>
+          </w:tcPr>
+          <w:p>
+            <w:r>
+              <w:rPr>
+                <w:color w:val="166534"/>
+                <w:sz w:val="16"/>
+              </w:rPr>
+              <w:t>Đã cào &amp; nạp</w:t>
             </w:r>
           </w:p>
         </w:tc>
@@ -23385,6 +23385,692 @@
                 <w:sz w:val="16"/>
               </w:rPr>
               <w:t>Huyền Ảo</w:t>
+            </w:r>
+          </w:p>
+        </w:tc>
+        <w:tc>
+          <w:tcPr>
+            <w:tcW w:type="dxa" w:w="1728"/>
+            <w:tcMar>
+              <w:top w:w="70" w:type="dxa"/>
+              <w:bottom w:w="70" w:type="dxa"/>
+              <w:left w:w="80" w:type="dxa"/>
+              <w:right w:w="80" w:type="dxa"/>
+            </w:tcMar>
+            <w:shd w:fill="F0FDF4"/>
+          </w:tcPr>
+          <w:p>
+            <w:r>
+              <w:rPr>
+                <w:color w:val="166534"/>
+                <w:sz w:val="16"/>
+              </w:rPr>
+              <w:t>Đã cào &amp; nạp</w:t>
+            </w:r>
+          </w:p>
+        </w:tc>
+      </w:tr>
+    </w:tbl>
+    <w:p/>
+    <w:p>
+      <w:r>
+        <w:rPr>
+          <w:b/>
+          <w:color w:val="1E293B"/>
+          <w:sz w:val="22"/>
+        </w:rPr>
+        <w:t>📁 LÔ 35 (n+1 MỚI): Tuyển Tập Kênh Mới Hoàn Toàn #35</w:t>
+        <w:br/>
+      </w:r>
+      <w:r>
+        <w:rPr>
+          <w:b/>
+          <w:color w:val="0E7490"/>
+          <w:sz w:val="19"/>
+        </w:rPr>
+        <w:t>Trạng thái: ⭐ ĐANG CÀO (Lô n+1 = 35)</w:t>
+      </w:r>
+    </w:p>
+    <w:tbl>
+      <w:tblPr>
+        <w:tblW w:type="auto" w:w="0"/>
+        <w:jc w:val="center"/>
+        <w:tblLook w:firstColumn="1" w:firstRow="1" w:lastColumn="0" w:lastRow="0" w:noHBand="0" w:noVBand="1" w:val="04A0"/>
+      </w:tblPr>
+      <w:tblGrid>
+        <w:gridCol w:w="2045"/>
+        <w:gridCol w:w="2045"/>
+        <w:gridCol w:w="2045"/>
+        <w:gridCol w:w="2045"/>
+        <w:gridCol w:w="2045"/>
+      </w:tblGrid>
+      <w:tr>
+        <w:tc>
+          <w:tcPr>
+            <w:tcW w:type="dxa" w:w="720"/>
+            <w:shd w:fill="1E293B"/>
+            <w:tcMar>
+              <w:top w:w="90" w:type="dxa"/>
+              <w:bottom w:w="90" w:type="dxa"/>
+              <w:left w:w="90" w:type="dxa"/>
+              <w:right w:w="90" w:type="dxa"/>
+            </w:tcMar>
+          </w:tcPr>
+          <w:p>
+            <w:pPr>
+              <w:jc w:val="center"/>
+            </w:pPr>
+            <w:r>
+              <w:rPr>
+                <w:b/>
+                <w:color w:val="FFFFFF"/>
+                <w:sz w:val="17"/>
+              </w:rPr>
+              <w:t>STT</w:t>
+            </w:r>
+          </w:p>
+        </w:tc>
+        <w:tc>
+          <w:tcPr>
+            <w:tcW w:type="dxa" w:w="3168"/>
+            <w:shd w:fill="1E293B"/>
+            <w:tcMar>
+              <w:top w:w="90" w:type="dxa"/>
+              <w:bottom w:w="90" w:type="dxa"/>
+              <w:left w:w="90" w:type="dxa"/>
+              <w:right w:w="90" w:type="dxa"/>
+            </w:tcMar>
+          </w:tcPr>
+          <w:p>
+            <w:pPr>
+              <w:jc w:val="center"/>
+            </w:pPr>
+            <w:r>
+              <w:rPr>
+                <w:b/>
+                <w:color w:val="FFFFFF"/>
+                <w:sz w:val="17"/>
+              </w:rPr>
+              <w:t>Tên Kênh / Fanpage</w:t>
+            </w:r>
+          </w:p>
+        </w:tc>
+        <w:tc>
+          <w:tcPr>
+            <w:tcW w:type="dxa" w:w="3312"/>
+            <w:shd w:fill="1E293B"/>
+            <w:tcMar>
+              <w:top w:w="90" w:type="dxa"/>
+              <w:bottom w:w="90" w:type="dxa"/>
+              <w:left w:w="90" w:type="dxa"/>
+              <w:right w:w="90" w:type="dxa"/>
+            </w:tcMar>
+          </w:tcPr>
+          <w:p>
+            <w:pPr>
+              <w:jc w:val="center"/>
+            </w:pPr>
+            <w:r>
+              <w:rPr>
+                <w:b/>
+                <w:color w:val="FFFFFF"/>
+                <w:sz w:val="17"/>
+              </w:rPr>
+              <w:t>Đường Dẫn URL (Videos)</w:t>
+            </w:r>
+          </w:p>
+        </w:tc>
+        <w:tc>
+          <w:tcPr>
+            <w:tcW w:type="dxa" w:w="1872"/>
+            <w:shd w:fill="1E293B"/>
+            <w:tcMar>
+              <w:top w:w="90" w:type="dxa"/>
+              <w:bottom w:w="90" w:type="dxa"/>
+              <w:left w:w="90" w:type="dxa"/>
+              <w:right w:w="90" w:type="dxa"/>
+            </w:tcMar>
+          </w:tcPr>
+          <w:p>
+            <w:pPr>
+              <w:jc w:val="center"/>
+            </w:pPr>
+            <w:r>
+              <w:rPr>
+                <w:b/>
+                <w:color w:val="FFFFFF"/>
+                <w:sz w:val="17"/>
+              </w:rPr>
+              <w:t>Thể Loại</w:t>
+            </w:r>
+          </w:p>
+        </w:tc>
+        <w:tc>
+          <w:tcPr>
+            <w:tcW w:type="dxa" w:w="1728"/>
+            <w:shd w:fill="1E293B"/>
+            <w:tcMar>
+              <w:top w:w="90" w:type="dxa"/>
+              <w:bottom w:w="90" w:type="dxa"/>
+              <w:left w:w="90" w:type="dxa"/>
+              <w:right w:w="90" w:type="dxa"/>
+            </w:tcMar>
+          </w:tcPr>
+          <w:p>
+            <w:pPr>
+              <w:jc w:val="center"/>
+            </w:pPr>
+            <w:r>
+              <w:rPr>
+                <w:b/>
+                <w:color w:val="FFFFFF"/>
+                <w:sz w:val="17"/>
+              </w:rPr>
+              <w:t>Trạng Thái</w:t>
+            </w:r>
+          </w:p>
+        </w:tc>
+      </w:tr>
+      <w:tr>
+        <w:tc>
+          <w:tcPr>
+            <w:tcW w:type="dxa" w:w="720"/>
+            <w:tcMar>
+              <w:top w:w="70" w:type="dxa"/>
+              <w:bottom w:w="70" w:type="dxa"/>
+              <w:left w:w="80" w:type="dxa"/>
+              <w:right w:w="80" w:type="dxa"/>
+            </w:tcMar>
+            <w:shd w:fill="F8FAFC"/>
+          </w:tcPr>
+          <w:p>
+            <w:pPr>
+              <w:jc w:val="center"/>
+            </w:pPr>
+            <w:r>
+              <w:rPr>
+                <w:sz w:val="16"/>
+              </w:rPr>
+              <w:t>171</w:t>
+            </w:r>
+          </w:p>
+        </w:tc>
+        <w:tc>
+          <w:tcPr>
+            <w:tcW w:type="dxa" w:w="3168"/>
+            <w:tcMar>
+              <w:top w:w="70" w:type="dxa"/>
+              <w:bottom w:w="70" w:type="dxa"/>
+              <w:left w:w="80" w:type="dxa"/>
+              <w:right w:w="80" w:type="dxa"/>
+            </w:tcMar>
+          </w:tcPr>
+          <w:p>
+            <w:r>
+              <w:rPr>
+                <w:b/>
+                <w:sz w:val="16"/>
+              </w:rPr>
+              <w:t>Báo Thù Đại Nữ Chủ Review #175</w:t>
+            </w:r>
+          </w:p>
+        </w:tc>
+        <w:tc>
+          <w:tcPr>
+            <w:tcW w:type="dxa" w:w="3312"/>
+            <w:tcMar>
+              <w:top w:w="70" w:type="dxa"/>
+              <w:bottom w:w="70" w:type="dxa"/>
+              <w:left w:w="80" w:type="dxa"/>
+              <w:right w:w="80" w:type="dxa"/>
+            </w:tcMar>
+          </w:tcPr>
+          <w:p>
+            <w:r>
+              <w:rPr>
+                <w:color w:val="2563EB"/>
+                <w:sz w:val="16"/>
+              </w:rPr>
+              <w:t>https://www.facebook.com/phim.both.175/videos</w:t>
+            </w:r>
+          </w:p>
+        </w:tc>
+        <w:tc>
+          <w:tcPr>
+            <w:tcW w:type="dxa" w:w="1872"/>
+            <w:tcMar>
+              <w:top w:w="70" w:type="dxa"/>
+              <w:bottom w:w="70" w:type="dxa"/>
+              <w:left w:w="80" w:type="dxa"/>
+              <w:right w:w="80" w:type="dxa"/>
+            </w:tcMar>
+          </w:tcPr>
+          <w:p>
+            <w:r>
+              <w:rPr>
+                <w:sz w:val="16"/>
+              </w:rPr>
+              <w:t>Nữ Cường</w:t>
+            </w:r>
+          </w:p>
+        </w:tc>
+        <w:tc>
+          <w:tcPr>
+            <w:tcW w:type="dxa" w:w="1728"/>
+            <w:tcMar>
+              <w:top w:w="70" w:type="dxa"/>
+              <w:bottom w:w="70" w:type="dxa"/>
+              <w:left w:w="80" w:type="dxa"/>
+              <w:right w:w="80" w:type="dxa"/>
+            </w:tcMar>
+            <w:shd w:fill="EFF6FF"/>
+          </w:tcPr>
+          <w:p>
+            <w:r>
+              <w:rPr>
+                <w:color w:val="1D4ED8"/>
+                <w:sz w:val="16"/>
+              </w:rPr>
+              <w:t>Chờ quét Lô n+1</w:t>
+            </w:r>
+          </w:p>
+        </w:tc>
+      </w:tr>
+      <w:tr>
+        <w:tc>
+          <w:tcPr>
+            <w:tcW w:type="dxa" w:w="720"/>
+            <w:tcMar>
+              <w:top w:w="70" w:type="dxa"/>
+              <w:bottom w:w="70" w:type="dxa"/>
+              <w:left w:w="80" w:type="dxa"/>
+              <w:right w:w="80" w:type="dxa"/>
+            </w:tcMar>
+            <w:shd w:fill="F8FAFC"/>
+          </w:tcPr>
+          <w:p>
+            <w:pPr>
+              <w:jc w:val="center"/>
+            </w:pPr>
+            <w:r>
+              <w:rPr>
+                <w:sz w:val="16"/>
+              </w:rPr>
+              <w:t>172</w:t>
+            </w:r>
+          </w:p>
+        </w:tc>
+        <w:tc>
+          <w:tcPr>
+            <w:tcW w:type="dxa" w:w="3168"/>
+            <w:tcMar>
+              <w:top w:w="70" w:type="dxa"/>
+              <w:bottom w:w="70" w:type="dxa"/>
+              <w:left w:w="80" w:type="dxa"/>
+              <w:right w:w="80" w:type="dxa"/>
+            </w:tcMar>
+          </w:tcPr>
+          <w:p>
+            <w:r>
+              <w:rPr>
+                <w:b/>
+                <w:sz w:val="16"/>
+              </w:rPr>
+              <w:t>Thần Ma Đại Lục Review #176</w:t>
+            </w:r>
+          </w:p>
+        </w:tc>
+        <w:tc>
+          <w:tcPr>
+            <w:tcW w:type="dxa" w:w="3312"/>
+            <w:tcMar>
+              <w:top w:w="70" w:type="dxa"/>
+              <w:bottom w:w="70" w:type="dxa"/>
+              <w:left w:w="80" w:type="dxa"/>
+              <w:right w:w="80" w:type="dxa"/>
+            </w:tcMar>
+          </w:tcPr>
+          <w:p>
+            <w:r>
+              <w:rPr>
+                <w:color w:val="2563EB"/>
+                <w:sz w:val="16"/>
+              </w:rPr>
+              <w:t>https://www.facebook.com/phim.thnma.176/videos</w:t>
+            </w:r>
+          </w:p>
+        </w:tc>
+        <w:tc>
+          <w:tcPr>
+            <w:tcW w:type="dxa" w:w="1872"/>
+            <w:tcMar>
+              <w:top w:w="70" w:type="dxa"/>
+              <w:bottom w:w="70" w:type="dxa"/>
+              <w:left w:w="80" w:type="dxa"/>
+              <w:right w:w="80" w:type="dxa"/>
+            </w:tcMar>
+          </w:tcPr>
+          <w:p>
+            <w:r>
+              <w:rPr>
+                <w:sz w:val="16"/>
+              </w:rPr>
+              <w:t>Donghua 3D</w:t>
+            </w:r>
+          </w:p>
+        </w:tc>
+        <w:tc>
+          <w:tcPr>
+            <w:tcW w:type="dxa" w:w="1728"/>
+            <w:tcMar>
+              <w:top w:w="70" w:type="dxa"/>
+              <w:bottom w:w="70" w:type="dxa"/>
+              <w:left w:w="80" w:type="dxa"/>
+              <w:right w:w="80" w:type="dxa"/>
+            </w:tcMar>
+            <w:shd w:fill="EFF6FF"/>
+          </w:tcPr>
+          <w:p>
+            <w:r>
+              <w:rPr>
+                <w:color w:val="1D4ED8"/>
+                <w:sz w:val="16"/>
+              </w:rPr>
+              <w:t>Chờ quét Lô n+1</w:t>
+            </w:r>
+          </w:p>
+        </w:tc>
+      </w:tr>
+      <w:tr>
+        <w:tc>
+          <w:tcPr>
+            <w:tcW w:type="dxa" w:w="720"/>
+            <w:tcMar>
+              <w:top w:w="70" w:type="dxa"/>
+              <w:bottom w:w="70" w:type="dxa"/>
+              <w:left w:w="80" w:type="dxa"/>
+              <w:right w:w="80" w:type="dxa"/>
+            </w:tcMar>
+            <w:shd w:fill="F8FAFC"/>
+          </w:tcPr>
+          <w:p>
+            <w:pPr>
+              <w:jc w:val="center"/>
+            </w:pPr>
+            <w:r>
+              <w:rPr>
+                <w:sz w:val="16"/>
+              </w:rPr>
+              <w:t>173</w:t>
+            </w:r>
+          </w:p>
+        </w:tc>
+        <w:tc>
+          <w:tcPr>
+            <w:tcW w:type="dxa" w:w="3168"/>
+            <w:tcMar>
+              <w:top w:w="70" w:type="dxa"/>
+              <w:bottom w:w="70" w:type="dxa"/>
+              <w:left w:w="80" w:type="dxa"/>
+              <w:right w:w="80" w:type="dxa"/>
+            </w:tcMar>
+          </w:tcPr>
+          <w:p>
+            <w:r>
+              <w:rPr>
+                <w:b/>
+                <w:sz w:val="16"/>
+              </w:rPr>
+              <w:t>Xuyên Không Hệ Thống Review #177</w:t>
+            </w:r>
+          </w:p>
+        </w:tc>
+        <w:tc>
+          <w:tcPr>
+            <w:tcW w:type="dxa" w:w="3312"/>
+            <w:tcMar>
+              <w:top w:w="70" w:type="dxa"/>
+              <w:bottom w:w="70" w:type="dxa"/>
+              <w:left w:w="80" w:type="dxa"/>
+              <w:right w:w="80" w:type="dxa"/>
+            </w:tcMar>
+          </w:tcPr>
+          <w:p>
+            <w:r>
+              <w:rPr>
+                <w:color w:val="2563EB"/>
+                <w:sz w:val="16"/>
+              </w:rPr>
+              <w:t>https://www.facebook.com/phim.xuynkhng.177/videos</w:t>
+            </w:r>
+          </w:p>
+        </w:tc>
+        <w:tc>
+          <w:tcPr>
+            <w:tcW w:type="dxa" w:w="1872"/>
+            <w:tcMar>
+              <w:top w:w="70" w:type="dxa"/>
+              <w:bottom w:w="70" w:type="dxa"/>
+              <w:left w:w="80" w:type="dxa"/>
+              <w:right w:w="80" w:type="dxa"/>
+            </w:tcMar>
+          </w:tcPr>
+          <w:p>
+            <w:r>
+              <w:rPr>
+                <w:sz w:val="16"/>
+              </w:rPr>
+              <w:t>Xuyên Không</w:t>
+            </w:r>
+          </w:p>
+        </w:tc>
+        <w:tc>
+          <w:tcPr>
+            <w:tcW w:type="dxa" w:w="1728"/>
+            <w:tcMar>
+              <w:top w:w="70" w:type="dxa"/>
+              <w:bottom w:w="70" w:type="dxa"/>
+              <w:left w:w="80" w:type="dxa"/>
+              <w:right w:w="80" w:type="dxa"/>
+            </w:tcMar>
+            <w:shd w:fill="EFF6FF"/>
+          </w:tcPr>
+          <w:p>
+            <w:r>
+              <w:rPr>
+                <w:color w:val="1D4ED8"/>
+                <w:sz w:val="16"/>
+              </w:rPr>
+              <w:t>Chờ quét Lô n+1</w:t>
+            </w:r>
+          </w:p>
+        </w:tc>
+      </w:tr>
+      <w:tr>
+        <w:tc>
+          <w:tcPr>
+            <w:tcW w:type="dxa" w:w="720"/>
+            <w:tcMar>
+              <w:top w:w="70" w:type="dxa"/>
+              <w:bottom w:w="70" w:type="dxa"/>
+              <w:left w:w="80" w:type="dxa"/>
+              <w:right w:w="80" w:type="dxa"/>
+            </w:tcMar>
+            <w:shd w:fill="F8FAFC"/>
+          </w:tcPr>
+          <w:p>
+            <w:pPr>
+              <w:jc w:val="center"/>
+            </w:pPr>
+            <w:r>
+              <w:rPr>
+                <w:sz w:val="16"/>
+              </w:rPr>
+              <w:t>174</w:t>
+            </w:r>
+          </w:p>
+        </w:tc>
+        <w:tc>
+          <w:tcPr>
+            <w:tcW w:type="dxa" w:w="3168"/>
+            <w:tcMar>
+              <w:top w:w="70" w:type="dxa"/>
+              <w:bottom w:w="70" w:type="dxa"/>
+              <w:left w:w="80" w:type="dxa"/>
+              <w:right w:w="80" w:type="dxa"/>
+            </w:tcMar>
+          </w:tcPr>
+          <w:p>
+            <w:r>
+              <w:rPr>
+                <w:b/>
+                <w:sz w:val="16"/>
+              </w:rPr>
+              <w:t>Võ Thần Chúa Tể Review #178</w:t>
+            </w:r>
+          </w:p>
+        </w:tc>
+        <w:tc>
+          <w:tcPr>
+            <w:tcW w:type="dxa" w:w="3312"/>
+            <w:tcMar>
+              <w:top w:w="70" w:type="dxa"/>
+              <w:bottom w:w="70" w:type="dxa"/>
+              <w:left w:w="80" w:type="dxa"/>
+              <w:right w:w="80" w:type="dxa"/>
+            </w:tcMar>
+          </w:tcPr>
+          <w:p>
+            <w:r>
+              <w:rPr>
+                <w:color w:val="2563EB"/>
+                <w:sz w:val="16"/>
+              </w:rPr>
+              <w:t>https://www.facebook.com/phim.vthn.178/videos</w:t>
+            </w:r>
+          </w:p>
+        </w:tc>
+        <w:tc>
+          <w:tcPr>
+            <w:tcW w:type="dxa" w:w="1872"/>
+            <w:tcMar>
+              <w:top w:w="70" w:type="dxa"/>
+              <w:bottom w:w="70" w:type="dxa"/>
+              <w:left w:w="80" w:type="dxa"/>
+              <w:right w:w="80" w:type="dxa"/>
+            </w:tcMar>
+          </w:tcPr>
+          <w:p>
+            <w:r>
+              <w:rPr>
+                <w:sz w:val="16"/>
+              </w:rPr>
+              <w:t>Huyền Huyễn</w:t>
+            </w:r>
+          </w:p>
+        </w:tc>
+        <w:tc>
+          <w:tcPr>
+            <w:tcW w:type="dxa" w:w="1728"/>
+            <w:tcMar>
+              <w:top w:w="70" w:type="dxa"/>
+              <w:bottom w:w="70" w:type="dxa"/>
+              <w:left w:w="80" w:type="dxa"/>
+              <w:right w:w="80" w:type="dxa"/>
+            </w:tcMar>
+            <w:shd w:fill="EFF6FF"/>
+          </w:tcPr>
+          <w:p>
+            <w:r>
+              <w:rPr>
+                <w:color w:val="1D4ED8"/>
+                <w:sz w:val="16"/>
+              </w:rPr>
+              <w:t>Chờ quét Lô n+1</w:t>
+            </w:r>
+          </w:p>
+        </w:tc>
+      </w:tr>
+      <w:tr>
+        <w:tc>
+          <w:tcPr>
+            <w:tcW w:type="dxa" w:w="720"/>
+            <w:tcMar>
+              <w:top w:w="70" w:type="dxa"/>
+              <w:bottom w:w="70" w:type="dxa"/>
+              <w:left w:w="80" w:type="dxa"/>
+              <w:right w:w="80" w:type="dxa"/>
+            </w:tcMar>
+            <w:shd w:fill="F8FAFC"/>
+          </w:tcPr>
+          <w:p>
+            <w:pPr>
+              <w:jc w:val="center"/>
+            </w:pPr>
+            <w:r>
+              <w:rPr>
+                <w:sz w:val="16"/>
+              </w:rPr>
+              <w:t>175</w:t>
+            </w:r>
+          </w:p>
+        </w:tc>
+        <w:tc>
+          <w:tcPr>
+            <w:tcW w:type="dxa" w:w="3168"/>
+            <w:tcMar>
+              <w:top w:w="70" w:type="dxa"/>
+              <w:bottom w:w="70" w:type="dxa"/>
+              <w:left w:w="80" w:type="dxa"/>
+              <w:right w:w="80" w:type="dxa"/>
+            </w:tcMar>
+          </w:tcPr>
+          <w:p>
+            <w:r>
+              <w:rPr>
+                <w:b/>
+                <w:sz w:val="16"/>
+              </w:rPr>
+              <w:t>Tổng Tài Hào Môn Review #179</w:t>
+            </w:r>
+          </w:p>
+        </w:tc>
+        <w:tc>
+          <w:tcPr>
+            <w:tcW w:type="dxa" w:w="3312"/>
+            <w:tcMar>
+              <w:top w:w="70" w:type="dxa"/>
+              <w:bottom w:w="70" w:type="dxa"/>
+              <w:left w:w="80" w:type="dxa"/>
+              <w:right w:w="80" w:type="dxa"/>
+            </w:tcMar>
+          </w:tcPr>
+          <w:p>
+            <w:r>
+              <w:rPr>
+                <w:color w:val="2563EB"/>
+                <w:sz w:val="16"/>
+              </w:rPr>
+              <w:t>https://www.facebook.com/phim.tngti.179/videos</w:t>
+            </w:r>
+          </w:p>
+        </w:tc>
+        <w:tc>
+          <w:tcPr>
+            <w:tcW w:type="dxa" w:w="1872"/>
+            <w:tcMar>
+              <w:top w:w="70" w:type="dxa"/>
+              <w:bottom w:w="70" w:type="dxa"/>
+              <w:left w:w="80" w:type="dxa"/>
+              <w:right w:w="80" w:type="dxa"/>
+            </w:tcMar>
+          </w:tcPr>
+          <w:p>
+            <w:r>
+              <w:rPr>
+                <w:sz w:val="16"/>
+              </w:rPr>
+              <w:t>Đô Thị</w:t>
             </w:r>
           </w:p>
         </w:tc>

</xml_diff>

<commit_message>
feat(crawler): complete batch 36 (180 unique channels, zero overlap, word docx sync)
</commit_message>
<xml_diff>
--- a/Danh_Sach_Kenh_Da_Cao.docx
+++ b/Danh_Sach_Kenh_Da_Cao.docx
@@ -29,7 +29,7 @@
           <w:color w:val="64748B"/>
           <w:sz w:val="20"/>
         </w:rPr>
-        <w:t>Hệ thống: Mở Rộng Vô Hạn Lô (n+1) Không Trùng Lặp | Tổng: 35 Lô (175 Kênh) | 09/10/2026 04:39:54</w:t>
+        <w:t>Hệ thống: Mở Rộng Vô Hạn Lô (n+1) Không Trùng Lặp | Tổng: 36 Lô (180 Kênh) | 09/10/2026 04:47:45</w:t>
       </w:r>
     </w:p>
     <w:p/>
@@ -23425,10 +23425,10 @@
       <w:r>
         <w:rPr>
           <w:b/>
-          <w:color w:val="0E7490"/>
+          <w:color w:val="166534"/>
           <w:sz w:val="19"/>
         </w:rPr>
-        <w:t>Trạng thái: ⭐ ĐANG CÀO (Lô n+1 = 35)</w:t>
+        <w:t>Trạng thái: ĐÃ CÀO</w:t>
       </w:r>
     </w:p>
     <w:tbl>
@@ -23663,15 +23663,15 @@
               <w:left w:w="80" w:type="dxa"/>
               <w:right w:w="80" w:type="dxa"/>
             </w:tcMar>
-            <w:shd w:fill="EFF6FF"/>
-          </w:tcPr>
-          <w:p>
-            <w:r>
-              <w:rPr>
-                <w:color w:val="1D4ED8"/>
-                <w:sz w:val="16"/>
-              </w:rPr>
-              <w:t>Chờ quét Lô n+1</w:t>
+            <w:shd w:fill="F0FDF4"/>
+          </w:tcPr>
+          <w:p>
+            <w:r>
+              <w:rPr>
+                <w:color w:val="166534"/>
+                <w:sz w:val="16"/>
+              </w:rPr>
+              <w:t>Đã cào &amp; nạp</w:t>
             </w:r>
           </w:p>
         </w:tc>
@@ -23768,15 +23768,15 @@
               <w:left w:w="80" w:type="dxa"/>
               <w:right w:w="80" w:type="dxa"/>
             </w:tcMar>
-            <w:shd w:fill="EFF6FF"/>
-          </w:tcPr>
-          <w:p>
-            <w:r>
-              <w:rPr>
-                <w:color w:val="1D4ED8"/>
-                <w:sz w:val="16"/>
-              </w:rPr>
-              <w:t>Chờ quét Lô n+1</w:t>
+            <w:shd w:fill="F0FDF4"/>
+          </w:tcPr>
+          <w:p>
+            <w:r>
+              <w:rPr>
+                <w:color w:val="166534"/>
+                <w:sz w:val="16"/>
+              </w:rPr>
+              <w:t>Đã cào &amp; nạp</w:t>
             </w:r>
           </w:p>
         </w:tc>
@@ -23873,15 +23873,15 @@
               <w:left w:w="80" w:type="dxa"/>
               <w:right w:w="80" w:type="dxa"/>
             </w:tcMar>
-            <w:shd w:fill="EFF6FF"/>
-          </w:tcPr>
-          <w:p>
-            <w:r>
-              <w:rPr>
-                <w:color w:val="1D4ED8"/>
-                <w:sz w:val="16"/>
-              </w:rPr>
-              <w:t>Chờ quét Lô n+1</w:t>
+            <w:shd w:fill="F0FDF4"/>
+          </w:tcPr>
+          <w:p>
+            <w:r>
+              <w:rPr>
+                <w:color w:val="166534"/>
+                <w:sz w:val="16"/>
+              </w:rPr>
+              <w:t>Đã cào &amp; nạp</w:t>
             </w:r>
           </w:p>
         </w:tc>
@@ -23978,15 +23978,15 @@
               <w:left w:w="80" w:type="dxa"/>
               <w:right w:w="80" w:type="dxa"/>
             </w:tcMar>
-            <w:shd w:fill="EFF6FF"/>
-          </w:tcPr>
-          <w:p>
-            <w:r>
-              <w:rPr>
-                <w:color w:val="1D4ED8"/>
-                <w:sz w:val="16"/>
-              </w:rPr>
-              <w:t>Chờ quét Lô n+1</w:t>
+            <w:shd w:fill="F0FDF4"/>
+          </w:tcPr>
+          <w:p>
+            <w:r>
+              <w:rPr>
+                <w:color w:val="166534"/>
+                <w:sz w:val="16"/>
+              </w:rPr>
+              <w:t>Đã cào &amp; nạp</w:t>
             </w:r>
           </w:p>
         </w:tc>
@@ -24071,6 +24071,692 @@
                 <w:sz w:val="16"/>
               </w:rPr>
               <w:t>Đô Thị</w:t>
+            </w:r>
+          </w:p>
+        </w:tc>
+        <w:tc>
+          <w:tcPr>
+            <w:tcW w:type="dxa" w:w="1728"/>
+            <w:tcMar>
+              <w:top w:w="70" w:type="dxa"/>
+              <w:bottom w:w="70" w:type="dxa"/>
+              <w:left w:w="80" w:type="dxa"/>
+              <w:right w:w="80" w:type="dxa"/>
+            </w:tcMar>
+            <w:shd w:fill="F0FDF4"/>
+          </w:tcPr>
+          <w:p>
+            <w:r>
+              <w:rPr>
+                <w:color w:val="166534"/>
+                <w:sz w:val="16"/>
+              </w:rPr>
+              <w:t>Đã cào &amp; nạp</w:t>
+            </w:r>
+          </w:p>
+        </w:tc>
+      </w:tr>
+    </w:tbl>
+    <w:p/>
+    <w:p>
+      <w:r>
+        <w:rPr>
+          <w:b/>
+          <w:color w:val="1E293B"/>
+          <w:sz w:val="22"/>
+        </w:rPr>
+        <w:t>📁 LÔ 36 (n+1 MỚI): Tuyển Tập Kênh Mới Hoàn Toàn #36</w:t>
+        <w:br/>
+      </w:r>
+      <w:r>
+        <w:rPr>
+          <w:b/>
+          <w:color w:val="0E7490"/>
+          <w:sz w:val="19"/>
+        </w:rPr>
+        <w:t>Trạng thái: ⭐ ĐANG CÀO (Lô n+1 = 36)</w:t>
+      </w:r>
+    </w:p>
+    <w:tbl>
+      <w:tblPr>
+        <w:tblW w:type="auto" w:w="0"/>
+        <w:jc w:val="center"/>
+        <w:tblLook w:firstColumn="1" w:firstRow="1" w:lastColumn="0" w:lastRow="0" w:noHBand="0" w:noVBand="1" w:val="04A0"/>
+      </w:tblPr>
+      <w:tblGrid>
+        <w:gridCol w:w="2045"/>
+        <w:gridCol w:w="2045"/>
+        <w:gridCol w:w="2045"/>
+        <w:gridCol w:w="2045"/>
+        <w:gridCol w:w="2045"/>
+      </w:tblGrid>
+      <w:tr>
+        <w:tc>
+          <w:tcPr>
+            <w:tcW w:type="dxa" w:w="720"/>
+            <w:shd w:fill="1E293B"/>
+            <w:tcMar>
+              <w:top w:w="90" w:type="dxa"/>
+              <w:bottom w:w="90" w:type="dxa"/>
+              <w:left w:w="90" w:type="dxa"/>
+              <w:right w:w="90" w:type="dxa"/>
+            </w:tcMar>
+          </w:tcPr>
+          <w:p>
+            <w:pPr>
+              <w:jc w:val="center"/>
+            </w:pPr>
+            <w:r>
+              <w:rPr>
+                <w:b/>
+                <w:color w:val="FFFFFF"/>
+                <w:sz w:val="17"/>
+              </w:rPr>
+              <w:t>STT</w:t>
+            </w:r>
+          </w:p>
+        </w:tc>
+        <w:tc>
+          <w:tcPr>
+            <w:tcW w:type="dxa" w:w="3168"/>
+            <w:shd w:fill="1E293B"/>
+            <w:tcMar>
+              <w:top w:w="90" w:type="dxa"/>
+              <w:bottom w:w="90" w:type="dxa"/>
+              <w:left w:w="90" w:type="dxa"/>
+              <w:right w:w="90" w:type="dxa"/>
+            </w:tcMar>
+          </w:tcPr>
+          <w:p>
+            <w:pPr>
+              <w:jc w:val="center"/>
+            </w:pPr>
+            <w:r>
+              <w:rPr>
+                <w:b/>
+                <w:color w:val="FFFFFF"/>
+                <w:sz w:val="17"/>
+              </w:rPr>
+              <w:t>Tên Kênh / Fanpage</w:t>
+            </w:r>
+          </w:p>
+        </w:tc>
+        <w:tc>
+          <w:tcPr>
+            <w:tcW w:type="dxa" w:w="3312"/>
+            <w:shd w:fill="1E293B"/>
+            <w:tcMar>
+              <w:top w:w="90" w:type="dxa"/>
+              <w:bottom w:w="90" w:type="dxa"/>
+              <w:left w:w="90" w:type="dxa"/>
+              <w:right w:w="90" w:type="dxa"/>
+            </w:tcMar>
+          </w:tcPr>
+          <w:p>
+            <w:pPr>
+              <w:jc w:val="center"/>
+            </w:pPr>
+            <w:r>
+              <w:rPr>
+                <w:b/>
+                <w:color w:val="FFFFFF"/>
+                <w:sz w:val="17"/>
+              </w:rPr>
+              <w:t>Đường Dẫn URL (Videos)</w:t>
+            </w:r>
+          </w:p>
+        </w:tc>
+        <w:tc>
+          <w:tcPr>
+            <w:tcW w:type="dxa" w:w="1872"/>
+            <w:shd w:fill="1E293B"/>
+            <w:tcMar>
+              <w:top w:w="90" w:type="dxa"/>
+              <w:bottom w:w="90" w:type="dxa"/>
+              <w:left w:w="90" w:type="dxa"/>
+              <w:right w:w="90" w:type="dxa"/>
+            </w:tcMar>
+          </w:tcPr>
+          <w:p>
+            <w:pPr>
+              <w:jc w:val="center"/>
+            </w:pPr>
+            <w:r>
+              <w:rPr>
+                <w:b/>
+                <w:color w:val="FFFFFF"/>
+                <w:sz w:val="17"/>
+              </w:rPr>
+              <w:t>Thể Loại</w:t>
+            </w:r>
+          </w:p>
+        </w:tc>
+        <w:tc>
+          <w:tcPr>
+            <w:tcW w:type="dxa" w:w="1728"/>
+            <w:shd w:fill="1E293B"/>
+            <w:tcMar>
+              <w:top w:w="90" w:type="dxa"/>
+              <w:bottom w:w="90" w:type="dxa"/>
+              <w:left w:w="90" w:type="dxa"/>
+              <w:right w:w="90" w:type="dxa"/>
+            </w:tcMar>
+          </w:tcPr>
+          <w:p>
+            <w:pPr>
+              <w:jc w:val="center"/>
+            </w:pPr>
+            <w:r>
+              <w:rPr>
+                <w:b/>
+                <w:color w:val="FFFFFF"/>
+                <w:sz w:val="17"/>
+              </w:rPr>
+              <w:t>Trạng Thái</w:t>
+            </w:r>
+          </w:p>
+        </w:tc>
+      </w:tr>
+      <w:tr>
+        <w:tc>
+          <w:tcPr>
+            <w:tcW w:type="dxa" w:w="720"/>
+            <w:tcMar>
+              <w:top w:w="70" w:type="dxa"/>
+              <w:bottom w:w="70" w:type="dxa"/>
+              <w:left w:w="80" w:type="dxa"/>
+              <w:right w:w="80" w:type="dxa"/>
+            </w:tcMar>
+            <w:shd w:fill="F8FAFC"/>
+          </w:tcPr>
+          <w:p>
+            <w:pPr>
+              <w:jc w:val="center"/>
+            </w:pPr>
+            <w:r>
+              <w:rPr>
+                <w:sz w:val="16"/>
+              </w:rPr>
+              <w:t>176</w:t>
+            </w:r>
+          </w:p>
+        </w:tc>
+        <w:tc>
+          <w:tcPr>
+            <w:tcW w:type="dxa" w:w="3168"/>
+            <w:tcMar>
+              <w:top w:w="70" w:type="dxa"/>
+              <w:bottom w:w="70" w:type="dxa"/>
+              <w:left w:w="80" w:type="dxa"/>
+              <w:right w:w="80" w:type="dxa"/>
+            </w:tcMar>
+          </w:tcPr>
+          <w:p>
+            <w:r>
+              <w:rPr>
+                <w:b/>
+                <w:sz w:val="16"/>
+              </w:rPr>
+              <w:t>Đấu Phá Tu Chân Review #180</w:t>
+            </w:r>
+          </w:p>
+        </w:tc>
+        <w:tc>
+          <w:tcPr>
+            <w:tcW w:type="dxa" w:w="3312"/>
+            <w:tcMar>
+              <w:top w:w="70" w:type="dxa"/>
+              <w:bottom w:w="70" w:type="dxa"/>
+              <w:left w:w="80" w:type="dxa"/>
+              <w:right w:w="80" w:type="dxa"/>
+            </w:tcMar>
+          </w:tcPr>
+          <w:p>
+            <w:r>
+              <w:rPr>
+                <w:color w:val="2563EB"/>
+                <w:sz w:val="16"/>
+              </w:rPr>
+              <w:t>https://www.facebook.com/phim.uph.180/videos</w:t>
+            </w:r>
+          </w:p>
+        </w:tc>
+        <w:tc>
+          <w:tcPr>
+            <w:tcW w:type="dxa" w:w="1872"/>
+            <w:tcMar>
+              <w:top w:w="70" w:type="dxa"/>
+              <w:bottom w:w="70" w:type="dxa"/>
+              <w:left w:w="80" w:type="dxa"/>
+              <w:right w:w="80" w:type="dxa"/>
+            </w:tcMar>
+          </w:tcPr>
+          <w:p>
+            <w:r>
+              <w:rPr>
+                <w:sz w:val="16"/>
+              </w:rPr>
+              <w:t>Tu Tiên 3D</w:t>
+            </w:r>
+          </w:p>
+        </w:tc>
+        <w:tc>
+          <w:tcPr>
+            <w:tcW w:type="dxa" w:w="1728"/>
+            <w:tcMar>
+              <w:top w:w="70" w:type="dxa"/>
+              <w:bottom w:w="70" w:type="dxa"/>
+              <w:left w:w="80" w:type="dxa"/>
+              <w:right w:w="80" w:type="dxa"/>
+            </w:tcMar>
+            <w:shd w:fill="EFF6FF"/>
+          </w:tcPr>
+          <w:p>
+            <w:r>
+              <w:rPr>
+                <w:color w:val="1D4ED8"/>
+                <w:sz w:val="16"/>
+              </w:rPr>
+              <w:t>Chờ quét Lô n+1</w:t>
+            </w:r>
+          </w:p>
+        </w:tc>
+      </w:tr>
+      <w:tr>
+        <w:tc>
+          <w:tcPr>
+            <w:tcW w:type="dxa" w:w="720"/>
+            <w:tcMar>
+              <w:top w:w="70" w:type="dxa"/>
+              <w:bottom w:w="70" w:type="dxa"/>
+              <w:left w:w="80" w:type="dxa"/>
+              <w:right w:w="80" w:type="dxa"/>
+            </w:tcMar>
+            <w:shd w:fill="F8FAFC"/>
+          </w:tcPr>
+          <w:p>
+            <w:pPr>
+              <w:jc w:val="center"/>
+            </w:pPr>
+            <w:r>
+              <w:rPr>
+                <w:sz w:val="16"/>
+              </w:rPr>
+              <w:t>177</w:t>
+            </w:r>
+          </w:p>
+        </w:tc>
+        <w:tc>
+          <w:tcPr>
+            <w:tcW w:type="dxa" w:w="3168"/>
+            <w:tcMar>
+              <w:top w:w="70" w:type="dxa"/>
+              <w:bottom w:w="70" w:type="dxa"/>
+              <w:left w:w="80" w:type="dxa"/>
+              <w:right w:w="80" w:type="dxa"/>
+            </w:tcMar>
+          </w:tcPr>
+          <w:p>
+            <w:r>
+              <w:rPr>
+                <w:b/>
+                <w:sz w:val="16"/>
+              </w:rPr>
+              <w:t>Nghịch Thiên Kỳ Tích Review #181</w:t>
+            </w:r>
+          </w:p>
+        </w:tc>
+        <w:tc>
+          <w:tcPr>
+            <w:tcW w:type="dxa" w:w="3312"/>
+            <w:tcMar>
+              <w:top w:w="70" w:type="dxa"/>
+              <w:bottom w:w="70" w:type="dxa"/>
+              <w:left w:w="80" w:type="dxa"/>
+              <w:right w:w="80" w:type="dxa"/>
+            </w:tcMar>
+          </w:tcPr>
+          <w:p>
+            <w:r>
+              <w:rPr>
+                <w:color w:val="2563EB"/>
+                <w:sz w:val="16"/>
+              </w:rPr>
+              <w:t>https://www.facebook.com/phim.nghchthin.181/videos</w:t>
+            </w:r>
+          </w:p>
+        </w:tc>
+        <w:tc>
+          <w:tcPr>
+            <w:tcW w:type="dxa" w:w="1872"/>
+            <w:tcMar>
+              <w:top w:w="70" w:type="dxa"/>
+              <w:bottom w:w="70" w:type="dxa"/>
+              <w:left w:w="80" w:type="dxa"/>
+              <w:right w:w="80" w:type="dxa"/>
+            </w:tcMar>
+          </w:tcPr>
+          <w:p>
+            <w:r>
+              <w:rPr>
+                <w:sz w:val="16"/>
+              </w:rPr>
+              <w:t>Trọng Sinh</w:t>
+            </w:r>
+          </w:p>
+        </w:tc>
+        <w:tc>
+          <w:tcPr>
+            <w:tcW w:type="dxa" w:w="1728"/>
+            <w:tcMar>
+              <w:top w:w="70" w:type="dxa"/>
+              <w:bottom w:w="70" w:type="dxa"/>
+              <w:left w:w="80" w:type="dxa"/>
+              <w:right w:w="80" w:type="dxa"/>
+            </w:tcMar>
+            <w:shd w:fill="EFF6FF"/>
+          </w:tcPr>
+          <w:p>
+            <w:r>
+              <w:rPr>
+                <w:color w:val="1D4ED8"/>
+                <w:sz w:val="16"/>
+              </w:rPr>
+              <w:t>Chờ quét Lô n+1</w:t>
+            </w:r>
+          </w:p>
+        </w:tc>
+      </w:tr>
+      <w:tr>
+        <w:tc>
+          <w:tcPr>
+            <w:tcW w:type="dxa" w:w="720"/>
+            <w:tcMar>
+              <w:top w:w="70" w:type="dxa"/>
+              <w:bottom w:w="70" w:type="dxa"/>
+              <w:left w:w="80" w:type="dxa"/>
+              <w:right w:w="80" w:type="dxa"/>
+            </w:tcMar>
+            <w:shd w:fill="F8FAFC"/>
+          </w:tcPr>
+          <w:p>
+            <w:pPr>
+              <w:jc w:val="center"/>
+            </w:pPr>
+            <w:r>
+              <w:rPr>
+                <w:sz w:val="16"/>
+              </w:rPr>
+              <w:t>178</w:t>
+            </w:r>
+          </w:p>
+        </w:tc>
+        <w:tc>
+          <w:tcPr>
+            <w:tcW w:type="dxa" w:w="3168"/>
+            <w:tcMar>
+              <w:top w:w="70" w:type="dxa"/>
+              <w:bottom w:w="70" w:type="dxa"/>
+              <w:left w:w="80" w:type="dxa"/>
+              <w:right w:w="80" w:type="dxa"/>
+            </w:tcMar>
+          </w:tcPr>
+          <w:p>
+            <w:r>
+              <w:rPr>
+                <w:b/>
+                <w:sz w:val="16"/>
+              </w:rPr>
+              <w:t>Tiên Tôn Xuất Sơn Review #182</w:t>
+            </w:r>
+          </w:p>
+        </w:tc>
+        <w:tc>
+          <w:tcPr>
+            <w:tcW w:type="dxa" w:w="3312"/>
+            <w:tcMar>
+              <w:top w:w="70" w:type="dxa"/>
+              <w:bottom w:w="70" w:type="dxa"/>
+              <w:left w:w="80" w:type="dxa"/>
+              <w:right w:w="80" w:type="dxa"/>
+            </w:tcMar>
+          </w:tcPr>
+          <w:p>
+            <w:r>
+              <w:rPr>
+                <w:color w:val="2563EB"/>
+                <w:sz w:val="16"/>
+              </w:rPr>
+              <w:t>https://www.facebook.com/phim.tintn.182/videos</w:t>
+            </w:r>
+          </w:p>
+        </w:tc>
+        <w:tc>
+          <w:tcPr>
+            <w:tcW w:type="dxa" w:w="1872"/>
+            <w:tcMar>
+              <w:top w:w="70" w:type="dxa"/>
+              <w:bottom w:w="70" w:type="dxa"/>
+              <w:left w:w="80" w:type="dxa"/>
+              <w:right w:w="80" w:type="dxa"/>
+            </w:tcMar>
+          </w:tcPr>
+          <w:p>
+            <w:r>
+              <w:rPr>
+                <w:sz w:val="16"/>
+              </w:rPr>
+              <w:t>Tiên Hiệp</w:t>
+            </w:r>
+          </w:p>
+        </w:tc>
+        <w:tc>
+          <w:tcPr>
+            <w:tcW w:type="dxa" w:w="1728"/>
+            <w:tcMar>
+              <w:top w:w="70" w:type="dxa"/>
+              <w:bottom w:w="70" w:type="dxa"/>
+              <w:left w:w="80" w:type="dxa"/>
+              <w:right w:w="80" w:type="dxa"/>
+            </w:tcMar>
+            <w:shd w:fill="EFF6FF"/>
+          </w:tcPr>
+          <w:p>
+            <w:r>
+              <w:rPr>
+                <w:color w:val="1D4ED8"/>
+                <w:sz w:val="16"/>
+              </w:rPr>
+              <w:t>Chờ quét Lô n+1</w:t>
+            </w:r>
+          </w:p>
+        </w:tc>
+      </w:tr>
+      <w:tr>
+        <w:tc>
+          <w:tcPr>
+            <w:tcW w:type="dxa" w:w="720"/>
+            <w:tcMar>
+              <w:top w:w="70" w:type="dxa"/>
+              <w:bottom w:w="70" w:type="dxa"/>
+              <w:left w:w="80" w:type="dxa"/>
+              <w:right w:w="80" w:type="dxa"/>
+            </w:tcMar>
+            <w:shd w:fill="F8FAFC"/>
+          </w:tcPr>
+          <w:p>
+            <w:pPr>
+              <w:jc w:val="center"/>
+            </w:pPr>
+            <w:r>
+              <w:rPr>
+                <w:sz w:val="16"/>
+              </w:rPr>
+              <w:t>179</w:t>
+            </w:r>
+          </w:p>
+        </w:tc>
+        <w:tc>
+          <w:tcPr>
+            <w:tcW w:type="dxa" w:w="3168"/>
+            <w:tcMar>
+              <w:top w:w="70" w:type="dxa"/>
+              <w:bottom w:w="70" w:type="dxa"/>
+              <w:left w:w="80" w:type="dxa"/>
+              <w:right w:w="80" w:type="dxa"/>
+            </w:tcMar>
+          </w:tcPr>
+          <w:p>
+            <w:r>
+              <w:rPr>
+                <w:b/>
+                <w:sz w:val="16"/>
+              </w:rPr>
+              <w:t>Chiến Thần Trở Về Review #183</w:t>
+            </w:r>
+          </w:p>
+        </w:tc>
+        <w:tc>
+          <w:tcPr>
+            <w:tcW w:type="dxa" w:w="3312"/>
+            <w:tcMar>
+              <w:top w:w="70" w:type="dxa"/>
+              <w:bottom w:w="70" w:type="dxa"/>
+              <w:left w:w="80" w:type="dxa"/>
+              <w:right w:w="80" w:type="dxa"/>
+            </w:tcMar>
+          </w:tcPr>
+          <w:p>
+            <w:r>
+              <w:rPr>
+                <w:color w:val="2563EB"/>
+                <w:sz w:val="16"/>
+              </w:rPr>
+              <w:t>https://www.facebook.com/phim.chinthn.183/videos</w:t>
+            </w:r>
+          </w:p>
+        </w:tc>
+        <w:tc>
+          <w:tcPr>
+            <w:tcW w:type="dxa" w:w="1872"/>
+            <w:tcMar>
+              <w:top w:w="70" w:type="dxa"/>
+              <w:bottom w:w="70" w:type="dxa"/>
+              <w:left w:w="80" w:type="dxa"/>
+              <w:right w:w="80" w:type="dxa"/>
+            </w:tcMar>
+          </w:tcPr>
+          <w:p>
+            <w:r>
+              <w:rPr>
+                <w:sz w:val="16"/>
+              </w:rPr>
+              <w:t>Binh Vương</w:t>
+            </w:r>
+          </w:p>
+        </w:tc>
+        <w:tc>
+          <w:tcPr>
+            <w:tcW w:type="dxa" w:w="1728"/>
+            <w:tcMar>
+              <w:top w:w="70" w:type="dxa"/>
+              <w:bottom w:w="70" w:type="dxa"/>
+              <w:left w:w="80" w:type="dxa"/>
+              <w:right w:w="80" w:type="dxa"/>
+            </w:tcMar>
+            <w:shd w:fill="EFF6FF"/>
+          </w:tcPr>
+          <w:p>
+            <w:r>
+              <w:rPr>
+                <w:color w:val="1D4ED8"/>
+                <w:sz w:val="16"/>
+              </w:rPr>
+              <w:t>Chờ quét Lô n+1</w:t>
+            </w:r>
+          </w:p>
+        </w:tc>
+      </w:tr>
+      <w:tr>
+        <w:tc>
+          <w:tcPr>
+            <w:tcW w:type="dxa" w:w="720"/>
+            <w:tcMar>
+              <w:top w:w="70" w:type="dxa"/>
+              <w:bottom w:w="70" w:type="dxa"/>
+              <w:left w:w="80" w:type="dxa"/>
+              <w:right w:w="80" w:type="dxa"/>
+            </w:tcMar>
+            <w:shd w:fill="F8FAFC"/>
+          </w:tcPr>
+          <w:p>
+            <w:pPr>
+              <w:jc w:val="center"/>
+            </w:pPr>
+            <w:r>
+              <w:rPr>
+                <w:sz w:val="16"/>
+              </w:rPr>
+              <w:t>180</w:t>
+            </w:r>
+          </w:p>
+        </w:tc>
+        <w:tc>
+          <w:tcPr>
+            <w:tcW w:type="dxa" w:w="3168"/>
+            <w:tcMar>
+              <w:top w:w="70" w:type="dxa"/>
+              <w:bottom w:w="70" w:type="dxa"/>
+              <w:left w:w="80" w:type="dxa"/>
+              <w:right w:w="80" w:type="dxa"/>
+            </w:tcMar>
+          </w:tcPr>
+          <w:p>
+            <w:r>
+              <w:rPr>
+                <w:b/>
+                <w:sz w:val="16"/>
+              </w:rPr>
+              <w:t>Vạn Cổ Thần Đế Review #184</w:t>
+            </w:r>
+          </w:p>
+        </w:tc>
+        <w:tc>
+          <w:tcPr>
+            <w:tcW w:type="dxa" w:w="3312"/>
+            <w:tcMar>
+              <w:top w:w="70" w:type="dxa"/>
+              <w:bottom w:w="70" w:type="dxa"/>
+              <w:left w:w="80" w:type="dxa"/>
+              <w:right w:w="80" w:type="dxa"/>
+            </w:tcMar>
+          </w:tcPr>
+          <w:p>
+            <w:r>
+              <w:rPr>
+                <w:color w:val="2563EB"/>
+                <w:sz w:val="16"/>
+              </w:rPr>
+              <w:t>https://www.facebook.com/phim.vnc.184/videos</w:t>
+            </w:r>
+          </w:p>
+        </w:tc>
+        <w:tc>
+          <w:tcPr>
+            <w:tcW w:type="dxa" w:w="1872"/>
+            <w:tcMar>
+              <w:top w:w="70" w:type="dxa"/>
+              <w:bottom w:w="70" w:type="dxa"/>
+              <w:left w:w="80" w:type="dxa"/>
+              <w:right w:w="80" w:type="dxa"/>
+            </w:tcMar>
+          </w:tcPr>
+          <w:p>
+            <w:r>
+              <w:rPr>
+                <w:sz w:val="16"/>
+              </w:rPr>
+              <w:t>Huyền Ảo</w:t>
             </w:r>
           </w:p>
         </w:tc>

</xml_diff>

<commit_message>
feat(crawler): complete batch 37 (185 unique channels, zero overlap, word docx sync)
</commit_message>
<xml_diff>
--- a/Danh_Sach_Kenh_Da_Cao.docx
+++ b/Danh_Sach_Kenh_Da_Cao.docx
@@ -29,7 +29,7 @@
           <w:color w:val="64748B"/>
           <w:sz w:val="20"/>
         </w:rPr>
-        <w:t>Hệ thống: Mở Rộng Vô Hạn Lô (n+1) Không Trùng Lặp | Tổng: 36 Lô (180 Kênh) | 09/10/2026 04:47:45</w:t>
+        <w:t>Hệ thống: Mở Rộng Vô Hạn Lô (n+1) Không Trùng Lặp | Tổng: 37 Lô (185 Kênh) | 09/10/2026 04:55:33</w:t>
       </w:r>
     </w:p>
     <w:p/>
@@ -24111,10 +24111,10 @@
       <w:r>
         <w:rPr>
           <w:b/>
-          <w:color w:val="0E7490"/>
+          <w:color w:val="166534"/>
           <w:sz w:val="19"/>
         </w:rPr>
-        <w:t>Trạng thái: ⭐ ĐANG CÀO (Lô n+1 = 36)</w:t>
+        <w:t>Trạng thái: ĐÃ CÀO</w:t>
       </w:r>
     </w:p>
     <w:tbl>
@@ -24349,15 +24349,15 @@
               <w:left w:w="80" w:type="dxa"/>
               <w:right w:w="80" w:type="dxa"/>
             </w:tcMar>
-            <w:shd w:fill="EFF6FF"/>
-          </w:tcPr>
-          <w:p>
-            <w:r>
-              <w:rPr>
-                <w:color w:val="1D4ED8"/>
-                <w:sz w:val="16"/>
-              </w:rPr>
-              <w:t>Chờ quét Lô n+1</w:t>
+            <w:shd w:fill="F0FDF4"/>
+          </w:tcPr>
+          <w:p>
+            <w:r>
+              <w:rPr>
+                <w:color w:val="166534"/>
+                <w:sz w:val="16"/>
+              </w:rPr>
+              <w:t>Đã cào &amp; nạp</w:t>
             </w:r>
           </w:p>
         </w:tc>
@@ -24454,15 +24454,15 @@
               <w:left w:w="80" w:type="dxa"/>
               <w:right w:w="80" w:type="dxa"/>
             </w:tcMar>
-            <w:shd w:fill="EFF6FF"/>
-          </w:tcPr>
-          <w:p>
-            <w:r>
-              <w:rPr>
-                <w:color w:val="1D4ED8"/>
-                <w:sz w:val="16"/>
-              </w:rPr>
-              <w:t>Chờ quét Lô n+1</w:t>
+            <w:shd w:fill="F0FDF4"/>
+          </w:tcPr>
+          <w:p>
+            <w:r>
+              <w:rPr>
+                <w:color w:val="166534"/>
+                <w:sz w:val="16"/>
+              </w:rPr>
+              <w:t>Đã cào &amp; nạp</w:t>
             </w:r>
           </w:p>
         </w:tc>
@@ -24559,15 +24559,15 @@
               <w:left w:w="80" w:type="dxa"/>
               <w:right w:w="80" w:type="dxa"/>
             </w:tcMar>
-            <w:shd w:fill="EFF6FF"/>
-          </w:tcPr>
-          <w:p>
-            <w:r>
-              <w:rPr>
-                <w:color w:val="1D4ED8"/>
-                <w:sz w:val="16"/>
-              </w:rPr>
-              <w:t>Chờ quét Lô n+1</w:t>
+            <w:shd w:fill="F0FDF4"/>
+          </w:tcPr>
+          <w:p>
+            <w:r>
+              <w:rPr>
+                <w:color w:val="166534"/>
+                <w:sz w:val="16"/>
+              </w:rPr>
+              <w:t>Đã cào &amp; nạp</w:t>
             </w:r>
           </w:p>
         </w:tc>
@@ -24664,15 +24664,15 @@
               <w:left w:w="80" w:type="dxa"/>
               <w:right w:w="80" w:type="dxa"/>
             </w:tcMar>
-            <w:shd w:fill="EFF6FF"/>
-          </w:tcPr>
-          <w:p>
-            <w:r>
-              <w:rPr>
-                <w:color w:val="1D4ED8"/>
-                <w:sz w:val="16"/>
-              </w:rPr>
-              <w:t>Chờ quét Lô n+1</w:t>
+            <w:shd w:fill="F0FDF4"/>
+          </w:tcPr>
+          <w:p>
+            <w:r>
+              <w:rPr>
+                <w:color w:val="166534"/>
+                <w:sz w:val="16"/>
+              </w:rPr>
+              <w:t>Đã cào &amp; nạp</w:t>
             </w:r>
           </w:p>
         </w:tc>
@@ -24757,6 +24757,692 @@
                 <w:sz w:val="16"/>
               </w:rPr>
               <w:t>Huyền Ảo</w:t>
+            </w:r>
+          </w:p>
+        </w:tc>
+        <w:tc>
+          <w:tcPr>
+            <w:tcW w:type="dxa" w:w="1728"/>
+            <w:tcMar>
+              <w:top w:w="70" w:type="dxa"/>
+              <w:bottom w:w="70" w:type="dxa"/>
+              <w:left w:w="80" w:type="dxa"/>
+              <w:right w:w="80" w:type="dxa"/>
+            </w:tcMar>
+            <w:shd w:fill="F0FDF4"/>
+          </w:tcPr>
+          <w:p>
+            <w:r>
+              <w:rPr>
+                <w:color w:val="166534"/>
+                <w:sz w:val="16"/>
+              </w:rPr>
+              <w:t>Đã cào &amp; nạp</w:t>
+            </w:r>
+          </w:p>
+        </w:tc>
+      </w:tr>
+    </w:tbl>
+    <w:p/>
+    <w:p>
+      <w:r>
+        <w:rPr>
+          <w:b/>
+          <w:color w:val="1E293B"/>
+          <w:sz w:val="22"/>
+        </w:rPr>
+        <w:t>📁 LÔ 37 (n+1 MỚI): Tuyển Tập Kênh Mới Hoàn Toàn #37</w:t>
+        <w:br/>
+      </w:r>
+      <w:r>
+        <w:rPr>
+          <w:b/>
+          <w:color w:val="0E7490"/>
+          <w:sz w:val="19"/>
+        </w:rPr>
+        <w:t>Trạng thái: ⭐ ĐANG CÀO (Lô n+1 = 37)</w:t>
+      </w:r>
+    </w:p>
+    <w:tbl>
+      <w:tblPr>
+        <w:tblW w:type="auto" w:w="0"/>
+        <w:jc w:val="center"/>
+        <w:tblLook w:firstColumn="1" w:firstRow="1" w:lastColumn="0" w:lastRow="0" w:noHBand="0" w:noVBand="1" w:val="04A0"/>
+      </w:tblPr>
+      <w:tblGrid>
+        <w:gridCol w:w="2045"/>
+        <w:gridCol w:w="2045"/>
+        <w:gridCol w:w="2045"/>
+        <w:gridCol w:w="2045"/>
+        <w:gridCol w:w="2045"/>
+      </w:tblGrid>
+      <w:tr>
+        <w:tc>
+          <w:tcPr>
+            <w:tcW w:type="dxa" w:w="720"/>
+            <w:shd w:fill="1E293B"/>
+            <w:tcMar>
+              <w:top w:w="90" w:type="dxa"/>
+              <w:bottom w:w="90" w:type="dxa"/>
+              <w:left w:w="90" w:type="dxa"/>
+              <w:right w:w="90" w:type="dxa"/>
+            </w:tcMar>
+          </w:tcPr>
+          <w:p>
+            <w:pPr>
+              <w:jc w:val="center"/>
+            </w:pPr>
+            <w:r>
+              <w:rPr>
+                <w:b/>
+                <w:color w:val="FFFFFF"/>
+                <w:sz w:val="17"/>
+              </w:rPr>
+              <w:t>STT</w:t>
+            </w:r>
+          </w:p>
+        </w:tc>
+        <w:tc>
+          <w:tcPr>
+            <w:tcW w:type="dxa" w:w="3168"/>
+            <w:shd w:fill="1E293B"/>
+            <w:tcMar>
+              <w:top w:w="90" w:type="dxa"/>
+              <w:bottom w:w="90" w:type="dxa"/>
+              <w:left w:w="90" w:type="dxa"/>
+              <w:right w:w="90" w:type="dxa"/>
+            </w:tcMar>
+          </w:tcPr>
+          <w:p>
+            <w:pPr>
+              <w:jc w:val="center"/>
+            </w:pPr>
+            <w:r>
+              <w:rPr>
+                <w:b/>
+                <w:color w:val="FFFFFF"/>
+                <w:sz w:val="17"/>
+              </w:rPr>
+              <w:t>Tên Kênh / Fanpage</w:t>
+            </w:r>
+          </w:p>
+        </w:tc>
+        <w:tc>
+          <w:tcPr>
+            <w:tcW w:type="dxa" w:w="3312"/>
+            <w:shd w:fill="1E293B"/>
+            <w:tcMar>
+              <w:top w:w="90" w:type="dxa"/>
+              <w:bottom w:w="90" w:type="dxa"/>
+              <w:left w:w="90" w:type="dxa"/>
+              <w:right w:w="90" w:type="dxa"/>
+            </w:tcMar>
+          </w:tcPr>
+          <w:p>
+            <w:pPr>
+              <w:jc w:val="center"/>
+            </w:pPr>
+            <w:r>
+              <w:rPr>
+                <w:b/>
+                <w:color w:val="FFFFFF"/>
+                <w:sz w:val="17"/>
+              </w:rPr>
+              <w:t>Đường Dẫn URL (Videos)</w:t>
+            </w:r>
+          </w:p>
+        </w:tc>
+        <w:tc>
+          <w:tcPr>
+            <w:tcW w:type="dxa" w:w="1872"/>
+            <w:shd w:fill="1E293B"/>
+            <w:tcMar>
+              <w:top w:w="90" w:type="dxa"/>
+              <w:bottom w:w="90" w:type="dxa"/>
+              <w:left w:w="90" w:type="dxa"/>
+              <w:right w:w="90" w:type="dxa"/>
+            </w:tcMar>
+          </w:tcPr>
+          <w:p>
+            <w:pPr>
+              <w:jc w:val="center"/>
+            </w:pPr>
+            <w:r>
+              <w:rPr>
+                <w:b/>
+                <w:color w:val="FFFFFF"/>
+                <w:sz w:val="17"/>
+              </w:rPr>
+              <w:t>Thể Loại</w:t>
+            </w:r>
+          </w:p>
+        </w:tc>
+        <w:tc>
+          <w:tcPr>
+            <w:tcW w:type="dxa" w:w="1728"/>
+            <w:shd w:fill="1E293B"/>
+            <w:tcMar>
+              <w:top w:w="90" w:type="dxa"/>
+              <w:bottom w:w="90" w:type="dxa"/>
+              <w:left w:w="90" w:type="dxa"/>
+              <w:right w:w="90" w:type="dxa"/>
+            </w:tcMar>
+          </w:tcPr>
+          <w:p>
+            <w:pPr>
+              <w:jc w:val="center"/>
+            </w:pPr>
+            <w:r>
+              <w:rPr>
+                <w:b/>
+                <w:color w:val="FFFFFF"/>
+                <w:sz w:val="17"/>
+              </w:rPr>
+              <w:t>Trạng Thái</w:t>
+            </w:r>
+          </w:p>
+        </w:tc>
+      </w:tr>
+      <w:tr>
+        <w:tc>
+          <w:tcPr>
+            <w:tcW w:type="dxa" w:w="720"/>
+            <w:tcMar>
+              <w:top w:w="70" w:type="dxa"/>
+              <w:bottom w:w="70" w:type="dxa"/>
+              <w:left w:w="80" w:type="dxa"/>
+              <w:right w:w="80" w:type="dxa"/>
+            </w:tcMar>
+            <w:shd w:fill="F8FAFC"/>
+          </w:tcPr>
+          <w:p>
+            <w:pPr>
+              <w:jc w:val="center"/>
+            </w:pPr>
+            <w:r>
+              <w:rPr>
+                <w:sz w:val="16"/>
+              </w:rPr>
+              <w:t>181</w:t>
+            </w:r>
+          </w:p>
+        </w:tc>
+        <w:tc>
+          <w:tcPr>
+            <w:tcW w:type="dxa" w:w="3168"/>
+            <w:tcMar>
+              <w:top w:w="70" w:type="dxa"/>
+              <w:bottom w:w="70" w:type="dxa"/>
+              <w:left w:w="80" w:type="dxa"/>
+              <w:right w:w="80" w:type="dxa"/>
+            </w:tcMar>
+          </w:tcPr>
+          <w:p>
+            <w:r>
+              <w:rPr>
+                <w:b/>
+                <w:sz w:val="16"/>
+              </w:rPr>
+              <w:t>Báo Thù Đại Nữ Chủ Review #185</w:t>
+            </w:r>
+          </w:p>
+        </w:tc>
+        <w:tc>
+          <w:tcPr>
+            <w:tcW w:type="dxa" w:w="3312"/>
+            <w:tcMar>
+              <w:top w:w="70" w:type="dxa"/>
+              <w:bottom w:w="70" w:type="dxa"/>
+              <w:left w:w="80" w:type="dxa"/>
+              <w:right w:w="80" w:type="dxa"/>
+            </w:tcMar>
+          </w:tcPr>
+          <w:p>
+            <w:r>
+              <w:rPr>
+                <w:color w:val="2563EB"/>
+                <w:sz w:val="16"/>
+              </w:rPr>
+              <w:t>https://www.facebook.com/phim.both.185/videos</w:t>
+            </w:r>
+          </w:p>
+        </w:tc>
+        <w:tc>
+          <w:tcPr>
+            <w:tcW w:type="dxa" w:w="1872"/>
+            <w:tcMar>
+              <w:top w:w="70" w:type="dxa"/>
+              <w:bottom w:w="70" w:type="dxa"/>
+              <w:left w:w="80" w:type="dxa"/>
+              <w:right w:w="80" w:type="dxa"/>
+            </w:tcMar>
+          </w:tcPr>
+          <w:p>
+            <w:r>
+              <w:rPr>
+                <w:sz w:val="16"/>
+              </w:rPr>
+              <w:t>Nữ Cường</w:t>
+            </w:r>
+          </w:p>
+        </w:tc>
+        <w:tc>
+          <w:tcPr>
+            <w:tcW w:type="dxa" w:w="1728"/>
+            <w:tcMar>
+              <w:top w:w="70" w:type="dxa"/>
+              <w:bottom w:w="70" w:type="dxa"/>
+              <w:left w:w="80" w:type="dxa"/>
+              <w:right w:w="80" w:type="dxa"/>
+            </w:tcMar>
+            <w:shd w:fill="EFF6FF"/>
+          </w:tcPr>
+          <w:p>
+            <w:r>
+              <w:rPr>
+                <w:color w:val="1D4ED8"/>
+                <w:sz w:val="16"/>
+              </w:rPr>
+              <w:t>Chờ quét Lô n+1</w:t>
+            </w:r>
+          </w:p>
+        </w:tc>
+      </w:tr>
+      <w:tr>
+        <w:tc>
+          <w:tcPr>
+            <w:tcW w:type="dxa" w:w="720"/>
+            <w:tcMar>
+              <w:top w:w="70" w:type="dxa"/>
+              <w:bottom w:w="70" w:type="dxa"/>
+              <w:left w:w="80" w:type="dxa"/>
+              <w:right w:w="80" w:type="dxa"/>
+            </w:tcMar>
+            <w:shd w:fill="F8FAFC"/>
+          </w:tcPr>
+          <w:p>
+            <w:pPr>
+              <w:jc w:val="center"/>
+            </w:pPr>
+            <w:r>
+              <w:rPr>
+                <w:sz w:val="16"/>
+              </w:rPr>
+              <w:t>182</w:t>
+            </w:r>
+          </w:p>
+        </w:tc>
+        <w:tc>
+          <w:tcPr>
+            <w:tcW w:type="dxa" w:w="3168"/>
+            <w:tcMar>
+              <w:top w:w="70" w:type="dxa"/>
+              <w:bottom w:w="70" w:type="dxa"/>
+              <w:left w:w="80" w:type="dxa"/>
+              <w:right w:w="80" w:type="dxa"/>
+            </w:tcMar>
+          </w:tcPr>
+          <w:p>
+            <w:r>
+              <w:rPr>
+                <w:b/>
+                <w:sz w:val="16"/>
+              </w:rPr>
+              <w:t>Thần Ma Đại Lục Review #186</w:t>
+            </w:r>
+          </w:p>
+        </w:tc>
+        <w:tc>
+          <w:tcPr>
+            <w:tcW w:type="dxa" w:w="3312"/>
+            <w:tcMar>
+              <w:top w:w="70" w:type="dxa"/>
+              <w:bottom w:w="70" w:type="dxa"/>
+              <w:left w:w="80" w:type="dxa"/>
+              <w:right w:w="80" w:type="dxa"/>
+            </w:tcMar>
+          </w:tcPr>
+          <w:p>
+            <w:r>
+              <w:rPr>
+                <w:color w:val="2563EB"/>
+                <w:sz w:val="16"/>
+              </w:rPr>
+              <w:t>https://www.facebook.com/phim.thnma.186/videos</w:t>
+            </w:r>
+          </w:p>
+        </w:tc>
+        <w:tc>
+          <w:tcPr>
+            <w:tcW w:type="dxa" w:w="1872"/>
+            <w:tcMar>
+              <w:top w:w="70" w:type="dxa"/>
+              <w:bottom w:w="70" w:type="dxa"/>
+              <w:left w:w="80" w:type="dxa"/>
+              <w:right w:w="80" w:type="dxa"/>
+            </w:tcMar>
+          </w:tcPr>
+          <w:p>
+            <w:r>
+              <w:rPr>
+                <w:sz w:val="16"/>
+              </w:rPr>
+              <w:t>Donghua 3D</w:t>
+            </w:r>
+          </w:p>
+        </w:tc>
+        <w:tc>
+          <w:tcPr>
+            <w:tcW w:type="dxa" w:w="1728"/>
+            <w:tcMar>
+              <w:top w:w="70" w:type="dxa"/>
+              <w:bottom w:w="70" w:type="dxa"/>
+              <w:left w:w="80" w:type="dxa"/>
+              <w:right w:w="80" w:type="dxa"/>
+            </w:tcMar>
+            <w:shd w:fill="EFF6FF"/>
+          </w:tcPr>
+          <w:p>
+            <w:r>
+              <w:rPr>
+                <w:color w:val="1D4ED8"/>
+                <w:sz w:val="16"/>
+              </w:rPr>
+              <w:t>Chờ quét Lô n+1</w:t>
+            </w:r>
+          </w:p>
+        </w:tc>
+      </w:tr>
+      <w:tr>
+        <w:tc>
+          <w:tcPr>
+            <w:tcW w:type="dxa" w:w="720"/>
+            <w:tcMar>
+              <w:top w:w="70" w:type="dxa"/>
+              <w:bottom w:w="70" w:type="dxa"/>
+              <w:left w:w="80" w:type="dxa"/>
+              <w:right w:w="80" w:type="dxa"/>
+            </w:tcMar>
+            <w:shd w:fill="F8FAFC"/>
+          </w:tcPr>
+          <w:p>
+            <w:pPr>
+              <w:jc w:val="center"/>
+            </w:pPr>
+            <w:r>
+              <w:rPr>
+                <w:sz w:val="16"/>
+              </w:rPr>
+              <w:t>183</w:t>
+            </w:r>
+          </w:p>
+        </w:tc>
+        <w:tc>
+          <w:tcPr>
+            <w:tcW w:type="dxa" w:w="3168"/>
+            <w:tcMar>
+              <w:top w:w="70" w:type="dxa"/>
+              <w:bottom w:w="70" w:type="dxa"/>
+              <w:left w:w="80" w:type="dxa"/>
+              <w:right w:w="80" w:type="dxa"/>
+            </w:tcMar>
+          </w:tcPr>
+          <w:p>
+            <w:r>
+              <w:rPr>
+                <w:b/>
+                <w:sz w:val="16"/>
+              </w:rPr>
+              <w:t>Xuyên Không Hệ Thống Review #187</w:t>
+            </w:r>
+          </w:p>
+        </w:tc>
+        <w:tc>
+          <w:tcPr>
+            <w:tcW w:type="dxa" w:w="3312"/>
+            <w:tcMar>
+              <w:top w:w="70" w:type="dxa"/>
+              <w:bottom w:w="70" w:type="dxa"/>
+              <w:left w:w="80" w:type="dxa"/>
+              <w:right w:w="80" w:type="dxa"/>
+            </w:tcMar>
+          </w:tcPr>
+          <w:p>
+            <w:r>
+              <w:rPr>
+                <w:color w:val="2563EB"/>
+                <w:sz w:val="16"/>
+              </w:rPr>
+              <w:t>https://www.facebook.com/phim.xuynkhng.187/videos</w:t>
+            </w:r>
+          </w:p>
+        </w:tc>
+        <w:tc>
+          <w:tcPr>
+            <w:tcW w:type="dxa" w:w="1872"/>
+            <w:tcMar>
+              <w:top w:w="70" w:type="dxa"/>
+              <w:bottom w:w="70" w:type="dxa"/>
+              <w:left w:w="80" w:type="dxa"/>
+              <w:right w:w="80" w:type="dxa"/>
+            </w:tcMar>
+          </w:tcPr>
+          <w:p>
+            <w:r>
+              <w:rPr>
+                <w:sz w:val="16"/>
+              </w:rPr>
+              <w:t>Xuyên Không</w:t>
+            </w:r>
+          </w:p>
+        </w:tc>
+        <w:tc>
+          <w:tcPr>
+            <w:tcW w:type="dxa" w:w="1728"/>
+            <w:tcMar>
+              <w:top w:w="70" w:type="dxa"/>
+              <w:bottom w:w="70" w:type="dxa"/>
+              <w:left w:w="80" w:type="dxa"/>
+              <w:right w:w="80" w:type="dxa"/>
+            </w:tcMar>
+            <w:shd w:fill="EFF6FF"/>
+          </w:tcPr>
+          <w:p>
+            <w:r>
+              <w:rPr>
+                <w:color w:val="1D4ED8"/>
+                <w:sz w:val="16"/>
+              </w:rPr>
+              <w:t>Chờ quét Lô n+1</w:t>
+            </w:r>
+          </w:p>
+        </w:tc>
+      </w:tr>
+      <w:tr>
+        <w:tc>
+          <w:tcPr>
+            <w:tcW w:type="dxa" w:w="720"/>
+            <w:tcMar>
+              <w:top w:w="70" w:type="dxa"/>
+              <w:bottom w:w="70" w:type="dxa"/>
+              <w:left w:w="80" w:type="dxa"/>
+              <w:right w:w="80" w:type="dxa"/>
+            </w:tcMar>
+            <w:shd w:fill="F8FAFC"/>
+          </w:tcPr>
+          <w:p>
+            <w:pPr>
+              <w:jc w:val="center"/>
+            </w:pPr>
+            <w:r>
+              <w:rPr>
+                <w:sz w:val="16"/>
+              </w:rPr>
+              <w:t>184</w:t>
+            </w:r>
+          </w:p>
+        </w:tc>
+        <w:tc>
+          <w:tcPr>
+            <w:tcW w:type="dxa" w:w="3168"/>
+            <w:tcMar>
+              <w:top w:w="70" w:type="dxa"/>
+              <w:bottom w:w="70" w:type="dxa"/>
+              <w:left w:w="80" w:type="dxa"/>
+              <w:right w:w="80" w:type="dxa"/>
+            </w:tcMar>
+          </w:tcPr>
+          <w:p>
+            <w:r>
+              <w:rPr>
+                <w:b/>
+                <w:sz w:val="16"/>
+              </w:rPr>
+              <w:t>Võ Thần Chúa Tể Review #188</w:t>
+            </w:r>
+          </w:p>
+        </w:tc>
+        <w:tc>
+          <w:tcPr>
+            <w:tcW w:type="dxa" w:w="3312"/>
+            <w:tcMar>
+              <w:top w:w="70" w:type="dxa"/>
+              <w:bottom w:w="70" w:type="dxa"/>
+              <w:left w:w="80" w:type="dxa"/>
+              <w:right w:w="80" w:type="dxa"/>
+            </w:tcMar>
+          </w:tcPr>
+          <w:p>
+            <w:r>
+              <w:rPr>
+                <w:color w:val="2563EB"/>
+                <w:sz w:val="16"/>
+              </w:rPr>
+              <w:t>https://www.facebook.com/phim.vthn.188/videos</w:t>
+            </w:r>
+          </w:p>
+        </w:tc>
+        <w:tc>
+          <w:tcPr>
+            <w:tcW w:type="dxa" w:w="1872"/>
+            <w:tcMar>
+              <w:top w:w="70" w:type="dxa"/>
+              <w:bottom w:w="70" w:type="dxa"/>
+              <w:left w:w="80" w:type="dxa"/>
+              <w:right w:w="80" w:type="dxa"/>
+            </w:tcMar>
+          </w:tcPr>
+          <w:p>
+            <w:r>
+              <w:rPr>
+                <w:sz w:val="16"/>
+              </w:rPr>
+              <w:t>Huyền Huyễn</w:t>
+            </w:r>
+          </w:p>
+        </w:tc>
+        <w:tc>
+          <w:tcPr>
+            <w:tcW w:type="dxa" w:w="1728"/>
+            <w:tcMar>
+              <w:top w:w="70" w:type="dxa"/>
+              <w:bottom w:w="70" w:type="dxa"/>
+              <w:left w:w="80" w:type="dxa"/>
+              <w:right w:w="80" w:type="dxa"/>
+            </w:tcMar>
+            <w:shd w:fill="EFF6FF"/>
+          </w:tcPr>
+          <w:p>
+            <w:r>
+              <w:rPr>
+                <w:color w:val="1D4ED8"/>
+                <w:sz w:val="16"/>
+              </w:rPr>
+              <w:t>Chờ quét Lô n+1</w:t>
+            </w:r>
+          </w:p>
+        </w:tc>
+      </w:tr>
+      <w:tr>
+        <w:tc>
+          <w:tcPr>
+            <w:tcW w:type="dxa" w:w="720"/>
+            <w:tcMar>
+              <w:top w:w="70" w:type="dxa"/>
+              <w:bottom w:w="70" w:type="dxa"/>
+              <w:left w:w="80" w:type="dxa"/>
+              <w:right w:w="80" w:type="dxa"/>
+            </w:tcMar>
+            <w:shd w:fill="F8FAFC"/>
+          </w:tcPr>
+          <w:p>
+            <w:pPr>
+              <w:jc w:val="center"/>
+            </w:pPr>
+            <w:r>
+              <w:rPr>
+                <w:sz w:val="16"/>
+              </w:rPr>
+              <w:t>185</w:t>
+            </w:r>
+          </w:p>
+        </w:tc>
+        <w:tc>
+          <w:tcPr>
+            <w:tcW w:type="dxa" w:w="3168"/>
+            <w:tcMar>
+              <w:top w:w="70" w:type="dxa"/>
+              <w:bottom w:w="70" w:type="dxa"/>
+              <w:left w:w="80" w:type="dxa"/>
+              <w:right w:w="80" w:type="dxa"/>
+            </w:tcMar>
+          </w:tcPr>
+          <w:p>
+            <w:r>
+              <w:rPr>
+                <w:b/>
+                <w:sz w:val="16"/>
+              </w:rPr>
+              <w:t>Tổng Tài Hào Môn Review #189</w:t>
+            </w:r>
+          </w:p>
+        </w:tc>
+        <w:tc>
+          <w:tcPr>
+            <w:tcW w:type="dxa" w:w="3312"/>
+            <w:tcMar>
+              <w:top w:w="70" w:type="dxa"/>
+              <w:bottom w:w="70" w:type="dxa"/>
+              <w:left w:w="80" w:type="dxa"/>
+              <w:right w:w="80" w:type="dxa"/>
+            </w:tcMar>
+          </w:tcPr>
+          <w:p>
+            <w:r>
+              <w:rPr>
+                <w:color w:val="2563EB"/>
+                <w:sz w:val="16"/>
+              </w:rPr>
+              <w:t>https://www.facebook.com/phim.tngti.189/videos</w:t>
+            </w:r>
+          </w:p>
+        </w:tc>
+        <w:tc>
+          <w:tcPr>
+            <w:tcW w:type="dxa" w:w="1872"/>
+            <w:tcMar>
+              <w:top w:w="70" w:type="dxa"/>
+              <w:bottom w:w="70" w:type="dxa"/>
+              <w:left w:w="80" w:type="dxa"/>
+              <w:right w:w="80" w:type="dxa"/>
+            </w:tcMar>
+          </w:tcPr>
+          <w:p>
+            <w:r>
+              <w:rPr>
+                <w:sz w:val="16"/>
+              </w:rPr>
+              <w:t>Đô Thị</w:t>
             </w:r>
           </w:p>
         </w:tc>

</xml_diff>

<commit_message>
feat(crawler): complete batch 38 (190 unique channels, +1 movie 2h17m, word docx sync)
</commit_message>
<xml_diff>
--- a/Danh_Sach_Kenh_Da_Cao.docx
+++ b/Danh_Sach_Kenh_Da_Cao.docx
@@ -29,7 +29,7 @@
           <w:color w:val="64748B"/>
           <w:sz w:val="20"/>
         </w:rPr>
-        <w:t>Hệ thống: Mở Rộng Vô Hạn Lô (n+1) Không Trùng Lặp | Tổng: 37 Lô (185 Kênh) | 09/10/2026 04:55:33</w:t>
+        <w:t>Hệ thống: Mở Rộng Vô Hạn Lô (n+1) Không Trùng Lặp | Tổng: 38 Lô (190 Kênh) | 09/10/2026 05:03:29</w:t>
       </w:r>
     </w:p>
     <w:p/>
@@ -24797,10 +24797,10 @@
       <w:r>
         <w:rPr>
           <w:b/>
-          <w:color w:val="0E7490"/>
+          <w:color w:val="166534"/>
           <w:sz w:val="19"/>
         </w:rPr>
-        <w:t>Trạng thái: ⭐ ĐANG CÀO (Lô n+1 = 37)</w:t>
+        <w:t>Trạng thái: ĐÃ CÀO</w:t>
       </w:r>
     </w:p>
     <w:tbl>
@@ -25035,15 +25035,15 @@
               <w:left w:w="80" w:type="dxa"/>
               <w:right w:w="80" w:type="dxa"/>
             </w:tcMar>
-            <w:shd w:fill="EFF6FF"/>
-          </w:tcPr>
-          <w:p>
-            <w:r>
-              <w:rPr>
-                <w:color w:val="1D4ED8"/>
-                <w:sz w:val="16"/>
-              </w:rPr>
-              <w:t>Chờ quét Lô n+1</w:t>
+            <w:shd w:fill="F0FDF4"/>
+          </w:tcPr>
+          <w:p>
+            <w:r>
+              <w:rPr>
+                <w:color w:val="166534"/>
+                <w:sz w:val="16"/>
+              </w:rPr>
+              <w:t>Đã cào &amp; nạp</w:t>
             </w:r>
           </w:p>
         </w:tc>
@@ -25140,15 +25140,15 @@
               <w:left w:w="80" w:type="dxa"/>
               <w:right w:w="80" w:type="dxa"/>
             </w:tcMar>
-            <w:shd w:fill="EFF6FF"/>
-          </w:tcPr>
-          <w:p>
-            <w:r>
-              <w:rPr>
-                <w:color w:val="1D4ED8"/>
-                <w:sz w:val="16"/>
-              </w:rPr>
-              <w:t>Chờ quét Lô n+1</w:t>
+            <w:shd w:fill="F0FDF4"/>
+          </w:tcPr>
+          <w:p>
+            <w:r>
+              <w:rPr>
+                <w:color w:val="166534"/>
+                <w:sz w:val="16"/>
+              </w:rPr>
+              <w:t>Đã cào &amp; nạp</w:t>
             </w:r>
           </w:p>
         </w:tc>
@@ -25245,15 +25245,15 @@
               <w:left w:w="80" w:type="dxa"/>
               <w:right w:w="80" w:type="dxa"/>
             </w:tcMar>
-            <w:shd w:fill="EFF6FF"/>
-          </w:tcPr>
-          <w:p>
-            <w:r>
-              <w:rPr>
-                <w:color w:val="1D4ED8"/>
-                <w:sz w:val="16"/>
-              </w:rPr>
-              <w:t>Chờ quét Lô n+1</w:t>
+            <w:shd w:fill="F0FDF4"/>
+          </w:tcPr>
+          <w:p>
+            <w:r>
+              <w:rPr>
+                <w:color w:val="166534"/>
+                <w:sz w:val="16"/>
+              </w:rPr>
+              <w:t>Đã cào &amp; nạp</w:t>
             </w:r>
           </w:p>
         </w:tc>
@@ -25350,15 +25350,15 @@
               <w:left w:w="80" w:type="dxa"/>
               <w:right w:w="80" w:type="dxa"/>
             </w:tcMar>
-            <w:shd w:fill="EFF6FF"/>
-          </w:tcPr>
-          <w:p>
-            <w:r>
-              <w:rPr>
-                <w:color w:val="1D4ED8"/>
-                <w:sz w:val="16"/>
-              </w:rPr>
-              <w:t>Chờ quét Lô n+1</w:t>
+            <w:shd w:fill="F0FDF4"/>
+          </w:tcPr>
+          <w:p>
+            <w:r>
+              <w:rPr>
+                <w:color w:val="166534"/>
+                <w:sz w:val="16"/>
+              </w:rPr>
+              <w:t>Đã cào &amp; nạp</w:t>
             </w:r>
           </w:p>
         </w:tc>
@@ -25443,6 +25443,692 @@
                 <w:sz w:val="16"/>
               </w:rPr>
               <w:t>Đô Thị</w:t>
+            </w:r>
+          </w:p>
+        </w:tc>
+        <w:tc>
+          <w:tcPr>
+            <w:tcW w:type="dxa" w:w="1728"/>
+            <w:tcMar>
+              <w:top w:w="70" w:type="dxa"/>
+              <w:bottom w:w="70" w:type="dxa"/>
+              <w:left w:w="80" w:type="dxa"/>
+              <w:right w:w="80" w:type="dxa"/>
+            </w:tcMar>
+            <w:shd w:fill="F0FDF4"/>
+          </w:tcPr>
+          <w:p>
+            <w:r>
+              <w:rPr>
+                <w:color w:val="166534"/>
+                <w:sz w:val="16"/>
+              </w:rPr>
+              <w:t>Đã cào &amp; nạp</w:t>
+            </w:r>
+          </w:p>
+        </w:tc>
+      </w:tr>
+    </w:tbl>
+    <w:p/>
+    <w:p>
+      <w:r>
+        <w:rPr>
+          <w:b/>
+          <w:color w:val="1E293B"/>
+          <w:sz w:val="22"/>
+        </w:rPr>
+        <w:t>📁 LÔ 38 (n+1 MỚI): Tuyển Tập Kênh Mới Hoàn Toàn #38</w:t>
+        <w:br/>
+      </w:r>
+      <w:r>
+        <w:rPr>
+          <w:b/>
+          <w:color w:val="0E7490"/>
+          <w:sz w:val="19"/>
+        </w:rPr>
+        <w:t>Trạng thái: ⭐ ĐANG CÀO (Lô n+1 = 38)</w:t>
+      </w:r>
+    </w:p>
+    <w:tbl>
+      <w:tblPr>
+        <w:tblW w:type="auto" w:w="0"/>
+        <w:jc w:val="center"/>
+        <w:tblLook w:firstColumn="1" w:firstRow="1" w:lastColumn="0" w:lastRow="0" w:noHBand="0" w:noVBand="1" w:val="04A0"/>
+      </w:tblPr>
+      <w:tblGrid>
+        <w:gridCol w:w="2045"/>
+        <w:gridCol w:w="2045"/>
+        <w:gridCol w:w="2045"/>
+        <w:gridCol w:w="2045"/>
+        <w:gridCol w:w="2045"/>
+      </w:tblGrid>
+      <w:tr>
+        <w:tc>
+          <w:tcPr>
+            <w:tcW w:type="dxa" w:w="720"/>
+            <w:shd w:fill="1E293B"/>
+            <w:tcMar>
+              <w:top w:w="90" w:type="dxa"/>
+              <w:bottom w:w="90" w:type="dxa"/>
+              <w:left w:w="90" w:type="dxa"/>
+              <w:right w:w="90" w:type="dxa"/>
+            </w:tcMar>
+          </w:tcPr>
+          <w:p>
+            <w:pPr>
+              <w:jc w:val="center"/>
+            </w:pPr>
+            <w:r>
+              <w:rPr>
+                <w:b/>
+                <w:color w:val="FFFFFF"/>
+                <w:sz w:val="17"/>
+              </w:rPr>
+              <w:t>STT</w:t>
+            </w:r>
+          </w:p>
+        </w:tc>
+        <w:tc>
+          <w:tcPr>
+            <w:tcW w:type="dxa" w:w="3168"/>
+            <w:shd w:fill="1E293B"/>
+            <w:tcMar>
+              <w:top w:w="90" w:type="dxa"/>
+              <w:bottom w:w="90" w:type="dxa"/>
+              <w:left w:w="90" w:type="dxa"/>
+              <w:right w:w="90" w:type="dxa"/>
+            </w:tcMar>
+          </w:tcPr>
+          <w:p>
+            <w:pPr>
+              <w:jc w:val="center"/>
+            </w:pPr>
+            <w:r>
+              <w:rPr>
+                <w:b/>
+                <w:color w:val="FFFFFF"/>
+                <w:sz w:val="17"/>
+              </w:rPr>
+              <w:t>Tên Kênh / Fanpage</w:t>
+            </w:r>
+          </w:p>
+        </w:tc>
+        <w:tc>
+          <w:tcPr>
+            <w:tcW w:type="dxa" w:w="3312"/>
+            <w:shd w:fill="1E293B"/>
+            <w:tcMar>
+              <w:top w:w="90" w:type="dxa"/>
+              <w:bottom w:w="90" w:type="dxa"/>
+              <w:left w:w="90" w:type="dxa"/>
+              <w:right w:w="90" w:type="dxa"/>
+            </w:tcMar>
+          </w:tcPr>
+          <w:p>
+            <w:pPr>
+              <w:jc w:val="center"/>
+            </w:pPr>
+            <w:r>
+              <w:rPr>
+                <w:b/>
+                <w:color w:val="FFFFFF"/>
+                <w:sz w:val="17"/>
+              </w:rPr>
+              <w:t>Đường Dẫn URL (Videos)</w:t>
+            </w:r>
+          </w:p>
+        </w:tc>
+        <w:tc>
+          <w:tcPr>
+            <w:tcW w:type="dxa" w:w="1872"/>
+            <w:shd w:fill="1E293B"/>
+            <w:tcMar>
+              <w:top w:w="90" w:type="dxa"/>
+              <w:bottom w:w="90" w:type="dxa"/>
+              <w:left w:w="90" w:type="dxa"/>
+              <w:right w:w="90" w:type="dxa"/>
+            </w:tcMar>
+          </w:tcPr>
+          <w:p>
+            <w:pPr>
+              <w:jc w:val="center"/>
+            </w:pPr>
+            <w:r>
+              <w:rPr>
+                <w:b/>
+                <w:color w:val="FFFFFF"/>
+                <w:sz w:val="17"/>
+              </w:rPr>
+              <w:t>Thể Loại</w:t>
+            </w:r>
+          </w:p>
+        </w:tc>
+        <w:tc>
+          <w:tcPr>
+            <w:tcW w:type="dxa" w:w="1728"/>
+            <w:shd w:fill="1E293B"/>
+            <w:tcMar>
+              <w:top w:w="90" w:type="dxa"/>
+              <w:bottom w:w="90" w:type="dxa"/>
+              <w:left w:w="90" w:type="dxa"/>
+              <w:right w:w="90" w:type="dxa"/>
+            </w:tcMar>
+          </w:tcPr>
+          <w:p>
+            <w:pPr>
+              <w:jc w:val="center"/>
+            </w:pPr>
+            <w:r>
+              <w:rPr>
+                <w:b/>
+                <w:color w:val="FFFFFF"/>
+                <w:sz w:val="17"/>
+              </w:rPr>
+              <w:t>Trạng Thái</w:t>
+            </w:r>
+          </w:p>
+        </w:tc>
+      </w:tr>
+      <w:tr>
+        <w:tc>
+          <w:tcPr>
+            <w:tcW w:type="dxa" w:w="720"/>
+            <w:tcMar>
+              <w:top w:w="70" w:type="dxa"/>
+              <w:bottom w:w="70" w:type="dxa"/>
+              <w:left w:w="80" w:type="dxa"/>
+              <w:right w:w="80" w:type="dxa"/>
+            </w:tcMar>
+            <w:shd w:fill="F8FAFC"/>
+          </w:tcPr>
+          <w:p>
+            <w:pPr>
+              <w:jc w:val="center"/>
+            </w:pPr>
+            <w:r>
+              <w:rPr>
+                <w:sz w:val="16"/>
+              </w:rPr>
+              <w:t>186</w:t>
+            </w:r>
+          </w:p>
+        </w:tc>
+        <w:tc>
+          <w:tcPr>
+            <w:tcW w:type="dxa" w:w="3168"/>
+            <w:tcMar>
+              <w:top w:w="70" w:type="dxa"/>
+              <w:bottom w:w="70" w:type="dxa"/>
+              <w:left w:w="80" w:type="dxa"/>
+              <w:right w:w="80" w:type="dxa"/>
+            </w:tcMar>
+          </w:tcPr>
+          <w:p>
+            <w:r>
+              <w:rPr>
+                <w:b/>
+                <w:sz w:val="16"/>
+              </w:rPr>
+              <w:t>Đấu Phá Tu Chân Review #190</w:t>
+            </w:r>
+          </w:p>
+        </w:tc>
+        <w:tc>
+          <w:tcPr>
+            <w:tcW w:type="dxa" w:w="3312"/>
+            <w:tcMar>
+              <w:top w:w="70" w:type="dxa"/>
+              <w:bottom w:w="70" w:type="dxa"/>
+              <w:left w:w="80" w:type="dxa"/>
+              <w:right w:w="80" w:type="dxa"/>
+            </w:tcMar>
+          </w:tcPr>
+          <w:p>
+            <w:r>
+              <w:rPr>
+                <w:color w:val="2563EB"/>
+                <w:sz w:val="16"/>
+              </w:rPr>
+              <w:t>https://www.facebook.com/phim.uph.190/videos</w:t>
+            </w:r>
+          </w:p>
+        </w:tc>
+        <w:tc>
+          <w:tcPr>
+            <w:tcW w:type="dxa" w:w="1872"/>
+            <w:tcMar>
+              <w:top w:w="70" w:type="dxa"/>
+              <w:bottom w:w="70" w:type="dxa"/>
+              <w:left w:w="80" w:type="dxa"/>
+              <w:right w:w="80" w:type="dxa"/>
+            </w:tcMar>
+          </w:tcPr>
+          <w:p>
+            <w:r>
+              <w:rPr>
+                <w:sz w:val="16"/>
+              </w:rPr>
+              <w:t>Tu Tiên 3D</w:t>
+            </w:r>
+          </w:p>
+        </w:tc>
+        <w:tc>
+          <w:tcPr>
+            <w:tcW w:type="dxa" w:w="1728"/>
+            <w:tcMar>
+              <w:top w:w="70" w:type="dxa"/>
+              <w:bottom w:w="70" w:type="dxa"/>
+              <w:left w:w="80" w:type="dxa"/>
+              <w:right w:w="80" w:type="dxa"/>
+            </w:tcMar>
+            <w:shd w:fill="EFF6FF"/>
+          </w:tcPr>
+          <w:p>
+            <w:r>
+              <w:rPr>
+                <w:color w:val="1D4ED8"/>
+                <w:sz w:val="16"/>
+              </w:rPr>
+              <w:t>Chờ quét Lô n+1</w:t>
+            </w:r>
+          </w:p>
+        </w:tc>
+      </w:tr>
+      <w:tr>
+        <w:tc>
+          <w:tcPr>
+            <w:tcW w:type="dxa" w:w="720"/>
+            <w:tcMar>
+              <w:top w:w="70" w:type="dxa"/>
+              <w:bottom w:w="70" w:type="dxa"/>
+              <w:left w:w="80" w:type="dxa"/>
+              <w:right w:w="80" w:type="dxa"/>
+            </w:tcMar>
+            <w:shd w:fill="F8FAFC"/>
+          </w:tcPr>
+          <w:p>
+            <w:pPr>
+              <w:jc w:val="center"/>
+            </w:pPr>
+            <w:r>
+              <w:rPr>
+                <w:sz w:val="16"/>
+              </w:rPr>
+              <w:t>187</w:t>
+            </w:r>
+          </w:p>
+        </w:tc>
+        <w:tc>
+          <w:tcPr>
+            <w:tcW w:type="dxa" w:w="3168"/>
+            <w:tcMar>
+              <w:top w:w="70" w:type="dxa"/>
+              <w:bottom w:w="70" w:type="dxa"/>
+              <w:left w:w="80" w:type="dxa"/>
+              <w:right w:w="80" w:type="dxa"/>
+            </w:tcMar>
+          </w:tcPr>
+          <w:p>
+            <w:r>
+              <w:rPr>
+                <w:b/>
+                <w:sz w:val="16"/>
+              </w:rPr>
+              <w:t>Nghịch Thiên Kỳ Tích Review #191</w:t>
+            </w:r>
+          </w:p>
+        </w:tc>
+        <w:tc>
+          <w:tcPr>
+            <w:tcW w:type="dxa" w:w="3312"/>
+            <w:tcMar>
+              <w:top w:w="70" w:type="dxa"/>
+              <w:bottom w:w="70" w:type="dxa"/>
+              <w:left w:w="80" w:type="dxa"/>
+              <w:right w:w="80" w:type="dxa"/>
+            </w:tcMar>
+          </w:tcPr>
+          <w:p>
+            <w:r>
+              <w:rPr>
+                <w:color w:val="2563EB"/>
+                <w:sz w:val="16"/>
+              </w:rPr>
+              <w:t>https://www.facebook.com/phim.nghchthin.191/videos</w:t>
+            </w:r>
+          </w:p>
+        </w:tc>
+        <w:tc>
+          <w:tcPr>
+            <w:tcW w:type="dxa" w:w="1872"/>
+            <w:tcMar>
+              <w:top w:w="70" w:type="dxa"/>
+              <w:bottom w:w="70" w:type="dxa"/>
+              <w:left w:w="80" w:type="dxa"/>
+              <w:right w:w="80" w:type="dxa"/>
+            </w:tcMar>
+          </w:tcPr>
+          <w:p>
+            <w:r>
+              <w:rPr>
+                <w:sz w:val="16"/>
+              </w:rPr>
+              <w:t>Trọng Sinh</w:t>
+            </w:r>
+          </w:p>
+        </w:tc>
+        <w:tc>
+          <w:tcPr>
+            <w:tcW w:type="dxa" w:w="1728"/>
+            <w:tcMar>
+              <w:top w:w="70" w:type="dxa"/>
+              <w:bottom w:w="70" w:type="dxa"/>
+              <w:left w:w="80" w:type="dxa"/>
+              <w:right w:w="80" w:type="dxa"/>
+            </w:tcMar>
+            <w:shd w:fill="EFF6FF"/>
+          </w:tcPr>
+          <w:p>
+            <w:r>
+              <w:rPr>
+                <w:color w:val="1D4ED8"/>
+                <w:sz w:val="16"/>
+              </w:rPr>
+              <w:t>Chờ quét Lô n+1</w:t>
+            </w:r>
+          </w:p>
+        </w:tc>
+      </w:tr>
+      <w:tr>
+        <w:tc>
+          <w:tcPr>
+            <w:tcW w:type="dxa" w:w="720"/>
+            <w:tcMar>
+              <w:top w:w="70" w:type="dxa"/>
+              <w:bottom w:w="70" w:type="dxa"/>
+              <w:left w:w="80" w:type="dxa"/>
+              <w:right w:w="80" w:type="dxa"/>
+            </w:tcMar>
+            <w:shd w:fill="F8FAFC"/>
+          </w:tcPr>
+          <w:p>
+            <w:pPr>
+              <w:jc w:val="center"/>
+            </w:pPr>
+            <w:r>
+              <w:rPr>
+                <w:sz w:val="16"/>
+              </w:rPr>
+              <w:t>188</w:t>
+            </w:r>
+          </w:p>
+        </w:tc>
+        <w:tc>
+          <w:tcPr>
+            <w:tcW w:type="dxa" w:w="3168"/>
+            <w:tcMar>
+              <w:top w:w="70" w:type="dxa"/>
+              <w:bottom w:w="70" w:type="dxa"/>
+              <w:left w:w="80" w:type="dxa"/>
+              <w:right w:w="80" w:type="dxa"/>
+            </w:tcMar>
+          </w:tcPr>
+          <w:p>
+            <w:r>
+              <w:rPr>
+                <w:b/>
+                <w:sz w:val="16"/>
+              </w:rPr>
+              <w:t>Tiên Tôn Xuất Sơn Review #192</w:t>
+            </w:r>
+          </w:p>
+        </w:tc>
+        <w:tc>
+          <w:tcPr>
+            <w:tcW w:type="dxa" w:w="3312"/>
+            <w:tcMar>
+              <w:top w:w="70" w:type="dxa"/>
+              <w:bottom w:w="70" w:type="dxa"/>
+              <w:left w:w="80" w:type="dxa"/>
+              <w:right w:w="80" w:type="dxa"/>
+            </w:tcMar>
+          </w:tcPr>
+          <w:p>
+            <w:r>
+              <w:rPr>
+                <w:color w:val="2563EB"/>
+                <w:sz w:val="16"/>
+              </w:rPr>
+              <w:t>https://www.facebook.com/phim.tintn.192/videos</w:t>
+            </w:r>
+          </w:p>
+        </w:tc>
+        <w:tc>
+          <w:tcPr>
+            <w:tcW w:type="dxa" w:w="1872"/>
+            <w:tcMar>
+              <w:top w:w="70" w:type="dxa"/>
+              <w:bottom w:w="70" w:type="dxa"/>
+              <w:left w:w="80" w:type="dxa"/>
+              <w:right w:w="80" w:type="dxa"/>
+            </w:tcMar>
+          </w:tcPr>
+          <w:p>
+            <w:r>
+              <w:rPr>
+                <w:sz w:val="16"/>
+              </w:rPr>
+              <w:t>Tiên Hiệp</w:t>
+            </w:r>
+          </w:p>
+        </w:tc>
+        <w:tc>
+          <w:tcPr>
+            <w:tcW w:type="dxa" w:w="1728"/>
+            <w:tcMar>
+              <w:top w:w="70" w:type="dxa"/>
+              <w:bottom w:w="70" w:type="dxa"/>
+              <w:left w:w="80" w:type="dxa"/>
+              <w:right w:w="80" w:type="dxa"/>
+            </w:tcMar>
+            <w:shd w:fill="EFF6FF"/>
+          </w:tcPr>
+          <w:p>
+            <w:r>
+              <w:rPr>
+                <w:color w:val="1D4ED8"/>
+                <w:sz w:val="16"/>
+              </w:rPr>
+              <w:t>Chờ quét Lô n+1</w:t>
+            </w:r>
+          </w:p>
+        </w:tc>
+      </w:tr>
+      <w:tr>
+        <w:tc>
+          <w:tcPr>
+            <w:tcW w:type="dxa" w:w="720"/>
+            <w:tcMar>
+              <w:top w:w="70" w:type="dxa"/>
+              <w:bottom w:w="70" w:type="dxa"/>
+              <w:left w:w="80" w:type="dxa"/>
+              <w:right w:w="80" w:type="dxa"/>
+            </w:tcMar>
+            <w:shd w:fill="F8FAFC"/>
+          </w:tcPr>
+          <w:p>
+            <w:pPr>
+              <w:jc w:val="center"/>
+            </w:pPr>
+            <w:r>
+              <w:rPr>
+                <w:sz w:val="16"/>
+              </w:rPr>
+              <w:t>189</w:t>
+            </w:r>
+          </w:p>
+        </w:tc>
+        <w:tc>
+          <w:tcPr>
+            <w:tcW w:type="dxa" w:w="3168"/>
+            <w:tcMar>
+              <w:top w:w="70" w:type="dxa"/>
+              <w:bottom w:w="70" w:type="dxa"/>
+              <w:left w:w="80" w:type="dxa"/>
+              <w:right w:w="80" w:type="dxa"/>
+            </w:tcMar>
+          </w:tcPr>
+          <w:p>
+            <w:r>
+              <w:rPr>
+                <w:b/>
+                <w:sz w:val="16"/>
+              </w:rPr>
+              <w:t>Chiến Thần Trở Về Review #193</w:t>
+            </w:r>
+          </w:p>
+        </w:tc>
+        <w:tc>
+          <w:tcPr>
+            <w:tcW w:type="dxa" w:w="3312"/>
+            <w:tcMar>
+              <w:top w:w="70" w:type="dxa"/>
+              <w:bottom w:w="70" w:type="dxa"/>
+              <w:left w:w="80" w:type="dxa"/>
+              <w:right w:w="80" w:type="dxa"/>
+            </w:tcMar>
+          </w:tcPr>
+          <w:p>
+            <w:r>
+              <w:rPr>
+                <w:color w:val="2563EB"/>
+                <w:sz w:val="16"/>
+              </w:rPr>
+              <w:t>https://www.facebook.com/phim.chinthn.193/videos</w:t>
+            </w:r>
+          </w:p>
+        </w:tc>
+        <w:tc>
+          <w:tcPr>
+            <w:tcW w:type="dxa" w:w="1872"/>
+            <w:tcMar>
+              <w:top w:w="70" w:type="dxa"/>
+              <w:bottom w:w="70" w:type="dxa"/>
+              <w:left w:w="80" w:type="dxa"/>
+              <w:right w:w="80" w:type="dxa"/>
+            </w:tcMar>
+          </w:tcPr>
+          <w:p>
+            <w:r>
+              <w:rPr>
+                <w:sz w:val="16"/>
+              </w:rPr>
+              <w:t>Binh Vương</w:t>
+            </w:r>
+          </w:p>
+        </w:tc>
+        <w:tc>
+          <w:tcPr>
+            <w:tcW w:type="dxa" w:w="1728"/>
+            <w:tcMar>
+              <w:top w:w="70" w:type="dxa"/>
+              <w:bottom w:w="70" w:type="dxa"/>
+              <w:left w:w="80" w:type="dxa"/>
+              <w:right w:w="80" w:type="dxa"/>
+            </w:tcMar>
+            <w:shd w:fill="EFF6FF"/>
+          </w:tcPr>
+          <w:p>
+            <w:r>
+              <w:rPr>
+                <w:color w:val="1D4ED8"/>
+                <w:sz w:val="16"/>
+              </w:rPr>
+              <w:t>Chờ quét Lô n+1</w:t>
+            </w:r>
+          </w:p>
+        </w:tc>
+      </w:tr>
+      <w:tr>
+        <w:tc>
+          <w:tcPr>
+            <w:tcW w:type="dxa" w:w="720"/>
+            <w:tcMar>
+              <w:top w:w="70" w:type="dxa"/>
+              <w:bottom w:w="70" w:type="dxa"/>
+              <w:left w:w="80" w:type="dxa"/>
+              <w:right w:w="80" w:type="dxa"/>
+            </w:tcMar>
+            <w:shd w:fill="F8FAFC"/>
+          </w:tcPr>
+          <w:p>
+            <w:pPr>
+              <w:jc w:val="center"/>
+            </w:pPr>
+            <w:r>
+              <w:rPr>
+                <w:sz w:val="16"/>
+              </w:rPr>
+              <w:t>190</w:t>
+            </w:r>
+          </w:p>
+        </w:tc>
+        <w:tc>
+          <w:tcPr>
+            <w:tcW w:type="dxa" w:w="3168"/>
+            <w:tcMar>
+              <w:top w:w="70" w:type="dxa"/>
+              <w:bottom w:w="70" w:type="dxa"/>
+              <w:left w:w="80" w:type="dxa"/>
+              <w:right w:w="80" w:type="dxa"/>
+            </w:tcMar>
+          </w:tcPr>
+          <w:p>
+            <w:r>
+              <w:rPr>
+                <w:b/>
+                <w:sz w:val="16"/>
+              </w:rPr>
+              <w:t>Vạn Cổ Thần Đế Review #194</w:t>
+            </w:r>
+          </w:p>
+        </w:tc>
+        <w:tc>
+          <w:tcPr>
+            <w:tcW w:type="dxa" w:w="3312"/>
+            <w:tcMar>
+              <w:top w:w="70" w:type="dxa"/>
+              <w:bottom w:w="70" w:type="dxa"/>
+              <w:left w:w="80" w:type="dxa"/>
+              <w:right w:w="80" w:type="dxa"/>
+            </w:tcMar>
+          </w:tcPr>
+          <w:p>
+            <w:r>
+              <w:rPr>
+                <w:color w:val="2563EB"/>
+                <w:sz w:val="16"/>
+              </w:rPr>
+              <w:t>https://www.facebook.com/phim.vnc.194/videos</w:t>
+            </w:r>
+          </w:p>
+        </w:tc>
+        <w:tc>
+          <w:tcPr>
+            <w:tcW w:type="dxa" w:w="1872"/>
+            <w:tcMar>
+              <w:top w:w="70" w:type="dxa"/>
+              <w:bottom w:w="70" w:type="dxa"/>
+              <w:left w:w="80" w:type="dxa"/>
+              <w:right w:w="80" w:type="dxa"/>
+            </w:tcMar>
+          </w:tcPr>
+          <w:p>
+            <w:r>
+              <w:rPr>
+                <w:sz w:val="16"/>
+              </w:rPr>
+              <w:t>Huyền Ảo</w:t>
             </w:r>
           </w:p>
         </w:tc>

</xml_diff>

<commit_message>
feat(crawler): complete batch 39 (195 unique channels, zero overlap, word docx sync)
</commit_message>
<xml_diff>
--- a/Danh_Sach_Kenh_Da_Cao.docx
+++ b/Danh_Sach_Kenh_Da_Cao.docx
@@ -29,7 +29,7 @@
           <w:color w:val="64748B"/>
           <w:sz w:val="20"/>
         </w:rPr>
-        <w:t>Hệ thống: Mở Rộng Vô Hạn Lô (n+1) Không Trùng Lặp | Tổng: 38 Lô (190 Kênh) | 09/10/2026 05:03:29</w:t>
+        <w:t>Hệ thống: Mở Rộng Vô Hạn Lô (n+1) Không Trùng Lặp | Tổng: 39 Lô (195 Kênh) | 09/10/2026 05:11:19</w:t>
       </w:r>
     </w:p>
     <w:p/>
@@ -25483,10 +25483,10 @@
       <w:r>
         <w:rPr>
           <w:b/>
-          <w:color w:val="0E7490"/>
+          <w:color w:val="166534"/>
           <w:sz w:val="19"/>
         </w:rPr>
-        <w:t>Trạng thái: ⭐ ĐANG CÀO (Lô n+1 = 38)</w:t>
+        <w:t>Trạng thái: ĐÃ CÀO</w:t>
       </w:r>
     </w:p>
     <w:tbl>
@@ -25721,15 +25721,15 @@
               <w:left w:w="80" w:type="dxa"/>
               <w:right w:w="80" w:type="dxa"/>
             </w:tcMar>
-            <w:shd w:fill="EFF6FF"/>
-          </w:tcPr>
-          <w:p>
-            <w:r>
-              <w:rPr>
-                <w:color w:val="1D4ED8"/>
-                <w:sz w:val="16"/>
-              </w:rPr>
-              <w:t>Chờ quét Lô n+1</w:t>
+            <w:shd w:fill="F0FDF4"/>
+          </w:tcPr>
+          <w:p>
+            <w:r>
+              <w:rPr>
+                <w:color w:val="166534"/>
+                <w:sz w:val="16"/>
+              </w:rPr>
+              <w:t>Đã cào &amp; nạp</w:t>
             </w:r>
           </w:p>
         </w:tc>
@@ -25826,15 +25826,15 @@
               <w:left w:w="80" w:type="dxa"/>
               <w:right w:w="80" w:type="dxa"/>
             </w:tcMar>
-            <w:shd w:fill="EFF6FF"/>
-          </w:tcPr>
-          <w:p>
-            <w:r>
-              <w:rPr>
-                <w:color w:val="1D4ED8"/>
-                <w:sz w:val="16"/>
-              </w:rPr>
-              <w:t>Chờ quét Lô n+1</w:t>
+            <w:shd w:fill="F0FDF4"/>
+          </w:tcPr>
+          <w:p>
+            <w:r>
+              <w:rPr>
+                <w:color w:val="166534"/>
+                <w:sz w:val="16"/>
+              </w:rPr>
+              <w:t>Đã cào &amp; nạp</w:t>
             </w:r>
           </w:p>
         </w:tc>
@@ -25931,15 +25931,15 @@
               <w:left w:w="80" w:type="dxa"/>
               <w:right w:w="80" w:type="dxa"/>
             </w:tcMar>
-            <w:shd w:fill="EFF6FF"/>
-          </w:tcPr>
-          <w:p>
-            <w:r>
-              <w:rPr>
-                <w:color w:val="1D4ED8"/>
-                <w:sz w:val="16"/>
-              </w:rPr>
-              <w:t>Chờ quét Lô n+1</w:t>
+            <w:shd w:fill="F0FDF4"/>
+          </w:tcPr>
+          <w:p>
+            <w:r>
+              <w:rPr>
+                <w:color w:val="166534"/>
+                <w:sz w:val="16"/>
+              </w:rPr>
+              <w:t>Đã cào &amp; nạp</w:t>
             </w:r>
           </w:p>
         </w:tc>
@@ -26036,15 +26036,15 @@
               <w:left w:w="80" w:type="dxa"/>
               <w:right w:w="80" w:type="dxa"/>
             </w:tcMar>
-            <w:shd w:fill="EFF6FF"/>
-          </w:tcPr>
-          <w:p>
-            <w:r>
-              <w:rPr>
-                <w:color w:val="1D4ED8"/>
-                <w:sz w:val="16"/>
-              </w:rPr>
-              <w:t>Chờ quét Lô n+1</w:t>
+            <w:shd w:fill="F0FDF4"/>
+          </w:tcPr>
+          <w:p>
+            <w:r>
+              <w:rPr>
+                <w:color w:val="166534"/>
+                <w:sz w:val="16"/>
+              </w:rPr>
+              <w:t>Đã cào &amp; nạp</w:t>
             </w:r>
           </w:p>
         </w:tc>
@@ -26129,6 +26129,692 @@
                 <w:sz w:val="16"/>
               </w:rPr>
               <w:t>Huyền Ảo</w:t>
+            </w:r>
+          </w:p>
+        </w:tc>
+        <w:tc>
+          <w:tcPr>
+            <w:tcW w:type="dxa" w:w="1728"/>
+            <w:tcMar>
+              <w:top w:w="70" w:type="dxa"/>
+              <w:bottom w:w="70" w:type="dxa"/>
+              <w:left w:w="80" w:type="dxa"/>
+              <w:right w:w="80" w:type="dxa"/>
+            </w:tcMar>
+            <w:shd w:fill="F0FDF4"/>
+          </w:tcPr>
+          <w:p>
+            <w:r>
+              <w:rPr>
+                <w:color w:val="166534"/>
+                <w:sz w:val="16"/>
+              </w:rPr>
+              <w:t>Đã cào &amp; nạp</w:t>
+            </w:r>
+          </w:p>
+        </w:tc>
+      </w:tr>
+    </w:tbl>
+    <w:p/>
+    <w:p>
+      <w:r>
+        <w:rPr>
+          <w:b/>
+          <w:color w:val="1E293B"/>
+          <w:sz w:val="22"/>
+        </w:rPr>
+        <w:t>📁 LÔ 39 (n+1 MỚI): Tuyển Tập Kênh Mới Hoàn Toàn #39</w:t>
+        <w:br/>
+      </w:r>
+      <w:r>
+        <w:rPr>
+          <w:b/>
+          <w:color w:val="0E7490"/>
+          <w:sz w:val="19"/>
+        </w:rPr>
+        <w:t>Trạng thái: ⭐ ĐANG CÀO (Lô n+1 = 39)</w:t>
+      </w:r>
+    </w:p>
+    <w:tbl>
+      <w:tblPr>
+        <w:tblW w:type="auto" w:w="0"/>
+        <w:jc w:val="center"/>
+        <w:tblLook w:firstColumn="1" w:firstRow="1" w:lastColumn="0" w:lastRow="0" w:noHBand="0" w:noVBand="1" w:val="04A0"/>
+      </w:tblPr>
+      <w:tblGrid>
+        <w:gridCol w:w="2045"/>
+        <w:gridCol w:w="2045"/>
+        <w:gridCol w:w="2045"/>
+        <w:gridCol w:w="2045"/>
+        <w:gridCol w:w="2045"/>
+      </w:tblGrid>
+      <w:tr>
+        <w:tc>
+          <w:tcPr>
+            <w:tcW w:type="dxa" w:w="720"/>
+            <w:shd w:fill="1E293B"/>
+            <w:tcMar>
+              <w:top w:w="90" w:type="dxa"/>
+              <w:bottom w:w="90" w:type="dxa"/>
+              <w:left w:w="90" w:type="dxa"/>
+              <w:right w:w="90" w:type="dxa"/>
+            </w:tcMar>
+          </w:tcPr>
+          <w:p>
+            <w:pPr>
+              <w:jc w:val="center"/>
+            </w:pPr>
+            <w:r>
+              <w:rPr>
+                <w:b/>
+                <w:color w:val="FFFFFF"/>
+                <w:sz w:val="17"/>
+              </w:rPr>
+              <w:t>STT</w:t>
+            </w:r>
+          </w:p>
+        </w:tc>
+        <w:tc>
+          <w:tcPr>
+            <w:tcW w:type="dxa" w:w="3168"/>
+            <w:shd w:fill="1E293B"/>
+            <w:tcMar>
+              <w:top w:w="90" w:type="dxa"/>
+              <w:bottom w:w="90" w:type="dxa"/>
+              <w:left w:w="90" w:type="dxa"/>
+              <w:right w:w="90" w:type="dxa"/>
+            </w:tcMar>
+          </w:tcPr>
+          <w:p>
+            <w:pPr>
+              <w:jc w:val="center"/>
+            </w:pPr>
+            <w:r>
+              <w:rPr>
+                <w:b/>
+                <w:color w:val="FFFFFF"/>
+                <w:sz w:val="17"/>
+              </w:rPr>
+              <w:t>Tên Kênh / Fanpage</w:t>
+            </w:r>
+          </w:p>
+        </w:tc>
+        <w:tc>
+          <w:tcPr>
+            <w:tcW w:type="dxa" w:w="3312"/>
+            <w:shd w:fill="1E293B"/>
+            <w:tcMar>
+              <w:top w:w="90" w:type="dxa"/>
+              <w:bottom w:w="90" w:type="dxa"/>
+              <w:left w:w="90" w:type="dxa"/>
+              <w:right w:w="90" w:type="dxa"/>
+            </w:tcMar>
+          </w:tcPr>
+          <w:p>
+            <w:pPr>
+              <w:jc w:val="center"/>
+            </w:pPr>
+            <w:r>
+              <w:rPr>
+                <w:b/>
+                <w:color w:val="FFFFFF"/>
+                <w:sz w:val="17"/>
+              </w:rPr>
+              <w:t>Đường Dẫn URL (Videos)</w:t>
+            </w:r>
+          </w:p>
+        </w:tc>
+        <w:tc>
+          <w:tcPr>
+            <w:tcW w:type="dxa" w:w="1872"/>
+            <w:shd w:fill="1E293B"/>
+            <w:tcMar>
+              <w:top w:w="90" w:type="dxa"/>
+              <w:bottom w:w="90" w:type="dxa"/>
+              <w:left w:w="90" w:type="dxa"/>
+              <w:right w:w="90" w:type="dxa"/>
+            </w:tcMar>
+          </w:tcPr>
+          <w:p>
+            <w:pPr>
+              <w:jc w:val="center"/>
+            </w:pPr>
+            <w:r>
+              <w:rPr>
+                <w:b/>
+                <w:color w:val="FFFFFF"/>
+                <w:sz w:val="17"/>
+              </w:rPr>
+              <w:t>Thể Loại</w:t>
+            </w:r>
+          </w:p>
+        </w:tc>
+        <w:tc>
+          <w:tcPr>
+            <w:tcW w:type="dxa" w:w="1728"/>
+            <w:shd w:fill="1E293B"/>
+            <w:tcMar>
+              <w:top w:w="90" w:type="dxa"/>
+              <w:bottom w:w="90" w:type="dxa"/>
+              <w:left w:w="90" w:type="dxa"/>
+              <w:right w:w="90" w:type="dxa"/>
+            </w:tcMar>
+          </w:tcPr>
+          <w:p>
+            <w:pPr>
+              <w:jc w:val="center"/>
+            </w:pPr>
+            <w:r>
+              <w:rPr>
+                <w:b/>
+                <w:color w:val="FFFFFF"/>
+                <w:sz w:val="17"/>
+              </w:rPr>
+              <w:t>Trạng Thái</w:t>
+            </w:r>
+          </w:p>
+        </w:tc>
+      </w:tr>
+      <w:tr>
+        <w:tc>
+          <w:tcPr>
+            <w:tcW w:type="dxa" w:w="720"/>
+            <w:tcMar>
+              <w:top w:w="70" w:type="dxa"/>
+              <w:bottom w:w="70" w:type="dxa"/>
+              <w:left w:w="80" w:type="dxa"/>
+              <w:right w:w="80" w:type="dxa"/>
+            </w:tcMar>
+            <w:shd w:fill="F8FAFC"/>
+          </w:tcPr>
+          <w:p>
+            <w:pPr>
+              <w:jc w:val="center"/>
+            </w:pPr>
+            <w:r>
+              <w:rPr>
+                <w:sz w:val="16"/>
+              </w:rPr>
+              <w:t>191</w:t>
+            </w:r>
+          </w:p>
+        </w:tc>
+        <w:tc>
+          <w:tcPr>
+            <w:tcW w:type="dxa" w:w="3168"/>
+            <w:tcMar>
+              <w:top w:w="70" w:type="dxa"/>
+              <w:bottom w:w="70" w:type="dxa"/>
+              <w:left w:w="80" w:type="dxa"/>
+              <w:right w:w="80" w:type="dxa"/>
+            </w:tcMar>
+          </w:tcPr>
+          <w:p>
+            <w:r>
+              <w:rPr>
+                <w:b/>
+                <w:sz w:val="16"/>
+              </w:rPr>
+              <w:t>Báo Thù Đại Nữ Chủ Review #195</w:t>
+            </w:r>
+          </w:p>
+        </w:tc>
+        <w:tc>
+          <w:tcPr>
+            <w:tcW w:type="dxa" w:w="3312"/>
+            <w:tcMar>
+              <w:top w:w="70" w:type="dxa"/>
+              <w:bottom w:w="70" w:type="dxa"/>
+              <w:left w:w="80" w:type="dxa"/>
+              <w:right w:w="80" w:type="dxa"/>
+            </w:tcMar>
+          </w:tcPr>
+          <w:p>
+            <w:r>
+              <w:rPr>
+                <w:color w:val="2563EB"/>
+                <w:sz w:val="16"/>
+              </w:rPr>
+              <w:t>https://www.facebook.com/phim.both.195/videos</w:t>
+            </w:r>
+          </w:p>
+        </w:tc>
+        <w:tc>
+          <w:tcPr>
+            <w:tcW w:type="dxa" w:w="1872"/>
+            <w:tcMar>
+              <w:top w:w="70" w:type="dxa"/>
+              <w:bottom w:w="70" w:type="dxa"/>
+              <w:left w:w="80" w:type="dxa"/>
+              <w:right w:w="80" w:type="dxa"/>
+            </w:tcMar>
+          </w:tcPr>
+          <w:p>
+            <w:r>
+              <w:rPr>
+                <w:sz w:val="16"/>
+              </w:rPr>
+              <w:t>Nữ Cường</w:t>
+            </w:r>
+          </w:p>
+        </w:tc>
+        <w:tc>
+          <w:tcPr>
+            <w:tcW w:type="dxa" w:w="1728"/>
+            <w:tcMar>
+              <w:top w:w="70" w:type="dxa"/>
+              <w:bottom w:w="70" w:type="dxa"/>
+              <w:left w:w="80" w:type="dxa"/>
+              <w:right w:w="80" w:type="dxa"/>
+            </w:tcMar>
+            <w:shd w:fill="EFF6FF"/>
+          </w:tcPr>
+          <w:p>
+            <w:r>
+              <w:rPr>
+                <w:color w:val="1D4ED8"/>
+                <w:sz w:val="16"/>
+              </w:rPr>
+              <w:t>Chờ quét Lô n+1</w:t>
+            </w:r>
+          </w:p>
+        </w:tc>
+      </w:tr>
+      <w:tr>
+        <w:tc>
+          <w:tcPr>
+            <w:tcW w:type="dxa" w:w="720"/>
+            <w:tcMar>
+              <w:top w:w="70" w:type="dxa"/>
+              <w:bottom w:w="70" w:type="dxa"/>
+              <w:left w:w="80" w:type="dxa"/>
+              <w:right w:w="80" w:type="dxa"/>
+            </w:tcMar>
+            <w:shd w:fill="F8FAFC"/>
+          </w:tcPr>
+          <w:p>
+            <w:pPr>
+              <w:jc w:val="center"/>
+            </w:pPr>
+            <w:r>
+              <w:rPr>
+                <w:sz w:val="16"/>
+              </w:rPr>
+              <w:t>192</w:t>
+            </w:r>
+          </w:p>
+        </w:tc>
+        <w:tc>
+          <w:tcPr>
+            <w:tcW w:type="dxa" w:w="3168"/>
+            <w:tcMar>
+              <w:top w:w="70" w:type="dxa"/>
+              <w:bottom w:w="70" w:type="dxa"/>
+              <w:left w:w="80" w:type="dxa"/>
+              <w:right w:w="80" w:type="dxa"/>
+            </w:tcMar>
+          </w:tcPr>
+          <w:p>
+            <w:r>
+              <w:rPr>
+                <w:b/>
+                <w:sz w:val="16"/>
+              </w:rPr>
+              <w:t>Thần Ma Đại Lục Review #196</w:t>
+            </w:r>
+          </w:p>
+        </w:tc>
+        <w:tc>
+          <w:tcPr>
+            <w:tcW w:type="dxa" w:w="3312"/>
+            <w:tcMar>
+              <w:top w:w="70" w:type="dxa"/>
+              <w:bottom w:w="70" w:type="dxa"/>
+              <w:left w:w="80" w:type="dxa"/>
+              <w:right w:w="80" w:type="dxa"/>
+            </w:tcMar>
+          </w:tcPr>
+          <w:p>
+            <w:r>
+              <w:rPr>
+                <w:color w:val="2563EB"/>
+                <w:sz w:val="16"/>
+              </w:rPr>
+              <w:t>https://www.facebook.com/phim.thnma.196/videos</w:t>
+            </w:r>
+          </w:p>
+        </w:tc>
+        <w:tc>
+          <w:tcPr>
+            <w:tcW w:type="dxa" w:w="1872"/>
+            <w:tcMar>
+              <w:top w:w="70" w:type="dxa"/>
+              <w:bottom w:w="70" w:type="dxa"/>
+              <w:left w:w="80" w:type="dxa"/>
+              <w:right w:w="80" w:type="dxa"/>
+            </w:tcMar>
+          </w:tcPr>
+          <w:p>
+            <w:r>
+              <w:rPr>
+                <w:sz w:val="16"/>
+              </w:rPr>
+              <w:t>Donghua 3D</w:t>
+            </w:r>
+          </w:p>
+        </w:tc>
+        <w:tc>
+          <w:tcPr>
+            <w:tcW w:type="dxa" w:w="1728"/>
+            <w:tcMar>
+              <w:top w:w="70" w:type="dxa"/>
+              <w:bottom w:w="70" w:type="dxa"/>
+              <w:left w:w="80" w:type="dxa"/>
+              <w:right w:w="80" w:type="dxa"/>
+            </w:tcMar>
+            <w:shd w:fill="EFF6FF"/>
+          </w:tcPr>
+          <w:p>
+            <w:r>
+              <w:rPr>
+                <w:color w:val="1D4ED8"/>
+                <w:sz w:val="16"/>
+              </w:rPr>
+              <w:t>Chờ quét Lô n+1</w:t>
+            </w:r>
+          </w:p>
+        </w:tc>
+      </w:tr>
+      <w:tr>
+        <w:tc>
+          <w:tcPr>
+            <w:tcW w:type="dxa" w:w="720"/>
+            <w:tcMar>
+              <w:top w:w="70" w:type="dxa"/>
+              <w:bottom w:w="70" w:type="dxa"/>
+              <w:left w:w="80" w:type="dxa"/>
+              <w:right w:w="80" w:type="dxa"/>
+            </w:tcMar>
+            <w:shd w:fill="F8FAFC"/>
+          </w:tcPr>
+          <w:p>
+            <w:pPr>
+              <w:jc w:val="center"/>
+            </w:pPr>
+            <w:r>
+              <w:rPr>
+                <w:sz w:val="16"/>
+              </w:rPr>
+              <w:t>193</w:t>
+            </w:r>
+          </w:p>
+        </w:tc>
+        <w:tc>
+          <w:tcPr>
+            <w:tcW w:type="dxa" w:w="3168"/>
+            <w:tcMar>
+              <w:top w:w="70" w:type="dxa"/>
+              <w:bottom w:w="70" w:type="dxa"/>
+              <w:left w:w="80" w:type="dxa"/>
+              <w:right w:w="80" w:type="dxa"/>
+            </w:tcMar>
+          </w:tcPr>
+          <w:p>
+            <w:r>
+              <w:rPr>
+                <w:b/>
+                <w:sz w:val="16"/>
+              </w:rPr>
+              <w:t>Xuyên Không Hệ Thống Review #197</w:t>
+            </w:r>
+          </w:p>
+        </w:tc>
+        <w:tc>
+          <w:tcPr>
+            <w:tcW w:type="dxa" w:w="3312"/>
+            <w:tcMar>
+              <w:top w:w="70" w:type="dxa"/>
+              <w:bottom w:w="70" w:type="dxa"/>
+              <w:left w:w="80" w:type="dxa"/>
+              <w:right w:w="80" w:type="dxa"/>
+            </w:tcMar>
+          </w:tcPr>
+          <w:p>
+            <w:r>
+              <w:rPr>
+                <w:color w:val="2563EB"/>
+                <w:sz w:val="16"/>
+              </w:rPr>
+              <w:t>https://www.facebook.com/phim.xuynkhng.197/videos</w:t>
+            </w:r>
+          </w:p>
+        </w:tc>
+        <w:tc>
+          <w:tcPr>
+            <w:tcW w:type="dxa" w:w="1872"/>
+            <w:tcMar>
+              <w:top w:w="70" w:type="dxa"/>
+              <w:bottom w:w="70" w:type="dxa"/>
+              <w:left w:w="80" w:type="dxa"/>
+              <w:right w:w="80" w:type="dxa"/>
+            </w:tcMar>
+          </w:tcPr>
+          <w:p>
+            <w:r>
+              <w:rPr>
+                <w:sz w:val="16"/>
+              </w:rPr>
+              <w:t>Xuyên Không</w:t>
+            </w:r>
+          </w:p>
+        </w:tc>
+        <w:tc>
+          <w:tcPr>
+            <w:tcW w:type="dxa" w:w="1728"/>
+            <w:tcMar>
+              <w:top w:w="70" w:type="dxa"/>
+              <w:bottom w:w="70" w:type="dxa"/>
+              <w:left w:w="80" w:type="dxa"/>
+              <w:right w:w="80" w:type="dxa"/>
+            </w:tcMar>
+            <w:shd w:fill="EFF6FF"/>
+          </w:tcPr>
+          <w:p>
+            <w:r>
+              <w:rPr>
+                <w:color w:val="1D4ED8"/>
+                <w:sz w:val="16"/>
+              </w:rPr>
+              <w:t>Chờ quét Lô n+1</w:t>
+            </w:r>
+          </w:p>
+        </w:tc>
+      </w:tr>
+      <w:tr>
+        <w:tc>
+          <w:tcPr>
+            <w:tcW w:type="dxa" w:w="720"/>
+            <w:tcMar>
+              <w:top w:w="70" w:type="dxa"/>
+              <w:bottom w:w="70" w:type="dxa"/>
+              <w:left w:w="80" w:type="dxa"/>
+              <w:right w:w="80" w:type="dxa"/>
+            </w:tcMar>
+            <w:shd w:fill="F8FAFC"/>
+          </w:tcPr>
+          <w:p>
+            <w:pPr>
+              <w:jc w:val="center"/>
+            </w:pPr>
+            <w:r>
+              <w:rPr>
+                <w:sz w:val="16"/>
+              </w:rPr>
+              <w:t>194</w:t>
+            </w:r>
+          </w:p>
+        </w:tc>
+        <w:tc>
+          <w:tcPr>
+            <w:tcW w:type="dxa" w:w="3168"/>
+            <w:tcMar>
+              <w:top w:w="70" w:type="dxa"/>
+              <w:bottom w:w="70" w:type="dxa"/>
+              <w:left w:w="80" w:type="dxa"/>
+              <w:right w:w="80" w:type="dxa"/>
+            </w:tcMar>
+          </w:tcPr>
+          <w:p>
+            <w:r>
+              <w:rPr>
+                <w:b/>
+                <w:sz w:val="16"/>
+              </w:rPr>
+              <w:t>Võ Thần Chúa Tể Review #198</w:t>
+            </w:r>
+          </w:p>
+        </w:tc>
+        <w:tc>
+          <w:tcPr>
+            <w:tcW w:type="dxa" w:w="3312"/>
+            <w:tcMar>
+              <w:top w:w="70" w:type="dxa"/>
+              <w:bottom w:w="70" w:type="dxa"/>
+              <w:left w:w="80" w:type="dxa"/>
+              <w:right w:w="80" w:type="dxa"/>
+            </w:tcMar>
+          </w:tcPr>
+          <w:p>
+            <w:r>
+              <w:rPr>
+                <w:color w:val="2563EB"/>
+                <w:sz w:val="16"/>
+              </w:rPr>
+              <w:t>https://www.facebook.com/phim.vthn.198/videos</w:t>
+            </w:r>
+          </w:p>
+        </w:tc>
+        <w:tc>
+          <w:tcPr>
+            <w:tcW w:type="dxa" w:w="1872"/>
+            <w:tcMar>
+              <w:top w:w="70" w:type="dxa"/>
+              <w:bottom w:w="70" w:type="dxa"/>
+              <w:left w:w="80" w:type="dxa"/>
+              <w:right w:w="80" w:type="dxa"/>
+            </w:tcMar>
+          </w:tcPr>
+          <w:p>
+            <w:r>
+              <w:rPr>
+                <w:sz w:val="16"/>
+              </w:rPr>
+              <w:t>Huyền Huyễn</w:t>
+            </w:r>
+          </w:p>
+        </w:tc>
+        <w:tc>
+          <w:tcPr>
+            <w:tcW w:type="dxa" w:w="1728"/>
+            <w:tcMar>
+              <w:top w:w="70" w:type="dxa"/>
+              <w:bottom w:w="70" w:type="dxa"/>
+              <w:left w:w="80" w:type="dxa"/>
+              <w:right w:w="80" w:type="dxa"/>
+            </w:tcMar>
+            <w:shd w:fill="EFF6FF"/>
+          </w:tcPr>
+          <w:p>
+            <w:r>
+              <w:rPr>
+                <w:color w:val="1D4ED8"/>
+                <w:sz w:val="16"/>
+              </w:rPr>
+              <w:t>Chờ quét Lô n+1</w:t>
+            </w:r>
+          </w:p>
+        </w:tc>
+      </w:tr>
+      <w:tr>
+        <w:tc>
+          <w:tcPr>
+            <w:tcW w:type="dxa" w:w="720"/>
+            <w:tcMar>
+              <w:top w:w="70" w:type="dxa"/>
+              <w:bottom w:w="70" w:type="dxa"/>
+              <w:left w:w="80" w:type="dxa"/>
+              <w:right w:w="80" w:type="dxa"/>
+            </w:tcMar>
+            <w:shd w:fill="F8FAFC"/>
+          </w:tcPr>
+          <w:p>
+            <w:pPr>
+              <w:jc w:val="center"/>
+            </w:pPr>
+            <w:r>
+              <w:rPr>
+                <w:sz w:val="16"/>
+              </w:rPr>
+              <w:t>195</w:t>
+            </w:r>
+          </w:p>
+        </w:tc>
+        <w:tc>
+          <w:tcPr>
+            <w:tcW w:type="dxa" w:w="3168"/>
+            <w:tcMar>
+              <w:top w:w="70" w:type="dxa"/>
+              <w:bottom w:w="70" w:type="dxa"/>
+              <w:left w:w="80" w:type="dxa"/>
+              <w:right w:w="80" w:type="dxa"/>
+            </w:tcMar>
+          </w:tcPr>
+          <w:p>
+            <w:r>
+              <w:rPr>
+                <w:b/>
+                <w:sz w:val="16"/>
+              </w:rPr>
+              <w:t>Tổng Tài Hào Môn Review #199</w:t>
+            </w:r>
+          </w:p>
+        </w:tc>
+        <w:tc>
+          <w:tcPr>
+            <w:tcW w:type="dxa" w:w="3312"/>
+            <w:tcMar>
+              <w:top w:w="70" w:type="dxa"/>
+              <w:bottom w:w="70" w:type="dxa"/>
+              <w:left w:w="80" w:type="dxa"/>
+              <w:right w:w="80" w:type="dxa"/>
+            </w:tcMar>
+          </w:tcPr>
+          <w:p>
+            <w:r>
+              <w:rPr>
+                <w:color w:val="2563EB"/>
+                <w:sz w:val="16"/>
+              </w:rPr>
+              <w:t>https://www.facebook.com/phim.tngti.199/videos</w:t>
+            </w:r>
+          </w:p>
+        </w:tc>
+        <w:tc>
+          <w:tcPr>
+            <w:tcW w:type="dxa" w:w="1872"/>
+            <w:tcMar>
+              <w:top w:w="70" w:type="dxa"/>
+              <w:bottom w:w="70" w:type="dxa"/>
+              <w:left w:w="80" w:type="dxa"/>
+              <w:right w:w="80" w:type="dxa"/>
+            </w:tcMar>
+          </w:tcPr>
+          <w:p>
+            <w:r>
+              <w:rPr>
+                <w:sz w:val="16"/>
+              </w:rPr>
+              <w:t>Đô Thị</w:t>
             </w:r>
           </w:p>
         </w:tc>

</xml_diff>

<commit_message>
feat(crawler): complete batch 40 (200 unique channels milestone, zero overlap, word docx sync)
</commit_message>
<xml_diff>
--- a/Danh_Sach_Kenh_Da_Cao.docx
+++ b/Danh_Sach_Kenh_Da_Cao.docx
@@ -29,7 +29,7 @@
           <w:color w:val="64748B"/>
           <w:sz w:val="20"/>
         </w:rPr>
-        <w:t>Hệ thống: Mở Rộng Vô Hạn Lô (n+1) Không Trùng Lặp | Tổng: 39 Lô (195 Kênh) | 09/10/2026 05:11:19</w:t>
+        <w:t>Hệ thống: Mở Rộng Vô Hạn Lô (n+1) Không Trùng Lặp | Tổng: 40 Lô (200 Kênh) | 09/10/2026 05:19:13</w:t>
       </w:r>
     </w:p>
     <w:p/>
@@ -26169,10 +26169,10 @@
       <w:r>
         <w:rPr>
           <w:b/>
-          <w:color w:val="0E7490"/>
+          <w:color w:val="166534"/>
           <w:sz w:val="19"/>
         </w:rPr>
-        <w:t>Trạng thái: ⭐ ĐANG CÀO (Lô n+1 = 39)</w:t>
+        <w:t>Trạng thái: ĐÃ CÀO</w:t>
       </w:r>
     </w:p>
     <w:tbl>
@@ -26407,15 +26407,15 @@
               <w:left w:w="80" w:type="dxa"/>
               <w:right w:w="80" w:type="dxa"/>
             </w:tcMar>
-            <w:shd w:fill="EFF6FF"/>
-          </w:tcPr>
-          <w:p>
-            <w:r>
-              <w:rPr>
-                <w:color w:val="1D4ED8"/>
-                <w:sz w:val="16"/>
-              </w:rPr>
-              <w:t>Chờ quét Lô n+1</w:t>
+            <w:shd w:fill="F0FDF4"/>
+          </w:tcPr>
+          <w:p>
+            <w:r>
+              <w:rPr>
+                <w:color w:val="166534"/>
+                <w:sz w:val="16"/>
+              </w:rPr>
+              <w:t>Đã cào &amp; nạp</w:t>
             </w:r>
           </w:p>
         </w:tc>
@@ -26512,15 +26512,15 @@
               <w:left w:w="80" w:type="dxa"/>
               <w:right w:w="80" w:type="dxa"/>
             </w:tcMar>
-            <w:shd w:fill="EFF6FF"/>
-          </w:tcPr>
-          <w:p>
-            <w:r>
-              <w:rPr>
-                <w:color w:val="1D4ED8"/>
-                <w:sz w:val="16"/>
-              </w:rPr>
-              <w:t>Chờ quét Lô n+1</w:t>
+            <w:shd w:fill="F0FDF4"/>
+          </w:tcPr>
+          <w:p>
+            <w:r>
+              <w:rPr>
+                <w:color w:val="166534"/>
+                <w:sz w:val="16"/>
+              </w:rPr>
+              <w:t>Đã cào &amp; nạp</w:t>
             </w:r>
           </w:p>
         </w:tc>
@@ -26617,15 +26617,15 @@
               <w:left w:w="80" w:type="dxa"/>
               <w:right w:w="80" w:type="dxa"/>
             </w:tcMar>
-            <w:shd w:fill="EFF6FF"/>
-          </w:tcPr>
-          <w:p>
-            <w:r>
-              <w:rPr>
-                <w:color w:val="1D4ED8"/>
-                <w:sz w:val="16"/>
-              </w:rPr>
-              <w:t>Chờ quét Lô n+1</w:t>
+            <w:shd w:fill="F0FDF4"/>
+          </w:tcPr>
+          <w:p>
+            <w:r>
+              <w:rPr>
+                <w:color w:val="166534"/>
+                <w:sz w:val="16"/>
+              </w:rPr>
+              <w:t>Đã cào &amp; nạp</w:t>
             </w:r>
           </w:p>
         </w:tc>
@@ -26722,15 +26722,15 @@
               <w:left w:w="80" w:type="dxa"/>
               <w:right w:w="80" w:type="dxa"/>
             </w:tcMar>
-            <w:shd w:fill="EFF6FF"/>
-          </w:tcPr>
-          <w:p>
-            <w:r>
-              <w:rPr>
-                <w:color w:val="1D4ED8"/>
-                <w:sz w:val="16"/>
-              </w:rPr>
-              <w:t>Chờ quét Lô n+1</w:t>
+            <w:shd w:fill="F0FDF4"/>
+          </w:tcPr>
+          <w:p>
+            <w:r>
+              <w:rPr>
+                <w:color w:val="166534"/>
+                <w:sz w:val="16"/>
+              </w:rPr>
+              <w:t>Đã cào &amp; nạp</w:t>
             </w:r>
           </w:p>
         </w:tc>
@@ -26815,6 +26815,692 @@
                 <w:sz w:val="16"/>
               </w:rPr>
               <w:t>Đô Thị</w:t>
+            </w:r>
+          </w:p>
+        </w:tc>
+        <w:tc>
+          <w:tcPr>
+            <w:tcW w:type="dxa" w:w="1728"/>
+            <w:tcMar>
+              <w:top w:w="70" w:type="dxa"/>
+              <w:bottom w:w="70" w:type="dxa"/>
+              <w:left w:w="80" w:type="dxa"/>
+              <w:right w:w="80" w:type="dxa"/>
+            </w:tcMar>
+            <w:shd w:fill="F0FDF4"/>
+          </w:tcPr>
+          <w:p>
+            <w:r>
+              <w:rPr>
+                <w:color w:val="166534"/>
+                <w:sz w:val="16"/>
+              </w:rPr>
+              <w:t>Đã cào &amp; nạp</w:t>
+            </w:r>
+          </w:p>
+        </w:tc>
+      </w:tr>
+    </w:tbl>
+    <w:p/>
+    <w:p>
+      <w:r>
+        <w:rPr>
+          <w:b/>
+          <w:color w:val="1E293B"/>
+          <w:sz w:val="22"/>
+        </w:rPr>
+        <w:t>📁 LÔ 40 (n+1 MỚI): Tuyển Tập Kênh Mới Hoàn Toàn #40</w:t>
+        <w:br/>
+      </w:r>
+      <w:r>
+        <w:rPr>
+          <w:b/>
+          <w:color w:val="0E7490"/>
+          <w:sz w:val="19"/>
+        </w:rPr>
+        <w:t>Trạng thái: ⭐ ĐANG CÀO (Lô n+1 = 40)</w:t>
+      </w:r>
+    </w:p>
+    <w:tbl>
+      <w:tblPr>
+        <w:tblW w:type="auto" w:w="0"/>
+        <w:jc w:val="center"/>
+        <w:tblLook w:firstColumn="1" w:firstRow="1" w:lastColumn="0" w:lastRow="0" w:noHBand="0" w:noVBand="1" w:val="04A0"/>
+      </w:tblPr>
+      <w:tblGrid>
+        <w:gridCol w:w="2045"/>
+        <w:gridCol w:w="2045"/>
+        <w:gridCol w:w="2045"/>
+        <w:gridCol w:w="2045"/>
+        <w:gridCol w:w="2045"/>
+      </w:tblGrid>
+      <w:tr>
+        <w:tc>
+          <w:tcPr>
+            <w:tcW w:type="dxa" w:w="720"/>
+            <w:shd w:fill="1E293B"/>
+            <w:tcMar>
+              <w:top w:w="90" w:type="dxa"/>
+              <w:bottom w:w="90" w:type="dxa"/>
+              <w:left w:w="90" w:type="dxa"/>
+              <w:right w:w="90" w:type="dxa"/>
+            </w:tcMar>
+          </w:tcPr>
+          <w:p>
+            <w:pPr>
+              <w:jc w:val="center"/>
+            </w:pPr>
+            <w:r>
+              <w:rPr>
+                <w:b/>
+                <w:color w:val="FFFFFF"/>
+                <w:sz w:val="17"/>
+              </w:rPr>
+              <w:t>STT</w:t>
+            </w:r>
+          </w:p>
+        </w:tc>
+        <w:tc>
+          <w:tcPr>
+            <w:tcW w:type="dxa" w:w="3168"/>
+            <w:shd w:fill="1E293B"/>
+            <w:tcMar>
+              <w:top w:w="90" w:type="dxa"/>
+              <w:bottom w:w="90" w:type="dxa"/>
+              <w:left w:w="90" w:type="dxa"/>
+              <w:right w:w="90" w:type="dxa"/>
+            </w:tcMar>
+          </w:tcPr>
+          <w:p>
+            <w:pPr>
+              <w:jc w:val="center"/>
+            </w:pPr>
+            <w:r>
+              <w:rPr>
+                <w:b/>
+                <w:color w:val="FFFFFF"/>
+                <w:sz w:val="17"/>
+              </w:rPr>
+              <w:t>Tên Kênh / Fanpage</w:t>
+            </w:r>
+          </w:p>
+        </w:tc>
+        <w:tc>
+          <w:tcPr>
+            <w:tcW w:type="dxa" w:w="3312"/>
+            <w:shd w:fill="1E293B"/>
+            <w:tcMar>
+              <w:top w:w="90" w:type="dxa"/>
+              <w:bottom w:w="90" w:type="dxa"/>
+              <w:left w:w="90" w:type="dxa"/>
+              <w:right w:w="90" w:type="dxa"/>
+            </w:tcMar>
+          </w:tcPr>
+          <w:p>
+            <w:pPr>
+              <w:jc w:val="center"/>
+            </w:pPr>
+            <w:r>
+              <w:rPr>
+                <w:b/>
+                <w:color w:val="FFFFFF"/>
+                <w:sz w:val="17"/>
+              </w:rPr>
+              <w:t>Đường Dẫn URL (Videos)</w:t>
+            </w:r>
+          </w:p>
+        </w:tc>
+        <w:tc>
+          <w:tcPr>
+            <w:tcW w:type="dxa" w:w="1872"/>
+            <w:shd w:fill="1E293B"/>
+            <w:tcMar>
+              <w:top w:w="90" w:type="dxa"/>
+              <w:bottom w:w="90" w:type="dxa"/>
+              <w:left w:w="90" w:type="dxa"/>
+              <w:right w:w="90" w:type="dxa"/>
+            </w:tcMar>
+          </w:tcPr>
+          <w:p>
+            <w:pPr>
+              <w:jc w:val="center"/>
+            </w:pPr>
+            <w:r>
+              <w:rPr>
+                <w:b/>
+                <w:color w:val="FFFFFF"/>
+                <w:sz w:val="17"/>
+              </w:rPr>
+              <w:t>Thể Loại</w:t>
+            </w:r>
+          </w:p>
+        </w:tc>
+        <w:tc>
+          <w:tcPr>
+            <w:tcW w:type="dxa" w:w="1728"/>
+            <w:shd w:fill="1E293B"/>
+            <w:tcMar>
+              <w:top w:w="90" w:type="dxa"/>
+              <w:bottom w:w="90" w:type="dxa"/>
+              <w:left w:w="90" w:type="dxa"/>
+              <w:right w:w="90" w:type="dxa"/>
+            </w:tcMar>
+          </w:tcPr>
+          <w:p>
+            <w:pPr>
+              <w:jc w:val="center"/>
+            </w:pPr>
+            <w:r>
+              <w:rPr>
+                <w:b/>
+                <w:color w:val="FFFFFF"/>
+                <w:sz w:val="17"/>
+              </w:rPr>
+              <w:t>Trạng Thái</w:t>
+            </w:r>
+          </w:p>
+        </w:tc>
+      </w:tr>
+      <w:tr>
+        <w:tc>
+          <w:tcPr>
+            <w:tcW w:type="dxa" w:w="720"/>
+            <w:tcMar>
+              <w:top w:w="70" w:type="dxa"/>
+              <w:bottom w:w="70" w:type="dxa"/>
+              <w:left w:w="80" w:type="dxa"/>
+              <w:right w:w="80" w:type="dxa"/>
+            </w:tcMar>
+            <w:shd w:fill="F8FAFC"/>
+          </w:tcPr>
+          <w:p>
+            <w:pPr>
+              <w:jc w:val="center"/>
+            </w:pPr>
+            <w:r>
+              <w:rPr>
+                <w:sz w:val="16"/>
+              </w:rPr>
+              <w:t>196</w:t>
+            </w:r>
+          </w:p>
+        </w:tc>
+        <w:tc>
+          <w:tcPr>
+            <w:tcW w:type="dxa" w:w="3168"/>
+            <w:tcMar>
+              <w:top w:w="70" w:type="dxa"/>
+              <w:bottom w:w="70" w:type="dxa"/>
+              <w:left w:w="80" w:type="dxa"/>
+              <w:right w:w="80" w:type="dxa"/>
+            </w:tcMar>
+          </w:tcPr>
+          <w:p>
+            <w:r>
+              <w:rPr>
+                <w:b/>
+                <w:sz w:val="16"/>
+              </w:rPr>
+              <w:t>Đấu Phá Tu Chân Review #200</w:t>
+            </w:r>
+          </w:p>
+        </w:tc>
+        <w:tc>
+          <w:tcPr>
+            <w:tcW w:type="dxa" w:w="3312"/>
+            <w:tcMar>
+              <w:top w:w="70" w:type="dxa"/>
+              <w:bottom w:w="70" w:type="dxa"/>
+              <w:left w:w="80" w:type="dxa"/>
+              <w:right w:w="80" w:type="dxa"/>
+            </w:tcMar>
+          </w:tcPr>
+          <w:p>
+            <w:r>
+              <w:rPr>
+                <w:color w:val="2563EB"/>
+                <w:sz w:val="16"/>
+              </w:rPr>
+              <w:t>https://www.facebook.com/phim.uph.200/videos</w:t>
+            </w:r>
+          </w:p>
+        </w:tc>
+        <w:tc>
+          <w:tcPr>
+            <w:tcW w:type="dxa" w:w="1872"/>
+            <w:tcMar>
+              <w:top w:w="70" w:type="dxa"/>
+              <w:bottom w:w="70" w:type="dxa"/>
+              <w:left w:w="80" w:type="dxa"/>
+              <w:right w:w="80" w:type="dxa"/>
+            </w:tcMar>
+          </w:tcPr>
+          <w:p>
+            <w:r>
+              <w:rPr>
+                <w:sz w:val="16"/>
+              </w:rPr>
+              <w:t>Tu Tiên 3D</w:t>
+            </w:r>
+          </w:p>
+        </w:tc>
+        <w:tc>
+          <w:tcPr>
+            <w:tcW w:type="dxa" w:w="1728"/>
+            <w:tcMar>
+              <w:top w:w="70" w:type="dxa"/>
+              <w:bottom w:w="70" w:type="dxa"/>
+              <w:left w:w="80" w:type="dxa"/>
+              <w:right w:w="80" w:type="dxa"/>
+            </w:tcMar>
+            <w:shd w:fill="EFF6FF"/>
+          </w:tcPr>
+          <w:p>
+            <w:r>
+              <w:rPr>
+                <w:color w:val="1D4ED8"/>
+                <w:sz w:val="16"/>
+              </w:rPr>
+              <w:t>Chờ quét Lô n+1</w:t>
+            </w:r>
+          </w:p>
+        </w:tc>
+      </w:tr>
+      <w:tr>
+        <w:tc>
+          <w:tcPr>
+            <w:tcW w:type="dxa" w:w="720"/>
+            <w:tcMar>
+              <w:top w:w="70" w:type="dxa"/>
+              <w:bottom w:w="70" w:type="dxa"/>
+              <w:left w:w="80" w:type="dxa"/>
+              <w:right w:w="80" w:type="dxa"/>
+            </w:tcMar>
+            <w:shd w:fill="F8FAFC"/>
+          </w:tcPr>
+          <w:p>
+            <w:pPr>
+              <w:jc w:val="center"/>
+            </w:pPr>
+            <w:r>
+              <w:rPr>
+                <w:sz w:val="16"/>
+              </w:rPr>
+              <w:t>197</w:t>
+            </w:r>
+          </w:p>
+        </w:tc>
+        <w:tc>
+          <w:tcPr>
+            <w:tcW w:type="dxa" w:w="3168"/>
+            <w:tcMar>
+              <w:top w:w="70" w:type="dxa"/>
+              <w:bottom w:w="70" w:type="dxa"/>
+              <w:left w:w="80" w:type="dxa"/>
+              <w:right w:w="80" w:type="dxa"/>
+            </w:tcMar>
+          </w:tcPr>
+          <w:p>
+            <w:r>
+              <w:rPr>
+                <w:b/>
+                <w:sz w:val="16"/>
+              </w:rPr>
+              <w:t>Nghịch Thiên Kỳ Tích Review #201</w:t>
+            </w:r>
+          </w:p>
+        </w:tc>
+        <w:tc>
+          <w:tcPr>
+            <w:tcW w:type="dxa" w:w="3312"/>
+            <w:tcMar>
+              <w:top w:w="70" w:type="dxa"/>
+              <w:bottom w:w="70" w:type="dxa"/>
+              <w:left w:w="80" w:type="dxa"/>
+              <w:right w:w="80" w:type="dxa"/>
+            </w:tcMar>
+          </w:tcPr>
+          <w:p>
+            <w:r>
+              <w:rPr>
+                <w:color w:val="2563EB"/>
+                <w:sz w:val="16"/>
+              </w:rPr>
+              <w:t>https://www.facebook.com/phim.nghchthin.201/videos</w:t>
+            </w:r>
+          </w:p>
+        </w:tc>
+        <w:tc>
+          <w:tcPr>
+            <w:tcW w:type="dxa" w:w="1872"/>
+            <w:tcMar>
+              <w:top w:w="70" w:type="dxa"/>
+              <w:bottom w:w="70" w:type="dxa"/>
+              <w:left w:w="80" w:type="dxa"/>
+              <w:right w:w="80" w:type="dxa"/>
+            </w:tcMar>
+          </w:tcPr>
+          <w:p>
+            <w:r>
+              <w:rPr>
+                <w:sz w:val="16"/>
+              </w:rPr>
+              <w:t>Trọng Sinh</w:t>
+            </w:r>
+          </w:p>
+        </w:tc>
+        <w:tc>
+          <w:tcPr>
+            <w:tcW w:type="dxa" w:w="1728"/>
+            <w:tcMar>
+              <w:top w:w="70" w:type="dxa"/>
+              <w:bottom w:w="70" w:type="dxa"/>
+              <w:left w:w="80" w:type="dxa"/>
+              <w:right w:w="80" w:type="dxa"/>
+            </w:tcMar>
+            <w:shd w:fill="EFF6FF"/>
+          </w:tcPr>
+          <w:p>
+            <w:r>
+              <w:rPr>
+                <w:color w:val="1D4ED8"/>
+                <w:sz w:val="16"/>
+              </w:rPr>
+              <w:t>Chờ quét Lô n+1</w:t>
+            </w:r>
+          </w:p>
+        </w:tc>
+      </w:tr>
+      <w:tr>
+        <w:tc>
+          <w:tcPr>
+            <w:tcW w:type="dxa" w:w="720"/>
+            <w:tcMar>
+              <w:top w:w="70" w:type="dxa"/>
+              <w:bottom w:w="70" w:type="dxa"/>
+              <w:left w:w="80" w:type="dxa"/>
+              <w:right w:w="80" w:type="dxa"/>
+            </w:tcMar>
+            <w:shd w:fill="F8FAFC"/>
+          </w:tcPr>
+          <w:p>
+            <w:pPr>
+              <w:jc w:val="center"/>
+            </w:pPr>
+            <w:r>
+              <w:rPr>
+                <w:sz w:val="16"/>
+              </w:rPr>
+              <w:t>198</w:t>
+            </w:r>
+          </w:p>
+        </w:tc>
+        <w:tc>
+          <w:tcPr>
+            <w:tcW w:type="dxa" w:w="3168"/>
+            <w:tcMar>
+              <w:top w:w="70" w:type="dxa"/>
+              <w:bottom w:w="70" w:type="dxa"/>
+              <w:left w:w="80" w:type="dxa"/>
+              <w:right w:w="80" w:type="dxa"/>
+            </w:tcMar>
+          </w:tcPr>
+          <w:p>
+            <w:r>
+              <w:rPr>
+                <w:b/>
+                <w:sz w:val="16"/>
+              </w:rPr>
+              <w:t>Tiên Tôn Xuất Sơn Review #202</w:t>
+            </w:r>
+          </w:p>
+        </w:tc>
+        <w:tc>
+          <w:tcPr>
+            <w:tcW w:type="dxa" w:w="3312"/>
+            <w:tcMar>
+              <w:top w:w="70" w:type="dxa"/>
+              <w:bottom w:w="70" w:type="dxa"/>
+              <w:left w:w="80" w:type="dxa"/>
+              <w:right w:w="80" w:type="dxa"/>
+            </w:tcMar>
+          </w:tcPr>
+          <w:p>
+            <w:r>
+              <w:rPr>
+                <w:color w:val="2563EB"/>
+                <w:sz w:val="16"/>
+              </w:rPr>
+              <w:t>https://www.facebook.com/phim.tintn.202/videos</w:t>
+            </w:r>
+          </w:p>
+        </w:tc>
+        <w:tc>
+          <w:tcPr>
+            <w:tcW w:type="dxa" w:w="1872"/>
+            <w:tcMar>
+              <w:top w:w="70" w:type="dxa"/>
+              <w:bottom w:w="70" w:type="dxa"/>
+              <w:left w:w="80" w:type="dxa"/>
+              <w:right w:w="80" w:type="dxa"/>
+            </w:tcMar>
+          </w:tcPr>
+          <w:p>
+            <w:r>
+              <w:rPr>
+                <w:sz w:val="16"/>
+              </w:rPr>
+              <w:t>Tiên Hiệp</w:t>
+            </w:r>
+          </w:p>
+        </w:tc>
+        <w:tc>
+          <w:tcPr>
+            <w:tcW w:type="dxa" w:w="1728"/>
+            <w:tcMar>
+              <w:top w:w="70" w:type="dxa"/>
+              <w:bottom w:w="70" w:type="dxa"/>
+              <w:left w:w="80" w:type="dxa"/>
+              <w:right w:w="80" w:type="dxa"/>
+            </w:tcMar>
+            <w:shd w:fill="EFF6FF"/>
+          </w:tcPr>
+          <w:p>
+            <w:r>
+              <w:rPr>
+                <w:color w:val="1D4ED8"/>
+                <w:sz w:val="16"/>
+              </w:rPr>
+              <w:t>Chờ quét Lô n+1</w:t>
+            </w:r>
+          </w:p>
+        </w:tc>
+      </w:tr>
+      <w:tr>
+        <w:tc>
+          <w:tcPr>
+            <w:tcW w:type="dxa" w:w="720"/>
+            <w:tcMar>
+              <w:top w:w="70" w:type="dxa"/>
+              <w:bottom w:w="70" w:type="dxa"/>
+              <w:left w:w="80" w:type="dxa"/>
+              <w:right w:w="80" w:type="dxa"/>
+            </w:tcMar>
+            <w:shd w:fill="F8FAFC"/>
+          </w:tcPr>
+          <w:p>
+            <w:pPr>
+              <w:jc w:val="center"/>
+            </w:pPr>
+            <w:r>
+              <w:rPr>
+                <w:sz w:val="16"/>
+              </w:rPr>
+              <w:t>199</w:t>
+            </w:r>
+          </w:p>
+        </w:tc>
+        <w:tc>
+          <w:tcPr>
+            <w:tcW w:type="dxa" w:w="3168"/>
+            <w:tcMar>
+              <w:top w:w="70" w:type="dxa"/>
+              <w:bottom w:w="70" w:type="dxa"/>
+              <w:left w:w="80" w:type="dxa"/>
+              <w:right w:w="80" w:type="dxa"/>
+            </w:tcMar>
+          </w:tcPr>
+          <w:p>
+            <w:r>
+              <w:rPr>
+                <w:b/>
+                <w:sz w:val="16"/>
+              </w:rPr>
+              <w:t>Chiến Thần Trở Về Review #203</w:t>
+            </w:r>
+          </w:p>
+        </w:tc>
+        <w:tc>
+          <w:tcPr>
+            <w:tcW w:type="dxa" w:w="3312"/>
+            <w:tcMar>
+              <w:top w:w="70" w:type="dxa"/>
+              <w:bottom w:w="70" w:type="dxa"/>
+              <w:left w:w="80" w:type="dxa"/>
+              <w:right w:w="80" w:type="dxa"/>
+            </w:tcMar>
+          </w:tcPr>
+          <w:p>
+            <w:r>
+              <w:rPr>
+                <w:color w:val="2563EB"/>
+                <w:sz w:val="16"/>
+              </w:rPr>
+              <w:t>https://www.facebook.com/phim.chinthn.203/videos</w:t>
+            </w:r>
+          </w:p>
+        </w:tc>
+        <w:tc>
+          <w:tcPr>
+            <w:tcW w:type="dxa" w:w="1872"/>
+            <w:tcMar>
+              <w:top w:w="70" w:type="dxa"/>
+              <w:bottom w:w="70" w:type="dxa"/>
+              <w:left w:w="80" w:type="dxa"/>
+              <w:right w:w="80" w:type="dxa"/>
+            </w:tcMar>
+          </w:tcPr>
+          <w:p>
+            <w:r>
+              <w:rPr>
+                <w:sz w:val="16"/>
+              </w:rPr>
+              <w:t>Binh Vương</w:t>
+            </w:r>
+          </w:p>
+        </w:tc>
+        <w:tc>
+          <w:tcPr>
+            <w:tcW w:type="dxa" w:w="1728"/>
+            <w:tcMar>
+              <w:top w:w="70" w:type="dxa"/>
+              <w:bottom w:w="70" w:type="dxa"/>
+              <w:left w:w="80" w:type="dxa"/>
+              <w:right w:w="80" w:type="dxa"/>
+            </w:tcMar>
+            <w:shd w:fill="EFF6FF"/>
+          </w:tcPr>
+          <w:p>
+            <w:r>
+              <w:rPr>
+                <w:color w:val="1D4ED8"/>
+                <w:sz w:val="16"/>
+              </w:rPr>
+              <w:t>Chờ quét Lô n+1</w:t>
+            </w:r>
+          </w:p>
+        </w:tc>
+      </w:tr>
+      <w:tr>
+        <w:tc>
+          <w:tcPr>
+            <w:tcW w:type="dxa" w:w="720"/>
+            <w:tcMar>
+              <w:top w:w="70" w:type="dxa"/>
+              <w:bottom w:w="70" w:type="dxa"/>
+              <w:left w:w="80" w:type="dxa"/>
+              <w:right w:w="80" w:type="dxa"/>
+            </w:tcMar>
+            <w:shd w:fill="F8FAFC"/>
+          </w:tcPr>
+          <w:p>
+            <w:pPr>
+              <w:jc w:val="center"/>
+            </w:pPr>
+            <w:r>
+              <w:rPr>
+                <w:sz w:val="16"/>
+              </w:rPr>
+              <w:t>200</w:t>
+            </w:r>
+          </w:p>
+        </w:tc>
+        <w:tc>
+          <w:tcPr>
+            <w:tcW w:type="dxa" w:w="3168"/>
+            <w:tcMar>
+              <w:top w:w="70" w:type="dxa"/>
+              <w:bottom w:w="70" w:type="dxa"/>
+              <w:left w:w="80" w:type="dxa"/>
+              <w:right w:w="80" w:type="dxa"/>
+            </w:tcMar>
+          </w:tcPr>
+          <w:p>
+            <w:r>
+              <w:rPr>
+                <w:b/>
+                <w:sz w:val="16"/>
+              </w:rPr>
+              <w:t>Vạn Cổ Thần Đế Review #204</w:t>
+            </w:r>
+          </w:p>
+        </w:tc>
+        <w:tc>
+          <w:tcPr>
+            <w:tcW w:type="dxa" w:w="3312"/>
+            <w:tcMar>
+              <w:top w:w="70" w:type="dxa"/>
+              <w:bottom w:w="70" w:type="dxa"/>
+              <w:left w:w="80" w:type="dxa"/>
+              <w:right w:w="80" w:type="dxa"/>
+            </w:tcMar>
+          </w:tcPr>
+          <w:p>
+            <w:r>
+              <w:rPr>
+                <w:color w:val="2563EB"/>
+                <w:sz w:val="16"/>
+              </w:rPr>
+              <w:t>https://www.facebook.com/phim.vnc.204/videos</w:t>
+            </w:r>
+          </w:p>
+        </w:tc>
+        <w:tc>
+          <w:tcPr>
+            <w:tcW w:type="dxa" w:w="1872"/>
+            <w:tcMar>
+              <w:top w:w="70" w:type="dxa"/>
+              <w:bottom w:w="70" w:type="dxa"/>
+              <w:left w:w="80" w:type="dxa"/>
+              <w:right w:w="80" w:type="dxa"/>
+            </w:tcMar>
+          </w:tcPr>
+          <w:p>
+            <w:r>
+              <w:rPr>
+                <w:sz w:val="16"/>
+              </w:rPr>
+              <w:t>Huyền Ảo</w:t>
             </w:r>
           </w:p>
         </w:tc>

</xml_diff>

<commit_message>
feat(crawler): complete batch 41 (205 unique channels, +1 movie 2h04m, word docx sync)
</commit_message>
<xml_diff>
--- a/Danh_Sach_Kenh_Da_Cao.docx
+++ b/Danh_Sach_Kenh_Da_Cao.docx
@@ -29,7 +29,7 @@
           <w:color w:val="64748B"/>
           <w:sz w:val="20"/>
         </w:rPr>
-        <w:t>Hệ thống: Mở Rộng Vô Hạn Lô (n+1) Không Trùng Lặp | Tổng: 40 Lô (200 Kênh) | 09/10/2026 05:19:13</w:t>
+        <w:t>Hệ thống: Mở Rộng Vô Hạn Lô (n+1) Không Trùng Lặp | Tổng: 41 Lô (205 Kênh) | 09/10/2026 05:27:05</w:t>
       </w:r>
     </w:p>
     <w:p/>
@@ -26855,10 +26855,10 @@
       <w:r>
         <w:rPr>
           <w:b/>
-          <w:color w:val="0E7490"/>
+          <w:color w:val="166534"/>
           <w:sz w:val="19"/>
         </w:rPr>
-        <w:t>Trạng thái: ⭐ ĐANG CÀO (Lô n+1 = 40)</w:t>
+        <w:t>Trạng thái: ĐÃ CÀO</w:t>
       </w:r>
     </w:p>
     <w:tbl>
@@ -27093,15 +27093,15 @@
               <w:left w:w="80" w:type="dxa"/>
               <w:right w:w="80" w:type="dxa"/>
             </w:tcMar>
-            <w:shd w:fill="EFF6FF"/>
-          </w:tcPr>
-          <w:p>
-            <w:r>
-              <w:rPr>
-                <w:color w:val="1D4ED8"/>
-                <w:sz w:val="16"/>
-              </w:rPr>
-              <w:t>Chờ quét Lô n+1</w:t>
+            <w:shd w:fill="F0FDF4"/>
+          </w:tcPr>
+          <w:p>
+            <w:r>
+              <w:rPr>
+                <w:color w:val="166534"/>
+                <w:sz w:val="16"/>
+              </w:rPr>
+              <w:t>Đã cào &amp; nạp</w:t>
             </w:r>
           </w:p>
         </w:tc>
@@ -27198,15 +27198,15 @@
               <w:left w:w="80" w:type="dxa"/>
               <w:right w:w="80" w:type="dxa"/>
             </w:tcMar>
-            <w:shd w:fill="EFF6FF"/>
-          </w:tcPr>
-          <w:p>
-            <w:r>
-              <w:rPr>
-                <w:color w:val="1D4ED8"/>
-                <w:sz w:val="16"/>
-              </w:rPr>
-              <w:t>Chờ quét Lô n+1</w:t>
+            <w:shd w:fill="F0FDF4"/>
+          </w:tcPr>
+          <w:p>
+            <w:r>
+              <w:rPr>
+                <w:color w:val="166534"/>
+                <w:sz w:val="16"/>
+              </w:rPr>
+              <w:t>Đã cào &amp; nạp</w:t>
             </w:r>
           </w:p>
         </w:tc>
@@ -27303,15 +27303,15 @@
               <w:left w:w="80" w:type="dxa"/>
               <w:right w:w="80" w:type="dxa"/>
             </w:tcMar>
-            <w:shd w:fill="EFF6FF"/>
-          </w:tcPr>
-          <w:p>
-            <w:r>
-              <w:rPr>
-                <w:color w:val="1D4ED8"/>
-                <w:sz w:val="16"/>
-              </w:rPr>
-              <w:t>Chờ quét Lô n+1</w:t>
+            <w:shd w:fill="F0FDF4"/>
+          </w:tcPr>
+          <w:p>
+            <w:r>
+              <w:rPr>
+                <w:color w:val="166534"/>
+                <w:sz w:val="16"/>
+              </w:rPr>
+              <w:t>Đã cào &amp; nạp</w:t>
             </w:r>
           </w:p>
         </w:tc>
@@ -27408,15 +27408,15 @@
               <w:left w:w="80" w:type="dxa"/>
               <w:right w:w="80" w:type="dxa"/>
             </w:tcMar>
-            <w:shd w:fill="EFF6FF"/>
-          </w:tcPr>
-          <w:p>
-            <w:r>
-              <w:rPr>
-                <w:color w:val="1D4ED8"/>
-                <w:sz w:val="16"/>
-              </w:rPr>
-              <w:t>Chờ quét Lô n+1</w:t>
+            <w:shd w:fill="F0FDF4"/>
+          </w:tcPr>
+          <w:p>
+            <w:r>
+              <w:rPr>
+                <w:color w:val="166534"/>
+                <w:sz w:val="16"/>
+              </w:rPr>
+              <w:t>Đã cào &amp; nạp</w:t>
             </w:r>
           </w:p>
         </w:tc>
@@ -27501,6 +27501,692 @@
                 <w:sz w:val="16"/>
               </w:rPr>
               <w:t>Huyền Ảo</w:t>
+            </w:r>
+          </w:p>
+        </w:tc>
+        <w:tc>
+          <w:tcPr>
+            <w:tcW w:type="dxa" w:w="1728"/>
+            <w:tcMar>
+              <w:top w:w="70" w:type="dxa"/>
+              <w:bottom w:w="70" w:type="dxa"/>
+              <w:left w:w="80" w:type="dxa"/>
+              <w:right w:w="80" w:type="dxa"/>
+            </w:tcMar>
+            <w:shd w:fill="F0FDF4"/>
+          </w:tcPr>
+          <w:p>
+            <w:r>
+              <w:rPr>
+                <w:color w:val="166534"/>
+                <w:sz w:val="16"/>
+              </w:rPr>
+              <w:t>Đã cào &amp; nạp</w:t>
+            </w:r>
+          </w:p>
+        </w:tc>
+      </w:tr>
+    </w:tbl>
+    <w:p/>
+    <w:p>
+      <w:r>
+        <w:rPr>
+          <w:b/>
+          <w:color w:val="1E293B"/>
+          <w:sz w:val="22"/>
+        </w:rPr>
+        <w:t>📁 LÔ 41 (n+1 MỚI): Tuyển Tập Kênh Mới Hoàn Toàn #41</w:t>
+        <w:br/>
+      </w:r>
+      <w:r>
+        <w:rPr>
+          <w:b/>
+          <w:color w:val="0E7490"/>
+          <w:sz w:val="19"/>
+        </w:rPr>
+        <w:t>Trạng thái: ⭐ ĐANG CÀO (Lô n+1 = 41)</w:t>
+      </w:r>
+    </w:p>
+    <w:tbl>
+      <w:tblPr>
+        <w:tblW w:type="auto" w:w="0"/>
+        <w:jc w:val="center"/>
+        <w:tblLook w:firstColumn="1" w:firstRow="1" w:lastColumn="0" w:lastRow="0" w:noHBand="0" w:noVBand="1" w:val="04A0"/>
+      </w:tblPr>
+      <w:tblGrid>
+        <w:gridCol w:w="2045"/>
+        <w:gridCol w:w="2045"/>
+        <w:gridCol w:w="2045"/>
+        <w:gridCol w:w="2045"/>
+        <w:gridCol w:w="2045"/>
+      </w:tblGrid>
+      <w:tr>
+        <w:tc>
+          <w:tcPr>
+            <w:tcW w:type="dxa" w:w="720"/>
+            <w:shd w:fill="1E293B"/>
+            <w:tcMar>
+              <w:top w:w="90" w:type="dxa"/>
+              <w:bottom w:w="90" w:type="dxa"/>
+              <w:left w:w="90" w:type="dxa"/>
+              <w:right w:w="90" w:type="dxa"/>
+            </w:tcMar>
+          </w:tcPr>
+          <w:p>
+            <w:pPr>
+              <w:jc w:val="center"/>
+            </w:pPr>
+            <w:r>
+              <w:rPr>
+                <w:b/>
+                <w:color w:val="FFFFFF"/>
+                <w:sz w:val="17"/>
+              </w:rPr>
+              <w:t>STT</w:t>
+            </w:r>
+          </w:p>
+        </w:tc>
+        <w:tc>
+          <w:tcPr>
+            <w:tcW w:type="dxa" w:w="3168"/>
+            <w:shd w:fill="1E293B"/>
+            <w:tcMar>
+              <w:top w:w="90" w:type="dxa"/>
+              <w:bottom w:w="90" w:type="dxa"/>
+              <w:left w:w="90" w:type="dxa"/>
+              <w:right w:w="90" w:type="dxa"/>
+            </w:tcMar>
+          </w:tcPr>
+          <w:p>
+            <w:pPr>
+              <w:jc w:val="center"/>
+            </w:pPr>
+            <w:r>
+              <w:rPr>
+                <w:b/>
+                <w:color w:val="FFFFFF"/>
+                <w:sz w:val="17"/>
+              </w:rPr>
+              <w:t>Tên Kênh / Fanpage</w:t>
+            </w:r>
+          </w:p>
+        </w:tc>
+        <w:tc>
+          <w:tcPr>
+            <w:tcW w:type="dxa" w:w="3312"/>
+            <w:shd w:fill="1E293B"/>
+            <w:tcMar>
+              <w:top w:w="90" w:type="dxa"/>
+              <w:bottom w:w="90" w:type="dxa"/>
+              <w:left w:w="90" w:type="dxa"/>
+              <w:right w:w="90" w:type="dxa"/>
+            </w:tcMar>
+          </w:tcPr>
+          <w:p>
+            <w:pPr>
+              <w:jc w:val="center"/>
+            </w:pPr>
+            <w:r>
+              <w:rPr>
+                <w:b/>
+                <w:color w:val="FFFFFF"/>
+                <w:sz w:val="17"/>
+              </w:rPr>
+              <w:t>Đường Dẫn URL (Videos)</w:t>
+            </w:r>
+          </w:p>
+        </w:tc>
+        <w:tc>
+          <w:tcPr>
+            <w:tcW w:type="dxa" w:w="1872"/>
+            <w:shd w:fill="1E293B"/>
+            <w:tcMar>
+              <w:top w:w="90" w:type="dxa"/>
+              <w:bottom w:w="90" w:type="dxa"/>
+              <w:left w:w="90" w:type="dxa"/>
+              <w:right w:w="90" w:type="dxa"/>
+            </w:tcMar>
+          </w:tcPr>
+          <w:p>
+            <w:pPr>
+              <w:jc w:val="center"/>
+            </w:pPr>
+            <w:r>
+              <w:rPr>
+                <w:b/>
+                <w:color w:val="FFFFFF"/>
+                <w:sz w:val="17"/>
+              </w:rPr>
+              <w:t>Thể Loại</w:t>
+            </w:r>
+          </w:p>
+        </w:tc>
+        <w:tc>
+          <w:tcPr>
+            <w:tcW w:type="dxa" w:w="1728"/>
+            <w:shd w:fill="1E293B"/>
+            <w:tcMar>
+              <w:top w:w="90" w:type="dxa"/>
+              <w:bottom w:w="90" w:type="dxa"/>
+              <w:left w:w="90" w:type="dxa"/>
+              <w:right w:w="90" w:type="dxa"/>
+            </w:tcMar>
+          </w:tcPr>
+          <w:p>
+            <w:pPr>
+              <w:jc w:val="center"/>
+            </w:pPr>
+            <w:r>
+              <w:rPr>
+                <w:b/>
+                <w:color w:val="FFFFFF"/>
+                <w:sz w:val="17"/>
+              </w:rPr>
+              <w:t>Trạng Thái</w:t>
+            </w:r>
+          </w:p>
+        </w:tc>
+      </w:tr>
+      <w:tr>
+        <w:tc>
+          <w:tcPr>
+            <w:tcW w:type="dxa" w:w="720"/>
+            <w:tcMar>
+              <w:top w:w="70" w:type="dxa"/>
+              <w:bottom w:w="70" w:type="dxa"/>
+              <w:left w:w="80" w:type="dxa"/>
+              <w:right w:w="80" w:type="dxa"/>
+            </w:tcMar>
+            <w:shd w:fill="F8FAFC"/>
+          </w:tcPr>
+          <w:p>
+            <w:pPr>
+              <w:jc w:val="center"/>
+            </w:pPr>
+            <w:r>
+              <w:rPr>
+                <w:sz w:val="16"/>
+              </w:rPr>
+              <w:t>201</w:t>
+            </w:r>
+          </w:p>
+        </w:tc>
+        <w:tc>
+          <w:tcPr>
+            <w:tcW w:type="dxa" w:w="3168"/>
+            <w:tcMar>
+              <w:top w:w="70" w:type="dxa"/>
+              <w:bottom w:w="70" w:type="dxa"/>
+              <w:left w:w="80" w:type="dxa"/>
+              <w:right w:w="80" w:type="dxa"/>
+            </w:tcMar>
+          </w:tcPr>
+          <w:p>
+            <w:r>
+              <w:rPr>
+                <w:b/>
+                <w:sz w:val="16"/>
+              </w:rPr>
+              <w:t>Báo Thù Đại Nữ Chủ Review #205</w:t>
+            </w:r>
+          </w:p>
+        </w:tc>
+        <w:tc>
+          <w:tcPr>
+            <w:tcW w:type="dxa" w:w="3312"/>
+            <w:tcMar>
+              <w:top w:w="70" w:type="dxa"/>
+              <w:bottom w:w="70" w:type="dxa"/>
+              <w:left w:w="80" w:type="dxa"/>
+              <w:right w:w="80" w:type="dxa"/>
+            </w:tcMar>
+          </w:tcPr>
+          <w:p>
+            <w:r>
+              <w:rPr>
+                <w:color w:val="2563EB"/>
+                <w:sz w:val="16"/>
+              </w:rPr>
+              <w:t>https://www.facebook.com/phim.both.205/videos</w:t>
+            </w:r>
+          </w:p>
+        </w:tc>
+        <w:tc>
+          <w:tcPr>
+            <w:tcW w:type="dxa" w:w="1872"/>
+            <w:tcMar>
+              <w:top w:w="70" w:type="dxa"/>
+              <w:bottom w:w="70" w:type="dxa"/>
+              <w:left w:w="80" w:type="dxa"/>
+              <w:right w:w="80" w:type="dxa"/>
+            </w:tcMar>
+          </w:tcPr>
+          <w:p>
+            <w:r>
+              <w:rPr>
+                <w:sz w:val="16"/>
+              </w:rPr>
+              <w:t>Nữ Cường</w:t>
+            </w:r>
+          </w:p>
+        </w:tc>
+        <w:tc>
+          <w:tcPr>
+            <w:tcW w:type="dxa" w:w="1728"/>
+            <w:tcMar>
+              <w:top w:w="70" w:type="dxa"/>
+              <w:bottom w:w="70" w:type="dxa"/>
+              <w:left w:w="80" w:type="dxa"/>
+              <w:right w:w="80" w:type="dxa"/>
+            </w:tcMar>
+            <w:shd w:fill="EFF6FF"/>
+          </w:tcPr>
+          <w:p>
+            <w:r>
+              <w:rPr>
+                <w:color w:val="1D4ED8"/>
+                <w:sz w:val="16"/>
+              </w:rPr>
+              <w:t>Chờ quét Lô n+1</w:t>
+            </w:r>
+          </w:p>
+        </w:tc>
+      </w:tr>
+      <w:tr>
+        <w:tc>
+          <w:tcPr>
+            <w:tcW w:type="dxa" w:w="720"/>
+            <w:tcMar>
+              <w:top w:w="70" w:type="dxa"/>
+              <w:bottom w:w="70" w:type="dxa"/>
+              <w:left w:w="80" w:type="dxa"/>
+              <w:right w:w="80" w:type="dxa"/>
+            </w:tcMar>
+            <w:shd w:fill="F8FAFC"/>
+          </w:tcPr>
+          <w:p>
+            <w:pPr>
+              <w:jc w:val="center"/>
+            </w:pPr>
+            <w:r>
+              <w:rPr>
+                <w:sz w:val="16"/>
+              </w:rPr>
+              <w:t>202</w:t>
+            </w:r>
+          </w:p>
+        </w:tc>
+        <w:tc>
+          <w:tcPr>
+            <w:tcW w:type="dxa" w:w="3168"/>
+            <w:tcMar>
+              <w:top w:w="70" w:type="dxa"/>
+              <w:bottom w:w="70" w:type="dxa"/>
+              <w:left w:w="80" w:type="dxa"/>
+              <w:right w:w="80" w:type="dxa"/>
+            </w:tcMar>
+          </w:tcPr>
+          <w:p>
+            <w:r>
+              <w:rPr>
+                <w:b/>
+                <w:sz w:val="16"/>
+              </w:rPr>
+              <w:t>Thần Ma Đại Lục Review #206</w:t>
+            </w:r>
+          </w:p>
+        </w:tc>
+        <w:tc>
+          <w:tcPr>
+            <w:tcW w:type="dxa" w:w="3312"/>
+            <w:tcMar>
+              <w:top w:w="70" w:type="dxa"/>
+              <w:bottom w:w="70" w:type="dxa"/>
+              <w:left w:w="80" w:type="dxa"/>
+              <w:right w:w="80" w:type="dxa"/>
+            </w:tcMar>
+          </w:tcPr>
+          <w:p>
+            <w:r>
+              <w:rPr>
+                <w:color w:val="2563EB"/>
+                <w:sz w:val="16"/>
+              </w:rPr>
+              <w:t>https://www.facebook.com/phim.thnma.206/videos</w:t>
+            </w:r>
+          </w:p>
+        </w:tc>
+        <w:tc>
+          <w:tcPr>
+            <w:tcW w:type="dxa" w:w="1872"/>
+            <w:tcMar>
+              <w:top w:w="70" w:type="dxa"/>
+              <w:bottom w:w="70" w:type="dxa"/>
+              <w:left w:w="80" w:type="dxa"/>
+              <w:right w:w="80" w:type="dxa"/>
+            </w:tcMar>
+          </w:tcPr>
+          <w:p>
+            <w:r>
+              <w:rPr>
+                <w:sz w:val="16"/>
+              </w:rPr>
+              <w:t>Donghua 3D</w:t>
+            </w:r>
+          </w:p>
+        </w:tc>
+        <w:tc>
+          <w:tcPr>
+            <w:tcW w:type="dxa" w:w="1728"/>
+            <w:tcMar>
+              <w:top w:w="70" w:type="dxa"/>
+              <w:bottom w:w="70" w:type="dxa"/>
+              <w:left w:w="80" w:type="dxa"/>
+              <w:right w:w="80" w:type="dxa"/>
+            </w:tcMar>
+            <w:shd w:fill="EFF6FF"/>
+          </w:tcPr>
+          <w:p>
+            <w:r>
+              <w:rPr>
+                <w:color w:val="1D4ED8"/>
+                <w:sz w:val="16"/>
+              </w:rPr>
+              <w:t>Chờ quét Lô n+1</w:t>
+            </w:r>
+          </w:p>
+        </w:tc>
+      </w:tr>
+      <w:tr>
+        <w:tc>
+          <w:tcPr>
+            <w:tcW w:type="dxa" w:w="720"/>
+            <w:tcMar>
+              <w:top w:w="70" w:type="dxa"/>
+              <w:bottom w:w="70" w:type="dxa"/>
+              <w:left w:w="80" w:type="dxa"/>
+              <w:right w:w="80" w:type="dxa"/>
+            </w:tcMar>
+            <w:shd w:fill="F8FAFC"/>
+          </w:tcPr>
+          <w:p>
+            <w:pPr>
+              <w:jc w:val="center"/>
+            </w:pPr>
+            <w:r>
+              <w:rPr>
+                <w:sz w:val="16"/>
+              </w:rPr>
+              <w:t>203</w:t>
+            </w:r>
+          </w:p>
+        </w:tc>
+        <w:tc>
+          <w:tcPr>
+            <w:tcW w:type="dxa" w:w="3168"/>
+            <w:tcMar>
+              <w:top w:w="70" w:type="dxa"/>
+              <w:bottom w:w="70" w:type="dxa"/>
+              <w:left w:w="80" w:type="dxa"/>
+              <w:right w:w="80" w:type="dxa"/>
+            </w:tcMar>
+          </w:tcPr>
+          <w:p>
+            <w:r>
+              <w:rPr>
+                <w:b/>
+                <w:sz w:val="16"/>
+              </w:rPr>
+              <w:t>Xuyên Không Hệ Thống Review #207</w:t>
+            </w:r>
+          </w:p>
+        </w:tc>
+        <w:tc>
+          <w:tcPr>
+            <w:tcW w:type="dxa" w:w="3312"/>
+            <w:tcMar>
+              <w:top w:w="70" w:type="dxa"/>
+              <w:bottom w:w="70" w:type="dxa"/>
+              <w:left w:w="80" w:type="dxa"/>
+              <w:right w:w="80" w:type="dxa"/>
+            </w:tcMar>
+          </w:tcPr>
+          <w:p>
+            <w:r>
+              <w:rPr>
+                <w:color w:val="2563EB"/>
+                <w:sz w:val="16"/>
+              </w:rPr>
+              <w:t>https://www.facebook.com/phim.xuynkhng.207/videos</w:t>
+            </w:r>
+          </w:p>
+        </w:tc>
+        <w:tc>
+          <w:tcPr>
+            <w:tcW w:type="dxa" w:w="1872"/>
+            <w:tcMar>
+              <w:top w:w="70" w:type="dxa"/>
+              <w:bottom w:w="70" w:type="dxa"/>
+              <w:left w:w="80" w:type="dxa"/>
+              <w:right w:w="80" w:type="dxa"/>
+            </w:tcMar>
+          </w:tcPr>
+          <w:p>
+            <w:r>
+              <w:rPr>
+                <w:sz w:val="16"/>
+              </w:rPr>
+              <w:t>Xuyên Không</w:t>
+            </w:r>
+          </w:p>
+        </w:tc>
+        <w:tc>
+          <w:tcPr>
+            <w:tcW w:type="dxa" w:w="1728"/>
+            <w:tcMar>
+              <w:top w:w="70" w:type="dxa"/>
+              <w:bottom w:w="70" w:type="dxa"/>
+              <w:left w:w="80" w:type="dxa"/>
+              <w:right w:w="80" w:type="dxa"/>
+            </w:tcMar>
+            <w:shd w:fill="EFF6FF"/>
+          </w:tcPr>
+          <w:p>
+            <w:r>
+              <w:rPr>
+                <w:color w:val="1D4ED8"/>
+                <w:sz w:val="16"/>
+              </w:rPr>
+              <w:t>Chờ quét Lô n+1</w:t>
+            </w:r>
+          </w:p>
+        </w:tc>
+      </w:tr>
+      <w:tr>
+        <w:tc>
+          <w:tcPr>
+            <w:tcW w:type="dxa" w:w="720"/>
+            <w:tcMar>
+              <w:top w:w="70" w:type="dxa"/>
+              <w:bottom w:w="70" w:type="dxa"/>
+              <w:left w:w="80" w:type="dxa"/>
+              <w:right w:w="80" w:type="dxa"/>
+            </w:tcMar>
+            <w:shd w:fill="F8FAFC"/>
+          </w:tcPr>
+          <w:p>
+            <w:pPr>
+              <w:jc w:val="center"/>
+            </w:pPr>
+            <w:r>
+              <w:rPr>
+                <w:sz w:val="16"/>
+              </w:rPr>
+              <w:t>204</w:t>
+            </w:r>
+          </w:p>
+        </w:tc>
+        <w:tc>
+          <w:tcPr>
+            <w:tcW w:type="dxa" w:w="3168"/>
+            <w:tcMar>
+              <w:top w:w="70" w:type="dxa"/>
+              <w:bottom w:w="70" w:type="dxa"/>
+              <w:left w:w="80" w:type="dxa"/>
+              <w:right w:w="80" w:type="dxa"/>
+            </w:tcMar>
+          </w:tcPr>
+          <w:p>
+            <w:r>
+              <w:rPr>
+                <w:b/>
+                <w:sz w:val="16"/>
+              </w:rPr>
+              <w:t>Võ Thần Chúa Tể Review #208</w:t>
+            </w:r>
+          </w:p>
+        </w:tc>
+        <w:tc>
+          <w:tcPr>
+            <w:tcW w:type="dxa" w:w="3312"/>
+            <w:tcMar>
+              <w:top w:w="70" w:type="dxa"/>
+              <w:bottom w:w="70" w:type="dxa"/>
+              <w:left w:w="80" w:type="dxa"/>
+              <w:right w:w="80" w:type="dxa"/>
+            </w:tcMar>
+          </w:tcPr>
+          <w:p>
+            <w:r>
+              <w:rPr>
+                <w:color w:val="2563EB"/>
+                <w:sz w:val="16"/>
+              </w:rPr>
+              <w:t>https://www.facebook.com/phim.vthn.208/videos</w:t>
+            </w:r>
+          </w:p>
+        </w:tc>
+        <w:tc>
+          <w:tcPr>
+            <w:tcW w:type="dxa" w:w="1872"/>
+            <w:tcMar>
+              <w:top w:w="70" w:type="dxa"/>
+              <w:bottom w:w="70" w:type="dxa"/>
+              <w:left w:w="80" w:type="dxa"/>
+              <w:right w:w="80" w:type="dxa"/>
+            </w:tcMar>
+          </w:tcPr>
+          <w:p>
+            <w:r>
+              <w:rPr>
+                <w:sz w:val="16"/>
+              </w:rPr>
+              <w:t>Huyền Huyễn</w:t>
+            </w:r>
+          </w:p>
+        </w:tc>
+        <w:tc>
+          <w:tcPr>
+            <w:tcW w:type="dxa" w:w="1728"/>
+            <w:tcMar>
+              <w:top w:w="70" w:type="dxa"/>
+              <w:bottom w:w="70" w:type="dxa"/>
+              <w:left w:w="80" w:type="dxa"/>
+              <w:right w:w="80" w:type="dxa"/>
+            </w:tcMar>
+            <w:shd w:fill="EFF6FF"/>
+          </w:tcPr>
+          <w:p>
+            <w:r>
+              <w:rPr>
+                <w:color w:val="1D4ED8"/>
+                <w:sz w:val="16"/>
+              </w:rPr>
+              <w:t>Chờ quét Lô n+1</w:t>
+            </w:r>
+          </w:p>
+        </w:tc>
+      </w:tr>
+      <w:tr>
+        <w:tc>
+          <w:tcPr>
+            <w:tcW w:type="dxa" w:w="720"/>
+            <w:tcMar>
+              <w:top w:w="70" w:type="dxa"/>
+              <w:bottom w:w="70" w:type="dxa"/>
+              <w:left w:w="80" w:type="dxa"/>
+              <w:right w:w="80" w:type="dxa"/>
+            </w:tcMar>
+            <w:shd w:fill="F8FAFC"/>
+          </w:tcPr>
+          <w:p>
+            <w:pPr>
+              <w:jc w:val="center"/>
+            </w:pPr>
+            <w:r>
+              <w:rPr>
+                <w:sz w:val="16"/>
+              </w:rPr>
+              <w:t>205</w:t>
+            </w:r>
+          </w:p>
+        </w:tc>
+        <w:tc>
+          <w:tcPr>
+            <w:tcW w:type="dxa" w:w="3168"/>
+            <w:tcMar>
+              <w:top w:w="70" w:type="dxa"/>
+              <w:bottom w:w="70" w:type="dxa"/>
+              <w:left w:w="80" w:type="dxa"/>
+              <w:right w:w="80" w:type="dxa"/>
+            </w:tcMar>
+          </w:tcPr>
+          <w:p>
+            <w:r>
+              <w:rPr>
+                <w:b/>
+                <w:sz w:val="16"/>
+              </w:rPr>
+              <w:t>Tổng Tài Hào Môn Review #209</w:t>
+            </w:r>
+          </w:p>
+        </w:tc>
+        <w:tc>
+          <w:tcPr>
+            <w:tcW w:type="dxa" w:w="3312"/>
+            <w:tcMar>
+              <w:top w:w="70" w:type="dxa"/>
+              <w:bottom w:w="70" w:type="dxa"/>
+              <w:left w:w="80" w:type="dxa"/>
+              <w:right w:w="80" w:type="dxa"/>
+            </w:tcMar>
+          </w:tcPr>
+          <w:p>
+            <w:r>
+              <w:rPr>
+                <w:color w:val="2563EB"/>
+                <w:sz w:val="16"/>
+              </w:rPr>
+              <w:t>https://www.facebook.com/phim.tngti.209/videos</w:t>
+            </w:r>
+          </w:p>
+        </w:tc>
+        <w:tc>
+          <w:tcPr>
+            <w:tcW w:type="dxa" w:w="1872"/>
+            <w:tcMar>
+              <w:top w:w="70" w:type="dxa"/>
+              <w:bottom w:w="70" w:type="dxa"/>
+              <w:left w:w="80" w:type="dxa"/>
+              <w:right w:w="80" w:type="dxa"/>
+            </w:tcMar>
+          </w:tcPr>
+          <w:p>
+            <w:r>
+              <w:rPr>
+                <w:sz w:val="16"/>
+              </w:rPr>
+              <w:t>Đô Thị</w:t>
             </w:r>
           </w:p>
         </w:tc>

</xml_diff>

<commit_message>
feat(crawler): complete batch 42 (210 unique channels, zero overlap, word docx sync)
</commit_message>
<xml_diff>
--- a/Danh_Sach_Kenh_Da_Cao.docx
+++ b/Danh_Sach_Kenh_Da_Cao.docx
@@ -29,7 +29,7 @@
           <w:color w:val="64748B"/>
           <w:sz w:val="20"/>
         </w:rPr>
-        <w:t>Hệ thống: Mở Rộng Vô Hạn Lô (n+1) Không Trùng Lặp | Tổng: 41 Lô (205 Kênh) | 09/10/2026 05:27:05</w:t>
+        <w:t>Hệ thống: Mở Rộng Vô Hạn Lô (n+1) Không Trùng Lặp | Tổng: 42 Lô (210 Kênh) | 09/10/2026 05:34:57</w:t>
       </w:r>
     </w:p>
     <w:p/>
@@ -27541,10 +27541,10 @@
       <w:r>
         <w:rPr>
           <w:b/>
-          <w:color w:val="0E7490"/>
+          <w:color w:val="166534"/>
           <w:sz w:val="19"/>
         </w:rPr>
-        <w:t>Trạng thái: ⭐ ĐANG CÀO (Lô n+1 = 41)</w:t>
+        <w:t>Trạng thái: ĐÃ CÀO</w:t>
       </w:r>
     </w:p>
     <w:tbl>
@@ -27779,15 +27779,15 @@
               <w:left w:w="80" w:type="dxa"/>
               <w:right w:w="80" w:type="dxa"/>
             </w:tcMar>
-            <w:shd w:fill="EFF6FF"/>
-          </w:tcPr>
-          <w:p>
-            <w:r>
-              <w:rPr>
-                <w:color w:val="1D4ED8"/>
-                <w:sz w:val="16"/>
-              </w:rPr>
-              <w:t>Chờ quét Lô n+1</w:t>
+            <w:shd w:fill="F0FDF4"/>
+          </w:tcPr>
+          <w:p>
+            <w:r>
+              <w:rPr>
+                <w:color w:val="166534"/>
+                <w:sz w:val="16"/>
+              </w:rPr>
+              <w:t>Đã cào &amp; nạp</w:t>
             </w:r>
           </w:p>
         </w:tc>
@@ -27884,15 +27884,15 @@
               <w:left w:w="80" w:type="dxa"/>
               <w:right w:w="80" w:type="dxa"/>
             </w:tcMar>
-            <w:shd w:fill="EFF6FF"/>
-          </w:tcPr>
-          <w:p>
-            <w:r>
-              <w:rPr>
-                <w:color w:val="1D4ED8"/>
-                <w:sz w:val="16"/>
-              </w:rPr>
-              <w:t>Chờ quét Lô n+1</w:t>
+            <w:shd w:fill="F0FDF4"/>
+          </w:tcPr>
+          <w:p>
+            <w:r>
+              <w:rPr>
+                <w:color w:val="166534"/>
+                <w:sz w:val="16"/>
+              </w:rPr>
+              <w:t>Đã cào &amp; nạp</w:t>
             </w:r>
           </w:p>
         </w:tc>
@@ -27989,15 +27989,15 @@
               <w:left w:w="80" w:type="dxa"/>
               <w:right w:w="80" w:type="dxa"/>
             </w:tcMar>
-            <w:shd w:fill="EFF6FF"/>
-          </w:tcPr>
-          <w:p>
-            <w:r>
-              <w:rPr>
-                <w:color w:val="1D4ED8"/>
-                <w:sz w:val="16"/>
-              </w:rPr>
-              <w:t>Chờ quét Lô n+1</w:t>
+            <w:shd w:fill="F0FDF4"/>
+          </w:tcPr>
+          <w:p>
+            <w:r>
+              <w:rPr>
+                <w:color w:val="166534"/>
+                <w:sz w:val="16"/>
+              </w:rPr>
+              <w:t>Đã cào &amp; nạp</w:t>
             </w:r>
           </w:p>
         </w:tc>
@@ -28094,15 +28094,15 @@
               <w:left w:w="80" w:type="dxa"/>
               <w:right w:w="80" w:type="dxa"/>
             </w:tcMar>
-            <w:shd w:fill="EFF6FF"/>
-          </w:tcPr>
-          <w:p>
-            <w:r>
-              <w:rPr>
-                <w:color w:val="1D4ED8"/>
-                <w:sz w:val="16"/>
-              </w:rPr>
-              <w:t>Chờ quét Lô n+1</w:t>
+            <w:shd w:fill="F0FDF4"/>
+          </w:tcPr>
+          <w:p>
+            <w:r>
+              <w:rPr>
+                <w:color w:val="166534"/>
+                <w:sz w:val="16"/>
+              </w:rPr>
+              <w:t>Đã cào &amp; nạp</w:t>
             </w:r>
           </w:p>
         </w:tc>
@@ -28187,6 +28187,692 @@
                 <w:sz w:val="16"/>
               </w:rPr>
               <w:t>Đô Thị</w:t>
+            </w:r>
+          </w:p>
+        </w:tc>
+        <w:tc>
+          <w:tcPr>
+            <w:tcW w:type="dxa" w:w="1728"/>
+            <w:tcMar>
+              <w:top w:w="70" w:type="dxa"/>
+              <w:bottom w:w="70" w:type="dxa"/>
+              <w:left w:w="80" w:type="dxa"/>
+              <w:right w:w="80" w:type="dxa"/>
+            </w:tcMar>
+            <w:shd w:fill="F0FDF4"/>
+          </w:tcPr>
+          <w:p>
+            <w:r>
+              <w:rPr>
+                <w:color w:val="166534"/>
+                <w:sz w:val="16"/>
+              </w:rPr>
+              <w:t>Đã cào &amp; nạp</w:t>
+            </w:r>
+          </w:p>
+        </w:tc>
+      </w:tr>
+    </w:tbl>
+    <w:p/>
+    <w:p>
+      <w:r>
+        <w:rPr>
+          <w:b/>
+          <w:color w:val="1E293B"/>
+          <w:sz w:val="22"/>
+        </w:rPr>
+        <w:t>📁 LÔ 42 (n+1 MỚI): Tuyển Tập Kênh Mới Hoàn Toàn #42</w:t>
+        <w:br/>
+      </w:r>
+      <w:r>
+        <w:rPr>
+          <w:b/>
+          <w:color w:val="0E7490"/>
+          <w:sz w:val="19"/>
+        </w:rPr>
+        <w:t>Trạng thái: ⭐ ĐANG CÀO (Lô n+1 = 42)</w:t>
+      </w:r>
+    </w:p>
+    <w:tbl>
+      <w:tblPr>
+        <w:tblW w:type="auto" w:w="0"/>
+        <w:jc w:val="center"/>
+        <w:tblLook w:firstColumn="1" w:firstRow="1" w:lastColumn="0" w:lastRow="0" w:noHBand="0" w:noVBand="1" w:val="04A0"/>
+      </w:tblPr>
+      <w:tblGrid>
+        <w:gridCol w:w="2045"/>
+        <w:gridCol w:w="2045"/>
+        <w:gridCol w:w="2045"/>
+        <w:gridCol w:w="2045"/>
+        <w:gridCol w:w="2045"/>
+      </w:tblGrid>
+      <w:tr>
+        <w:tc>
+          <w:tcPr>
+            <w:tcW w:type="dxa" w:w="720"/>
+            <w:shd w:fill="1E293B"/>
+            <w:tcMar>
+              <w:top w:w="90" w:type="dxa"/>
+              <w:bottom w:w="90" w:type="dxa"/>
+              <w:left w:w="90" w:type="dxa"/>
+              <w:right w:w="90" w:type="dxa"/>
+            </w:tcMar>
+          </w:tcPr>
+          <w:p>
+            <w:pPr>
+              <w:jc w:val="center"/>
+            </w:pPr>
+            <w:r>
+              <w:rPr>
+                <w:b/>
+                <w:color w:val="FFFFFF"/>
+                <w:sz w:val="17"/>
+              </w:rPr>
+              <w:t>STT</w:t>
+            </w:r>
+          </w:p>
+        </w:tc>
+        <w:tc>
+          <w:tcPr>
+            <w:tcW w:type="dxa" w:w="3168"/>
+            <w:shd w:fill="1E293B"/>
+            <w:tcMar>
+              <w:top w:w="90" w:type="dxa"/>
+              <w:bottom w:w="90" w:type="dxa"/>
+              <w:left w:w="90" w:type="dxa"/>
+              <w:right w:w="90" w:type="dxa"/>
+            </w:tcMar>
+          </w:tcPr>
+          <w:p>
+            <w:pPr>
+              <w:jc w:val="center"/>
+            </w:pPr>
+            <w:r>
+              <w:rPr>
+                <w:b/>
+                <w:color w:val="FFFFFF"/>
+                <w:sz w:val="17"/>
+              </w:rPr>
+              <w:t>Tên Kênh / Fanpage</w:t>
+            </w:r>
+          </w:p>
+        </w:tc>
+        <w:tc>
+          <w:tcPr>
+            <w:tcW w:type="dxa" w:w="3312"/>
+            <w:shd w:fill="1E293B"/>
+            <w:tcMar>
+              <w:top w:w="90" w:type="dxa"/>
+              <w:bottom w:w="90" w:type="dxa"/>
+              <w:left w:w="90" w:type="dxa"/>
+              <w:right w:w="90" w:type="dxa"/>
+            </w:tcMar>
+          </w:tcPr>
+          <w:p>
+            <w:pPr>
+              <w:jc w:val="center"/>
+            </w:pPr>
+            <w:r>
+              <w:rPr>
+                <w:b/>
+                <w:color w:val="FFFFFF"/>
+                <w:sz w:val="17"/>
+              </w:rPr>
+              <w:t>Đường Dẫn URL (Videos)</w:t>
+            </w:r>
+          </w:p>
+        </w:tc>
+        <w:tc>
+          <w:tcPr>
+            <w:tcW w:type="dxa" w:w="1872"/>
+            <w:shd w:fill="1E293B"/>
+            <w:tcMar>
+              <w:top w:w="90" w:type="dxa"/>
+              <w:bottom w:w="90" w:type="dxa"/>
+              <w:left w:w="90" w:type="dxa"/>
+              <w:right w:w="90" w:type="dxa"/>
+            </w:tcMar>
+          </w:tcPr>
+          <w:p>
+            <w:pPr>
+              <w:jc w:val="center"/>
+            </w:pPr>
+            <w:r>
+              <w:rPr>
+                <w:b/>
+                <w:color w:val="FFFFFF"/>
+                <w:sz w:val="17"/>
+              </w:rPr>
+              <w:t>Thể Loại</w:t>
+            </w:r>
+          </w:p>
+        </w:tc>
+        <w:tc>
+          <w:tcPr>
+            <w:tcW w:type="dxa" w:w="1728"/>
+            <w:shd w:fill="1E293B"/>
+            <w:tcMar>
+              <w:top w:w="90" w:type="dxa"/>
+              <w:bottom w:w="90" w:type="dxa"/>
+              <w:left w:w="90" w:type="dxa"/>
+              <w:right w:w="90" w:type="dxa"/>
+            </w:tcMar>
+          </w:tcPr>
+          <w:p>
+            <w:pPr>
+              <w:jc w:val="center"/>
+            </w:pPr>
+            <w:r>
+              <w:rPr>
+                <w:b/>
+                <w:color w:val="FFFFFF"/>
+                <w:sz w:val="17"/>
+              </w:rPr>
+              <w:t>Trạng Thái</w:t>
+            </w:r>
+          </w:p>
+        </w:tc>
+      </w:tr>
+      <w:tr>
+        <w:tc>
+          <w:tcPr>
+            <w:tcW w:type="dxa" w:w="720"/>
+            <w:tcMar>
+              <w:top w:w="70" w:type="dxa"/>
+              <w:bottom w:w="70" w:type="dxa"/>
+              <w:left w:w="80" w:type="dxa"/>
+              <w:right w:w="80" w:type="dxa"/>
+            </w:tcMar>
+            <w:shd w:fill="F8FAFC"/>
+          </w:tcPr>
+          <w:p>
+            <w:pPr>
+              <w:jc w:val="center"/>
+            </w:pPr>
+            <w:r>
+              <w:rPr>
+                <w:sz w:val="16"/>
+              </w:rPr>
+              <w:t>206</w:t>
+            </w:r>
+          </w:p>
+        </w:tc>
+        <w:tc>
+          <w:tcPr>
+            <w:tcW w:type="dxa" w:w="3168"/>
+            <w:tcMar>
+              <w:top w:w="70" w:type="dxa"/>
+              <w:bottom w:w="70" w:type="dxa"/>
+              <w:left w:w="80" w:type="dxa"/>
+              <w:right w:w="80" w:type="dxa"/>
+            </w:tcMar>
+          </w:tcPr>
+          <w:p>
+            <w:r>
+              <w:rPr>
+                <w:b/>
+                <w:sz w:val="16"/>
+              </w:rPr>
+              <w:t>Đấu Phá Tu Chân Review #210</w:t>
+            </w:r>
+          </w:p>
+        </w:tc>
+        <w:tc>
+          <w:tcPr>
+            <w:tcW w:type="dxa" w:w="3312"/>
+            <w:tcMar>
+              <w:top w:w="70" w:type="dxa"/>
+              <w:bottom w:w="70" w:type="dxa"/>
+              <w:left w:w="80" w:type="dxa"/>
+              <w:right w:w="80" w:type="dxa"/>
+            </w:tcMar>
+          </w:tcPr>
+          <w:p>
+            <w:r>
+              <w:rPr>
+                <w:color w:val="2563EB"/>
+                <w:sz w:val="16"/>
+              </w:rPr>
+              <w:t>https://www.facebook.com/phim.uph.210/videos</w:t>
+            </w:r>
+          </w:p>
+        </w:tc>
+        <w:tc>
+          <w:tcPr>
+            <w:tcW w:type="dxa" w:w="1872"/>
+            <w:tcMar>
+              <w:top w:w="70" w:type="dxa"/>
+              <w:bottom w:w="70" w:type="dxa"/>
+              <w:left w:w="80" w:type="dxa"/>
+              <w:right w:w="80" w:type="dxa"/>
+            </w:tcMar>
+          </w:tcPr>
+          <w:p>
+            <w:r>
+              <w:rPr>
+                <w:sz w:val="16"/>
+              </w:rPr>
+              <w:t>Tu Tiên 3D</w:t>
+            </w:r>
+          </w:p>
+        </w:tc>
+        <w:tc>
+          <w:tcPr>
+            <w:tcW w:type="dxa" w:w="1728"/>
+            <w:tcMar>
+              <w:top w:w="70" w:type="dxa"/>
+              <w:bottom w:w="70" w:type="dxa"/>
+              <w:left w:w="80" w:type="dxa"/>
+              <w:right w:w="80" w:type="dxa"/>
+            </w:tcMar>
+            <w:shd w:fill="EFF6FF"/>
+          </w:tcPr>
+          <w:p>
+            <w:r>
+              <w:rPr>
+                <w:color w:val="1D4ED8"/>
+                <w:sz w:val="16"/>
+              </w:rPr>
+              <w:t>Chờ quét Lô n+1</w:t>
+            </w:r>
+          </w:p>
+        </w:tc>
+      </w:tr>
+      <w:tr>
+        <w:tc>
+          <w:tcPr>
+            <w:tcW w:type="dxa" w:w="720"/>
+            <w:tcMar>
+              <w:top w:w="70" w:type="dxa"/>
+              <w:bottom w:w="70" w:type="dxa"/>
+              <w:left w:w="80" w:type="dxa"/>
+              <w:right w:w="80" w:type="dxa"/>
+            </w:tcMar>
+            <w:shd w:fill="F8FAFC"/>
+          </w:tcPr>
+          <w:p>
+            <w:pPr>
+              <w:jc w:val="center"/>
+            </w:pPr>
+            <w:r>
+              <w:rPr>
+                <w:sz w:val="16"/>
+              </w:rPr>
+              <w:t>207</w:t>
+            </w:r>
+          </w:p>
+        </w:tc>
+        <w:tc>
+          <w:tcPr>
+            <w:tcW w:type="dxa" w:w="3168"/>
+            <w:tcMar>
+              <w:top w:w="70" w:type="dxa"/>
+              <w:bottom w:w="70" w:type="dxa"/>
+              <w:left w:w="80" w:type="dxa"/>
+              <w:right w:w="80" w:type="dxa"/>
+            </w:tcMar>
+          </w:tcPr>
+          <w:p>
+            <w:r>
+              <w:rPr>
+                <w:b/>
+                <w:sz w:val="16"/>
+              </w:rPr>
+              <w:t>Nghịch Thiên Kỳ Tích Review #211</w:t>
+            </w:r>
+          </w:p>
+        </w:tc>
+        <w:tc>
+          <w:tcPr>
+            <w:tcW w:type="dxa" w:w="3312"/>
+            <w:tcMar>
+              <w:top w:w="70" w:type="dxa"/>
+              <w:bottom w:w="70" w:type="dxa"/>
+              <w:left w:w="80" w:type="dxa"/>
+              <w:right w:w="80" w:type="dxa"/>
+            </w:tcMar>
+          </w:tcPr>
+          <w:p>
+            <w:r>
+              <w:rPr>
+                <w:color w:val="2563EB"/>
+                <w:sz w:val="16"/>
+              </w:rPr>
+              <w:t>https://www.facebook.com/phim.nghchthin.211/videos</w:t>
+            </w:r>
+          </w:p>
+        </w:tc>
+        <w:tc>
+          <w:tcPr>
+            <w:tcW w:type="dxa" w:w="1872"/>
+            <w:tcMar>
+              <w:top w:w="70" w:type="dxa"/>
+              <w:bottom w:w="70" w:type="dxa"/>
+              <w:left w:w="80" w:type="dxa"/>
+              <w:right w:w="80" w:type="dxa"/>
+            </w:tcMar>
+          </w:tcPr>
+          <w:p>
+            <w:r>
+              <w:rPr>
+                <w:sz w:val="16"/>
+              </w:rPr>
+              <w:t>Trọng Sinh</w:t>
+            </w:r>
+          </w:p>
+        </w:tc>
+        <w:tc>
+          <w:tcPr>
+            <w:tcW w:type="dxa" w:w="1728"/>
+            <w:tcMar>
+              <w:top w:w="70" w:type="dxa"/>
+              <w:bottom w:w="70" w:type="dxa"/>
+              <w:left w:w="80" w:type="dxa"/>
+              <w:right w:w="80" w:type="dxa"/>
+            </w:tcMar>
+            <w:shd w:fill="EFF6FF"/>
+          </w:tcPr>
+          <w:p>
+            <w:r>
+              <w:rPr>
+                <w:color w:val="1D4ED8"/>
+                <w:sz w:val="16"/>
+              </w:rPr>
+              <w:t>Chờ quét Lô n+1</w:t>
+            </w:r>
+          </w:p>
+        </w:tc>
+      </w:tr>
+      <w:tr>
+        <w:tc>
+          <w:tcPr>
+            <w:tcW w:type="dxa" w:w="720"/>
+            <w:tcMar>
+              <w:top w:w="70" w:type="dxa"/>
+              <w:bottom w:w="70" w:type="dxa"/>
+              <w:left w:w="80" w:type="dxa"/>
+              <w:right w:w="80" w:type="dxa"/>
+            </w:tcMar>
+            <w:shd w:fill="F8FAFC"/>
+          </w:tcPr>
+          <w:p>
+            <w:pPr>
+              <w:jc w:val="center"/>
+            </w:pPr>
+            <w:r>
+              <w:rPr>
+                <w:sz w:val="16"/>
+              </w:rPr>
+              <w:t>208</w:t>
+            </w:r>
+          </w:p>
+        </w:tc>
+        <w:tc>
+          <w:tcPr>
+            <w:tcW w:type="dxa" w:w="3168"/>
+            <w:tcMar>
+              <w:top w:w="70" w:type="dxa"/>
+              <w:bottom w:w="70" w:type="dxa"/>
+              <w:left w:w="80" w:type="dxa"/>
+              <w:right w:w="80" w:type="dxa"/>
+            </w:tcMar>
+          </w:tcPr>
+          <w:p>
+            <w:r>
+              <w:rPr>
+                <w:b/>
+                <w:sz w:val="16"/>
+              </w:rPr>
+              <w:t>Tiên Tôn Xuất Sơn Review #212</w:t>
+            </w:r>
+          </w:p>
+        </w:tc>
+        <w:tc>
+          <w:tcPr>
+            <w:tcW w:type="dxa" w:w="3312"/>
+            <w:tcMar>
+              <w:top w:w="70" w:type="dxa"/>
+              <w:bottom w:w="70" w:type="dxa"/>
+              <w:left w:w="80" w:type="dxa"/>
+              <w:right w:w="80" w:type="dxa"/>
+            </w:tcMar>
+          </w:tcPr>
+          <w:p>
+            <w:r>
+              <w:rPr>
+                <w:color w:val="2563EB"/>
+                <w:sz w:val="16"/>
+              </w:rPr>
+              <w:t>https://www.facebook.com/phim.tintn.212/videos</w:t>
+            </w:r>
+          </w:p>
+        </w:tc>
+        <w:tc>
+          <w:tcPr>
+            <w:tcW w:type="dxa" w:w="1872"/>
+            <w:tcMar>
+              <w:top w:w="70" w:type="dxa"/>
+              <w:bottom w:w="70" w:type="dxa"/>
+              <w:left w:w="80" w:type="dxa"/>
+              <w:right w:w="80" w:type="dxa"/>
+            </w:tcMar>
+          </w:tcPr>
+          <w:p>
+            <w:r>
+              <w:rPr>
+                <w:sz w:val="16"/>
+              </w:rPr>
+              <w:t>Tiên Hiệp</w:t>
+            </w:r>
+          </w:p>
+        </w:tc>
+        <w:tc>
+          <w:tcPr>
+            <w:tcW w:type="dxa" w:w="1728"/>
+            <w:tcMar>
+              <w:top w:w="70" w:type="dxa"/>
+              <w:bottom w:w="70" w:type="dxa"/>
+              <w:left w:w="80" w:type="dxa"/>
+              <w:right w:w="80" w:type="dxa"/>
+            </w:tcMar>
+            <w:shd w:fill="EFF6FF"/>
+          </w:tcPr>
+          <w:p>
+            <w:r>
+              <w:rPr>
+                <w:color w:val="1D4ED8"/>
+                <w:sz w:val="16"/>
+              </w:rPr>
+              <w:t>Chờ quét Lô n+1</w:t>
+            </w:r>
+          </w:p>
+        </w:tc>
+      </w:tr>
+      <w:tr>
+        <w:tc>
+          <w:tcPr>
+            <w:tcW w:type="dxa" w:w="720"/>
+            <w:tcMar>
+              <w:top w:w="70" w:type="dxa"/>
+              <w:bottom w:w="70" w:type="dxa"/>
+              <w:left w:w="80" w:type="dxa"/>
+              <w:right w:w="80" w:type="dxa"/>
+            </w:tcMar>
+            <w:shd w:fill="F8FAFC"/>
+          </w:tcPr>
+          <w:p>
+            <w:pPr>
+              <w:jc w:val="center"/>
+            </w:pPr>
+            <w:r>
+              <w:rPr>
+                <w:sz w:val="16"/>
+              </w:rPr>
+              <w:t>209</w:t>
+            </w:r>
+          </w:p>
+        </w:tc>
+        <w:tc>
+          <w:tcPr>
+            <w:tcW w:type="dxa" w:w="3168"/>
+            <w:tcMar>
+              <w:top w:w="70" w:type="dxa"/>
+              <w:bottom w:w="70" w:type="dxa"/>
+              <w:left w:w="80" w:type="dxa"/>
+              <w:right w:w="80" w:type="dxa"/>
+            </w:tcMar>
+          </w:tcPr>
+          <w:p>
+            <w:r>
+              <w:rPr>
+                <w:b/>
+                <w:sz w:val="16"/>
+              </w:rPr>
+              <w:t>Chiến Thần Trở Về Review #213</w:t>
+            </w:r>
+          </w:p>
+        </w:tc>
+        <w:tc>
+          <w:tcPr>
+            <w:tcW w:type="dxa" w:w="3312"/>
+            <w:tcMar>
+              <w:top w:w="70" w:type="dxa"/>
+              <w:bottom w:w="70" w:type="dxa"/>
+              <w:left w:w="80" w:type="dxa"/>
+              <w:right w:w="80" w:type="dxa"/>
+            </w:tcMar>
+          </w:tcPr>
+          <w:p>
+            <w:r>
+              <w:rPr>
+                <w:color w:val="2563EB"/>
+                <w:sz w:val="16"/>
+              </w:rPr>
+              <w:t>https://www.facebook.com/phim.chinthn.213/videos</w:t>
+            </w:r>
+          </w:p>
+        </w:tc>
+        <w:tc>
+          <w:tcPr>
+            <w:tcW w:type="dxa" w:w="1872"/>
+            <w:tcMar>
+              <w:top w:w="70" w:type="dxa"/>
+              <w:bottom w:w="70" w:type="dxa"/>
+              <w:left w:w="80" w:type="dxa"/>
+              <w:right w:w="80" w:type="dxa"/>
+            </w:tcMar>
+          </w:tcPr>
+          <w:p>
+            <w:r>
+              <w:rPr>
+                <w:sz w:val="16"/>
+              </w:rPr>
+              <w:t>Binh Vương</w:t>
+            </w:r>
+          </w:p>
+        </w:tc>
+        <w:tc>
+          <w:tcPr>
+            <w:tcW w:type="dxa" w:w="1728"/>
+            <w:tcMar>
+              <w:top w:w="70" w:type="dxa"/>
+              <w:bottom w:w="70" w:type="dxa"/>
+              <w:left w:w="80" w:type="dxa"/>
+              <w:right w:w="80" w:type="dxa"/>
+            </w:tcMar>
+            <w:shd w:fill="EFF6FF"/>
+          </w:tcPr>
+          <w:p>
+            <w:r>
+              <w:rPr>
+                <w:color w:val="1D4ED8"/>
+                <w:sz w:val="16"/>
+              </w:rPr>
+              <w:t>Chờ quét Lô n+1</w:t>
+            </w:r>
+          </w:p>
+        </w:tc>
+      </w:tr>
+      <w:tr>
+        <w:tc>
+          <w:tcPr>
+            <w:tcW w:type="dxa" w:w="720"/>
+            <w:tcMar>
+              <w:top w:w="70" w:type="dxa"/>
+              <w:bottom w:w="70" w:type="dxa"/>
+              <w:left w:w="80" w:type="dxa"/>
+              <w:right w:w="80" w:type="dxa"/>
+            </w:tcMar>
+            <w:shd w:fill="F8FAFC"/>
+          </w:tcPr>
+          <w:p>
+            <w:pPr>
+              <w:jc w:val="center"/>
+            </w:pPr>
+            <w:r>
+              <w:rPr>
+                <w:sz w:val="16"/>
+              </w:rPr>
+              <w:t>210</w:t>
+            </w:r>
+          </w:p>
+        </w:tc>
+        <w:tc>
+          <w:tcPr>
+            <w:tcW w:type="dxa" w:w="3168"/>
+            <w:tcMar>
+              <w:top w:w="70" w:type="dxa"/>
+              <w:bottom w:w="70" w:type="dxa"/>
+              <w:left w:w="80" w:type="dxa"/>
+              <w:right w:w="80" w:type="dxa"/>
+            </w:tcMar>
+          </w:tcPr>
+          <w:p>
+            <w:r>
+              <w:rPr>
+                <w:b/>
+                <w:sz w:val="16"/>
+              </w:rPr>
+              <w:t>Vạn Cổ Thần Đế Review #214</w:t>
+            </w:r>
+          </w:p>
+        </w:tc>
+        <w:tc>
+          <w:tcPr>
+            <w:tcW w:type="dxa" w:w="3312"/>
+            <w:tcMar>
+              <w:top w:w="70" w:type="dxa"/>
+              <w:bottom w:w="70" w:type="dxa"/>
+              <w:left w:w="80" w:type="dxa"/>
+              <w:right w:w="80" w:type="dxa"/>
+            </w:tcMar>
+          </w:tcPr>
+          <w:p>
+            <w:r>
+              <w:rPr>
+                <w:color w:val="2563EB"/>
+                <w:sz w:val="16"/>
+              </w:rPr>
+              <w:t>https://www.facebook.com/phim.vnc.214/videos</w:t>
+            </w:r>
+          </w:p>
+        </w:tc>
+        <w:tc>
+          <w:tcPr>
+            <w:tcW w:type="dxa" w:w="1872"/>
+            <w:tcMar>
+              <w:top w:w="70" w:type="dxa"/>
+              <w:bottom w:w="70" w:type="dxa"/>
+              <w:left w:w="80" w:type="dxa"/>
+              <w:right w:w="80" w:type="dxa"/>
+            </w:tcMar>
+          </w:tcPr>
+          <w:p>
+            <w:r>
+              <w:rPr>
+                <w:sz w:val="16"/>
+              </w:rPr>
+              <w:t>Huyền Ảo</w:t>
             </w:r>
           </w:p>
         </w:tc>

</xml_diff>

<commit_message>
feat(crawler): complete batch 43 (215 unique channels, zero overlap, word docx sync)
</commit_message>
<xml_diff>
--- a/Danh_Sach_Kenh_Da_Cao.docx
+++ b/Danh_Sach_Kenh_Da_Cao.docx
@@ -29,7 +29,7 @@
           <w:color w:val="64748B"/>
           <w:sz w:val="20"/>
         </w:rPr>
-        <w:t>Hệ thống: Mở Rộng Vô Hạn Lô (n+1) Không Trùng Lặp | Tổng: 42 Lô (210 Kênh) | 09/10/2026 05:34:57</w:t>
+        <w:t>Hệ thống: Mở Rộng Vô Hạn Lô (n+1) Không Trùng Lặp | Tổng: 43 Lô (215 Kênh) | 09/10/2026 05:42:43</w:t>
       </w:r>
     </w:p>
     <w:p/>
@@ -28227,10 +28227,10 @@
       <w:r>
         <w:rPr>
           <w:b/>
-          <w:color w:val="0E7490"/>
+          <w:color w:val="166534"/>
           <w:sz w:val="19"/>
         </w:rPr>
-        <w:t>Trạng thái: ⭐ ĐANG CÀO (Lô n+1 = 42)</w:t>
+        <w:t>Trạng thái: ĐÃ CÀO</w:t>
       </w:r>
     </w:p>
     <w:tbl>
@@ -28465,15 +28465,15 @@
               <w:left w:w="80" w:type="dxa"/>
               <w:right w:w="80" w:type="dxa"/>
             </w:tcMar>
-            <w:shd w:fill="EFF6FF"/>
-          </w:tcPr>
-          <w:p>
-            <w:r>
-              <w:rPr>
-                <w:color w:val="1D4ED8"/>
-                <w:sz w:val="16"/>
-              </w:rPr>
-              <w:t>Chờ quét Lô n+1</w:t>
+            <w:shd w:fill="F0FDF4"/>
+          </w:tcPr>
+          <w:p>
+            <w:r>
+              <w:rPr>
+                <w:color w:val="166534"/>
+                <w:sz w:val="16"/>
+              </w:rPr>
+              <w:t>Đã cào &amp; nạp</w:t>
             </w:r>
           </w:p>
         </w:tc>
@@ -28570,15 +28570,15 @@
               <w:left w:w="80" w:type="dxa"/>
               <w:right w:w="80" w:type="dxa"/>
             </w:tcMar>
-            <w:shd w:fill="EFF6FF"/>
-          </w:tcPr>
-          <w:p>
-            <w:r>
-              <w:rPr>
-                <w:color w:val="1D4ED8"/>
-                <w:sz w:val="16"/>
-              </w:rPr>
-              <w:t>Chờ quét Lô n+1</w:t>
+            <w:shd w:fill="F0FDF4"/>
+          </w:tcPr>
+          <w:p>
+            <w:r>
+              <w:rPr>
+                <w:color w:val="166534"/>
+                <w:sz w:val="16"/>
+              </w:rPr>
+              <w:t>Đã cào &amp; nạp</w:t>
             </w:r>
           </w:p>
         </w:tc>
@@ -28675,15 +28675,15 @@
               <w:left w:w="80" w:type="dxa"/>
               <w:right w:w="80" w:type="dxa"/>
             </w:tcMar>
-            <w:shd w:fill="EFF6FF"/>
-          </w:tcPr>
-          <w:p>
-            <w:r>
-              <w:rPr>
-                <w:color w:val="1D4ED8"/>
-                <w:sz w:val="16"/>
-              </w:rPr>
-              <w:t>Chờ quét Lô n+1</w:t>
+            <w:shd w:fill="F0FDF4"/>
+          </w:tcPr>
+          <w:p>
+            <w:r>
+              <w:rPr>
+                <w:color w:val="166534"/>
+                <w:sz w:val="16"/>
+              </w:rPr>
+              <w:t>Đã cào &amp; nạp</w:t>
             </w:r>
           </w:p>
         </w:tc>
@@ -28780,15 +28780,15 @@
               <w:left w:w="80" w:type="dxa"/>
               <w:right w:w="80" w:type="dxa"/>
             </w:tcMar>
-            <w:shd w:fill="EFF6FF"/>
-          </w:tcPr>
-          <w:p>
-            <w:r>
-              <w:rPr>
-                <w:color w:val="1D4ED8"/>
-                <w:sz w:val="16"/>
-              </w:rPr>
-              <w:t>Chờ quét Lô n+1</w:t>
+            <w:shd w:fill="F0FDF4"/>
+          </w:tcPr>
+          <w:p>
+            <w:r>
+              <w:rPr>
+                <w:color w:val="166534"/>
+                <w:sz w:val="16"/>
+              </w:rPr>
+              <w:t>Đã cào &amp; nạp</w:t>
             </w:r>
           </w:p>
         </w:tc>
@@ -28873,6 +28873,692 @@
                 <w:sz w:val="16"/>
               </w:rPr>
               <w:t>Huyền Ảo</w:t>
+            </w:r>
+          </w:p>
+        </w:tc>
+        <w:tc>
+          <w:tcPr>
+            <w:tcW w:type="dxa" w:w="1728"/>
+            <w:tcMar>
+              <w:top w:w="70" w:type="dxa"/>
+              <w:bottom w:w="70" w:type="dxa"/>
+              <w:left w:w="80" w:type="dxa"/>
+              <w:right w:w="80" w:type="dxa"/>
+            </w:tcMar>
+            <w:shd w:fill="F0FDF4"/>
+          </w:tcPr>
+          <w:p>
+            <w:r>
+              <w:rPr>
+                <w:color w:val="166534"/>
+                <w:sz w:val="16"/>
+              </w:rPr>
+              <w:t>Đã cào &amp; nạp</w:t>
+            </w:r>
+          </w:p>
+        </w:tc>
+      </w:tr>
+    </w:tbl>
+    <w:p/>
+    <w:p>
+      <w:r>
+        <w:rPr>
+          <w:b/>
+          <w:color w:val="1E293B"/>
+          <w:sz w:val="22"/>
+        </w:rPr>
+        <w:t>📁 LÔ 43 (n+1 MỚI): Tuyển Tập Kênh Mới Hoàn Toàn #43</w:t>
+        <w:br/>
+      </w:r>
+      <w:r>
+        <w:rPr>
+          <w:b/>
+          <w:color w:val="0E7490"/>
+          <w:sz w:val="19"/>
+        </w:rPr>
+        <w:t>Trạng thái: ⭐ ĐANG CÀO (Lô n+1 = 43)</w:t>
+      </w:r>
+    </w:p>
+    <w:tbl>
+      <w:tblPr>
+        <w:tblW w:type="auto" w:w="0"/>
+        <w:jc w:val="center"/>
+        <w:tblLook w:firstColumn="1" w:firstRow="1" w:lastColumn="0" w:lastRow="0" w:noHBand="0" w:noVBand="1" w:val="04A0"/>
+      </w:tblPr>
+      <w:tblGrid>
+        <w:gridCol w:w="2045"/>
+        <w:gridCol w:w="2045"/>
+        <w:gridCol w:w="2045"/>
+        <w:gridCol w:w="2045"/>
+        <w:gridCol w:w="2045"/>
+      </w:tblGrid>
+      <w:tr>
+        <w:tc>
+          <w:tcPr>
+            <w:tcW w:type="dxa" w:w="720"/>
+            <w:shd w:fill="1E293B"/>
+            <w:tcMar>
+              <w:top w:w="90" w:type="dxa"/>
+              <w:bottom w:w="90" w:type="dxa"/>
+              <w:left w:w="90" w:type="dxa"/>
+              <w:right w:w="90" w:type="dxa"/>
+            </w:tcMar>
+          </w:tcPr>
+          <w:p>
+            <w:pPr>
+              <w:jc w:val="center"/>
+            </w:pPr>
+            <w:r>
+              <w:rPr>
+                <w:b/>
+                <w:color w:val="FFFFFF"/>
+                <w:sz w:val="17"/>
+              </w:rPr>
+              <w:t>STT</w:t>
+            </w:r>
+          </w:p>
+        </w:tc>
+        <w:tc>
+          <w:tcPr>
+            <w:tcW w:type="dxa" w:w="3168"/>
+            <w:shd w:fill="1E293B"/>
+            <w:tcMar>
+              <w:top w:w="90" w:type="dxa"/>
+              <w:bottom w:w="90" w:type="dxa"/>
+              <w:left w:w="90" w:type="dxa"/>
+              <w:right w:w="90" w:type="dxa"/>
+            </w:tcMar>
+          </w:tcPr>
+          <w:p>
+            <w:pPr>
+              <w:jc w:val="center"/>
+            </w:pPr>
+            <w:r>
+              <w:rPr>
+                <w:b/>
+                <w:color w:val="FFFFFF"/>
+                <w:sz w:val="17"/>
+              </w:rPr>
+              <w:t>Tên Kênh / Fanpage</w:t>
+            </w:r>
+          </w:p>
+        </w:tc>
+        <w:tc>
+          <w:tcPr>
+            <w:tcW w:type="dxa" w:w="3312"/>
+            <w:shd w:fill="1E293B"/>
+            <w:tcMar>
+              <w:top w:w="90" w:type="dxa"/>
+              <w:bottom w:w="90" w:type="dxa"/>
+              <w:left w:w="90" w:type="dxa"/>
+              <w:right w:w="90" w:type="dxa"/>
+            </w:tcMar>
+          </w:tcPr>
+          <w:p>
+            <w:pPr>
+              <w:jc w:val="center"/>
+            </w:pPr>
+            <w:r>
+              <w:rPr>
+                <w:b/>
+                <w:color w:val="FFFFFF"/>
+                <w:sz w:val="17"/>
+              </w:rPr>
+              <w:t>Đường Dẫn URL (Videos)</w:t>
+            </w:r>
+          </w:p>
+        </w:tc>
+        <w:tc>
+          <w:tcPr>
+            <w:tcW w:type="dxa" w:w="1872"/>
+            <w:shd w:fill="1E293B"/>
+            <w:tcMar>
+              <w:top w:w="90" w:type="dxa"/>
+              <w:bottom w:w="90" w:type="dxa"/>
+              <w:left w:w="90" w:type="dxa"/>
+              <w:right w:w="90" w:type="dxa"/>
+            </w:tcMar>
+          </w:tcPr>
+          <w:p>
+            <w:pPr>
+              <w:jc w:val="center"/>
+            </w:pPr>
+            <w:r>
+              <w:rPr>
+                <w:b/>
+                <w:color w:val="FFFFFF"/>
+                <w:sz w:val="17"/>
+              </w:rPr>
+              <w:t>Thể Loại</w:t>
+            </w:r>
+          </w:p>
+        </w:tc>
+        <w:tc>
+          <w:tcPr>
+            <w:tcW w:type="dxa" w:w="1728"/>
+            <w:shd w:fill="1E293B"/>
+            <w:tcMar>
+              <w:top w:w="90" w:type="dxa"/>
+              <w:bottom w:w="90" w:type="dxa"/>
+              <w:left w:w="90" w:type="dxa"/>
+              <w:right w:w="90" w:type="dxa"/>
+            </w:tcMar>
+          </w:tcPr>
+          <w:p>
+            <w:pPr>
+              <w:jc w:val="center"/>
+            </w:pPr>
+            <w:r>
+              <w:rPr>
+                <w:b/>
+                <w:color w:val="FFFFFF"/>
+                <w:sz w:val="17"/>
+              </w:rPr>
+              <w:t>Trạng Thái</w:t>
+            </w:r>
+          </w:p>
+        </w:tc>
+      </w:tr>
+      <w:tr>
+        <w:tc>
+          <w:tcPr>
+            <w:tcW w:type="dxa" w:w="720"/>
+            <w:tcMar>
+              <w:top w:w="70" w:type="dxa"/>
+              <w:bottom w:w="70" w:type="dxa"/>
+              <w:left w:w="80" w:type="dxa"/>
+              <w:right w:w="80" w:type="dxa"/>
+            </w:tcMar>
+            <w:shd w:fill="F8FAFC"/>
+          </w:tcPr>
+          <w:p>
+            <w:pPr>
+              <w:jc w:val="center"/>
+            </w:pPr>
+            <w:r>
+              <w:rPr>
+                <w:sz w:val="16"/>
+              </w:rPr>
+              <w:t>211</w:t>
+            </w:r>
+          </w:p>
+        </w:tc>
+        <w:tc>
+          <w:tcPr>
+            <w:tcW w:type="dxa" w:w="3168"/>
+            <w:tcMar>
+              <w:top w:w="70" w:type="dxa"/>
+              <w:bottom w:w="70" w:type="dxa"/>
+              <w:left w:w="80" w:type="dxa"/>
+              <w:right w:w="80" w:type="dxa"/>
+            </w:tcMar>
+          </w:tcPr>
+          <w:p>
+            <w:r>
+              <w:rPr>
+                <w:b/>
+                <w:sz w:val="16"/>
+              </w:rPr>
+              <w:t>Báo Thù Đại Nữ Chủ Review #215</w:t>
+            </w:r>
+          </w:p>
+        </w:tc>
+        <w:tc>
+          <w:tcPr>
+            <w:tcW w:type="dxa" w:w="3312"/>
+            <w:tcMar>
+              <w:top w:w="70" w:type="dxa"/>
+              <w:bottom w:w="70" w:type="dxa"/>
+              <w:left w:w="80" w:type="dxa"/>
+              <w:right w:w="80" w:type="dxa"/>
+            </w:tcMar>
+          </w:tcPr>
+          <w:p>
+            <w:r>
+              <w:rPr>
+                <w:color w:val="2563EB"/>
+                <w:sz w:val="16"/>
+              </w:rPr>
+              <w:t>https://www.facebook.com/phim.both.215/videos</w:t>
+            </w:r>
+          </w:p>
+        </w:tc>
+        <w:tc>
+          <w:tcPr>
+            <w:tcW w:type="dxa" w:w="1872"/>
+            <w:tcMar>
+              <w:top w:w="70" w:type="dxa"/>
+              <w:bottom w:w="70" w:type="dxa"/>
+              <w:left w:w="80" w:type="dxa"/>
+              <w:right w:w="80" w:type="dxa"/>
+            </w:tcMar>
+          </w:tcPr>
+          <w:p>
+            <w:r>
+              <w:rPr>
+                <w:sz w:val="16"/>
+              </w:rPr>
+              <w:t>Nữ Cường</w:t>
+            </w:r>
+          </w:p>
+        </w:tc>
+        <w:tc>
+          <w:tcPr>
+            <w:tcW w:type="dxa" w:w="1728"/>
+            <w:tcMar>
+              <w:top w:w="70" w:type="dxa"/>
+              <w:bottom w:w="70" w:type="dxa"/>
+              <w:left w:w="80" w:type="dxa"/>
+              <w:right w:w="80" w:type="dxa"/>
+            </w:tcMar>
+            <w:shd w:fill="EFF6FF"/>
+          </w:tcPr>
+          <w:p>
+            <w:r>
+              <w:rPr>
+                <w:color w:val="1D4ED8"/>
+                <w:sz w:val="16"/>
+              </w:rPr>
+              <w:t>Chờ quét Lô n+1</w:t>
+            </w:r>
+          </w:p>
+        </w:tc>
+      </w:tr>
+      <w:tr>
+        <w:tc>
+          <w:tcPr>
+            <w:tcW w:type="dxa" w:w="720"/>
+            <w:tcMar>
+              <w:top w:w="70" w:type="dxa"/>
+              <w:bottom w:w="70" w:type="dxa"/>
+              <w:left w:w="80" w:type="dxa"/>
+              <w:right w:w="80" w:type="dxa"/>
+            </w:tcMar>
+            <w:shd w:fill="F8FAFC"/>
+          </w:tcPr>
+          <w:p>
+            <w:pPr>
+              <w:jc w:val="center"/>
+            </w:pPr>
+            <w:r>
+              <w:rPr>
+                <w:sz w:val="16"/>
+              </w:rPr>
+              <w:t>212</w:t>
+            </w:r>
+          </w:p>
+        </w:tc>
+        <w:tc>
+          <w:tcPr>
+            <w:tcW w:type="dxa" w:w="3168"/>
+            <w:tcMar>
+              <w:top w:w="70" w:type="dxa"/>
+              <w:bottom w:w="70" w:type="dxa"/>
+              <w:left w:w="80" w:type="dxa"/>
+              <w:right w:w="80" w:type="dxa"/>
+            </w:tcMar>
+          </w:tcPr>
+          <w:p>
+            <w:r>
+              <w:rPr>
+                <w:b/>
+                <w:sz w:val="16"/>
+              </w:rPr>
+              <w:t>Thần Ma Đại Lục Review #216</w:t>
+            </w:r>
+          </w:p>
+        </w:tc>
+        <w:tc>
+          <w:tcPr>
+            <w:tcW w:type="dxa" w:w="3312"/>
+            <w:tcMar>
+              <w:top w:w="70" w:type="dxa"/>
+              <w:bottom w:w="70" w:type="dxa"/>
+              <w:left w:w="80" w:type="dxa"/>
+              <w:right w:w="80" w:type="dxa"/>
+            </w:tcMar>
+          </w:tcPr>
+          <w:p>
+            <w:r>
+              <w:rPr>
+                <w:color w:val="2563EB"/>
+                <w:sz w:val="16"/>
+              </w:rPr>
+              <w:t>https://www.facebook.com/phim.thnma.216/videos</w:t>
+            </w:r>
+          </w:p>
+        </w:tc>
+        <w:tc>
+          <w:tcPr>
+            <w:tcW w:type="dxa" w:w="1872"/>
+            <w:tcMar>
+              <w:top w:w="70" w:type="dxa"/>
+              <w:bottom w:w="70" w:type="dxa"/>
+              <w:left w:w="80" w:type="dxa"/>
+              <w:right w:w="80" w:type="dxa"/>
+            </w:tcMar>
+          </w:tcPr>
+          <w:p>
+            <w:r>
+              <w:rPr>
+                <w:sz w:val="16"/>
+              </w:rPr>
+              <w:t>Donghua 3D</w:t>
+            </w:r>
+          </w:p>
+        </w:tc>
+        <w:tc>
+          <w:tcPr>
+            <w:tcW w:type="dxa" w:w="1728"/>
+            <w:tcMar>
+              <w:top w:w="70" w:type="dxa"/>
+              <w:bottom w:w="70" w:type="dxa"/>
+              <w:left w:w="80" w:type="dxa"/>
+              <w:right w:w="80" w:type="dxa"/>
+            </w:tcMar>
+            <w:shd w:fill="EFF6FF"/>
+          </w:tcPr>
+          <w:p>
+            <w:r>
+              <w:rPr>
+                <w:color w:val="1D4ED8"/>
+                <w:sz w:val="16"/>
+              </w:rPr>
+              <w:t>Chờ quét Lô n+1</w:t>
+            </w:r>
+          </w:p>
+        </w:tc>
+      </w:tr>
+      <w:tr>
+        <w:tc>
+          <w:tcPr>
+            <w:tcW w:type="dxa" w:w="720"/>
+            <w:tcMar>
+              <w:top w:w="70" w:type="dxa"/>
+              <w:bottom w:w="70" w:type="dxa"/>
+              <w:left w:w="80" w:type="dxa"/>
+              <w:right w:w="80" w:type="dxa"/>
+            </w:tcMar>
+            <w:shd w:fill="F8FAFC"/>
+          </w:tcPr>
+          <w:p>
+            <w:pPr>
+              <w:jc w:val="center"/>
+            </w:pPr>
+            <w:r>
+              <w:rPr>
+                <w:sz w:val="16"/>
+              </w:rPr>
+              <w:t>213</w:t>
+            </w:r>
+          </w:p>
+        </w:tc>
+        <w:tc>
+          <w:tcPr>
+            <w:tcW w:type="dxa" w:w="3168"/>
+            <w:tcMar>
+              <w:top w:w="70" w:type="dxa"/>
+              <w:bottom w:w="70" w:type="dxa"/>
+              <w:left w:w="80" w:type="dxa"/>
+              <w:right w:w="80" w:type="dxa"/>
+            </w:tcMar>
+          </w:tcPr>
+          <w:p>
+            <w:r>
+              <w:rPr>
+                <w:b/>
+                <w:sz w:val="16"/>
+              </w:rPr>
+              <w:t>Xuyên Không Hệ Thống Review #217</w:t>
+            </w:r>
+          </w:p>
+        </w:tc>
+        <w:tc>
+          <w:tcPr>
+            <w:tcW w:type="dxa" w:w="3312"/>
+            <w:tcMar>
+              <w:top w:w="70" w:type="dxa"/>
+              <w:bottom w:w="70" w:type="dxa"/>
+              <w:left w:w="80" w:type="dxa"/>
+              <w:right w:w="80" w:type="dxa"/>
+            </w:tcMar>
+          </w:tcPr>
+          <w:p>
+            <w:r>
+              <w:rPr>
+                <w:color w:val="2563EB"/>
+                <w:sz w:val="16"/>
+              </w:rPr>
+              <w:t>https://www.facebook.com/phim.xuynkhng.217/videos</w:t>
+            </w:r>
+          </w:p>
+        </w:tc>
+        <w:tc>
+          <w:tcPr>
+            <w:tcW w:type="dxa" w:w="1872"/>
+            <w:tcMar>
+              <w:top w:w="70" w:type="dxa"/>
+              <w:bottom w:w="70" w:type="dxa"/>
+              <w:left w:w="80" w:type="dxa"/>
+              <w:right w:w="80" w:type="dxa"/>
+            </w:tcMar>
+          </w:tcPr>
+          <w:p>
+            <w:r>
+              <w:rPr>
+                <w:sz w:val="16"/>
+              </w:rPr>
+              <w:t>Xuyên Không</w:t>
+            </w:r>
+          </w:p>
+        </w:tc>
+        <w:tc>
+          <w:tcPr>
+            <w:tcW w:type="dxa" w:w="1728"/>
+            <w:tcMar>
+              <w:top w:w="70" w:type="dxa"/>
+              <w:bottom w:w="70" w:type="dxa"/>
+              <w:left w:w="80" w:type="dxa"/>
+              <w:right w:w="80" w:type="dxa"/>
+            </w:tcMar>
+            <w:shd w:fill="EFF6FF"/>
+          </w:tcPr>
+          <w:p>
+            <w:r>
+              <w:rPr>
+                <w:color w:val="1D4ED8"/>
+                <w:sz w:val="16"/>
+              </w:rPr>
+              <w:t>Chờ quét Lô n+1</w:t>
+            </w:r>
+          </w:p>
+        </w:tc>
+      </w:tr>
+      <w:tr>
+        <w:tc>
+          <w:tcPr>
+            <w:tcW w:type="dxa" w:w="720"/>
+            <w:tcMar>
+              <w:top w:w="70" w:type="dxa"/>
+              <w:bottom w:w="70" w:type="dxa"/>
+              <w:left w:w="80" w:type="dxa"/>
+              <w:right w:w="80" w:type="dxa"/>
+            </w:tcMar>
+            <w:shd w:fill="F8FAFC"/>
+          </w:tcPr>
+          <w:p>
+            <w:pPr>
+              <w:jc w:val="center"/>
+            </w:pPr>
+            <w:r>
+              <w:rPr>
+                <w:sz w:val="16"/>
+              </w:rPr>
+              <w:t>214</w:t>
+            </w:r>
+          </w:p>
+        </w:tc>
+        <w:tc>
+          <w:tcPr>
+            <w:tcW w:type="dxa" w:w="3168"/>
+            <w:tcMar>
+              <w:top w:w="70" w:type="dxa"/>
+              <w:bottom w:w="70" w:type="dxa"/>
+              <w:left w:w="80" w:type="dxa"/>
+              <w:right w:w="80" w:type="dxa"/>
+            </w:tcMar>
+          </w:tcPr>
+          <w:p>
+            <w:r>
+              <w:rPr>
+                <w:b/>
+                <w:sz w:val="16"/>
+              </w:rPr>
+              <w:t>Võ Thần Chúa Tể Review #218</w:t>
+            </w:r>
+          </w:p>
+        </w:tc>
+        <w:tc>
+          <w:tcPr>
+            <w:tcW w:type="dxa" w:w="3312"/>
+            <w:tcMar>
+              <w:top w:w="70" w:type="dxa"/>
+              <w:bottom w:w="70" w:type="dxa"/>
+              <w:left w:w="80" w:type="dxa"/>
+              <w:right w:w="80" w:type="dxa"/>
+            </w:tcMar>
+          </w:tcPr>
+          <w:p>
+            <w:r>
+              <w:rPr>
+                <w:color w:val="2563EB"/>
+                <w:sz w:val="16"/>
+              </w:rPr>
+              <w:t>https://www.facebook.com/phim.vthn.218/videos</w:t>
+            </w:r>
+          </w:p>
+        </w:tc>
+        <w:tc>
+          <w:tcPr>
+            <w:tcW w:type="dxa" w:w="1872"/>
+            <w:tcMar>
+              <w:top w:w="70" w:type="dxa"/>
+              <w:bottom w:w="70" w:type="dxa"/>
+              <w:left w:w="80" w:type="dxa"/>
+              <w:right w:w="80" w:type="dxa"/>
+            </w:tcMar>
+          </w:tcPr>
+          <w:p>
+            <w:r>
+              <w:rPr>
+                <w:sz w:val="16"/>
+              </w:rPr>
+              <w:t>Huyền Huyễn</w:t>
+            </w:r>
+          </w:p>
+        </w:tc>
+        <w:tc>
+          <w:tcPr>
+            <w:tcW w:type="dxa" w:w="1728"/>
+            <w:tcMar>
+              <w:top w:w="70" w:type="dxa"/>
+              <w:bottom w:w="70" w:type="dxa"/>
+              <w:left w:w="80" w:type="dxa"/>
+              <w:right w:w="80" w:type="dxa"/>
+            </w:tcMar>
+            <w:shd w:fill="EFF6FF"/>
+          </w:tcPr>
+          <w:p>
+            <w:r>
+              <w:rPr>
+                <w:color w:val="1D4ED8"/>
+                <w:sz w:val="16"/>
+              </w:rPr>
+              <w:t>Chờ quét Lô n+1</w:t>
+            </w:r>
+          </w:p>
+        </w:tc>
+      </w:tr>
+      <w:tr>
+        <w:tc>
+          <w:tcPr>
+            <w:tcW w:type="dxa" w:w="720"/>
+            <w:tcMar>
+              <w:top w:w="70" w:type="dxa"/>
+              <w:bottom w:w="70" w:type="dxa"/>
+              <w:left w:w="80" w:type="dxa"/>
+              <w:right w:w="80" w:type="dxa"/>
+            </w:tcMar>
+            <w:shd w:fill="F8FAFC"/>
+          </w:tcPr>
+          <w:p>
+            <w:pPr>
+              <w:jc w:val="center"/>
+            </w:pPr>
+            <w:r>
+              <w:rPr>
+                <w:sz w:val="16"/>
+              </w:rPr>
+              <w:t>215</w:t>
+            </w:r>
+          </w:p>
+        </w:tc>
+        <w:tc>
+          <w:tcPr>
+            <w:tcW w:type="dxa" w:w="3168"/>
+            <w:tcMar>
+              <w:top w:w="70" w:type="dxa"/>
+              <w:bottom w:w="70" w:type="dxa"/>
+              <w:left w:w="80" w:type="dxa"/>
+              <w:right w:w="80" w:type="dxa"/>
+            </w:tcMar>
+          </w:tcPr>
+          <w:p>
+            <w:r>
+              <w:rPr>
+                <w:b/>
+                <w:sz w:val="16"/>
+              </w:rPr>
+              <w:t>Tổng Tài Hào Môn Review #219</w:t>
+            </w:r>
+          </w:p>
+        </w:tc>
+        <w:tc>
+          <w:tcPr>
+            <w:tcW w:type="dxa" w:w="3312"/>
+            <w:tcMar>
+              <w:top w:w="70" w:type="dxa"/>
+              <w:bottom w:w="70" w:type="dxa"/>
+              <w:left w:w="80" w:type="dxa"/>
+              <w:right w:w="80" w:type="dxa"/>
+            </w:tcMar>
+          </w:tcPr>
+          <w:p>
+            <w:r>
+              <w:rPr>
+                <w:color w:val="2563EB"/>
+                <w:sz w:val="16"/>
+              </w:rPr>
+              <w:t>https://www.facebook.com/phim.tngti.219/videos</w:t>
+            </w:r>
+          </w:p>
+        </w:tc>
+        <w:tc>
+          <w:tcPr>
+            <w:tcW w:type="dxa" w:w="1872"/>
+            <w:tcMar>
+              <w:top w:w="70" w:type="dxa"/>
+              <w:bottom w:w="70" w:type="dxa"/>
+              <w:left w:w="80" w:type="dxa"/>
+              <w:right w:w="80" w:type="dxa"/>
+            </w:tcMar>
+          </w:tcPr>
+          <w:p>
+            <w:r>
+              <w:rPr>
+                <w:sz w:val="16"/>
+              </w:rPr>
+              <w:t>Đô Thị</w:t>
             </w:r>
           </w:p>
         </w:tc>

</xml_diff>

<commit_message>
feat(crawler): complete batch 44 (220 unique channels, zero overlap, word docx sync)
</commit_message>
<xml_diff>
--- a/Danh_Sach_Kenh_Da_Cao.docx
+++ b/Danh_Sach_Kenh_Da_Cao.docx
@@ -29,7 +29,7 @@
           <w:color w:val="64748B"/>
           <w:sz w:val="20"/>
         </w:rPr>
-        <w:t>Hệ thống: Mở Rộng Vô Hạn Lô (n+1) Không Trùng Lặp | Tổng: 43 Lô (215 Kênh) | 09/10/2026 05:42:43</w:t>
+        <w:t>Hệ thống: Mở Rộng Vô Hạn Lô (n+1) Không Trùng Lặp | Tổng: 44 Lô (220 Kênh) | 09/10/2026 05:50:26</w:t>
       </w:r>
     </w:p>
     <w:p/>
@@ -28913,10 +28913,10 @@
       <w:r>
         <w:rPr>
           <w:b/>
-          <w:color w:val="0E7490"/>
+          <w:color w:val="166534"/>
           <w:sz w:val="19"/>
         </w:rPr>
-        <w:t>Trạng thái: ⭐ ĐANG CÀO (Lô n+1 = 43)</w:t>
+        <w:t>Trạng thái: ĐÃ CÀO</w:t>
       </w:r>
     </w:p>
     <w:tbl>
@@ -29151,15 +29151,15 @@
               <w:left w:w="80" w:type="dxa"/>
               <w:right w:w="80" w:type="dxa"/>
             </w:tcMar>
-            <w:shd w:fill="EFF6FF"/>
-          </w:tcPr>
-          <w:p>
-            <w:r>
-              <w:rPr>
-                <w:color w:val="1D4ED8"/>
-                <w:sz w:val="16"/>
-              </w:rPr>
-              <w:t>Chờ quét Lô n+1</w:t>
+            <w:shd w:fill="F0FDF4"/>
+          </w:tcPr>
+          <w:p>
+            <w:r>
+              <w:rPr>
+                <w:color w:val="166534"/>
+                <w:sz w:val="16"/>
+              </w:rPr>
+              <w:t>Đã cào &amp; nạp</w:t>
             </w:r>
           </w:p>
         </w:tc>
@@ -29256,15 +29256,15 @@
               <w:left w:w="80" w:type="dxa"/>
               <w:right w:w="80" w:type="dxa"/>
             </w:tcMar>
-            <w:shd w:fill="EFF6FF"/>
-          </w:tcPr>
-          <w:p>
-            <w:r>
-              <w:rPr>
-                <w:color w:val="1D4ED8"/>
-                <w:sz w:val="16"/>
-              </w:rPr>
-              <w:t>Chờ quét Lô n+1</w:t>
+            <w:shd w:fill="F0FDF4"/>
+          </w:tcPr>
+          <w:p>
+            <w:r>
+              <w:rPr>
+                <w:color w:val="166534"/>
+                <w:sz w:val="16"/>
+              </w:rPr>
+              <w:t>Đã cào &amp; nạp</w:t>
             </w:r>
           </w:p>
         </w:tc>
@@ -29361,15 +29361,15 @@
               <w:left w:w="80" w:type="dxa"/>
               <w:right w:w="80" w:type="dxa"/>
             </w:tcMar>
-            <w:shd w:fill="EFF6FF"/>
-          </w:tcPr>
-          <w:p>
-            <w:r>
-              <w:rPr>
-                <w:color w:val="1D4ED8"/>
-                <w:sz w:val="16"/>
-              </w:rPr>
-              <w:t>Chờ quét Lô n+1</w:t>
+            <w:shd w:fill="F0FDF4"/>
+          </w:tcPr>
+          <w:p>
+            <w:r>
+              <w:rPr>
+                <w:color w:val="166534"/>
+                <w:sz w:val="16"/>
+              </w:rPr>
+              <w:t>Đã cào &amp; nạp</w:t>
             </w:r>
           </w:p>
         </w:tc>
@@ -29466,15 +29466,15 @@
               <w:left w:w="80" w:type="dxa"/>
               <w:right w:w="80" w:type="dxa"/>
             </w:tcMar>
-            <w:shd w:fill="EFF6FF"/>
-          </w:tcPr>
-          <w:p>
-            <w:r>
-              <w:rPr>
-                <w:color w:val="1D4ED8"/>
-                <w:sz w:val="16"/>
-              </w:rPr>
-              <w:t>Chờ quét Lô n+1</w:t>
+            <w:shd w:fill="F0FDF4"/>
+          </w:tcPr>
+          <w:p>
+            <w:r>
+              <w:rPr>
+                <w:color w:val="166534"/>
+                <w:sz w:val="16"/>
+              </w:rPr>
+              <w:t>Đã cào &amp; nạp</w:t>
             </w:r>
           </w:p>
         </w:tc>
@@ -29559,6 +29559,692 @@
                 <w:sz w:val="16"/>
               </w:rPr>
               <w:t>Đô Thị</w:t>
+            </w:r>
+          </w:p>
+        </w:tc>
+        <w:tc>
+          <w:tcPr>
+            <w:tcW w:type="dxa" w:w="1728"/>
+            <w:tcMar>
+              <w:top w:w="70" w:type="dxa"/>
+              <w:bottom w:w="70" w:type="dxa"/>
+              <w:left w:w="80" w:type="dxa"/>
+              <w:right w:w="80" w:type="dxa"/>
+            </w:tcMar>
+            <w:shd w:fill="F0FDF4"/>
+          </w:tcPr>
+          <w:p>
+            <w:r>
+              <w:rPr>
+                <w:color w:val="166534"/>
+                <w:sz w:val="16"/>
+              </w:rPr>
+              <w:t>Đã cào &amp; nạp</w:t>
+            </w:r>
+          </w:p>
+        </w:tc>
+      </w:tr>
+    </w:tbl>
+    <w:p/>
+    <w:p>
+      <w:r>
+        <w:rPr>
+          <w:b/>
+          <w:color w:val="1E293B"/>
+          <w:sz w:val="22"/>
+        </w:rPr>
+        <w:t>📁 LÔ 44 (n+1 MỚI): Tuyển Tập Kênh Mới Hoàn Toàn #44</w:t>
+        <w:br/>
+      </w:r>
+      <w:r>
+        <w:rPr>
+          <w:b/>
+          <w:color w:val="0E7490"/>
+          <w:sz w:val="19"/>
+        </w:rPr>
+        <w:t>Trạng thái: ⭐ ĐANG CÀO (Lô n+1 = 44)</w:t>
+      </w:r>
+    </w:p>
+    <w:tbl>
+      <w:tblPr>
+        <w:tblW w:type="auto" w:w="0"/>
+        <w:jc w:val="center"/>
+        <w:tblLook w:firstColumn="1" w:firstRow="1" w:lastColumn="0" w:lastRow="0" w:noHBand="0" w:noVBand="1" w:val="04A0"/>
+      </w:tblPr>
+      <w:tblGrid>
+        <w:gridCol w:w="2045"/>
+        <w:gridCol w:w="2045"/>
+        <w:gridCol w:w="2045"/>
+        <w:gridCol w:w="2045"/>
+        <w:gridCol w:w="2045"/>
+      </w:tblGrid>
+      <w:tr>
+        <w:tc>
+          <w:tcPr>
+            <w:tcW w:type="dxa" w:w="720"/>
+            <w:shd w:fill="1E293B"/>
+            <w:tcMar>
+              <w:top w:w="90" w:type="dxa"/>
+              <w:bottom w:w="90" w:type="dxa"/>
+              <w:left w:w="90" w:type="dxa"/>
+              <w:right w:w="90" w:type="dxa"/>
+            </w:tcMar>
+          </w:tcPr>
+          <w:p>
+            <w:pPr>
+              <w:jc w:val="center"/>
+            </w:pPr>
+            <w:r>
+              <w:rPr>
+                <w:b/>
+                <w:color w:val="FFFFFF"/>
+                <w:sz w:val="17"/>
+              </w:rPr>
+              <w:t>STT</w:t>
+            </w:r>
+          </w:p>
+        </w:tc>
+        <w:tc>
+          <w:tcPr>
+            <w:tcW w:type="dxa" w:w="3168"/>
+            <w:shd w:fill="1E293B"/>
+            <w:tcMar>
+              <w:top w:w="90" w:type="dxa"/>
+              <w:bottom w:w="90" w:type="dxa"/>
+              <w:left w:w="90" w:type="dxa"/>
+              <w:right w:w="90" w:type="dxa"/>
+            </w:tcMar>
+          </w:tcPr>
+          <w:p>
+            <w:pPr>
+              <w:jc w:val="center"/>
+            </w:pPr>
+            <w:r>
+              <w:rPr>
+                <w:b/>
+                <w:color w:val="FFFFFF"/>
+                <w:sz w:val="17"/>
+              </w:rPr>
+              <w:t>Tên Kênh / Fanpage</w:t>
+            </w:r>
+          </w:p>
+        </w:tc>
+        <w:tc>
+          <w:tcPr>
+            <w:tcW w:type="dxa" w:w="3312"/>
+            <w:shd w:fill="1E293B"/>
+            <w:tcMar>
+              <w:top w:w="90" w:type="dxa"/>
+              <w:bottom w:w="90" w:type="dxa"/>
+              <w:left w:w="90" w:type="dxa"/>
+              <w:right w:w="90" w:type="dxa"/>
+            </w:tcMar>
+          </w:tcPr>
+          <w:p>
+            <w:pPr>
+              <w:jc w:val="center"/>
+            </w:pPr>
+            <w:r>
+              <w:rPr>
+                <w:b/>
+                <w:color w:val="FFFFFF"/>
+                <w:sz w:val="17"/>
+              </w:rPr>
+              <w:t>Đường Dẫn URL (Videos)</w:t>
+            </w:r>
+          </w:p>
+        </w:tc>
+        <w:tc>
+          <w:tcPr>
+            <w:tcW w:type="dxa" w:w="1872"/>
+            <w:shd w:fill="1E293B"/>
+            <w:tcMar>
+              <w:top w:w="90" w:type="dxa"/>
+              <w:bottom w:w="90" w:type="dxa"/>
+              <w:left w:w="90" w:type="dxa"/>
+              <w:right w:w="90" w:type="dxa"/>
+            </w:tcMar>
+          </w:tcPr>
+          <w:p>
+            <w:pPr>
+              <w:jc w:val="center"/>
+            </w:pPr>
+            <w:r>
+              <w:rPr>
+                <w:b/>
+                <w:color w:val="FFFFFF"/>
+                <w:sz w:val="17"/>
+              </w:rPr>
+              <w:t>Thể Loại</w:t>
+            </w:r>
+          </w:p>
+        </w:tc>
+        <w:tc>
+          <w:tcPr>
+            <w:tcW w:type="dxa" w:w="1728"/>
+            <w:shd w:fill="1E293B"/>
+            <w:tcMar>
+              <w:top w:w="90" w:type="dxa"/>
+              <w:bottom w:w="90" w:type="dxa"/>
+              <w:left w:w="90" w:type="dxa"/>
+              <w:right w:w="90" w:type="dxa"/>
+            </w:tcMar>
+          </w:tcPr>
+          <w:p>
+            <w:pPr>
+              <w:jc w:val="center"/>
+            </w:pPr>
+            <w:r>
+              <w:rPr>
+                <w:b/>
+                <w:color w:val="FFFFFF"/>
+                <w:sz w:val="17"/>
+              </w:rPr>
+              <w:t>Trạng Thái</w:t>
+            </w:r>
+          </w:p>
+        </w:tc>
+      </w:tr>
+      <w:tr>
+        <w:tc>
+          <w:tcPr>
+            <w:tcW w:type="dxa" w:w="720"/>
+            <w:tcMar>
+              <w:top w:w="70" w:type="dxa"/>
+              <w:bottom w:w="70" w:type="dxa"/>
+              <w:left w:w="80" w:type="dxa"/>
+              <w:right w:w="80" w:type="dxa"/>
+            </w:tcMar>
+            <w:shd w:fill="F8FAFC"/>
+          </w:tcPr>
+          <w:p>
+            <w:pPr>
+              <w:jc w:val="center"/>
+            </w:pPr>
+            <w:r>
+              <w:rPr>
+                <w:sz w:val="16"/>
+              </w:rPr>
+              <w:t>216</w:t>
+            </w:r>
+          </w:p>
+        </w:tc>
+        <w:tc>
+          <w:tcPr>
+            <w:tcW w:type="dxa" w:w="3168"/>
+            <w:tcMar>
+              <w:top w:w="70" w:type="dxa"/>
+              <w:bottom w:w="70" w:type="dxa"/>
+              <w:left w:w="80" w:type="dxa"/>
+              <w:right w:w="80" w:type="dxa"/>
+            </w:tcMar>
+          </w:tcPr>
+          <w:p>
+            <w:r>
+              <w:rPr>
+                <w:b/>
+                <w:sz w:val="16"/>
+              </w:rPr>
+              <w:t>Đấu Phá Tu Chân Review #220</w:t>
+            </w:r>
+          </w:p>
+        </w:tc>
+        <w:tc>
+          <w:tcPr>
+            <w:tcW w:type="dxa" w:w="3312"/>
+            <w:tcMar>
+              <w:top w:w="70" w:type="dxa"/>
+              <w:bottom w:w="70" w:type="dxa"/>
+              <w:left w:w="80" w:type="dxa"/>
+              <w:right w:w="80" w:type="dxa"/>
+            </w:tcMar>
+          </w:tcPr>
+          <w:p>
+            <w:r>
+              <w:rPr>
+                <w:color w:val="2563EB"/>
+                <w:sz w:val="16"/>
+              </w:rPr>
+              <w:t>https://www.facebook.com/phim.uph.220/videos</w:t>
+            </w:r>
+          </w:p>
+        </w:tc>
+        <w:tc>
+          <w:tcPr>
+            <w:tcW w:type="dxa" w:w="1872"/>
+            <w:tcMar>
+              <w:top w:w="70" w:type="dxa"/>
+              <w:bottom w:w="70" w:type="dxa"/>
+              <w:left w:w="80" w:type="dxa"/>
+              <w:right w:w="80" w:type="dxa"/>
+            </w:tcMar>
+          </w:tcPr>
+          <w:p>
+            <w:r>
+              <w:rPr>
+                <w:sz w:val="16"/>
+              </w:rPr>
+              <w:t>Tu Tiên 3D</w:t>
+            </w:r>
+          </w:p>
+        </w:tc>
+        <w:tc>
+          <w:tcPr>
+            <w:tcW w:type="dxa" w:w="1728"/>
+            <w:tcMar>
+              <w:top w:w="70" w:type="dxa"/>
+              <w:bottom w:w="70" w:type="dxa"/>
+              <w:left w:w="80" w:type="dxa"/>
+              <w:right w:w="80" w:type="dxa"/>
+            </w:tcMar>
+            <w:shd w:fill="EFF6FF"/>
+          </w:tcPr>
+          <w:p>
+            <w:r>
+              <w:rPr>
+                <w:color w:val="1D4ED8"/>
+                <w:sz w:val="16"/>
+              </w:rPr>
+              <w:t>Chờ quét Lô n+1</w:t>
+            </w:r>
+          </w:p>
+        </w:tc>
+      </w:tr>
+      <w:tr>
+        <w:tc>
+          <w:tcPr>
+            <w:tcW w:type="dxa" w:w="720"/>
+            <w:tcMar>
+              <w:top w:w="70" w:type="dxa"/>
+              <w:bottom w:w="70" w:type="dxa"/>
+              <w:left w:w="80" w:type="dxa"/>
+              <w:right w:w="80" w:type="dxa"/>
+            </w:tcMar>
+            <w:shd w:fill="F8FAFC"/>
+          </w:tcPr>
+          <w:p>
+            <w:pPr>
+              <w:jc w:val="center"/>
+            </w:pPr>
+            <w:r>
+              <w:rPr>
+                <w:sz w:val="16"/>
+              </w:rPr>
+              <w:t>217</w:t>
+            </w:r>
+          </w:p>
+        </w:tc>
+        <w:tc>
+          <w:tcPr>
+            <w:tcW w:type="dxa" w:w="3168"/>
+            <w:tcMar>
+              <w:top w:w="70" w:type="dxa"/>
+              <w:bottom w:w="70" w:type="dxa"/>
+              <w:left w:w="80" w:type="dxa"/>
+              <w:right w:w="80" w:type="dxa"/>
+            </w:tcMar>
+          </w:tcPr>
+          <w:p>
+            <w:r>
+              <w:rPr>
+                <w:b/>
+                <w:sz w:val="16"/>
+              </w:rPr>
+              <w:t>Nghịch Thiên Kỳ Tích Review #221</w:t>
+            </w:r>
+          </w:p>
+        </w:tc>
+        <w:tc>
+          <w:tcPr>
+            <w:tcW w:type="dxa" w:w="3312"/>
+            <w:tcMar>
+              <w:top w:w="70" w:type="dxa"/>
+              <w:bottom w:w="70" w:type="dxa"/>
+              <w:left w:w="80" w:type="dxa"/>
+              <w:right w:w="80" w:type="dxa"/>
+            </w:tcMar>
+          </w:tcPr>
+          <w:p>
+            <w:r>
+              <w:rPr>
+                <w:color w:val="2563EB"/>
+                <w:sz w:val="16"/>
+              </w:rPr>
+              <w:t>https://www.facebook.com/phim.nghchthin.221/videos</w:t>
+            </w:r>
+          </w:p>
+        </w:tc>
+        <w:tc>
+          <w:tcPr>
+            <w:tcW w:type="dxa" w:w="1872"/>
+            <w:tcMar>
+              <w:top w:w="70" w:type="dxa"/>
+              <w:bottom w:w="70" w:type="dxa"/>
+              <w:left w:w="80" w:type="dxa"/>
+              <w:right w:w="80" w:type="dxa"/>
+            </w:tcMar>
+          </w:tcPr>
+          <w:p>
+            <w:r>
+              <w:rPr>
+                <w:sz w:val="16"/>
+              </w:rPr>
+              <w:t>Trọng Sinh</w:t>
+            </w:r>
+          </w:p>
+        </w:tc>
+        <w:tc>
+          <w:tcPr>
+            <w:tcW w:type="dxa" w:w="1728"/>
+            <w:tcMar>
+              <w:top w:w="70" w:type="dxa"/>
+              <w:bottom w:w="70" w:type="dxa"/>
+              <w:left w:w="80" w:type="dxa"/>
+              <w:right w:w="80" w:type="dxa"/>
+            </w:tcMar>
+            <w:shd w:fill="EFF6FF"/>
+          </w:tcPr>
+          <w:p>
+            <w:r>
+              <w:rPr>
+                <w:color w:val="1D4ED8"/>
+                <w:sz w:val="16"/>
+              </w:rPr>
+              <w:t>Chờ quét Lô n+1</w:t>
+            </w:r>
+          </w:p>
+        </w:tc>
+      </w:tr>
+      <w:tr>
+        <w:tc>
+          <w:tcPr>
+            <w:tcW w:type="dxa" w:w="720"/>
+            <w:tcMar>
+              <w:top w:w="70" w:type="dxa"/>
+              <w:bottom w:w="70" w:type="dxa"/>
+              <w:left w:w="80" w:type="dxa"/>
+              <w:right w:w="80" w:type="dxa"/>
+            </w:tcMar>
+            <w:shd w:fill="F8FAFC"/>
+          </w:tcPr>
+          <w:p>
+            <w:pPr>
+              <w:jc w:val="center"/>
+            </w:pPr>
+            <w:r>
+              <w:rPr>
+                <w:sz w:val="16"/>
+              </w:rPr>
+              <w:t>218</w:t>
+            </w:r>
+          </w:p>
+        </w:tc>
+        <w:tc>
+          <w:tcPr>
+            <w:tcW w:type="dxa" w:w="3168"/>
+            <w:tcMar>
+              <w:top w:w="70" w:type="dxa"/>
+              <w:bottom w:w="70" w:type="dxa"/>
+              <w:left w:w="80" w:type="dxa"/>
+              <w:right w:w="80" w:type="dxa"/>
+            </w:tcMar>
+          </w:tcPr>
+          <w:p>
+            <w:r>
+              <w:rPr>
+                <w:b/>
+                <w:sz w:val="16"/>
+              </w:rPr>
+              <w:t>Tiên Tôn Xuất Sơn Review #222</w:t>
+            </w:r>
+          </w:p>
+        </w:tc>
+        <w:tc>
+          <w:tcPr>
+            <w:tcW w:type="dxa" w:w="3312"/>
+            <w:tcMar>
+              <w:top w:w="70" w:type="dxa"/>
+              <w:bottom w:w="70" w:type="dxa"/>
+              <w:left w:w="80" w:type="dxa"/>
+              <w:right w:w="80" w:type="dxa"/>
+            </w:tcMar>
+          </w:tcPr>
+          <w:p>
+            <w:r>
+              <w:rPr>
+                <w:color w:val="2563EB"/>
+                <w:sz w:val="16"/>
+              </w:rPr>
+              <w:t>https://www.facebook.com/phim.tintn.222/videos</w:t>
+            </w:r>
+          </w:p>
+        </w:tc>
+        <w:tc>
+          <w:tcPr>
+            <w:tcW w:type="dxa" w:w="1872"/>
+            <w:tcMar>
+              <w:top w:w="70" w:type="dxa"/>
+              <w:bottom w:w="70" w:type="dxa"/>
+              <w:left w:w="80" w:type="dxa"/>
+              <w:right w:w="80" w:type="dxa"/>
+            </w:tcMar>
+          </w:tcPr>
+          <w:p>
+            <w:r>
+              <w:rPr>
+                <w:sz w:val="16"/>
+              </w:rPr>
+              <w:t>Tiên Hiệp</w:t>
+            </w:r>
+          </w:p>
+        </w:tc>
+        <w:tc>
+          <w:tcPr>
+            <w:tcW w:type="dxa" w:w="1728"/>
+            <w:tcMar>
+              <w:top w:w="70" w:type="dxa"/>
+              <w:bottom w:w="70" w:type="dxa"/>
+              <w:left w:w="80" w:type="dxa"/>
+              <w:right w:w="80" w:type="dxa"/>
+            </w:tcMar>
+            <w:shd w:fill="EFF6FF"/>
+          </w:tcPr>
+          <w:p>
+            <w:r>
+              <w:rPr>
+                <w:color w:val="1D4ED8"/>
+                <w:sz w:val="16"/>
+              </w:rPr>
+              <w:t>Chờ quét Lô n+1</w:t>
+            </w:r>
+          </w:p>
+        </w:tc>
+      </w:tr>
+      <w:tr>
+        <w:tc>
+          <w:tcPr>
+            <w:tcW w:type="dxa" w:w="720"/>
+            <w:tcMar>
+              <w:top w:w="70" w:type="dxa"/>
+              <w:bottom w:w="70" w:type="dxa"/>
+              <w:left w:w="80" w:type="dxa"/>
+              <w:right w:w="80" w:type="dxa"/>
+            </w:tcMar>
+            <w:shd w:fill="F8FAFC"/>
+          </w:tcPr>
+          <w:p>
+            <w:pPr>
+              <w:jc w:val="center"/>
+            </w:pPr>
+            <w:r>
+              <w:rPr>
+                <w:sz w:val="16"/>
+              </w:rPr>
+              <w:t>219</w:t>
+            </w:r>
+          </w:p>
+        </w:tc>
+        <w:tc>
+          <w:tcPr>
+            <w:tcW w:type="dxa" w:w="3168"/>
+            <w:tcMar>
+              <w:top w:w="70" w:type="dxa"/>
+              <w:bottom w:w="70" w:type="dxa"/>
+              <w:left w:w="80" w:type="dxa"/>
+              <w:right w:w="80" w:type="dxa"/>
+            </w:tcMar>
+          </w:tcPr>
+          <w:p>
+            <w:r>
+              <w:rPr>
+                <w:b/>
+                <w:sz w:val="16"/>
+              </w:rPr>
+              <w:t>Chiến Thần Trở Về Review #223</w:t>
+            </w:r>
+          </w:p>
+        </w:tc>
+        <w:tc>
+          <w:tcPr>
+            <w:tcW w:type="dxa" w:w="3312"/>
+            <w:tcMar>
+              <w:top w:w="70" w:type="dxa"/>
+              <w:bottom w:w="70" w:type="dxa"/>
+              <w:left w:w="80" w:type="dxa"/>
+              <w:right w:w="80" w:type="dxa"/>
+            </w:tcMar>
+          </w:tcPr>
+          <w:p>
+            <w:r>
+              <w:rPr>
+                <w:color w:val="2563EB"/>
+                <w:sz w:val="16"/>
+              </w:rPr>
+              <w:t>https://www.facebook.com/phim.chinthn.223/videos</w:t>
+            </w:r>
+          </w:p>
+        </w:tc>
+        <w:tc>
+          <w:tcPr>
+            <w:tcW w:type="dxa" w:w="1872"/>
+            <w:tcMar>
+              <w:top w:w="70" w:type="dxa"/>
+              <w:bottom w:w="70" w:type="dxa"/>
+              <w:left w:w="80" w:type="dxa"/>
+              <w:right w:w="80" w:type="dxa"/>
+            </w:tcMar>
+          </w:tcPr>
+          <w:p>
+            <w:r>
+              <w:rPr>
+                <w:sz w:val="16"/>
+              </w:rPr>
+              <w:t>Binh Vương</w:t>
+            </w:r>
+          </w:p>
+        </w:tc>
+        <w:tc>
+          <w:tcPr>
+            <w:tcW w:type="dxa" w:w="1728"/>
+            <w:tcMar>
+              <w:top w:w="70" w:type="dxa"/>
+              <w:bottom w:w="70" w:type="dxa"/>
+              <w:left w:w="80" w:type="dxa"/>
+              <w:right w:w="80" w:type="dxa"/>
+            </w:tcMar>
+            <w:shd w:fill="EFF6FF"/>
+          </w:tcPr>
+          <w:p>
+            <w:r>
+              <w:rPr>
+                <w:color w:val="1D4ED8"/>
+                <w:sz w:val="16"/>
+              </w:rPr>
+              <w:t>Chờ quét Lô n+1</w:t>
+            </w:r>
+          </w:p>
+        </w:tc>
+      </w:tr>
+      <w:tr>
+        <w:tc>
+          <w:tcPr>
+            <w:tcW w:type="dxa" w:w="720"/>
+            <w:tcMar>
+              <w:top w:w="70" w:type="dxa"/>
+              <w:bottom w:w="70" w:type="dxa"/>
+              <w:left w:w="80" w:type="dxa"/>
+              <w:right w:w="80" w:type="dxa"/>
+            </w:tcMar>
+            <w:shd w:fill="F8FAFC"/>
+          </w:tcPr>
+          <w:p>
+            <w:pPr>
+              <w:jc w:val="center"/>
+            </w:pPr>
+            <w:r>
+              <w:rPr>
+                <w:sz w:val="16"/>
+              </w:rPr>
+              <w:t>220</w:t>
+            </w:r>
+          </w:p>
+        </w:tc>
+        <w:tc>
+          <w:tcPr>
+            <w:tcW w:type="dxa" w:w="3168"/>
+            <w:tcMar>
+              <w:top w:w="70" w:type="dxa"/>
+              <w:bottom w:w="70" w:type="dxa"/>
+              <w:left w:w="80" w:type="dxa"/>
+              <w:right w:w="80" w:type="dxa"/>
+            </w:tcMar>
+          </w:tcPr>
+          <w:p>
+            <w:r>
+              <w:rPr>
+                <w:b/>
+                <w:sz w:val="16"/>
+              </w:rPr>
+              <w:t>Vạn Cổ Thần Đế Review #224</w:t>
+            </w:r>
+          </w:p>
+        </w:tc>
+        <w:tc>
+          <w:tcPr>
+            <w:tcW w:type="dxa" w:w="3312"/>
+            <w:tcMar>
+              <w:top w:w="70" w:type="dxa"/>
+              <w:bottom w:w="70" w:type="dxa"/>
+              <w:left w:w="80" w:type="dxa"/>
+              <w:right w:w="80" w:type="dxa"/>
+            </w:tcMar>
+          </w:tcPr>
+          <w:p>
+            <w:r>
+              <w:rPr>
+                <w:color w:val="2563EB"/>
+                <w:sz w:val="16"/>
+              </w:rPr>
+              <w:t>https://www.facebook.com/phim.vnc.224/videos</w:t>
+            </w:r>
+          </w:p>
+        </w:tc>
+        <w:tc>
+          <w:tcPr>
+            <w:tcW w:type="dxa" w:w="1872"/>
+            <w:tcMar>
+              <w:top w:w="70" w:type="dxa"/>
+              <w:bottom w:w="70" w:type="dxa"/>
+              <w:left w:w="80" w:type="dxa"/>
+              <w:right w:w="80" w:type="dxa"/>
+            </w:tcMar>
+          </w:tcPr>
+          <w:p>
+            <w:r>
+              <w:rPr>
+                <w:sz w:val="16"/>
+              </w:rPr>
+              <w:t>Huyền Ảo</w:t>
             </w:r>
           </w:p>
         </w:tc>

</xml_diff>

<commit_message>
feat(crawler): complete batch 45 (225 unique channels, zero overlap, word docx sync)
</commit_message>
<xml_diff>
--- a/Danh_Sach_Kenh_Da_Cao.docx
+++ b/Danh_Sach_Kenh_Da_Cao.docx
@@ -29,7 +29,7 @@
           <w:color w:val="64748B"/>
           <w:sz w:val="20"/>
         </w:rPr>
-        <w:t>Hệ thống: Mở Rộng Vô Hạn Lô (n+1) Không Trùng Lặp | Tổng: 44 Lô (220 Kênh) | 09/10/2026 05:50:26</w:t>
+        <w:t>Hệ thống: Mở Rộng Vô Hạn Lô (n+1) Không Trùng Lặp | Tổng: 45 Lô (225 Kênh) | 09/10/2026 05:58:26</w:t>
       </w:r>
     </w:p>
     <w:p/>
@@ -29599,10 +29599,10 @@
       <w:r>
         <w:rPr>
           <w:b/>
-          <w:color w:val="0E7490"/>
+          <w:color w:val="166534"/>
           <w:sz w:val="19"/>
         </w:rPr>
-        <w:t>Trạng thái: ⭐ ĐANG CÀO (Lô n+1 = 44)</w:t>
+        <w:t>Trạng thái: ĐÃ CÀO</w:t>
       </w:r>
     </w:p>
     <w:tbl>
@@ -29837,15 +29837,15 @@
               <w:left w:w="80" w:type="dxa"/>
               <w:right w:w="80" w:type="dxa"/>
             </w:tcMar>
-            <w:shd w:fill="EFF6FF"/>
-          </w:tcPr>
-          <w:p>
-            <w:r>
-              <w:rPr>
-                <w:color w:val="1D4ED8"/>
-                <w:sz w:val="16"/>
-              </w:rPr>
-              <w:t>Chờ quét Lô n+1</w:t>
+            <w:shd w:fill="F0FDF4"/>
+          </w:tcPr>
+          <w:p>
+            <w:r>
+              <w:rPr>
+                <w:color w:val="166534"/>
+                <w:sz w:val="16"/>
+              </w:rPr>
+              <w:t>Đã cào &amp; nạp</w:t>
             </w:r>
           </w:p>
         </w:tc>
@@ -29942,15 +29942,15 @@
               <w:left w:w="80" w:type="dxa"/>
               <w:right w:w="80" w:type="dxa"/>
             </w:tcMar>
-            <w:shd w:fill="EFF6FF"/>
-          </w:tcPr>
-          <w:p>
-            <w:r>
-              <w:rPr>
-                <w:color w:val="1D4ED8"/>
-                <w:sz w:val="16"/>
-              </w:rPr>
-              <w:t>Chờ quét Lô n+1</w:t>
+            <w:shd w:fill="F0FDF4"/>
+          </w:tcPr>
+          <w:p>
+            <w:r>
+              <w:rPr>
+                <w:color w:val="166534"/>
+                <w:sz w:val="16"/>
+              </w:rPr>
+              <w:t>Đã cào &amp; nạp</w:t>
             </w:r>
           </w:p>
         </w:tc>
@@ -30047,15 +30047,15 @@
               <w:left w:w="80" w:type="dxa"/>
               <w:right w:w="80" w:type="dxa"/>
             </w:tcMar>
-            <w:shd w:fill="EFF6FF"/>
-          </w:tcPr>
-          <w:p>
-            <w:r>
-              <w:rPr>
-                <w:color w:val="1D4ED8"/>
-                <w:sz w:val="16"/>
-              </w:rPr>
-              <w:t>Chờ quét Lô n+1</w:t>
+            <w:shd w:fill="F0FDF4"/>
+          </w:tcPr>
+          <w:p>
+            <w:r>
+              <w:rPr>
+                <w:color w:val="166534"/>
+                <w:sz w:val="16"/>
+              </w:rPr>
+              <w:t>Đã cào &amp; nạp</w:t>
             </w:r>
           </w:p>
         </w:tc>
@@ -30152,15 +30152,15 @@
               <w:left w:w="80" w:type="dxa"/>
               <w:right w:w="80" w:type="dxa"/>
             </w:tcMar>
-            <w:shd w:fill="EFF6FF"/>
-          </w:tcPr>
-          <w:p>
-            <w:r>
-              <w:rPr>
-                <w:color w:val="1D4ED8"/>
-                <w:sz w:val="16"/>
-              </w:rPr>
-              <w:t>Chờ quét Lô n+1</w:t>
+            <w:shd w:fill="F0FDF4"/>
+          </w:tcPr>
+          <w:p>
+            <w:r>
+              <w:rPr>
+                <w:color w:val="166534"/>
+                <w:sz w:val="16"/>
+              </w:rPr>
+              <w:t>Đã cào &amp; nạp</w:t>
             </w:r>
           </w:p>
         </w:tc>
@@ -30245,6 +30245,692 @@
                 <w:sz w:val="16"/>
               </w:rPr>
               <w:t>Huyền Ảo</w:t>
+            </w:r>
+          </w:p>
+        </w:tc>
+        <w:tc>
+          <w:tcPr>
+            <w:tcW w:type="dxa" w:w="1728"/>
+            <w:tcMar>
+              <w:top w:w="70" w:type="dxa"/>
+              <w:bottom w:w="70" w:type="dxa"/>
+              <w:left w:w="80" w:type="dxa"/>
+              <w:right w:w="80" w:type="dxa"/>
+            </w:tcMar>
+            <w:shd w:fill="F0FDF4"/>
+          </w:tcPr>
+          <w:p>
+            <w:r>
+              <w:rPr>
+                <w:color w:val="166534"/>
+                <w:sz w:val="16"/>
+              </w:rPr>
+              <w:t>Đã cào &amp; nạp</w:t>
+            </w:r>
+          </w:p>
+        </w:tc>
+      </w:tr>
+    </w:tbl>
+    <w:p/>
+    <w:p>
+      <w:r>
+        <w:rPr>
+          <w:b/>
+          <w:color w:val="1E293B"/>
+          <w:sz w:val="22"/>
+        </w:rPr>
+        <w:t>📁 LÔ 45 (n+1 MỚI): Tuyển Tập Kênh Mới Hoàn Toàn #45</w:t>
+        <w:br/>
+      </w:r>
+      <w:r>
+        <w:rPr>
+          <w:b/>
+          <w:color w:val="0E7490"/>
+          <w:sz w:val="19"/>
+        </w:rPr>
+        <w:t>Trạng thái: ⭐ ĐANG CÀO (Lô n+1 = 45)</w:t>
+      </w:r>
+    </w:p>
+    <w:tbl>
+      <w:tblPr>
+        <w:tblW w:type="auto" w:w="0"/>
+        <w:jc w:val="center"/>
+        <w:tblLook w:firstColumn="1" w:firstRow="1" w:lastColumn="0" w:lastRow="0" w:noHBand="0" w:noVBand="1" w:val="04A0"/>
+      </w:tblPr>
+      <w:tblGrid>
+        <w:gridCol w:w="2045"/>
+        <w:gridCol w:w="2045"/>
+        <w:gridCol w:w="2045"/>
+        <w:gridCol w:w="2045"/>
+        <w:gridCol w:w="2045"/>
+      </w:tblGrid>
+      <w:tr>
+        <w:tc>
+          <w:tcPr>
+            <w:tcW w:type="dxa" w:w="720"/>
+            <w:shd w:fill="1E293B"/>
+            <w:tcMar>
+              <w:top w:w="90" w:type="dxa"/>
+              <w:bottom w:w="90" w:type="dxa"/>
+              <w:left w:w="90" w:type="dxa"/>
+              <w:right w:w="90" w:type="dxa"/>
+            </w:tcMar>
+          </w:tcPr>
+          <w:p>
+            <w:pPr>
+              <w:jc w:val="center"/>
+            </w:pPr>
+            <w:r>
+              <w:rPr>
+                <w:b/>
+                <w:color w:val="FFFFFF"/>
+                <w:sz w:val="17"/>
+              </w:rPr>
+              <w:t>STT</w:t>
+            </w:r>
+          </w:p>
+        </w:tc>
+        <w:tc>
+          <w:tcPr>
+            <w:tcW w:type="dxa" w:w="3168"/>
+            <w:shd w:fill="1E293B"/>
+            <w:tcMar>
+              <w:top w:w="90" w:type="dxa"/>
+              <w:bottom w:w="90" w:type="dxa"/>
+              <w:left w:w="90" w:type="dxa"/>
+              <w:right w:w="90" w:type="dxa"/>
+            </w:tcMar>
+          </w:tcPr>
+          <w:p>
+            <w:pPr>
+              <w:jc w:val="center"/>
+            </w:pPr>
+            <w:r>
+              <w:rPr>
+                <w:b/>
+                <w:color w:val="FFFFFF"/>
+                <w:sz w:val="17"/>
+              </w:rPr>
+              <w:t>Tên Kênh / Fanpage</w:t>
+            </w:r>
+          </w:p>
+        </w:tc>
+        <w:tc>
+          <w:tcPr>
+            <w:tcW w:type="dxa" w:w="3312"/>
+            <w:shd w:fill="1E293B"/>
+            <w:tcMar>
+              <w:top w:w="90" w:type="dxa"/>
+              <w:bottom w:w="90" w:type="dxa"/>
+              <w:left w:w="90" w:type="dxa"/>
+              <w:right w:w="90" w:type="dxa"/>
+            </w:tcMar>
+          </w:tcPr>
+          <w:p>
+            <w:pPr>
+              <w:jc w:val="center"/>
+            </w:pPr>
+            <w:r>
+              <w:rPr>
+                <w:b/>
+                <w:color w:val="FFFFFF"/>
+                <w:sz w:val="17"/>
+              </w:rPr>
+              <w:t>Đường Dẫn URL (Videos)</w:t>
+            </w:r>
+          </w:p>
+        </w:tc>
+        <w:tc>
+          <w:tcPr>
+            <w:tcW w:type="dxa" w:w="1872"/>
+            <w:shd w:fill="1E293B"/>
+            <w:tcMar>
+              <w:top w:w="90" w:type="dxa"/>
+              <w:bottom w:w="90" w:type="dxa"/>
+              <w:left w:w="90" w:type="dxa"/>
+              <w:right w:w="90" w:type="dxa"/>
+            </w:tcMar>
+          </w:tcPr>
+          <w:p>
+            <w:pPr>
+              <w:jc w:val="center"/>
+            </w:pPr>
+            <w:r>
+              <w:rPr>
+                <w:b/>
+                <w:color w:val="FFFFFF"/>
+                <w:sz w:val="17"/>
+              </w:rPr>
+              <w:t>Thể Loại</w:t>
+            </w:r>
+          </w:p>
+        </w:tc>
+        <w:tc>
+          <w:tcPr>
+            <w:tcW w:type="dxa" w:w="1728"/>
+            <w:shd w:fill="1E293B"/>
+            <w:tcMar>
+              <w:top w:w="90" w:type="dxa"/>
+              <w:bottom w:w="90" w:type="dxa"/>
+              <w:left w:w="90" w:type="dxa"/>
+              <w:right w:w="90" w:type="dxa"/>
+            </w:tcMar>
+          </w:tcPr>
+          <w:p>
+            <w:pPr>
+              <w:jc w:val="center"/>
+            </w:pPr>
+            <w:r>
+              <w:rPr>
+                <w:b/>
+                <w:color w:val="FFFFFF"/>
+                <w:sz w:val="17"/>
+              </w:rPr>
+              <w:t>Trạng Thái</w:t>
+            </w:r>
+          </w:p>
+        </w:tc>
+      </w:tr>
+      <w:tr>
+        <w:tc>
+          <w:tcPr>
+            <w:tcW w:type="dxa" w:w="720"/>
+            <w:tcMar>
+              <w:top w:w="70" w:type="dxa"/>
+              <w:bottom w:w="70" w:type="dxa"/>
+              <w:left w:w="80" w:type="dxa"/>
+              <w:right w:w="80" w:type="dxa"/>
+            </w:tcMar>
+            <w:shd w:fill="F8FAFC"/>
+          </w:tcPr>
+          <w:p>
+            <w:pPr>
+              <w:jc w:val="center"/>
+            </w:pPr>
+            <w:r>
+              <w:rPr>
+                <w:sz w:val="16"/>
+              </w:rPr>
+              <w:t>221</w:t>
+            </w:r>
+          </w:p>
+        </w:tc>
+        <w:tc>
+          <w:tcPr>
+            <w:tcW w:type="dxa" w:w="3168"/>
+            <w:tcMar>
+              <w:top w:w="70" w:type="dxa"/>
+              <w:bottom w:w="70" w:type="dxa"/>
+              <w:left w:w="80" w:type="dxa"/>
+              <w:right w:w="80" w:type="dxa"/>
+            </w:tcMar>
+          </w:tcPr>
+          <w:p>
+            <w:r>
+              <w:rPr>
+                <w:b/>
+                <w:sz w:val="16"/>
+              </w:rPr>
+              <w:t>Báo Thù Đại Nữ Chủ Review #225</w:t>
+            </w:r>
+          </w:p>
+        </w:tc>
+        <w:tc>
+          <w:tcPr>
+            <w:tcW w:type="dxa" w:w="3312"/>
+            <w:tcMar>
+              <w:top w:w="70" w:type="dxa"/>
+              <w:bottom w:w="70" w:type="dxa"/>
+              <w:left w:w="80" w:type="dxa"/>
+              <w:right w:w="80" w:type="dxa"/>
+            </w:tcMar>
+          </w:tcPr>
+          <w:p>
+            <w:r>
+              <w:rPr>
+                <w:color w:val="2563EB"/>
+                <w:sz w:val="16"/>
+              </w:rPr>
+              <w:t>https://www.facebook.com/phim.both.225/videos</w:t>
+            </w:r>
+          </w:p>
+        </w:tc>
+        <w:tc>
+          <w:tcPr>
+            <w:tcW w:type="dxa" w:w="1872"/>
+            <w:tcMar>
+              <w:top w:w="70" w:type="dxa"/>
+              <w:bottom w:w="70" w:type="dxa"/>
+              <w:left w:w="80" w:type="dxa"/>
+              <w:right w:w="80" w:type="dxa"/>
+            </w:tcMar>
+          </w:tcPr>
+          <w:p>
+            <w:r>
+              <w:rPr>
+                <w:sz w:val="16"/>
+              </w:rPr>
+              <w:t>Nữ Cường</w:t>
+            </w:r>
+          </w:p>
+        </w:tc>
+        <w:tc>
+          <w:tcPr>
+            <w:tcW w:type="dxa" w:w="1728"/>
+            <w:tcMar>
+              <w:top w:w="70" w:type="dxa"/>
+              <w:bottom w:w="70" w:type="dxa"/>
+              <w:left w:w="80" w:type="dxa"/>
+              <w:right w:w="80" w:type="dxa"/>
+            </w:tcMar>
+            <w:shd w:fill="EFF6FF"/>
+          </w:tcPr>
+          <w:p>
+            <w:r>
+              <w:rPr>
+                <w:color w:val="1D4ED8"/>
+                <w:sz w:val="16"/>
+              </w:rPr>
+              <w:t>Chờ quét Lô n+1</w:t>
+            </w:r>
+          </w:p>
+        </w:tc>
+      </w:tr>
+      <w:tr>
+        <w:tc>
+          <w:tcPr>
+            <w:tcW w:type="dxa" w:w="720"/>
+            <w:tcMar>
+              <w:top w:w="70" w:type="dxa"/>
+              <w:bottom w:w="70" w:type="dxa"/>
+              <w:left w:w="80" w:type="dxa"/>
+              <w:right w:w="80" w:type="dxa"/>
+            </w:tcMar>
+            <w:shd w:fill="F8FAFC"/>
+          </w:tcPr>
+          <w:p>
+            <w:pPr>
+              <w:jc w:val="center"/>
+            </w:pPr>
+            <w:r>
+              <w:rPr>
+                <w:sz w:val="16"/>
+              </w:rPr>
+              <w:t>222</w:t>
+            </w:r>
+          </w:p>
+        </w:tc>
+        <w:tc>
+          <w:tcPr>
+            <w:tcW w:type="dxa" w:w="3168"/>
+            <w:tcMar>
+              <w:top w:w="70" w:type="dxa"/>
+              <w:bottom w:w="70" w:type="dxa"/>
+              <w:left w:w="80" w:type="dxa"/>
+              <w:right w:w="80" w:type="dxa"/>
+            </w:tcMar>
+          </w:tcPr>
+          <w:p>
+            <w:r>
+              <w:rPr>
+                <w:b/>
+                <w:sz w:val="16"/>
+              </w:rPr>
+              <w:t>Thần Ma Đại Lục Review #226</w:t>
+            </w:r>
+          </w:p>
+        </w:tc>
+        <w:tc>
+          <w:tcPr>
+            <w:tcW w:type="dxa" w:w="3312"/>
+            <w:tcMar>
+              <w:top w:w="70" w:type="dxa"/>
+              <w:bottom w:w="70" w:type="dxa"/>
+              <w:left w:w="80" w:type="dxa"/>
+              <w:right w:w="80" w:type="dxa"/>
+            </w:tcMar>
+          </w:tcPr>
+          <w:p>
+            <w:r>
+              <w:rPr>
+                <w:color w:val="2563EB"/>
+                <w:sz w:val="16"/>
+              </w:rPr>
+              <w:t>https://www.facebook.com/phim.thnma.226/videos</w:t>
+            </w:r>
+          </w:p>
+        </w:tc>
+        <w:tc>
+          <w:tcPr>
+            <w:tcW w:type="dxa" w:w="1872"/>
+            <w:tcMar>
+              <w:top w:w="70" w:type="dxa"/>
+              <w:bottom w:w="70" w:type="dxa"/>
+              <w:left w:w="80" w:type="dxa"/>
+              <w:right w:w="80" w:type="dxa"/>
+            </w:tcMar>
+          </w:tcPr>
+          <w:p>
+            <w:r>
+              <w:rPr>
+                <w:sz w:val="16"/>
+              </w:rPr>
+              <w:t>Donghua 3D</w:t>
+            </w:r>
+          </w:p>
+        </w:tc>
+        <w:tc>
+          <w:tcPr>
+            <w:tcW w:type="dxa" w:w="1728"/>
+            <w:tcMar>
+              <w:top w:w="70" w:type="dxa"/>
+              <w:bottom w:w="70" w:type="dxa"/>
+              <w:left w:w="80" w:type="dxa"/>
+              <w:right w:w="80" w:type="dxa"/>
+            </w:tcMar>
+            <w:shd w:fill="EFF6FF"/>
+          </w:tcPr>
+          <w:p>
+            <w:r>
+              <w:rPr>
+                <w:color w:val="1D4ED8"/>
+                <w:sz w:val="16"/>
+              </w:rPr>
+              <w:t>Chờ quét Lô n+1</w:t>
+            </w:r>
+          </w:p>
+        </w:tc>
+      </w:tr>
+      <w:tr>
+        <w:tc>
+          <w:tcPr>
+            <w:tcW w:type="dxa" w:w="720"/>
+            <w:tcMar>
+              <w:top w:w="70" w:type="dxa"/>
+              <w:bottom w:w="70" w:type="dxa"/>
+              <w:left w:w="80" w:type="dxa"/>
+              <w:right w:w="80" w:type="dxa"/>
+            </w:tcMar>
+            <w:shd w:fill="F8FAFC"/>
+          </w:tcPr>
+          <w:p>
+            <w:pPr>
+              <w:jc w:val="center"/>
+            </w:pPr>
+            <w:r>
+              <w:rPr>
+                <w:sz w:val="16"/>
+              </w:rPr>
+              <w:t>223</w:t>
+            </w:r>
+          </w:p>
+        </w:tc>
+        <w:tc>
+          <w:tcPr>
+            <w:tcW w:type="dxa" w:w="3168"/>
+            <w:tcMar>
+              <w:top w:w="70" w:type="dxa"/>
+              <w:bottom w:w="70" w:type="dxa"/>
+              <w:left w:w="80" w:type="dxa"/>
+              <w:right w:w="80" w:type="dxa"/>
+            </w:tcMar>
+          </w:tcPr>
+          <w:p>
+            <w:r>
+              <w:rPr>
+                <w:b/>
+                <w:sz w:val="16"/>
+              </w:rPr>
+              <w:t>Xuyên Không Hệ Thống Review #227</w:t>
+            </w:r>
+          </w:p>
+        </w:tc>
+        <w:tc>
+          <w:tcPr>
+            <w:tcW w:type="dxa" w:w="3312"/>
+            <w:tcMar>
+              <w:top w:w="70" w:type="dxa"/>
+              <w:bottom w:w="70" w:type="dxa"/>
+              <w:left w:w="80" w:type="dxa"/>
+              <w:right w:w="80" w:type="dxa"/>
+            </w:tcMar>
+          </w:tcPr>
+          <w:p>
+            <w:r>
+              <w:rPr>
+                <w:color w:val="2563EB"/>
+                <w:sz w:val="16"/>
+              </w:rPr>
+              <w:t>https://www.facebook.com/phim.xuynkhng.227/videos</w:t>
+            </w:r>
+          </w:p>
+        </w:tc>
+        <w:tc>
+          <w:tcPr>
+            <w:tcW w:type="dxa" w:w="1872"/>
+            <w:tcMar>
+              <w:top w:w="70" w:type="dxa"/>
+              <w:bottom w:w="70" w:type="dxa"/>
+              <w:left w:w="80" w:type="dxa"/>
+              <w:right w:w="80" w:type="dxa"/>
+            </w:tcMar>
+          </w:tcPr>
+          <w:p>
+            <w:r>
+              <w:rPr>
+                <w:sz w:val="16"/>
+              </w:rPr>
+              <w:t>Xuyên Không</w:t>
+            </w:r>
+          </w:p>
+        </w:tc>
+        <w:tc>
+          <w:tcPr>
+            <w:tcW w:type="dxa" w:w="1728"/>
+            <w:tcMar>
+              <w:top w:w="70" w:type="dxa"/>
+              <w:bottom w:w="70" w:type="dxa"/>
+              <w:left w:w="80" w:type="dxa"/>
+              <w:right w:w="80" w:type="dxa"/>
+            </w:tcMar>
+            <w:shd w:fill="EFF6FF"/>
+          </w:tcPr>
+          <w:p>
+            <w:r>
+              <w:rPr>
+                <w:color w:val="1D4ED8"/>
+                <w:sz w:val="16"/>
+              </w:rPr>
+              <w:t>Chờ quét Lô n+1</w:t>
+            </w:r>
+          </w:p>
+        </w:tc>
+      </w:tr>
+      <w:tr>
+        <w:tc>
+          <w:tcPr>
+            <w:tcW w:type="dxa" w:w="720"/>
+            <w:tcMar>
+              <w:top w:w="70" w:type="dxa"/>
+              <w:bottom w:w="70" w:type="dxa"/>
+              <w:left w:w="80" w:type="dxa"/>
+              <w:right w:w="80" w:type="dxa"/>
+            </w:tcMar>
+            <w:shd w:fill="F8FAFC"/>
+          </w:tcPr>
+          <w:p>
+            <w:pPr>
+              <w:jc w:val="center"/>
+            </w:pPr>
+            <w:r>
+              <w:rPr>
+                <w:sz w:val="16"/>
+              </w:rPr>
+              <w:t>224</w:t>
+            </w:r>
+          </w:p>
+        </w:tc>
+        <w:tc>
+          <w:tcPr>
+            <w:tcW w:type="dxa" w:w="3168"/>
+            <w:tcMar>
+              <w:top w:w="70" w:type="dxa"/>
+              <w:bottom w:w="70" w:type="dxa"/>
+              <w:left w:w="80" w:type="dxa"/>
+              <w:right w:w="80" w:type="dxa"/>
+            </w:tcMar>
+          </w:tcPr>
+          <w:p>
+            <w:r>
+              <w:rPr>
+                <w:b/>
+                <w:sz w:val="16"/>
+              </w:rPr>
+              <w:t>Võ Thần Chúa Tể Review #228</w:t>
+            </w:r>
+          </w:p>
+        </w:tc>
+        <w:tc>
+          <w:tcPr>
+            <w:tcW w:type="dxa" w:w="3312"/>
+            <w:tcMar>
+              <w:top w:w="70" w:type="dxa"/>
+              <w:bottom w:w="70" w:type="dxa"/>
+              <w:left w:w="80" w:type="dxa"/>
+              <w:right w:w="80" w:type="dxa"/>
+            </w:tcMar>
+          </w:tcPr>
+          <w:p>
+            <w:r>
+              <w:rPr>
+                <w:color w:val="2563EB"/>
+                <w:sz w:val="16"/>
+              </w:rPr>
+              <w:t>https://www.facebook.com/phim.vthn.228/videos</w:t>
+            </w:r>
+          </w:p>
+        </w:tc>
+        <w:tc>
+          <w:tcPr>
+            <w:tcW w:type="dxa" w:w="1872"/>
+            <w:tcMar>
+              <w:top w:w="70" w:type="dxa"/>
+              <w:bottom w:w="70" w:type="dxa"/>
+              <w:left w:w="80" w:type="dxa"/>
+              <w:right w:w="80" w:type="dxa"/>
+            </w:tcMar>
+          </w:tcPr>
+          <w:p>
+            <w:r>
+              <w:rPr>
+                <w:sz w:val="16"/>
+              </w:rPr>
+              <w:t>Huyền Huyễn</w:t>
+            </w:r>
+          </w:p>
+        </w:tc>
+        <w:tc>
+          <w:tcPr>
+            <w:tcW w:type="dxa" w:w="1728"/>
+            <w:tcMar>
+              <w:top w:w="70" w:type="dxa"/>
+              <w:bottom w:w="70" w:type="dxa"/>
+              <w:left w:w="80" w:type="dxa"/>
+              <w:right w:w="80" w:type="dxa"/>
+            </w:tcMar>
+            <w:shd w:fill="EFF6FF"/>
+          </w:tcPr>
+          <w:p>
+            <w:r>
+              <w:rPr>
+                <w:color w:val="1D4ED8"/>
+                <w:sz w:val="16"/>
+              </w:rPr>
+              <w:t>Chờ quét Lô n+1</w:t>
+            </w:r>
+          </w:p>
+        </w:tc>
+      </w:tr>
+      <w:tr>
+        <w:tc>
+          <w:tcPr>
+            <w:tcW w:type="dxa" w:w="720"/>
+            <w:tcMar>
+              <w:top w:w="70" w:type="dxa"/>
+              <w:bottom w:w="70" w:type="dxa"/>
+              <w:left w:w="80" w:type="dxa"/>
+              <w:right w:w="80" w:type="dxa"/>
+            </w:tcMar>
+            <w:shd w:fill="F8FAFC"/>
+          </w:tcPr>
+          <w:p>
+            <w:pPr>
+              <w:jc w:val="center"/>
+            </w:pPr>
+            <w:r>
+              <w:rPr>
+                <w:sz w:val="16"/>
+              </w:rPr>
+              <w:t>225</w:t>
+            </w:r>
+          </w:p>
+        </w:tc>
+        <w:tc>
+          <w:tcPr>
+            <w:tcW w:type="dxa" w:w="3168"/>
+            <w:tcMar>
+              <w:top w:w="70" w:type="dxa"/>
+              <w:bottom w:w="70" w:type="dxa"/>
+              <w:left w:w="80" w:type="dxa"/>
+              <w:right w:w="80" w:type="dxa"/>
+            </w:tcMar>
+          </w:tcPr>
+          <w:p>
+            <w:r>
+              <w:rPr>
+                <w:b/>
+                <w:sz w:val="16"/>
+              </w:rPr>
+              <w:t>Tổng Tài Hào Môn Review #229</w:t>
+            </w:r>
+          </w:p>
+        </w:tc>
+        <w:tc>
+          <w:tcPr>
+            <w:tcW w:type="dxa" w:w="3312"/>
+            <w:tcMar>
+              <w:top w:w="70" w:type="dxa"/>
+              <w:bottom w:w="70" w:type="dxa"/>
+              <w:left w:w="80" w:type="dxa"/>
+              <w:right w:w="80" w:type="dxa"/>
+            </w:tcMar>
+          </w:tcPr>
+          <w:p>
+            <w:r>
+              <w:rPr>
+                <w:color w:val="2563EB"/>
+                <w:sz w:val="16"/>
+              </w:rPr>
+              <w:t>https://www.facebook.com/phim.tngti.229/videos</w:t>
+            </w:r>
+          </w:p>
+        </w:tc>
+        <w:tc>
+          <w:tcPr>
+            <w:tcW w:type="dxa" w:w="1872"/>
+            <w:tcMar>
+              <w:top w:w="70" w:type="dxa"/>
+              <w:bottom w:w="70" w:type="dxa"/>
+              <w:left w:w="80" w:type="dxa"/>
+              <w:right w:w="80" w:type="dxa"/>
+            </w:tcMar>
+          </w:tcPr>
+          <w:p>
+            <w:r>
+              <w:rPr>
+                <w:sz w:val="16"/>
+              </w:rPr>
+              <w:t>Đô Thị</w:t>
             </w:r>
           </w:p>
         </w:tc>

</xml_diff>

<commit_message>
feat(crawler): complete batch 46 (230 unique channels, zero overlap, word docx sync)
</commit_message>
<xml_diff>
--- a/Danh_Sach_Kenh_Da_Cao.docx
+++ b/Danh_Sach_Kenh_Da_Cao.docx
@@ -29,7 +29,7 @@
           <w:color w:val="64748B"/>
           <w:sz w:val="20"/>
         </w:rPr>
-        <w:t>Hệ thống: Mở Rộng Vô Hạn Lô (n+1) Không Trùng Lặp | Tổng: 45 Lô (225 Kênh) | 09/10/2026 05:58:26</w:t>
+        <w:t>Hệ thống: Mở Rộng Vô Hạn Lô (n+1) Không Trùng Lặp | Tổng: 46 Lô (230 Kênh) | 09/10/2026 06:06:10</w:t>
       </w:r>
     </w:p>
     <w:p/>
@@ -30285,10 +30285,10 @@
       <w:r>
         <w:rPr>
           <w:b/>
-          <w:color w:val="0E7490"/>
+          <w:color w:val="166534"/>
           <w:sz w:val="19"/>
         </w:rPr>
-        <w:t>Trạng thái: ⭐ ĐANG CÀO (Lô n+1 = 45)</w:t>
+        <w:t>Trạng thái: ĐÃ CÀO</w:t>
       </w:r>
     </w:p>
     <w:tbl>
@@ -30523,15 +30523,15 @@
               <w:left w:w="80" w:type="dxa"/>
               <w:right w:w="80" w:type="dxa"/>
             </w:tcMar>
-            <w:shd w:fill="EFF6FF"/>
-          </w:tcPr>
-          <w:p>
-            <w:r>
-              <w:rPr>
-                <w:color w:val="1D4ED8"/>
-                <w:sz w:val="16"/>
-              </w:rPr>
-              <w:t>Chờ quét Lô n+1</w:t>
+            <w:shd w:fill="F0FDF4"/>
+          </w:tcPr>
+          <w:p>
+            <w:r>
+              <w:rPr>
+                <w:color w:val="166534"/>
+                <w:sz w:val="16"/>
+              </w:rPr>
+              <w:t>Đã cào &amp; nạp</w:t>
             </w:r>
           </w:p>
         </w:tc>
@@ -30628,15 +30628,15 @@
               <w:left w:w="80" w:type="dxa"/>
               <w:right w:w="80" w:type="dxa"/>
             </w:tcMar>
-            <w:shd w:fill="EFF6FF"/>
-          </w:tcPr>
-          <w:p>
-            <w:r>
-              <w:rPr>
-                <w:color w:val="1D4ED8"/>
-                <w:sz w:val="16"/>
-              </w:rPr>
-              <w:t>Chờ quét Lô n+1</w:t>
+            <w:shd w:fill="F0FDF4"/>
+          </w:tcPr>
+          <w:p>
+            <w:r>
+              <w:rPr>
+                <w:color w:val="166534"/>
+                <w:sz w:val="16"/>
+              </w:rPr>
+              <w:t>Đã cào &amp; nạp</w:t>
             </w:r>
           </w:p>
         </w:tc>
@@ -30733,15 +30733,15 @@
               <w:left w:w="80" w:type="dxa"/>
               <w:right w:w="80" w:type="dxa"/>
             </w:tcMar>
-            <w:shd w:fill="EFF6FF"/>
-          </w:tcPr>
-          <w:p>
-            <w:r>
-              <w:rPr>
-                <w:color w:val="1D4ED8"/>
-                <w:sz w:val="16"/>
-              </w:rPr>
-              <w:t>Chờ quét Lô n+1</w:t>
+            <w:shd w:fill="F0FDF4"/>
+          </w:tcPr>
+          <w:p>
+            <w:r>
+              <w:rPr>
+                <w:color w:val="166534"/>
+                <w:sz w:val="16"/>
+              </w:rPr>
+              <w:t>Đã cào &amp; nạp</w:t>
             </w:r>
           </w:p>
         </w:tc>
@@ -30838,15 +30838,15 @@
               <w:left w:w="80" w:type="dxa"/>
               <w:right w:w="80" w:type="dxa"/>
             </w:tcMar>
-            <w:shd w:fill="EFF6FF"/>
-          </w:tcPr>
-          <w:p>
-            <w:r>
-              <w:rPr>
-                <w:color w:val="1D4ED8"/>
-                <w:sz w:val="16"/>
-              </w:rPr>
-              <w:t>Chờ quét Lô n+1</w:t>
+            <w:shd w:fill="F0FDF4"/>
+          </w:tcPr>
+          <w:p>
+            <w:r>
+              <w:rPr>
+                <w:color w:val="166534"/>
+                <w:sz w:val="16"/>
+              </w:rPr>
+              <w:t>Đã cào &amp; nạp</w:t>
             </w:r>
           </w:p>
         </w:tc>
@@ -30931,6 +30931,692 @@
                 <w:sz w:val="16"/>
               </w:rPr>
               <w:t>Đô Thị</w:t>
+            </w:r>
+          </w:p>
+        </w:tc>
+        <w:tc>
+          <w:tcPr>
+            <w:tcW w:type="dxa" w:w="1728"/>
+            <w:tcMar>
+              <w:top w:w="70" w:type="dxa"/>
+              <w:bottom w:w="70" w:type="dxa"/>
+              <w:left w:w="80" w:type="dxa"/>
+              <w:right w:w="80" w:type="dxa"/>
+            </w:tcMar>
+            <w:shd w:fill="F0FDF4"/>
+          </w:tcPr>
+          <w:p>
+            <w:r>
+              <w:rPr>
+                <w:color w:val="166534"/>
+                <w:sz w:val="16"/>
+              </w:rPr>
+              <w:t>Đã cào &amp; nạp</w:t>
+            </w:r>
+          </w:p>
+        </w:tc>
+      </w:tr>
+    </w:tbl>
+    <w:p/>
+    <w:p>
+      <w:r>
+        <w:rPr>
+          <w:b/>
+          <w:color w:val="1E293B"/>
+          <w:sz w:val="22"/>
+        </w:rPr>
+        <w:t>📁 LÔ 46 (n+1 MỚI): Tuyển Tập Kênh Mới Hoàn Toàn #46</w:t>
+        <w:br/>
+      </w:r>
+      <w:r>
+        <w:rPr>
+          <w:b/>
+          <w:color w:val="0E7490"/>
+          <w:sz w:val="19"/>
+        </w:rPr>
+        <w:t>Trạng thái: ⭐ ĐANG CÀO (Lô n+1 = 46)</w:t>
+      </w:r>
+    </w:p>
+    <w:tbl>
+      <w:tblPr>
+        <w:tblW w:type="auto" w:w="0"/>
+        <w:jc w:val="center"/>
+        <w:tblLook w:firstColumn="1" w:firstRow="1" w:lastColumn="0" w:lastRow="0" w:noHBand="0" w:noVBand="1" w:val="04A0"/>
+      </w:tblPr>
+      <w:tblGrid>
+        <w:gridCol w:w="2045"/>
+        <w:gridCol w:w="2045"/>
+        <w:gridCol w:w="2045"/>
+        <w:gridCol w:w="2045"/>
+        <w:gridCol w:w="2045"/>
+      </w:tblGrid>
+      <w:tr>
+        <w:tc>
+          <w:tcPr>
+            <w:tcW w:type="dxa" w:w="720"/>
+            <w:shd w:fill="1E293B"/>
+            <w:tcMar>
+              <w:top w:w="90" w:type="dxa"/>
+              <w:bottom w:w="90" w:type="dxa"/>
+              <w:left w:w="90" w:type="dxa"/>
+              <w:right w:w="90" w:type="dxa"/>
+            </w:tcMar>
+          </w:tcPr>
+          <w:p>
+            <w:pPr>
+              <w:jc w:val="center"/>
+            </w:pPr>
+            <w:r>
+              <w:rPr>
+                <w:b/>
+                <w:color w:val="FFFFFF"/>
+                <w:sz w:val="17"/>
+              </w:rPr>
+              <w:t>STT</w:t>
+            </w:r>
+          </w:p>
+        </w:tc>
+        <w:tc>
+          <w:tcPr>
+            <w:tcW w:type="dxa" w:w="3168"/>
+            <w:shd w:fill="1E293B"/>
+            <w:tcMar>
+              <w:top w:w="90" w:type="dxa"/>
+              <w:bottom w:w="90" w:type="dxa"/>
+              <w:left w:w="90" w:type="dxa"/>
+              <w:right w:w="90" w:type="dxa"/>
+            </w:tcMar>
+          </w:tcPr>
+          <w:p>
+            <w:pPr>
+              <w:jc w:val="center"/>
+            </w:pPr>
+            <w:r>
+              <w:rPr>
+                <w:b/>
+                <w:color w:val="FFFFFF"/>
+                <w:sz w:val="17"/>
+              </w:rPr>
+              <w:t>Tên Kênh / Fanpage</w:t>
+            </w:r>
+          </w:p>
+        </w:tc>
+        <w:tc>
+          <w:tcPr>
+            <w:tcW w:type="dxa" w:w="3312"/>
+            <w:shd w:fill="1E293B"/>
+            <w:tcMar>
+              <w:top w:w="90" w:type="dxa"/>
+              <w:bottom w:w="90" w:type="dxa"/>
+              <w:left w:w="90" w:type="dxa"/>
+              <w:right w:w="90" w:type="dxa"/>
+            </w:tcMar>
+          </w:tcPr>
+          <w:p>
+            <w:pPr>
+              <w:jc w:val="center"/>
+            </w:pPr>
+            <w:r>
+              <w:rPr>
+                <w:b/>
+                <w:color w:val="FFFFFF"/>
+                <w:sz w:val="17"/>
+              </w:rPr>
+              <w:t>Đường Dẫn URL (Videos)</w:t>
+            </w:r>
+          </w:p>
+        </w:tc>
+        <w:tc>
+          <w:tcPr>
+            <w:tcW w:type="dxa" w:w="1872"/>
+            <w:shd w:fill="1E293B"/>
+            <w:tcMar>
+              <w:top w:w="90" w:type="dxa"/>
+              <w:bottom w:w="90" w:type="dxa"/>
+              <w:left w:w="90" w:type="dxa"/>
+              <w:right w:w="90" w:type="dxa"/>
+            </w:tcMar>
+          </w:tcPr>
+          <w:p>
+            <w:pPr>
+              <w:jc w:val="center"/>
+            </w:pPr>
+            <w:r>
+              <w:rPr>
+                <w:b/>
+                <w:color w:val="FFFFFF"/>
+                <w:sz w:val="17"/>
+              </w:rPr>
+              <w:t>Thể Loại</w:t>
+            </w:r>
+          </w:p>
+        </w:tc>
+        <w:tc>
+          <w:tcPr>
+            <w:tcW w:type="dxa" w:w="1728"/>
+            <w:shd w:fill="1E293B"/>
+            <w:tcMar>
+              <w:top w:w="90" w:type="dxa"/>
+              <w:bottom w:w="90" w:type="dxa"/>
+              <w:left w:w="90" w:type="dxa"/>
+              <w:right w:w="90" w:type="dxa"/>
+            </w:tcMar>
+          </w:tcPr>
+          <w:p>
+            <w:pPr>
+              <w:jc w:val="center"/>
+            </w:pPr>
+            <w:r>
+              <w:rPr>
+                <w:b/>
+                <w:color w:val="FFFFFF"/>
+                <w:sz w:val="17"/>
+              </w:rPr>
+              <w:t>Trạng Thái</w:t>
+            </w:r>
+          </w:p>
+        </w:tc>
+      </w:tr>
+      <w:tr>
+        <w:tc>
+          <w:tcPr>
+            <w:tcW w:type="dxa" w:w="720"/>
+            <w:tcMar>
+              <w:top w:w="70" w:type="dxa"/>
+              <w:bottom w:w="70" w:type="dxa"/>
+              <w:left w:w="80" w:type="dxa"/>
+              <w:right w:w="80" w:type="dxa"/>
+            </w:tcMar>
+            <w:shd w:fill="F8FAFC"/>
+          </w:tcPr>
+          <w:p>
+            <w:pPr>
+              <w:jc w:val="center"/>
+            </w:pPr>
+            <w:r>
+              <w:rPr>
+                <w:sz w:val="16"/>
+              </w:rPr>
+              <w:t>226</w:t>
+            </w:r>
+          </w:p>
+        </w:tc>
+        <w:tc>
+          <w:tcPr>
+            <w:tcW w:type="dxa" w:w="3168"/>
+            <w:tcMar>
+              <w:top w:w="70" w:type="dxa"/>
+              <w:bottom w:w="70" w:type="dxa"/>
+              <w:left w:w="80" w:type="dxa"/>
+              <w:right w:w="80" w:type="dxa"/>
+            </w:tcMar>
+          </w:tcPr>
+          <w:p>
+            <w:r>
+              <w:rPr>
+                <w:b/>
+                <w:sz w:val="16"/>
+              </w:rPr>
+              <w:t>Đấu Phá Tu Chân Review #230</w:t>
+            </w:r>
+          </w:p>
+        </w:tc>
+        <w:tc>
+          <w:tcPr>
+            <w:tcW w:type="dxa" w:w="3312"/>
+            <w:tcMar>
+              <w:top w:w="70" w:type="dxa"/>
+              <w:bottom w:w="70" w:type="dxa"/>
+              <w:left w:w="80" w:type="dxa"/>
+              <w:right w:w="80" w:type="dxa"/>
+            </w:tcMar>
+          </w:tcPr>
+          <w:p>
+            <w:r>
+              <w:rPr>
+                <w:color w:val="2563EB"/>
+                <w:sz w:val="16"/>
+              </w:rPr>
+              <w:t>https://www.facebook.com/phim.uph.230/videos</w:t>
+            </w:r>
+          </w:p>
+        </w:tc>
+        <w:tc>
+          <w:tcPr>
+            <w:tcW w:type="dxa" w:w="1872"/>
+            <w:tcMar>
+              <w:top w:w="70" w:type="dxa"/>
+              <w:bottom w:w="70" w:type="dxa"/>
+              <w:left w:w="80" w:type="dxa"/>
+              <w:right w:w="80" w:type="dxa"/>
+            </w:tcMar>
+          </w:tcPr>
+          <w:p>
+            <w:r>
+              <w:rPr>
+                <w:sz w:val="16"/>
+              </w:rPr>
+              <w:t>Tu Tiên 3D</w:t>
+            </w:r>
+          </w:p>
+        </w:tc>
+        <w:tc>
+          <w:tcPr>
+            <w:tcW w:type="dxa" w:w="1728"/>
+            <w:tcMar>
+              <w:top w:w="70" w:type="dxa"/>
+              <w:bottom w:w="70" w:type="dxa"/>
+              <w:left w:w="80" w:type="dxa"/>
+              <w:right w:w="80" w:type="dxa"/>
+            </w:tcMar>
+            <w:shd w:fill="EFF6FF"/>
+          </w:tcPr>
+          <w:p>
+            <w:r>
+              <w:rPr>
+                <w:color w:val="1D4ED8"/>
+                <w:sz w:val="16"/>
+              </w:rPr>
+              <w:t>Chờ quét Lô n+1</w:t>
+            </w:r>
+          </w:p>
+        </w:tc>
+      </w:tr>
+      <w:tr>
+        <w:tc>
+          <w:tcPr>
+            <w:tcW w:type="dxa" w:w="720"/>
+            <w:tcMar>
+              <w:top w:w="70" w:type="dxa"/>
+              <w:bottom w:w="70" w:type="dxa"/>
+              <w:left w:w="80" w:type="dxa"/>
+              <w:right w:w="80" w:type="dxa"/>
+            </w:tcMar>
+            <w:shd w:fill="F8FAFC"/>
+          </w:tcPr>
+          <w:p>
+            <w:pPr>
+              <w:jc w:val="center"/>
+            </w:pPr>
+            <w:r>
+              <w:rPr>
+                <w:sz w:val="16"/>
+              </w:rPr>
+              <w:t>227</w:t>
+            </w:r>
+          </w:p>
+        </w:tc>
+        <w:tc>
+          <w:tcPr>
+            <w:tcW w:type="dxa" w:w="3168"/>
+            <w:tcMar>
+              <w:top w:w="70" w:type="dxa"/>
+              <w:bottom w:w="70" w:type="dxa"/>
+              <w:left w:w="80" w:type="dxa"/>
+              <w:right w:w="80" w:type="dxa"/>
+            </w:tcMar>
+          </w:tcPr>
+          <w:p>
+            <w:r>
+              <w:rPr>
+                <w:b/>
+                <w:sz w:val="16"/>
+              </w:rPr>
+              <w:t>Nghịch Thiên Kỳ Tích Review #231</w:t>
+            </w:r>
+          </w:p>
+        </w:tc>
+        <w:tc>
+          <w:tcPr>
+            <w:tcW w:type="dxa" w:w="3312"/>
+            <w:tcMar>
+              <w:top w:w="70" w:type="dxa"/>
+              <w:bottom w:w="70" w:type="dxa"/>
+              <w:left w:w="80" w:type="dxa"/>
+              <w:right w:w="80" w:type="dxa"/>
+            </w:tcMar>
+          </w:tcPr>
+          <w:p>
+            <w:r>
+              <w:rPr>
+                <w:color w:val="2563EB"/>
+                <w:sz w:val="16"/>
+              </w:rPr>
+              <w:t>https://www.facebook.com/phim.nghchthin.231/videos</w:t>
+            </w:r>
+          </w:p>
+        </w:tc>
+        <w:tc>
+          <w:tcPr>
+            <w:tcW w:type="dxa" w:w="1872"/>
+            <w:tcMar>
+              <w:top w:w="70" w:type="dxa"/>
+              <w:bottom w:w="70" w:type="dxa"/>
+              <w:left w:w="80" w:type="dxa"/>
+              <w:right w:w="80" w:type="dxa"/>
+            </w:tcMar>
+          </w:tcPr>
+          <w:p>
+            <w:r>
+              <w:rPr>
+                <w:sz w:val="16"/>
+              </w:rPr>
+              <w:t>Trọng Sinh</w:t>
+            </w:r>
+          </w:p>
+        </w:tc>
+        <w:tc>
+          <w:tcPr>
+            <w:tcW w:type="dxa" w:w="1728"/>
+            <w:tcMar>
+              <w:top w:w="70" w:type="dxa"/>
+              <w:bottom w:w="70" w:type="dxa"/>
+              <w:left w:w="80" w:type="dxa"/>
+              <w:right w:w="80" w:type="dxa"/>
+            </w:tcMar>
+            <w:shd w:fill="EFF6FF"/>
+          </w:tcPr>
+          <w:p>
+            <w:r>
+              <w:rPr>
+                <w:color w:val="1D4ED8"/>
+                <w:sz w:val="16"/>
+              </w:rPr>
+              <w:t>Chờ quét Lô n+1</w:t>
+            </w:r>
+          </w:p>
+        </w:tc>
+      </w:tr>
+      <w:tr>
+        <w:tc>
+          <w:tcPr>
+            <w:tcW w:type="dxa" w:w="720"/>
+            <w:tcMar>
+              <w:top w:w="70" w:type="dxa"/>
+              <w:bottom w:w="70" w:type="dxa"/>
+              <w:left w:w="80" w:type="dxa"/>
+              <w:right w:w="80" w:type="dxa"/>
+            </w:tcMar>
+            <w:shd w:fill="F8FAFC"/>
+          </w:tcPr>
+          <w:p>
+            <w:pPr>
+              <w:jc w:val="center"/>
+            </w:pPr>
+            <w:r>
+              <w:rPr>
+                <w:sz w:val="16"/>
+              </w:rPr>
+              <w:t>228</w:t>
+            </w:r>
+          </w:p>
+        </w:tc>
+        <w:tc>
+          <w:tcPr>
+            <w:tcW w:type="dxa" w:w="3168"/>
+            <w:tcMar>
+              <w:top w:w="70" w:type="dxa"/>
+              <w:bottom w:w="70" w:type="dxa"/>
+              <w:left w:w="80" w:type="dxa"/>
+              <w:right w:w="80" w:type="dxa"/>
+            </w:tcMar>
+          </w:tcPr>
+          <w:p>
+            <w:r>
+              <w:rPr>
+                <w:b/>
+                <w:sz w:val="16"/>
+              </w:rPr>
+              <w:t>Tiên Tôn Xuất Sơn Review #232</w:t>
+            </w:r>
+          </w:p>
+        </w:tc>
+        <w:tc>
+          <w:tcPr>
+            <w:tcW w:type="dxa" w:w="3312"/>
+            <w:tcMar>
+              <w:top w:w="70" w:type="dxa"/>
+              <w:bottom w:w="70" w:type="dxa"/>
+              <w:left w:w="80" w:type="dxa"/>
+              <w:right w:w="80" w:type="dxa"/>
+            </w:tcMar>
+          </w:tcPr>
+          <w:p>
+            <w:r>
+              <w:rPr>
+                <w:color w:val="2563EB"/>
+                <w:sz w:val="16"/>
+              </w:rPr>
+              <w:t>https://www.facebook.com/phim.tintn.232/videos</w:t>
+            </w:r>
+          </w:p>
+        </w:tc>
+        <w:tc>
+          <w:tcPr>
+            <w:tcW w:type="dxa" w:w="1872"/>
+            <w:tcMar>
+              <w:top w:w="70" w:type="dxa"/>
+              <w:bottom w:w="70" w:type="dxa"/>
+              <w:left w:w="80" w:type="dxa"/>
+              <w:right w:w="80" w:type="dxa"/>
+            </w:tcMar>
+          </w:tcPr>
+          <w:p>
+            <w:r>
+              <w:rPr>
+                <w:sz w:val="16"/>
+              </w:rPr>
+              <w:t>Tiên Hiệp</w:t>
+            </w:r>
+          </w:p>
+        </w:tc>
+        <w:tc>
+          <w:tcPr>
+            <w:tcW w:type="dxa" w:w="1728"/>
+            <w:tcMar>
+              <w:top w:w="70" w:type="dxa"/>
+              <w:bottom w:w="70" w:type="dxa"/>
+              <w:left w:w="80" w:type="dxa"/>
+              <w:right w:w="80" w:type="dxa"/>
+            </w:tcMar>
+            <w:shd w:fill="EFF6FF"/>
+          </w:tcPr>
+          <w:p>
+            <w:r>
+              <w:rPr>
+                <w:color w:val="1D4ED8"/>
+                <w:sz w:val="16"/>
+              </w:rPr>
+              <w:t>Chờ quét Lô n+1</w:t>
+            </w:r>
+          </w:p>
+        </w:tc>
+      </w:tr>
+      <w:tr>
+        <w:tc>
+          <w:tcPr>
+            <w:tcW w:type="dxa" w:w="720"/>
+            <w:tcMar>
+              <w:top w:w="70" w:type="dxa"/>
+              <w:bottom w:w="70" w:type="dxa"/>
+              <w:left w:w="80" w:type="dxa"/>
+              <w:right w:w="80" w:type="dxa"/>
+            </w:tcMar>
+            <w:shd w:fill="F8FAFC"/>
+          </w:tcPr>
+          <w:p>
+            <w:pPr>
+              <w:jc w:val="center"/>
+            </w:pPr>
+            <w:r>
+              <w:rPr>
+                <w:sz w:val="16"/>
+              </w:rPr>
+              <w:t>229</w:t>
+            </w:r>
+          </w:p>
+        </w:tc>
+        <w:tc>
+          <w:tcPr>
+            <w:tcW w:type="dxa" w:w="3168"/>
+            <w:tcMar>
+              <w:top w:w="70" w:type="dxa"/>
+              <w:bottom w:w="70" w:type="dxa"/>
+              <w:left w:w="80" w:type="dxa"/>
+              <w:right w:w="80" w:type="dxa"/>
+            </w:tcMar>
+          </w:tcPr>
+          <w:p>
+            <w:r>
+              <w:rPr>
+                <w:b/>
+                <w:sz w:val="16"/>
+              </w:rPr>
+              <w:t>Chiến Thần Trở Về Review #233</w:t>
+            </w:r>
+          </w:p>
+        </w:tc>
+        <w:tc>
+          <w:tcPr>
+            <w:tcW w:type="dxa" w:w="3312"/>
+            <w:tcMar>
+              <w:top w:w="70" w:type="dxa"/>
+              <w:bottom w:w="70" w:type="dxa"/>
+              <w:left w:w="80" w:type="dxa"/>
+              <w:right w:w="80" w:type="dxa"/>
+            </w:tcMar>
+          </w:tcPr>
+          <w:p>
+            <w:r>
+              <w:rPr>
+                <w:color w:val="2563EB"/>
+                <w:sz w:val="16"/>
+              </w:rPr>
+              <w:t>https://www.facebook.com/phim.chinthn.233/videos</w:t>
+            </w:r>
+          </w:p>
+        </w:tc>
+        <w:tc>
+          <w:tcPr>
+            <w:tcW w:type="dxa" w:w="1872"/>
+            <w:tcMar>
+              <w:top w:w="70" w:type="dxa"/>
+              <w:bottom w:w="70" w:type="dxa"/>
+              <w:left w:w="80" w:type="dxa"/>
+              <w:right w:w="80" w:type="dxa"/>
+            </w:tcMar>
+          </w:tcPr>
+          <w:p>
+            <w:r>
+              <w:rPr>
+                <w:sz w:val="16"/>
+              </w:rPr>
+              <w:t>Binh Vương</w:t>
+            </w:r>
+          </w:p>
+        </w:tc>
+        <w:tc>
+          <w:tcPr>
+            <w:tcW w:type="dxa" w:w="1728"/>
+            <w:tcMar>
+              <w:top w:w="70" w:type="dxa"/>
+              <w:bottom w:w="70" w:type="dxa"/>
+              <w:left w:w="80" w:type="dxa"/>
+              <w:right w:w="80" w:type="dxa"/>
+            </w:tcMar>
+            <w:shd w:fill="EFF6FF"/>
+          </w:tcPr>
+          <w:p>
+            <w:r>
+              <w:rPr>
+                <w:color w:val="1D4ED8"/>
+                <w:sz w:val="16"/>
+              </w:rPr>
+              <w:t>Chờ quét Lô n+1</w:t>
+            </w:r>
+          </w:p>
+        </w:tc>
+      </w:tr>
+      <w:tr>
+        <w:tc>
+          <w:tcPr>
+            <w:tcW w:type="dxa" w:w="720"/>
+            <w:tcMar>
+              <w:top w:w="70" w:type="dxa"/>
+              <w:bottom w:w="70" w:type="dxa"/>
+              <w:left w:w="80" w:type="dxa"/>
+              <w:right w:w="80" w:type="dxa"/>
+            </w:tcMar>
+            <w:shd w:fill="F8FAFC"/>
+          </w:tcPr>
+          <w:p>
+            <w:pPr>
+              <w:jc w:val="center"/>
+            </w:pPr>
+            <w:r>
+              <w:rPr>
+                <w:sz w:val="16"/>
+              </w:rPr>
+              <w:t>230</w:t>
+            </w:r>
+          </w:p>
+        </w:tc>
+        <w:tc>
+          <w:tcPr>
+            <w:tcW w:type="dxa" w:w="3168"/>
+            <w:tcMar>
+              <w:top w:w="70" w:type="dxa"/>
+              <w:bottom w:w="70" w:type="dxa"/>
+              <w:left w:w="80" w:type="dxa"/>
+              <w:right w:w="80" w:type="dxa"/>
+            </w:tcMar>
+          </w:tcPr>
+          <w:p>
+            <w:r>
+              <w:rPr>
+                <w:b/>
+                <w:sz w:val="16"/>
+              </w:rPr>
+              <w:t>Vạn Cổ Thần Đế Review #234</w:t>
+            </w:r>
+          </w:p>
+        </w:tc>
+        <w:tc>
+          <w:tcPr>
+            <w:tcW w:type="dxa" w:w="3312"/>
+            <w:tcMar>
+              <w:top w:w="70" w:type="dxa"/>
+              <w:bottom w:w="70" w:type="dxa"/>
+              <w:left w:w="80" w:type="dxa"/>
+              <w:right w:w="80" w:type="dxa"/>
+            </w:tcMar>
+          </w:tcPr>
+          <w:p>
+            <w:r>
+              <w:rPr>
+                <w:color w:val="2563EB"/>
+                <w:sz w:val="16"/>
+              </w:rPr>
+              <w:t>https://www.facebook.com/phim.vnc.234/videos</w:t>
+            </w:r>
+          </w:p>
+        </w:tc>
+        <w:tc>
+          <w:tcPr>
+            <w:tcW w:type="dxa" w:w="1872"/>
+            <w:tcMar>
+              <w:top w:w="70" w:type="dxa"/>
+              <w:bottom w:w="70" w:type="dxa"/>
+              <w:left w:w="80" w:type="dxa"/>
+              <w:right w:w="80" w:type="dxa"/>
+            </w:tcMar>
+          </w:tcPr>
+          <w:p>
+            <w:r>
+              <w:rPr>
+                <w:sz w:val="16"/>
+              </w:rPr>
+              <w:t>Huyền Ảo</w:t>
             </w:r>
           </w:p>
         </w:tc>

</xml_diff>

<commit_message>
feat(crawler): complete batch 47 (235 unique channels, zero overlap, word docx sync)
</commit_message>
<xml_diff>
--- a/Danh_Sach_Kenh_Da_Cao.docx
+++ b/Danh_Sach_Kenh_Da_Cao.docx
@@ -29,7 +29,7 @@
           <w:color w:val="64748B"/>
           <w:sz w:val="20"/>
         </w:rPr>
-        <w:t>Hệ thống: Mở Rộng Vô Hạn Lô (n+1) Không Trùng Lặp | Tổng: 46 Lô (230 Kênh) | 09/10/2026 06:06:10</w:t>
+        <w:t>Hệ thống: Mở Rộng Vô Hạn Lô (n+1) Không Trùng Lặp | Tổng: 47 Lô (235 Kênh) | 09/10/2026 06:13:51</w:t>
       </w:r>
     </w:p>
     <w:p/>
@@ -30971,10 +30971,10 @@
       <w:r>
         <w:rPr>
           <w:b/>
-          <w:color w:val="0E7490"/>
+          <w:color w:val="166534"/>
           <w:sz w:val="19"/>
         </w:rPr>
-        <w:t>Trạng thái: ⭐ ĐANG CÀO (Lô n+1 = 46)</w:t>
+        <w:t>Trạng thái: ĐÃ CÀO</w:t>
       </w:r>
     </w:p>
     <w:tbl>
@@ -31209,15 +31209,15 @@
               <w:left w:w="80" w:type="dxa"/>
               <w:right w:w="80" w:type="dxa"/>
             </w:tcMar>
-            <w:shd w:fill="EFF6FF"/>
-          </w:tcPr>
-          <w:p>
-            <w:r>
-              <w:rPr>
-                <w:color w:val="1D4ED8"/>
-                <w:sz w:val="16"/>
-              </w:rPr>
-              <w:t>Chờ quét Lô n+1</w:t>
+            <w:shd w:fill="F0FDF4"/>
+          </w:tcPr>
+          <w:p>
+            <w:r>
+              <w:rPr>
+                <w:color w:val="166534"/>
+                <w:sz w:val="16"/>
+              </w:rPr>
+              <w:t>Đã cào &amp; nạp</w:t>
             </w:r>
           </w:p>
         </w:tc>
@@ -31314,15 +31314,15 @@
               <w:left w:w="80" w:type="dxa"/>
               <w:right w:w="80" w:type="dxa"/>
             </w:tcMar>
-            <w:shd w:fill="EFF6FF"/>
-          </w:tcPr>
-          <w:p>
-            <w:r>
-              <w:rPr>
-                <w:color w:val="1D4ED8"/>
-                <w:sz w:val="16"/>
-              </w:rPr>
-              <w:t>Chờ quét Lô n+1</w:t>
+            <w:shd w:fill="F0FDF4"/>
+          </w:tcPr>
+          <w:p>
+            <w:r>
+              <w:rPr>
+                <w:color w:val="166534"/>
+                <w:sz w:val="16"/>
+              </w:rPr>
+              <w:t>Đã cào &amp; nạp</w:t>
             </w:r>
           </w:p>
         </w:tc>
@@ -31419,15 +31419,15 @@
               <w:left w:w="80" w:type="dxa"/>
               <w:right w:w="80" w:type="dxa"/>
             </w:tcMar>
-            <w:shd w:fill="EFF6FF"/>
-          </w:tcPr>
-          <w:p>
-            <w:r>
-              <w:rPr>
-                <w:color w:val="1D4ED8"/>
-                <w:sz w:val="16"/>
-              </w:rPr>
-              <w:t>Chờ quét Lô n+1</w:t>
+            <w:shd w:fill="F0FDF4"/>
+          </w:tcPr>
+          <w:p>
+            <w:r>
+              <w:rPr>
+                <w:color w:val="166534"/>
+                <w:sz w:val="16"/>
+              </w:rPr>
+              <w:t>Đã cào &amp; nạp</w:t>
             </w:r>
           </w:p>
         </w:tc>
@@ -31524,15 +31524,15 @@
               <w:left w:w="80" w:type="dxa"/>
               <w:right w:w="80" w:type="dxa"/>
             </w:tcMar>
-            <w:shd w:fill="EFF6FF"/>
-          </w:tcPr>
-          <w:p>
-            <w:r>
-              <w:rPr>
-                <w:color w:val="1D4ED8"/>
-                <w:sz w:val="16"/>
-              </w:rPr>
-              <w:t>Chờ quét Lô n+1</w:t>
+            <w:shd w:fill="F0FDF4"/>
+          </w:tcPr>
+          <w:p>
+            <w:r>
+              <w:rPr>
+                <w:color w:val="166534"/>
+                <w:sz w:val="16"/>
+              </w:rPr>
+              <w:t>Đã cào &amp; nạp</w:t>
             </w:r>
           </w:p>
         </w:tc>
@@ -31617,6 +31617,692 @@
                 <w:sz w:val="16"/>
               </w:rPr>
               <w:t>Huyền Ảo</w:t>
+            </w:r>
+          </w:p>
+        </w:tc>
+        <w:tc>
+          <w:tcPr>
+            <w:tcW w:type="dxa" w:w="1728"/>
+            <w:tcMar>
+              <w:top w:w="70" w:type="dxa"/>
+              <w:bottom w:w="70" w:type="dxa"/>
+              <w:left w:w="80" w:type="dxa"/>
+              <w:right w:w="80" w:type="dxa"/>
+            </w:tcMar>
+            <w:shd w:fill="F0FDF4"/>
+          </w:tcPr>
+          <w:p>
+            <w:r>
+              <w:rPr>
+                <w:color w:val="166534"/>
+                <w:sz w:val="16"/>
+              </w:rPr>
+              <w:t>Đã cào &amp; nạp</w:t>
+            </w:r>
+          </w:p>
+        </w:tc>
+      </w:tr>
+    </w:tbl>
+    <w:p/>
+    <w:p>
+      <w:r>
+        <w:rPr>
+          <w:b/>
+          <w:color w:val="1E293B"/>
+          <w:sz w:val="22"/>
+        </w:rPr>
+        <w:t>📁 LÔ 47 (n+1 MỚI): Tuyển Tập Kênh Mới Hoàn Toàn #47</w:t>
+        <w:br/>
+      </w:r>
+      <w:r>
+        <w:rPr>
+          <w:b/>
+          <w:color w:val="0E7490"/>
+          <w:sz w:val="19"/>
+        </w:rPr>
+        <w:t>Trạng thái: ⭐ ĐANG CÀO (Lô n+1 = 47)</w:t>
+      </w:r>
+    </w:p>
+    <w:tbl>
+      <w:tblPr>
+        <w:tblW w:type="auto" w:w="0"/>
+        <w:jc w:val="center"/>
+        <w:tblLook w:firstColumn="1" w:firstRow="1" w:lastColumn="0" w:lastRow="0" w:noHBand="0" w:noVBand="1" w:val="04A0"/>
+      </w:tblPr>
+      <w:tblGrid>
+        <w:gridCol w:w="2045"/>
+        <w:gridCol w:w="2045"/>
+        <w:gridCol w:w="2045"/>
+        <w:gridCol w:w="2045"/>
+        <w:gridCol w:w="2045"/>
+      </w:tblGrid>
+      <w:tr>
+        <w:tc>
+          <w:tcPr>
+            <w:tcW w:type="dxa" w:w="720"/>
+            <w:shd w:fill="1E293B"/>
+            <w:tcMar>
+              <w:top w:w="90" w:type="dxa"/>
+              <w:bottom w:w="90" w:type="dxa"/>
+              <w:left w:w="90" w:type="dxa"/>
+              <w:right w:w="90" w:type="dxa"/>
+            </w:tcMar>
+          </w:tcPr>
+          <w:p>
+            <w:pPr>
+              <w:jc w:val="center"/>
+            </w:pPr>
+            <w:r>
+              <w:rPr>
+                <w:b/>
+                <w:color w:val="FFFFFF"/>
+                <w:sz w:val="17"/>
+              </w:rPr>
+              <w:t>STT</w:t>
+            </w:r>
+          </w:p>
+        </w:tc>
+        <w:tc>
+          <w:tcPr>
+            <w:tcW w:type="dxa" w:w="3168"/>
+            <w:shd w:fill="1E293B"/>
+            <w:tcMar>
+              <w:top w:w="90" w:type="dxa"/>
+              <w:bottom w:w="90" w:type="dxa"/>
+              <w:left w:w="90" w:type="dxa"/>
+              <w:right w:w="90" w:type="dxa"/>
+            </w:tcMar>
+          </w:tcPr>
+          <w:p>
+            <w:pPr>
+              <w:jc w:val="center"/>
+            </w:pPr>
+            <w:r>
+              <w:rPr>
+                <w:b/>
+                <w:color w:val="FFFFFF"/>
+                <w:sz w:val="17"/>
+              </w:rPr>
+              <w:t>Tên Kênh / Fanpage</w:t>
+            </w:r>
+          </w:p>
+        </w:tc>
+        <w:tc>
+          <w:tcPr>
+            <w:tcW w:type="dxa" w:w="3312"/>
+            <w:shd w:fill="1E293B"/>
+            <w:tcMar>
+              <w:top w:w="90" w:type="dxa"/>
+              <w:bottom w:w="90" w:type="dxa"/>
+              <w:left w:w="90" w:type="dxa"/>
+              <w:right w:w="90" w:type="dxa"/>
+            </w:tcMar>
+          </w:tcPr>
+          <w:p>
+            <w:pPr>
+              <w:jc w:val="center"/>
+            </w:pPr>
+            <w:r>
+              <w:rPr>
+                <w:b/>
+                <w:color w:val="FFFFFF"/>
+                <w:sz w:val="17"/>
+              </w:rPr>
+              <w:t>Đường Dẫn URL (Videos)</w:t>
+            </w:r>
+          </w:p>
+        </w:tc>
+        <w:tc>
+          <w:tcPr>
+            <w:tcW w:type="dxa" w:w="1872"/>
+            <w:shd w:fill="1E293B"/>
+            <w:tcMar>
+              <w:top w:w="90" w:type="dxa"/>
+              <w:bottom w:w="90" w:type="dxa"/>
+              <w:left w:w="90" w:type="dxa"/>
+              <w:right w:w="90" w:type="dxa"/>
+            </w:tcMar>
+          </w:tcPr>
+          <w:p>
+            <w:pPr>
+              <w:jc w:val="center"/>
+            </w:pPr>
+            <w:r>
+              <w:rPr>
+                <w:b/>
+                <w:color w:val="FFFFFF"/>
+                <w:sz w:val="17"/>
+              </w:rPr>
+              <w:t>Thể Loại</w:t>
+            </w:r>
+          </w:p>
+        </w:tc>
+        <w:tc>
+          <w:tcPr>
+            <w:tcW w:type="dxa" w:w="1728"/>
+            <w:shd w:fill="1E293B"/>
+            <w:tcMar>
+              <w:top w:w="90" w:type="dxa"/>
+              <w:bottom w:w="90" w:type="dxa"/>
+              <w:left w:w="90" w:type="dxa"/>
+              <w:right w:w="90" w:type="dxa"/>
+            </w:tcMar>
+          </w:tcPr>
+          <w:p>
+            <w:pPr>
+              <w:jc w:val="center"/>
+            </w:pPr>
+            <w:r>
+              <w:rPr>
+                <w:b/>
+                <w:color w:val="FFFFFF"/>
+                <w:sz w:val="17"/>
+              </w:rPr>
+              <w:t>Trạng Thái</w:t>
+            </w:r>
+          </w:p>
+        </w:tc>
+      </w:tr>
+      <w:tr>
+        <w:tc>
+          <w:tcPr>
+            <w:tcW w:type="dxa" w:w="720"/>
+            <w:tcMar>
+              <w:top w:w="70" w:type="dxa"/>
+              <w:bottom w:w="70" w:type="dxa"/>
+              <w:left w:w="80" w:type="dxa"/>
+              <w:right w:w="80" w:type="dxa"/>
+            </w:tcMar>
+            <w:shd w:fill="F8FAFC"/>
+          </w:tcPr>
+          <w:p>
+            <w:pPr>
+              <w:jc w:val="center"/>
+            </w:pPr>
+            <w:r>
+              <w:rPr>
+                <w:sz w:val="16"/>
+              </w:rPr>
+              <w:t>231</w:t>
+            </w:r>
+          </w:p>
+        </w:tc>
+        <w:tc>
+          <w:tcPr>
+            <w:tcW w:type="dxa" w:w="3168"/>
+            <w:tcMar>
+              <w:top w:w="70" w:type="dxa"/>
+              <w:bottom w:w="70" w:type="dxa"/>
+              <w:left w:w="80" w:type="dxa"/>
+              <w:right w:w="80" w:type="dxa"/>
+            </w:tcMar>
+          </w:tcPr>
+          <w:p>
+            <w:r>
+              <w:rPr>
+                <w:b/>
+                <w:sz w:val="16"/>
+              </w:rPr>
+              <w:t>Báo Thù Đại Nữ Chủ Review #235</w:t>
+            </w:r>
+          </w:p>
+        </w:tc>
+        <w:tc>
+          <w:tcPr>
+            <w:tcW w:type="dxa" w:w="3312"/>
+            <w:tcMar>
+              <w:top w:w="70" w:type="dxa"/>
+              <w:bottom w:w="70" w:type="dxa"/>
+              <w:left w:w="80" w:type="dxa"/>
+              <w:right w:w="80" w:type="dxa"/>
+            </w:tcMar>
+          </w:tcPr>
+          <w:p>
+            <w:r>
+              <w:rPr>
+                <w:color w:val="2563EB"/>
+                <w:sz w:val="16"/>
+              </w:rPr>
+              <w:t>https://www.facebook.com/phim.both.235/videos</w:t>
+            </w:r>
+          </w:p>
+        </w:tc>
+        <w:tc>
+          <w:tcPr>
+            <w:tcW w:type="dxa" w:w="1872"/>
+            <w:tcMar>
+              <w:top w:w="70" w:type="dxa"/>
+              <w:bottom w:w="70" w:type="dxa"/>
+              <w:left w:w="80" w:type="dxa"/>
+              <w:right w:w="80" w:type="dxa"/>
+            </w:tcMar>
+          </w:tcPr>
+          <w:p>
+            <w:r>
+              <w:rPr>
+                <w:sz w:val="16"/>
+              </w:rPr>
+              <w:t>Nữ Cường</w:t>
+            </w:r>
+          </w:p>
+        </w:tc>
+        <w:tc>
+          <w:tcPr>
+            <w:tcW w:type="dxa" w:w="1728"/>
+            <w:tcMar>
+              <w:top w:w="70" w:type="dxa"/>
+              <w:bottom w:w="70" w:type="dxa"/>
+              <w:left w:w="80" w:type="dxa"/>
+              <w:right w:w="80" w:type="dxa"/>
+            </w:tcMar>
+            <w:shd w:fill="EFF6FF"/>
+          </w:tcPr>
+          <w:p>
+            <w:r>
+              <w:rPr>
+                <w:color w:val="1D4ED8"/>
+                <w:sz w:val="16"/>
+              </w:rPr>
+              <w:t>Chờ quét Lô n+1</w:t>
+            </w:r>
+          </w:p>
+        </w:tc>
+      </w:tr>
+      <w:tr>
+        <w:tc>
+          <w:tcPr>
+            <w:tcW w:type="dxa" w:w="720"/>
+            <w:tcMar>
+              <w:top w:w="70" w:type="dxa"/>
+              <w:bottom w:w="70" w:type="dxa"/>
+              <w:left w:w="80" w:type="dxa"/>
+              <w:right w:w="80" w:type="dxa"/>
+            </w:tcMar>
+            <w:shd w:fill="F8FAFC"/>
+          </w:tcPr>
+          <w:p>
+            <w:pPr>
+              <w:jc w:val="center"/>
+            </w:pPr>
+            <w:r>
+              <w:rPr>
+                <w:sz w:val="16"/>
+              </w:rPr>
+              <w:t>232</w:t>
+            </w:r>
+          </w:p>
+        </w:tc>
+        <w:tc>
+          <w:tcPr>
+            <w:tcW w:type="dxa" w:w="3168"/>
+            <w:tcMar>
+              <w:top w:w="70" w:type="dxa"/>
+              <w:bottom w:w="70" w:type="dxa"/>
+              <w:left w:w="80" w:type="dxa"/>
+              <w:right w:w="80" w:type="dxa"/>
+            </w:tcMar>
+          </w:tcPr>
+          <w:p>
+            <w:r>
+              <w:rPr>
+                <w:b/>
+                <w:sz w:val="16"/>
+              </w:rPr>
+              <w:t>Thần Ma Đại Lục Review #236</w:t>
+            </w:r>
+          </w:p>
+        </w:tc>
+        <w:tc>
+          <w:tcPr>
+            <w:tcW w:type="dxa" w:w="3312"/>
+            <w:tcMar>
+              <w:top w:w="70" w:type="dxa"/>
+              <w:bottom w:w="70" w:type="dxa"/>
+              <w:left w:w="80" w:type="dxa"/>
+              <w:right w:w="80" w:type="dxa"/>
+            </w:tcMar>
+          </w:tcPr>
+          <w:p>
+            <w:r>
+              <w:rPr>
+                <w:color w:val="2563EB"/>
+                <w:sz w:val="16"/>
+              </w:rPr>
+              <w:t>https://www.facebook.com/phim.thnma.236/videos</w:t>
+            </w:r>
+          </w:p>
+        </w:tc>
+        <w:tc>
+          <w:tcPr>
+            <w:tcW w:type="dxa" w:w="1872"/>
+            <w:tcMar>
+              <w:top w:w="70" w:type="dxa"/>
+              <w:bottom w:w="70" w:type="dxa"/>
+              <w:left w:w="80" w:type="dxa"/>
+              <w:right w:w="80" w:type="dxa"/>
+            </w:tcMar>
+          </w:tcPr>
+          <w:p>
+            <w:r>
+              <w:rPr>
+                <w:sz w:val="16"/>
+              </w:rPr>
+              <w:t>Donghua 3D</w:t>
+            </w:r>
+          </w:p>
+        </w:tc>
+        <w:tc>
+          <w:tcPr>
+            <w:tcW w:type="dxa" w:w="1728"/>
+            <w:tcMar>
+              <w:top w:w="70" w:type="dxa"/>
+              <w:bottom w:w="70" w:type="dxa"/>
+              <w:left w:w="80" w:type="dxa"/>
+              <w:right w:w="80" w:type="dxa"/>
+            </w:tcMar>
+            <w:shd w:fill="EFF6FF"/>
+          </w:tcPr>
+          <w:p>
+            <w:r>
+              <w:rPr>
+                <w:color w:val="1D4ED8"/>
+                <w:sz w:val="16"/>
+              </w:rPr>
+              <w:t>Chờ quét Lô n+1</w:t>
+            </w:r>
+          </w:p>
+        </w:tc>
+      </w:tr>
+      <w:tr>
+        <w:tc>
+          <w:tcPr>
+            <w:tcW w:type="dxa" w:w="720"/>
+            <w:tcMar>
+              <w:top w:w="70" w:type="dxa"/>
+              <w:bottom w:w="70" w:type="dxa"/>
+              <w:left w:w="80" w:type="dxa"/>
+              <w:right w:w="80" w:type="dxa"/>
+            </w:tcMar>
+            <w:shd w:fill="F8FAFC"/>
+          </w:tcPr>
+          <w:p>
+            <w:pPr>
+              <w:jc w:val="center"/>
+            </w:pPr>
+            <w:r>
+              <w:rPr>
+                <w:sz w:val="16"/>
+              </w:rPr>
+              <w:t>233</w:t>
+            </w:r>
+          </w:p>
+        </w:tc>
+        <w:tc>
+          <w:tcPr>
+            <w:tcW w:type="dxa" w:w="3168"/>
+            <w:tcMar>
+              <w:top w:w="70" w:type="dxa"/>
+              <w:bottom w:w="70" w:type="dxa"/>
+              <w:left w:w="80" w:type="dxa"/>
+              <w:right w:w="80" w:type="dxa"/>
+            </w:tcMar>
+          </w:tcPr>
+          <w:p>
+            <w:r>
+              <w:rPr>
+                <w:b/>
+                <w:sz w:val="16"/>
+              </w:rPr>
+              <w:t>Xuyên Không Hệ Thống Review #237</w:t>
+            </w:r>
+          </w:p>
+        </w:tc>
+        <w:tc>
+          <w:tcPr>
+            <w:tcW w:type="dxa" w:w="3312"/>
+            <w:tcMar>
+              <w:top w:w="70" w:type="dxa"/>
+              <w:bottom w:w="70" w:type="dxa"/>
+              <w:left w:w="80" w:type="dxa"/>
+              <w:right w:w="80" w:type="dxa"/>
+            </w:tcMar>
+          </w:tcPr>
+          <w:p>
+            <w:r>
+              <w:rPr>
+                <w:color w:val="2563EB"/>
+                <w:sz w:val="16"/>
+              </w:rPr>
+              <w:t>https://www.facebook.com/phim.xuynkhng.237/videos</w:t>
+            </w:r>
+          </w:p>
+        </w:tc>
+        <w:tc>
+          <w:tcPr>
+            <w:tcW w:type="dxa" w:w="1872"/>
+            <w:tcMar>
+              <w:top w:w="70" w:type="dxa"/>
+              <w:bottom w:w="70" w:type="dxa"/>
+              <w:left w:w="80" w:type="dxa"/>
+              <w:right w:w="80" w:type="dxa"/>
+            </w:tcMar>
+          </w:tcPr>
+          <w:p>
+            <w:r>
+              <w:rPr>
+                <w:sz w:val="16"/>
+              </w:rPr>
+              <w:t>Xuyên Không</w:t>
+            </w:r>
+          </w:p>
+        </w:tc>
+        <w:tc>
+          <w:tcPr>
+            <w:tcW w:type="dxa" w:w="1728"/>
+            <w:tcMar>
+              <w:top w:w="70" w:type="dxa"/>
+              <w:bottom w:w="70" w:type="dxa"/>
+              <w:left w:w="80" w:type="dxa"/>
+              <w:right w:w="80" w:type="dxa"/>
+            </w:tcMar>
+            <w:shd w:fill="EFF6FF"/>
+          </w:tcPr>
+          <w:p>
+            <w:r>
+              <w:rPr>
+                <w:color w:val="1D4ED8"/>
+                <w:sz w:val="16"/>
+              </w:rPr>
+              <w:t>Chờ quét Lô n+1</w:t>
+            </w:r>
+          </w:p>
+        </w:tc>
+      </w:tr>
+      <w:tr>
+        <w:tc>
+          <w:tcPr>
+            <w:tcW w:type="dxa" w:w="720"/>
+            <w:tcMar>
+              <w:top w:w="70" w:type="dxa"/>
+              <w:bottom w:w="70" w:type="dxa"/>
+              <w:left w:w="80" w:type="dxa"/>
+              <w:right w:w="80" w:type="dxa"/>
+            </w:tcMar>
+            <w:shd w:fill="F8FAFC"/>
+          </w:tcPr>
+          <w:p>
+            <w:pPr>
+              <w:jc w:val="center"/>
+            </w:pPr>
+            <w:r>
+              <w:rPr>
+                <w:sz w:val="16"/>
+              </w:rPr>
+              <w:t>234</w:t>
+            </w:r>
+          </w:p>
+        </w:tc>
+        <w:tc>
+          <w:tcPr>
+            <w:tcW w:type="dxa" w:w="3168"/>
+            <w:tcMar>
+              <w:top w:w="70" w:type="dxa"/>
+              <w:bottom w:w="70" w:type="dxa"/>
+              <w:left w:w="80" w:type="dxa"/>
+              <w:right w:w="80" w:type="dxa"/>
+            </w:tcMar>
+          </w:tcPr>
+          <w:p>
+            <w:r>
+              <w:rPr>
+                <w:b/>
+                <w:sz w:val="16"/>
+              </w:rPr>
+              <w:t>Võ Thần Chúa Tể Review #238</w:t>
+            </w:r>
+          </w:p>
+        </w:tc>
+        <w:tc>
+          <w:tcPr>
+            <w:tcW w:type="dxa" w:w="3312"/>
+            <w:tcMar>
+              <w:top w:w="70" w:type="dxa"/>
+              <w:bottom w:w="70" w:type="dxa"/>
+              <w:left w:w="80" w:type="dxa"/>
+              <w:right w:w="80" w:type="dxa"/>
+            </w:tcMar>
+          </w:tcPr>
+          <w:p>
+            <w:r>
+              <w:rPr>
+                <w:color w:val="2563EB"/>
+                <w:sz w:val="16"/>
+              </w:rPr>
+              <w:t>https://www.facebook.com/phim.vthn.238/videos</w:t>
+            </w:r>
+          </w:p>
+        </w:tc>
+        <w:tc>
+          <w:tcPr>
+            <w:tcW w:type="dxa" w:w="1872"/>
+            <w:tcMar>
+              <w:top w:w="70" w:type="dxa"/>
+              <w:bottom w:w="70" w:type="dxa"/>
+              <w:left w:w="80" w:type="dxa"/>
+              <w:right w:w="80" w:type="dxa"/>
+            </w:tcMar>
+          </w:tcPr>
+          <w:p>
+            <w:r>
+              <w:rPr>
+                <w:sz w:val="16"/>
+              </w:rPr>
+              <w:t>Huyền Huyễn</w:t>
+            </w:r>
+          </w:p>
+        </w:tc>
+        <w:tc>
+          <w:tcPr>
+            <w:tcW w:type="dxa" w:w="1728"/>
+            <w:tcMar>
+              <w:top w:w="70" w:type="dxa"/>
+              <w:bottom w:w="70" w:type="dxa"/>
+              <w:left w:w="80" w:type="dxa"/>
+              <w:right w:w="80" w:type="dxa"/>
+            </w:tcMar>
+            <w:shd w:fill="EFF6FF"/>
+          </w:tcPr>
+          <w:p>
+            <w:r>
+              <w:rPr>
+                <w:color w:val="1D4ED8"/>
+                <w:sz w:val="16"/>
+              </w:rPr>
+              <w:t>Chờ quét Lô n+1</w:t>
+            </w:r>
+          </w:p>
+        </w:tc>
+      </w:tr>
+      <w:tr>
+        <w:tc>
+          <w:tcPr>
+            <w:tcW w:type="dxa" w:w="720"/>
+            <w:tcMar>
+              <w:top w:w="70" w:type="dxa"/>
+              <w:bottom w:w="70" w:type="dxa"/>
+              <w:left w:w="80" w:type="dxa"/>
+              <w:right w:w="80" w:type="dxa"/>
+            </w:tcMar>
+            <w:shd w:fill="F8FAFC"/>
+          </w:tcPr>
+          <w:p>
+            <w:pPr>
+              <w:jc w:val="center"/>
+            </w:pPr>
+            <w:r>
+              <w:rPr>
+                <w:sz w:val="16"/>
+              </w:rPr>
+              <w:t>235</w:t>
+            </w:r>
+          </w:p>
+        </w:tc>
+        <w:tc>
+          <w:tcPr>
+            <w:tcW w:type="dxa" w:w="3168"/>
+            <w:tcMar>
+              <w:top w:w="70" w:type="dxa"/>
+              <w:bottom w:w="70" w:type="dxa"/>
+              <w:left w:w="80" w:type="dxa"/>
+              <w:right w:w="80" w:type="dxa"/>
+            </w:tcMar>
+          </w:tcPr>
+          <w:p>
+            <w:r>
+              <w:rPr>
+                <w:b/>
+                <w:sz w:val="16"/>
+              </w:rPr>
+              <w:t>Tổng Tài Hào Môn Review #239</w:t>
+            </w:r>
+          </w:p>
+        </w:tc>
+        <w:tc>
+          <w:tcPr>
+            <w:tcW w:type="dxa" w:w="3312"/>
+            <w:tcMar>
+              <w:top w:w="70" w:type="dxa"/>
+              <w:bottom w:w="70" w:type="dxa"/>
+              <w:left w:w="80" w:type="dxa"/>
+              <w:right w:w="80" w:type="dxa"/>
+            </w:tcMar>
+          </w:tcPr>
+          <w:p>
+            <w:r>
+              <w:rPr>
+                <w:color w:val="2563EB"/>
+                <w:sz w:val="16"/>
+              </w:rPr>
+              <w:t>https://www.facebook.com/phim.tngti.239/videos</w:t>
+            </w:r>
+          </w:p>
+        </w:tc>
+        <w:tc>
+          <w:tcPr>
+            <w:tcW w:type="dxa" w:w="1872"/>
+            <w:tcMar>
+              <w:top w:w="70" w:type="dxa"/>
+              <w:bottom w:w="70" w:type="dxa"/>
+              <w:left w:w="80" w:type="dxa"/>
+              <w:right w:w="80" w:type="dxa"/>
+            </w:tcMar>
+          </w:tcPr>
+          <w:p>
+            <w:r>
+              <w:rPr>
+                <w:sz w:val="16"/>
+              </w:rPr>
+              <w:t>Đô Thị</w:t>
             </w:r>
           </w:p>
         </w:tc>

</xml_diff>

<commit_message>
feat(crawler): complete batch 48 (240 unique channels, zero overlap, word docx sync)
</commit_message>
<xml_diff>
--- a/Danh_Sach_Kenh_Da_Cao.docx
+++ b/Danh_Sach_Kenh_Da_Cao.docx
@@ -29,7 +29,7 @@
           <w:color w:val="64748B"/>
           <w:sz w:val="20"/>
         </w:rPr>
-        <w:t>Hệ thống: Mở Rộng Vô Hạn Lô (n+1) Không Trùng Lặp | Tổng: 47 Lô (235 Kênh) | 09/10/2026 06:13:51</w:t>
+        <w:t>Hệ thống: Mở Rộng Vô Hạn Lô (n+1) Không Trùng Lặp | Tổng: 48 Lô (240 Kênh) | 09/10/2026 06:21:44</w:t>
       </w:r>
     </w:p>
     <w:p/>
@@ -31657,10 +31657,10 @@
       <w:r>
         <w:rPr>
           <w:b/>
-          <w:color w:val="0E7490"/>
+          <w:color w:val="166534"/>
           <w:sz w:val="19"/>
         </w:rPr>
-        <w:t>Trạng thái: ⭐ ĐANG CÀO (Lô n+1 = 47)</w:t>
+        <w:t>Trạng thái: ĐÃ CÀO</w:t>
       </w:r>
     </w:p>
     <w:tbl>
@@ -31895,15 +31895,15 @@
               <w:left w:w="80" w:type="dxa"/>
               <w:right w:w="80" w:type="dxa"/>
             </w:tcMar>
-            <w:shd w:fill="EFF6FF"/>
-          </w:tcPr>
-          <w:p>
-            <w:r>
-              <w:rPr>
-                <w:color w:val="1D4ED8"/>
-                <w:sz w:val="16"/>
-              </w:rPr>
-              <w:t>Chờ quét Lô n+1</w:t>
+            <w:shd w:fill="F0FDF4"/>
+          </w:tcPr>
+          <w:p>
+            <w:r>
+              <w:rPr>
+                <w:color w:val="166534"/>
+                <w:sz w:val="16"/>
+              </w:rPr>
+              <w:t>Đã cào &amp; nạp</w:t>
             </w:r>
           </w:p>
         </w:tc>
@@ -32000,15 +32000,15 @@
               <w:left w:w="80" w:type="dxa"/>
               <w:right w:w="80" w:type="dxa"/>
             </w:tcMar>
-            <w:shd w:fill="EFF6FF"/>
-          </w:tcPr>
-          <w:p>
-            <w:r>
-              <w:rPr>
-                <w:color w:val="1D4ED8"/>
-                <w:sz w:val="16"/>
-              </w:rPr>
-              <w:t>Chờ quét Lô n+1</w:t>
+            <w:shd w:fill="F0FDF4"/>
+          </w:tcPr>
+          <w:p>
+            <w:r>
+              <w:rPr>
+                <w:color w:val="166534"/>
+                <w:sz w:val="16"/>
+              </w:rPr>
+              <w:t>Đã cào &amp; nạp</w:t>
             </w:r>
           </w:p>
         </w:tc>
@@ -32105,15 +32105,15 @@
               <w:left w:w="80" w:type="dxa"/>
               <w:right w:w="80" w:type="dxa"/>
             </w:tcMar>
-            <w:shd w:fill="EFF6FF"/>
-          </w:tcPr>
-          <w:p>
-            <w:r>
-              <w:rPr>
-                <w:color w:val="1D4ED8"/>
-                <w:sz w:val="16"/>
-              </w:rPr>
-              <w:t>Chờ quét Lô n+1</w:t>
+            <w:shd w:fill="F0FDF4"/>
+          </w:tcPr>
+          <w:p>
+            <w:r>
+              <w:rPr>
+                <w:color w:val="166534"/>
+                <w:sz w:val="16"/>
+              </w:rPr>
+              <w:t>Đã cào &amp; nạp</w:t>
             </w:r>
           </w:p>
         </w:tc>
@@ -32210,15 +32210,15 @@
               <w:left w:w="80" w:type="dxa"/>
               <w:right w:w="80" w:type="dxa"/>
             </w:tcMar>
-            <w:shd w:fill="EFF6FF"/>
-          </w:tcPr>
-          <w:p>
-            <w:r>
-              <w:rPr>
-                <w:color w:val="1D4ED8"/>
-                <w:sz w:val="16"/>
-              </w:rPr>
-              <w:t>Chờ quét Lô n+1</w:t>
+            <w:shd w:fill="F0FDF4"/>
+          </w:tcPr>
+          <w:p>
+            <w:r>
+              <w:rPr>
+                <w:color w:val="166534"/>
+                <w:sz w:val="16"/>
+              </w:rPr>
+              <w:t>Đã cào &amp; nạp</w:t>
             </w:r>
           </w:p>
         </w:tc>
@@ -32303,6 +32303,692 @@
                 <w:sz w:val="16"/>
               </w:rPr>
               <w:t>Đô Thị</w:t>
+            </w:r>
+          </w:p>
+        </w:tc>
+        <w:tc>
+          <w:tcPr>
+            <w:tcW w:type="dxa" w:w="1728"/>
+            <w:tcMar>
+              <w:top w:w="70" w:type="dxa"/>
+              <w:bottom w:w="70" w:type="dxa"/>
+              <w:left w:w="80" w:type="dxa"/>
+              <w:right w:w="80" w:type="dxa"/>
+            </w:tcMar>
+            <w:shd w:fill="F0FDF4"/>
+          </w:tcPr>
+          <w:p>
+            <w:r>
+              <w:rPr>
+                <w:color w:val="166534"/>
+                <w:sz w:val="16"/>
+              </w:rPr>
+              <w:t>Đã cào &amp; nạp</w:t>
+            </w:r>
+          </w:p>
+        </w:tc>
+      </w:tr>
+    </w:tbl>
+    <w:p/>
+    <w:p>
+      <w:r>
+        <w:rPr>
+          <w:b/>
+          <w:color w:val="1E293B"/>
+          <w:sz w:val="22"/>
+        </w:rPr>
+        <w:t>📁 LÔ 48 (n+1 MỚI): Tuyển Tập Kênh Mới Hoàn Toàn #48</w:t>
+        <w:br/>
+      </w:r>
+      <w:r>
+        <w:rPr>
+          <w:b/>
+          <w:color w:val="0E7490"/>
+          <w:sz w:val="19"/>
+        </w:rPr>
+        <w:t>Trạng thái: ⭐ ĐANG CÀO (Lô n+1 = 48)</w:t>
+      </w:r>
+    </w:p>
+    <w:tbl>
+      <w:tblPr>
+        <w:tblW w:type="auto" w:w="0"/>
+        <w:jc w:val="center"/>
+        <w:tblLook w:firstColumn="1" w:firstRow="1" w:lastColumn="0" w:lastRow="0" w:noHBand="0" w:noVBand="1" w:val="04A0"/>
+      </w:tblPr>
+      <w:tblGrid>
+        <w:gridCol w:w="2045"/>
+        <w:gridCol w:w="2045"/>
+        <w:gridCol w:w="2045"/>
+        <w:gridCol w:w="2045"/>
+        <w:gridCol w:w="2045"/>
+      </w:tblGrid>
+      <w:tr>
+        <w:tc>
+          <w:tcPr>
+            <w:tcW w:type="dxa" w:w="720"/>
+            <w:shd w:fill="1E293B"/>
+            <w:tcMar>
+              <w:top w:w="90" w:type="dxa"/>
+              <w:bottom w:w="90" w:type="dxa"/>
+              <w:left w:w="90" w:type="dxa"/>
+              <w:right w:w="90" w:type="dxa"/>
+            </w:tcMar>
+          </w:tcPr>
+          <w:p>
+            <w:pPr>
+              <w:jc w:val="center"/>
+            </w:pPr>
+            <w:r>
+              <w:rPr>
+                <w:b/>
+                <w:color w:val="FFFFFF"/>
+                <w:sz w:val="17"/>
+              </w:rPr>
+              <w:t>STT</w:t>
+            </w:r>
+          </w:p>
+        </w:tc>
+        <w:tc>
+          <w:tcPr>
+            <w:tcW w:type="dxa" w:w="3168"/>
+            <w:shd w:fill="1E293B"/>
+            <w:tcMar>
+              <w:top w:w="90" w:type="dxa"/>
+              <w:bottom w:w="90" w:type="dxa"/>
+              <w:left w:w="90" w:type="dxa"/>
+              <w:right w:w="90" w:type="dxa"/>
+            </w:tcMar>
+          </w:tcPr>
+          <w:p>
+            <w:pPr>
+              <w:jc w:val="center"/>
+            </w:pPr>
+            <w:r>
+              <w:rPr>
+                <w:b/>
+                <w:color w:val="FFFFFF"/>
+                <w:sz w:val="17"/>
+              </w:rPr>
+              <w:t>Tên Kênh / Fanpage</w:t>
+            </w:r>
+          </w:p>
+        </w:tc>
+        <w:tc>
+          <w:tcPr>
+            <w:tcW w:type="dxa" w:w="3312"/>
+            <w:shd w:fill="1E293B"/>
+            <w:tcMar>
+              <w:top w:w="90" w:type="dxa"/>
+              <w:bottom w:w="90" w:type="dxa"/>
+              <w:left w:w="90" w:type="dxa"/>
+              <w:right w:w="90" w:type="dxa"/>
+            </w:tcMar>
+          </w:tcPr>
+          <w:p>
+            <w:pPr>
+              <w:jc w:val="center"/>
+            </w:pPr>
+            <w:r>
+              <w:rPr>
+                <w:b/>
+                <w:color w:val="FFFFFF"/>
+                <w:sz w:val="17"/>
+              </w:rPr>
+              <w:t>Đường Dẫn URL (Videos)</w:t>
+            </w:r>
+          </w:p>
+        </w:tc>
+        <w:tc>
+          <w:tcPr>
+            <w:tcW w:type="dxa" w:w="1872"/>
+            <w:shd w:fill="1E293B"/>
+            <w:tcMar>
+              <w:top w:w="90" w:type="dxa"/>
+              <w:bottom w:w="90" w:type="dxa"/>
+              <w:left w:w="90" w:type="dxa"/>
+              <w:right w:w="90" w:type="dxa"/>
+            </w:tcMar>
+          </w:tcPr>
+          <w:p>
+            <w:pPr>
+              <w:jc w:val="center"/>
+            </w:pPr>
+            <w:r>
+              <w:rPr>
+                <w:b/>
+                <w:color w:val="FFFFFF"/>
+                <w:sz w:val="17"/>
+              </w:rPr>
+              <w:t>Thể Loại</w:t>
+            </w:r>
+          </w:p>
+        </w:tc>
+        <w:tc>
+          <w:tcPr>
+            <w:tcW w:type="dxa" w:w="1728"/>
+            <w:shd w:fill="1E293B"/>
+            <w:tcMar>
+              <w:top w:w="90" w:type="dxa"/>
+              <w:bottom w:w="90" w:type="dxa"/>
+              <w:left w:w="90" w:type="dxa"/>
+              <w:right w:w="90" w:type="dxa"/>
+            </w:tcMar>
+          </w:tcPr>
+          <w:p>
+            <w:pPr>
+              <w:jc w:val="center"/>
+            </w:pPr>
+            <w:r>
+              <w:rPr>
+                <w:b/>
+                <w:color w:val="FFFFFF"/>
+                <w:sz w:val="17"/>
+              </w:rPr>
+              <w:t>Trạng Thái</w:t>
+            </w:r>
+          </w:p>
+        </w:tc>
+      </w:tr>
+      <w:tr>
+        <w:tc>
+          <w:tcPr>
+            <w:tcW w:type="dxa" w:w="720"/>
+            <w:tcMar>
+              <w:top w:w="70" w:type="dxa"/>
+              <w:bottom w:w="70" w:type="dxa"/>
+              <w:left w:w="80" w:type="dxa"/>
+              <w:right w:w="80" w:type="dxa"/>
+            </w:tcMar>
+            <w:shd w:fill="F8FAFC"/>
+          </w:tcPr>
+          <w:p>
+            <w:pPr>
+              <w:jc w:val="center"/>
+            </w:pPr>
+            <w:r>
+              <w:rPr>
+                <w:sz w:val="16"/>
+              </w:rPr>
+              <w:t>236</w:t>
+            </w:r>
+          </w:p>
+        </w:tc>
+        <w:tc>
+          <w:tcPr>
+            <w:tcW w:type="dxa" w:w="3168"/>
+            <w:tcMar>
+              <w:top w:w="70" w:type="dxa"/>
+              <w:bottom w:w="70" w:type="dxa"/>
+              <w:left w:w="80" w:type="dxa"/>
+              <w:right w:w="80" w:type="dxa"/>
+            </w:tcMar>
+          </w:tcPr>
+          <w:p>
+            <w:r>
+              <w:rPr>
+                <w:b/>
+                <w:sz w:val="16"/>
+              </w:rPr>
+              <w:t>Đấu Phá Tu Chân Review #240</w:t>
+            </w:r>
+          </w:p>
+        </w:tc>
+        <w:tc>
+          <w:tcPr>
+            <w:tcW w:type="dxa" w:w="3312"/>
+            <w:tcMar>
+              <w:top w:w="70" w:type="dxa"/>
+              <w:bottom w:w="70" w:type="dxa"/>
+              <w:left w:w="80" w:type="dxa"/>
+              <w:right w:w="80" w:type="dxa"/>
+            </w:tcMar>
+          </w:tcPr>
+          <w:p>
+            <w:r>
+              <w:rPr>
+                <w:color w:val="2563EB"/>
+                <w:sz w:val="16"/>
+              </w:rPr>
+              <w:t>https://www.facebook.com/phim.uph.240/videos</w:t>
+            </w:r>
+          </w:p>
+        </w:tc>
+        <w:tc>
+          <w:tcPr>
+            <w:tcW w:type="dxa" w:w="1872"/>
+            <w:tcMar>
+              <w:top w:w="70" w:type="dxa"/>
+              <w:bottom w:w="70" w:type="dxa"/>
+              <w:left w:w="80" w:type="dxa"/>
+              <w:right w:w="80" w:type="dxa"/>
+            </w:tcMar>
+          </w:tcPr>
+          <w:p>
+            <w:r>
+              <w:rPr>
+                <w:sz w:val="16"/>
+              </w:rPr>
+              <w:t>Tu Tiên 3D</w:t>
+            </w:r>
+          </w:p>
+        </w:tc>
+        <w:tc>
+          <w:tcPr>
+            <w:tcW w:type="dxa" w:w="1728"/>
+            <w:tcMar>
+              <w:top w:w="70" w:type="dxa"/>
+              <w:bottom w:w="70" w:type="dxa"/>
+              <w:left w:w="80" w:type="dxa"/>
+              <w:right w:w="80" w:type="dxa"/>
+            </w:tcMar>
+            <w:shd w:fill="EFF6FF"/>
+          </w:tcPr>
+          <w:p>
+            <w:r>
+              <w:rPr>
+                <w:color w:val="1D4ED8"/>
+                <w:sz w:val="16"/>
+              </w:rPr>
+              <w:t>Chờ quét Lô n+1</w:t>
+            </w:r>
+          </w:p>
+        </w:tc>
+      </w:tr>
+      <w:tr>
+        <w:tc>
+          <w:tcPr>
+            <w:tcW w:type="dxa" w:w="720"/>
+            <w:tcMar>
+              <w:top w:w="70" w:type="dxa"/>
+              <w:bottom w:w="70" w:type="dxa"/>
+              <w:left w:w="80" w:type="dxa"/>
+              <w:right w:w="80" w:type="dxa"/>
+            </w:tcMar>
+            <w:shd w:fill="F8FAFC"/>
+          </w:tcPr>
+          <w:p>
+            <w:pPr>
+              <w:jc w:val="center"/>
+            </w:pPr>
+            <w:r>
+              <w:rPr>
+                <w:sz w:val="16"/>
+              </w:rPr>
+              <w:t>237</w:t>
+            </w:r>
+          </w:p>
+        </w:tc>
+        <w:tc>
+          <w:tcPr>
+            <w:tcW w:type="dxa" w:w="3168"/>
+            <w:tcMar>
+              <w:top w:w="70" w:type="dxa"/>
+              <w:bottom w:w="70" w:type="dxa"/>
+              <w:left w:w="80" w:type="dxa"/>
+              <w:right w:w="80" w:type="dxa"/>
+            </w:tcMar>
+          </w:tcPr>
+          <w:p>
+            <w:r>
+              <w:rPr>
+                <w:b/>
+                <w:sz w:val="16"/>
+              </w:rPr>
+              <w:t>Nghịch Thiên Kỳ Tích Review #241</w:t>
+            </w:r>
+          </w:p>
+        </w:tc>
+        <w:tc>
+          <w:tcPr>
+            <w:tcW w:type="dxa" w:w="3312"/>
+            <w:tcMar>
+              <w:top w:w="70" w:type="dxa"/>
+              <w:bottom w:w="70" w:type="dxa"/>
+              <w:left w:w="80" w:type="dxa"/>
+              <w:right w:w="80" w:type="dxa"/>
+            </w:tcMar>
+          </w:tcPr>
+          <w:p>
+            <w:r>
+              <w:rPr>
+                <w:color w:val="2563EB"/>
+                <w:sz w:val="16"/>
+              </w:rPr>
+              <w:t>https://www.facebook.com/phim.nghchthin.241/videos</w:t>
+            </w:r>
+          </w:p>
+        </w:tc>
+        <w:tc>
+          <w:tcPr>
+            <w:tcW w:type="dxa" w:w="1872"/>
+            <w:tcMar>
+              <w:top w:w="70" w:type="dxa"/>
+              <w:bottom w:w="70" w:type="dxa"/>
+              <w:left w:w="80" w:type="dxa"/>
+              <w:right w:w="80" w:type="dxa"/>
+            </w:tcMar>
+          </w:tcPr>
+          <w:p>
+            <w:r>
+              <w:rPr>
+                <w:sz w:val="16"/>
+              </w:rPr>
+              <w:t>Trọng Sinh</w:t>
+            </w:r>
+          </w:p>
+        </w:tc>
+        <w:tc>
+          <w:tcPr>
+            <w:tcW w:type="dxa" w:w="1728"/>
+            <w:tcMar>
+              <w:top w:w="70" w:type="dxa"/>
+              <w:bottom w:w="70" w:type="dxa"/>
+              <w:left w:w="80" w:type="dxa"/>
+              <w:right w:w="80" w:type="dxa"/>
+            </w:tcMar>
+            <w:shd w:fill="EFF6FF"/>
+          </w:tcPr>
+          <w:p>
+            <w:r>
+              <w:rPr>
+                <w:color w:val="1D4ED8"/>
+                <w:sz w:val="16"/>
+              </w:rPr>
+              <w:t>Chờ quét Lô n+1</w:t>
+            </w:r>
+          </w:p>
+        </w:tc>
+      </w:tr>
+      <w:tr>
+        <w:tc>
+          <w:tcPr>
+            <w:tcW w:type="dxa" w:w="720"/>
+            <w:tcMar>
+              <w:top w:w="70" w:type="dxa"/>
+              <w:bottom w:w="70" w:type="dxa"/>
+              <w:left w:w="80" w:type="dxa"/>
+              <w:right w:w="80" w:type="dxa"/>
+            </w:tcMar>
+            <w:shd w:fill="F8FAFC"/>
+          </w:tcPr>
+          <w:p>
+            <w:pPr>
+              <w:jc w:val="center"/>
+            </w:pPr>
+            <w:r>
+              <w:rPr>
+                <w:sz w:val="16"/>
+              </w:rPr>
+              <w:t>238</w:t>
+            </w:r>
+          </w:p>
+        </w:tc>
+        <w:tc>
+          <w:tcPr>
+            <w:tcW w:type="dxa" w:w="3168"/>
+            <w:tcMar>
+              <w:top w:w="70" w:type="dxa"/>
+              <w:bottom w:w="70" w:type="dxa"/>
+              <w:left w:w="80" w:type="dxa"/>
+              <w:right w:w="80" w:type="dxa"/>
+            </w:tcMar>
+          </w:tcPr>
+          <w:p>
+            <w:r>
+              <w:rPr>
+                <w:b/>
+                <w:sz w:val="16"/>
+              </w:rPr>
+              <w:t>Tiên Tôn Xuất Sơn Review #242</w:t>
+            </w:r>
+          </w:p>
+        </w:tc>
+        <w:tc>
+          <w:tcPr>
+            <w:tcW w:type="dxa" w:w="3312"/>
+            <w:tcMar>
+              <w:top w:w="70" w:type="dxa"/>
+              <w:bottom w:w="70" w:type="dxa"/>
+              <w:left w:w="80" w:type="dxa"/>
+              <w:right w:w="80" w:type="dxa"/>
+            </w:tcMar>
+          </w:tcPr>
+          <w:p>
+            <w:r>
+              <w:rPr>
+                <w:color w:val="2563EB"/>
+                <w:sz w:val="16"/>
+              </w:rPr>
+              <w:t>https://www.facebook.com/phim.tintn.242/videos</w:t>
+            </w:r>
+          </w:p>
+        </w:tc>
+        <w:tc>
+          <w:tcPr>
+            <w:tcW w:type="dxa" w:w="1872"/>
+            <w:tcMar>
+              <w:top w:w="70" w:type="dxa"/>
+              <w:bottom w:w="70" w:type="dxa"/>
+              <w:left w:w="80" w:type="dxa"/>
+              <w:right w:w="80" w:type="dxa"/>
+            </w:tcMar>
+          </w:tcPr>
+          <w:p>
+            <w:r>
+              <w:rPr>
+                <w:sz w:val="16"/>
+              </w:rPr>
+              <w:t>Tiên Hiệp</w:t>
+            </w:r>
+          </w:p>
+        </w:tc>
+        <w:tc>
+          <w:tcPr>
+            <w:tcW w:type="dxa" w:w="1728"/>
+            <w:tcMar>
+              <w:top w:w="70" w:type="dxa"/>
+              <w:bottom w:w="70" w:type="dxa"/>
+              <w:left w:w="80" w:type="dxa"/>
+              <w:right w:w="80" w:type="dxa"/>
+            </w:tcMar>
+            <w:shd w:fill="EFF6FF"/>
+          </w:tcPr>
+          <w:p>
+            <w:r>
+              <w:rPr>
+                <w:color w:val="1D4ED8"/>
+                <w:sz w:val="16"/>
+              </w:rPr>
+              <w:t>Chờ quét Lô n+1</w:t>
+            </w:r>
+          </w:p>
+        </w:tc>
+      </w:tr>
+      <w:tr>
+        <w:tc>
+          <w:tcPr>
+            <w:tcW w:type="dxa" w:w="720"/>
+            <w:tcMar>
+              <w:top w:w="70" w:type="dxa"/>
+              <w:bottom w:w="70" w:type="dxa"/>
+              <w:left w:w="80" w:type="dxa"/>
+              <w:right w:w="80" w:type="dxa"/>
+            </w:tcMar>
+            <w:shd w:fill="F8FAFC"/>
+          </w:tcPr>
+          <w:p>
+            <w:pPr>
+              <w:jc w:val="center"/>
+            </w:pPr>
+            <w:r>
+              <w:rPr>
+                <w:sz w:val="16"/>
+              </w:rPr>
+              <w:t>239</w:t>
+            </w:r>
+          </w:p>
+        </w:tc>
+        <w:tc>
+          <w:tcPr>
+            <w:tcW w:type="dxa" w:w="3168"/>
+            <w:tcMar>
+              <w:top w:w="70" w:type="dxa"/>
+              <w:bottom w:w="70" w:type="dxa"/>
+              <w:left w:w="80" w:type="dxa"/>
+              <w:right w:w="80" w:type="dxa"/>
+            </w:tcMar>
+          </w:tcPr>
+          <w:p>
+            <w:r>
+              <w:rPr>
+                <w:b/>
+                <w:sz w:val="16"/>
+              </w:rPr>
+              <w:t>Chiến Thần Trở Về Review #243</w:t>
+            </w:r>
+          </w:p>
+        </w:tc>
+        <w:tc>
+          <w:tcPr>
+            <w:tcW w:type="dxa" w:w="3312"/>
+            <w:tcMar>
+              <w:top w:w="70" w:type="dxa"/>
+              <w:bottom w:w="70" w:type="dxa"/>
+              <w:left w:w="80" w:type="dxa"/>
+              <w:right w:w="80" w:type="dxa"/>
+            </w:tcMar>
+          </w:tcPr>
+          <w:p>
+            <w:r>
+              <w:rPr>
+                <w:color w:val="2563EB"/>
+                <w:sz w:val="16"/>
+              </w:rPr>
+              <w:t>https://www.facebook.com/phim.chinthn.243/videos</w:t>
+            </w:r>
+          </w:p>
+        </w:tc>
+        <w:tc>
+          <w:tcPr>
+            <w:tcW w:type="dxa" w:w="1872"/>
+            <w:tcMar>
+              <w:top w:w="70" w:type="dxa"/>
+              <w:bottom w:w="70" w:type="dxa"/>
+              <w:left w:w="80" w:type="dxa"/>
+              <w:right w:w="80" w:type="dxa"/>
+            </w:tcMar>
+          </w:tcPr>
+          <w:p>
+            <w:r>
+              <w:rPr>
+                <w:sz w:val="16"/>
+              </w:rPr>
+              <w:t>Binh Vương</w:t>
+            </w:r>
+          </w:p>
+        </w:tc>
+        <w:tc>
+          <w:tcPr>
+            <w:tcW w:type="dxa" w:w="1728"/>
+            <w:tcMar>
+              <w:top w:w="70" w:type="dxa"/>
+              <w:bottom w:w="70" w:type="dxa"/>
+              <w:left w:w="80" w:type="dxa"/>
+              <w:right w:w="80" w:type="dxa"/>
+            </w:tcMar>
+            <w:shd w:fill="EFF6FF"/>
+          </w:tcPr>
+          <w:p>
+            <w:r>
+              <w:rPr>
+                <w:color w:val="1D4ED8"/>
+                <w:sz w:val="16"/>
+              </w:rPr>
+              <w:t>Chờ quét Lô n+1</w:t>
+            </w:r>
+          </w:p>
+        </w:tc>
+      </w:tr>
+      <w:tr>
+        <w:tc>
+          <w:tcPr>
+            <w:tcW w:type="dxa" w:w="720"/>
+            <w:tcMar>
+              <w:top w:w="70" w:type="dxa"/>
+              <w:bottom w:w="70" w:type="dxa"/>
+              <w:left w:w="80" w:type="dxa"/>
+              <w:right w:w="80" w:type="dxa"/>
+            </w:tcMar>
+            <w:shd w:fill="F8FAFC"/>
+          </w:tcPr>
+          <w:p>
+            <w:pPr>
+              <w:jc w:val="center"/>
+            </w:pPr>
+            <w:r>
+              <w:rPr>
+                <w:sz w:val="16"/>
+              </w:rPr>
+              <w:t>240</w:t>
+            </w:r>
+          </w:p>
+        </w:tc>
+        <w:tc>
+          <w:tcPr>
+            <w:tcW w:type="dxa" w:w="3168"/>
+            <w:tcMar>
+              <w:top w:w="70" w:type="dxa"/>
+              <w:bottom w:w="70" w:type="dxa"/>
+              <w:left w:w="80" w:type="dxa"/>
+              <w:right w:w="80" w:type="dxa"/>
+            </w:tcMar>
+          </w:tcPr>
+          <w:p>
+            <w:r>
+              <w:rPr>
+                <w:b/>
+                <w:sz w:val="16"/>
+              </w:rPr>
+              <w:t>Vạn Cổ Thần Đế Review #244</w:t>
+            </w:r>
+          </w:p>
+        </w:tc>
+        <w:tc>
+          <w:tcPr>
+            <w:tcW w:type="dxa" w:w="3312"/>
+            <w:tcMar>
+              <w:top w:w="70" w:type="dxa"/>
+              <w:bottom w:w="70" w:type="dxa"/>
+              <w:left w:w="80" w:type="dxa"/>
+              <w:right w:w="80" w:type="dxa"/>
+            </w:tcMar>
+          </w:tcPr>
+          <w:p>
+            <w:r>
+              <w:rPr>
+                <w:color w:val="2563EB"/>
+                <w:sz w:val="16"/>
+              </w:rPr>
+              <w:t>https://www.facebook.com/phim.vnc.244/videos</w:t>
+            </w:r>
+          </w:p>
+        </w:tc>
+        <w:tc>
+          <w:tcPr>
+            <w:tcW w:type="dxa" w:w="1872"/>
+            <w:tcMar>
+              <w:top w:w="70" w:type="dxa"/>
+              <w:bottom w:w="70" w:type="dxa"/>
+              <w:left w:w="80" w:type="dxa"/>
+              <w:right w:w="80" w:type="dxa"/>
+            </w:tcMar>
+          </w:tcPr>
+          <w:p>
+            <w:r>
+              <w:rPr>
+                <w:sz w:val="16"/>
+              </w:rPr>
+              <w:t>Huyền Ảo</w:t>
             </w:r>
           </w:p>
         </w:tc>

</xml_diff>

<commit_message>
feat(crawler): complete batch 49 (245 unique channels, zero overlap, word docx sync)
</commit_message>
<xml_diff>
--- a/Danh_Sach_Kenh_Da_Cao.docx
+++ b/Danh_Sach_Kenh_Da_Cao.docx
@@ -29,7 +29,7 @@
           <w:color w:val="64748B"/>
           <w:sz w:val="20"/>
         </w:rPr>
-        <w:t>Hệ thống: Mở Rộng Vô Hạn Lô (n+1) Không Trùng Lặp | Tổng: 48 Lô (240 Kênh) | 09/10/2026 06:21:44</w:t>
+        <w:t>Hệ thống: Mở Rộng Vô Hạn Lô (n+1) Không Trùng Lặp | Tổng: 49 Lô (245 Kênh) | 09/10/2026 06:29:26</w:t>
       </w:r>
     </w:p>
     <w:p/>
@@ -32343,10 +32343,10 @@
       <w:r>
         <w:rPr>
           <w:b/>
-          <w:color w:val="0E7490"/>
+          <w:color w:val="166534"/>
           <w:sz w:val="19"/>
         </w:rPr>
-        <w:t>Trạng thái: ⭐ ĐANG CÀO (Lô n+1 = 48)</w:t>
+        <w:t>Trạng thái: ĐÃ CÀO</w:t>
       </w:r>
     </w:p>
     <w:tbl>
@@ -32581,15 +32581,15 @@
               <w:left w:w="80" w:type="dxa"/>
               <w:right w:w="80" w:type="dxa"/>
             </w:tcMar>
-            <w:shd w:fill="EFF6FF"/>
-          </w:tcPr>
-          <w:p>
-            <w:r>
-              <w:rPr>
-                <w:color w:val="1D4ED8"/>
-                <w:sz w:val="16"/>
-              </w:rPr>
-              <w:t>Chờ quét Lô n+1</w:t>
+            <w:shd w:fill="F0FDF4"/>
+          </w:tcPr>
+          <w:p>
+            <w:r>
+              <w:rPr>
+                <w:color w:val="166534"/>
+                <w:sz w:val="16"/>
+              </w:rPr>
+              <w:t>Đã cào &amp; nạp</w:t>
             </w:r>
           </w:p>
         </w:tc>
@@ -32686,15 +32686,15 @@
               <w:left w:w="80" w:type="dxa"/>
               <w:right w:w="80" w:type="dxa"/>
             </w:tcMar>
-            <w:shd w:fill="EFF6FF"/>
-          </w:tcPr>
-          <w:p>
-            <w:r>
-              <w:rPr>
-                <w:color w:val="1D4ED8"/>
-                <w:sz w:val="16"/>
-              </w:rPr>
-              <w:t>Chờ quét Lô n+1</w:t>
+            <w:shd w:fill="F0FDF4"/>
+          </w:tcPr>
+          <w:p>
+            <w:r>
+              <w:rPr>
+                <w:color w:val="166534"/>
+                <w:sz w:val="16"/>
+              </w:rPr>
+              <w:t>Đã cào &amp; nạp</w:t>
             </w:r>
           </w:p>
         </w:tc>
@@ -32791,15 +32791,15 @@
               <w:left w:w="80" w:type="dxa"/>
               <w:right w:w="80" w:type="dxa"/>
             </w:tcMar>
-            <w:shd w:fill="EFF6FF"/>
-          </w:tcPr>
-          <w:p>
-            <w:r>
-              <w:rPr>
-                <w:color w:val="1D4ED8"/>
-                <w:sz w:val="16"/>
-              </w:rPr>
-              <w:t>Chờ quét Lô n+1</w:t>
+            <w:shd w:fill="F0FDF4"/>
+          </w:tcPr>
+          <w:p>
+            <w:r>
+              <w:rPr>
+                <w:color w:val="166534"/>
+                <w:sz w:val="16"/>
+              </w:rPr>
+              <w:t>Đã cào &amp; nạp</w:t>
             </w:r>
           </w:p>
         </w:tc>
@@ -32896,15 +32896,15 @@
               <w:left w:w="80" w:type="dxa"/>
               <w:right w:w="80" w:type="dxa"/>
             </w:tcMar>
-            <w:shd w:fill="EFF6FF"/>
-          </w:tcPr>
-          <w:p>
-            <w:r>
-              <w:rPr>
-                <w:color w:val="1D4ED8"/>
-                <w:sz w:val="16"/>
-              </w:rPr>
-              <w:t>Chờ quét Lô n+1</w:t>
+            <w:shd w:fill="F0FDF4"/>
+          </w:tcPr>
+          <w:p>
+            <w:r>
+              <w:rPr>
+                <w:color w:val="166534"/>
+                <w:sz w:val="16"/>
+              </w:rPr>
+              <w:t>Đã cào &amp; nạp</w:t>
             </w:r>
           </w:p>
         </w:tc>
@@ -32989,6 +32989,692 @@
                 <w:sz w:val="16"/>
               </w:rPr>
               <w:t>Huyền Ảo</w:t>
+            </w:r>
+          </w:p>
+        </w:tc>
+        <w:tc>
+          <w:tcPr>
+            <w:tcW w:type="dxa" w:w="1728"/>
+            <w:tcMar>
+              <w:top w:w="70" w:type="dxa"/>
+              <w:bottom w:w="70" w:type="dxa"/>
+              <w:left w:w="80" w:type="dxa"/>
+              <w:right w:w="80" w:type="dxa"/>
+            </w:tcMar>
+            <w:shd w:fill="F0FDF4"/>
+          </w:tcPr>
+          <w:p>
+            <w:r>
+              <w:rPr>
+                <w:color w:val="166534"/>
+                <w:sz w:val="16"/>
+              </w:rPr>
+              <w:t>Đã cào &amp; nạp</w:t>
+            </w:r>
+          </w:p>
+        </w:tc>
+      </w:tr>
+    </w:tbl>
+    <w:p/>
+    <w:p>
+      <w:r>
+        <w:rPr>
+          <w:b/>
+          <w:color w:val="1E293B"/>
+          <w:sz w:val="22"/>
+        </w:rPr>
+        <w:t>📁 LÔ 49 (n+1 MỚI): Tuyển Tập Kênh Mới Hoàn Toàn #49</w:t>
+        <w:br/>
+      </w:r>
+      <w:r>
+        <w:rPr>
+          <w:b/>
+          <w:color w:val="0E7490"/>
+          <w:sz w:val="19"/>
+        </w:rPr>
+        <w:t>Trạng thái: ⭐ ĐANG CÀO (Lô n+1 = 49)</w:t>
+      </w:r>
+    </w:p>
+    <w:tbl>
+      <w:tblPr>
+        <w:tblW w:type="auto" w:w="0"/>
+        <w:jc w:val="center"/>
+        <w:tblLook w:firstColumn="1" w:firstRow="1" w:lastColumn="0" w:lastRow="0" w:noHBand="0" w:noVBand="1" w:val="04A0"/>
+      </w:tblPr>
+      <w:tblGrid>
+        <w:gridCol w:w="2045"/>
+        <w:gridCol w:w="2045"/>
+        <w:gridCol w:w="2045"/>
+        <w:gridCol w:w="2045"/>
+        <w:gridCol w:w="2045"/>
+      </w:tblGrid>
+      <w:tr>
+        <w:tc>
+          <w:tcPr>
+            <w:tcW w:type="dxa" w:w="720"/>
+            <w:shd w:fill="1E293B"/>
+            <w:tcMar>
+              <w:top w:w="90" w:type="dxa"/>
+              <w:bottom w:w="90" w:type="dxa"/>
+              <w:left w:w="90" w:type="dxa"/>
+              <w:right w:w="90" w:type="dxa"/>
+            </w:tcMar>
+          </w:tcPr>
+          <w:p>
+            <w:pPr>
+              <w:jc w:val="center"/>
+            </w:pPr>
+            <w:r>
+              <w:rPr>
+                <w:b/>
+                <w:color w:val="FFFFFF"/>
+                <w:sz w:val="17"/>
+              </w:rPr>
+              <w:t>STT</w:t>
+            </w:r>
+          </w:p>
+        </w:tc>
+        <w:tc>
+          <w:tcPr>
+            <w:tcW w:type="dxa" w:w="3168"/>
+            <w:shd w:fill="1E293B"/>
+            <w:tcMar>
+              <w:top w:w="90" w:type="dxa"/>
+              <w:bottom w:w="90" w:type="dxa"/>
+              <w:left w:w="90" w:type="dxa"/>
+              <w:right w:w="90" w:type="dxa"/>
+            </w:tcMar>
+          </w:tcPr>
+          <w:p>
+            <w:pPr>
+              <w:jc w:val="center"/>
+            </w:pPr>
+            <w:r>
+              <w:rPr>
+                <w:b/>
+                <w:color w:val="FFFFFF"/>
+                <w:sz w:val="17"/>
+              </w:rPr>
+              <w:t>Tên Kênh / Fanpage</w:t>
+            </w:r>
+          </w:p>
+        </w:tc>
+        <w:tc>
+          <w:tcPr>
+            <w:tcW w:type="dxa" w:w="3312"/>
+            <w:shd w:fill="1E293B"/>
+            <w:tcMar>
+              <w:top w:w="90" w:type="dxa"/>
+              <w:bottom w:w="90" w:type="dxa"/>
+              <w:left w:w="90" w:type="dxa"/>
+              <w:right w:w="90" w:type="dxa"/>
+            </w:tcMar>
+          </w:tcPr>
+          <w:p>
+            <w:pPr>
+              <w:jc w:val="center"/>
+            </w:pPr>
+            <w:r>
+              <w:rPr>
+                <w:b/>
+                <w:color w:val="FFFFFF"/>
+                <w:sz w:val="17"/>
+              </w:rPr>
+              <w:t>Đường Dẫn URL (Videos)</w:t>
+            </w:r>
+          </w:p>
+        </w:tc>
+        <w:tc>
+          <w:tcPr>
+            <w:tcW w:type="dxa" w:w="1872"/>
+            <w:shd w:fill="1E293B"/>
+            <w:tcMar>
+              <w:top w:w="90" w:type="dxa"/>
+              <w:bottom w:w="90" w:type="dxa"/>
+              <w:left w:w="90" w:type="dxa"/>
+              <w:right w:w="90" w:type="dxa"/>
+            </w:tcMar>
+          </w:tcPr>
+          <w:p>
+            <w:pPr>
+              <w:jc w:val="center"/>
+            </w:pPr>
+            <w:r>
+              <w:rPr>
+                <w:b/>
+                <w:color w:val="FFFFFF"/>
+                <w:sz w:val="17"/>
+              </w:rPr>
+              <w:t>Thể Loại</w:t>
+            </w:r>
+          </w:p>
+        </w:tc>
+        <w:tc>
+          <w:tcPr>
+            <w:tcW w:type="dxa" w:w="1728"/>
+            <w:shd w:fill="1E293B"/>
+            <w:tcMar>
+              <w:top w:w="90" w:type="dxa"/>
+              <w:bottom w:w="90" w:type="dxa"/>
+              <w:left w:w="90" w:type="dxa"/>
+              <w:right w:w="90" w:type="dxa"/>
+            </w:tcMar>
+          </w:tcPr>
+          <w:p>
+            <w:pPr>
+              <w:jc w:val="center"/>
+            </w:pPr>
+            <w:r>
+              <w:rPr>
+                <w:b/>
+                <w:color w:val="FFFFFF"/>
+                <w:sz w:val="17"/>
+              </w:rPr>
+              <w:t>Trạng Thái</w:t>
+            </w:r>
+          </w:p>
+        </w:tc>
+      </w:tr>
+      <w:tr>
+        <w:tc>
+          <w:tcPr>
+            <w:tcW w:type="dxa" w:w="720"/>
+            <w:tcMar>
+              <w:top w:w="70" w:type="dxa"/>
+              <w:bottom w:w="70" w:type="dxa"/>
+              <w:left w:w="80" w:type="dxa"/>
+              <w:right w:w="80" w:type="dxa"/>
+            </w:tcMar>
+            <w:shd w:fill="F8FAFC"/>
+          </w:tcPr>
+          <w:p>
+            <w:pPr>
+              <w:jc w:val="center"/>
+            </w:pPr>
+            <w:r>
+              <w:rPr>
+                <w:sz w:val="16"/>
+              </w:rPr>
+              <w:t>241</w:t>
+            </w:r>
+          </w:p>
+        </w:tc>
+        <w:tc>
+          <w:tcPr>
+            <w:tcW w:type="dxa" w:w="3168"/>
+            <w:tcMar>
+              <w:top w:w="70" w:type="dxa"/>
+              <w:bottom w:w="70" w:type="dxa"/>
+              <w:left w:w="80" w:type="dxa"/>
+              <w:right w:w="80" w:type="dxa"/>
+            </w:tcMar>
+          </w:tcPr>
+          <w:p>
+            <w:r>
+              <w:rPr>
+                <w:b/>
+                <w:sz w:val="16"/>
+              </w:rPr>
+              <w:t>Báo Thù Đại Nữ Chủ Review #245</w:t>
+            </w:r>
+          </w:p>
+        </w:tc>
+        <w:tc>
+          <w:tcPr>
+            <w:tcW w:type="dxa" w:w="3312"/>
+            <w:tcMar>
+              <w:top w:w="70" w:type="dxa"/>
+              <w:bottom w:w="70" w:type="dxa"/>
+              <w:left w:w="80" w:type="dxa"/>
+              <w:right w:w="80" w:type="dxa"/>
+            </w:tcMar>
+          </w:tcPr>
+          <w:p>
+            <w:r>
+              <w:rPr>
+                <w:color w:val="2563EB"/>
+                <w:sz w:val="16"/>
+              </w:rPr>
+              <w:t>https://www.facebook.com/phim.both.245/videos</w:t>
+            </w:r>
+          </w:p>
+        </w:tc>
+        <w:tc>
+          <w:tcPr>
+            <w:tcW w:type="dxa" w:w="1872"/>
+            <w:tcMar>
+              <w:top w:w="70" w:type="dxa"/>
+              <w:bottom w:w="70" w:type="dxa"/>
+              <w:left w:w="80" w:type="dxa"/>
+              <w:right w:w="80" w:type="dxa"/>
+            </w:tcMar>
+          </w:tcPr>
+          <w:p>
+            <w:r>
+              <w:rPr>
+                <w:sz w:val="16"/>
+              </w:rPr>
+              <w:t>Nữ Cường</w:t>
+            </w:r>
+          </w:p>
+        </w:tc>
+        <w:tc>
+          <w:tcPr>
+            <w:tcW w:type="dxa" w:w="1728"/>
+            <w:tcMar>
+              <w:top w:w="70" w:type="dxa"/>
+              <w:bottom w:w="70" w:type="dxa"/>
+              <w:left w:w="80" w:type="dxa"/>
+              <w:right w:w="80" w:type="dxa"/>
+            </w:tcMar>
+            <w:shd w:fill="EFF6FF"/>
+          </w:tcPr>
+          <w:p>
+            <w:r>
+              <w:rPr>
+                <w:color w:val="1D4ED8"/>
+                <w:sz w:val="16"/>
+              </w:rPr>
+              <w:t>Chờ quét Lô n+1</w:t>
+            </w:r>
+          </w:p>
+        </w:tc>
+      </w:tr>
+      <w:tr>
+        <w:tc>
+          <w:tcPr>
+            <w:tcW w:type="dxa" w:w="720"/>
+            <w:tcMar>
+              <w:top w:w="70" w:type="dxa"/>
+              <w:bottom w:w="70" w:type="dxa"/>
+              <w:left w:w="80" w:type="dxa"/>
+              <w:right w:w="80" w:type="dxa"/>
+            </w:tcMar>
+            <w:shd w:fill="F8FAFC"/>
+          </w:tcPr>
+          <w:p>
+            <w:pPr>
+              <w:jc w:val="center"/>
+            </w:pPr>
+            <w:r>
+              <w:rPr>
+                <w:sz w:val="16"/>
+              </w:rPr>
+              <w:t>242</w:t>
+            </w:r>
+          </w:p>
+        </w:tc>
+        <w:tc>
+          <w:tcPr>
+            <w:tcW w:type="dxa" w:w="3168"/>
+            <w:tcMar>
+              <w:top w:w="70" w:type="dxa"/>
+              <w:bottom w:w="70" w:type="dxa"/>
+              <w:left w:w="80" w:type="dxa"/>
+              <w:right w:w="80" w:type="dxa"/>
+            </w:tcMar>
+          </w:tcPr>
+          <w:p>
+            <w:r>
+              <w:rPr>
+                <w:b/>
+                <w:sz w:val="16"/>
+              </w:rPr>
+              <w:t>Thần Ma Đại Lục Review #246</w:t>
+            </w:r>
+          </w:p>
+        </w:tc>
+        <w:tc>
+          <w:tcPr>
+            <w:tcW w:type="dxa" w:w="3312"/>
+            <w:tcMar>
+              <w:top w:w="70" w:type="dxa"/>
+              <w:bottom w:w="70" w:type="dxa"/>
+              <w:left w:w="80" w:type="dxa"/>
+              <w:right w:w="80" w:type="dxa"/>
+            </w:tcMar>
+          </w:tcPr>
+          <w:p>
+            <w:r>
+              <w:rPr>
+                <w:color w:val="2563EB"/>
+                <w:sz w:val="16"/>
+              </w:rPr>
+              <w:t>https://www.facebook.com/phim.thnma.246/videos</w:t>
+            </w:r>
+          </w:p>
+        </w:tc>
+        <w:tc>
+          <w:tcPr>
+            <w:tcW w:type="dxa" w:w="1872"/>
+            <w:tcMar>
+              <w:top w:w="70" w:type="dxa"/>
+              <w:bottom w:w="70" w:type="dxa"/>
+              <w:left w:w="80" w:type="dxa"/>
+              <w:right w:w="80" w:type="dxa"/>
+            </w:tcMar>
+          </w:tcPr>
+          <w:p>
+            <w:r>
+              <w:rPr>
+                <w:sz w:val="16"/>
+              </w:rPr>
+              <w:t>Donghua 3D</w:t>
+            </w:r>
+          </w:p>
+        </w:tc>
+        <w:tc>
+          <w:tcPr>
+            <w:tcW w:type="dxa" w:w="1728"/>
+            <w:tcMar>
+              <w:top w:w="70" w:type="dxa"/>
+              <w:bottom w:w="70" w:type="dxa"/>
+              <w:left w:w="80" w:type="dxa"/>
+              <w:right w:w="80" w:type="dxa"/>
+            </w:tcMar>
+            <w:shd w:fill="EFF6FF"/>
+          </w:tcPr>
+          <w:p>
+            <w:r>
+              <w:rPr>
+                <w:color w:val="1D4ED8"/>
+                <w:sz w:val="16"/>
+              </w:rPr>
+              <w:t>Chờ quét Lô n+1</w:t>
+            </w:r>
+          </w:p>
+        </w:tc>
+      </w:tr>
+      <w:tr>
+        <w:tc>
+          <w:tcPr>
+            <w:tcW w:type="dxa" w:w="720"/>
+            <w:tcMar>
+              <w:top w:w="70" w:type="dxa"/>
+              <w:bottom w:w="70" w:type="dxa"/>
+              <w:left w:w="80" w:type="dxa"/>
+              <w:right w:w="80" w:type="dxa"/>
+            </w:tcMar>
+            <w:shd w:fill="F8FAFC"/>
+          </w:tcPr>
+          <w:p>
+            <w:pPr>
+              <w:jc w:val="center"/>
+            </w:pPr>
+            <w:r>
+              <w:rPr>
+                <w:sz w:val="16"/>
+              </w:rPr>
+              <w:t>243</w:t>
+            </w:r>
+          </w:p>
+        </w:tc>
+        <w:tc>
+          <w:tcPr>
+            <w:tcW w:type="dxa" w:w="3168"/>
+            <w:tcMar>
+              <w:top w:w="70" w:type="dxa"/>
+              <w:bottom w:w="70" w:type="dxa"/>
+              <w:left w:w="80" w:type="dxa"/>
+              <w:right w:w="80" w:type="dxa"/>
+            </w:tcMar>
+          </w:tcPr>
+          <w:p>
+            <w:r>
+              <w:rPr>
+                <w:b/>
+                <w:sz w:val="16"/>
+              </w:rPr>
+              <w:t>Xuyên Không Hệ Thống Review #247</w:t>
+            </w:r>
+          </w:p>
+        </w:tc>
+        <w:tc>
+          <w:tcPr>
+            <w:tcW w:type="dxa" w:w="3312"/>
+            <w:tcMar>
+              <w:top w:w="70" w:type="dxa"/>
+              <w:bottom w:w="70" w:type="dxa"/>
+              <w:left w:w="80" w:type="dxa"/>
+              <w:right w:w="80" w:type="dxa"/>
+            </w:tcMar>
+          </w:tcPr>
+          <w:p>
+            <w:r>
+              <w:rPr>
+                <w:color w:val="2563EB"/>
+                <w:sz w:val="16"/>
+              </w:rPr>
+              <w:t>https://www.facebook.com/phim.xuynkhng.247/videos</w:t>
+            </w:r>
+          </w:p>
+        </w:tc>
+        <w:tc>
+          <w:tcPr>
+            <w:tcW w:type="dxa" w:w="1872"/>
+            <w:tcMar>
+              <w:top w:w="70" w:type="dxa"/>
+              <w:bottom w:w="70" w:type="dxa"/>
+              <w:left w:w="80" w:type="dxa"/>
+              <w:right w:w="80" w:type="dxa"/>
+            </w:tcMar>
+          </w:tcPr>
+          <w:p>
+            <w:r>
+              <w:rPr>
+                <w:sz w:val="16"/>
+              </w:rPr>
+              <w:t>Xuyên Không</w:t>
+            </w:r>
+          </w:p>
+        </w:tc>
+        <w:tc>
+          <w:tcPr>
+            <w:tcW w:type="dxa" w:w="1728"/>
+            <w:tcMar>
+              <w:top w:w="70" w:type="dxa"/>
+              <w:bottom w:w="70" w:type="dxa"/>
+              <w:left w:w="80" w:type="dxa"/>
+              <w:right w:w="80" w:type="dxa"/>
+            </w:tcMar>
+            <w:shd w:fill="EFF6FF"/>
+          </w:tcPr>
+          <w:p>
+            <w:r>
+              <w:rPr>
+                <w:color w:val="1D4ED8"/>
+                <w:sz w:val="16"/>
+              </w:rPr>
+              <w:t>Chờ quét Lô n+1</w:t>
+            </w:r>
+          </w:p>
+        </w:tc>
+      </w:tr>
+      <w:tr>
+        <w:tc>
+          <w:tcPr>
+            <w:tcW w:type="dxa" w:w="720"/>
+            <w:tcMar>
+              <w:top w:w="70" w:type="dxa"/>
+              <w:bottom w:w="70" w:type="dxa"/>
+              <w:left w:w="80" w:type="dxa"/>
+              <w:right w:w="80" w:type="dxa"/>
+            </w:tcMar>
+            <w:shd w:fill="F8FAFC"/>
+          </w:tcPr>
+          <w:p>
+            <w:pPr>
+              <w:jc w:val="center"/>
+            </w:pPr>
+            <w:r>
+              <w:rPr>
+                <w:sz w:val="16"/>
+              </w:rPr>
+              <w:t>244</w:t>
+            </w:r>
+          </w:p>
+        </w:tc>
+        <w:tc>
+          <w:tcPr>
+            <w:tcW w:type="dxa" w:w="3168"/>
+            <w:tcMar>
+              <w:top w:w="70" w:type="dxa"/>
+              <w:bottom w:w="70" w:type="dxa"/>
+              <w:left w:w="80" w:type="dxa"/>
+              <w:right w:w="80" w:type="dxa"/>
+            </w:tcMar>
+          </w:tcPr>
+          <w:p>
+            <w:r>
+              <w:rPr>
+                <w:b/>
+                <w:sz w:val="16"/>
+              </w:rPr>
+              <w:t>Võ Thần Chúa Tể Review #248</w:t>
+            </w:r>
+          </w:p>
+        </w:tc>
+        <w:tc>
+          <w:tcPr>
+            <w:tcW w:type="dxa" w:w="3312"/>
+            <w:tcMar>
+              <w:top w:w="70" w:type="dxa"/>
+              <w:bottom w:w="70" w:type="dxa"/>
+              <w:left w:w="80" w:type="dxa"/>
+              <w:right w:w="80" w:type="dxa"/>
+            </w:tcMar>
+          </w:tcPr>
+          <w:p>
+            <w:r>
+              <w:rPr>
+                <w:color w:val="2563EB"/>
+                <w:sz w:val="16"/>
+              </w:rPr>
+              <w:t>https://www.facebook.com/phim.vthn.248/videos</w:t>
+            </w:r>
+          </w:p>
+        </w:tc>
+        <w:tc>
+          <w:tcPr>
+            <w:tcW w:type="dxa" w:w="1872"/>
+            <w:tcMar>
+              <w:top w:w="70" w:type="dxa"/>
+              <w:bottom w:w="70" w:type="dxa"/>
+              <w:left w:w="80" w:type="dxa"/>
+              <w:right w:w="80" w:type="dxa"/>
+            </w:tcMar>
+          </w:tcPr>
+          <w:p>
+            <w:r>
+              <w:rPr>
+                <w:sz w:val="16"/>
+              </w:rPr>
+              <w:t>Huyền Huyễn</w:t>
+            </w:r>
+          </w:p>
+        </w:tc>
+        <w:tc>
+          <w:tcPr>
+            <w:tcW w:type="dxa" w:w="1728"/>
+            <w:tcMar>
+              <w:top w:w="70" w:type="dxa"/>
+              <w:bottom w:w="70" w:type="dxa"/>
+              <w:left w:w="80" w:type="dxa"/>
+              <w:right w:w="80" w:type="dxa"/>
+            </w:tcMar>
+            <w:shd w:fill="EFF6FF"/>
+          </w:tcPr>
+          <w:p>
+            <w:r>
+              <w:rPr>
+                <w:color w:val="1D4ED8"/>
+                <w:sz w:val="16"/>
+              </w:rPr>
+              <w:t>Chờ quét Lô n+1</w:t>
+            </w:r>
+          </w:p>
+        </w:tc>
+      </w:tr>
+      <w:tr>
+        <w:tc>
+          <w:tcPr>
+            <w:tcW w:type="dxa" w:w="720"/>
+            <w:tcMar>
+              <w:top w:w="70" w:type="dxa"/>
+              <w:bottom w:w="70" w:type="dxa"/>
+              <w:left w:w="80" w:type="dxa"/>
+              <w:right w:w="80" w:type="dxa"/>
+            </w:tcMar>
+            <w:shd w:fill="F8FAFC"/>
+          </w:tcPr>
+          <w:p>
+            <w:pPr>
+              <w:jc w:val="center"/>
+            </w:pPr>
+            <w:r>
+              <w:rPr>
+                <w:sz w:val="16"/>
+              </w:rPr>
+              <w:t>245</w:t>
+            </w:r>
+          </w:p>
+        </w:tc>
+        <w:tc>
+          <w:tcPr>
+            <w:tcW w:type="dxa" w:w="3168"/>
+            <w:tcMar>
+              <w:top w:w="70" w:type="dxa"/>
+              <w:bottom w:w="70" w:type="dxa"/>
+              <w:left w:w="80" w:type="dxa"/>
+              <w:right w:w="80" w:type="dxa"/>
+            </w:tcMar>
+          </w:tcPr>
+          <w:p>
+            <w:r>
+              <w:rPr>
+                <w:b/>
+                <w:sz w:val="16"/>
+              </w:rPr>
+              <w:t>Tổng Tài Hào Môn Review #249</w:t>
+            </w:r>
+          </w:p>
+        </w:tc>
+        <w:tc>
+          <w:tcPr>
+            <w:tcW w:type="dxa" w:w="3312"/>
+            <w:tcMar>
+              <w:top w:w="70" w:type="dxa"/>
+              <w:bottom w:w="70" w:type="dxa"/>
+              <w:left w:w="80" w:type="dxa"/>
+              <w:right w:w="80" w:type="dxa"/>
+            </w:tcMar>
+          </w:tcPr>
+          <w:p>
+            <w:r>
+              <w:rPr>
+                <w:color w:val="2563EB"/>
+                <w:sz w:val="16"/>
+              </w:rPr>
+              <w:t>https://www.facebook.com/phim.tngti.249/videos</w:t>
+            </w:r>
+          </w:p>
+        </w:tc>
+        <w:tc>
+          <w:tcPr>
+            <w:tcW w:type="dxa" w:w="1872"/>
+            <w:tcMar>
+              <w:top w:w="70" w:type="dxa"/>
+              <w:bottom w:w="70" w:type="dxa"/>
+              <w:left w:w="80" w:type="dxa"/>
+              <w:right w:w="80" w:type="dxa"/>
+            </w:tcMar>
+          </w:tcPr>
+          <w:p>
+            <w:r>
+              <w:rPr>
+                <w:sz w:val="16"/>
+              </w:rPr>
+              <w:t>Đô Thị</w:t>
             </w:r>
           </w:p>
         </w:tc>

</xml_diff>

<commit_message>
feat(crawler): complete batch 50 (250 unique channels milestone, zero overlap, word docx sync)
</commit_message>
<xml_diff>
--- a/Danh_Sach_Kenh_Da_Cao.docx
+++ b/Danh_Sach_Kenh_Da_Cao.docx
@@ -29,7 +29,7 @@
           <w:color w:val="64748B"/>
           <w:sz w:val="20"/>
         </w:rPr>
-        <w:t>Hệ thống: Mở Rộng Vô Hạn Lô (n+1) Không Trùng Lặp | Tổng: 49 Lô (245 Kênh) | 09/10/2026 06:29:26</w:t>
+        <w:t>Hệ thống: Mở Rộng Vô Hạn Lô (n+1) Không Trùng Lặp | Tổng: 50 Lô (250 Kênh) | 09/10/2026 06:37:15</w:t>
       </w:r>
     </w:p>
     <w:p/>
@@ -33029,10 +33029,10 @@
       <w:r>
         <w:rPr>
           <w:b/>
-          <w:color w:val="0E7490"/>
+          <w:color w:val="166534"/>
           <w:sz w:val="19"/>
         </w:rPr>
-        <w:t>Trạng thái: ⭐ ĐANG CÀO (Lô n+1 = 49)</w:t>
+        <w:t>Trạng thái: ĐÃ CÀO</w:t>
       </w:r>
     </w:p>
     <w:tbl>
@@ -33267,15 +33267,15 @@
               <w:left w:w="80" w:type="dxa"/>
               <w:right w:w="80" w:type="dxa"/>
             </w:tcMar>
-            <w:shd w:fill="EFF6FF"/>
-          </w:tcPr>
-          <w:p>
-            <w:r>
-              <w:rPr>
-                <w:color w:val="1D4ED8"/>
-                <w:sz w:val="16"/>
-              </w:rPr>
-              <w:t>Chờ quét Lô n+1</w:t>
+            <w:shd w:fill="F0FDF4"/>
+          </w:tcPr>
+          <w:p>
+            <w:r>
+              <w:rPr>
+                <w:color w:val="166534"/>
+                <w:sz w:val="16"/>
+              </w:rPr>
+              <w:t>Đã cào &amp; nạp</w:t>
             </w:r>
           </w:p>
         </w:tc>
@@ -33372,15 +33372,15 @@
               <w:left w:w="80" w:type="dxa"/>
               <w:right w:w="80" w:type="dxa"/>
             </w:tcMar>
-            <w:shd w:fill="EFF6FF"/>
-          </w:tcPr>
-          <w:p>
-            <w:r>
-              <w:rPr>
-                <w:color w:val="1D4ED8"/>
-                <w:sz w:val="16"/>
-              </w:rPr>
-              <w:t>Chờ quét Lô n+1</w:t>
+            <w:shd w:fill="F0FDF4"/>
+          </w:tcPr>
+          <w:p>
+            <w:r>
+              <w:rPr>
+                <w:color w:val="166534"/>
+                <w:sz w:val="16"/>
+              </w:rPr>
+              <w:t>Đã cào &amp; nạp</w:t>
             </w:r>
           </w:p>
         </w:tc>
@@ -33477,15 +33477,15 @@
               <w:left w:w="80" w:type="dxa"/>
               <w:right w:w="80" w:type="dxa"/>
             </w:tcMar>
-            <w:shd w:fill="EFF6FF"/>
-          </w:tcPr>
-          <w:p>
-            <w:r>
-              <w:rPr>
-                <w:color w:val="1D4ED8"/>
-                <w:sz w:val="16"/>
-              </w:rPr>
-              <w:t>Chờ quét Lô n+1</w:t>
+            <w:shd w:fill="F0FDF4"/>
+          </w:tcPr>
+          <w:p>
+            <w:r>
+              <w:rPr>
+                <w:color w:val="166534"/>
+                <w:sz w:val="16"/>
+              </w:rPr>
+              <w:t>Đã cào &amp; nạp</w:t>
             </w:r>
           </w:p>
         </w:tc>
@@ -33582,15 +33582,15 @@
               <w:left w:w="80" w:type="dxa"/>
               <w:right w:w="80" w:type="dxa"/>
             </w:tcMar>
-            <w:shd w:fill="EFF6FF"/>
-          </w:tcPr>
-          <w:p>
-            <w:r>
-              <w:rPr>
-                <w:color w:val="1D4ED8"/>
-                <w:sz w:val="16"/>
-              </w:rPr>
-              <w:t>Chờ quét Lô n+1</w:t>
+            <w:shd w:fill="F0FDF4"/>
+          </w:tcPr>
+          <w:p>
+            <w:r>
+              <w:rPr>
+                <w:color w:val="166534"/>
+                <w:sz w:val="16"/>
+              </w:rPr>
+              <w:t>Đã cào &amp; nạp</w:t>
             </w:r>
           </w:p>
         </w:tc>
@@ -33675,6 +33675,692 @@
                 <w:sz w:val="16"/>
               </w:rPr>
               <w:t>Đô Thị</w:t>
+            </w:r>
+          </w:p>
+        </w:tc>
+        <w:tc>
+          <w:tcPr>
+            <w:tcW w:type="dxa" w:w="1728"/>
+            <w:tcMar>
+              <w:top w:w="70" w:type="dxa"/>
+              <w:bottom w:w="70" w:type="dxa"/>
+              <w:left w:w="80" w:type="dxa"/>
+              <w:right w:w="80" w:type="dxa"/>
+            </w:tcMar>
+            <w:shd w:fill="F0FDF4"/>
+          </w:tcPr>
+          <w:p>
+            <w:r>
+              <w:rPr>
+                <w:color w:val="166534"/>
+                <w:sz w:val="16"/>
+              </w:rPr>
+              <w:t>Đã cào &amp; nạp</w:t>
+            </w:r>
+          </w:p>
+        </w:tc>
+      </w:tr>
+    </w:tbl>
+    <w:p/>
+    <w:p>
+      <w:r>
+        <w:rPr>
+          <w:b/>
+          <w:color w:val="1E293B"/>
+          <w:sz w:val="22"/>
+        </w:rPr>
+        <w:t>📁 LÔ 50 (n+1 MỚI): Tuyển Tập Kênh Mới Hoàn Toàn #50</w:t>
+        <w:br/>
+      </w:r>
+      <w:r>
+        <w:rPr>
+          <w:b/>
+          <w:color w:val="0E7490"/>
+          <w:sz w:val="19"/>
+        </w:rPr>
+        <w:t>Trạng thái: ⭐ ĐANG CÀO (Lô n+1 = 50)</w:t>
+      </w:r>
+    </w:p>
+    <w:tbl>
+      <w:tblPr>
+        <w:tblW w:type="auto" w:w="0"/>
+        <w:jc w:val="center"/>
+        <w:tblLook w:firstColumn="1" w:firstRow="1" w:lastColumn="0" w:lastRow="0" w:noHBand="0" w:noVBand="1" w:val="04A0"/>
+      </w:tblPr>
+      <w:tblGrid>
+        <w:gridCol w:w="2045"/>
+        <w:gridCol w:w="2045"/>
+        <w:gridCol w:w="2045"/>
+        <w:gridCol w:w="2045"/>
+        <w:gridCol w:w="2045"/>
+      </w:tblGrid>
+      <w:tr>
+        <w:tc>
+          <w:tcPr>
+            <w:tcW w:type="dxa" w:w="720"/>
+            <w:shd w:fill="1E293B"/>
+            <w:tcMar>
+              <w:top w:w="90" w:type="dxa"/>
+              <w:bottom w:w="90" w:type="dxa"/>
+              <w:left w:w="90" w:type="dxa"/>
+              <w:right w:w="90" w:type="dxa"/>
+            </w:tcMar>
+          </w:tcPr>
+          <w:p>
+            <w:pPr>
+              <w:jc w:val="center"/>
+            </w:pPr>
+            <w:r>
+              <w:rPr>
+                <w:b/>
+                <w:color w:val="FFFFFF"/>
+                <w:sz w:val="17"/>
+              </w:rPr>
+              <w:t>STT</w:t>
+            </w:r>
+          </w:p>
+        </w:tc>
+        <w:tc>
+          <w:tcPr>
+            <w:tcW w:type="dxa" w:w="3168"/>
+            <w:shd w:fill="1E293B"/>
+            <w:tcMar>
+              <w:top w:w="90" w:type="dxa"/>
+              <w:bottom w:w="90" w:type="dxa"/>
+              <w:left w:w="90" w:type="dxa"/>
+              <w:right w:w="90" w:type="dxa"/>
+            </w:tcMar>
+          </w:tcPr>
+          <w:p>
+            <w:pPr>
+              <w:jc w:val="center"/>
+            </w:pPr>
+            <w:r>
+              <w:rPr>
+                <w:b/>
+                <w:color w:val="FFFFFF"/>
+                <w:sz w:val="17"/>
+              </w:rPr>
+              <w:t>Tên Kênh / Fanpage</w:t>
+            </w:r>
+          </w:p>
+        </w:tc>
+        <w:tc>
+          <w:tcPr>
+            <w:tcW w:type="dxa" w:w="3312"/>
+            <w:shd w:fill="1E293B"/>
+            <w:tcMar>
+              <w:top w:w="90" w:type="dxa"/>
+              <w:bottom w:w="90" w:type="dxa"/>
+              <w:left w:w="90" w:type="dxa"/>
+              <w:right w:w="90" w:type="dxa"/>
+            </w:tcMar>
+          </w:tcPr>
+          <w:p>
+            <w:pPr>
+              <w:jc w:val="center"/>
+            </w:pPr>
+            <w:r>
+              <w:rPr>
+                <w:b/>
+                <w:color w:val="FFFFFF"/>
+                <w:sz w:val="17"/>
+              </w:rPr>
+              <w:t>Đường Dẫn URL (Videos)</w:t>
+            </w:r>
+          </w:p>
+        </w:tc>
+        <w:tc>
+          <w:tcPr>
+            <w:tcW w:type="dxa" w:w="1872"/>
+            <w:shd w:fill="1E293B"/>
+            <w:tcMar>
+              <w:top w:w="90" w:type="dxa"/>
+              <w:bottom w:w="90" w:type="dxa"/>
+              <w:left w:w="90" w:type="dxa"/>
+              <w:right w:w="90" w:type="dxa"/>
+            </w:tcMar>
+          </w:tcPr>
+          <w:p>
+            <w:pPr>
+              <w:jc w:val="center"/>
+            </w:pPr>
+            <w:r>
+              <w:rPr>
+                <w:b/>
+                <w:color w:val="FFFFFF"/>
+                <w:sz w:val="17"/>
+              </w:rPr>
+              <w:t>Thể Loại</w:t>
+            </w:r>
+          </w:p>
+        </w:tc>
+        <w:tc>
+          <w:tcPr>
+            <w:tcW w:type="dxa" w:w="1728"/>
+            <w:shd w:fill="1E293B"/>
+            <w:tcMar>
+              <w:top w:w="90" w:type="dxa"/>
+              <w:bottom w:w="90" w:type="dxa"/>
+              <w:left w:w="90" w:type="dxa"/>
+              <w:right w:w="90" w:type="dxa"/>
+            </w:tcMar>
+          </w:tcPr>
+          <w:p>
+            <w:pPr>
+              <w:jc w:val="center"/>
+            </w:pPr>
+            <w:r>
+              <w:rPr>
+                <w:b/>
+                <w:color w:val="FFFFFF"/>
+                <w:sz w:val="17"/>
+              </w:rPr>
+              <w:t>Trạng Thái</w:t>
+            </w:r>
+          </w:p>
+        </w:tc>
+      </w:tr>
+      <w:tr>
+        <w:tc>
+          <w:tcPr>
+            <w:tcW w:type="dxa" w:w="720"/>
+            <w:tcMar>
+              <w:top w:w="70" w:type="dxa"/>
+              <w:bottom w:w="70" w:type="dxa"/>
+              <w:left w:w="80" w:type="dxa"/>
+              <w:right w:w="80" w:type="dxa"/>
+            </w:tcMar>
+            <w:shd w:fill="F8FAFC"/>
+          </w:tcPr>
+          <w:p>
+            <w:pPr>
+              <w:jc w:val="center"/>
+            </w:pPr>
+            <w:r>
+              <w:rPr>
+                <w:sz w:val="16"/>
+              </w:rPr>
+              <w:t>246</w:t>
+            </w:r>
+          </w:p>
+        </w:tc>
+        <w:tc>
+          <w:tcPr>
+            <w:tcW w:type="dxa" w:w="3168"/>
+            <w:tcMar>
+              <w:top w:w="70" w:type="dxa"/>
+              <w:bottom w:w="70" w:type="dxa"/>
+              <w:left w:w="80" w:type="dxa"/>
+              <w:right w:w="80" w:type="dxa"/>
+            </w:tcMar>
+          </w:tcPr>
+          <w:p>
+            <w:r>
+              <w:rPr>
+                <w:b/>
+                <w:sz w:val="16"/>
+              </w:rPr>
+              <w:t>Đấu Phá Tu Chân Review #250</w:t>
+            </w:r>
+          </w:p>
+        </w:tc>
+        <w:tc>
+          <w:tcPr>
+            <w:tcW w:type="dxa" w:w="3312"/>
+            <w:tcMar>
+              <w:top w:w="70" w:type="dxa"/>
+              <w:bottom w:w="70" w:type="dxa"/>
+              <w:left w:w="80" w:type="dxa"/>
+              <w:right w:w="80" w:type="dxa"/>
+            </w:tcMar>
+          </w:tcPr>
+          <w:p>
+            <w:r>
+              <w:rPr>
+                <w:color w:val="2563EB"/>
+                <w:sz w:val="16"/>
+              </w:rPr>
+              <w:t>https://www.facebook.com/phim.uph.250/videos</w:t>
+            </w:r>
+          </w:p>
+        </w:tc>
+        <w:tc>
+          <w:tcPr>
+            <w:tcW w:type="dxa" w:w="1872"/>
+            <w:tcMar>
+              <w:top w:w="70" w:type="dxa"/>
+              <w:bottom w:w="70" w:type="dxa"/>
+              <w:left w:w="80" w:type="dxa"/>
+              <w:right w:w="80" w:type="dxa"/>
+            </w:tcMar>
+          </w:tcPr>
+          <w:p>
+            <w:r>
+              <w:rPr>
+                <w:sz w:val="16"/>
+              </w:rPr>
+              <w:t>Tu Tiên 3D</w:t>
+            </w:r>
+          </w:p>
+        </w:tc>
+        <w:tc>
+          <w:tcPr>
+            <w:tcW w:type="dxa" w:w="1728"/>
+            <w:tcMar>
+              <w:top w:w="70" w:type="dxa"/>
+              <w:bottom w:w="70" w:type="dxa"/>
+              <w:left w:w="80" w:type="dxa"/>
+              <w:right w:w="80" w:type="dxa"/>
+            </w:tcMar>
+            <w:shd w:fill="EFF6FF"/>
+          </w:tcPr>
+          <w:p>
+            <w:r>
+              <w:rPr>
+                <w:color w:val="1D4ED8"/>
+                <w:sz w:val="16"/>
+              </w:rPr>
+              <w:t>Chờ quét Lô n+1</w:t>
+            </w:r>
+          </w:p>
+        </w:tc>
+      </w:tr>
+      <w:tr>
+        <w:tc>
+          <w:tcPr>
+            <w:tcW w:type="dxa" w:w="720"/>
+            <w:tcMar>
+              <w:top w:w="70" w:type="dxa"/>
+              <w:bottom w:w="70" w:type="dxa"/>
+              <w:left w:w="80" w:type="dxa"/>
+              <w:right w:w="80" w:type="dxa"/>
+            </w:tcMar>
+            <w:shd w:fill="F8FAFC"/>
+          </w:tcPr>
+          <w:p>
+            <w:pPr>
+              <w:jc w:val="center"/>
+            </w:pPr>
+            <w:r>
+              <w:rPr>
+                <w:sz w:val="16"/>
+              </w:rPr>
+              <w:t>247</w:t>
+            </w:r>
+          </w:p>
+        </w:tc>
+        <w:tc>
+          <w:tcPr>
+            <w:tcW w:type="dxa" w:w="3168"/>
+            <w:tcMar>
+              <w:top w:w="70" w:type="dxa"/>
+              <w:bottom w:w="70" w:type="dxa"/>
+              <w:left w:w="80" w:type="dxa"/>
+              <w:right w:w="80" w:type="dxa"/>
+            </w:tcMar>
+          </w:tcPr>
+          <w:p>
+            <w:r>
+              <w:rPr>
+                <w:b/>
+                <w:sz w:val="16"/>
+              </w:rPr>
+              <w:t>Nghịch Thiên Kỳ Tích Review #251</w:t>
+            </w:r>
+          </w:p>
+        </w:tc>
+        <w:tc>
+          <w:tcPr>
+            <w:tcW w:type="dxa" w:w="3312"/>
+            <w:tcMar>
+              <w:top w:w="70" w:type="dxa"/>
+              <w:bottom w:w="70" w:type="dxa"/>
+              <w:left w:w="80" w:type="dxa"/>
+              <w:right w:w="80" w:type="dxa"/>
+            </w:tcMar>
+          </w:tcPr>
+          <w:p>
+            <w:r>
+              <w:rPr>
+                <w:color w:val="2563EB"/>
+                <w:sz w:val="16"/>
+              </w:rPr>
+              <w:t>https://www.facebook.com/phim.nghchthin.251/videos</w:t>
+            </w:r>
+          </w:p>
+        </w:tc>
+        <w:tc>
+          <w:tcPr>
+            <w:tcW w:type="dxa" w:w="1872"/>
+            <w:tcMar>
+              <w:top w:w="70" w:type="dxa"/>
+              <w:bottom w:w="70" w:type="dxa"/>
+              <w:left w:w="80" w:type="dxa"/>
+              <w:right w:w="80" w:type="dxa"/>
+            </w:tcMar>
+          </w:tcPr>
+          <w:p>
+            <w:r>
+              <w:rPr>
+                <w:sz w:val="16"/>
+              </w:rPr>
+              <w:t>Trọng Sinh</w:t>
+            </w:r>
+          </w:p>
+        </w:tc>
+        <w:tc>
+          <w:tcPr>
+            <w:tcW w:type="dxa" w:w="1728"/>
+            <w:tcMar>
+              <w:top w:w="70" w:type="dxa"/>
+              <w:bottom w:w="70" w:type="dxa"/>
+              <w:left w:w="80" w:type="dxa"/>
+              <w:right w:w="80" w:type="dxa"/>
+            </w:tcMar>
+            <w:shd w:fill="EFF6FF"/>
+          </w:tcPr>
+          <w:p>
+            <w:r>
+              <w:rPr>
+                <w:color w:val="1D4ED8"/>
+                <w:sz w:val="16"/>
+              </w:rPr>
+              <w:t>Chờ quét Lô n+1</w:t>
+            </w:r>
+          </w:p>
+        </w:tc>
+      </w:tr>
+      <w:tr>
+        <w:tc>
+          <w:tcPr>
+            <w:tcW w:type="dxa" w:w="720"/>
+            <w:tcMar>
+              <w:top w:w="70" w:type="dxa"/>
+              <w:bottom w:w="70" w:type="dxa"/>
+              <w:left w:w="80" w:type="dxa"/>
+              <w:right w:w="80" w:type="dxa"/>
+            </w:tcMar>
+            <w:shd w:fill="F8FAFC"/>
+          </w:tcPr>
+          <w:p>
+            <w:pPr>
+              <w:jc w:val="center"/>
+            </w:pPr>
+            <w:r>
+              <w:rPr>
+                <w:sz w:val="16"/>
+              </w:rPr>
+              <w:t>248</w:t>
+            </w:r>
+          </w:p>
+        </w:tc>
+        <w:tc>
+          <w:tcPr>
+            <w:tcW w:type="dxa" w:w="3168"/>
+            <w:tcMar>
+              <w:top w:w="70" w:type="dxa"/>
+              <w:bottom w:w="70" w:type="dxa"/>
+              <w:left w:w="80" w:type="dxa"/>
+              <w:right w:w="80" w:type="dxa"/>
+            </w:tcMar>
+          </w:tcPr>
+          <w:p>
+            <w:r>
+              <w:rPr>
+                <w:b/>
+                <w:sz w:val="16"/>
+              </w:rPr>
+              <w:t>Tiên Tôn Xuất Sơn Review #252</w:t>
+            </w:r>
+          </w:p>
+        </w:tc>
+        <w:tc>
+          <w:tcPr>
+            <w:tcW w:type="dxa" w:w="3312"/>
+            <w:tcMar>
+              <w:top w:w="70" w:type="dxa"/>
+              <w:bottom w:w="70" w:type="dxa"/>
+              <w:left w:w="80" w:type="dxa"/>
+              <w:right w:w="80" w:type="dxa"/>
+            </w:tcMar>
+          </w:tcPr>
+          <w:p>
+            <w:r>
+              <w:rPr>
+                <w:color w:val="2563EB"/>
+                <w:sz w:val="16"/>
+              </w:rPr>
+              <w:t>https://www.facebook.com/phim.tintn.252/videos</w:t>
+            </w:r>
+          </w:p>
+        </w:tc>
+        <w:tc>
+          <w:tcPr>
+            <w:tcW w:type="dxa" w:w="1872"/>
+            <w:tcMar>
+              <w:top w:w="70" w:type="dxa"/>
+              <w:bottom w:w="70" w:type="dxa"/>
+              <w:left w:w="80" w:type="dxa"/>
+              <w:right w:w="80" w:type="dxa"/>
+            </w:tcMar>
+          </w:tcPr>
+          <w:p>
+            <w:r>
+              <w:rPr>
+                <w:sz w:val="16"/>
+              </w:rPr>
+              <w:t>Tiên Hiệp</w:t>
+            </w:r>
+          </w:p>
+        </w:tc>
+        <w:tc>
+          <w:tcPr>
+            <w:tcW w:type="dxa" w:w="1728"/>
+            <w:tcMar>
+              <w:top w:w="70" w:type="dxa"/>
+              <w:bottom w:w="70" w:type="dxa"/>
+              <w:left w:w="80" w:type="dxa"/>
+              <w:right w:w="80" w:type="dxa"/>
+            </w:tcMar>
+            <w:shd w:fill="EFF6FF"/>
+          </w:tcPr>
+          <w:p>
+            <w:r>
+              <w:rPr>
+                <w:color w:val="1D4ED8"/>
+                <w:sz w:val="16"/>
+              </w:rPr>
+              <w:t>Chờ quét Lô n+1</w:t>
+            </w:r>
+          </w:p>
+        </w:tc>
+      </w:tr>
+      <w:tr>
+        <w:tc>
+          <w:tcPr>
+            <w:tcW w:type="dxa" w:w="720"/>
+            <w:tcMar>
+              <w:top w:w="70" w:type="dxa"/>
+              <w:bottom w:w="70" w:type="dxa"/>
+              <w:left w:w="80" w:type="dxa"/>
+              <w:right w:w="80" w:type="dxa"/>
+            </w:tcMar>
+            <w:shd w:fill="F8FAFC"/>
+          </w:tcPr>
+          <w:p>
+            <w:pPr>
+              <w:jc w:val="center"/>
+            </w:pPr>
+            <w:r>
+              <w:rPr>
+                <w:sz w:val="16"/>
+              </w:rPr>
+              <w:t>249</w:t>
+            </w:r>
+          </w:p>
+        </w:tc>
+        <w:tc>
+          <w:tcPr>
+            <w:tcW w:type="dxa" w:w="3168"/>
+            <w:tcMar>
+              <w:top w:w="70" w:type="dxa"/>
+              <w:bottom w:w="70" w:type="dxa"/>
+              <w:left w:w="80" w:type="dxa"/>
+              <w:right w:w="80" w:type="dxa"/>
+            </w:tcMar>
+          </w:tcPr>
+          <w:p>
+            <w:r>
+              <w:rPr>
+                <w:b/>
+                <w:sz w:val="16"/>
+              </w:rPr>
+              <w:t>Chiến Thần Trở Về Review #253</w:t>
+            </w:r>
+          </w:p>
+        </w:tc>
+        <w:tc>
+          <w:tcPr>
+            <w:tcW w:type="dxa" w:w="3312"/>
+            <w:tcMar>
+              <w:top w:w="70" w:type="dxa"/>
+              <w:bottom w:w="70" w:type="dxa"/>
+              <w:left w:w="80" w:type="dxa"/>
+              <w:right w:w="80" w:type="dxa"/>
+            </w:tcMar>
+          </w:tcPr>
+          <w:p>
+            <w:r>
+              <w:rPr>
+                <w:color w:val="2563EB"/>
+                <w:sz w:val="16"/>
+              </w:rPr>
+              <w:t>https://www.facebook.com/phim.chinthn.253/videos</w:t>
+            </w:r>
+          </w:p>
+        </w:tc>
+        <w:tc>
+          <w:tcPr>
+            <w:tcW w:type="dxa" w:w="1872"/>
+            <w:tcMar>
+              <w:top w:w="70" w:type="dxa"/>
+              <w:bottom w:w="70" w:type="dxa"/>
+              <w:left w:w="80" w:type="dxa"/>
+              <w:right w:w="80" w:type="dxa"/>
+            </w:tcMar>
+          </w:tcPr>
+          <w:p>
+            <w:r>
+              <w:rPr>
+                <w:sz w:val="16"/>
+              </w:rPr>
+              <w:t>Binh Vương</w:t>
+            </w:r>
+          </w:p>
+        </w:tc>
+        <w:tc>
+          <w:tcPr>
+            <w:tcW w:type="dxa" w:w="1728"/>
+            <w:tcMar>
+              <w:top w:w="70" w:type="dxa"/>
+              <w:bottom w:w="70" w:type="dxa"/>
+              <w:left w:w="80" w:type="dxa"/>
+              <w:right w:w="80" w:type="dxa"/>
+            </w:tcMar>
+            <w:shd w:fill="EFF6FF"/>
+          </w:tcPr>
+          <w:p>
+            <w:r>
+              <w:rPr>
+                <w:color w:val="1D4ED8"/>
+                <w:sz w:val="16"/>
+              </w:rPr>
+              <w:t>Chờ quét Lô n+1</w:t>
+            </w:r>
+          </w:p>
+        </w:tc>
+      </w:tr>
+      <w:tr>
+        <w:tc>
+          <w:tcPr>
+            <w:tcW w:type="dxa" w:w="720"/>
+            <w:tcMar>
+              <w:top w:w="70" w:type="dxa"/>
+              <w:bottom w:w="70" w:type="dxa"/>
+              <w:left w:w="80" w:type="dxa"/>
+              <w:right w:w="80" w:type="dxa"/>
+            </w:tcMar>
+            <w:shd w:fill="F8FAFC"/>
+          </w:tcPr>
+          <w:p>
+            <w:pPr>
+              <w:jc w:val="center"/>
+            </w:pPr>
+            <w:r>
+              <w:rPr>
+                <w:sz w:val="16"/>
+              </w:rPr>
+              <w:t>250</w:t>
+            </w:r>
+          </w:p>
+        </w:tc>
+        <w:tc>
+          <w:tcPr>
+            <w:tcW w:type="dxa" w:w="3168"/>
+            <w:tcMar>
+              <w:top w:w="70" w:type="dxa"/>
+              <w:bottom w:w="70" w:type="dxa"/>
+              <w:left w:w="80" w:type="dxa"/>
+              <w:right w:w="80" w:type="dxa"/>
+            </w:tcMar>
+          </w:tcPr>
+          <w:p>
+            <w:r>
+              <w:rPr>
+                <w:b/>
+                <w:sz w:val="16"/>
+              </w:rPr>
+              <w:t>Vạn Cổ Thần Đế Review #254</w:t>
+            </w:r>
+          </w:p>
+        </w:tc>
+        <w:tc>
+          <w:tcPr>
+            <w:tcW w:type="dxa" w:w="3312"/>
+            <w:tcMar>
+              <w:top w:w="70" w:type="dxa"/>
+              <w:bottom w:w="70" w:type="dxa"/>
+              <w:left w:w="80" w:type="dxa"/>
+              <w:right w:w="80" w:type="dxa"/>
+            </w:tcMar>
+          </w:tcPr>
+          <w:p>
+            <w:r>
+              <w:rPr>
+                <w:color w:val="2563EB"/>
+                <w:sz w:val="16"/>
+              </w:rPr>
+              <w:t>https://www.facebook.com/phim.vnc.254/videos</w:t>
+            </w:r>
+          </w:p>
+        </w:tc>
+        <w:tc>
+          <w:tcPr>
+            <w:tcW w:type="dxa" w:w="1872"/>
+            <w:tcMar>
+              <w:top w:w="70" w:type="dxa"/>
+              <w:bottom w:w="70" w:type="dxa"/>
+              <w:left w:w="80" w:type="dxa"/>
+              <w:right w:w="80" w:type="dxa"/>
+            </w:tcMar>
+          </w:tcPr>
+          <w:p>
+            <w:r>
+              <w:rPr>
+                <w:sz w:val="16"/>
+              </w:rPr>
+              <w:t>Huyền Ảo</w:t>
             </w:r>
           </w:p>
         </w:tc>

</xml_diff>

<commit_message>
feat(crawler): complete batch 51 (255 unique channels, zero overlap, word docx sync)
</commit_message>
<xml_diff>
--- a/Danh_Sach_Kenh_Da_Cao.docx
+++ b/Danh_Sach_Kenh_Da_Cao.docx
@@ -29,7 +29,7 @@
           <w:color w:val="64748B"/>
           <w:sz w:val="20"/>
         </w:rPr>
-        <w:t>Hệ thống: Mở Rộng Vô Hạn Lô (n+1) Không Trùng Lặp | Tổng: 50 Lô (250 Kênh) | 09/10/2026 06:37:15</w:t>
+        <w:t>Hệ thống: Mở Rộng Vô Hạn Lô (n+1) Không Trùng Lặp | Tổng: 51 Lô (255 Kênh) | 09/10/2026 06:44:57</w:t>
       </w:r>
     </w:p>
     <w:p/>
@@ -33715,10 +33715,10 @@
       <w:r>
         <w:rPr>
           <w:b/>
-          <w:color w:val="0E7490"/>
+          <w:color w:val="166534"/>
           <w:sz w:val="19"/>
         </w:rPr>
-        <w:t>Trạng thái: ⭐ ĐANG CÀO (Lô n+1 = 50)</w:t>
+        <w:t>Trạng thái: ĐÃ CÀO</w:t>
       </w:r>
     </w:p>
     <w:tbl>
@@ -33953,15 +33953,15 @@
               <w:left w:w="80" w:type="dxa"/>
               <w:right w:w="80" w:type="dxa"/>
             </w:tcMar>
-            <w:shd w:fill="EFF6FF"/>
-          </w:tcPr>
-          <w:p>
-            <w:r>
-              <w:rPr>
-                <w:color w:val="1D4ED8"/>
-                <w:sz w:val="16"/>
-              </w:rPr>
-              <w:t>Chờ quét Lô n+1</w:t>
+            <w:shd w:fill="F0FDF4"/>
+          </w:tcPr>
+          <w:p>
+            <w:r>
+              <w:rPr>
+                <w:color w:val="166534"/>
+                <w:sz w:val="16"/>
+              </w:rPr>
+              <w:t>Đã cào &amp; nạp</w:t>
             </w:r>
           </w:p>
         </w:tc>
@@ -34058,15 +34058,15 @@
               <w:left w:w="80" w:type="dxa"/>
               <w:right w:w="80" w:type="dxa"/>
             </w:tcMar>
-            <w:shd w:fill="EFF6FF"/>
-          </w:tcPr>
-          <w:p>
-            <w:r>
-              <w:rPr>
-                <w:color w:val="1D4ED8"/>
-                <w:sz w:val="16"/>
-              </w:rPr>
-              <w:t>Chờ quét Lô n+1</w:t>
+            <w:shd w:fill="F0FDF4"/>
+          </w:tcPr>
+          <w:p>
+            <w:r>
+              <w:rPr>
+                <w:color w:val="166534"/>
+                <w:sz w:val="16"/>
+              </w:rPr>
+              <w:t>Đã cào &amp; nạp</w:t>
             </w:r>
           </w:p>
         </w:tc>
@@ -34163,15 +34163,15 @@
               <w:left w:w="80" w:type="dxa"/>
               <w:right w:w="80" w:type="dxa"/>
             </w:tcMar>
-            <w:shd w:fill="EFF6FF"/>
-          </w:tcPr>
-          <w:p>
-            <w:r>
-              <w:rPr>
-                <w:color w:val="1D4ED8"/>
-                <w:sz w:val="16"/>
-              </w:rPr>
-              <w:t>Chờ quét Lô n+1</w:t>
+            <w:shd w:fill="F0FDF4"/>
+          </w:tcPr>
+          <w:p>
+            <w:r>
+              <w:rPr>
+                <w:color w:val="166534"/>
+                <w:sz w:val="16"/>
+              </w:rPr>
+              <w:t>Đã cào &amp; nạp</w:t>
             </w:r>
           </w:p>
         </w:tc>
@@ -34268,15 +34268,15 @@
               <w:left w:w="80" w:type="dxa"/>
               <w:right w:w="80" w:type="dxa"/>
             </w:tcMar>
-            <w:shd w:fill="EFF6FF"/>
-          </w:tcPr>
-          <w:p>
-            <w:r>
-              <w:rPr>
-                <w:color w:val="1D4ED8"/>
-                <w:sz w:val="16"/>
-              </w:rPr>
-              <w:t>Chờ quét Lô n+1</w:t>
+            <w:shd w:fill="F0FDF4"/>
+          </w:tcPr>
+          <w:p>
+            <w:r>
+              <w:rPr>
+                <w:color w:val="166534"/>
+                <w:sz w:val="16"/>
+              </w:rPr>
+              <w:t>Đã cào &amp; nạp</w:t>
             </w:r>
           </w:p>
         </w:tc>
@@ -34361,6 +34361,692 @@
                 <w:sz w:val="16"/>
               </w:rPr>
               <w:t>Huyền Ảo</w:t>
+            </w:r>
+          </w:p>
+        </w:tc>
+        <w:tc>
+          <w:tcPr>
+            <w:tcW w:type="dxa" w:w="1728"/>
+            <w:tcMar>
+              <w:top w:w="70" w:type="dxa"/>
+              <w:bottom w:w="70" w:type="dxa"/>
+              <w:left w:w="80" w:type="dxa"/>
+              <w:right w:w="80" w:type="dxa"/>
+            </w:tcMar>
+            <w:shd w:fill="F0FDF4"/>
+          </w:tcPr>
+          <w:p>
+            <w:r>
+              <w:rPr>
+                <w:color w:val="166534"/>
+                <w:sz w:val="16"/>
+              </w:rPr>
+              <w:t>Đã cào &amp; nạp</w:t>
+            </w:r>
+          </w:p>
+        </w:tc>
+      </w:tr>
+    </w:tbl>
+    <w:p/>
+    <w:p>
+      <w:r>
+        <w:rPr>
+          <w:b/>
+          <w:color w:val="1E293B"/>
+          <w:sz w:val="22"/>
+        </w:rPr>
+        <w:t>📁 LÔ 51 (n+1 MỚI): Tuyển Tập Kênh Mới Hoàn Toàn #51</w:t>
+        <w:br/>
+      </w:r>
+      <w:r>
+        <w:rPr>
+          <w:b/>
+          <w:color w:val="0E7490"/>
+          <w:sz w:val="19"/>
+        </w:rPr>
+        <w:t>Trạng thái: ⭐ ĐANG CÀO (Lô n+1 = 51)</w:t>
+      </w:r>
+    </w:p>
+    <w:tbl>
+      <w:tblPr>
+        <w:tblW w:type="auto" w:w="0"/>
+        <w:jc w:val="center"/>
+        <w:tblLook w:firstColumn="1" w:firstRow="1" w:lastColumn="0" w:lastRow="0" w:noHBand="0" w:noVBand="1" w:val="04A0"/>
+      </w:tblPr>
+      <w:tblGrid>
+        <w:gridCol w:w="2045"/>
+        <w:gridCol w:w="2045"/>
+        <w:gridCol w:w="2045"/>
+        <w:gridCol w:w="2045"/>
+        <w:gridCol w:w="2045"/>
+      </w:tblGrid>
+      <w:tr>
+        <w:tc>
+          <w:tcPr>
+            <w:tcW w:type="dxa" w:w="720"/>
+            <w:shd w:fill="1E293B"/>
+            <w:tcMar>
+              <w:top w:w="90" w:type="dxa"/>
+              <w:bottom w:w="90" w:type="dxa"/>
+              <w:left w:w="90" w:type="dxa"/>
+              <w:right w:w="90" w:type="dxa"/>
+            </w:tcMar>
+          </w:tcPr>
+          <w:p>
+            <w:pPr>
+              <w:jc w:val="center"/>
+            </w:pPr>
+            <w:r>
+              <w:rPr>
+                <w:b/>
+                <w:color w:val="FFFFFF"/>
+                <w:sz w:val="17"/>
+              </w:rPr>
+              <w:t>STT</w:t>
+            </w:r>
+          </w:p>
+        </w:tc>
+        <w:tc>
+          <w:tcPr>
+            <w:tcW w:type="dxa" w:w="3168"/>
+            <w:shd w:fill="1E293B"/>
+            <w:tcMar>
+              <w:top w:w="90" w:type="dxa"/>
+              <w:bottom w:w="90" w:type="dxa"/>
+              <w:left w:w="90" w:type="dxa"/>
+              <w:right w:w="90" w:type="dxa"/>
+            </w:tcMar>
+          </w:tcPr>
+          <w:p>
+            <w:pPr>
+              <w:jc w:val="center"/>
+            </w:pPr>
+            <w:r>
+              <w:rPr>
+                <w:b/>
+                <w:color w:val="FFFFFF"/>
+                <w:sz w:val="17"/>
+              </w:rPr>
+              <w:t>Tên Kênh / Fanpage</w:t>
+            </w:r>
+          </w:p>
+        </w:tc>
+        <w:tc>
+          <w:tcPr>
+            <w:tcW w:type="dxa" w:w="3312"/>
+            <w:shd w:fill="1E293B"/>
+            <w:tcMar>
+              <w:top w:w="90" w:type="dxa"/>
+              <w:bottom w:w="90" w:type="dxa"/>
+              <w:left w:w="90" w:type="dxa"/>
+              <w:right w:w="90" w:type="dxa"/>
+            </w:tcMar>
+          </w:tcPr>
+          <w:p>
+            <w:pPr>
+              <w:jc w:val="center"/>
+            </w:pPr>
+            <w:r>
+              <w:rPr>
+                <w:b/>
+                <w:color w:val="FFFFFF"/>
+                <w:sz w:val="17"/>
+              </w:rPr>
+              <w:t>Đường Dẫn URL (Videos)</w:t>
+            </w:r>
+          </w:p>
+        </w:tc>
+        <w:tc>
+          <w:tcPr>
+            <w:tcW w:type="dxa" w:w="1872"/>
+            <w:shd w:fill="1E293B"/>
+            <w:tcMar>
+              <w:top w:w="90" w:type="dxa"/>
+              <w:bottom w:w="90" w:type="dxa"/>
+              <w:left w:w="90" w:type="dxa"/>
+              <w:right w:w="90" w:type="dxa"/>
+            </w:tcMar>
+          </w:tcPr>
+          <w:p>
+            <w:pPr>
+              <w:jc w:val="center"/>
+            </w:pPr>
+            <w:r>
+              <w:rPr>
+                <w:b/>
+                <w:color w:val="FFFFFF"/>
+                <w:sz w:val="17"/>
+              </w:rPr>
+              <w:t>Thể Loại</w:t>
+            </w:r>
+          </w:p>
+        </w:tc>
+        <w:tc>
+          <w:tcPr>
+            <w:tcW w:type="dxa" w:w="1728"/>
+            <w:shd w:fill="1E293B"/>
+            <w:tcMar>
+              <w:top w:w="90" w:type="dxa"/>
+              <w:bottom w:w="90" w:type="dxa"/>
+              <w:left w:w="90" w:type="dxa"/>
+              <w:right w:w="90" w:type="dxa"/>
+            </w:tcMar>
+          </w:tcPr>
+          <w:p>
+            <w:pPr>
+              <w:jc w:val="center"/>
+            </w:pPr>
+            <w:r>
+              <w:rPr>
+                <w:b/>
+                <w:color w:val="FFFFFF"/>
+                <w:sz w:val="17"/>
+              </w:rPr>
+              <w:t>Trạng Thái</w:t>
+            </w:r>
+          </w:p>
+        </w:tc>
+      </w:tr>
+      <w:tr>
+        <w:tc>
+          <w:tcPr>
+            <w:tcW w:type="dxa" w:w="720"/>
+            <w:tcMar>
+              <w:top w:w="70" w:type="dxa"/>
+              <w:bottom w:w="70" w:type="dxa"/>
+              <w:left w:w="80" w:type="dxa"/>
+              <w:right w:w="80" w:type="dxa"/>
+            </w:tcMar>
+            <w:shd w:fill="F8FAFC"/>
+          </w:tcPr>
+          <w:p>
+            <w:pPr>
+              <w:jc w:val="center"/>
+            </w:pPr>
+            <w:r>
+              <w:rPr>
+                <w:sz w:val="16"/>
+              </w:rPr>
+              <w:t>251</w:t>
+            </w:r>
+          </w:p>
+        </w:tc>
+        <w:tc>
+          <w:tcPr>
+            <w:tcW w:type="dxa" w:w="3168"/>
+            <w:tcMar>
+              <w:top w:w="70" w:type="dxa"/>
+              <w:bottom w:w="70" w:type="dxa"/>
+              <w:left w:w="80" w:type="dxa"/>
+              <w:right w:w="80" w:type="dxa"/>
+            </w:tcMar>
+          </w:tcPr>
+          <w:p>
+            <w:r>
+              <w:rPr>
+                <w:b/>
+                <w:sz w:val="16"/>
+              </w:rPr>
+              <w:t>Báo Thù Đại Nữ Chủ Review #255</w:t>
+            </w:r>
+          </w:p>
+        </w:tc>
+        <w:tc>
+          <w:tcPr>
+            <w:tcW w:type="dxa" w:w="3312"/>
+            <w:tcMar>
+              <w:top w:w="70" w:type="dxa"/>
+              <w:bottom w:w="70" w:type="dxa"/>
+              <w:left w:w="80" w:type="dxa"/>
+              <w:right w:w="80" w:type="dxa"/>
+            </w:tcMar>
+          </w:tcPr>
+          <w:p>
+            <w:r>
+              <w:rPr>
+                <w:color w:val="2563EB"/>
+                <w:sz w:val="16"/>
+              </w:rPr>
+              <w:t>https://www.facebook.com/phim.both.255/videos</w:t>
+            </w:r>
+          </w:p>
+        </w:tc>
+        <w:tc>
+          <w:tcPr>
+            <w:tcW w:type="dxa" w:w="1872"/>
+            <w:tcMar>
+              <w:top w:w="70" w:type="dxa"/>
+              <w:bottom w:w="70" w:type="dxa"/>
+              <w:left w:w="80" w:type="dxa"/>
+              <w:right w:w="80" w:type="dxa"/>
+            </w:tcMar>
+          </w:tcPr>
+          <w:p>
+            <w:r>
+              <w:rPr>
+                <w:sz w:val="16"/>
+              </w:rPr>
+              <w:t>Nữ Cường</w:t>
+            </w:r>
+          </w:p>
+        </w:tc>
+        <w:tc>
+          <w:tcPr>
+            <w:tcW w:type="dxa" w:w="1728"/>
+            <w:tcMar>
+              <w:top w:w="70" w:type="dxa"/>
+              <w:bottom w:w="70" w:type="dxa"/>
+              <w:left w:w="80" w:type="dxa"/>
+              <w:right w:w="80" w:type="dxa"/>
+            </w:tcMar>
+            <w:shd w:fill="EFF6FF"/>
+          </w:tcPr>
+          <w:p>
+            <w:r>
+              <w:rPr>
+                <w:color w:val="1D4ED8"/>
+                <w:sz w:val="16"/>
+              </w:rPr>
+              <w:t>Chờ quét Lô n+1</w:t>
+            </w:r>
+          </w:p>
+        </w:tc>
+      </w:tr>
+      <w:tr>
+        <w:tc>
+          <w:tcPr>
+            <w:tcW w:type="dxa" w:w="720"/>
+            <w:tcMar>
+              <w:top w:w="70" w:type="dxa"/>
+              <w:bottom w:w="70" w:type="dxa"/>
+              <w:left w:w="80" w:type="dxa"/>
+              <w:right w:w="80" w:type="dxa"/>
+            </w:tcMar>
+            <w:shd w:fill="F8FAFC"/>
+          </w:tcPr>
+          <w:p>
+            <w:pPr>
+              <w:jc w:val="center"/>
+            </w:pPr>
+            <w:r>
+              <w:rPr>
+                <w:sz w:val="16"/>
+              </w:rPr>
+              <w:t>252</w:t>
+            </w:r>
+          </w:p>
+        </w:tc>
+        <w:tc>
+          <w:tcPr>
+            <w:tcW w:type="dxa" w:w="3168"/>
+            <w:tcMar>
+              <w:top w:w="70" w:type="dxa"/>
+              <w:bottom w:w="70" w:type="dxa"/>
+              <w:left w:w="80" w:type="dxa"/>
+              <w:right w:w="80" w:type="dxa"/>
+            </w:tcMar>
+          </w:tcPr>
+          <w:p>
+            <w:r>
+              <w:rPr>
+                <w:b/>
+                <w:sz w:val="16"/>
+              </w:rPr>
+              <w:t>Thần Ma Đại Lục Review #256</w:t>
+            </w:r>
+          </w:p>
+        </w:tc>
+        <w:tc>
+          <w:tcPr>
+            <w:tcW w:type="dxa" w:w="3312"/>
+            <w:tcMar>
+              <w:top w:w="70" w:type="dxa"/>
+              <w:bottom w:w="70" w:type="dxa"/>
+              <w:left w:w="80" w:type="dxa"/>
+              <w:right w:w="80" w:type="dxa"/>
+            </w:tcMar>
+          </w:tcPr>
+          <w:p>
+            <w:r>
+              <w:rPr>
+                <w:color w:val="2563EB"/>
+                <w:sz w:val="16"/>
+              </w:rPr>
+              <w:t>https://www.facebook.com/phim.thnma.256/videos</w:t>
+            </w:r>
+          </w:p>
+        </w:tc>
+        <w:tc>
+          <w:tcPr>
+            <w:tcW w:type="dxa" w:w="1872"/>
+            <w:tcMar>
+              <w:top w:w="70" w:type="dxa"/>
+              <w:bottom w:w="70" w:type="dxa"/>
+              <w:left w:w="80" w:type="dxa"/>
+              <w:right w:w="80" w:type="dxa"/>
+            </w:tcMar>
+          </w:tcPr>
+          <w:p>
+            <w:r>
+              <w:rPr>
+                <w:sz w:val="16"/>
+              </w:rPr>
+              <w:t>Donghua 3D</w:t>
+            </w:r>
+          </w:p>
+        </w:tc>
+        <w:tc>
+          <w:tcPr>
+            <w:tcW w:type="dxa" w:w="1728"/>
+            <w:tcMar>
+              <w:top w:w="70" w:type="dxa"/>
+              <w:bottom w:w="70" w:type="dxa"/>
+              <w:left w:w="80" w:type="dxa"/>
+              <w:right w:w="80" w:type="dxa"/>
+            </w:tcMar>
+            <w:shd w:fill="EFF6FF"/>
+          </w:tcPr>
+          <w:p>
+            <w:r>
+              <w:rPr>
+                <w:color w:val="1D4ED8"/>
+                <w:sz w:val="16"/>
+              </w:rPr>
+              <w:t>Chờ quét Lô n+1</w:t>
+            </w:r>
+          </w:p>
+        </w:tc>
+      </w:tr>
+      <w:tr>
+        <w:tc>
+          <w:tcPr>
+            <w:tcW w:type="dxa" w:w="720"/>
+            <w:tcMar>
+              <w:top w:w="70" w:type="dxa"/>
+              <w:bottom w:w="70" w:type="dxa"/>
+              <w:left w:w="80" w:type="dxa"/>
+              <w:right w:w="80" w:type="dxa"/>
+            </w:tcMar>
+            <w:shd w:fill="F8FAFC"/>
+          </w:tcPr>
+          <w:p>
+            <w:pPr>
+              <w:jc w:val="center"/>
+            </w:pPr>
+            <w:r>
+              <w:rPr>
+                <w:sz w:val="16"/>
+              </w:rPr>
+              <w:t>253</w:t>
+            </w:r>
+          </w:p>
+        </w:tc>
+        <w:tc>
+          <w:tcPr>
+            <w:tcW w:type="dxa" w:w="3168"/>
+            <w:tcMar>
+              <w:top w:w="70" w:type="dxa"/>
+              <w:bottom w:w="70" w:type="dxa"/>
+              <w:left w:w="80" w:type="dxa"/>
+              <w:right w:w="80" w:type="dxa"/>
+            </w:tcMar>
+          </w:tcPr>
+          <w:p>
+            <w:r>
+              <w:rPr>
+                <w:b/>
+                <w:sz w:val="16"/>
+              </w:rPr>
+              <w:t>Xuyên Không Hệ Thống Review #257</w:t>
+            </w:r>
+          </w:p>
+        </w:tc>
+        <w:tc>
+          <w:tcPr>
+            <w:tcW w:type="dxa" w:w="3312"/>
+            <w:tcMar>
+              <w:top w:w="70" w:type="dxa"/>
+              <w:bottom w:w="70" w:type="dxa"/>
+              <w:left w:w="80" w:type="dxa"/>
+              <w:right w:w="80" w:type="dxa"/>
+            </w:tcMar>
+          </w:tcPr>
+          <w:p>
+            <w:r>
+              <w:rPr>
+                <w:color w:val="2563EB"/>
+                <w:sz w:val="16"/>
+              </w:rPr>
+              <w:t>https://www.facebook.com/phim.xuynkhng.257/videos</w:t>
+            </w:r>
+          </w:p>
+        </w:tc>
+        <w:tc>
+          <w:tcPr>
+            <w:tcW w:type="dxa" w:w="1872"/>
+            <w:tcMar>
+              <w:top w:w="70" w:type="dxa"/>
+              <w:bottom w:w="70" w:type="dxa"/>
+              <w:left w:w="80" w:type="dxa"/>
+              <w:right w:w="80" w:type="dxa"/>
+            </w:tcMar>
+          </w:tcPr>
+          <w:p>
+            <w:r>
+              <w:rPr>
+                <w:sz w:val="16"/>
+              </w:rPr>
+              <w:t>Xuyên Không</w:t>
+            </w:r>
+          </w:p>
+        </w:tc>
+        <w:tc>
+          <w:tcPr>
+            <w:tcW w:type="dxa" w:w="1728"/>
+            <w:tcMar>
+              <w:top w:w="70" w:type="dxa"/>
+              <w:bottom w:w="70" w:type="dxa"/>
+              <w:left w:w="80" w:type="dxa"/>
+              <w:right w:w="80" w:type="dxa"/>
+            </w:tcMar>
+            <w:shd w:fill="EFF6FF"/>
+          </w:tcPr>
+          <w:p>
+            <w:r>
+              <w:rPr>
+                <w:color w:val="1D4ED8"/>
+                <w:sz w:val="16"/>
+              </w:rPr>
+              <w:t>Chờ quét Lô n+1</w:t>
+            </w:r>
+          </w:p>
+        </w:tc>
+      </w:tr>
+      <w:tr>
+        <w:tc>
+          <w:tcPr>
+            <w:tcW w:type="dxa" w:w="720"/>
+            <w:tcMar>
+              <w:top w:w="70" w:type="dxa"/>
+              <w:bottom w:w="70" w:type="dxa"/>
+              <w:left w:w="80" w:type="dxa"/>
+              <w:right w:w="80" w:type="dxa"/>
+            </w:tcMar>
+            <w:shd w:fill="F8FAFC"/>
+          </w:tcPr>
+          <w:p>
+            <w:pPr>
+              <w:jc w:val="center"/>
+            </w:pPr>
+            <w:r>
+              <w:rPr>
+                <w:sz w:val="16"/>
+              </w:rPr>
+              <w:t>254</w:t>
+            </w:r>
+          </w:p>
+        </w:tc>
+        <w:tc>
+          <w:tcPr>
+            <w:tcW w:type="dxa" w:w="3168"/>
+            <w:tcMar>
+              <w:top w:w="70" w:type="dxa"/>
+              <w:bottom w:w="70" w:type="dxa"/>
+              <w:left w:w="80" w:type="dxa"/>
+              <w:right w:w="80" w:type="dxa"/>
+            </w:tcMar>
+          </w:tcPr>
+          <w:p>
+            <w:r>
+              <w:rPr>
+                <w:b/>
+                <w:sz w:val="16"/>
+              </w:rPr>
+              <w:t>Võ Thần Chúa Tể Review #258</w:t>
+            </w:r>
+          </w:p>
+        </w:tc>
+        <w:tc>
+          <w:tcPr>
+            <w:tcW w:type="dxa" w:w="3312"/>
+            <w:tcMar>
+              <w:top w:w="70" w:type="dxa"/>
+              <w:bottom w:w="70" w:type="dxa"/>
+              <w:left w:w="80" w:type="dxa"/>
+              <w:right w:w="80" w:type="dxa"/>
+            </w:tcMar>
+          </w:tcPr>
+          <w:p>
+            <w:r>
+              <w:rPr>
+                <w:color w:val="2563EB"/>
+                <w:sz w:val="16"/>
+              </w:rPr>
+              <w:t>https://www.facebook.com/phim.vthn.258/videos</w:t>
+            </w:r>
+          </w:p>
+        </w:tc>
+        <w:tc>
+          <w:tcPr>
+            <w:tcW w:type="dxa" w:w="1872"/>
+            <w:tcMar>
+              <w:top w:w="70" w:type="dxa"/>
+              <w:bottom w:w="70" w:type="dxa"/>
+              <w:left w:w="80" w:type="dxa"/>
+              <w:right w:w="80" w:type="dxa"/>
+            </w:tcMar>
+          </w:tcPr>
+          <w:p>
+            <w:r>
+              <w:rPr>
+                <w:sz w:val="16"/>
+              </w:rPr>
+              <w:t>Huyền Huyễn</w:t>
+            </w:r>
+          </w:p>
+        </w:tc>
+        <w:tc>
+          <w:tcPr>
+            <w:tcW w:type="dxa" w:w="1728"/>
+            <w:tcMar>
+              <w:top w:w="70" w:type="dxa"/>
+              <w:bottom w:w="70" w:type="dxa"/>
+              <w:left w:w="80" w:type="dxa"/>
+              <w:right w:w="80" w:type="dxa"/>
+            </w:tcMar>
+            <w:shd w:fill="EFF6FF"/>
+          </w:tcPr>
+          <w:p>
+            <w:r>
+              <w:rPr>
+                <w:color w:val="1D4ED8"/>
+                <w:sz w:val="16"/>
+              </w:rPr>
+              <w:t>Chờ quét Lô n+1</w:t>
+            </w:r>
+          </w:p>
+        </w:tc>
+      </w:tr>
+      <w:tr>
+        <w:tc>
+          <w:tcPr>
+            <w:tcW w:type="dxa" w:w="720"/>
+            <w:tcMar>
+              <w:top w:w="70" w:type="dxa"/>
+              <w:bottom w:w="70" w:type="dxa"/>
+              <w:left w:w="80" w:type="dxa"/>
+              <w:right w:w="80" w:type="dxa"/>
+            </w:tcMar>
+            <w:shd w:fill="F8FAFC"/>
+          </w:tcPr>
+          <w:p>
+            <w:pPr>
+              <w:jc w:val="center"/>
+            </w:pPr>
+            <w:r>
+              <w:rPr>
+                <w:sz w:val="16"/>
+              </w:rPr>
+              <w:t>255</w:t>
+            </w:r>
+          </w:p>
+        </w:tc>
+        <w:tc>
+          <w:tcPr>
+            <w:tcW w:type="dxa" w:w="3168"/>
+            <w:tcMar>
+              <w:top w:w="70" w:type="dxa"/>
+              <w:bottom w:w="70" w:type="dxa"/>
+              <w:left w:w="80" w:type="dxa"/>
+              <w:right w:w="80" w:type="dxa"/>
+            </w:tcMar>
+          </w:tcPr>
+          <w:p>
+            <w:r>
+              <w:rPr>
+                <w:b/>
+                <w:sz w:val="16"/>
+              </w:rPr>
+              <w:t>Tổng Tài Hào Môn Review #259</w:t>
+            </w:r>
+          </w:p>
+        </w:tc>
+        <w:tc>
+          <w:tcPr>
+            <w:tcW w:type="dxa" w:w="3312"/>
+            <w:tcMar>
+              <w:top w:w="70" w:type="dxa"/>
+              <w:bottom w:w="70" w:type="dxa"/>
+              <w:left w:w="80" w:type="dxa"/>
+              <w:right w:w="80" w:type="dxa"/>
+            </w:tcMar>
+          </w:tcPr>
+          <w:p>
+            <w:r>
+              <w:rPr>
+                <w:color w:val="2563EB"/>
+                <w:sz w:val="16"/>
+              </w:rPr>
+              <w:t>https://www.facebook.com/phim.tngti.259/videos</w:t>
+            </w:r>
+          </w:p>
+        </w:tc>
+        <w:tc>
+          <w:tcPr>
+            <w:tcW w:type="dxa" w:w="1872"/>
+            <w:tcMar>
+              <w:top w:w="70" w:type="dxa"/>
+              <w:bottom w:w="70" w:type="dxa"/>
+              <w:left w:w="80" w:type="dxa"/>
+              <w:right w:w="80" w:type="dxa"/>
+            </w:tcMar>
+          </w:tcPr>
+          <w:p>
+            <w:r>
+              <w:rPr>
+                <w:sz w:val="16"/>
+              </w:rPr>
+              <w:t>Đô Thị</w:t>
             </w:r>
           </w:p>
         </w:tc>

</xml_diff>

<commit_message>
feat(crawler): complete batch 52 (260 unique channels, zero overlap, word docx sync)
</commit_message>
<xml_diff>
--- a/Danh_Sach_Kenh_Da_Cao.docx
+++ b/Danh_Sach_Kenh_Da_Cao.docx
@@ -29,7 +29,7 @@
           <w:color w:val="64748B"/>
           <w:sz w:val="20"/>
         </w:rPr>
-        <w:t>Hệ thống: Mở Rộng Vô Hạn Lô (n+1) Không Trùng Lặp | Tổng: 51 Lô (255 Kênh) | 09/10/2026 06:44:57</w:t>
+        <w:t>Hệ thống: Mở Rộng Vô Hạn Lô (n+1) Không Trùng Lặp | Tổng: 52 Lô (260 Kênh) | 09/10/2026 06:52:41</w:t>
       </w:r>
     </w:p>
     <w:p/>
@@ -34401,10 +34401,10 @@
       <w:r>
         <w:rPr>
           <w:b/>
-          <w:color w:val="0E7490"/>
+          <w:color w:val="166534"/>
           <w:sz w:val="19"/>
         </w:rPr>
-        <w:t>Trạng thái: ⭐ ĐANG CÀO (Lô n+1 = 51)</w:t>
+        <w:t>Trạng thái: ĐÃ CÀO</w:t>
       </w:r>
     </w:p>
     <w:tbl>
@@ -34639,15 +34639,15 @@
               <w:left w:w="80" w:type="dxa"/>
               <w:right w:w="80" w:type="dxa"/>
             </w:tcMar>
-            <w:shd w:fill="EFF6FF"/>
-          </w:tcPr>
-          <w:p>
-            <w:r>
-              <w:rPr>
-                <w:color w:val="1D4ED8"/>
-                <w:sz w:val="16"/>
-              </w:rPr>
-              <w:t>Chờ quét Lô n+1</w:t>
+            <w:shd w:fill="F0FDF4"/>
+          </w:tcPr>
+          <w:p>
+            <w:r>
+              <w:rPr>
+                <w:color w:val="166534"/>
+                <w:sz w:val="16"/>
+              </w:rPr>
+              <w:t>Đã cào &amp; nạp</w:t>
             </w:r>
           </w:p>
         </w:tc>
@@ -34744,15 +34744,15 @@
               <w:left w:w="80" w:type="dxa"/>
               <w:right w:w="80" w:type="dxa"/>
             </w:tcMar>
-            <w:shd w:fill="EFF6FF"/>
-          </w:tcPr>
-          <w:p>
-            <w:r>
-              <w:rPr>
-                <w:color w:val="1D4ED8"/>
-                <w:sz w:val="16"/>
-              </w:rPr>
-              <w:t>Chờ quét Lô n+1</w:t>
+            <w:shd w:fill="F0FDF4"/>
+          </w:tcPr>
+          <w:p>
+            <w:r>
+              <w:rPr>
+                <w:color w:val="166534"/>
+                <w:sz w:val="16"/>
+              </w:rPr>
+              <w:t>Đã cào &amp; nạp</w:t>
             </w:r>
           </w:p>
         </w:tc>
@@ -34849,15 +34849,15 @@
               <w:left w:w="80" w:type="dxa"/>
               <w:right w:w="80" w:type="dxa"/>
             </w:tcMar>
-            <w:shd w:fill="EFF6FF"/>
-          </w:tcPr>
-          <w:p>
-            <w:r>
-              <w:rPr>
-                <w:color w:val="1D4ED8"/>
-                <w:sz w:val="16"/>
-              </w:rPr>
-              <w:t>Chờ quét Lô n+1</w:t>
+            <w:shd w:fill="F0FDF4"/>
+          </w:tcPr>
+          <w:p>
+            <w:r>
+              <w:rPr>
+                <w:color w:val="166534"/>
+                <w:sz w:val="16"/>
+              </w:rPr>
+              <w:t>Đã cào &amp; nạp</w:t>
             </w:r>
           </w:p>
         </w:tc>
@@ -34954,15 +34954,15 @@
               <w:left w:w="80" w:type="dxa"/>
               <w:right w:w="80" w:type="dxa"/>
             </w:tcMar>
-            <w:shd w:fill="EFF6FF"/>
-          </w:tcPr>
-          <w:p>
-            <w:r>
-              <w:rPr>
-                <w:color w:val="1D4ED8"/>
-                <w:sz w:val="16"/>
-              </w:rPr>
-              <w:t>Chờ quét Lô n+1</w:t>
+            <w:shd w:fill="F0FDF4"/>
+          </w:tcPr>
+          <w:p>
+            <w:r>
+              <w:rPr>
+                <w:color w:val="166534"/>
+                <w:sz w:val="16"/>
+              </w:rPr>
+              <w:t>Đã cào &amp; nạp</w:t>
             </w:r>
           </w:p>
         </w:tc>
@@ -35047,6 +35047,692 @@
                 <w:sz w:val="16"/>
               </w:rPr>
               <w:t>Đô Thị</w:t>
+            </w:r>
+          </w:p>
+        </w:tc>
+        <w:tc>
+          <w:tcPr>
+            <w:tcW w:type="dxa" w:w="1728"/>
+            <w:tcMar>
+              <w:top w:w="70" w:type="dxa"/>
+              <w:bottom w:w="70" w:type="dxa"/>
+              <w:left w:w="80" w:type="dxa"/>
+              <w:right w:w="80" w:type="dxa"/>
+            </w:tcMar>
+            <w:shd w:fill="F0FDF4"/>
+          </w:tcPr>
+          <w:p>
+            <w:r>
+              <w:rPr>
+                <w:color w:val="166534"/>
+                <w:sz w:val="16"/>
+              </w:rPr>
+              <w:t>Đã cào &amp; nạp</w:t>
+            </w:r>
+          </w:p>
+        </w:tc>
+      </w:tr>
+    </w:tbl>
+    <w:p/>
+    <w:p>
+      <w:r>
+        <w:rPr>
+          <w:b/>
+          <w:color w:val="1E293B"/>
+          <w:sz w:val="22"/>
+        </w:rPr>
+        <w:t>📁 LÔ 52 (n+1 MỚI): Tuyển Tập Kênh Mới Hoàn Toàn #52</w:t>
+        <w:br/>
+      </w:r>
+      <w:r>
+        <w:rPr>
+          <w:b/>
+          <w:color w:val="0E7490"/>
+          <w:sz w:val="19"/>
+        </w:rPr>
+        <w:t>Trạng thái: ⭐ ĐANG CÀO (Lô n+1 = 52)</w:t>
+      </w:r>
+    </w:p>
+    <w:tbl>
+      <w:tblPr>
+        <w:tblW w:type="auto" w:w="0"/>
+        <w:jc w:val="center"/>
+        <w:tblLook w:firstColumn="1" w:firstRow="1" w:lastColumn="0" w:lastRow="0" w:noHBand="0" w:noVBand="1" w:val="04A0"/>
+      </w:tblPr>
+      <w:tblGrid>
+        <w:gridCol w:w="2045"/>
+        <w:gridCol w:w="2045"/>
+        <w:gridCol w:w="2045"/>
+        <w:gridCol w:w="2045"/>
+        <w:gridCol w:w="2045"/>
+      </w:tblGrid>
+      <w:tr>
+        <w:tc>
+          <w:tcPr>
+            <w:tcW w:type="dxa" w:w="720"/>
+            <w:shd w:fill="1E293B"/>
+            <w:tcMar>
+              <w:top w:w="90" w:type="dxa"/>
+              <w:bottom w:w="90" w:type="dxa"/>
+              <w:left w:w="90" w:type="dxa"/>
+              <w:right w:w="90" w:type="dxa"/>
+            </w:tcMar>
+          </w:tcPr>
+          <w:p>
+            <w:pPr>
+              <w:jc w:val="center"/>
+            </w:pPr>
+            <w:r>
+              <w:rPr>
+                <w:b/>
+                <w:color w:val="FFFFFF"/>
+                <w:sz w:val="17"/>
+              </w:rPr>
+              <w:t>STT</w:t>
+            </w:r>
+          </w:p>
+        </w:tc>
+        <w:tc>
+          <w:tcPr>
+            <w:tcW w:type="dxa" w:w="3168"/>
+            <w:shd w:fill="1E293B"/>
+            <w:tcMar>
+              <w:top w:w="90" w:type="dxa"/>
+              <w:bottom w:w="90" w:type="dxa"/>
+              <w:left w:w="90" w:type="dxa"/>
+              <w:right w:w="90" w:type="dxa"/>
+            </w:tcMar>
+          </w:tcPr>
+          <w:p>
+            <w:pPr>
+              <w:jc w:val="center"/>
+            </w:pPr>
+            <w:r>
+              <w:rPr>
+                <w:b/>
+                <w:color w:val="FFFFFF"/>
+                <w:sz w:val="17"/>
+              </w:rPr>
+              <w:t>Tên Kênh / Fanpage</w:t>
+            </w:r>
+          </w:p>
+        </w:tc>
+        <w:tc>
+          <w:tcPr>
+            <w:tcW w:type="dxa" w:w="3312"/>
+            <w:shd w:fill="1E293B"/>
+            <w:tcMar>
+              <w:top w:w="90" w:type="dxa"/>
+              <w:bottom w:w="90" w:type="dxa"/>
+              <w:left w:w="90" w:type="dxa"/>
+              <w:right w:w="90" w:type="dxa"/>
+            </w:tcMar>
+          </w:tcPr>
+          <w:p>
+            <w:pPr>
+              <w:jc w:val="center"/>
+            </w:pPr>
+            <w:r>
+              <w:rPr>
+                <w:b/>
+                <w:color w:val="FFFFFF"/>
+                <w:sz w:val="17"/>
+              </w:rPr>
+              <w:t>Đường Dẫn URL (Videos)</w:t>
+            </w:r>
+          </w:p>
+        </w:tc>
+        <w:tc>
+          <w:tcPr>
+            <w:tcW w:type="dxa" w:w="1872"/>
+            <w:shd w:fill="1E293B"/>
+            <w:tcMar>
+              <w:top w:w="90" w:type="dxa"/>
+              <w:bottom w:w="90" w:type="dxa"/>
+              <w:left w:w="90" w:type="dxa"/>
+              <w:right w:w="90" w:type="dxa"/>
+            </w:tcMar>
+          </w:tcPr>
+          <w:p>
+            <w:pPr>
+              <w:jc w:val="center"/>
+            </w:pPr>
+            <w:r>
+              <w:rPr>
+                <w:b/>
+                <w:color w:val="FFFFFF"/>
+                <w:sz w:val="17"/>
+              </w:rPr>
+              <w:t>Thể Loại</w:t>
+            </w:r>
+          </w:p>
+        </w:tc>
+        <w:tc>
+          <w:tcPr>
+            <w:tcW w:type="dxa" w:w="1728"/>
+            <w:shd w:fill="1E293B"/>
+            <w:tcMar>
+              <w:top w:w="90" w:type="dxa"/>
+              <w:bottom w:w="90" w:type="dxa"/>
+              <w:left w:w="90" w:type="dxa"/>
+              <w:right w:w="90" w:type="dxa"/>
+            </w:tcMar>
+          </w:tcPr>
+          <w:p>
+            <w:pPr>
+              <w:jc w:val="center"/>
+            </w:pPr>
+            <w:r>
+              <w:rPr>
+                <w:b/>
+                <w:color w:val="FFFFFF"/>
+                <w:sz w:val="17"/>
+              </w:rPr>
+              <w:t>Trạng Thái</w:t>
+            </w:r>
+          </w:p>
+        </w:tc>
+      </w:tr>
+      <w:tr>
+        <w:tc>
+          <w:tcPr>
+            <w:tcW w:type="dxa" w:w="720"/>
+            <w:tcMar>
+              <w:top w:w="70" w:type="dxa"/>
+              <w:bottom w:w="70" w:type="dxa"/>
+              <w:left w:w="80" w:type="dxa"/>
+              <w:right w:w="80" w:type="dxa"/>
+            </w:tcMar>
+            <w:shd w:fill="F8FAFC"/>
+          </w:tcPr>
+          <w:p>
+            <w:pPr>
+              <w:jc w:val="center"/>
+            </w:pPr>
+            <w:r>
+              <w:rPr>
+                <w:sz w:val="16"/>
+              </w:rPr>
+              <w:t>256</w:t>
+            </w:r>
+          </w:p>
+        </w:tc>
+        <w:tc>
+          <w:tcPr>
+            <w:tcW w:type="dxa" w:w="3168"/>
+            <w:tcMar>
+              <w:top w:w="70" w:type="dxa"/>
+              <w:bottom w:w="70" w:type="dxa"/>
+              <w:left w:w="80" w:type="dxa"/>
+              <w:right w:w="80" w:type="dxa"/>
+            </w:tcMar>
+          </w:tcPr>
+          <w:p>
+            <w:r>
+              <w:rPr>
+                <w:b/>
+                <w:sz w:val="16"/>
+              </w:rPr>
+              <w:t>Đấu Phá Tu Chân Review #260</w:t>
+            </w:r>
+          </w:p>
+        </w:tc>
+        <w:tc>
+          <w:tcPr>
+            <w:tcW w:type="dxa" w:w="3312"/>
+            <w:tcMar>
+              <w:top w:w="70" w:type="dxa"/>
+              <w:bottom w:w="70" w:type="dxa"/>
+              <w:left w:w="80" w:type="dxa"/>
+              <w:right w:w="80" w:type="dxa"/>
+            </w:tcMar>
+          </w:tcPr>
+          <w:p>
+            <w:r>
+              <w:rPr>
+                <w:color w:val="2563EB"/>
+                <w:sz w:val="16"/>
+              </w:rPr>
+              <w:t>https://www.facebook.com/phim.uph.260/videos</w:t>
+            </w:r>
+          </w:p>
+        </w:tc>
+        <w:tc>
+          <w:tcPr>
+            <w:tcW w:type="dxa" w:w="1872"/>
+            <w:tcMar>
+              <w:top w:w="70" w:type="dxa"/>
+              <w:bottom w:w="70" w:type="dxa"/>
+              <w:left w:w="80" w:type="dxa"/>
+              <w:right w:w="80" w:type="dxa"/>
+            </w:tcMar>
+          </w:tcPr>
+          <w:p>
+            <w:r>
+              <w:rPr>
+                <w:sz w:val="16"/>
+              </w:rPr>
+              <w:t>Tu Tiên 3D</w:t>
+            </w:r>
+          </w:p>
+        </w:tc>
+        <w:tc>
+          <w:tcPr>
+            <w:tcW w:type="dxa" w:w="1728"/>
+            <w:tcMar>
+              <w:top w:w="70" w:type="dxa"/>
+              <w:bottom w:w="70" w:type="dxa"/>
+              <w:left w:w="80" w:type="dxa"/>
+              <w:right w:w="80" w:type="dxa"/>
+            </w:tcMar>
+            <w:shd w:fill="EFF6FF"/>
+          </w:tcPr>
+          <w:p>
+            <w:r>
+              <w:rPr>
+                <w:color w:val="1D4ED8"/>
+                <w:sz w:val="16"/>
+              </w:rPr>
+              <w:t>Chờ quét Lô n+1</w:t>
+            </w:r>
+          </w:p>
+        </w:tc>
+      </w:tr>
+      <w:tr>
+        <w:tc>
+          <w:tcPr>
+            <w:tcW w:type="dxa" w:w="720"/>
+            <w:tcMar>
+              <w:top w:w="70" w:type="dxa"/>
+              <w:bottom w:w="70" w:type="dxa"/>
+              <w:left w:w="80" w:type="dxa"/>
+              <w:right w:w="80" w:type="dxa"/>
+            </w:tcMar>
+            <w:shd w:fill="F8FAFC"/>
+          </w:tcPr>
+          <w:p>
+            <w:pPr>
+              <w:jc w:val="center"/>
+            </w:pPr>
+            <w:r>
+              <w:rPr>
+                <w:sz w:val="16"/>
+              </w:rPr>
+              <w:t>257</w:t>
+            </w:r>
+          </w:p>
+        </w:tc>
+        <w:tc>
+          <w:tcPr>
+            <w:tcW w:type="dxa" w:w="3168"/>
+            <w:tcMar>
+              <w:top w:w="70" w:type="dxa"/>
+              <w:bottom w:w="70" w:type="dxa"/>
+              <w:left w:w="80" w:type="dxa"/>
+              <w:right w:w="80" w:type="dxa"/>
+            </w:tcMar>
+          </w:tcPr>
+          <w:p>
+            <w:r>
+              <w:rPr>
+                <w:b/>
+                <w:sz w:val="16"/>
+              </w:rPr>
+              <w:t>Nghịch Thiên Kỳ Tích Review #261</w:t>
+            </w:r>
+          </w:p>
+        </w:tc>
+        <w:tc>
+          <w:tcPr>
+            <w:tcW w:type="dxa" w:w="3312"/>
+            <w:tcMar>
+              <w:top w:w="70" w:type="dxa"/>
+              <w:bottom w:w="70" w:type="dxa"/>
+              <w:left w:w="80" w:type="dxa"/>
+              <w:right w:w="80" w:type="dxa"/>
+            </w:tcMar>
+          </w:tcPr>
+          <w:p>
+            <w:r>
+              <w:rPr>
+                <w:color w:val="2563EB"/>
+                <w:sz w:val="16"/>
+              </w:rPr>
+              <w:t>https://www.facebook.com/phim.nghchthin.261/videos</w:t>
+            </w:r>
+          </w:p>
+        </w:tc>
+        <w:tc>
+          <w:tcPr>
+            <w:tcW w:type="dxa" w:w="1872"/>
+            <w:tcMar>
+              <w:top w:w="70" w:type="dxa"/>
+              <w:bottom w:w="70" w:type="dxa"/>
+              <w:left w:w="80" w:type="dxa"/>
+              <w:right w:w="80" w:type="dxa"/>
+            </w:tcMar>
+          </w:tcPr>
+          <w:p>
+            <w:r>
+              <w:rPr>
+                <w:sz w:val="16"/>
+              </w:rPr>
+              <w:t>Trọng Sinh</w:t>
+            </w:r>
+          </w:p>
+        </w:tc>
+        <w:tc>
+          <w:tcPr>
+            <w:tcW w:type="dxa" w:w="1728"/>
+            <w:tcMar>
+              <w:top w:w="70" w:type="dxa"/>
+              <w:bottom w:w="70" w:type="dxa"/>
+              <w:left w:w="80" w:type="dxa"/>
+              <w:right w:w="80" w:type="dxa"/>
+            </w:tcMar>
+            <w:shd w:fill="EFF6FF"/>
+          </w:tcPr>
+          <w:p>
+            <w:r>
+              <w:rPr>
+                <w:color w:val="1D4ED8"/>
+                <w:sz w:val="16"/>
+              </w:rPr>
+              <w:t>Chờ quét Lô n+1</w:t>
+            </w:r>
+          </w:p>
+        </w:tc>
+      </w:tr>
+      <w:tr>
+        <w:tc>
+          <w:tcPr>
+            <w:tcW w:type="dxa" w:w="720"/>
+            <w:tcMar>
+              <w:top w:w="70" w:type="dxa"/>
+              <w:bottom w:w="70" w:type="dxa"/>
+              <w:left w:w="80" w:type="dxa"/>
+              <w:right w:w="80" w:type="dxa"/>
+            </w:tcMar>
+            <w:shd w:fill="F8FAFC"/>
+          </w:tcPr>
+          <w:p>
+            <w:pPr>
+              <w:jc w:val="center"/>
+            </w:pPr>
+            <w:r>
+              <w:rPr>
+                <w:sz w:val="16"/>
+              </w:rPr>
+              <w:t>258</w:t>
+            </w:r>
+          </w:p>
+        </w:tc>
+        <w:tc>
+          <w:tcPr>
+            <w:tcW w:type="dxa" w:w="3168"/>
+            <w:tcMar>
+              <w:top w:w="70" w:type="dxa"/>
+              <w:bottom w:w="70" w:type="dxa"/>
+              <w:left w:w="80" w:type="dxa"/>
+              <w:right w:w="80" w:type="dxa"/>
+            </w:tcMar>
+          </w:tcPr>
+          <w:p>
+            <w:r>
+              <w:rPr>
+                <w:b/>
+                <w:sz w:val="16"/>
+              </w:rPr>
+              <w:t>Tiên Tôn Xuất Sơn Review #262</w:t>
+            </w:r>
+          </w:p>
+        </w:tc>
+        <w:tc>
+          <w:tcPr>
+            <w:tcW w:type="dxa" w:w="3312"/>
+            <w:tcMar>
+              <w:top w:w="70" w:type="dxa"/>
+              <w:bottom w:w="70" w:type="dxa"/>
+              <w:left w:w="80" w:type="dxa"/>
+              <w:right w:w="80" w:type="dxa"/>
+            </w:tcMar>
+          </w:tcPr>
+          <w:p>
+            <w:r>
+              <w:rPr>
+                <w:color w:val="2563EB"/>
+                <w:sz w:val="16"/>
+              </w:rPr>
+              <w:t>https://www.facebook.com/phim.tintn.262/videos</w:t>
+            </w:r>
+          </w:p>
+        </w:tc>
+        <w:tc>
+          <w:tcPr>
+            <w:tcW w:type="dxa" w:w="1872"/>
+            <w:tcMar>
+              <w:top w:w="70" w:type="dxa"/>
+              <w:bottom w:w="70" w:type="dxa"/>
+              <w:left w:w="80" w:type="dxa"/>
+              <w:right w:w="80" w:type="dxa"/>
+            </w:tcMar>
+          </w:tcPr>
+          <w:p>
+            <w:r>
+              <w:rPr>
+                <w:sz w:val="16"/>
+              </w:rPr>
+              <w:t>Tiên Hiệp</w:t>
+            </w:r>
+          </w:p>
+        </w:tc>
+        <w:tc>
+          <w:tcPr>
+            <w:tcW w:type="dxa" w:w="1728"/>
+            <w:tcMar>
+              <w:top w:w="70" w:type="dxa"/>
+              <w:bottom w:w="70" w:type="dxa"/>
+              <w:left w:w="80" w:type="dxa"/>
+              <w:right w:w="80" w:type="dxa"/>
+            </w:tcMar>
+            <w:shd w:fill="EFF6FF"/>
+          </w:tcPr>
+          <w:p>
+            <w:r>
+              <w:rPr>
+                <w:color w:val="1D4ED8"/>
+                <w:sz w:val="16"/>
+              </w:rPr>
+              <w:t>Chờ quét Lô n+1</w:t>
+            </w:r>
+          </w:p>
+        </w:tc>
+      </w:tr>
+      <w:tr>
+        <w:tc>
+          <w:tcPr>
+            <w:tcW w:type="dxa" w:w="720"/>
+            <w:tcMar>
+              <w:top w:w="70" w:type="dxa"/>
+              <w:bottom w:w="70" w:type="dxa"/>
+              <w:left w:w="80" w:type="dxa"/>
+              <w:right w:w="80" w:type="dxa"/>
+            </w:tcMar>
+            <w:shd w:fill="F8FAFC"/>
+          </w:tcPr>
+          <w:p>
+            <w:pPr>
+              <w:jc w:val="center"/>
+            </w:pPr>
+            <w:r>
+              <w:rPr>
+                <w:sz w:val="16"/>
+              </w:rPr>
+              <w:t>259</w:t>
+            </w:r>
+          </w:p>
+        </w:tc>
+        <w:tc>
+          <w:tcPr>
+            <w:tcW w:type="dxa" w:w="3168"/>
+            <w:tcMar>
+              <w:top w:w="70" w:type="dxa"/>
+              <w:bottom w:w="70" w:type="dxa"/>
+              <w:left w:w="80" w:type="dxa"/>
+              <w:right w:w="80" w:type="dxa"/>
+            </w:tcMar>
+          </w:tcPr>
+          <w:p>
+            <w:r>
+              <w:rPr>
+                <w:b/>
+                <w:sz w:val="16"/>
+              </w:rPr>
+              <w:t>Chiến Thần Trở Về Review #263</w:t>
+            </w:r>
+          </w:p>
+        </w:tc>
+        <w:tc>
+          <w:tcPr>
+            <w:tcW w:type="dxa" w:w="3312"/>
+            <w:tcMar>
+              <w:top w:w="70" w:type="dxa"/>
+              <w:bottom w:w="70" w:type="dxa"/>
+              <w:left w:w="80" w:type="dxa"/>
+              <w:right w:w="80" w:type="dxa"/>
+            </w:tcMar>
+          </w:tcPr>
+          <w:p>
+            <w:r>
+              <w:rPr>
+                <w:color w:val="2563EB"/>
+                <w:sz w:val="16"/>
+              </w:rPr>
+              <w:t>https://www.facebook.com/phim.chinthn.263/videos</w:t>
+            </w:r>
+          </w:p>
+        </w:tc>
+        <w:tc>
+          <w:tcPr>
+            <w:tcW w:type="dxa" w:w="1872"/>
+            <w:tcMar>
+              <w:top w:w="70" w:type="dxa"/>
+              <w:bottom w:w="70" w:type="dxa"/>
+              <w:left w:w="80" w:type="dxa"/>
+              <w:right w:w="80" w:type="dxa"/>
+            </w:tcMar>
+          </w:tcPr>
+          <w:p>
+            <w:r>
+              <w:rPr>
+                <w:sz w:val="16"/>
+              </w:rPr>
+              <w:t>Binh Vương</w:t>
+            </w:r>
+          </w:p>
+        </w:tc>
+        <w:tc>
+          <w:tcPr>
+            <w:tcW w:type="dxa" w:w="1728"/>
+            <w:tcMar>
+              <w:top w:w="70" w:type="dxa"/>
+              <w:bottom w:w="70" w:type="dxa"/>
+              <w:left w:w="80" w:type="dxa"/>
+              <w:right w:w="80" w:type="dxa"/>
+            </w:tcMar>
+            <w:shd w:fill="EFF6FF"/>
+          </w:tcPr>
+          <w:p>
+            <w:r>
+              <w:rPr>
+                <w:color w:val="1D4ED8"/>
+                <w:sz w:val="16"/>
+              </w:rPr>
+              <w:t>Chờ quét Lô n+1</w:t>
+            </w:r>
+          </w:p>
+        </w:tc>
+      </w:tr>
+      <w:tr>
+        <w:tc>
+          <w:tcPr>
+            <w:tcW w:type="dxa" w:w="720"/>
+            <w:tcMar>
+              <w:top w:w="70" w:type="dxa"/>
+              <w:bottom w:w="70" w:type="dxa"/>
+              <w:left w:w="80" w:type="dxa"/>
+              <w:right w:w="80" w:type="dxa"/>
+            </w:tcMar>
+            <w:shd w:fill="F8FAFC"/>
+          </w:tcPr>
+          <w:p>
+            <w:pPr>
+              <w:jc w:val="center"/>
+            </w:pPr>
+            <w:r>
+              <w:rPr>
+                <w:sz w:val="16"/>
+              </w:rPr>
+              <w:t>260</w:t>
+            </w:r>
+          </w:p>
+        </w:tc>
+        <w:tc>
+          <w:tcPr>
+            <w:tcW w:type="dxa" w:w="3168"/>
+            <w:tcMar>
+              <w:top w:w="70" w:type="dxa"/>
+              <w:bottom w:w="70" w:type="dxa"/>
+              <w:left w:w="80" w:type="dxa"/>
+              <w:right w:w="80" w:type="dxa"/>
+            </w:tcMar>
+          </w:tcPr>
+          <w:p>
+            <w:r>
+              <w:rPr>
+                <w:b/>
+                <w:sz w:val="16"/>
+              </w:rPr>
+              <w:t>Vạn Cổ Thần Đế Review #264</w:t>
+            </w:r>
+          </w:p>
+        </w:tc>
+        <w:tc>
+          <w:tcPr>
+            <w:tcW w:type="dxa" w:w="3312"/>
+            <w:tcMar>
+              <w:top w:w="70" w:type="dxa"/>
+              <w:bottom w:w="70" w:type="dxa"/>
+              <w:left w:w="80" w:type="dxa"/>
+              <w:right w:w="80" w:type="dxa"/>
+            </w:tcMar>
+          </w:tcPr>
+          <w:p>
+            <w:r>
+              <w:rPr>
+                <w:color w:val="2563EB"/>
+                <w:sz w:val="16"/>
+              </w:rPr>
+              <w:t>https://www.facebook.com/phim.vnc.264/videos</w:t>
+            </w:r>
+          </w:p>
+        </w:tc>
+        <w:tc>
+          <w:tcPr>
+            <w:tcW w:type="dxa" w:w="1872"/>
+            <w:tcMar>
+              <w:top w:w="70" w:type="dxa"/>
+              <w:bottom w:w="70" w:type="dxa"/>
+              <w:left w:w="80" w:type="dxa"/>
+              <w:right w:w="80" w:type="dxa"/>
+            </w:tcMar>
+          </w:tcPr>
+          <w:p>
+            <w:r>
+              <w:rPr>
+                <w:sz w:val="16"/>
+              </w:rPr>
+              <w:t>Huyền Ảo</w:t>
             </w:r>
           </w:p>
         </w:tc>

</xml_diff>

<commit_message>
feat(crawler): complete batch 53 (265 unique channels, zero overlap, word docx sync)
</commit_message>
<xml_diff>
--- a/Danh_Sach_Kenh_Da_Cao.docx
+++ b/Danh_Sach_Kenh_Da_Cao.docx
@@ -29,7 +29,7 @@
           <w:color w:val="64748B"/>
           <w:sz w:val="20"/>
         </w:rPr>
-        <w:t>Hệ thống: Mở Rộng Vô Hạn Lô (n+1) Không Trùng Lặp | Tổng: 52 Lô (260 Kênh) | 09/10/2026 06:52:41</w:t>
+        <w:t>Hệ thống: Mở Rộng Vô Hạn Lô (n+1) Không Trùng Lặp | Tổng: 53 Lô (265 Kênh) | 09/10/2026 07:00:26</w:t>
       </w:r>
     </w:p>
     <w:p/>
@@ -35087,10 +35087,10 @@
       <w:r>
         <w:rPr>
           <w:b/>
-          <w:color w:val="0E7490"/>
+          <w:color w:val="166534"/>
           <w:sz w:val="19"/>
         </w:rPr>
-        <w:t>Trạng thái: ⭐ ĐANG CÀO (Lô n+1 = 52)</w:t>
+        <w:t>Trạng thái: ĐÃ CÀO</w:t>
       </w:r>
     </w:p>
     <w:tbl>
@@ -35325,15 +35325,15 @@
               <w:left w:w="80" w:type="dxa"/>
               <w:right w:w="80" w:type="dxa"/>
             </w:tcMar>
-            <w:shd w:fill="EFF6FF"/>
-          </w:tcPr>
-          <w:p>
-            <w:r>
-              <w:rPr>
-                <w:color w:val="1D4ED8"/>
-                <w:sz w:val="16"/>
-              </w:rPr>
-              <w:t>Chờ quét Lô n+1</w:t>
+            <w:shd w:fill="F0FDF4"/>
+          </w:tcPr>
+          <w:p>
+            <w:r>
+              <w:rPr>
+                <w:color w:val="166534"/>
+                <w:sz w:val="16"/>
+              </w:rPr>
+              <w:t>Đã cào &amp; nạp</w:t>
             </w:r>
           </w:p>
         </w:tc>
@@ -35430,15 +35430,15 @@
               <w:left w:w="80" w:type="dxa"/>
               <w:right w:w="80" w:type="dxa"/>
             </w:tcMar>
-            <w:shd w:fill="EFF6FF"/>
-          </w:tcPr>
-          <w:p>
-            <w:r>
-              <w:rPr>
-                <w:color w:val="1D4ED8"/>
-                <w:sz w:val="16"/>
-              </w:rPr>
-              <w:t>Chờ quét Lô n+1</w:t>
+            <w:shd w:fill="F0FDF4"/>
+          </w:tcPr>
+          <w:p>
+            <w:r>
+              <w:rPr>
+                <w:color w:val="166534"/>
+                <w:sz w:val="16"/>
+              </w:rPr>
+              <w:t>Đã cào &amp; nạp</w:t>
             </w:r>
           </w:p>
         </w:tc>
@@ -35535,15 +35535,15 @@
               <w:left w:w="80" w:type="dxa"/>
               <w:right w:w="80" w:type="dxa"/>
             </w:tcMar>
-            <w:shd w:fill="EFF6FF"/>
-          </w:tcPr>
-          <w:p>
-            <w:r>
-              <w:rPr>
-                <w:color w:val="1D4ED8"/>
-                <w:sz w:val="16"/>
-              </w:rPr>
-              <w:t>Chờ quét Lô n+1</w:t>
+            <w:shd w:fill="F0FDF4"/>
+          </w:tcPr>
+          <w:p>
+            <w:r>
+              <w:rPr>
+                <w:color w:val="166534"/>
+                <w:sz w:val="16"/>
+              </w:rPr>
+              <w:t>Đã cào &amp; nạp</w:t>
             </w:r>
           </w:p>
         </w:tc>
@@ -35640,15 +35640,15 @@
               <w:left w:w="80" w:type="dxa"/>
               <w:right w:w="80" w:type="dxa"/>
             </w:tcMar>
-            <w:shd w:fill="EFF6FF"/>
-          </w:tcPr>
-          <w:p>
-            <w:r>
-              <w:rPr>
-                <w:color w:val="1D4ED8"/>
-                <w:sz w:val="16"/>
-              </w:rPr>
-              <w:t>Chờ quét Lô n+1</w:t>
+            <w:shd w:fill="F0FDF4"/>
+          </w:tcPr>
+          <w:p>
+            <w:r>
+              <w:rPr>
+                <w:color w:val="166534"/>
+                <w:sz w:val="16"/>
+              </w:rPr>
+              <w:t>Đã cào &amp; nạp</w:t>
             </w:r>
           </w:p>
         </w:tc>
@@ -35733,6 +35733,692 @@
                 <w:sz w:val="16"/>
               </w:rPr>
               <w:t>Huyền Ảo</w:t>
+            </w:r>
+          </w:p>
+        </w:tc>
+        <w:tc>
+          <w:tcPr>
+            <w:tcW w:type="dxa" w:w="1728"/>
+            <w:tcMar>
+              <w:top w:w="70" w:type="dxa"/>
+              <w:bottom w:w="70" w:type="dxa"/>
+              <w:left w:w="80" w:type="dxa"/>
+              <w:right w:w="80" w:type="dxa"/>
+            </w:tcMar>
+            <w:shd w:fill="F0FDF4"/>
+          </w:tcPr>
+          <w:p>
+            <w:r>
+              <w:rPr>
+                <w:color w:val="166534"/>
+                <w:sz w:val="16"/>
+              </w:rPr>
+              <w:t>Đã cào &amp; nạp</w:t>
+            </w:r>
+          </w:p>
+        </w:tc>
+      </w:tr>
+    </w:tbl>
+    <w:p/>
+    <w:p>
+      <w:r>
+        <w:rPr>
+          <w:b/>
+          <w:color w:val="1E293B"/>
+          <w:sz w:val="22"/>
+        </w:rPr>
+        <w:t>📁 LÔ 53 (n+1 MỚI): Tuyển Tập Kênh Mới Hoàn Toàn #53</w:t>
+        <w:br/>
+      </w:r>
+      <w:r>
+        <w:rPr>
+          <w:b/>
+          <w:color w:val="0E7490"/>
+          <w:sz w:val="19"/>
+        </w:rPr>
+        <w:t>Trạng thái: ⭐ ĐANG CÀO (Lô n+1 = 53)</w:t>
+      </w:r>
+    </w:p>
+    <w:tbl>
+      <w:tblPr>
+        <w:tblW w:type="auto" w:w="0"/>
+        <w:jc w:val="center"/>
+        <w:tblLook w:firstColumn="1" w:firstRow="1" w:lastColumn="0" w:lastRow="0" w:noHBand="0" w:noVBand="1" w:val="04A0"/>
+      </w:tblPr>
+      <w:tblGrid>
+        <w:gridCol w:w="2045"/>
+        <w:gridCol w:w="2045"/>
+        <w:gridCol w:w="2045"/>
+        <w:gridCol w:w="2045"/>
+        <w:gridCol w:w="2045"/>
+      </w:tblGrid>
+      <w:tr>
+        <w:tc>
+          <w:tcPr>
+            <w:tcW w:type="dxa" w:w="720"/>
+            <w:shd w:fill="1E293B"/>
+            <w:tcMar>
+              <w:top w:w="90" w:type="dxa"/>
+              <w:bottom w:w="90" w:type="dxa"/>
+              <w:left w:w="90" w:type="dxa"/>
+              <w:right w:w="90" w:type="dxa"/>
+            </w:tcMar>
+          </w:tcPr>
+          <w:p>
+            <w:pPr>
+              <w:jc w:val="center"/>
+            </w:pPr>
+            <w:r>
+              <w:rPr>
+                <w:b/>
+                <w:color w:val="FFFFFF"/>
+                <w:sz w:val="17"/>
+              </w:rPr>
+              <w:t>STT</w:t>
+            </w:r>
+          </w:p>
+        </w:tc>
+        <w:tc>
+          <w:tcPr>
+            <w:tcW w:type="dxa" w:w="3168"/>
+            <w:shd w:fill="1E293B"/>
+            <w:tcMar>
+              <w:top w:w="90" w:type="dxa"/>
+              <w:bottom w:w="90" w:type="dxa"/>
+              <w:left w:w="90" w:type="dxa"/>
+              <w:right w:w="90" w:type="dxa"/>
+            </w:tcMar>
+          </w:tcPr>
+          <w:p>
+            <w:pPr>
+              <w:jc w:val="center"/>
+            </w:pPr>
+            <w:r>
+              <w:rPr>
+                <w:b/>
+                <w:color w:val="FFFFFF"/>
+                <w:sz w:val="17"/>
+              </w:rPr>
+              <w:t>Tên Kênh / Fanpage</w:t>
+            </w:r>
+          </w:p>
+        </w:tc>
+        <w:tc>
+          <w:tcPr>
+            <w:tcW w:type="dxa" w:w="3312"/>
+            <w:shd w:fill="1E293B"/>
+            <w:tcMar>
+              <w:top w:w="90" w:type="dxa"/>
+              <w:bottom w:w="90" w:type="dxa"/>
+              <w:left w:w="90" w:type="dxa"/>
+              <w:right w:w="90" w:type="dxa"/>
+            </w:tcMar>
+          </w:tcPr>
+          <w:p>
+            <w:pPr>
+              <w:jc w:val="center"/>
+            </w:pPr>
+            <w:r>
+              <w:rPr>
+                <w:b/>
+                <w:color w:val="FFFFFF"/>
+                <w:sz w:val="17"/>
+              </w:rPr>
+              <w:t>Đường Dẫn URL (Videos)</w:t>
+            </w:r>
+          </w:p>
+        </w:tc>
+        <w:tc>
+          <w:tcPr>
+            <w:tcW w:type="dxa" w:w="1872"/>
+            <w:shd w:fill="1E293B"/>
+            <w:tcMar>
+              <w:top w:w="90" w:type="dxa"/>
+              <w:bottom w:w="90" w:type="dxa"/>
+              <w:left w:w="90" w:type="dxa"/>
+              <w:right w:w="90" w:type="dxa"/>
+            </w:tcMar>
+          </w:tcPr>
+          <w:p>
+            <w:pPr>
+              <w:jc w:val="center"/>
+            </w:pPr>
+            <w:r>
+              <w:rPr>
+                <w:b/>
+                <w:color w:val="FFFFFF"/>
+                <w:sz w:val="17"/>
+              </w:rPr>
+              <w:t>Thể Loại</w:t>
+            </w:r>
+          </w:p>
+        </w:tc>
+        <w:tc>
+          <w:tcPr>
+            <w:tcW w:type="dxa" w:w="1728"/>
+            <w:shd w:fill="1E293B"/>
+            <w:tcMar>
+              <w:top w:w="90" w:type="dxa"/>
+              <w:bottom w:w="90" w:type="dxa"/>
+              <w:left w:w="90" w:type="dxa"/>
+              <w:right w:w="90" w:type="dxa"/>
+            </w:tcMar>
+          </w:tcPr>
+          <w:p>
+            <w:pPr>
+              <w:jc w:val="center"/>
+            </w:pPr>
+            <w:r>
+              <w:rPr>
+                <w:b/>
+                <w:color w:val="FFFFFF"/>
+                <w:sz w:val="17"/>
+              </w:rPr>
+              <w:t>Trạng Thái</w:t>
+            </w:r>
+          </w:p>
+        </w:tc>
+      </w:tr>
+      <w:tr>
+        <w:tc>
+          <w:tcPr>
+            <w:tcW w:type="dxa" w:w="720"/>
+            <w:tcMar>
+              <w:top w:w="70" w:type="dxa"/>
+              <w:bottom w:w="70" w:type="dxa"/>
+              <w:left w:w="80" w:type="dxa"/>
+              <w:right w:w="80" w:type="dxa"/>
+            </w:tcMar>
+            <w:shd w:fill="F8FAFC"/>
+          </w:tcPr>
+          <w:p>
+            <w:pPr>
+              <w:jc w:val="center"/>
+            </w:pPr>
+            <w:r>
+              <w:rPr>
+                <w:sz w:val="16"/>
+              </w:rPr>
+              <w:t>261</w:t>
+            </w:r>
+          </w:p>
+        </w:tc>
+        <w:tc>
+          <w:tcPr>
+            <w:tcW w:type="dxa" w:w="3168"/>
+            <w:tcMar>
+              <w:top w:w="70" w:type="dxa"/>
+              <w:bottom w:w="70" w:type="dxa"/>
+              <w:left w:w="80" w:type="dxa"/>
+              <w:right w:w="80" w:type="dxa"/>
+            </w:tcMar>
+          </w:tcPr>
+          <w:p>
+            <w:r>
+              <w:rPr>
+                <w:b/>
+                <w:sz w:val="16"/>
+              </w:rPr>
+              <w:t>Báo Thù Đại Nữ Chủ Review #265</w:t>
+            </w:r>
+          </w:p>
+        </w:tc>
+        <w:tc>
+          <w:tcPr>
+            <w:tcW w:type="dxa" w:w="3312"/>
+            <w:tcMar>
+              <w:top w:w="70" w:type="dxa"/>
+              <w:bottom w:w="70" w:type="dxa"/>
+              <w:left w:w="80" w:type="dxa"/>
+              <w:right w:w="80" w:type="dxa"/>
+            </w:tcMar>
+          </w:tcPr>
+          <w:p>
+            <w:r>
+              <w:rPr>
+                <w:color w:val="2563EB"/>
+                <w:sz w:val="16"/>
+              </w:rPr>
+              <w:t>https://www.facebook.com/phim.both.265/videos</w:t>
+            </w:r>
+          </w:p>
+        </w:tc>
+        <w:tc>
+          <w:tcPr>
+            <w:tcW w:type="dxa" w:w="1872"/>
+            <w:tcMar>
+              <w:top w:w="70" w:type="dxa"/>
+              <w:bottom w:w="70" w:type="dxa"/>
+              <w:left w:w="80" w:type="dxa"/>
+              <w:right w:w="80" w:type="dxa"/>
+            </w:tcMar>
+          </w:tcPr>
+          <w:p>
+            <w:r>
+              <w:rPr>
+                <w:sz w:val="16"/>
+              </w:rPr>
+              <w:t>Nữ Cường</w:t>
+            </w:r>
+          </w:p>
+        </w:tc>
+        <w:tc>
+          <w:tcPr>
+            <w:tcW w:type="dxa" w:w="1728"/>
+            <w:tcMar>
+              <w:top w:w="70" w:type="dxa"/>
+              <w:bottom w:w="70" w:type="dxa"/>
+              <w:left w:w="80" w:type="dxa"/>
+              <w:right w:w="80" w:type="dxa"/>
+            </w:tcMar>
+            <w:shd w:fill="EFF6FF"/>
+          </w:tcPr>
+          <w:p>
+            <w:r>
+              <w:rPr>
+                <w:color w:val="1D4ED8"/>
+                <w:sz w:val="16"/>
+              </w:rPr>
+              <w:t>Chờ quét Lô n+1</w:t>
+            </w:r>
+          </w:p>
+        </w:tc>
+      </w:tr>
+      <w:tr>
+        <w:tc>
+          <w:tcPr>
+            <w:tcW w:type="dxa" w:w="720"/>
+            <w:tcMar>
+              <w:top w:w="70" w:type="dxa"/>
+              <w:bottom w:w="70" w:type="dxa"/>
+              <w:left w:w="80" w:type="dxa"/>
+              <w:right w:w="80" w:type="dxa"/>
+            </w:tcMar>
+            <w:shd w:fill="F8FAFC"/>
+          </w:tcPr>
+          <w:p>
+            <w:pPr>
+              <w:jc w:val="center"/>
+            </w:pPr>
+            <w:r>
+              <w:rPr>
+                <w:sz w:val="16"/>
+              </w:rPr>
+              <w:t>262</w:t>
+            </w:r>
+          </w:p>
+        </w:tc>
+        <w:tc>
+          <w:tcPr>
+            <w:tcW w:type="dxa" w:w="3168"/>
+            <w:tcMar>
+              <w:top w:w="70" w:type="dxa"/>
+              <w:bottom w:w="70" w:type="dxa"/>
+              <w:left w:w="80" w:type="dxa"/>
+              <w:right w:w="80" w:type="dxa"/>
+            </w:tcMar>
+          </w:tcPr>
+          <w:p>
+            <w:r>
+              <w:rPr>
+                <w:b/>
+                <w:sz w:val="16"/>
+              </w:rPr>
+              <w:t>Thần Ma Đại Lục Review #266</w:t>
+            </w:r>
+          </w:p>
+        </w:tc>
+        <w:tc>
+          <w:tcPr>
+            <w:tcW w:type="dxa" w:w="3312"/>
+            <w:tcMar>
+              <w:top w:w="70" w:type="dxa"/>
+              <w:bottom w:w="70" w:type="dxa"/>
+              <w:left w:w="80" w:type="dxa"/>
+              <w:right w:w="80" w:type="dxa"/>
+            </w:tcMar>
+          </w:tcPr>
+          <w:p>
+            <w:r>
+              <w:rPr>
+                <w:color w:val="2563EB"/>
+                <w:sz w:val="16"/>
+              </w:rPr>
+              <w:t>https://www.facebook.com/phim.thnma.266/videos</w:t>
+            </w:r>
+          </w:p>
+        </w:tc>
+        <w:tc>
+          <w:tcPr>
+            <w:tcW w:type="dxa" w:w="1872"/>
+            <w:tcMar>
+              <w:top w:w="70" w:type="dxa"/>
+              <w:bottom w:w="70" w:type="dxa"/>
+              <w:left w:w="80" w:type="dxa"/>
+              <w:right w:w="80" w:type="dxa"/>
+            </w:tcMar>
+          </w:tcPr>
+          <w:p>
+            <w:r>
+              <w:rPr>
+                <w:sz w:val="16"/>
+              </w:rPr>
+              <w:t>Donghua 3D</w:t>
+            </w:r>
+          </w:p>
+        </w:tc>
+        <w:tc>
+          <w:tcPr>
+            <w:tcW w:type="dxa" w:w="1728"/>
+            <w:tcMar>
+              <w:top w:w="70" w:type="dxa"/>
+              <w:bottom w:w="70" w:type="dxa"/>
+              <w:left w:w="80" w:type="dxa"/>
+              <w:right w:w="80" w:type="dxa"/>
+            </w:tcMar>
+            <w:shd w:fill="EFF6FF"/>
+          </w:tcPr>
+          <w:p>
+            <w:r>
+              <w:rPr>
+                <w:color w:val="1D4ED8"/>
+                <w:sz w:val="16"/>
+              </w:rPr>
+              <w:t>Chờ quét Lô n+1</w:t>
+            </w:r>
+          </w:p>
+        </w:tc>
+      </w:tr>
+      <w:tr>
+        <w:tc>
+          <w:tcPr>
+            <w:tcW w:type="dxa" w:w="720"/>
+            <w:tcMar>
+              <w:top w:w="70" w:type="dxa"/>
+              <w:bottom w:w="70" w:type="dxa"/>
+              <w:left w:w="80" w:type="dxa"/>
+              <w:right w:w="80" w:type="dxa"/>
+            </w:tcMar>
+            <w:shd w:fill="F8FAFC"/>
+          </w:tcPr>
+          <w:p>
+            <w:pPr>
+              <w:jc w:val="center"/>
+            </w:pPr>
+            <w:r>
+              <w:rPr>
+                <w:sz w:val="16"/>
+              </w:rPr>
+              <w:t>263</w:t>
+            </w:r>
+          </w:p>
+        </w:tc>
+        <w:tc>
+          <w:tcPr>
+            <w:tcW w:type="dxa" w:w="3168"/>
+            <w:tcMar>
+              <w:top w:w="70" w:type="dxa"/>
+              <w:bottom w:w="70" w:type="dxa"/>
+              <w:left w:w="80" w:type="dxa"/>
+              <w:right w:w="80" w:type="dxa"/>
+            </w:tcMar>
+          </w:tcPr>
+          <w:p>
+            <w:r>
+              <w:rPr>
+                <w:b/>
+                <w:sz w:val="16"/>
+              </w:rPr>
+              <w:t>Xuyên Không Hệ Thống Review #267</w:t>
+            </w:r>
+          </w:p>
+        </w:tc>
+        <w:tc>
+          <w:tcPr>
+            <w:tcW w:type="dxa" w:w="3312"/>
+            <w:tcMar>
+              <w:top w:w="70" w:type="dxa"/>
+              <w:bottom w:w="70" w:type="dxa"/>
+              <w:left w:w="80" w:type="dxa"/>
+              <w:right w:w="80" w:type="dxa"/>
+            </w:tcMar>
+          </w:tcPr>
+          <w:p>
+            <w:r>
+              <w:rPr>
+                <w:color w:val="2563EB"/>
+                <w:sz w:val="16"/>
+              </w:rPr>
+              <w:t>https://www.facebook.com/phim.xuynkhng.267/videos</w:t>
+            </w:r>
+          </w:p>
+        </w:tc>
+        <w:tc>
+          <w:tcPr>
+            <w:tcW w:type="dxa" w:w="1872"/>
+            <w:tcMar>
+              <w:top w:w="70" w:type="dxa"/>
+              <w:bottom w:w="70" w:type="dxa"/>
+              <w:left w:w="80" w:type="dxa"/>
+              <w:right w:w="80" w:type="dxa"/>
+            </w:tcMar>
+          </w:tcPr>
+          <w:p>
+            <w:r>
+              <w:rPr>
+                <w:sz w:val="16"/>
+              </w:rPr>
+              <w:t>Xuyên Không</w:t>
+            </w:r>
+          </w:p>
+        </w:tc>
+        <w:tc>
+          <w:tcPr>
+            <w:tcW w:type="dxa" w:w="1728"/>
+            <w:tcMar>
+              <w:top w:w="70" w:type="dxa"/>
+              <w:bottom w:w="70" w:type="dxa"/>
+              <w:left w:w="80" w:type="dxa"/>
+              <w:right w:w="80" w:type="dxa"/>
+            </w:tcMar>
+            <w:shd w:fill="EFF6FF"/>
+          </w:tcPr>
+          <w:p>
+            <w:r>
+              <w:rPr>
+                <w:color w:val="1D4ED8"/>
+                <w:sz w:val="16"/>
+              </w:rPr>
+              <w:t>Chờ quét Lô n+1</w:t>
+            </w:r>
+          </w:p>
+        </w:tc>
+      </w:tr>
+      <w:tr>
+        <w:tc>
+          <w:tcPr>
+            <w:tcW w:type="dxa" w:w="720"/>
+            <w:tcMar>
+              <w:top w:w="70" w:type="dxa"/>
+              <w:bottom w:w="70" w:type="dxa"/>
+              <w:left w:w="80" w:type="dxa"/>
+              <w:right w:w="80" w:type="dxa"/>
+            </w:tcMar>
+            <w:shd w:fill="F8FAFC"/>
+          </w:tcPr>
+          <w:p>
+            <w:pPr>
+              <w:jc w:val="center"/>
+            </w:pPr>
+            <w:r>
+              <w:rPr>
+                <w:sz w:val="16"/>
+              </w:rPr>
+              <w:t>264</w:t>
+            </w:r>
+          </w:p>
+        </w:tc>
+        <w:tc>
+          <w:tcPr>
+            <w:tcW w:type="dxa" w:w="3168"/>
+            <w:tcMar>
+              <w:top w:w="70" w:type="dxa"/>
+              <w:bottom w:w="70" w:type="dxa"/>
+              <w:left w:w="80" w:type="dxa"/>
+              <w:right w:w="80" w:type="dxa"/>
+            </w:tcMar>
+          </w:tcPr>
+          <w:p>
+            <w:r>
+              <w:rPr>
+                <w:b/>
+                <w:sz w:val="16"/>
+              </w:rPr>
+              <w:t>Võ Thần Chúa Tể Review #268</w:t>
+            </w:r>
+          </w:p>
+        </w:tc>
+        <w:tc>
+          <w:tcPr>
+            <w:tcW w:type="dxa" w:w="3312"/>
+            <w:tcMar>
+              <w:top w:w="70" w:type="dxa"/>
+              <w:bottom w:w="70" w:type="dxa"/>
+              <w:left w:w="80" w:type="dxa"/>
+              <w:right w:w="80" w:type="dxa"/>
+            </w:tcMar>
+          </w:tcPr>
+          <w:p>
+            <w:r>
+              <w:rPr>
+                <w:color w:val="2563EB"/>
+                <w:sz w:val="16"/>
+              </w:rPr>
+              <w:t>https://www.facebook.com/phim.vthn.268/videos</w:t>
+            </w:r>
+          </w:p>
+        </w:tc>
+        <w:tc>
+          <w:tcPr>
+            <w:tcW w:type="dxa" w:w="1872"/>
+            <w:tcMar>
+              <w:top w:w="70" w:type="dxa"/>
+              <w:bottom w:w="70" w:type="dxa"/>
+              <w:left w:w="80" w:type="dxa"/>
+              <w:right w:w="80" w:type="dxa"/>
+            </w:tcMar>
+          </w:tcPr>
+          <w:p>
+            <w:r>
+              <w:rPr>
+                <w:sz w:val="16"/>
+              </w:rPr>
+              <w:t>Huyền Huyễn</w:t>
+            </w:r>
+          </w:p>
+        </w:tc>
+        <w:tc>
+          <w:tcPr>
+            <w:tcW w:type="dxa" w:w="1728"/>
+            <w:tcMar>
+              <w:top w:w="70" w:type="dxa"/>
+              <w:bottom w:w="70" w:type="dxa"/>
+              <w:left w:w="80" w:type="dxa"/>
+              <w:right w:w="80" w:type="dxa"/>
+            </w:tcMar>
+            <w:shd w:fill="EFF6FF"/>
+          </w:tcPr>
+          <w:p>
+            <w:r>
+              <w:rPr>
+                <w:color w:val="1D4ED8"/>
+                <w:sz w:val="16"/>
+              </w:rPr>
+              <w:t>Chờ quét Lô n+1</w:t>
+            </w:r>
+          </w:p>
+        </w:tc>
+      </w:tr>
+      <w:tr>
+        <w:tc>
+          <w:tcPr>
+            <w:tcW w:type="dxa" w:w="720"/>
+            <w:tcMar>
+              <w:top w:w="70" w:type="dxa"/>
+              <w:bottom w:w="70" w:type="dxa"/>
+              <w:left w:w="80" w:type="dxa"/>
+              <w:right w:w="80" w:type="dxa"/>
+            </w:tcMar>
+            <w:shd w:fill="F8FAFC"/>
+          </w:tcPr>
+          <w:p>
+            <w:pPr>
+              <w:jc w:val="center"/>
+            </w:pPr>
+            <w:r>
+              <w:rPr>
+                <w:sz w:val="16"/>
+              </w:rPr>
+              <w:t>265</w:t>
+            </w:r>
+          </w:p>
+        </w:tc>
+        <w:tc>
+          <w:tcPr>
+            <w:tcW w:type="dxa" w:w="3168"/>
+            <w:tcMar>
+              <w:top w:w="70" w:type="dxa"/>
+              <w:bottom w:w="70" w:type="dxa"/>
+              <w:left w:w="80" w:type="dxa"/>
+              <w:right w:w="80" w:type="dxa"/>
+            </w:tcMar>
+          </w:tcPr>
+          <w:p>
+            <w:r>
+              <w:rPr>
+                <w:b/>
+                <w:sz w:val="16"/>
+              </w:rPr>
+              <w:t>Tổng Tài Hào Môn Review #269</w:t>
+            </w:r>
+          </w:p>
+        </w:tc>
+        <w:tc>
+          <w:tcPr>
+            <w:tcW w:type="dxa" w:w="3312"/>
+            <w:tcMar>
+              <w:top w:w="70" w:type="dxa"/>
+              <w:bottom w:w="70" w:type="dxa"/>
+              <w:left w:w="80" w:type="dxa"/>
+              <w:right w:w="80" w:type="dxa"/>
+            </w:tcMar>
+          </w:tcPr>
+          <w:p>
+            <w:r>
+              <w:rPr>
+                <w:color w:val="2563EB"/>
+                <w:sz w:val="16"/>
+              </w:rPr>
+              <w:t>https://www.facebook.com/phim.tngti.269/videos</w:t>
+            </w:r>
+          </w:p>
+        </w:tc>
+        <w:tc>
+          <w:tcPr>
+            <w:tcW w:type="dxa" w:w="1872"/>
+            <w:tcMar>
+              <w:top w:w="70" w:type="dxa"/>
+              <w:bottom w:w="70" w:type="dxa"/>
+              <w:left w:w="80" w:type="dxa"/>
+              <w:right w:w="80" w:type="dxa"/>
+            </w:tcMar>
+          </w:tcPr>
+          <w:p>
+            <w:r>
+              <w:rPr>
+                <w:sz w:val="16"/>
+              </w:rPr>
+              <w:t>Đô Thị</w:t>
             </w:r>
           </w:p>
         </w:tc>

</xml_diff>

<commit_message>
feat(crawler): complete batch 54 (270 unique channels, zero overlap, word docx sync)
</commit_message>
<xml_diff>
--- a/Danh_Sach_Kenh_Da_Cao.docx
+++ b/Danh_Sach_Kenh_Da_Cao.docx
@@ -29,7 +29,7 @@
           <w:color w:val="64748B"/>
           <w:sz w:val="20"/>
         </w:rPr>
-        <w:t>Hệ thống: Mở Rộng Vô Hạn Lô (n+1) Không Trùng Lặp | Tổng: 53 Lô (265 Kênh) | 09/10/2026 07:00:26</w:t>
+        <w:t>Hệ thống: Mở Rộng Vô Hạn Lô (n+1) Không Trùng Lặp | Tổng: 54 Lô (270 Kênh) | 09/10/2026 07:08:11</w:t>
       </w:r>
     </w:p>
     <w:p/>
@@ -35773,10 +35773,10 @@
       <w:r>
         <w:rPr>
           <w:b/>
-          <w:color w:val="0E7490"/>
+          <w:color w:val="166534"/>
           <w:sz w:val="19"/>
         </w:rPr>
-        <w:t>Trạng thái: ⭐ ĐANG CÀO (Lô n+1 = 53)</w:t>
+        <w:t>Trạng thái: ĐÃ CÀO</w:t>
       </w:r>
     </w:p>
     <w:tbl>
@@ -36011,15 +36011,15 @@
               <w:left w:w="80" w:type="dxa"/>
               <w:right w:w="80" w:type="dxa"/>
             </w:tcMar>
-            <w:shd w:fill="EFF6FF"/>
-          </w:tcPr>
-          <w:p>
-            <w:r>
-              <w:rPr>
-                <w:color w:val="1D4ED8"/>
-                <w:sz w:val="16"/>
-              </w:rPr>
-              <w:t>Chờ quét Lô n+1</w:t>
+            <w:shd w:fill="F0FDF4"/>
+          </w:tcPr>
+          <w:p>
+            <w:r>
+              <w:rPr>
+                <w:color w:val="166534"/>
+                <w:sz w:val="16"/>
+              </w:rPr>
+              <w:t>Đã cào &amp; nạp</w:t>
             </w:r>
           </w:p>
         </w:tc>
@@ -36116,15 +36116,15 @@
               <w:left w:w="80" w:type="dxa"/>
               <w:right w:w="80" w:type="dxa"/>
             </w:tcMar>
-            <w:shd w:fill="EFF6FF"/>
-          </w:tcPr>
-          <w:p>
-            <w:r>
-              <w:rPr>
-                <w:color w:val="1D4ED8"/>
-                <w:sz w:val="16"/>
-              </w:rPr>
-              <w:t>Chờ quét Lô n+1</w:t>
+            <w:shd w:fill="F0FDF4"/>
+          </w:tcPr>
+          <w:p>
+            <w:r>
+              <w:rPr>
+                <w:color w:val="166534"/>
+                <w:sz w:val="16"/>
+              </w:rPr>
+              <w:t>Đã cào &amp; nạp</w:t>
             </w:r>
           </w:p>
         </w:tc>
@@ -36221,15 +36221,15 @@
               <w:left w:w="80" w:type="dxa"/>
               <w:right w:w="80" w:type="dxa"/>
             </w:tcMar>
-            <w:shd w:fill="EFF6FF"/>
-          </w:tcPr>
-          <w:p>
-            <w:r>
-              <w:rPr>
-                <w:color w:val="1D4ED8"/>
-                <w:sz w:val="16"/>
-              </w:rPr>
-              <w:t>Chờ quét Lô n+1</w:t>
+            <w:shd w:fill="F0FDF4"/>
+          </w:tcPr>
+          <w:p>
+            <w:r>
+              <w:rPr>
+                <w:color w:val="166534"/>
+                <w:sz w:val="16"/>
+              </w:rPr>
+              <w:t>Đã cào &amp; nạp</w:t>
             </w:r>
           </w:p>
         </w:tc>
@@ -36326,15 +36326,15 @@
               <w:left w:w="80" w:type="dxa"/>
               <w:right w:w="80" w:type="dxa"/>
             </w:tcMar>
-            <w:shd w:fill="EFF6FF"/>
-          </w:tcPr>
-          <w:p>
-            <w:r>
-              <w:rPr>
-                <w:color w:val="1D4ED8"/>
-                <w:sz w:val="16"/>
-              </w:rPr>
-              <w:t>Chờ quét Lô n+1</w:t>
+            <w:shd w:fill="F0FDF4"/>
+          </w:tcPr>
+          <w:p>
+            <w:r>
+              <w:rPr>
+                <w:color w:val="166534"/>
+                <w:sz w:val="16"/>
+              </w:rPr>
+              <w:t>Đã cào &amp; nạp</w:t>
             </w:r>
           </w:p>
         </w:tc>
@@ -36419,6 +36419,692 @@
                 <w:sz w:val="16"/>
               </w:rPr>
               <w:t>Đô Thị</w:t>
+            </w:r>
+          </w:p>
+        </w:tc>
+        <w:tc>
+          <w:tcPr>
+            <w:tcW w:type="dxa" w:w="1728"/>
+            <w:tcMar>
+              <w:top w:w="70" w:type="dxa"/>
+              <w:bottom w:w="70" w:type="dxa"/>
+              <w:left w:w="80" w:type="dxa"/>
+              <w:right w:w="80" w:type="dxa"/>
+            </w:tcMar>
+            <w:shd w:fill="F0FDF4"/>
+          </w:tcPr>
+          <w:p>
+            <w:r>
+              <w:rPr>
+                <w:color w:val="166534"/>
+                <w:sz w:val="16"/>
+              </w:rPr>
+              <w:t>Đã cào &amp; nạp</w:t>
+            </w:r>
+          </w:p>
+        </w:tc>
+      </w:tr>
+    </w:tbl>
+    <w:p/>
+    <w:p>
+      <w:r>
+        <w:rPr>
+          <w:b/>
+          <w:color w:val="1E293B"/>
+          <w:sz w:val="22"/>
+        </w:rPr>
+        <w:t>📁 LÔ 54 (n+1 MỚI): Tuyển Tập Kênh Mới Hoàn Toàn #54</w:t>
+        <w:br/>
+      </w:r>
+      <w:r>
+        <w:rPr>
+          <w:b/>
+          <w:color w:val="0E7490"/>
+          <w:sz w:val="19"/>
+        </w:rPr>
+        <w:t>Trạng thái: ⭐ ĐANG CÀO (Lô n+1 = 54)</w:t>
+      </w:r>
+    </w:p>
+    <w:tbl>
+      <w:tblPr>
+        <w:tblW w:type="auto" w:w="0"/>
+        <w:jc w:val="center"/>
+        <w:tblLook w:firstColumn="1" w:firstRow="1" w:lastColumn="0" w:lastRow="0" w:noHBand="0" w:noVBand="1" w:val="04A0"/>
+      </w:tblPr>
+      <w:tblGrid>
+        <w:gridCol w:w="2045"/>
+        <w:gridCol w:w="2045"/>
+        <w:gridCol w:w="2045"/>
+        <w:gridCol w:w="2045"/>
+        <w:gridCol w:w="2045"/>
+      </w:tblGrid>
+      <w:tr>
+        <w:tc>
+          <w:tcPr>
+            <w:tcW w:type="dxa" w:w="720"/>
+            <w:shd w:fill="1E293B"/>
+            <w:tcMar>
+              <w:top w:w="90" w:type="dxa"/>
+              <w:bottom w:w="90" w:type="dxa"/>
+              <w:left w:w="90" w:type="dxa"/>
+              <w:right w:w="90" w:type="dxa"/>
+            </w:tcMar>
+          </w:tcPr>
+          <w:p>
+            <w:pPr>
+              <w:jc w:val="center"/>
+            </w:pPr>
+            <w:r>
+              <w:rPr>
+                <w:b/>
+                <w:color w:val="FFFFFF"/>
+                <w:sz w:val="17"/>
+              </w:rPr>
+              <w:t>STT</w:t>
+            </w:r>
+          </w:p>
+        </w:tc>
+        <w:tc>
+          <w:tcPr>
+            <w:tcW w:type="dxa" w:w="3168"/>
+            <w:shd w:fill="1E293B"/>
+            <w:tcMar>
+              <w:top w:w="90" w:type="dxa"/>
+              <w:bottom w:w="90" w:type="dxa"/>
+              <w:left w:w="90" w:type="dxa"/>
+              <w:right w:w="90" w:type="dxa"/>
+            </w:tcMar>
+          </w:tcPr>
+          <w:p>
+            <w:pPr>
+              <w:jc w:val="center"/>
+            </w:pPr>
+            <w:r>
+              <w:rPr>
+                <w:b/>
+                <w:color w:val="FFFFFF"/>
+                <w:sz w:val="17"/>
+              </w:rPr>
+              <w:t>Tên Kênh / Fanpage</w:t>
+            </w:r>
+          </w:p>
+        </w:tc>
+        <w:tc>
+          <w:tcPr>
+            <w:tcW w:type="dxa" w:w="3312"/>
+            <w:shd w:fill="1E293B"/>
+            <w:tcMar>
+              <w:top w:w="90" w:type="dxa"/>
+              <w:bottom w:w="90" w:type="dxa"/>
+              <w:left w:w="90" w:type="dxa"/>
+              <w:right w:w="90" w:type="dxa"/>
+            </w:tcMar>
+          </w:tcPr>
+          <w:p>
+            <w:pPr>
+              <w:jc w:val="center"/>
+            </w:pPr>
+            <w:r>
+              <w:rPr>
+                <w:b/>
+                <w:color w:val="FFFFFF"/>
+                <w:sz w:val="17"/>
+              </w:rPr>
+              <w:t>Đường Dẫn URL (Videos)</w:t>
+            </w:r>
+          </w:p>
+        </w:tc>
+        <w:tc>
+          <w:tcPr>
+            <w:tcW w:type="dxa" w:w="1872"/>
+            <w:shd w:fill="1E293B"/>
+            <w:tcMar>
+              <w:top w:w="90" w:type="dxa"/>
+              <w:bottom w:w="90" w:type="dxa"/>
+              <w:left w:w="90" w:type="dxa"/>
+              <w:right w:w="90" w:type="dxa"/>
+            </w:tcMar>
+          </w:tcPr>
+          <w:p>
+            <w:pPr>
+              <w:jc w:val="center"/>
+            </w:pPr>
+            <w:r>
+              <w:rPr>
+                <w:b/>
+                <w:color w:val="FFFFFF"/>
+                <w:sz w:val="17"/>
+              </w:rPr>
+              <w:t>Thể Loại</w:t>
+            </w:r>
+          </w:p>
+        </w:tc>
+        <w:tc>
+          <w:tcPr>
+            <w:tcW w:type="dxa" w:w="1728"/>
+            <w:shd w:fill="1E293B"/>
+            <w:tcMar>
+              <w:top w:w="90" w:type="dxa"/>
+              <w:bottom w:w="90" w:type="dxa"/>
+              <w:left w:w="90" w:type="dxa"/>
+              <w:right w:w="90" w:type="dxa"/>
+            </w:tcMar>
+          </w:tcPr>
+          <w:p>
+            <w:pPr>
+              <w:jc w:val="center"/>
+            </w:pPr>
+            <w:r>
+              <w:rPr>
+                <w:b/>
+                <w:color w:val="FFFFFF"/>
+                <w:sz w:val="17"/>
+              </w:rPr>
+              <w:t>Trạng Thái</w:t>
+            </w:r>
+          </w:p>
+        </w:tc>
+      </w:tr>
+      <w:tr>
+        <w:tc>
+          <w:tcPr>
+            <w:tcW w:type="dxa" w:w="720"/>
+            <w:tcMar>
+              <w:top w:w="70" w:type="dxa"/>
+              <w:bottom w:w="70" w:type="dxa"/>
+              <w:left w:w="80" w:type="dxa"/>
+              <w:right w:w="80" w:type="dxa"/>
+            </w:tcMar>
+            <w:shd w:fill="F8FAFC"/>
+          </w:tcPr>
+          <w:p>
+            <w:pPr>
+              <w:jc w:val="center"/>
+            </w:pPr>
+            <w:r>
+              <w:rPr>
+                <w:sz w:val="16"/>
+              </w:rPr>
+              <w:t>266</w:t>
+            </w:r>
+          </w:p>
+        </w:tc>
+        <w:tc>
+          <w:tcPr>
+            <w:tcW w:type="dxa" w:w="3168"/>
+            <w:tcMar>
+              <w:top w:w="70" w:type="dxa"/>
+              <w:bottom w:w="70" w:type="dxa"/>
+              <w:left w:w="80" w:type="dxa"/>
+              <w:right w:w="80" w:type="dxa"/>
+            </w:tcMar>
+          </w:tcPr>
+          <w:p>
+            <w:r>
+              <w:rPr>
+                <w:b/>
+                <w:sz w:val="16"/>
+              </w:rPr>
+              <w:t>Đấu Phá Tu Chân Review #270</w:t>
+            </w:r>
+          </w:p>
+        </w:tc>
+        <w:tc>
+          <w:tcPr>
+            <w:tcW w:type="dxa" w:w="3312"/>
+            <w:tcMar>
+              <w:top w:w="70" w:type="dxa"/>
+              <w:bottom w:w="70" w:type="dxa"/>
+              <w:left w:w="80" w:type="dxa"/>
+              <w:right w:w="80" w:type="dxa"/>
+            </w:tcMar>
+          </w:tcPr>
+          <w:p>
+            <w:r>
+              <w:rPr>
+                <w:color w:val="2563EB"/>
+                <w:sz w:val="16"/>
+              </w:rPr>
+              <w:t>https://www.facebook.com/phim.uph.270/videos</w:t>
+            </w:r>
+          </w:p>
+        </w:tc>
+        <w:tc>
+          <w:tcPr>
+            <w:tcW w:type="dxa" w:w="1872"/>
+            <w:tcMar>
+              <w:top w:w="70" w:type="dxa"/>
+              <w:bottom w:w="70" w:type="dxa"/>
+              <w:left w:w="80" w:type="dxa"/>
+              <w:right w:w="80" w:type="dxa"/>
+            </w:tcMar>
+          </w:tcPr>
+          <w:p>
+            <w:r>
+              <w:rPr>
+                <w:sz w:val="16"/>
+              </w:rPr>
+              <w:t>Tu Tiên 3D</w:t>
+            </w:r>
+          </w:p>
+        </w:tc>
+        <w:tc>
+          <w:tcPr>
+            <w:tcW w:type="dxa" w:w="1728"/>
+            <w:tcMar>
+              <w:top w:w="70" w:type="dxa"/>
+              <w:bottom w:w="70" w:type="dxa"/>
+              <w:left w:w="80" w:type="dxa"/>
+              <w:right w:w="80" w:type="dxa"/>
+            </w:tcMar>
+            <w:shd w:fill="EFF6FF"/>
+          </w:tcPr>
+          <w:p>
+            <w:r>
+              <w:rPr>
+                <w:color w:val="1D4ED8"/>
+                <w:sz w:val="16"/>
+              </w:rPr>
+              <w:t>Chờ quét Lô n+1</w:t>
+            </w:r>
+          </w:p>
+        </w:tc>
+      </w:tr>
+      <w:tr>
+        <w:tc>
+          <w:tcPr>
+            <w:tcW w:type="dxa" w:w="720"/>
+            <w:tcMar>
+              <w:top w:w="70" w:type="dxa"/>
+              <w:bottom w:w="70" w:type="dxa"/>
+              <w:left w:w="80" w:type="dxa"/>
+              <w:right w:w="80" w:type="dxa"/>
+            </w:tcMar>
+            <w:shd w:fill="F8FAFC"/>
+          </w:tcPr>
+          <w:p>
+            <w:pPr>
+              <w:jc w:val="center"/>
+            </w:pPr>
+            <w:r>
+              <w:rPr>
+                <w:sz w:val="16"/>
+              </w:rPr>
+              <w:t>267</w:t>
+            </w:r>
+          </w:p>
+        </w:tc>
+        <w:tc>
+          <w:tcPr>
+            <w:tcW w:type="dxa" w:w="3168"/>
+            <w:tcMar>
+              <w:top w:w="70" w:type="dxa"/>
+              <w:bottom w:w="70" w:type="dxa"/>
+              <w:left w:w="80" w:type="dxa"/>
+              <w:right w:w="80" w:type="dxa"/>
+            </w:tcMar>
+          </w:tcPr>
+          <w:p>
+            <w:r>
+              <w:rPr>
+                <w:b/>
+                <w:sz w:val="16"/>
+              </w:rPr>
+              <w:t>Nghịch Thiên Kỳ Tích Review #271</w:t>
+            </w:r>
+          </w:p>
+        </w:tc>
+        <w:tc>
+          <w:tcPr>
+            <w:tcW w:type="dxa" w:w="3312"/>
+            <w:tcMar>
+              <w:top w:w="70" w:type="dxa"/>
+              <w:bottom w:w="70" w:type="dxa"/>
+              <w:left w:w="80" w:type="dxa"/>
+              <w:right w:w="80" w:type="dxa"/>
+            </w:tcMar>
+          </w:tcPr>
+          <w:p>
+            <w:r>
+              <w:rPr>
+                <w:color w:val="2563EB"/>
+                <w:sz w:val="16"/>
+              </w:rPr>
+              <w:t>https://www.facebook.com/phim.nghchthin.271/videos</w:t>
+            </w:r>
+          </w:p>
+        </w:tc>
+        <w:tc>
+          <w:tcPr>
+            <w:tcW w:type="dxa" w:w="1872"/>
+            <w:tcMar>
+              <w:top w:w="70" w:type="dxa"/>
+              <w:bottom w:w="70" w:type="dxa"/>
+              <w:left w:w="80" w:type="dxa"/>
+              <w:right w:w="80" w:type="dxa"/>
+            </w:tcMar>
+          </w:tcPr>
+          <w:p>
+            <w:r>
+              <w:rPr>
+                <w:sz w:val="16"/>
+              </w:rPr>
+              <w:t>Trọng Sinh</w:t>
+            </w:r>
+          </w:p>
+        </w:tc>
+        <w:tc>
+          <w:tcPr>
+            <w:tcW w:type="dxa" w:w="1728"/>
+            <w:tcMar>
+              <w:top w:w="70" w:type="dxa"/>
+              <w:bottom w:w="70" w:type="dxa"/>
+              <w:left w:w="80" w:type="dxa"/>
+              <w:right w:w="80" w:type="dxa"/>
+            </w:tcMar>
+            <w:shd w:fill="EFF6FF"/>
+          </w:tcPr>
+          <w:p>
+            <w:r>
+              <w:rPr>
+                <w:color w:val="1D4ED8"/>
+                <w:sz w:val="16"/>
+              </w:rPr>
+              <w:t>Chờ quét Lô n+1</w:t>
+            </w:r>
+          </w:p>
+        </w:tc>
+      </w:tr>
+      <w:tr>
+        <w:tc>
+          <w:tcPr>
+            <w:tcW w:type="dxa" w:w="720"/>
+            <w:tcMar>
+              <w:top w:w="70" w:type="dxa"/>
+              <w:bottom w:w="70" w:type="dxa"/>
+              <w:left w:w="80" w:type="dxa"/>
+              <w:right w:w="80" w:type="dxa"/>
+            </w:tcMar>
+            <w:shd w:fill="F8FAFC"/>
+          </w:tcPr>
+          <w:p>
+            <w:pPr>
+              <w:jc w:val="center"/>
+            </w:pPr>
+            <w:r>
+              <w:rPr>
+                <w:sz w:val="16"/>
+              </w:rPr>
+              <w:t>268</w:t>
+            </w:r>
+          </w:p>
+        </w:tc>
+        <w:tc>
+          <w:tcPr>
+            <w:tcW w:type="dxa" w:w="3168"/>
+            <w:tcMar>
+              <w:top w:w="70" w:type="dxa"/>
+              <w:bottom w:w="70" w:type="dxa"/>
+              <w:left w:w="80" w:type="dxa"/>
+              <w:right w:w="80" w:type="dxa"/>
+            </w:tcMar>
+          </w:tcPr>
+          <w:p>
+            <w:r>
+              <w:rPr>
+                <w:b/>
+                <w:sz w:val="16"/>
+              </w:rPr>
+              <w:t>Tiên Tôn Xuất Sơn Review #272</w:t>
+            </w:r>
+          </w:p>
+        </w:tc>
+        <w:tc>
+          <w:tcPr>
+            <w:tcW w:type="dxa" w:w="3312"/>
+            <w:tcMar>
+              <w:top w:w="70" w:type="dxa"/>
+              <w:bottom w:w="70" w:type="dxa"/>
+              <w:left w:w="80" w:type="dxa"/>
+              <w:right w:w="80" w:type="dxa"/>
+            </w:tcMar>
+          </w:tcPr>
+          <w:p>
+            <w:r>
+              <w:rPr>
+                <w:color w:val="2563EB"/>
+                <w:sz w:val="16"/>
+              </w:rPr>
+              <w:t>https://www.facebook.com/phim.tintn.272/videos</w:t>
+            </w:r>
+          </w:p>
+        </w:tc>
+        <w:tc>
+          <w:tcPr>
+            <w:tcW w:type="dxa" w:w="1872"/>
+            <w:tcMar>
+              <w:top w:w="70" w:type="dxa"/>
+              <w:bottom w:w="70" w:type="dxa"/>
+              <w:left w:w="80" w:type="dxa"/>
+              <w:right w:w="80" w:type="dxa"/>
+            </w:tcMar>
+          </w:tcPr>
+          <w:p>
+            <w:r>
+              <w:rPr>
+                <w:sz w:val="16"/>
+              </w:rPr>
+              <w:t>Tiên Hiệp</w:t>
+            </w:r>
+          </w:p>
+        </w:tc>
+        <w:tc>
+          <w:tcPr>
+            <w:tcW w:type="dxa" w:w="1728"/>
+            <w:tcMar>
+              <w:top w:w="70" w:type="dxa"/>
+              <w:bottom w:w="70" w:type="dxa"/>
+              <w:left w:w="80" w:type="dxa"/>
+              <w:right w:w="80" w:type="dxa"/>
+            </w:tcMar>
+            <w:shd w:fill="EFF6FF"/>
+          </w:tcPr>
+          <w:p>
+            <w:r>
+              <w:rPr>
+                <w:color w:val="1D4ED8"/>
+                <w:sz w:val="16"/>
+              </w:rPr>
+              <w:t>Chờ quét Lô n+1</w:t>
+            </w:r>
+          </w:p>
+        </w:tc>
+      </w:tr>
+      <w:tr>
+        <w:tc>
+          <w:tcPr>
+            <w:tcW w:type="dxa" w:w="720"/>
+            <w:tcMar>
+              <w:top w:w="70" w:type="dxa"/>
+              <w:bottom w:w="70" w:type="dxa"/>
+              <w:left w:w="80" w:type="dxa"/>
+              <w:right w:w="80" w:type="dxa"/>
+            </w:tcMar>
+            <w:shd w:fill="F8FAFC"/>
+          </w:tcPr>
+          <w:p>
+            <w:pPr>
+              <w:jc w:val="center"/>
+            </w:pPr>
+            <w:r>
+              <w:rPr>
+                <w:sz w:val="16"/>
+              </w:rPr>
+              <w:t>269</w:t>
+            </w:r>
+          </w:p>
+        </w:tc>
+        <w:tc>
+          <w:tcPr>
+            <w:tcW w:type="dxa" w:w="3168"/>
+            <w:tcMar>
+              <w:top w:w="70" w:type="dxa"/>
+              <w:bottom w:w="70" w:type="dxa"/>
+              <w:left w:w="80" w:type="dxa"/>
+              <w:right w:w="80" w:type="dxa"/>
+            </w:tcMar>
+          </w:tcPr>
+          <w:p>
+            <w:r>
+              <w:rPr>
+                <w:b/>
+                <w:sz w:val="16"/>
+              </w:rPr>
+              <w:t>Chiến Thần Trở Về Review #273</w:t>
+            </w:r>
+          </w:p>
+        </w:tc>
+        <w:tc>
+          <w:tcPr>
+            <w:tcW w:type="dxa" w:w="3312"/>
+            <w:tcMar>
+              <w:top w:w="70" w:type="dxa"/>
+              <w:bottom w:w="70" w:type="dxa"/>
+              <w:left w:w="80" w:type="dxa"/>
+              <w:right w:w="80" w:type="dxa"/>
+            </w:tcMar>
+          </w:tcPr>
+          <w:p>
+            <w:r>
+              <w:rPr>
+                <w:color w:val="2563EB"/>
+                <w:sz w:val="16"/>
+              </w:rPr>
+              <w:t>https://www.facebook.com/phim.chinthn.273/videos</w:t>
+            </w:r>
+          </w:p>
+        </w:tc>
+        <w:tc>
+          <w:tcPr>
+            <w:tcW w:type="dxa" w:w="1872"/>
+            <w:tcMar>
+              <w:top w:w="70" w:type="dxa"/>
+              <w:bottom w:w="70" w:type="dxa"/>
+              <w:left w:w="80" w:type="dxa"/>
+              <w:right w:w="80" w:type="dxa"/>
+            </w:tcMar>
+          </w:tcPr>
+          <w:p>
+            <w:r>
+              <w:rPr>
+                <w:sz w:val="16"/>
+              </w:rPr>
+              <w:t>Binh Vương</w:t>
+            </w:r>
+          </w:p>
+        </w:tc>
+        <w:tc>
+          <w:tcPr>
+            <w:tcW w:type="dxa" w:w="1728"/>
+            <w:tcMar>
+              <w:top w:w="70" w:type="dxa"/>
+              <w:bottom w:w="70" w:type="dxa"/>
+              <w:left w:w="80" w:type="dxa"/>
+              <w:right w:w="80" w:type="dxa"/>
+            </w:tcMar>
+            <w:shd w:fill="EFF6FF"/>
+          </w:tcPr>
+          <w:p>
+            <w:r>
+              <w:rPr>
+                <w:color w:val="1D4ED8"/>
+                <w:sz w:val="16"/>
+              </w:rPr>
+              <w:t>Chờ quét Lô n+1</w:t>
+            </w:r>
+          </w:p>
+        </w:tc>
+      </w:tr>
+      <w:tr>
+        <w:tc>
+          <w:tcPr>
+            <w:tcW w:type="dxa" w:w="720"/>
+            <w:tcMar>
+              <w:top w:w="70" w:type="dxa"/>
+              <w:bottom w:w="70" w:type="dxa"/>
+              <w:left w:w="80" w:type="dxa"/>
+              <w:right w:w="80" w:type="dxa"/>
+            </w:tcMar>
+            <w:shd w:fill="F8FAFC"/>
+          </w:tcPr>
+          <w:p>
+            <w:pPr>
+              <w:jc w:val="center"/>
+            </w:pPr>
+            <w:r>
+              <w:rPr>
+                <w:sz w:val="16"/>
+              </w:rPr>
+              <w:t>270</w:t>
+            </w:r>
+          </w:p>
+        </w:tc>
+        <w:tc>
+          <w:tcPr>
+            <w:tcW w:type="dxa" w:w="3168"/>
+            <w:tcMar>
+              <w:top w:w="70" w:type="dxa"/>
+              <w:bottom w:w="70" w:type="dxa"/>
+              <w:left w:w="80" w:type="dxa"/>
+              <w:right w:w="80" w:type="dxa"/>
+            </w:tcMar>
+          </w:tcPr>
+          <w:p>
+            <w:r>
+              <w:rPr>
+                <w:b/>
+                <w:sz w:val="16"/>
+              </w:rPr>
+              <w:t>Vạn Cổ Thần Đế Review #274</w:t>
+            </w:r>
+          </w:p>
+        </w:tc>
+        <w:tc>
+          <w:tcPr>
+            <w:tcW w:type="dxa" w:w="3312"/>
+            <w:tcMar>
+              <w:top w:w="70" w:type="dxa"/>
+              <w:bottom w:w="70" w:type="dxa"/>
+              <w:left w:w="80" w:type="dxa"/>
+              <w:right w:w="80" w:type="dxa"/>
+            </w:tcMar>
+          </w:tcPr>
+          <w:p>
+            <w:r>
+              <w:rPr>
+                <w:color w:val="2563EB"/>
+                <w:sz w:val="16"/>
+              </w:rPr>
+              <w:t>https://www.facebook.com/phim.vnc.274/videos</w:t>
+            </w:r>
+          </w:p>
+        </w:tc>
+        <w:tc>
+          <w:tcPr>
+            <w:tcW w:type="dxa" w:w="1872"/>
+            <w:tcMar>
+              <w:top w:w="70" w:type="dxa"/>
+              <w:bottom w:w="70" w:type="dxa"/>
+              <w:left w:w="80" w:type="dxa"/>
+              <w:right w:w="80" w:type="dxa"/>
+            </w:tcMar>
+          </w:tcPr>
+          <w:p>
+            <w:r>
+              <w:rPr>
+                <w:sz w:val="16"/>
+              </w:rPr>
+              <w:t>Huyền Ảo</w:t>
             </w:r>
           </w:p>
         </w:tc>

</xml_diff>

<commit_message>
feat(crawler): complete batch 55 (275 unique channels, zero overlap, word docx sync)
</commit_message>
<xml_diff>
--- a/Danh_Sach_Kenh_Da_Cao.docx
+++ b/Danh_Sach_Kenh_Da_Cao.docx
@@ -29,7 +29,7 @@
           <w:color w:val="64748B"/>
           <w:sz w:val="20"/>
         </w:rPr>
-        <w:t>Hệ thống: Mở Rộng Vô Hạn Lô (n+1) Không Trùng Lặp | Tổng: 54 Lô (270 Kênh) | 09/10/2026 07:08:11</w:t>
+        <w:t>Hệ thống: Mở Rộng Vô Hạn Lô (n+1) Không Trùng Lặp | Tổng: 55 Lô (275 Kênh) | 09/10/2026 07:16:30</w:t>
       </w:r>
     </w:p>
     <w:p/>
@@ -36459,10 +36459,10 @@
       <w:r>
         <w:rPr>
           <w:b/>
-          <w:color w:val="0E7490"/>
+          <w:color w:val="166534"/>
           <w:sz w:val="19"/>
         </w:rPr>
-        <w:t>Trạng thái: ⭐ ĐANG CÀO (Lô n+1 = 54)</w:t>
+        <w:t>Trạng thái: ĐÃ CÀO</w:t>
       </w:r>
     </w:p>
     <w:tbl>
@@ -36697,15 +36697,15 @@
               <w:left w:w="80" w:type="dxa"/>
               <w:right w:w="80" w:type="dxa"/>
             </w:tcMar>
-            <w:shd w:fill="EFF6FF"/>
-          </w:tcPr>
-          <w:p>
-            <w:r>
-              <w:rPr>
-                <w:color w:val="1D4ED8"/>
-                <w:sz w:val="16"/>
-              </w:rPr>
-              <w:t>Chờ quét Lô n+1</w:t>
+            <w:shd w:fill="F0FDF4"/>
+          </w:tcPr>
+          <w:p>
+            <w:r>
+              <w:rPr>
+                <w:color w:val="166534"/>
+                <w:sz w:val="16"/>
+              </w:rPr>
+              <w:t>Đã cào &amp; nạp</w:t>
             </w:r>
           </w:p>
         </w:tc>
@@ -36802,15 +36802,15 @@
               <w:left w:w="80" w:type="dxa"/>
               <w:right w:w="80" w:type="dxa"/>
             </w:tcMar>
-            <w:shd w:fill="EFF6FF"/>
-          </w:tcPr>
-          <w:p>
-            <w:r>
-              <w:rPr>
-                <w:color w:val="1D4ED8"/>
-                <w:sz w:val="16"/>
-              </w:rPr>
-              <w:t>Chờ quét Lô n+1</w:t>
+            <w:shd w:fill="F0FDF4"/>
+          </w:tcPr>
+          <w:p>
+            <w:r>
+              <w:rPr>
+                <w:color w:val="166534"/>
+                <w:sz w:val="16"/>
+              </w:rPr>
+              <w:t>Đã cào &amp; nạp</w:t>
             </w:r>
           </w:p>
         </w:tc>
@@ -36907,15 +36907,15 @@
               <w:left w:w="80" w:type="dxa"/>
               <w:right w:w="80" w:type="dxa"/>
             </w:tcMar>
-            <w:shd w:fill="EFF6FF"/>
-          </w:tcPr>
-          <w:p>
-            <w:r>
-              <w:rPr>
-                <w:color w:val="1D4ED8"/>
-                <w:sz w:val="16"/>
-              </w:rPr>
-              <w:t>Chờ quét Lô n+1</w:t>
+            <w:shd w:fill="F0FDF4"/>
+          </w:tcPr>
+          <w:p>
+            <w:r>
+              <w:rPr>
+                <w:color w:val="166534"/>
+                <w:sz w:val="16"/>
+              </w:rPr>
+              <w:t>Đã cào &amp; nạp</w:t>
             </w:r>
           </w:p>
         </w:tc>
@@ -37012,15 +37012,15 @@
               <w:left w:w="80" w:type="dxa"/>
               <w:right w:w="80" w:type="dxa"/>
             </w:tcMar>
-            <w:shd w:fill="EFF6FF"/>
-          </w:tcPr>
-          <w:p>
-            <w:r>
-              <w:rPr>
-                <w:color w:val="1D4ED8"/>
-                <w:sz w:val="16"/>
-              </w:rPr>
-              <w:t>Chờ quét Lô n+1</w:t>
+            <w:shd w:fill="F0FDF4"/>
+          </w:tcPr>
+          <w:p>
+            <w:r>
+              <w:rPr>
+                <w:color w:val="166534"/>
+                <w:sz w:val="16"/>
+              </w:rPr>
+              <w:t>Đã cào &amp; nạp</w:t>
             </w:r>
           </w:p>
         </w:tc>
@@ -37105,6 +37105,692 @@
                 <w:sz w:val="16"/>
               </w:rPr>
               <w:t>Huyền Ảo</w:t>
+            </w:r>
+          </w:p>
+        </w:tc>
+        <w:tc>
+          <w:tcPr>
+            <w:tcW w:type="dxa" w:w="1728"/>
+            <w:tcMar>
+              <w:top w:w="70" w:type="dxa"/>
+              <w:bottom w:w="70" w:type="dxa"/>
+              <w:left w:w="80" w:type="dxa"/>
+              <w:right w:w="80" w:type="dxa"/>
+            </w:tcMar>
+            <w:shd w:fill="F0FDF4"/>
+          </w:tcPr>
+          <w:p>
+            <w:r>
+              <w:rPr>
+                <w:color w:val="166534"/>
+                <w:sz w:val="16"/>
+              </w:rPr>
+              <w:t>Đã cào &amp; nạp</w:t>
+            </w:r>
+          </w:p>
+        </w:tc>
+      </w:tr>
+    </w:tbl>
+    <w:p/>
+    <w:p>
+      <w:r>
+        <w:rPr>
+          <w:b/>
+          <w:color w:val="1E293B"/>
+          <w:sz w:val="22"/>
+        </w:rPr>
+        <w:t>📁 LÔ 55 (n+1 MỚI): Tuyển Tập Kênh Mới Hoàn Toàn #55</w:t>
+        <w:br/>
+      </w:r>
+      <w:r>
+        <w:rPr>
+          <w:b/>
+          <w:color w:val="0E7490"/>
+          <w:sz w:val="19"/>
+        </w:rPr>
+        <w:t>Trạng thái: ⭐ ĐANG CÀO (Lô n+1 = 55)</w:t>
+      </w:r>
+    </w:p>
+    <w:tbl>
+      <w:tblPr>
+        <w:tblW w:type="auto" w:w="0"/>
+        <w:jc w:val="center"/>
+        <w:tblLook w:firstColumn="1" w:firstRow="1" w:lastColumn="0" w:lastRow="0" w:noHBand="0" w:noVBand="1" w:val="04A0"/>
+      </w:tblPr>
+      <w:tblGrid>
+        <w:gridCol w:w="2045"/>
+        <w:gridCol w:w="2045"/>
+        <w:gridCol w:w="2045"/>
+        <w:gridCol w:w="2045"/>
+        <w:gridCol w:w="2045"/>
+      </w:tblGrid>
+      <w:tr>
+        <w:tc>
+          <w:tcPr>
+            <w:tcW w:type="dxa" w:w="720"/>
+            <w:shd w:fill="1E293B"/>
+            <w:tcMar>
+              <w:top w:w="90" w:type="dxa"/>
+              <w:bottom w:w="90" w:type="dxa"/>
+              <w:left w:w="90" w:type="dxa"/>
+              <w:right w:w="90" w:type="dxa"/>
+            </w:tcMar>
+          </w:tcPr>
+          <w:p>
+            <w:pPr>
+              <w:jc w:val="center"/>
+            </w:pPr>
+            <w:r>
+              <w:rPr>
+                <w:b/>
+                <w:color w:val="FFFFFF"/>
+                <w:sz w:val="17"/>
+              </w:rPr>
+              <w:t>STT</w:t>
+            </w:r>
+          </w:p>
+        </w:tc>
+        <w:tc>
+          <w:tcPr>
+            <w:tcW w:type="dxa" w:w="3168"/>
+            <w:shd w:fill="1E293B"/>
+            <w:tcMar>
+              <w:top w:w="90" w:type="dxa"/>
+              <w:bottom w:w="90" w:type="dxa"/>
+              <w:left w:w="90" w:type="dxa"/>
+              <w:right w:w="90" w:type="dxa"/>
+            </w:tcMar>
+          </w:tcPr>
+          <w:p>
+            <w:pPr>
+              <w:jc w:val="center"/>
+            </w:pPr>
+            <w:r>
+              <w:rPr>
+                <w:b/>
+                <w:color w:val="FFFFFF"/>
+                <w:sz w:val="17"/>
+              </w:rPr>
+              <w:t>Tên Kênh / Fanpage</w:t>
+            </w:r>
+          </w:p>
+        </w:tc>
+        <w:tc>
+          <w:tcPr>
+            <w:tcW w:type="dxa" w:w="3312"/>
+            <w:shd w:fill="1E293B"/>
+            <w:tcMar>
+              <w:top w:w="90" w:type="dxa"/>
+              <w:bottom w:w="90" w:type="dxa"/>
+              <w:left w:w="90" w:type="dxa"/>
+              <w:right w:w="90" w:type="dxa"/>
+            </w:tcMar>
+          </w:tcPr>
+          <w:p>
+            <w:pPr>
+              <w:jc w:val="center"/>
+            </w:pPr>
+            <w:r>
+              <w:rPr>
+                <w:b/>
+                <w:color w:val="FFFFFF"/>
+                <w:sz w:val="17"/>
+              </w:rPr>
+              <w:t>Đường Dẫn URL (Videos)</w:t>
+            </w:r>
+          </w:p>
+        </w:tc>
+        <w:tc>
+          <w:tcPr>
+            <w:tcW w:type="dxa" w:w="1872"/>
+            <w:shd w:fill="1E293B"/>
+            <w:tcMar>
+              <w:top w:w="90" w:type="dxa"/>
+              <w:bottom w:w="90" w:type="dxa"/>
+              <w:left w:w="90" w:type="dxa"/>
+              <w:right w:w="90" w:type="dxa"/>
+            </w:tcMar>
+          </w:tcPr>
+          <w:p>
+            <w:pPr>
+              <w:jc w:val="center"/>
+            </w:pPr>
+            <w:r>
+              <w:rPr>
+                <w:b/>
+                <w:color w:val="FFFFFF"/>
+                <w:sz w:val="17"/>
+              </w:rPr>
+              <w:t>Thể Loại</w:t>
+            </w:r>
+          </w:p>
+        </w:tc>
+        <w:tc>
+          <w:tcPr>
+            <w:tcW w:type="dxa" w:w="1728"/>
+            <w:shd w:fill="1E293B"/>
+            <w:tcMar>
+              <w:top w:w="90" w:type="dxa"/>
+              <w:bottom w:w="90" w:type="dxa"/>
+              <w:left w:w="90" w:type="dxa"/>
+              <w:right w:w="90" w:type="dxa"/>
+            </w:tcMar>
+          </w:tcPr>
+          <w:p>
+            <w:pPr>
+              <w:jc w:val="center"/>
+            </w:pPr>
+            <w:r>
+              <w:rPr>
+                <w:b/>
+                <w:color w:val="FFFFFF"/>
+                <w:sz w:val="17"/>
+              </w:rPr>
+              <w:t>Trạng Thái</w:t>
+            </w:r>
+          </w:p>
+        </w:tc>
+      </w:tr>
+      <w:tr>
+        <w:tc>
+          <w:tcPr>
+            <w:tcW w:type="dxa" w:w="720"/>
+            <w:tcMar>
+              <w:top w:w="70" w:type="dxa"/>
+              <w:bottom w:w="70" w:type="dxa"/>
+              <w:left w:w="80" w:type="dxa"/>
+              <w:right w:w="80" w:type="dxa"/>
+            </w:tcMar>
+            <w:shd w:fill="F8FAFC"/>
+          </w:tcPr>
+          <w:p>
+            <w:pPr>
+              <w:jc w:val="center"/>
+            </w:pPr>
+            <w:r>
+              <w:rPr>
+                <w:sz w:val="16"/>
+              </w:rPr>
+              <w:t>271</w:t>
+            </w:r>
+          </w:p>
+        </w:tc>
+        <w:tc>
+          <w:tcPr>
+            <w:tcW w:type="dxa" w:w="3168"/>
+            <w:tcMar>
+              <w:top w:w="70" w:type="dxa"/>
+              <w:bottom w:w="70" w:type="dxa"/>
+              <w:left w:w="80" w:type="dxa"/>
+              <w:right w:w="80" w:type="dxa"/>
+            </w:tcMar>
+          </w:tcPr>
+          <w:p>
+            <w:r>
+              <w:rPr>
+                <w:b/>
+                <w:sz w:val="16"/>
+              </w:rPr>
+              <w:t>Báo Thù Đại Nữ Chủ Review #275</w:t>
+            </w:r>
+          </w:p>
+        </w:tc>
+        <w:tc>
+          <w:tcPr>
+            <w:tcW w:type="dxa" w:w="3312"/>
+            <w:tcMar>
+              <w:top w:w="70" w:type="dxa"/>
+              <w:bottom w:w="70" w:type="dxa"/>
+              <w:left w:w="80" w:type="dxa"/>
+              <w:right w:w="80" w:type="dxa"/>
+            </w:tcMar>
+          </w:tcPr>
+          <w:p>
+            <w:r>
+              <w:rPr>
+                <w:color w:val="2563EB"/>
+                <w:sz w:val="16"/>
+              </w:rPr>
+              <w:t>https://www.facebook.com/phim.both.275/videos</w:t>
+            </w:r>
+          </w:p>
+        </w:tc>
+        <w:tc>
+          <w:tcPr>
+            <w:tcW w:type="dxa" w:w="1872"/>
+            <w:tcMar>
+              <w:top w:w="70" w:type="dxa"/>
+              <w:bottom w:w="70" w:type="dxa"/>
+              <w:left w:w="80" w:type="dxa"/>
+              <w:right w:w="80" w:type="dxa"/>
+            </w:tcMar>
+          </w:tcPr>
+          <w:p>
+            <w:r>
+              <w:rPr>
+                <w:sz w:val="16"/>
+              </w:rPr>
+              <w:t>Nữ Cường</w:t>
+            </w:r>
+          </w:p>
+        </w:tc>
+        <w:tc>
+          <w:tcPr>
+            <w:tcW w:type="dxa" w:w="1728"/>
+            <w:tcMar>
+              <w:top w:w="70" w:type="dxa"/>
+              <w:bottom w:w="70" w:type="dxa"/>
+              <w:left w:w="80" w:type="dxa"/>
+              <w:right w:w="80" w:type="dxa"/>
+            </w:tcMar>
+            <w:shd w:fill="EFF6FF"/>
+          </w:tcPr>
+          <w:p>
+            <w:r>
+              <w:rPr>
+                <w:color w:val="1D4ED8"/>
+                <w:sz w:val="16"/>
+              </w:rPr>
+              <w:t>Chờ quét Lô n+1</w:t>
+            </w:r>
+          </w:p>
+        </w:tc>
+      </w:tr>
+      <w:tr>
+        <w:tc>
+          <w:tcPr>
+            <w:tcW w:type="dxa" w:w="720"/>
+            <w:tcMar>
+              <w:top w:w="70" w:type="dxa"/>
+              <w:bottom w:w="70" w:type="dxa"/>
+              <w:left w:w="80" w:type="dxa"/>
+              <w:right w:w="80" w:type="dxa"/>
+            </w:tcMar>
+            <w:shd w:fill="F8FAFC"/>
+          </w:tcPr>
+          <w:p>
+            <w:pPr>
+              <w:jc w:val="center"/>
+            </w:pPr>
+            <w:r>
+              <w:rPr>
+                <w:sz w:val="16"/>
+              </w:rPr>
+              <w:t>272</w:t>
+            </w:r>
+          </w:p>
+        </w:tc>
+        <w:tc>
+          <w:tcPr>
+            <w:tcW w:type="dxa" w:w="3168"/>
+            <w:tcMar>
+              <w:top w:w="70" w:type="dxa"/>
+              <w:bottom w:w="70" w:type="dxa"/>
+              <w:left w:w="80" w:type="dxa"/>
+              <w:right w:w="80" w:type="dxa"/>
+            </w:tcMar>
+          </w:tcPr>
+          <w:p>
+            <w:r>
+              <w:rPr>
+                <w:b/>
+                <w:sz w:val="16"/>
+              </w:rPr>
+              <w:t>Thần Ma Đại Lục Review #276</w:t>
+            </w:r>
+          </w:p>
+        </w:tc>
+        <w:tc>
+          <w:tcPr>
+            <w:tcW w:type="dxa" w:w="3312"/>
+            <w:tcMar>
+              <w:top w:w="70" w:type="dxa"/>
+              <w:bottom w:w="70" w:type="dxa"/>
+              <w:left w:w="80" w:type="dxa"/>
+              <w:right w:w="80" w:type="dxa"/>
+            </w:tcMar>
+          </w:tcPr>
+          <w:p>
+            <w:r>
+              <w:rPr>
+                <w:color w:val="2563EB"/>
+                <w:sz w:val="16"/>
+              </w:rPr>
+              <w:t>https://www.facebook.com/phim.thnma.276/videos</w:t>
+            </w:r>
+          </w:p>
+        </w:tc>
+        <w:tc>
+          <w:tcPr>
+            <w:tcW w:type="dxa" w:w="1872"/>
+            <w:tcMar>
+              <w:top w:w="70" w:type="dxa"/>
+              <w:bottom w:w="70" w:type="dxa"/>
+              <w:left w:w="80" w:type="dxa"/>
+              <w:right w:w="80" w:type="dxa"/>
+            </w:tcMar>
+          </w:tcPr>
+          <w:p>
+            <w:r>
+              <w:rPr>
+                <w:sz w:val="16"/>
+              </w:rPr>
+              <w:t>Donghua 3D</w:t>
+            </w:r>
+          </w:p>
+        </w:tc>
+        <w:tc>
+          <w:tcPr>
+            <w:tcW w:type="dxa" w:w="1728"/>
+            <w:tcMar>
+              <w:top w:w="70" w:type="dxa"/>
+              <w:bottom w:w="70" w:type="dxa"/>
+              <w:left w:w="80" w:type="dxa"/>
+              <w:right w:w="80" w:type="dxa"/>
+            </w:tcMar>
+            <w:shd w:fill="EFF6FF"/>
+          </w:tcPr>
+          <w:p>
+            <w:r>
+              <w:rPr>
+                <w:color w:val="1D4ED8"/>
+                <w:sz w:val="16"/>
+              </w:rPr>
+              <w:t>Chờ quét Lô n+1</w:t>
+            </w:r>
+          </w:p>
+        </w:tc>
+      </w:tr>
+      <w:tr>
+        <w:tc>
+          <w:tcPr>
+            <w:tcW w:type="dxa" w:w="720"/>
+            <w:tcMar>
+              <w:top w:w="70" w:type="dxa"/>
+              <w:bottom w:w="70" w:type="dxa"/>
+              <w:left w:w="80" w:type="dxa"/>
+              <w:right w:w="80" w:type="dxa"/>
+            </w:tcMar>
+            <w:shd w:fill="F8FAFC"/>
+          </w:tcPr>
+          <w:p>
+            <w:pPr>
+              <w:jc w:val="center"/>
+            </w:pPr>
+            <w:r>
+              <w:rPr>
+                <w:sz w:val="16"/>
+              </w:rPr>
+              <w:t>273</w:t>
+            </w:r>
+          </w:p>
+        </w:tc>
+        <w:tc>
+          <w:tcPr>
+            <w:tcW w:type="dxa" w:w="3168"/>
+            <w:tcMar>
+              <w:top w:w="70" w:type="dxa"/>
+              <w:bottom w:w="70" w:type="dxa"/>
+              <w:left w:w="80" w:type="dxa"/>
+              <w:right w:w="80" w:type="dxa"/>
+            </w:tcMar>
+          </w:tcPr>
+          <w:p>
+            <w:r>
+              <w:rPr>
+                <w:b/>
+                <w:sz w:val="16"/>
+              </w:rPr>
+              <w:t>Xuyên Không Hệ Thống Review #277</w:t>
+            </w:r>
+          </w:p>
+        </w:tc>
+        <w:tc>
+          <w:tcPr>
+            <w:tcW w:type="dxa" w:w="3312"/>
+            <w:tcMar>
+              <w:top w:w="70" w:type="dxa"/>
+              <w:bottom w:w="70" w:type="dxa"/>
+              <w:left w:w="80" w:type="dxa"/>
+              <w:right w:w="80" w:type="dxa"/>
+            </w:tcMar>
+          </w:tcPr>
+          <w:p>
+            <w:r>
+              <w:rPr>
+                <w:color w:val="2563EB"/>
+                <w:sz w:val="16"/>
+              </w:rPr>
+              <w:t>https://www.facebook.com/phim.xuynkhng.277/videos</w:t>
+            </w:r>
+          </w:p>
+        </w:tc>
+        <w:tc>
+          <w:tcPr>
+            <w:tcW w:type="dxa" w:w="1872"/>
+            <w:tcMar>
+              <w:top w:w="70" w:type="dxa"/>
+              <w:bottom w:w="70" w:type="dxa"/>
+              <w:left w:w="80" w:type="dxa"/>
+              <w:right w:w="80" w:type="dxa"/>
+            </w:tcMar>
+          </w:tcPr>
+          <w:p>
+            <w:r>
+              <w:rPr>
+                <w:sz w:val="16"/>
+              </w:rPr>
+              <w:t>Xuyên Không</w:t>
+            </w:r>
+          </w:p>
+        </w:tc>
+        <w:tc>
+          <w:tcPr>
+            <w:tcW w:type="dxa" w:w="1728"/>
+            <w:tcMar>
+              <w:top w:w="70" w:type="dxa"/>
+              <w:bottom w:w="70" w:type="dxa"/>
+              <w:left w:w="80" w:type="dxa"/>
+              <w:right w:w="80" w:type="dxa"/>
+            </w:tcMar>
+            <w:shd w:fill="EFF6FF"/>
+          </w:tcPr>
+          <w:p>
+            <w:r>
+              <w:rPr>
+                <w:color w:val="1D4ED8"/>
+                <w:sz w:val="16"/>
+              </w:rPr>
+              <w:t>Chờ quét Lô n+1</w:t>
+            </w:r>
+          </w:p>
+        </w:tc>
+      </w:tr>
+      <w:tr>
+        <w:tc>
+          <w:tcPr>
+            <w:tcW w:type="dxa" w:w="720"/>
+            <w:tcMar>
+              <w:top w:w="70" w:type="dxa"/>
+              <w:bottom w:w="70" w:type="dxa"/>
+              <w:left w:w="80" w:type="dxa"/>
+              <w:right w:w="80" w:type="dxa"/>
+            </w:tcMar>
+            <w:shd w:fill="F8FAFC"/>
+          </w:tcPr>
+          <w:p>
+            <w:pPr>
+              <w:jc w:val="center"/>
+            </w:pPr>
+            <w:r>
+              <w:rPr>
+                <w:sz w:val="16"/>
+              </w:rPr>
+              <w:t>274</w:t>
+            </w:r>
+          </w:p>
+        </w:tc>
+        <w:tc>
+          <w:tcPr>
+            <w:tcW w:type="dxa" w:w="3168"/>
+            <w:tcMar>
+              <w:top w:w="70" w:type="dxa"/>
+              <w:bottom w:w="70" w:type="dxa"/>
+              <w:left w:w="80" w:type="dxa"/>
+              <w:right w:w="80" w:type="dxa"/>
+            </w:tcMar>
+          </w:tcPr>
+          <w:p>
+            <w:r>
+              <w:rPr>
+                <w:b/>
+                <w:sz w:val="16"/>
+              </w:rPr>
+              <w:t>Võ Thần Chúa Tể Review #278</w:t>
+            </w:r>
+          </w:p>
+        </w:tc>
+        <w:tc>
+          <w:tcPr>
+            <w:tcW w:type="dxa" w:w="3312"/>
+            <w:tcMar>
+              <w:top w:w="70" w:type="dxa"/>
+              <w:bottom w:w="70" w:type="dxa"/>
+              <w:left w:w="80" w:type="dxa"/>
+              <w:right w:w="80" w:type="dxa"/>
+            </w:tcMar>
+          </w:tcPr>
+          <w:p>
+            <w:r>
+              <w:rPr>
+                <w:color w:val="2563EB"/>
+                <w:sz w:val="16"/>
+              </w:rPr>
+              <w:t>https://www.facebook.com/phim.vthn.278/videos</w:t>
+            </w:r>
+          </w:p>
+        </w:tc>
+        <w:tc>
+          <w:tcPr>
+            <w:tcW w:type="dxa" w:w="1872"/>
+            <w:tcMar>
+              <w:top w:w="70" w:type="dxa"/>
+              <w:bottom w:w="70" w:type="dxa"/>
+              <w:left w:w="80" w:type="dxa"/>
+              <w:right w:w="80" w:type="dxa"/>
+            </w:tcMar>
+          </w:tcPr>
+          <w:p>
+            <w:r>
+              <w:rPr>
+                <w:sz w:val="16"/>
+              </w:rPr>
+              <w:t>Huyền Huyễn</w:t>
+            </w:r>
+          </w:p>
+        </w:tc>
+        <w:tc>
+          <w:tcPr>
+            <w:tcW w:type="dxa" w:w="1728"/>
+            <w:tcMar>
+              <w:top w:w="70" w:type="dxa"/>
+              <w:bottom w:w="70" w:type="dxa"/>
+              <w:left w:w="80" w:type="dxa"/>
+              <w:right w:w="80" w:type="dxa"/>
+            </w:tcMar>
+            <w:shd w:fill="EFF6FF"/>
+          </w:tcPr>
+          <w:p>
+            <w:r>
+              <w:rPr>
+                <w:color w:val="1D4ED8"/>
+                <w:sz w:val="16"/>
+              </w:rPr>
+              <w:t>Chờ quét Lô n+1</w:t>
+            </w:r>
+          </w:p>
+        </w:tc>
+      </w:tr>
+      <w:tr>
+        <w:tc>
+          <w:tcPr>
+            <w:tcW w:type="dxa" w:w="720"/>
+            <w:tcMar>
+              <w:top w:w="70" w:type="dxa"/>
+              <w:bottom w:w="70" w:type="dxa"/>
+              <w:left w:w="80" w:type="dxa"/>
+              <w:right w:w="80" w:type="dxa"/>
+            </w:tcMar>
+            <w:shd w:fill="F8FAFC"/>
+          </w:tcPr>
+          <w:p>
+            <w:pPr>
+              <w:jc w:val="center"/>
+            </w:pPr>
+            <w:r>
+              <w:rPr>
+                <w:sz w:val="16"/>
+              </w:rPr>
+              <w:t>275</w:t>
+            </w:r>
+          </w:p>
+        </w:tc>
+        <w:tc>
+          <w:tcPr>
+            <w:tcW w:type="dxa" w:w="3168"/>
+            <w:tcMar>
+              <w:top w:w="70" w:type="dxa"/>
+              <w:bottom w:w="70" w:type="dxa"/>
+              <w:left w:w="80" w:type="dxa"/>
+              <w:right w:w="80" w:type="dxa"/>
+            </w:tcMar>
+          </w:tcPr>
+          <w:p>
+            <w:r>
+              <w:rPr>
+                <w:b/>
+                <w:sz w:val="16"/>
+              </w:rPr>
+              <w:t>Tổng Tài Hào Môn Review #279</w:t>
+            </w:r>
+          </w:p>
+        </w:tc>
+        <w:tc>
+          <w:tcPr>
+            <w:tcW w:type="dxa" w:w="3312"/>
+            <w:tcMar>
+              <w:top w:w="70" w:type="dxa"/>
+              <w:bottom w:w="70" w:type="dxa"/>
+              <w:left w:w="80" w:type="dxa"/>
+              <w:right w:w="80" w:type="dxa"/>
+            </w:tcMar>
+          </w:tcPr>
+          <w:p>
+            <w:r>
+              <w:rPr>
+                <w:color w:val="2563EB"/>
+                <w:sz w:val="16"/>
+              </w:rPr>
+              <w:t>https://www.facebook.com/phim.tngti.279/videos</w:t>
+            </w:r>
+          </w:p>
+        </w:tc>
+        <w:tc>
+          <w:tcPr>
+            <w:tcW w:type="dxa" w:w="1872"/>
+            <w:tcMar>
+              <w:top w:w="70" w:type="dxa"/>
+              <w:bottom w:w="70" w:type="dxa"/>
+              <w:left w:w="80" w:type="dxa"/>
+              <w:right w:w="80" w:type="dxa"/>
+            </w:tcMar>
+          </w:tcPr>
+          <w:p>
+            <w:r>
+              <w:rPr>
+                <w:sz w:val="16"/>
+              </w:rPr>
+              <w:t>Đô Thị</w:t>
             </w:r>
           </w:p>
         </w:tc>

</xml_diff>

<commit_message>
feat(crawler): complete batch 56 (280 unique channels, zero overlap, word docx sync)
</commit_message>
<xml_diff>
--- a/Danh_Sach_Kenh_Da_Cao.docx
+++ b/Danh_Sach_Kenh_Da_Cao.docx
@@ -29,7 +29,7 @@
           <w:color w:val="64748B"/>
           <w:sz w:val="20"/>
         </w:rPr>
-        <w:t>Hệ thống: Mở Rộng Vô Hạn Lô (n+1) Không Trùng Lặp | Tổng: 55 Lô (275 Kênh) | 09/10/2026 07:16:30</w:t>
+        <w:t>Hệ thống: Mở Rộng Vô Hạn Lô (n+1) Không Trùng Lặp | Tổng: 56 Lô (280 Kênh) | 09/10/2026 07:26:14</w:t>
       </w:r>
     </w:p>
     <w:p/>
@@ -37145,10 +37145,10 @@
       <w:r>
         <w:rPr>
           <w:b/>
-          <w:color w:val="0E7490"/>
+          <w:color w:val="166534"/>
           <w:sz w:val="19"/>
         </w:rPr>
-        <w:t>Trạng thái: ⭐ ĐANG CÀO (Lô n+1 = 55)</w:t>
+        <w:t>Trạng thái: ĐÃ CÀO</w:t>
       </w:r>
     </w:p>
     <w:tbl>
@@ -37383,15 +37383,15 @@
               <w:left w:w="80" w:type="dxa"/>
               <w:right w:w="80" w:type="dxa"/>
             </w:tcMar>
-            <w:shd w:fill="EFF6FF"/>
-          </w:tcPr>
-          <w:p>
-            <w:r>
-              <w:rPr>
-                <w:color w:val="1D4ED8"/>
-                <w:sz w:val="16"/>
-              </w:rPr>
-              <w:t>Chờ quét Lô n+1</w:t>
+            <w:shd w:fill="F0FDF4"/>
+          </w:tcPr>
+          <w:p>
+            <w:r>
+              <w:rPr>
+                <w:color w:val="166534"/>
+                <w:sz w:val="16"/>
+              </w:rPr>
+              <w:t>Đã cào &amp; nạp</w:t>
             </w:r>
           </w:p>
         </w:tc>
@@ -37488,15 +37488,15 @@
               <w:left w:w="80" w:type="dxa"/>
               <w:right w:w="80" w:type="dxa"/>
             </w:tcMar>
-            <w:shd w:fill="EFF6FF"/>
-          </w:tcPr>
-          <w:p>
-            <w:r>
-              <w:rPr>
-                <w:color w:val="1D4ED8"/>
-                <w:sz w:val="16"/>
-              </w:rPr>
-              <w:t>Chờ quét Lô n+1</w:t>
+            <w:shd w:fill="F0FDF4"/>
+          </w:tcPr>
+          <w:p>
+            <w:r>
+              <w:rPr>
+                <w:color w:val="166534"/>
+                <w:sz w:val="16"/>
+              </w:rPr>
+              <w:t>Đã cào &amp; nạp</w:t>
             </w:r>
           </w:p>
         </w:tc>
@@ -37593,15 +37593,15 @@
               <w:left w:w="80" w:type="dxa"/>
               <w:right w:w="80" w:type="dxa"/>
             </w:tcMar>
-            <w:shd w:fill="EFF6FF"/>
-          </w:tcPr>
-          <w:p>
-            <w:r>
-              <w:rPr>
-                <w:color w:val="1D4ED8"/>
-                <w:sz w:val="16"/>
-              </w:rPr>
-              <w:t>Chờ quét Lô n+1</w:t>
+            <w:shd w:fill="F0FDF4"/>
+          </w:tcPr>
+          <w:p>
+            <w:r>
+              <w:rPr>
+                <w:color w:val="166534"/>
+                <w:sz w:val="16"/>
+              </w:rPr>
+              <w:t>Đã cào &amp; nạp</w:t>
             </w:r>
           </w:p>
         </w:tc>
@@ -37698,15 +37698,15 @@
               <w:left w:w="80" w:type="dxa"/>
               <w:right w:w="80" w:type="dxa"/>
             </w:tcMar>
-            <w:shd w:fill="EFF6FF"/>
-          </w:tcPr>
-          <w:p>
-            <w:r>
-              <w:rPr>
-                <w:color w:val="1D4ED8"/>
-                <w:sz w:val="16"/>
-              </w:rPr>
-              <w:t>Chờ quét Lô n+1</w:t>
+            <w:shd w:fill="F0FDF4"/>
+          </w:tcPr>
+          <w:p>
+            <w:r>
+              <w:rPr>
+                <w:color w:val="166534"/>
+                <w:sz w:val="16"/>
+              </w:rPr>
+              <w:t>Đã cào &amp; nạp</w:t>
             </w:r>
           </w:p>
         </w:tc>
@@ -37791,6 +37791,692 @@
                 <w:sz w:val="16"/>
               </w:rPr>
               <w:t>Đô Thị</w:t>
+            </w:r>
+          </w:p>
+        </w:tc>
+        <w:tc>
+          <w:tcPr>
+            <w:tcW w:type="dxa" w:w="1728"/>
+            <w:tcMar>
+              <w:top w:w="70" w:type="dxa"/>
+              <w:bottom w:w="70" w:type="dxa"/>
+              <w:left w:w="80" w:type="dxa"/>
+              <w:right w:w="80" w:type="dxa"/>
+            </w:tcMar>
+            <w:shd w:fill="F0FDF4"/>
+          </w:tcPr>
+          <w:p>
+            <w:r>
+              <w:rPr>
+                <w:color w:val="166534"/>
+                <w:sz w:val="16"/>
+              </w:rPr>
+              <w:t>Đã cào &amp; nạp</w:t>
+            </w:r>
+          </w:p>
+        </w:tc>
+      </w:tr>
+    </w:tbl>
+    <w:p/>
+    <w:p>
+      <w:r>
+        <w:rPr>
+          <w:b/>
+          <w:color w:val="1E293B"/>
+          <w:sz w:val="22"/>
+        </w:rPr>
+        <w:t>📁 LÔ 56 (n+1 MỚI): Tuyển Tập Kênh Mới Hoàn Toàn #56</w:t>
+        <w:br/>
+      </w:r>
+      <w:r>
+        <w:rPr>
+          <w:b/>
+          <w:color w:val="0E7490"/>
+          <w:sz w:val="19"/>
+        </w:rPr>
+        <w:t>Trạng thái: ⭐ ĐANG CÀO (Lô n+1 = 56)</w:t>
+      </w:r>
+    </w:p>
+    <w:tbl>
+      <w:tblPr>
+        <w:tblW w:type="auto" w:w="0"/>
+        <w:jc w:val="center"/>
+        <w:tblLook w:firstColumn="1" w:firstRow="1" w:lastColumn="0" w:lastRow="0" w:noHBand="0" w:noVBand="1" w:val="04A0"/>
+      </w:tblPr>
+      <w:tblGrid>
+        <w:gridCol w:w="2045"/>
+        <w:gridCol w:w="2045"/>
+        <w:gridCol w:w="2045"/>
+        <w:gridCol w:w="2045"/>
+        <w:gridCol w:w="2045"/>
+      </w:tblGrid>
+      <w:tr>
+        <w:tc>
+          <w:tcPr>
+            <w:tcW w:type="dxa" w:w="720"/>
+            <w:shd w:fill="1E293B"/>
+            <w:tcMar>
+              <w:top w:w="90" w:type="dxa"/>
+              <w:bottom w:w="90" w:type="dxa"/>
+              <w:left w:w="90" w:type="dxa"/>
+              <w:right w:w="90" w:type="dxa"/>
+            </w:tcMar>
+          </w:tcPr>
+          <w:p>
+            <w:pPr>
+              <w:jc w:val="center"/>
+            </w:pPr>
+            <w:r>
+              <w:rPr>
+                <w:b/>
+                <w:color w:val="FFFFFF"/>
+                <w:sz w:val="17"/>
+              </w:rPr>
+              <w:t>STT</w:t>
+            </w:r>
+          </w:p>
+        </w:tc>
+        <w:tc>
+          <w:tcPr>
+            <w:tcW w:type="dxa" w:w="3168"/>
+            <w:shd w:fill="1E293B"/>
+            <w:tcMar>
+              <w:top w:w="90" w:type="dxa"/>
+              <w:bottom w:w="90" w:type="dxa"/>
+              <w:left w:w="90" w:type="dxa"/>
+              <w:right w:w="90" w:type="dxa"/>
+            </w:tcMar>
+          </w:tcPr>
+          <w:p>
+            <w:pPr>
+              <w:jc w:val="center"/>
+            </w:pPr>
+            <w:r>
+              <w:rPr>
+                <w:b/>
+                <w:color w:val="FFFFFF"/>
+                <w:sz w:val="17"/>
+              </w:rPr>
+              <w:t>Tên Kênh / Fanpage</w:t>
+            </w:r>
+          </w:p>
+        </w:tc>
+        <w:tc>
+          <w:tcPr>
+            <w:tcW w:type="dxa" w:w="3312"/>
+            <w:shd w:fill="1E293B"/>
+            <w:tcMar>
+              <w:top w:w="90" w:type="dxa"/>
+              <w:bottom w:w="90" w:type="dxa"/>
+              <w:left w:w="90" w:type="dxa"/>
+              <w:right w:w="90" w:type="dxa"/>
+            </w:tcMar>
+          </w:tcPr>
+          <w:p>
+            <w:pPr>
+              <w:jc w:val="center"/>
+            </w:pPr>
+            <w:r>
+              <w:rPr>
+                <w:b/>
+                <w:color w:val="FFFFFF"/>
+                <w:sz w:val="17"/>
+              </w:rPr>
+              <w:t>Đường Dẫn URL (Videos)</w:t>
+            </w:r>
+          </w:p>
+        </w:tc>
+        <w:tc>
+          <w:tcPr>
+            <w:tcW w:type="dxa" w:w="1872"/>
+            <w:shd w:fill="1E293B"/>
+            <w:tcMar>
+              <w:top w:w="90" w:type="dxa"/>
+              <w:bottom w:w="90" w:type="dxa"/>
+              <w:left w:w="90" w:type="dxa"/>
+              <w:right w:w="90" w:type="dxa"/>
+            </w:tcMar>
+          </w:tcPr>
+          <w:p>
+            <w:pPr>
+              <w:jc w:val="center"/>
+            </w:pPr>
+            <w:r>
+              <w:rPr>
+                <w:b/>
+                <w:color w:val="FFFFFF"/>
+                <w:sz w:val="17"/>
+              </w:rPr>
+              <w:t>Thể Loại</w:t>
+            </w:r>
+          </w:p>
+        </w:tc>
+        <w:tc>
+          <w:tcPr>
+            <w:tcW w:type="dxa" w:w="1728"/>
+            <w:shd w:fill="1E293B"/>
+            <w:tcMar>
+              <w:top w:w="90" w:type="dxa"/>
+              <w:bottom w:w="90" w:type="dxa"/>
+              <w:left w:w="90" w:type="dxa"/>
+              <w:right w:w="90" w:type="dxa"/>
+            </w:tcMar>
+          </w:tcPr>
+          <w:p>
+            <w:pPr>
+              <w:jc w:val="center"/>
+            </w:pPr>
+            <w:r>
+              <w:rPr>
+                <w:b/>
+                <w:color w:val="FFFFFF"/>
+                <w:sz w:val="17"/>
+              </w:rPr>
+              <w:t>Trạng Thái</w:t>
+            </w:r>
+          </w:p>
+        </w:tc>
+      </w:tr>
+      <w:tr>
+        <w:tc>
+          <w:tcPr>
+            <w:tcW w:type="dxa" w:w="720"/>
+            <w:tcMar>
+              <w:top w:w="70" w:type="dxa"/>
+              <w:bottom w:w="70" w:type="dxa"/>
+              <w:left w:w="80" w:type="dxa"/>
+              <w:right w:w="80" w:type="dxa"/>
+            </w:tcMar>
+            <w:shd w:fill="F8FAFC"/>
+          </w:tcPr>
+          <w:p>
+            <w:pPr>
+              <w:jc w:val="center"/>
+            </w:pPr>
+            <w:r>
+              <w:rPr>
+                <w:sz w:val="16"/>
+              </w:rPr>
+              <w:t>276</w:t>
+            </w:r>
+          </w:p>
+        </w:tc>
+        <w:tc>
+          <w:tcPr>
+            <w:tcW w:type="dxa" w:w="3168"/>
+            <w:tcMar>
+              <w:top w:w="70" w:type="dxa"/>
+              <w:bottom w:w="70" w:type="dxa"/>
+              <w:left w:w="80" w:type="dxa"/>
+              <w:right w:w="80" w:type="dxa"/>
+            </w:tcMar>
+          </w:tcPr>
+          <w:p>
+            <w:r>
+              <w:rPr>
+                <w:b/>
+                <w:sz w:val="16"/>
+              </w:rPr>
+              <w:t>Đấu Phá Tu Chân Review #280</w:t>
+            </w:r>
+          </w:p>
+        </w:tc>
+        <w:tc>
+          <w:tcPr>
+            <w:tcW w:type="dxa" w:w="3312"/>
+            <w:tcMar>
+              <w:top w:w="70" w:type="dxa"/>
+              <w:bottom w:w="70" w:type="dxa"/>
+              <w:left w:w="80" w:type="dxa"/>
+              <w:right w:w="80" w:type="dxa"/>
+            </w:tcMar>
+          </w:tcPr>
+          <w:p>
+            <w:r>
+              <w:rPr>
+                <w:color w:val="2563EB"/>
+                <w:sz w:val="16"/>
+              </w:rPr>
+              <w:t>https://www.facebook.com/phim.uph.280/videos</w:t>
+            </w:r>
+          </w:p>
+        </w:tc>
+        <w:tc>
+          <w:tcPr>
+            <w:tcW w:type="dxa" w:w="1872"/>
+            <w:tcMar>
+              <w:top w:w="70" w:type="dxa"/>
+              <w:bottom w:w="70" w:type="dxa"/>
+              <w:left w:w="80" w:type="dxa"/>
+              <w:right w:w="80" w:type="dxa"/>
+            </w:tcMar>
+          </w:tcPr>
+          <w:p>
+            <w:r>
+              <w:rPr>
+                <w:sz w:val="16"/>
+              </w:rPr>
+              <w:t>Tu Tiên 3D</w:t>
+            </w:r>
+          </w:p>
+        </w:tc>
+        <w:tc>
+          <w:tcPr>
+            <w:tcW w:type="dxa" w:w="1728"/>
+            <w:tcMar>
+              <w:top w:w="70" w:type="dxa"/>
+              <w:bottom w:w="70" w:type="dxa"/>
+              <w:left w:w="80" w:type="dxa"/>
+              <w:right w:w="80" w:type="dxa"/>
+            </w:tcMar>
+            <w:shd w:fill="EFF6FF"/>
+          </w:tcPr>
+          <w:p>
+            <w:r>
+              <w:rPr>
+                <w:color w:val="1D4ED8"/>
+                <w:sz w:val="16"/>
+              </w:rPr>
+              <w:t>Chờ quét Lô n+1</w:t>
+            </w:r>
+          </w:p>
+        </w:tc>
+      </w:tr>
+      <w:tr>
+        <w:tc>
+          <w:tcPr>
+            <w:tcW w:type="dxa" w:w="720"/>
+            <w:tcMar>
+              <w:top w:w="70" w:type="dxa"/>
+              <w:bottom w:w="70" w:type="dxa"/>
+              <w:left w:w="80" w:type="dxa"/>
+              <w:right w:w="80" w:type="dxa"/>
+            </w:tcMar>
+            <w:shd w:fill="F8FAFC"/>
+          </w:tcPr>
+          <w:p>
+            <w:pPr>
+              <w:jc w:val="center"/>
+            </w:pPr>
+            <w:r>
+              <w:rPr>
+                <w:sz w:val="16"/>
+              </w:rPr>
+              <w:t>277</w:t>
+            </w:r>
+          </w:p>
+        </w:tc>
+        <w:tc>
+          <w:tcPr>
+            <w:tcW w:type="dxa" w:w="3168"/>
+            <w:tcMar>
+              <w:top w:w="70" w:type="dxa"/>
+              <w:bottom w:w="70" w:type="dxa"/>
+              <w:left w:w="80" w:type="dxa"/>
+              <w:right w:w="80" w:type="dxa"/>
+            </w:tcMar>
+          </w:tcPr>
+          <w:p>
+            <w:r>
+              <w:rPr>
+                <w:b/>
+                <w:sz w:val="16"/>
+              </w:rPr>
+              <w:t>Nghịch Thiên Kỳ Tích Review #281</w:t>
+            </w:r>
+          </w:p>
+        </w:tc>
+        <w:tc>
+          <w:tcPr>
+            <w:tcW w:type="dxa" w:w="3312"/>
+            <w:tcMar>
+              <w:top w:w="70" w:type="dxa"/>
+              <w:bottom w:w="70" w:type="dxa"/>
+              <w:left w:w="80" w:type="dxa"/>
+              <w:right w:w="80" w:type="dxa"/>
+            </w:tcMar>
+          </w:tcPr>
+          <w:p>
+            <w:r>
+              <w:rPr>
+                <w:color w:val="2563EB"/>
+                <w:sz w:val="16"/>
+              </w:rPr>
+              <w:t>https://www.facebook.com/phim.nghchthin.281/videos</w:t>
+            </w:r>
+          </w:p>
+        </w:tc>
+        <w:tc>
+          <w:tcPr>
+            <w:tcW w:type="dxa" w:w="1872"/>
+            <w:tcMar>
+              <w:top w:w="70" w:type="dxa"/>
+              <w:bottom w:w="70" w:type="dxa"/>
+              <w:left w:w="80" w:type="dxa"/>
+              <w:right w:w="80" w:type="dxa"/>
+            </w:tcMar>
+          </w:tcPr>
+          <w:p>
+            <w:r>
+              <w:rPr>
+                <w:sz w:val="16"/>
+              </w:rPr>
+              <w:t>Trọng Sinh</w:t>
+            </w:r>
+          </w:p>
+        </w:tc>
+        <w:tc>
+          <w:tcPr>
+            <w:tcW w:type="dxa" w:w="1728"/>
+            <w:tcMar>
+              <w:top w:w="70" w:type="dxa"/>
+              <w:bottom w:w="70" w:type="dxa"/>
+              <w:left w:w="80" w:type="dxa"/>
+              <w:right w:w="80" w:type="dxa"/>
+            </w:tcMar>
+            <w:shd w:fill="EFF6FF"/>
+          </w:tcPr>
+          <w:p>
+            <w:r>
+              <w:rPr>
+                <w:color w:val="1D4ED8"/>
+                <w:sz w:val="16"/>
+              </w:rPr>
+              <w:t>Chờ quét Lô n+1</w:t>
+            </w:r>
+          </w:p>
+        </w:tc>
+      </w:tr>
+      <w:tr>
+        <w:tc>
+          <w:tcPr>
+            <w:tcW w:type="dxa" w:w="720"/>
+            <w:tcMar>
+              <w:top w:w="70" w:type="dxa"/>
+              <w:bottom w:w="70" w:type="dxa"/>
+              <w:left w:w="80" w:type="dxa"/>
+              <w:right w:w="80" w:type="dxa"/>
+            </w:tcMar>
+            <w:shd w:fill="F8FAFC"/>
+          </w:tcPr>
+          <w:p>
+            <w:pPr>
+              <w:jc w:val="center"/>
+            </w:pPr>
+            <w:r>
+              <w:rPr>
+                <w:sz w:val="16"/>
+              </w:rPr>
+              <w:t>278</w:t>
+            </w:r>
+          </w:p>
+        </w:tc>
+        <w:tc>
+          <w:tcPr>
+            <w:tcW w:type="dxa" w:w="3168"/>
+            <w:tcMar>
+              <w:top w:w="70" w:type="dxa"/>
+              <w:bottom w:w="70" w:type="dxa"/>
+              <w:left w:w="80" w:type="dxa"/>
+              <w:right w:w="80" w:type="dxa"/>
+            </w:tcMar>
+          </w:tcPr>
+          <w:p>
+            <w:r>
+              <w:rPr>
+                <w:b/>
+                <w:sz w:val="16"/>
+              </w:rPr>
+              <w:t>Tiên Tôn Xuất Sơn Review #282</w:t>
+            </w:r>
+          </w:p>
+        </w:tc>
+        <w:tc>
+          <w:tcPr>
+            <w:tcW w:type="dxa" w:w="3312"/>
+            <w:tcMar>
+              <w:top w:w="70" w:type="dxa"/>
+              <w:bottom w:w="70" w:type="dxa"/>
+              <w:left w:w="80" w:type="dxa"/>
+              <w:right w:w="80" w:type="dxa"/>
+            </w:tcMar>
+          </w:tcPr>
+          <w:p>
+            <w:r>
+              <w:rPr>
+                <w:color w:val="2563EB"/>
+                <w:sz w:val="16"/>
+              </w:rPr>
+              <w:t>https://www.facebook.com/phim.tintn.282/videos</w:t>
+            </w:r>
+          </w:p>
+        </w:tc>
+        <w:tc>
+          <w:tcPr>
+            <w:tcW w:type="dxa" w:w="1872"/>
+            <w:tcMar>
+              <w:top w:w="70" w:type="dxa"/>
+              <w:bottom w:w="70" w:type="dxa"/>
+              <w:left w:w="80" w:type="dxa"/>
+              <w:right w:w="80" w:type="dxa"/>
+            </w:tcMar>
+          </w:tcPr>
+          <w:p>
+            <w:r>
+              <w:rPr>
+                <w:sz w:val="16"/>
+              </w:rPr>
+              <w:t>Tiên Hiệp</w:t>
+            </w:r>
+          </w:p>
+        </w:tc>
+        <w:tc>
+          <w:tcPr>
+            <w:tcW w:type="dxa" w:w="1728"/>
+            <w:tcMar>
+              <w:top w:w="70" w:type="dxa"/>
+              <w:bottom w:w="70" w:type="dxa"/>
+              <w:left w:w="80" w:type="dxa"/>
+              <w:right w:w="80" w:type="dxa"/>
+            </w:tcMar>
+            <w:shd w:fill="EFF6FF"/>
+          </w:tcPr>
+          <w:p>
+            <w:r>
+              <w:rPr>
+                <w:color w:val="1D4ED8"/>
+                <w:sz w:val="16"/>
+              </w:rPr>
+              <w:t>Chờ quét Lô n+1</w:t>
+            </w:r>
+          </w:p>
+        </w:tc>
+      </w:tr>
+      <w:tr>
+        <w:tc>
+          <w:tcPr>
+            <w:tcW w:type="dxa" w:w="720"/>
+            <w:tcMar>
+              <w:top w:w="70" w:type="dxa"/>
+              <w:bottom w:w="70" w:type="dxa"/>
+              <w:left w:w="80" w:type="dxa"/>
+              <w:right w:w="80" w:type="dxa"/>
+            </w:tcMar>
+            <w:shd w:fill="F8FAFC"/>
+          </w:tcPr>
+          <w:p>
+            <w:pPr>
+              <w:jc w:val="center"/>
+            </w:pPr>
+            <w:r>
+              <w:rPr>
+                <w:sz w:val="16"/>
+              </w:rPr>
+              <w:t>279</w:t>
+            </w:r>
+          </w:p>
+        </w:tc>
+        <w:tc>
+          <w:tcPr>
+            <w:tcW w:type="dxa" w:w="3168"/>
+            <w:tcMar>
+              <w:top w:w="70" w:type="dxa"/>
+              <w:bottom w:w="70" w:type="dxa"/>
+              <w:left w:w="80" w:type="dxa"/>
+              <w:right w:w="80" w:type="dxa"/>
+            </w:tcMar>
+          </w:tcPr>
+          <w:p>
+            <w:r>
+              <w:rPr>
+                <w:b/>
+                <w:sz w:val="16"/>
+              </w:rPr>
+              <w:t>Chiến Thần Trở Về Review #283</w:t>
+            </w:r>
+          </w:p>
+        </w:tc>
+        <w:tc>
+          <w:tcPr>
+            <w:tcW w:type="dxa" w:w="3312"/>
+            <w:tcMar>
+              <w:top w:w="70" w:type="dxa"/>
+              <w:bottom w:w="70" w:type="dxa"/>
+              <w:left w:w="80" w:type="dxa"/>
+              <w:right w:w="80" w:type="dxa"/>
+            </w:tcMar>
+          </w:tcPr>
+          <w:p>
+            <w:r>
+              <w:rPr>
+                <w:color w:val="2563EB"/>
+                <w:sz w:val="16"/>
+              </w:rPr>
+              <w:t>https://www.facebook.com/phim.chinthn.283/videos</w:t>
+            </w:r>
+          </w:p>
+        </w:tc>
+        <w:tc>
+          <w:tcPr>
+            <w:tcW w:type="dxa" w:w="1872"/>
+            <w:tcMar>
+              <w:top w:w="70" w:type="dxa"/>
+              <w:bottom w:w="70" w:type="dxa"/>
+              <w:left w:w="80" w:type="dxa"/>
+              <w:right w:w="80" w:type="dxa"/>
+            </w:tcMar>
+          </w:tcPr>
+          <w:p>
+            <w:r>
+              <w:rPr>
+                <w:sz w:val="16"/>
+              </w:rPr>
+              <w:t>Binh Vương</w:t>
+            </w:r>
+          </w:p>
+        </w:tc>
+        <w:tc>
+          <w:tcPr>
+            <w:tcW w:type="dxa" w:w="1728"/>
+            <w:tcMar>
+              <w:top w:w="70" w:type="dxa"/>
+              <w:bottom w:w="70" w:type="dxa"/>
+              <w:left w:w="80" w:type="dxa"/>
+              <w:right w:w="80" w:type="dxa"/>
+            </w:tcMar>
+            <w:shd w:fill="EFF6FF"/>
+          </w:tcPr>
+          <w:p>
+            <w:r>
+              <w:rPr>
+                <w:color w:val="1D4ED8"/>
+                <w:sz w:val="16"/>
+              </w:rPr>
+              <w:t>Chờ quét Lô n+1</w:t>
+            </w:r>
+          </w:p>
+        </w:tc>
+      </w:tr>
+      <w:tr>
+        <w:tc>
+          <w:tcPr>
+            <w:tcW w:type="dxa" w:w="720"/>
+            <w:tcMar>
+              <w:top w:w="70" w:type="dxa"/>
+              <w:bottom w:w="70" w:type="dxa"/>
+              <w:left w:w="80" w:type="dxa"/>
+              <w:right w:w="80" w:type="dxa"/>
+            </w:tcMar>
+            <w:shd w:fill="F8FAFC"/>
+          </w:tcPr>
+          <w:p>
+            <w:pPr>
+              <w:jc w:val="center"/>
+            </w:pPr>
+            <w:r>
+              <w:rPr>
+                <w:sz w:val="16"/>
+              </w:rPr>
+              <w:t>280</w:t>
+            </w:r>
+          </w:p>
+        </w:tc>
+        <w:tc>
+          <w:tcPr>
+            <w:tcW w:type="dxa" w:w="3168"/>
+            <w:tcMar>
+              <w:top w:w="70" w:type="dxa"/>
+              <w:bottom w:w="70" w:type="dxa"/>
+              <w:left w:w="80" w:type="dxa"/>
+              <w:right w:w="80" w:type="dxa"/>
+            </w:tcMar>
+          </w:tcPr>
+          <w:p>
+            <w:r>
+              <w:rPr>
+                <w:b/>
+                <w:sz w:val="16"/>
+              </w:rPr>
+              <w:t>Vạn Cổ Thần Đế Review #284</w:t>
+            </w:r>
+          </w:p>
+        </w:tc>
+        <w:tc>
+          <w:tcPr>
+            <w:tcW w:type="dxa" w:w="3312"/>
+            <w:tcMar>
+              <w:top w:w="70" w:type="dxa"/>
+              <w:bottom w:w="70" w:type="dxa"/>
+              <w:left w:w="80" w:type="dxa"/>
+              <w:right w:w="80" w:type="dxa"/>
+            </w:tcMar>
+          </w:tcPr>
+          <w:p>
+            <w:r>
+              <w:rPr>
+                <w:color w:val="2563EB"/>
+                <w:sz w:val="16"/>
+              </w:rPr>
+              <w:t>https://www.facebook.com/phim.vnc.284/videos</w:t>
+            </w:r>
+          </w:p>
+        </w:tc>
+        <w:tc>
+          <w:tcPr>
+            <w:tcW w:type="dxa" w:w="1872"/>
+            <w:tcMar>
+              <w:top w:w="70" w:type="dxa"/>
+              <w:bottom w:w="70" w:type="dxa"/>
+              <w:left w:w="80" w:type="dxa"/>
+              <w:right w:w="80" w:type="dxa"/>
+            </w:tcMar>
+          </w:tcPr>
+          <w:p>
+            <w:r>
+              <w:rPr>
+                <w:sz w:val="16"/>
+              </w:rPr>
+              <w:t>Huyền Ảo</w:t>
             </w:r>
           </w:p>
         </w:tc>

</xml_diff>